<commit_message>
Scope IECEx/ATEX certification document to GLD only
Remove all Cluster Head and Gateway content from the certification
document per user request: the 3-device comparison table in Section
2.2, the "Related system devices" spec row, and remaining prose
references (star topology target, IP-rating comparison, photo-gap
note). The document now describes the GLD unit on its own throughout,
consistent with its actual certification scope (Node Sensor only).

Co-Authored-By: Claude Sonnet 5 <noreply@anthropic.com>
</commit_message>
<xml_diff>
--- a/Deliverables/Dokumen_Teknis_Sertifikasi_GLD_IECEx_ATEX.docx
+++ b/Deliverables/Dokumen_Teknis_Sertifikasi_GLD_IECEx_ATEX.docx
@@ -324,7 +324,7 @@
       <w:r>
         <w:fldChar w:fldCharType="separate"/>
       </w:r>
-      <w:hyperlink w:anchor="_Toc240014014" w:history="1">
+      <w:hyperlink w:anchor="_Toc240032061" w:history="1">
         <w:r>
           <w:rPr>
             <w:rStyle w:val="Hyperlink"/>
@@ -351,7 +351,7 @@
             <w:noProof/>
             <w:webHidden/>
           </w:rPr>
-          <w:instrText xml:space="preserve"> PAGEREF _Toc240014014 \h </w:instrText>
+          <w:instrText xml:space="preserve"> PAGEREF _Toc240032061 \h </w:instrText>
         </w:r>
         <w:r>
           <w:rPr>
@@ -396,7 +396,7 @@
           <w:lang w:val="en-ID" w:eastAsia="en-ID"/>
         </w:rPr>
       </w:pPr>
-      <w:hyperlink w:anchor="_Toc240014015" w:history="1">
+      <w:hyperlink w:anchor="_Toc240032062" w:history="1">
         <w:r>
           <w:rPr>
             <w:rStyle w:val="Hyperlink"/>
@@ -423,7 +423,7 @@
             <w:noProof/>
             <w:webHidden/>
           </w:rPr>
-          <w:instrText xml:space="preserve"> PAGEREF _Toc240014015 \h </w:instrText>
+          <w:instrText xml:space="preserve"> PAGEREF _Toc240032062 \h </w:instrText>
         </w:r>
         <w:r>
           <w:rPr>
@@ -468,7 +468,7 @@
           <w:lang w:val="en-ID" w:eastAsia="en-ID"/>
         </w:rPr>
       </w:pPr>
-      <w:hyperlink w:anchor="_Toc240014016" w:history="1">
+      <w:hyperlink w:anchor="_Toc240032063" w:history="1">
         <w:r>
           <w:rPr>
             <w:rStyle w:val="Hyperlink"/>
@@ -495,7 +495,7 @@
             <w:noProof/>
             <w:webHidden/>
           </w:rPr>
-          <w:instrText xml:space="preserve"> PAGEREF _Toc240014016 \h </w:instrText>
+          <w:instrText xml:space="preserve"> PAGEREF _Toc240032063 \h </w:instrText>
         </w:r>
         <w:r>
           <w:rPr>
@@ -540,7 +540,7 @@
           <w:lang w:val="en-ID" w:eastAsia="en-ID"/>
         </w:rPr>
       </w:pPr>
-      <w:hyperlink w:anchor="_Toc240014017" w:history="1">
+      <w:hyperlink w:anchor="_Toc240032064" w:history="1">
         <w:r>
           <w:rPr>
             <w:rStyle w:val="Hyperlink"/>
@@ -567,7 +567,7 @@
             <w:noProof/>
             <w:webHidden/>
           </w:rPr>
-          <w:instrText xml:space="preserve"> PAGEREF _Toc240014017 \h </w:instrText>
+          <w:instrText xml:space="preserve"> PAGEREF _Toc240032064 \h </w:instrText>
         </w:r>
         <w:r>
           <w:rPr>
@@ -612,7 +612,7 @@
           <w:lang w:val="en-ID" w:eastAsia="en-ID"/>
         </w:rPr>
       </w:pPr>
-      <w:hyperlink w:anchor="_Toc240014018" w:history="1">
+      <w:hyperlink w:anchor="_Toc240032065" w:history="1">
         <w:r>
           <w:rPr>
             <w:rStyle w:val="Hyperlink"/>
@@ -639,7 +639,7 @@
             <w:noProof/>
             <w:webHidden/>
           </w:rPr>
-          <w:instrText xml:space="preserve"> PAGEREF _Toc240014018 \h </w:instrText>
+          <w:instrText xml:space="preserve"> PAGEREF _Toc240032065 \h </w:instrText>
         </w:r>
         <w:r>
           <w:rPr>
@@ -684,7 +684,7 @@
           <w:lang w:val="en-ID" w:eastAsia="en-ID"/>
         </w:rPr>
       </w:pPr>
-      <w:hyperlink w:anchor="_Toc240014019" w:history="1">
+      <w:hyperlink w:anchor="_Toc240032066" w:history="1">
         <w:r>
           <w:rPr>
             <w:rStyle w:val="Hyperlink"/>
@@ -711,7 +711,151 @@
             <w:noProof/>
             <w:webHidden/>
           </w:rPr>
-          <w:instrText xml:space="preserve"> PAGEREF _Toc240014019 \h </w:instrText>
+          <w:instrText xml:space="preserve"> PAGEREF _Toc240032066 \h </w:instrText>
+        </w:r>
+        <w:r>
+          <w:rPr>
+            <w:noProof/>
+            <w:webHidden/>
+          </w:rPr>
+        </w:r>
+        <w:r>
+          <w:rPr>
+            <w:noProof/>
+            <w:webHidden/>
+          </w:rPr>
+          <w:fldChar w:fldCharType="separate"/>
+        </w:r>
+        <w:r>
+          <w:rPr>
+            <w:noProof/>
+            <w:webHidden/>
+          </w:rPr>
+          <w:t>3</w:t>
+        </w:r>
+        <w:r>
+          <w:rPr>
+            <w:noProof/>
+            <w:webHidden/>
+          </w:rPr>
+          <w:fldChar w:fldCharType="end"/>
+        </w:r>
+      </w:hyperlink>
+    </w:p>
+    <w:p>
+      <w:pPr>
+        <w:pStyle w:val="TOC3"/>
+        <w:tabs>
+          <w:tab w:val="right" w:leader="dot" w:pos="9736"/>
+        </w:tabs>
+        <w:rPr>
+          <w:rFonts w:asciiTheme="minorHAnsi" w:hAnsiTheme="minorHAnsi"/>
+          <w:noProof/>
+          <w:color w:val="auto"/>
+          <w:sz w:val="22"/>
+          <w:lang w:val="en-ID" w:eastAsia="en-ID"/>
+        </w:rPr>
+      </w:pPr>
+      <w:hyperlink w:anchor="_Toc240032067" w:history="1">
+        <w:r>
+          <w:rPr>
+            <w:rStyle w:val="Hyperlink"/>
+            <w:noProof/>
+          </w:rPr>
+          <w:t>2.3.a · Electrical Parameters — Node Sensor (GLD)</w:t>
+        </w:r>
+        <w:r>
+          <w:rPr>
+            <w:noProof/>
+            <w:webHidden/>
+          </w:rPr>
+          <w:tab/>
+        </w:r>
+        <w:r>
+          <w:rPr>
+            <w:noProof/>
+            <w:webHidden/>
+          </w:rPr>
+          <w:fldChar w:fldCharType="begin"/>
+        </w:r>
+        <w:r>
+          <w:rPr>
+            <w:noProof/>
+            <w:webHidden/>
+          </w:rPr>
+          <w:instrText xml:space="preserve"> PAGEREF _Toc240032067 \h </w:instrText>
+        </w:r>
+        <w:r>
+          <w:rPr>
+            <w:noProof/>
+            <w:webHidden/>
+          </w:rPr>
+        </w:r>
+        <w:r>
+          <w:rPr>
+            <w:noProof/>
+            <w:webHidden/>
+          </w:rPr>
+          <w:fldChar w:fldCharType="separate"/>
+        </w:r>
+        <w:r>
+          <w:rPr>
+            <w:noProof/>
+            <w:webHidden/>
+          </w:rPr>
+          <w:t>3</w:t>
+        </w:r>
+        <w:r>
+          <w:rPr>
+            <w:noProof/>
+            <w:webHidden/>
+          </w:rPr>
+          <w:fldChar w:fldCharType="end"/>
+        </w:r>
+      </w:hyperlink>
+    </w:p>
+    <w:p>
+      <w:pPr>
+        <w:pStyle w:val="TOC3"/>
+        <w:tabs>
+          <w:tab w:val="right" w:leader="dot" w:pos="9736"/>
+        </w:tabs>
+        <w:rPr>
+          <w:rFonts w:asciiTheme="minorHAnsi" w:hAnsiTheme="minorHAnsi"/>
+          <w:noProof/>
+          <w:color w:val="auto"/>
+          <w:sz w:val="22"/>
+          <w:lang w:val="en-ID" w:eastAsia="en-ID"/>
+        </w:rPr>
+      </w:pPr>
+      <w:hyperlink w:anchor="_Toc240032068" w:history="1">
+        <w:r>
+          <w:rPr>
+            <w:rStyle w:val="Hyperlink"/>
+            <w:noProof/>
+          </w:rPr>
+          <w:t>2.3.b · Sensor and Communication Parameters — Node Sensor (GLD)</w:t>
+        </w:r>
+        <w:r>
+          <w:rPr>
+            <w:noProof/>
+            <w:webHidden/>
+          </w:rPr>
+          <w:tab/>
+        </w:r>
+        <w:r>
+          <w:rPr>
+            <w:noProof/>
+            <w:webHidden/>
+          </w:rPr>
+          <w:fldChar w:fldCharType="begin"/>
+        </w:r>
+        <w:r>
+          <w:rPr>
+            <w:noProof/>
+            <w:webHidden/>
+          </w:rPr>
+          <w:instrText xml:space="preserve"> PAGEREF _Toc240032068 \h </w:instrText>
         </w:r>
         <w:r>
           <w:rPr>
@@ -756,151 +900,7 @@
           <w:lang w:val="en-ID" w:eastAsia="en-ID"/>
         </w:rPr>
       </w:pPr>
-      <w:hyperlink w:anchor="_Toc240014020" w:history="1">
-        <w:r>
-          <w:rPr>
-            <w:rStyle w:val="Hyperlink"/>
-            <w:noProof/>
-          </w:rPr>
-          <w:t>2.3.a · Electrical Parameters — Node Sensor (GLD)</w:t>
-        </w:r>
-        <w:r>
-          <w:rPr>
-            <w:noProof/>
-            <w:webHidden/>
-          </w:rPr>
-          <w:tab/>
-        </w:r>
-        <w:r>
-          <w:rPr>
-            <w:noProof/>
-            <w:webHidden/>
-          </w:rPr>
-          <w:fldChar w:fldCharType="begin"/>
-        </w:r>
-        <w:r>
-          <w:rPr>
-            <w:noProof/>
-            <w:webHidden/>
-          </w:rPr>
-          <w:instrText xml:space="preserve"> PAGEREF _Toc240014020 \h </w:instrText>
-        </w:r>
-        <w:r>
-          <w:rPr>
-            <w:noProof/>
-            <w:webHidden/>
-          </w:rPr>
-        </w:r>
-        <w:r>
-          <w:rPr>
-            <w:noProof/>
-            <w:webHidden/>
-          </w:rPr>
-          <w:fldChar w:fldCharType="separate"/>
-        </w:r>
-        <w:r>
-          <w:rPr>
-            <w:noProof/>
-            <w:webHidden/>
-          </w:rPr>
-          <w:t>4</w:t>
-        </w:r>
-        <w:r>
-          <w:rPr>
-            <w:noProof/>
-            <w:webHidden/>
-          </w:rPr>
-          <w:fldChar w:fldCharType="end"/>
-        </w:r>
-      </w:hyperlink>
-    </w:p>
-    <w:p>
-      <w:pPr>
-        <w:pStyle w:val="TOC3"/>
-        <w:tabs>
-          <w:tab w:val="right" w:leader="dot" w:pos="9736"/>
-        </w:tabs>
-        <w:rPr>
-          <w:rFonts w:asciiTheme="minorHAnsi" w:hAnsiTheme="minorHAnsi"/>
-          <w:noProof/>
-          <w:color w:val="auto"/>
-          <w:sz w:val="22"/>
-          <w:lang w:val="en-ID" w:eastAsia="en-ID"/>
-        </w:rPr>
-      </w:pPr>
-      <w:hyperlink w:anchor="_Toc240014021" w:history="1">
-        <w:r>
-          <w:rPr>
-            <w:rStyle w:val="Hyperlink"/>
-            <w:noProof/>
-          </w:rPr>
-          <w:t>2.3.b · Sensor and Communication Parameters — Node Sensor (GLD)</w:t>
-        </w:r>
-        <w:r>
-          <w:rPr>
-            <w:noProof/>
-            <w:webHidden/>
-          </w:rPr>
-          <w:tab/>
-        </w:r>
-        <w:r>
-          <w:rPr>
-            <w:noProof/>
-            <w:webHidden/>
-          </w:rPr>
-          <w:fldChar w:fldCharType="begin"/>
-        </w:r>
-        <w:r>
-          <w:rPr>
-            <w:noProof/>
-            <w:webHidden/>
-          </w:rPr>
-          <w:instrText xml:space="preserve"> PAGEREF _Toc240014021 \h </w:instrText>
-        </w:r>
-        <w:r>
-          <w:rPr>
-            <w:noProof/>
-            <w:webHidden/>
-          </w:rPr>
-        </w:r>
-        <w:r>
-          <w:rPr>
-            <w:noProof/>
-            <w:webHidden/>
-          </w:rPr>
-          <w:fldChar w:fldCharType="separate"/>
-        </w:r>
-        <w:r>
-          <w:rPr>
-            <w:noProof/>
-            <w:webHidden/>
-          </w:rPr>
-          <w:t>4</w:t>
-        </w:r>
-        <w:r>
-          <w:rPr>
-            <w:noProof/>
-            <w:webHidden/>
-          </w:rPr>
-          <w:fldChar w:fldCharType="end"/>
-        </w:r>
-      </w:hyperlink>
-    </w:p>
-    <w:p>
-      <w:pPr>
-        <w:pStyle w:val="TOC3"/>
-        <w:tabs>
-          <w:tab w:val="right" w:leader="dot" w:pos="9736"/>
-        </w:tabs>
-        <w:rPr>
-          <w:rFonts w:asciiTheme="minorHAnsi" w:hAnsiTheme="minorHAnsi"/>
-          <w:noProof/>
-          <w:color w:val="auto"/>
-          <w:sz w:val="22"/>
-          <w:lang w:val="en-ID" w:eastAsia="en-ID"/>
-        </w:rPr>
-      </w:pPr>
-      <w:hyperlink w:anchor="_Toc240014022" w:history="1">
+      <w:hyperlink w:anchor="_Toc240032069" w:history="1">
         <w:r>
           <w:rPr>
             <w:rStyle w:val="Hyperlink"/>
@@ -927,7 +927,7 @@
             <w:noProof/>
             <w:webHidden/>
           </w:rPr>
-          <w:instrText xml:space="preserve"> PAGEREF _Toc240014022 \h </w:instrText>
+          <w:instrText xml:space="preserve"> PAGEREF _Toc240032069 \h </w:instrText>
         </w:r>
         <w:r>
           <w:rPr>
@@ -972,7 +972,7 @@
           <w:lang w:val="en-ID" w:eastAsia="en-ID"/>
         </w:rPr>
       </w:pPr>
-      <w:hyperlink w:anchor="_Toc240014023" w:history="1">
+      <w:hyperlink w:anchor="_Toc240032070" w:history="1">
         <w:r>
           <w:rPr>
             <w:rStyle w:val="Hyperlink"/>
@@ -999,7 +999,7 @@
             <w:noProof/>
             <w:webHidden/>
           </w:rPr>
-          <w:instrText xml:space="preserve"> PAGEREF _Toc240014023 \h </w:instrText>
+          <w:instrText xml:space="preserve"> PAGEREF _Toc240032070 \h </w:instrText>
         </w:r>
         <w:r>
           <w:rPr>
@@ -1044,7 +1044,7 @@
           <w:lang w:val="en-ID" w:eastAsia="en-ID"/>
         </w:rPr>
       </w:pPr>
-      <w:hyperlink w:anchor="_Toc240014024" w:history="1">
+      <w:hyperlink w:anchor="_Toc240032071" w:history="1">
         <w:r>
           <w:rPr>
             <w:rStyle w:val="Hyperlink"/>
@@ -1071,7 +1071,7 @@
             <w:noProof/>
             <w:webHidden/>
           </w:rPr>
-          <w:instrText xml:space="preserve"> PAGEREF _Toc240014024 \h </w:instrText>
+          <w:instrText xml:space="preserve"> PAGEREF _Toc240032071 \h </w:instrText>
         </w:r>
         <w:r>
           <w:rPr>
@@ -1091,7 +1091,7 @@
             <w:noProof/>
             <w:webHidden/>
           </w:rPr>
-          <w:t>11</w:t>
+          <w:t>9</w:t>
         </w:r>
         <w:r>
           <w:rPr>
@@ -1116,7 +1116,7 @@
           <w:lang w:val="en-ID" w:eastAsia="en-ID"/>
         </w:rPr>
       </w:pPr>
-      <w:hyperlink w:anchor="_Toc240014025" w:history="1">
+      <w:hyperlink w:anchor="_Toc240032072" w:history="1">
         <w:r>
           <w:rPr>
             <w:rStyle w:val="Hyperlink"/>
@@ -1143,7 +1143,7 @@
             <w:noProof/>
             <w:webHidden/>
           </w:rPr>
-          <w:instrText xml:space="preserve"> PAGEREF _Toc240014025 \h </w:instrText>
+          <w:instrText xml:space="preserve"> PAGEREF _Toc240032072 \h </w:instrText>
         </w:r>
         <w:r>
           <w:rPr>
@@ -1163,7 +1163,7 @@
             <w:noProof/>
             <w:webHidden/>
           </w:rPr>
-          <w:t>11</w:t>
+          <w:t>10</w:t>
         </w:r>
         <w:r>
           <w:rPr>
@@ -1188,7 +1188,7 @@
           <w:lang w:val="en-ID" w:eastAsia="en-ID"/>
         </w:rPr>
       </w:pPr>
-      <w:hyperlink w:anchor="_Toc240014026" w:history="1">
+      <w:hyperlink w:anchor="_Toc240032073" w:history="1">
         <w:r>
           <w:rPr>
             <w:rStyle w:val="Hyperlink"/>
@@ -1215,7 +1215,7 @@
             <w:noProof/>
             <w:webHidden/>
           </w:rPr>
-          <w:instrText xml:space="preserve"> PAGEREF _Toc240014026 \h </w:instrText>
+          <w:instrText xml:space="preserve"> PAGEREF _Toc240032073 \h </w:instrText>
         </w:r>
         <w:r>
           <w:rPr>
@@ -1235,7 +1235,7 @@
             <w:noProof/>
             <w:webHidden/>
           </w:rPr>
-          <w:t>11</w:t>
+          <w:t>10</w:t>
         </w:r>
         <w:r>
           <w:rPr>
@@ -1260,7 +1260,7 @@
       <w:pPr>
         <w:pStyle w:val="Heading1"/>
       </w:pPr>
-      <w:bookmarkStart w:id="0" w:name="_Toc240014014"/>
+      <w:bookmarkStart w:id="0" w:name="_Toc240032061"/>
       <w:r>
         <w:lastRenderedPageBreak/>
         <w:t>About This Document</w:t>
@@ -1276,6 +1276,51 @@
       </w:r>
       <w:r>
         <w:t>n subsequent revisions.</w:t>
+      </w:r>
+    </w:p>
+    <w:p>
+      <w:pPr>
+        <w:spacing w:after="200"/>
+      </w:pPr>
+      <w:r>
+        <w:rPr>
+          <w:i/>
+          <w:sz w:val="19"/>
+        </w:rPr>
+        <w:t>Original excerpt, Section 2, Items 1–4 — source: IECEx ATEX Certification Information Requirements (ExCB):</w:t>
+      </w:r>
+      <w:r>
+        <w:rPr>
+          <w:i/>
+          <w:sz w:val="19"/>
+        </w:rPr>
+        <w:br/>
+        <w:t>“1) Detailed product description; 2) Product name, model, and specification list; 3) Complete and clear functional descriptio</w:t>
+      </w:r>
+      <w:r>
+        <w:rPr>
+          <w:i/>
+          <w:sz w:val="19"/>
+        </w:rPr>
+        <w:t>n and technical parameters (electrical parameters, mechanical parameters, etc.); 4) Clear product photos (overall and key components).”</w:t>
+      </w:r>
+    </w:p>
+    <w:p>
+      <w:pPr>
+        <w:pStyle w:val="Heading1"/>
+      </w:pPr>
+      <w:bookmarkStart w:id="1" w:name="_Toc240032062"/>
+      <w:r>
+        <w:t>1. Basic Information (Application and Organization)</w:t>
+      </w:r>
+      <w:bookmarkEnd w:id="1"/>
+    </w:p>
+    <w:p>
+      <w:r>
+        <w:t xml:space="preserve">Covers the application form, business license/company registration, </w:t>
+      </w:r>
+      <w:r>
+        <w:t>organizational chart and contact information, manufacturing facility address and profile, and (where applicable) ISO 9001 certification.</w:t>
       </w:r>
     </w:p>
     <w:tbl>
@@ -1311,117 +1356,7 @@
                 <w:color w:val="4A4A4A"/>
                 <w:sz w:val="20"/>
               </w:rPr>
-              <w:t>Current certification scope — Node Sensor (GLD) only. The Cluster Head and LoRa Gateway units are assumed to operate exclusively in non-hazardous (safe) areas and therefore fall outside the scope of this IECEx/ATEX certification — t</w:t>
-            </w:r>
-            <w:r>
-              <w:rPr>
-                <w:color w:val="4A4A4A"/>
-                <w:sz w:val="20"/>
-              </w:rPr>
-              <w:t>his is a project working assumption, not the outcome of a formal area classification study by the end client. Specification tables for the Cluster Head and Gateway are included in Sections 2.2–2.3 for system context only (the three device types share signi</w:t>
-            </w:r>
-            <w:r>
-              <w:rPr>
-                <w:color w:val="4A4A4A"/>
-                <w:sz w:val="20"/>
-              </w:rPr>
-              <w:t>ficant architecture and components), not as certification subjects.</w:t>
-            </w:r>
-          </w:p>
-        </w:tc>
-      </w:tr>
-    </w:tbl>
-    <w:p>
-      <w:pPr>
-        <w:spacing w:after="80"/>
-      </w:pPr>
-    </w:p>
-    <w:p>
-      <w:pPr>
-        <w:spacing w:after="200"/>
-      </w:pPr>
-      <w:r>
-        <w:rPr>
-          <w:i/>
-          <w:sz w:val="19"/>
-        </w:rPr>
-        <w:t>Original excerpt, Section 2, Items 1–4 — source: IECEx ATEX Certification Information Requirements (ExCB):</w:t>
-      </w:r>
-      <w:r>
-        <w:rPr>
-          <w:i/>
-          <w:sz w:val="19"/>
-        </w:rPr>
-        <w:br/>
-        <w:t>“1) Detailed product description; 2) Product name, model, and specification lis</w:t>
-      </w:r>
-      <w:r>
-        <w:rPr>
-          <w:i/>
-          <w:sz w:val="19"/>
-        </w:rPr>
-        <w:t>t; 3) Complete and clear functional description and technical parameters (electrical parameters, mechanical parameters, etc.); 4) Clear product photos (overall and key components).”</w:t>
-      </w:r>
-    </w:p>
-    <w:p>
-      <w:pPr>
-        <w:pStyle w:val="Heading1"/>
-      </w:pPr>
-      <w:bookmarkStart w:id="1" w:name="_Toc240014015"/>
-      <w:r>
-        <w:t>1. Basic Information (Application and Organization)</w:t>
-      </w:r>
-      <w:bookmarkEnd w:id="1"/>
-    </w:p>
-    <w:p>
-      <w:r>
-        <w:t>Covers the application</w:t>
-      </w:r>
-      <w:r>
-        <w:t xml:space="preserve"> form, business license/company registration, organizational chart and contact information, manufacturing facility address and profile, and (where applicable) ISO 9001 certification.</w:t>
-      </w:r>
-    </w:p>
-    <w:tbl>
-      <w:tblPr>
-        <w:tblW w:w="0" w:type="auto"/>
-        <w:jc w:val="center"/>
-        <w:tblLook w:val="04A0" w:firstRow="1" w:lastRow="0" w:firstColumn="1" w:lastColumn="0" w:noHBand="0" w:noVBand="1"/>
-      </w:tblPr>
-      <w:tblGrid>
-        <w:gridCol w:w="9746"/>
-      </w:tblGrid>
-      <w:tr>
-        <w:trPr>
-          <w:jc w:val="center"/>
-        </w:trPr>
-        <w:tc>
-          <w:tcPr>
-            <w:tcW w:w="9746" w:type="dxa"/>
-            <w:tcBorders>
-              <w:top w:val="single" w:sz="4" w:space="0" w:color="B9D3E0"/>
-              <w:left w:val="single" w:sz="4" w:space="0" w:color="B9D3E0"/>
-              <w:bottom w:val="single" w:sz="4" w:space="0" w:color="B9D3E0"/>
-              <w:right w:val="single" w:sz="4" w:space="0" w:color="B9D3E0"/>
-            </w:tcBorders>
-            <w:shd w:val="clear" w:color="auto" w:fill="E4F2FA"/>
-          </w:tcPr>
-          <w:p>
-            <w:pPr>
-              <w:spacing w:after="40"/>
-            </w:pPr>
-            <w:r>
-              <w:rPr>
-                <w:color w:val="4A4A4A"/>
-                <w:sz w:val="20"/>
-              </w:rPr>
-              <w:t>Not yet prepared in this revision. To be completed in a subsequent revisi</w:t>
-            </w:r>
-            <w:r>
-              <w:rPr>
-                <w:color w:val="4A4A4A"/>
-                <w:sz w:val="20"/>
-              </w:rPr>
-              <w:t>on.</w:t>
+              <w:t>Not yet prepared in this revision. To be completed in a subsequent revision.</w:t>
             </w:r>
           </w:p>
         </w:tc>
@@ -1436,7 +1371,7 @@
       <w:pPr>
         <w:pStyle w:val="Heading1"/>
       </w:pPr>
-      <w:bookmarkStart w:id="2" w:name="_Toc240014016"/>
+      <w:bookmarkStart w:id="2" w:name="_Toc240032063"/>
       <w:r>
         <w:t>2. Technical Documentation</w:t>
       </w:r>
@@ -1444,14 +1379,17 @@
     </w:p>
     <w:p>
       <w:r>
-        <w:t>Nine items per the original checklist (1–9, with Item 6 comprising sub-items a–i). This revision addresses Items 1–4; Items 5–9 will follow.</w:t>
+        <w:t>Nine items pe</w:t>
+      </w:r>
+      <w:r>
+        <w:t>r the original checklist (1–9, with Item 6 comprising sub-items a–i). This revision addresses Items 1–4; Items 5–9 will follow.</w:t>
       </w:r>
     </w:p>
     <w:p>
       <w:pPr>
         <w:pStyle w:val="Heading2"/>
       </w:pPr>
-      <w:bookmarkStart w:id="3" w:name="_Toc240014017"/>
+      <w:bookmarkStart w:id="3" w:name="_Toc240032064"/>
       <w:r>
         <w:t>2.1 · Detailed Product Description</w:t>
       </w:r>
@@ -1459,60 +1397,54 @@
     </w:p>
     <w:p>
       <w:r>
-        <w:t xml:space="preserve">The Gas Leak Detector (GLD) Node Sensor is an </w:t>
+        <w:t xml:space="preserve">The Gas Leak Detector (GLD) is an IoT-based, multi-sensor gas leak detection device </w:t>
       </w:r>
       <w:r>
-        <w:t>IoT-based, multi-sensor gas leak detection device designed for the early detection of flammable and process gases in oil &amp; gas refinery environments (process units, tank farms, pipe racks, and storage/loading-unloading areas). It is one of three device typ</w:t>
+        <w:t>designed for the early detection of flammable and process gases in oil &amp; gas refinery environments (process units, tank farms, pipe racks, and storage/loading-unloading areas). This document addresses the GLD unit itself as the subject of the current IECEx</w:t>
       </w:r>
       <w:r>
-        <w:t>es within the broader GLD V2 system — Node Sensor (GLD), Cluster Head, and LoRa Gateway — however only the Node Sensor is the subject of the current IECEx/ATEX certification (see scope note above).</w:t>
+        <w:t>/ATEX certification.</w:t>
       </w:r>
     </w:p>
     <w:p>
       <w:r>
-        <w:t>Functionally, the Node Sensor integrates eight channels of</w:t>
+        <w:t>Functionally, the GLD integrates eight channels of metal-oxide semiconductor gas sensors (MQ series), an edge-AI microcontroller/processor (ESP32-S3), and a LoRa radio module (star-topology wireless transmission) within a single fixed-</w:t>
       </w:r>
       <w:r>
-        <w:t xml:space="preserve"> metal-oxide semiconductor gas sensors (MQ series), an edge-AI microcontroller/processor (ESP32-S3), and a LoRa radio module (star topology to the nearest Cluster Head) within a single fixed-point unit installed at locations with gas-leak risk. An on-devic</w:t>
+        <w:t>point unit installed at locations with gas-leak risk. An on-device AI gas-classification model (CNN Dual-Branch architecture) runs directly on the unit — confirmed by the engineering team; written verification within firmware documentation has not yet been</w:t>
       </w:r>
       <w:r>
-        <w:t>e AI gas-classification model (CNN Dual-Branch architecture) runs directly on the unit — confirmed by the engineering team; written verification within firmware documentation has not yet been completed — so that detection decisions do not depend on a conti</w:t>
+        <w:t xml:space="preserve"> completed — so that detection decisions do not depend on a continuous connection to a central server. When gas concentration exceeds a defined threshold, the unit triggers a local alarm (an integrated visual/audible alarm module) and simultaneously transm</w:t>
       </w:r>
       <w:r>
-        <w:t xml:space="preserve">nuous connection to a central server. When gas concentration exceeds a defined threshold, the </w:t>
-      </w:r>
-      <w:r>
-        <w:lastRenderedPageBreak/>
-        <w:t>unit triggers a local alarm (an integrated visual/audible alarm module) and simultaneously transmits an alarm notification over the LoRa network to the Cluster He</w:t>
-      </w:r>
-      <w:r>
-        <w:t>ad, which forwards it to the operator dashboard.</w:t>
+        <w:t>its an alarm notification over the LoRa network to the operator dashboard.</w:t>
       </w:r>
     </w:p>
     <w:p>
       <w:r>
-        <w:t>The enclosure is designed for hazardous-area deployment at refinery sites, using metal materials (aluminum alloy and stainless steel — no plastic or PVC) and mounted via an L-bracket to existing structures w</w:t>
+        <w:t>The enclosure is designed for hazardous-area deployment at refinery sites, using metal materials (aluminum alloy and stainless steel — no plastic or PVC) and mounted via an L-bracke</w:t>
       </w:r>
       <w:r>
-        <w:t>ithout drilling or welding. Important: this design-intent statement does not constitute a claim that the enclosure has passed testing or has been Ex-certified — the explosion-protection scheme, gas group, temperature class, and target installation zone wil</w:t>
+        <w:t>t to existing structures without drilling or welding. Important: this design-intent statement does not constitute a claim that the enclosure has passed testing or has been Ex-certified — the explosion-protection scheme, gas group, temperature class, and ta</w:t>
       </w:r>
       <w:r>
-        <w:t>l be addressed in Section 2.5 (to follow).</w:t>
+        <w:t>rget installation zone will be addressed in Section 2.5 (to follow).</w:t>
       </w:r>
     </w:p>
     <w:p>
       <w:r>
-        <w:t xml:space="preserve">The current production power configuration is continuous 24 VDC, supplied via an AC/DC adapter connected to the site electrical supply. A portable battery power path (Li-ion 18650) remains under development (R&amp;D) </w:t>
+        <w:lastRenderedPageBreak/>
+        <w:t>The current production power configuration is continuous 24 VDC, supplied via an AC/DC adapter connected to the site electrical supply. A portable battery power path (Li-ion 18650) remain</w:t>
       </w:r>
       <w:r>
-        <w:t>and has not become a deployed production configuration.</w:t>
+        <w:t>s under development (R&amp;D) and has not become a deployed production configuration.</w:t>
       </w:r>
     </w:p>
     <w:p>
       <w:pPr>
         <w:pStyle w:val="Heading2"/>
       </w:pPr>
-      <w:bookmarkStart w:id="4" w:name="_Toc240014018"/>
+      <w:bookmarkStart w:id="4" w:name="_Toc240032065"/>
       <w:r>
         <w:t>2.2 · Product Name, Model, and Specification List</w:t>
       </w:r>
@@ -1618,7 +1550,7 @@
                 <w:color w:val="4A4A4A"/>
                 <w:sz w:val="19"/>
               </w:rPr>
-              <w:t>Related system devices</w:t>
+              <w:t>Manufacturer</w:t>
             </w:r>
           </w:p>
         </w:tc>
@@ -1634,13 +1566,13 @@
               <w:rPr>
                 <w:sz w:val="20"/>
               </w:rPr>
-              <w:t xml:space="preserve">LoRa Cluster Head, LoRa Gateway </w:t>
+              <w:t xml:space="preserve">PT LAPI Ganesha </w:t>
             </w:r>
             <w:r>
               <w:rPr>
                 <w:sz w:val="20"/>
               </w:rPr>
-              <w:t>(outside certification scope)</w:t>
+              <w:t>Utama</w:t>
             </w:r>
           </w:p>
         </w:tc>
@@ -1661,7 +1593,7 @@
                 <w:color w:val="4A4A4A"/>
                 <w:sz w:val="19"/>
               </w:rPr>
-              <w:t>Manufacturer</w:t>
+              <w:t>Technical development partner</w:t>
             </w:r>
           </w:p>
         </w:tc>
@@ -1677,7 +1609,7 @@
               <w:rPr>
                 <w:sz w:val="20"/>
               </w:rPr>
-              <w:t>PT LAPI Ganesha Utama</w:t>
+              <w:t>Institute of Technology Bandung — IoT Laboratory &amp; Physics Laboratory</w:t>
             </w:r>
           </w:p>
         </w:tc>
@@ -1698,7 +1630,7 @@
                 <w:color w:val="4A4A4A"/>
                 <w:sz w:val="19"/>
               </w:rPr>
-              <w:t>Technical development partner</w:t>
+              <w:t>End client / program owner</w:t>
             </w:r>
           </w:p>
         </w:tc>
@@ -1714,7 +1646,7 @@
               <w:rPr>
                 <w:sz w:val="20"/>
               </w:rPr>
-              <w:t>Institute of Technology Bandung — IoT Laboratory &amp; Physics Laboratory</w:t>
+              <w:t>PT Pertamina Patra Niaga (initial deployment site: Refinery Unit IV, Cilacap)</w:t>
             </w:r>
           </w:p>
         </w:tc>
@@ -1735,7 +1667,7 @@
                 <w:color w:val="4A4A4A"/>
                 <w:sz w:val="19"/>
               </w:rPr>
-              <w:t>End client / program owner</w:t>
+              <w:t>Primary function</w:t>
             </w:r>
           </w:p>
         </w:tc>
@@ -1751,13 +1683,161 @@
               <w:rPr>
                 <w:sz w:val="20"/>
               </w:rPr>
-              <w:t xml:space="preserve">PT Pertamina Patra Niaga (initial deployment site: </w:t>
+              <w:t xml:space="preserve">Acquisition of </w:t>
             </w:r>
             <w:r>
               <w:rPr>
                 <w:sz w:val="20"/>
               </w:rPr>
-              <w:t>Refinery Unit IV, Cilacap)</w:t>
+              <w:t>8-channel gas sensor data and LoRa transmission</w:t>
+            </w:r>
+          </w:p>
+        </w:tc>
+      </w:tr>
+      <w:tr>
+        <w:tc>
+          <w:tcPr>
+            <w:tcW w:w="3168" w:type="dxa"/>
+            <w:shd w:val="clear" w:color="auto" w:fill="EFEFEF"/>
+          </w:tcPr>
+          <w:p>
+            <w:pPr>
+              <w:spacing w:after="40"/>
+            </w:pPr>
+            <w:r>
+              <w:rPr>
+                <w:b/>
+                <w:color w:val="4A4A4A"/>
+                <w:sz w:val="19"/>
+              </w:rPr>
+              <w:t>Microcontroller</w:t>
+            </w:r>
+          </w:p>
+        </w:tc>
+        <w:tc>
+          <w:tcPr>
+            <w:tcW w:w="6192" w:type="dxa"/>
+          </w:tcPr>
+          <w:p>
+            <w:pPr>
+              <w:spacing w:after="40"/>
+            </w:pPr>
+            <w:r>
+              <w:rPr>
+                <w:sz w:val="20"/>
+              </w:rPr>
+              <w:t>ESP32-S3-WROOM-1U</w:t>
+            </w:r>
+          </w:p>
+        </w:tc>
+      </w:tr>
+      <w:tr>
+        <w:tc>
+          <w:tcPr>
+            <w:tcW w:w="3168" w:type="dxa"/>
+            <w:shd w:val="clear" w:color="auto" w:fill="EFEFEF"/>
+          </w:tcPr>
+          <w:p>
+            <w:pPr>
+              <w:spacing w:after="40"/>
+            </w:pPr>
+            <w:r>
+              <w:rPr>
+                <w:b/>
+                <w:color w:val="4A4A4A"/>
+                <w:sz w:val="19"/>
+              </w:rPr>
+              <w:t>LoRa radio module</w:t>
+            </w:r>
+          </w:p>
+        </w:tc>
+        <w:tc>
+          <w:tcPr>
+            <w:tcW w:w="6192" w:type="dxa"/>
+          </w:tcPr>
+          <w:p>
+            <w:pPr>
+              <w:spacing w:after="40"/>
+            </w:pPr>
+            <w:r>
+              <w:rPr>
+                <w:sz w:val="20"/>
+              </w:rPr>
+              <w:t>E22-900MM22S</w:t>
+            </w:r>
+          </w:p>
+        </w:tc>
+      </w:tr>
+      <w:tr>
+        <w:tc>
+          <w:tcPr>
+            <w:tcW w:w="3168" w:type="dxa"/>
+            <w:shd w:val="clear" w:color="auto" w:fill="EFEFEF"/>
+          </w:tcPr>
+          <w:p>
+            <w:pPr>
+              <w:spacing w:after="40"/>
+            </w:pPr>
+            <w:r>
+              <w:rPr>
+                <w:b/>
+                <w:color w:val="4A4A4A"/>
+                <w:sz w:val="19"/>
+              </w:rPr>
+              <w:t>Dimensions (L×W×H)</w:t>
+            </w:r>
+          </w:p>
+        </w:tc>
+        <w:tc>
+          <w:tcPr>
+            <w:tcW w:w="6192" w:type="dxa"/>
+          </w:tcPr>
+          <w:p>
+            <w:pPr>
+              <w:spacing w:after="40"/>
+            </w:pPr>
+            <w:r>
+              <w:rPr>
+                <w:sz w:val="20"/>
+              </w:rPr>
+              <w:t>200 × 90 × 290 mm</w:t>
+            </w:r>
+          </w:p>
+        </w:tc>
+      </w:tr>
+      <w:tr>
+        <w:tc>
+          <w:tcPr>
+            <w:tcW w:w="3168" w:type="dxa"/>
+            <w:shd w:val="clear" w:color="auto" w:fill="EFEFEF"/>
+          </w:tcPr>
+          <w:p>
+            <w:pPr>
+              <w:spacing w:after="40"/>
+            </w:pPr>
+            <w:r>
+              <w:rPr>
+                <w:b/>
+                <w:color w:val="4A4A4A"/>
+                <w:sz w:val="19"/>
+              </w:rPr>
+              <w:t>Enclosure material</w:t>
+            </w:r>
+          </w:p>
+        </w:tc>
+        <w:tc>
+          <w:tcPr>
+            <w:tcW w:w="6192" w:type="dxa"/>
+          </w:tcPr>
+          <w:p>
+            <w:pPr>
+              <w:spacing w:after="40"/>
+            </w:pPr>
+            <w:r>
+              <w:rPr>
+                <w:sz w:val="20"/>
+              </w:rPr>
+              <w:t>Aluminum alloy + stainless steel</w:t>
             </w:r>
           </w:p>
         </w:tc>
@@ -1770,838 +1850,12 @@
     </w:p>
     <w:p>
       <w:r>
-        <w:t>The table below summarizes indicative specifications for all three device types within the GLD V2 system, provided for system-architecture context. The certification subject is the “Node Sensor (GLD)” column only.</w:t>
-      </w:r>
-    </w:p>
-    <w:tbl>
-      <w:tblPr>
-        <w:tblStyle w:val="TableGrid"/>
-        <w:tblW w:w="0" w:type="auto"/>
-        <w:jc w:val="center"/>
-        <w:tblLook w:val="04A0" w:firstRow="1" w:lastRow="0" w:firstColumn="1" w:lastColumn="0" w:noHBand="0" w:noVBand="1"/>
-      </w:tblPr>
-      <w:tblGrid>
-        <w:gridCol w:w="2448"/>
-        <w:gridCol w:w="2304"/>
-        <w:gridCol w:w="2304"/>
-        <w:gridCol w:w="2304"/>
-      </w:tblGrid>
-      <w:tr>
-        <w:trPr>
-          <w:jc w:val="center"/>
-        </w:trPr>
-        <w:tc>
-          <w:tcPr>
-            <w:tcW w:w="2448" w:type="dxa"/>
-            <w:shd w:val="clear" w:color="auto" w:fill="EFEFEF"/>
-          </w:tcPr>
-          <w:p>
-            <w:pPr>
-              <w:spacing w:after="40"/>
-            </w:pPr>
-            <w:r>
-              <w:rPr>
-                <w:b/>
-                <w:color w:val="4A4A4A"/>
-                <w:sz w:val="18"/>
-              </w:rPr>
-              <w:t>PARAMETER</w:t>
-            </w:r>
-          </w:p>
-        </w:tc>
-        <w:tc>
-          <w:tcPr>
-            <w:tcW w:w="2304" w:type="dxa"/>
-            <w:shd w:val="clear" w:color="auto" w:fill="EFEFEF"/>
-          </w:tcPr>
-          <w:p>
-            <w:pPr>
-              <w:spacing w:after="40"/>
-            </w:pPr>
-            <w:r>
-              <w:rPr>
-                <w:b/>
-                <w:color w:val="4A4A4A"/>
-                <w:sz w:val="18"/>
-              </w:rPr>
-              <w:t>NOD</w:t>
-            </w:r>
-            <w:r>
-              <w:rPr>
-                <w:b/>
-                <w:color w:val="4A4A4A"/>
-                <w:sz w:val="18"/>
-              </w:rPr>
-              <w:t>E SENSOR (GLD)</w:t>
-            </w:r>
-          </w:p>
-        </w:tc>
-        <w:tc>
-          <w:tcPr>
-            <w:tcW w:w="2304" w:type="dxa"/>
-            <w:shd w:val="clear" w:color="auto" w:fill="EFEFEF"/>
-          </w:tcPr>
-          <w:p>
-            <w:pPr>
-              <w:spacing w:after="40"/>
-            </w:pPr>
-            <w:r>
-              <w:rPr>
-                <w:b/>
-                <w:color w:val="4A4A4A"/>
-                <w:sz w:val="18"/>
-              </w:rPr>
-              <w:t>CLUSTER HEAD</w:t>
-            </w:r>
-          </w:p>
-        </w:tc>
-        <w:tc>
-          <w:tcPr>
-            <w:tcW w:w="2304" w:type="dxa"/>
-            <w:shd w:val="clear" w:color="auto" w:fill="EFEFEF"/>
-          </w:tcPr>
-          <w:p>
-            <w:pPr>
-              <w:spacing w:after="40"/>
-            </w:pPr>
-            <w:r>
-              <w:rPr>
-                <w:b/>
-                <w:color w:val="4A4A4A"/>
-                <w:sz w:val="18"/>
-              </w:rPr>
-              <w:t>LORA GATEWAY</w:t>
-            </w:r>
-          </w:p>
-        </w:tc>
-      </w:tr>
-      <w:tr>
-        <w:trPr>
-          <w:jc w:val="center"/>
-        </w:trPr>
-        <w:tc>
-          <w:tcPr>
-            <w:tcW w:w="2448" w:type="dxa"/>
-          </w:tcPr>
-          <w:p>
-            <w:pPr>
-              <w:spacing w:after="40"/>
-            </w:pPr>
-            <w:r>
-              <w:rPr>
-                <w:b/>
-                <w:sz w:val="19"/>
-              </w:rPr>
-              <w:t>Primary function</w:t>
-            </w:r>
-          </w:p>
-        </w:tc>
-        <w:tc>
-          <w:tcPr>
-            <w:tcW w:w="2304" w:type="dxa"/>
-          </w:tcPr>
-          <w:p>
-            <w:pPr>
-              <w:spacing w:after="40"/>
-            </w:pPr>
-            <w:r>
-              <w:rPr>
-                <w:sz w:val="19"/>
-              </w:rPr>
-              <w:t>Acquisition of 8-channel gas sensor data and LoRa transmission</w:t>
-            </w:r>
-          </w:p>
-        </w:tc>
-        <w:tc>
-          <w:tcPr>
-            <w:tcW w:w="2304" w:type="dxa"/>
-          </w:tcPr>
-          <w:p>
-            <w:pPr>
-              <w:spacing w:after="40"/>
-            </w:pPr>
-            <w:r>
-              <w:rPr>
-                <w:sz w:val="19"/>
-              </w:rPr>
-              <w:t>Aggregates data from multiple Node Sensors and forwards to the Gateway</w:t>
-            </w:r>
-          </w:p>
-        </w:tc>
-        <w:tc>
-          <w:tcPr>
-            <w:tcW w:w="2304" w:type="dxa"/>
-          </w:tcPr>
-          <w:p>
-            <w:pPr>
-              <w:spacing w:after="40"/>
-            </w:pPr>
-            <w:r>
-              <w:rPr>
-                <w:sz w:val="19"/>
-              </w:rPr>
-              <w:t>Bridges the field LoRa network to the server</w:t>
-            </w:r>
-          </w:p>
-        </w:tc>
-      </w:tr>
-      <w:tr>
-        <w:trPr>
-          <w:jc w:val="center"/>
-        </w:trPr>
-        <w:tc>
-          <w:tcPr>
-            <w:tcW w:w="2448" w:type="dxa"/>
-          </w:tcPr>
-          <w:p>
-            <w:pPr>
-              <w:spacing w:after="40"/>
-            </w:pPr>
-            <w:r>
-              <w:rPr>
-                <w:b/>
-                <w:sz w:val="19"/>
-              </w:rPr>
-              <w:t>Model/version</w:t>
-            </w:r>
-          </w:p>
-        </w:tc>
-        <w:tc>
-          <w:tcPr>
-            <w:tcW w:w="2304" w:type="dxa"/>
-          </w:tcPr>
-          <w:p>
-            <w:pPr>
-              <w:spacing w:after="40"/>
-            </w:pPr>
-            <w:r>
-              <w:rPr>
-                <w:sz w:val="19"/>
-              </w:rPr>
-              <w:t>V2</w:t>
-            </w:r>
-          </w:p>
-        </w:tc>
-        <w:tc>
-          <w:tcPr>
-            <w:tcW w:w="2304" w:type="dxa"/>
-          </w:tcPr>
-          <w:p>
-            <w:pPr>
-              <w:spacing w:after="40"/>
-            </w:pPr>
-            <w:r>
-              <w:rPr>
-                <w:sz w:val="19"/>
-              </w:rPr>
-              <w:t>V2</w:t>
-            </w:r>
-          </w:p>
-        </w:tc>
-        <w:tc>
-          <w:tcPr>
-            <w:tcW w:w="2304" w:type="dxa"/>
-          </w:tcPr>
-          <w:p>
-            <w:pPr>
-              <w:spacing w:after="40"/>
-            </w:pPr>
-            <w:r>
-              <w:rPr>
-                <w:sz w:val="19"/>
-              </w:rPr>
-              <w:t>V2</w:t>
-            </w:r>
-          </w:p>
-        </w:tc>
-      </w:tr>
-      <w:tr>
-        <w:trPr>
-          <w:jc w:val="center"/>
-        </w:trPr>
-        <w:tc>
-          <w:tcPr>
-            <w:tcW w:w="2448" w:type="dxa"/>
-          </w:tcPr>
-          <w:p>
-            <w:pPr>
-              <w:spacing w:after="40"/>
-            </w:pPr>
-            <w:r>
-              <w:rPr>
-                <w:b/>
-                <w:sz w:val="19"/>
-              </w:rPr>
-              <w:t>Microcontroller</w:t>
-            </w:r>
-          </w:p>
-        </w:tc>
-        <w:tc>
-          <w:tcPr>
-            <w:tcW w:w="2304" w:type="dxa"/>
-          </w:tcPr>
-          <w:p>
-            <w:pPr>
-              <w:spacing w:after="40"/>
-            </w:pPr>
-            <w:r>
-              <w:rPr>
-                <w:sz w:val="19"/>
-              </w:rPr>
-              <w:t>ESP32-S3-WROOM-1U</w:t>
-            </w:r>
-          </w:p>
-        </w:tc>
-        <w:tc>
-          <w:tcPr>
-            <w:tcW w:w="2304" w:type="dxa"/>
-          </w:tcPr>
-          <w:p>
-            <w:pPr>
-              <w:spacing w:after="40"/>
-            </w:pPr>
-            <w:r>
-              <w:rPr>
-                <w:sz w:val="19"/>
-              </w:rPr>
-              <w:t>ESP32-S3-WROOM-1U</w:t>
-            </w:r>
-          </w:p>
-        </w:tc>
-        <w:tc>
-          <w:tcPr>
-            <w:tcW w:w="2304" w:type="dxa"/>
-          </w:tcPr>
-          <w:p>
-            <w:pPr>
-              <w:spacing w:after="40"/>
-            </w:pPr>
-            <w:r>
-              <w:rPr>
-                <w:sz w:val="19"/>
-              </w:rPr>
-              <w:t>ESP32-S3-WROOM-1U</w:t>
-            </w:r>
-          </w:p>
-        </w:tc>
-      </w:tr>
-      <w:tr>
-        <w:trPr>
-          <w:jc w:val="center"/>
-        </w:trPr>
-        <w:tc>
-          <w:tcPr>
-            <w:tcW w:w="2448" w:type="dxa"/>
-          </w:tcPr>
-          <w:p>
-            <w:pPr>
-              <w:spacing w:after="40"/>
-            </w:pPr>
-            <w:r>
-              <w:rPr>
-                <w:b/>
-                <w:sz w:val="19"/>
-              </w:rPr>
-              <w:t>LoRa radio module</w:t>
-            </w:r>
-          </w:p>
-        </w:tc>
-        <w:tc>
-          <w:tcPr>
-            <w:tcW w:w="2304" w:type="dxa"/>
-          </w:tcPr>
-          <w:p>
-            <w:pPr>
-              <w:spacing w:after="40"/>
-            </w:pPr>
-            <w:r>
-              <w:rPr>
-                <w:sz w:val="19"/>
-              </w:rPr>
-              <w:t>E22-900MM22S</w:t>
-            </w:r>
-          </w:p>
-        </w:tc>
-        <w:tc>
-          <w:tcPr>
-            <w:tcW w:w="2304" w:type="dxa"/>
-          </w:tcPr>
-          <w:p>
-            <w:pPr>
-              <w:spacing w:after="40"/>
-            </w:pPr>
-            <w:r>
-              <w:rPr>
-                <w:sz w:val="19"/>
-              </w:rPr>
-              <w:t>E22-900MM22S</w:t>
-            </w:r>
-          </w:p>
-        </w:tc>
-        <w:tc>
-          <w:tcPr>
-            <w:tcW w:w="2304" w:type="dxa"/>
-          </w:tcPr>
-          <w:p>
-            <w:pPr>
-              <w:spacing w:after="40"/>
-            </w:pPr>
-            <w:r>
-              <w:rPr>
-                <w:sz w:val="19"/>
-              </w:rPr>
-              <w:t>E22-900MM22S</w:t>
-            </w:r>
-          </w:p>
-        </w:tc>
-      </w:tr>
-      <w:tr>
-        <w:trPr>
-          <w:jc w:val="center"/>
-        </w:trPr>
-        <w:tc>
-          <w:tcPr>
-            <w:tcW w:w="2448" w:type="dxa"/>
-          </w:tcPr>
-          <w:p>
-            <w:pPr>
-              <w:spacing w:after="40"/>
-            </w:pPr>
-            <w:r>
-              <w:rPr>
-                <w:b/>
-                <w:sz w:val="19"/>
-              </w:rPr>
-              <w:t>Power input</w:t>
-            </w:r>
-          </w:p>
-        </w:tc>
-        <w:tc>
-          <w:tcPr>
-            <w:tcW w:w="2304" w:type="dxa"/>
-          </w:tcPr>
-          <w:p>
-            <w:pPr>
-              <w:spacing w:after="40"/>
-            </w:pPr>
-            <w:r>
-              <w:rPr>
-                <w:sz w:val="19"/>
-              </w:rPr>
-              <w:t>24 VDC, ≈0.33 A</w:t>
-            </w:r>
-          </w:p>
-        </w:tc>
-        <w:tc>
-          <w:tcPr>
-            <w:tcW w:w="2304" w:type="dxa"/>
-          </w:tcPr>
-          <w:p>
-            <w:pPr>
-              <w:spacing w:after="40"/>
-            </w:pPr>
-            <w:r>
-              <w:rPr>
-                <w:sz w:val="19"/>
-              </w:rPr>
-              <w:t>5 VDC (battery + solar)</w:t>
-            </w:r>
-          </w:p>
-        </w:tc>
-        <w:tc>
-          <w:tcPr>
-            <w:tcW w:w="2304" w:type="dxa"/>
-          </w:tcPr>
-          <w:p>
-            <w:pPr>
-              <w:spacing w:after="40"/>
-            </w:pPr>
-            <w:r>
-              <w:rPr>
-                <w:sz w:val="19"/>
-              </w:rPr>
-              <w:t>5 VDC, AC/DC adapter</w:t>
-            </w:r>
-          </w:p>
-        </w:tc>
-      </w:tr>
-      <w:tr>
-        <w:trPr>
-          <w:jc w:val="center"/>
-        </w:trPr>
-        <w:tc>
-          <w:tcPr>
-            <w:tcW w:w="2448" w:type="dxa"/>
-          </w:tcPr>
-          <w:p>
-            <w:pPr>
-              <w:spacing w:after="40"/>
-            </w:pPr>
-            <w:r>
-              <w:rPr>
-                <w:b/>
-                <w:sz w:val="19"/>
-              </w:rPr>
-              <w:t>Max. power consumption</w:t>
-            </w:r>
-          </w:p>
-        </w:tc>
-        <w:tc>
-          <w:tcPr>
-            <w:tcW w:w="2304" w:type="dxa"/>
-          </w:tcPr>
-          <w:p>
-            <w:pPr>
-              <w:spacing w:after="40"/>
-            </w:pPr>
-            <w:r>
-              <w:rPr>
-                <w:sz w:val="19"/>
-              </w:rPr>
-              <w:t xml:space="preserve">7.995 </w:t>
-            </w:r>
-            <w:r>
-              <w:rPr>
-                <w:sz w:val="19"/>
-              </w:rPr>
-              <w:t>W</w:t>
-            </w:r>
-          </w:p>
-        </w:tc>
-        <w:tc>
-          <w:tcPr>
-            <w:tcW w:w="2304" w:type="dxa"/>
-          </w:tcPr>
-          <w:p>
-            <w:pPr>
-              <w:spacing w:after="40"/>
-            </w:pPr>
-            <w:r>
-              <w:rPr>
-                <w:sz w:val="19"/>
-              </w:rPr>
-              <w:t>0.73 W</w:t>
-            </w:r>
-          </w:p>
-        </w:tc>
-        <w:tc>
-          <w:tcPr>
-            <w:tcW w:w="2304" w:type="dxa"/>
-          </w:tcPr>
-          <w:p>
-            <w:pPr>
-              <w:spacing w:after="40"/>
-            </w:pPr>
-            <w:r>
-              <w:rPr>
-                <w:sz w:val="19"/>
-              </w:rPr>
-              <w:t>0.73 W</w:t>
-            </w:r>
-          </w:p>
-        </w:tc>
-      </w:tr>
-      <w:tr>
-        <w:trPr>
-          <w:jc w:val="center"/>
-        </w:trPr>
-        <w:tc>
-          <w:tcPr>
-            <w:tcW w:w="2448" w:type="dxa"/>
-          </w:tcPr>
-          <w:p>
-            <w:pPr>
-              <w:spacing w:after="40"/>
-            </w:pPr>
-            <w:r>
-              <w:rPr>
-                <w:b/>
-                <w:sz w:val="19"/>
-              </w:rPr>
-              <w:t>Dimensions (L×W×H)</w:t>
-            </w:r>
-          </w:p>
-        </w:tc>
-        <w:tc>
-          <w:tcPr>
-            <w:tcW w:w="2304" w:type="dxa"/>
-          </w:tcPr>
-          <w:p>
-            <w:pPr>
-              <w:spacing w:after="40"/>
-            </w:pPr>
-            <w:r>
-              <w:rPr>
-                <w:sz w:val="19"/>
-              </w:rPr>
-              <w:t>200 × 90 × 290 mm</w:t>
-            </w:r>
-          </w:p>
-        </w:tc>
-        <w:tc>
-          <w:tcPr>
-            <w:tcW w:w="2304" w:type="dxa"/>
-          </w:tcPr>
-          <w:p>
-            <w:pPr>
-              <w:spacing w:after="40"/>
-            </w:pPr>
-            <w:r>
-              <w:rPr>
-                <w:sz w:val="19"/>
-              </w:rPr>
-              <w:t>80 × 80 × 210 mm</w:t>
-            </w:r>
-          </w:p>
-        </w:tc>
-        <w:tc>
-          <w:tcPr>
-            <w:tcW w:w="2304" w:type="dxa"/>
-          </w:tcPr>
-          <w:p>
-            <w:pPr>
-              <w:spacing w:after="40"/>
-            </w:pPr>
-            <w:r>
-              <w:rPr>
-                <w:sz w:val="19"/>
-              </w:rPr>
-              <w:t>80 × 80 × 210 mm</w:t>
-            </w:r>
-          </w:p>
-        </w:tc>
-      </w:tr>
-      <w:tr>
-        <w:trPr>
-          <w:jc w:val="center"/>
-        </w:trPr>
-        <w:tc>
-          <w:tcPr>
-            <w:tcW w:w="2448" w:type="dxa"/>
-          </w:tcPr>
-          <w:p>
-            <w:pPr>
-              <w:spacing w:after="40"/>
-            </w:pPr>
-            <w:r>
-              <w:rPr>
-                <w:b/>
-                <w:sz w:val="19"/>
-              </w:rPr>
-              <w:t>Enclosure material</w:t>
-            </w:r>
-          </w:p>
-        </w:tc>
-        <w:tc>
-          <w:tcPr>
-            <w:tcW w:w="2304" w:type="dxa"/>
-          </w:tcPr>
-          <w:p>
-            <w:pPr>
-              <w:spacing w:after="40"/>
-            </w:pPr>
-            <w:r>
-              <w:rPr>
-                <w:sz w:val="19"/>
-              </w:rPr>
-              <w:t>Aluminum alloy + stainless steel</w:t>
-            </w:r>
-          </w:p>
-        </w:tc>
-        <w:tc>
-          <w:tcPr>
-            <w:tcW w:w="2304" w:type="dxa"/>
-          </w:tcPr>
-          <w:p>
-            <w:pPr>
-              <w:spacing w:after="40"/>
-            </w:pPr>
-            <w:r>
-              <w:rPr>
-                <w:sz w:val="19"/>
-              </w:rPr>
-              <w:t>Aluminum alloy + stainless steel</w:t>
-            </w:r>
-          </w:p>
-        </w:tc>
-        <w:tc>
-          <w:tcPr>
-            <w:tcW w:w="2304" w:type="dxa"/>
-          </w:tcPr>
-          <w:p>
-            <w:pPr>
-              <w:spacing w:after="40"/>
-            </w:pPr>
-            <w:r>
-              <w:rPr>
-                <w:sz w:val="19"/>
-              </w:rPr>
-              <w:t>Aluminum alloy + stainless steel</w:t>
-            </w:r>
-          </w:p>
-        </w:tc>
-      </w:tr>
-      <w:tr>
-        <w:trPr>
-          <w:jc w:val="center"/>
-        </w:trPr>
-        <w:tc>
-          <w:tcPr>
-            <w:tcW w:w="2448" w:type="dxa"/>
-          </w:tcPr>
-          <w:p>
-            <w:pPr>
-              <w:spacing w:after="40"/>
-            </w:pPr>
-            <w:r>
-              <w:rPr>
-                <w:b/>
-                <w:sz w:val="19"/>
-              </w:rPr>
-              <w:t>IP rating</w:t>
-            </w:r>
-          </w:p>
-        </w:tc>
-        <w:tc>
-          <w:tcPr>
-            <w:tcW w:w="2304" w:type="dxa"/>
-          </w:tcPr>
-          <w:p>
-            <w:pPr>
-              <w:spacing w:after="40"/>
-            </w:pPr>
-            <w:r>
-              <w:rPr>
-                <w:b/>
-                <w:color w:val="B02A37"/>
-                <w:sz w:val="19"/>
-              </w:rPr>
-              <w:t>Pending confirmation</w:t>
-            </w:r>
-          </w:p>
-        </w:tc>
-        <w:tc>
-          <w:tcPr>
-            <w:tcW w:w="2304" w:type="dxa"/>
-          </w:tcPr>
-          <w:p>
-            <w:pPr>
-              <w:spacing w:after="40"/>
-            </w:pPr>
-            <w:r>
-              <w:rPr>
-                <w:b/>
-                <w:color w:val="149174"/>
-                <w:sz w:val="19"/>
-              </w:rPr>
-              <w:t>IP66/67</w:t>
-            </w:r>
-          </w:p>
-        </w:tc>
-        <w:tc>
-          <w:tcPr>
-            <w:tcW w:w="2304" w:type="dxa"/>
-          </w:tcPr>
-          <w:p>
-            <w:pPr>
-              <w:spacing w:after="40"/>
-            </w:pPr>
-            <w:r>
-              <w:rPr>
-                <w:b/>
-                <w:color w:val="B56A1E"/>
-                <w:sz w:val="19"/>
-              </w:rPr>
-              <w:t>Likely equivalent to CH; not yet confirmed</w:t>
-            </w:r>
-          </w:p>
-        </w:tc>
-      </w:tr>
-      <w:tr>
-        <w:trPr>
-          <w:jc w:val="center"/>
-        </w:trPr>
-        <w:tc>
-          <w:tcPr>
-            <w:tcW w:w="2448" w:type="dxa"/>
-          </w:tcPr>
-          <w:p>
-            <w:pPr>
-              <w:spacing w:after="40"/>
-            </w:pPr>
-            <w:r>
-              <w:rPr>
-                <w:b/>
-                <w:sz w:val="19"/>
-              </w:rPr>
-              <w:t>Certification subject (ATEX/IECEx)?</w:t>
-            </w:r>
-          </w:p>
-        </w:tc>
-        <w:tc>
-          <w:tcPr>
-            <w:tcW w:w="2304" w:type="dxa"/>
-          </w:tcPr>
-          <w:p>
-            <w:pPr>
-              <w:spacing w:after="40"/>
-            </w:pPr>
-            <w:r>
-              <w:rPr>
-                <w:sz w:val="19"/>
-              </w:rPr>
-              <w:t>Yes — subject of this document</w:t>
-            </w:r>
-          </w:p>
-        </w:tc>
-        <w:tc>
-          <w:tcPr>
-            <w:tcW w:w="2304" w:type="dxa"/>
-          </w:tcPr>
-          <w:p>
-            <w:pPr>
-              <w:spacing w:after="40"/>
-            </w:pPr>
-            <w:r>
-              <w:rPr>
-                <w:sz w:val="19"/>
-              </w:rPr>
-              <w:t>No (assumed safe area)</w:t>
-            </w:r>
-          </w:p>
-        </w:tc>
-        <w:tc>
-          <w:tcPr>
-            <w:tcW w:w="2304" w:type="dxa"/>
-          </w:tcPr>
-          <w:p>
-            <w:pPr>
-              <w:spacing w:after="40"/>
-            </w:pPr>
-            <w:r>
-              <w:rPr>
-                <w:sz w:val="19"/>
-              </w:rPr>
-              <w:t>No (assumed safe area)</w:t>
-            </w:r>
-          </w:p>
-        </w:tc>
-      </w:tr>
-    </w:tbl>
-    <w:p>
-      <w:pPr>
-        <w:spacing w:after="40"/>
-      </w:pPr>
-    </w:p>
-    <w:p>
-      <w:r>
         <w:rPr>
           <w:i/>
           <w:color w:val="4A4A4A"/>
           <w:sz w:val="18"/>
         </w:rPr>
-        <w:lastRenderedPageBreak/>
-        <w:t xml:space="preserve">Source: internal technical specification documentation (Revision 27 August 2026) and EMC </w:t>
+        <w:t>Source: internal technical specification documen</w:t>
       </w:r>
       <w:r>
         <w:rPr>
@@ -2609,14 +1863,14 @@
           <w:color w:val="4A4A4A"/>
           <w:sz w:val="18"/>
         </w:rPr>
-        <w:t>parameter measurement data (Institute of Technology Bandung, Physics Laboratory).</w:t>
+        <w:t>tation (Revision 27 August 2026) and EMC parameter measurement data (Institute of Technology Bandung, Physics Laboratory).</w:t>
       </w:r>
     </w:p>
     <w:p>
       <w:pPr>
         <w:pStyle w:val="Heading2"/>
       </w:pPr>
-      <w:bookmarkStart w:id="5" w:name="_Toc240014019"/>
+      <w:bookmarkStart w:id="5" w:name="_Toc240032066"/>
       <w:r>
         <w:t>2.3 · Functional Description and Technical Parameters (Electrical, Mechanical, etc.)</w:t>
       </w:r>
@@ -2624,23 +1878,23 @@
     </w:p>
     <w:p>
       <w:r>
-        <w:t>Functional workflow (normal operating mode): sense → process → transmit. Each of the eigh</w:t>
+        <w:t>Functional workflow (normal operating mode): sen</w:t>
       </w:r>
       <w:r>
-        <w:t>t gas sensors continuously samples ambient conditions → data is normalized and classified by the on-device AI model (ESP32-S3) → the result is transmitted via LoRa to the Cluster Head (star topology) at a configurable interval (default 10 seconds), or imme</w:t>
+        <w:t>se → process → transmit. Each of the eight gas sensors continuously samples ambient conditions → data is normalized and classified by the on-device AI model (ESP32-S3) → the result is transmitted over the LoRa network (star-topology transmission) at a conf</w:t>
       </w:r>
       <w:r>
-        <w:t>diately (event-driven) when an alarm condition is detected. Gas alarms are triggered through two parallel channels: a local visual/audible alarm module on the unit itself, and a push notification transmitted over the LoRa network to the dashboard — the ala</w:t>
+        <w:t>igurable interval (default 10 seconds), or immediately (event-driven) when an alarm condition is detected. Gas alarms are triggered through two parallel channels: a local visual/audible alarm module on the unit itself, and a push notification transmitted o</w:t>
       </w:r>
       <w:r>
-        <w:t>rm-push pathway has been successfully tested on a campus mesh network (field validation at a production refinery installation is still pending).</w:t>
+        <w:t>ver the LoRa network to the dashboard — the alarm-push pathway has been successfully tested on a campus mesh network (field validation at a production refinery installation is still pending).</w:t>
       </w:r>
     </w:p>
     <w:p>
       <w:pPr>
         <w:pStyle w:val="Heading3"/>
       </w:pPr>
-      <w:bookmarkStart w:id="6" w:name="_Toc240014020"/>
+      <w:bookmarkStart w:id="6" w:name="_Toc240032067"/>
       <w:r>
         <w:t>2.3.a · Electrical Parameters — Node Sensor (GLD)</w:t>
       </w:r>
@@ -2697,7 +1951,15 @@
                 <w:color w:val="4A4A4A"/>
                 <w:sz w:val="18"/>
               </w:rPr>
-              <w:t>SPECIFICATION</w:t>
+              <w:t>SPEC</w:t>
+            </w:r>
+            <w:r>
+              <w:rPr>
+                <w:b/>
+                <w:color w:val="4A4A4A"/>
+                <w:sz w:val="18"/>
+              </w:rPr>
+              <w:t>IFICATION</w:t>
             </w:r>
           </w:p>
         </w:tc>
@@ -2773,13 +2035,7 @@
               <w:rPr>
                 <w:sz w:val="19"/>
               </w:rPr>
-              <w:t>24 V</w:t>
-            </w:r>
-            <w:r>
-              <w:rPr>
-                <w:sz w:val="19"/>
-              </w:rPr>
-              <w:t>DC</w:t>
+              <w:t>24 VDC</w:t>
             </w:r>
           </w:p>
         </w:tc>
@@ -2907,7 +2163,14 @@
                 <w:b/>
                 <w:sz w:val="19"/>
               </w:rPr>
-              <w:t>AC/DC adapter output</w:t>
+              <w:t xml:space="preserve">AC/DC </w:t>
+            </w:r>
+            <w:r>
+              <w:rPr>
+                <w:b/>
+                <w:sz w:val="19"/>
+              </w:rPr>
+              <w:t>adapter output</w:t>
             </w:r>
           </w:p>
         </w:tc>
@@ -2973,14 +2236,7 @@
                 <w:b/>
                 <w:sz w:val="19"/>
               </w:rPr>
-              <w:t xml:space="preserve">Internal </w:t>
-            </w:r>
-            <w:r>
-              <w:rPr>
-                <w:b/>
-                <w:sz w:val="19"/>
-              </w:rPr>
-              <w:t>operating voltage</w:t>
+              <w:t>Internal operating voltage</w:t>
             </w:r>
           </w:p>
         </w:tc>
@@ -3030,7 +2286,14 @@
               <w:rPr>
                 <w:sz w:val="19"/>
               </w:rPr>
-              <w:t>5 VDC for the MQ sensor/heater circuitry; 3.3 VDC for ESP32-S3 logic. Per-rail current not yet documented separately.</w:t>
+              <w:t xml:space="preserve">5 VDC for the MQ sensor/heater circuitry; 3.3 VDC for ESP32-S3 logic. Per-rail current not yet documented </w:t>
+            </w:r>
+            <w:r>
+              <w:rPr>
+                <w:sz w:val="19"/>
+              </w:rPr>
+              <w:lastRenderedPageBreak/>
+              <w:t>separately.</w:t>
             </w:r>
           </w:p>
         </w:tc>
@@ -3052,6 +2315,7 @@
                 <w:b/>
                 <w:sz w:val="19"/>
               </w:rPr>
+              <w:lastRenderedPageBreak/>
               <w:t>Maximum input current</w:t>
             </w:r>
           </w:p>
@@ -3102,13 +2366,7 @@
               <w:rPr>
                 <w:sz w:val="19"/>
               </w:rPr>
-              <w:t xml:space="preserve">Calculated from measured maximum power </w:t>
-            </w:r>
-            <w:r>
-              <w:rPr>
-                <w:sz w:val="19"/>
-              </w:rPr>
-              <w:t>consumption (7.995 W) divided by 24 VDC.</w:t>
+              <w:t>Calculated from measured maximum power consumption (7.995 W) divided by 24 VDC.</w:t>
             </w:r>
           </w:p>
         </w:tc>
@@ -3180,13 +2438,13 @@
               <w:rPr>
                 <w:sz w:val="19"/>
               </w:rPr>
-              <w:t xml:space="preserve">Applies to the continuous-power configuration. The battery (R&amp;D) configuration is recorded separately at 5.75 W — a different </w:t>
+              <w:t xml:space="preserve">Applies to the continuous-power configuration. The battery (R&amp;D) configuration is recorded </w:t>
             </w:r>
             <w:r>
               <w:rPr>
                 <w:sz w:val="19"/>
               </w:rPr>
-              <w:t>operating mode, not a data conflict.</w:t>
+              <w:t>separately at 5.75 W — a different operating mode, not a data conflict.</w:t>
             </w:r>
           </w:p>
         </w:tc>
@@ -3258,13 +2516,13 @@
               <w:rPr>
                 <w:sz w:val="19"/>
               </w:rPr>
-              <w:t>Not yet a deployed production configuration. Cell/BMS safety certification (e.g., UN 38.</w:t>
+              <w:t>Not yet a deployed production configuration. Cell/BMS</w:t>
             </w:r>
             <w:r>
               <w:rPr>
                 <w:sz w:val="19"/>
               </w:rPr>
-              <w:t>3, IEC 62133) not yet obtained.</w:t>
+              <w:t xml:space="preserve"> safety certification (e.g., UN 38.3, IEC 62133) not yet obtained.</w:t>
             </w:r>
           </w:p>
         </w:tc>
@@ -3351,9 +2609,12 @@
       <w:pPr>
         <w:pStyle w:val="Heading3"/>
       </w:pPr>
-      <w:bookmarkStart w:id="7" w:name="_Toc240014021"/>
+      <w:bookmarkStart w:id="7" w:name="_Toc240032068"/>
       <w:r>
-        <w:t>2.3.b · Sensor and Communication Parameters — Node Sensor (GLD)</w:t>
+        <w:t xml:space="preserve">2.3.b · Sensor and </w:t>
+      </w:r>
+      <w:r>
+        <w:t>Communication Parameters — Node Sensor (GLD)</w:t>
       </w:r>
       <w:bookmarkEnd w:id="7"/>
     </w:p>
@@ -3389,15 +2650,7 @@
                 <w:color w:val="4A4A4A"/>
                 <w:sz w:val="18"/>
               </w:rPr>
-              <w:t>PA</w:t>
-            </w:r>
-            <w:r>
-              <w:rPr>
-                <w:b/>
-                <w:color w:val="4A4A4A"/>
-                <w:sz w:val="18"/>
-              </w:rPr>
-              <w:t>RAMETER</w:t>
+              <w:t>PARAMETER</w:t>
             </w:r>
           </w:p>
         </w:tc>
@@ -3476,7 +2729,6 @@
                 <w:b/>
                 <w:sz w:val="19"/>
               </w:rPr>
-              <w:lastRenderedPageBreak/>
               <w:t>Gas sensors</w:t>
             </w:r>
           </w:p>
@@ -3549,7 +2801,14 @@
                 <w:b/>
                 <w:sz w:val="19"/>
               </w:rPr>
-              <w:t>AI gas-classification model</w:t>
+              <w:t xml:space="preserve">AI </w:t>
+            </w:r>
+            <w:r>
+              <w:rPr>
+                <w:b/>
+                <w:sz w:val="19"/>
+              </w:rPr>
+              <w:t>gas-classification model</w:t>
             </w:r>
           </w:p>
         </w:tc>
@@ -3565,13 +2824,7 @@
               <w:rPr>
                 <w:sz w:val="19"/>
               </w:rPr>
-              <w:t xml:space="preserve">CNN </w:t>
-            </w:r>
-            <w:r>
-              <w:rPr>
-                <w:sz w:val="19"/>
-              </w:rPr>
-              <w:t>Dual-Branch — 4 classes: LPG, CO₂, Clean Air, H₂</w:t>
+              <w:t>CNN Dual-Branch — 4 classes: LPG, CO₂, Clean Air, H₂</w:t>
             </w:r>
           </w:p>
         </w:tc>
@@ -3605,7 +2858,13 @@
               <w:rPr>
                 <w:sz w:val="19"/>
               </w:rPr>
-              <w:t>On-chip accuracy 99.20% (int8, ESP32-S3, 9.14 KB model size). Does not yet cover Benzene, CO, or H₂S (additional client requirement, still open).</w:t>
+              <w:t>On-chip accuracy 99.20% (int8, ESP32-S3, 9.14 KB model size). Does not yet cover Benzene, CO, or H₂S (additional client requiremen</w:t>
+            </w:r>
+            <w:r>
+              <w:rPr>
+                <w:sz w:val="19"/>
+              </w:rPr>
+              <w:t>t, still open).</w:t>
             </w:r>
           </w:p>
         </w:tc>
@@ -3627,14 +2886,7 @@
                 <w:b/>
                 <w:sz w:val="19"/>
               </w:rPr>
-              <w:t>Environmenta</w:t>
-            </w:r>
-            <w:r>
-              <w:rPr>
-                <w:b/>
-                <w:sz w:val="19"/>
-              </w:rPr>
-              <w:t>l sensor (temperature/humidity)</w:t>
+              <w:t>Environmental sensor (temperature/humidity)</w:t>
             </w:r>
           </w:p>
         </w:tc>
@@ -3756,13 +3008,13 @@
               <w:rPr>
                 <w:sz w:val="19"/>
               </w:rPr>
-              <w:t xml:space="preserve">Certified under FCC (2AC7Z-ESPS3WROOM1U), TELEC, and CE (per </w:t>
+              <w:t>Certified under FCC (2AC7Z-ESPS3WROOM</w:t>
             </w:r>
             <w:r>
               <w:rPr>
                 <w:sz w:val="19"/>
               </w:rPr>
-              <w:t>Espressif data) — RF/EMC certifications, not an “Ex component” certification.</w:t>
+              <w:t>1U), TELEC, and CE (per Espressif data) — RF/EMC certifications, not an “Ex component” certification.</w:t>
             </w:r>
           </w:p>
         </w:tc>
@@ -3834,7 +3086,13 @@
               <w:rPr>
                 <w:sz w:val="19"/>
               </w:rPr>
-              <w:t>Certified under CE, FCC, and RoHS (per Ebyte data) — RF/EMC certifications, not an “Ex component” certification.</w:t>
+              <w:t xml:space="preserve">Certified under CE, FCC, and RoHS (per Ebyte data) — RF/EMC certifications, not an “Ex </w:t>
+            </w:r>
+            <w:r>
+              <w:rPr>
+                <w:sz w:val="19"/>
+              </w:rPr>
+              <w:t>component” certification.</w:t>
             </w:r>
           </w:p>
         </w:tc>
@@ -3856,14 +3114,7 @@
                 <w:b/>
                 <w:sz w:val="19"/>
               </w:rPr>
-              <w:t xml:space="preserve">Operating </w:t>
-            </w:r>
-            <w:r>
-              <w:rPr>
-                <w:b/>
-                <w:sz w:val="19"/>
-              </w:rPr>
-              <w:t>frequency</w:t>
+              <w:t>Operating frequency</w:t>
             </w:r>
           </w:p>
         </w:tc>
@@ -3913,7 +3164,7 @@
               <w:rPr>
                 <w:sz w:val="19"/>
               </w:rPr>
-              <w:t>Star topology to the Cluster Head; within the regional 920–923 MHz ISM band (Indonesia).</w:t>
+              <w:t>Star-topology transmission; within the regional 920–923 MHz ISM band (Indonesia).</w:t>
             </w:r>
           </w:p>
         </w:tc>
@@ -3935,7 +3186,15 @@
                 <w:b/>
                 <w:sz w:val="19"/>
               </w:rPr>
-              <w:t>Transmit power (firmware configuration)</w:t>
+              <w:t xml:space="preserve">Transmit power (firmware </w:t>
+            </w:r>
+            <w:r>
+              <w:rPr>
+                <w:b/>
+                <w:sz w:val="19"/>
+              </w:rPr>
+              <w:lastRenderedPageBreak/>
+              <w:t>configuration)</w:t>
             </w:r>
           </w:p>
         </w:tc>
@@ -3951,6 +3210,7 @@
               <w:rPr>
                 <w:sz w:val="19"/>
               </w:rPr>
+              <w:lastRenderedPageBreak/>
               <w:t>17 dBm</w:t>
             </w:r>
           </w:p>
@@ -3985,12 +3245,19 @@
               <w:rPr>
                 <w:sz w:val="19"/>
               </w:rPr>
-              <w:t xml:space="preserve">The radio module supports up to 22 dBm — 17 dBm is an operational </w:t>
+              <w:t xml:space="preserve">The radio module supports up to 22 dBm — 17 dBm is an </w:t>
             </w:r>
             <w:r>
               <w:rPr>
                 <w:sz w:val="19"/>
               </w:rPr>
+              <w:t xml:space="preserve">operational </w:t>
+            </w:r>
+            <w:r>
+              <w:rPr>
+                <w:sz w:val="19"/>
+              </w:rPr>
+              <w:lastRenderedPageBreak/>
               <w:t>configuration, not the module's maximum limit.</w:t>
             </w:r>
           </w:p>
@@ -4013,6 +3280,7 @@
                 <w:b/>
                 <w:sz w:val="19"/>
               </w:rPr>
+              <w:lastRenderedPageBreak/>
               <w:t>Bandwidth / spreading factor</w:t>
             </w:r>
           </w:p>
@@ -4135,13 +3403,13 @@
               <w:rPr>
                 <w:sz w:val="19"/>
               </w:rPr>
-              <w:t xml:space="preserve">On some units, the 2.4 GHz Wi-Fi antenna remains </w:t>
+              <w:t>On some units, the 2.4 GHz Wi-Fi antenna rema</w:t>
             </w:r>
             <w:r>
               <w:rPr>
                 <w:sz w:val="19"/>
               </w:rPr>
-              <w:t>inside the enclosure and must be relocated externally.</w:t>
+              <w:t>ins inside the enclosure and must be relocated externally.</w:t>
             </w:r>
           </w:p>
         </w:tc>
@@ -4285,13 +3553,13 @@
               <w:rPr>
                 <w:sz w:val="19"/>
               </w:rPr>
-              <w:t>External ports/conne</w:t>
+              <w:t xml:space="preserve">External </w:t>
             </w:r>
             <w:r>
               <w:rPr>
                 <w:sz w:val="19"/>
               </w:rPr>
-              <w:t>ctors: USB, sensor, power, fan, antenna, alarm buzzer.</w:t>
+              <w:t>ports/connectors: USB, sensor, power, fan, antenna, alarm buzzer.</w:t>
             </w:r>
           </w:p>
         </w:tc>
@@ -4306,7 +3574,7 @@
       <w:pPr>
         <w:pStyle w:val="Heading3"/>
       </w:pPr>
-      <w:bookmarkStart w:id="8" w:name="_Toc240014022"/>
+      <w:bookmarkStart w:id="8" w:name="_Toc240032069"/>
       <w:r>
         <w:t>2.3.c · Mechanical Parameters — Node Sensor (GLD)</w:t>
       </w:r>
@@ -4473,13 +3741,13 @@
               <w:rPr>
                 <w:sz w:val="19"/>
               </w:rPr>
-              <w:t xml:space="preserve">PVC is not used in any </w:t>
+              <w:t xml:space="preserve">PVC is not used in </w:t>
             </w:r>
             <w:r>
               <w:rPr>
                 <w:sz w:val="19"/>
               </w:rPr>
-              <w:t>housing or bracket component. Specific grade still under determination.</w:t>
+              <w:t>any housing or bracket component. Specific grade still under determination.</w:t>
             </w:r>
           </w:p>
         </w:tc>
@@ -4501,7 +3769,6 @@
                 <w:b/>
                 <w:sz w:val="19"/>
               </w:rPr>
-              <w:lastRenderedPageBreak/>
               <w:t>Dimensions (L × W × H)</w:t>
             </w:r>
           </w:p>
@@ -4608,15 +3875,7 @@
                 <w:color w:val="B02A37"/>
                 <w:sz w:val="19"/>
               </w:rPr>
-              <w:t xml:space="preserve">Pending </w:t>
-            </w:r>
-            <w:r>
-              <w:rPr>
-                <w:b/>
-                <w:color w:val="B02A37"/>
-                <w:sz w:val="19"/>
-              </w:rPr>
-              <w:t>confirmation</w:t>
+              <w:t>Pending confirmation</w:t>
             </w:r>
           </w:p>
         </w:tc>
@@ -4782,7 +4041,7 @@
               <w:rPr>
                 <w:sz w:val="19"/>
               </w:rPr>
-              <w:t>tested/determined for the Node Sensor (the Cluster Head is already rated IP66/67).</w:t>
+              <w:t>tested/determined.</w:t>
             </w:r>
           </w:p>
         </w:tc>
@@ -4942,14 +4201,7 @@
                 <w:b/>
                 <w:sz w:val="19"/>
               </w:rPr>
-              <w:t xml:space="preserve">Operating </w:t>
-            </w:r>
-            <w:r>
-              <w:rPr>
-                <w:b/>
-                <w:sz w:val="19"/>
-              </w:rPr>
-              <w:t>temperature</w:t>
+              <w:t>Operating temperature</w:t>
             </w:r>
           </w:p>
         </w:tc>
@@ -4999,7 +4251,13 @@
               <w:rPr>
                 <w:sz w:val="19"/>
               </w:rPr>
-              <w:t>Ambient operating temperature range not yet determined — key parameter for temperature class (T1–T6) determination in Section 2.5.</w:t>
+              <w:t xml:space="preserve">Ambient operating temperature range not yet </w:t>
+            </w:r>
+            <w:r>
+              <w:rPr>
+                <w:sz w:val="19"/>
+              </w:rPr>
+              <w:t>determined — key parameter for temperature class (T1–T6) determination in Section 2.5.</w:t>
             </w:r>
           </w:p>
         </w:tc>
@@ -5083,7 +4341,7 @@
           <w:color w:val="4A4A4A"/>
           <w:sz w:val="18"/>
         </w:rPr>
-        <w:t>Source: internal technical specification doc</w:t>
+        <w:t>Source: internal technical specification documentation, Sections 1.1–1.3 (Node Sensor), cross-referenced with EMC parameter</w:t>
       </w:r>
       <w:r>
         <w:rPr>
@@ -5091,7 +4349,7 @@
           <w:color w:val="4A4A4A"/>
           <w:sz w:val="18"/>
         </w:rPr>
-        <w:t>umentation, Sections 1.1–1.3 (Node Sensor), cross-referenced with EMC parameter data and component certification verification (ESP32-S3-WROOM-1U, E22-900MM22S).</w:t>
+        <w:t xml:space="preserve"> data and component certification verification (ESP32-S3-WROOM-1U, E22-900MM22S).</w:t>
       </w:r>
     </w:p>
     <w:tbl>
@@ -5127,14 +4385,22 @@
                 <w:color w:val="4A4A4A"/>
                 <w:sz w:val="20"/>
               </w:rPr>
-              <w:t xml:space="preserve">Rows marked “Pending confirmation” above do not reflect a documentation oversight — this is an </w:t>
+              <w:t xml:space="preserve">Rows marked “Pending confirmation” above do not reflect a documentation oversight — this is an honest status </w:t>
             </w:r>
             <w:r>
               <w:rPr>
                 <w:color w:val="4A4A4A"/>
                 <w:sz w:val="20"/>
               </w:rPr>
-              <w:t>honest status indicator. These fields are intentionally left blank because no official data yet exists (not yet measured, tested, or decided). They must not be filled with estimates in future revisions without a clear supporting data source.</w:t>
+              <w:lastRenderedPageBreak/>
+              <w:t>indicator. These fields are intentionally left blank because no o</w:t>
+            </w:r>
+            <w:r>
+              <w:rPr>
+                <w:color w:val="4A4A4A"/>
+                <w:sz w:val="20"/>
+              </w:rPr>
+              <w:t>fficial data yet exists (not yet measured, tested, or decided). They must not be filled with estimates in future revisions without a clear supporting data source.</w:t>
             </w:r>
           </w:p>
         </w:tc>
@@ -5149,21 +4415,18 @@
       <w:pPr>
         <w:pStyle w:val="Heading2"/>
       </w:pPr>
-      <w:bookmarkStart w:id="9" w:name="_Toc240014023"/>
+      <w:bookmarkStart w:id="9" w:name="_Toc240032070"/>
       <w:r>
-        <w:t xml:space="preserve">2.4 · </w:t>
-      </w:r>
-      <w:r>
-        <w:t>Product Photographs — Overall and Key Components</w:t>
+        <w:t>2.4 · Product Photographs — Overall and Key Components</w:t>
       </w:r>
       <w:bookmarkEnd w:id="9"/>
     </w:p>
     <w:p>
       <w:r>
-        <w:t xml:space="preserve">The seven photographs below were taken directly from the Node Sensor (GLD) V2 prototype unit (no capture-date metadata is available in the source files). The first three photographs show the fully assembled </w:t>
+        <w:t xml:space="preserve">The seven photographs below were </w:t>
       </w:r>
       <w:r>
-        <w:t>unit from different angles; the remaining four show key components in close-up.</w:t>
+        <w:t>taken directly from the Node Sensor (GLD) V2 prototype unit (no capture-date metadata is available in the source files). The first three photographs show the fully assembled unit from different angles; the remaining four show key components in close-up.</w:t>
       </w:r>
     </w:p>
     <w:tbl>
@@ -5193,9 +4456,8 @@
               <w:rPr>
                 <w:noProof/>
               </w:rPr>
-              <w:lastRenderedPageBreak/>
               <w:drawing>
-                <wp:inline distT="0" distB="0" distL="0" distR="0" wp14:anchorId="7668AA99" wp14:editId="28659AA8">
+                <wp:inline distT="0" distB="0" distL="0" distR="0" wp14:anchorId="6985D951" wp14:editId="4EEEF302">
                   <wp:extent cx="2514600" cy="4165753"/>
                   <wp:effectExtent l="0" t="0" r="0" b="0"/>
                   <wp:docPr id="1" name="Picture 1"/>
@@ -5254,14 +4516,7 @@
                 <w:color w:val="4A4A4A"/>
                 <w:sz w:val="17"/>
               </w:rPr>
-              <w:t>The fully assembled Node Sensor (GLD): the main enclosure (blue) with sensor mesh cover, external LoRa antenna, and a visual alarm module (cylindri</w:t>
-            </w:r>
-            <w:r>
-              <w:rPr>
-                <w:color w:val="4A4A4A"/>
-                <w:sz w:val="17"/>
-              </w:rPr>
-              <w:t>cal housing, red lens) mounted on the right side.</w:t>
+              <w:t>The fully assembled Node Sensor (GLD): the main enclosure (blue) with sensor mesh cover, external LoRa antenna, and a visual alarm module (cylindrical housing, red lens) mounted on the right side.</w:t>
             </w:r>
           </w:p>
         </w:tc>
@@ -5279,7 +4534,7 @@
                 <w:noProof/>
               </w:rPr>
               <w:drawing>
-                <wp:inline distT="0" distB="0" distL="0" distR="0" wp14:anchorId="5CEAE83C" wp14:editId="3ADC3165">
+                <wp:inline distT="0" distB="0" distL="0" distR="0" wp14:anchorId="3FED73DC" wp14:editId="13829A7D">
                   <wp:extent cx="2514600" cy="3352800"/>
                   <wp:effectExtent l="0" t="0" r="0" b="0"/>
                   <wp:docPr id="2" name="Picture 2"/>
@@ -5324,7 +4579,14 @@
                 <w:b/>
                 <w:sz w:val="19"/>
               </w:rPr>
-              <w:t>Complete unit — alternate angle</w:t>
+              <w:t>Complete unit — alternate angl</w:t>
+            </w:r>
+            <w:r>
+              <w:rPr>
+                <w:b/>
+                <w:sz w:val="19"/>
+              </w:rPr>
+              <w:t>e</w:t>
             </w:r>
             <w:r>
               <w:rPr>
@@ -5362,7 +4624,7 @@
               </w:rPr>
               <w:lastRenderedPageBreak/>
               <w:drawing>
-                <wp:inline distT="0" distB="0" distL="0" distR="0" wp14:anchorId="2C5FC33D" wp14:editId="70D1C2F0">
+                <wp:inline distT="0" distB="0" distL="0" distR="0" wp14:anchorId="146D5F8A" wp14:editId="42F6F877">
                   <wp:extent cx="2514600" cy="5599312"/>
                   <wp:effectExtent l="0" t="0" r="0" b="0"/>
                   <wp:docPr id="3" name="Picture 3"/>
@@ -5407,20 +4669,13 @@
                 <w:b/>
                 <w:sz w:val="19"/>
               </w:rPr>
-              <w:t>Complete unit — front view (withou</w:t>
+              <w:t>Complete unit — front view (without antenna and alarm module)</w:t>
             </w:r>
             <w:r>
               <w:rPr>
                 <w:b/>
                 <w:sz w:val="19"/>
               </w:rPr>
-              <w:t>t antenna and alarm module)</w:t>
-            </w:r>
-            <w:r>
-              <w:rPr>
-                <w:b/>
-                <w:sz w:val="19"/>
-              </w:rPr>
               <w:br/>
             </w:r>
             <w:r>
@@ -5428,7 +4683,14 @@
                 <w:color w:val="4A4A4A"/>
                 <w:sz w:val="17"/>
               </w:rPr>
-              <w:t>The main enclosure with the sensor mesh cover installed, shown in a flat front view illustrating the enclosure shape and its four mounting bolt holes.</w:t>
+              <w:t>The main enclosure with the sensor mesh cover installe</w:t>
+            </w:r>
+            <w:r>
+              <w:rPr>
+                <w:color w:val="4A4A4A"/>
+                <w:sz w:val="17"/>
+              </w:rPr>
+              <w:t>d, shown in a flat front view illustrating the enclosure shape and its four mounting bolt holes.</w:t>
             </w:r>
           </w:p>
         </w:tc>
@@ -5446,7 +4708,7 @@
                 <w:noProof/>
               </w:rPr>
               <w:drawing>
-                <wp:inline distT="0" distB="0" distL="0" distR="0" wp14:anchorId="3A3071D7" wp14:editId="6F8C1A4C">
+                <wp:inline distT="0" distB="0" distL="0" distR="0" wp14:anchorId="17A6C413" wp14:editId="73BCD462">
                   <wp:extent cx="2514600" cy="5599312"/>
                   <wp:effectExtent l="0" t="0" r="0" b="0"/>
                   <wp:docPr id="4" name="Picture 4"/>
@@ -5505,14 +4767,14 @@
                 <w:color w:val="4A4A4A"/>
                 <w:sz w:val="17"/>
               </w:rPr>
-              <w:t>The main PCB i</w:t>
+              <w:t xml:space="preserve">The main PCB installed inside the enclosure prior to gas sensor module </w:t>
             </w:r>
             <w:r>
               <w:rPr>
                 <w:color w:val="4A4A4A"/>
                 <w:sz w:val="17"/>
               </w:rPr>
-              <w:t>nstalled inside the enclosure prior to gas sensor module installation. The ESP32-S3-WROOM-1U microcontroller, LoRa radio module, and power circuitry are visible.</w:t>
+              <w:t>installation. The ESP32-S3-WROOM-1U microcontroller, LoRa radio module, and power circuitry are visible.</w:t>
             </w:r>
           </w:p>
         </w:tc>
@@ -5536,7 +4798,7 @@
               </w:rPr>
               <w:lastRenderedPageBreak/>
               <w:drawing>
-                <wp:inline distT="0" distB="0" distL="0" distR="0" wp14:anchorId="6CD9C39A" wp14:editId="7931DDA8">
+                <wp:inline distT="0" distB="0" distL="0" distR="0" wp14:anchorId="2E2C9862" wp14:editId="7FDEA6EA">
                   <wp:extent cx="2514600" cy="5599312"/>
                   <wp:effectExtent l="0" t="0" r="0" b="0"/>
                   <wp:docPr id="5" name="Picture 5"/>
@@ -5595,14 +4857,14 @@
                 <w:color w:val="4A4A4A"/>
                 <w:sz w:val="17"/>
               </w:rPr>
-              <w:t>The same PCB with eight channels of MQ-se</w:t>
+              <w:t>The same PCB with eight channels of MQ-series gas sensors (MQ-2, MQ-3B, MQ-4, MQ-5, MQ-6, MQ-7B, M</w:t>
             </w:r>
             <w:r>
               <w:rPr>
                 <w:color w:val="4A4A4A"/>
                 <w:sz w:val="17"/>
               </w:rPr>
-              <w:t>ries gas sensors (MQ-2, MQ-3B, MQ-4, MQ-5, MQ-6, MQ-7B, MQ-8, MQ-135) installed around the central microcontroller.</w:t>
+              <w:t>Q-8, MQ-135) installed around the central microcontroller.</w:t>
             </w:r>
           </w:p>
         </w:tc>
@@ -5620,7 +4882,7 @@
                 <w:noProof/>
               </w:rPr>
               <w:drawing>
-                <wp:inline distT="0" distB="0" distL="0" distR="0" wp14:anchorId="091179D5" wp14:editId="7E7BA755">
+                <wp:inline distT="0" distB="0" distL="0" distR="0" wp14:anchorId="1BB64B82" wp14:editId="3B7B6E4D">
                   <wp:extent cx="2514600" cy="5599312"/>
                   <wp:effectExtent l="0" t="0" r="0" b="0"/>
                   <wp:docPr id="6" name="Picture 6"/>
@@ -5679,14 +4941,7 @@
                 <w:color w:val="4A4A4A"/>
                 <w:sz w:val="17"/>
               </w:rPr>
-              <w:t xml:space="preserve">The visual alarm (beacon/strobe) module, constructed of metal with a red lens, </w:t>
-            </w:r>
-            <w:r>
-              <w:rPr>
-                <w:color w:val="4A4A4A"/>
-                <w:sz w:val="17"/>
-              </w:rPr>
-              <w:t>connected to the main enclosure via a dedicated cable gland.</w:t>
+              <w:t>The visual alarm (beacon/strobe) module, constructed of metal with a red lens, connected to the main enclosure via a dedicated cable gland.</w:t>
             </w:r>
           </w:p>
         </w:tc>
@@ -5710,7 +4965,7 @@
               </w:rPr>
               <w:lastRenderedPageBreak/>
               <w:drawing>
-                <wp:inline distT="0" distB="0" distL="0" distR="0" wp14:anchorId="68CF689B" wp14:editId="77ECDE8B">
+                <wp:inline distT="0" distB="0" distL="0" distR="0" wp14:anchorId="09436308" wp14:editId="793AE253">
                   <wp:extent cx="2514600" cy="5599312"/>
                   <wp:effectExtent l="0" t="0" r="0" b="0"/>
                   <wp:docPr id="7" name="Picture 7"/>
@@ -5755,7 +5010,14 @@
                 <w:b/>
                 <w:sz w:val="19"/>
               </w:rPr>
-              <w:t>Key component — sensor mesh cover (close-up)</w:t>
+              <w:t>Key c</w:t>
+            </w:r>
+            <w:r>
+              <w:rPr>
+                <w:b/>
+                <w:sz w:val="19"/>
+              </w:rPr>
+              <w:t>omponent — sensor mesh cover (close-up)</w:t>
             </w:r>
             <w:r>
               <w:rPr>
@@ -5819,28 +5081,21 @@
                 <w:color w:val="4A4A4A"/>
                 <w:sz w:val="20"/>
               </w:rPr>
-              <w:t>Photographic</w:t>
+              <w:t xml:space="preserve">Photographic completeness — status as-is. The seven photographs above cover </w:t>
             </w:r>
             <w:r>
               <w:rPr>
                 <w:color w:val="4A4A4A"/>
                 <w:sz w:val="20"/>
               </w:rPr>
-              <w:t xml:space="preserve"> completeness — status as-is. The seven photographs above cover the complete unit and its key components (PCB, sensor modules, alarm module, mesh cover), substantively satisfying checklist Item 2.4. Still outstanding: (a) formally labeled photographs of ea</w:t>
+              <w:t>the complete unit and its key components (PCB, sensor modules, alarm module, mesh cover), substantively satisfying checklist Item 2.4. Still outstanding: (a) formally labeled photographs of each face (front/back/left/right/top/bottom) with a scale referenc</w:t>
             </w:r>
             <w:r>
               <w:rPr>
                 <w:color w:val="4A4A4A"/>
                 <w:sz w:val="20"/>
               </w:rPr>
-              <w:t>ch face (front/back/left/right/top/bottom) with a scale reference, as is customary in ExCB submission packages; (b) separate photographs of individual components such as the battery, gaskets/seals, terminals, and cable glands; (c) photographs of the Cluste</w:t>
-            </w:r>
-            <w:r>
-              <w:rPr>
-                <w:color w:val="4A4A4A"/>
-                <w:sz w:val="20"/>
-              </w:rPr>
-              <w:t>r Head and Gateway (currently outside certification scope; see scope note).</w:t>
+              <w:t>e, as is customary in ExCB submission packages; (b) separate photographs of individual components such as the battery, gaskets/seals, terminals, and cable glands.</w:t>
             </w:r>
           </w:p>
         </w:tc>
@@ -5855,10 +5110,12 @@
       <w:pPr>
         <w:pStyle w:val="Heading2"/>
       </w:pPr>
-      <w:bookmarkStart w:id="10" w:name="_Toc240014024"/>
+      <w:bookmarkStart w:id="10" w:name="_Toc240032071"/>
       <w:r>
-        <w:lastRenderedPageBreak/>
-        <w:t>2.5 · Description of Intended Use and Installation Environment (Gas Group, Temperature Class, Area Classification)</w:t>
+        <w:t>2.5 · Description of Intended Use and Installation Environment (Gas Group, Temperature Clas</w:t>
+      </w:r>
+      <w:r>
+        <w:t>s, Area Classification)</w:t>
       </w:r>
       <w:bookmarkEnd w:id="10"/>
     </w:p>
@@ -5895,14 +5152,22 @@
                 <w:color w:val="4A4A4A"/>
                 <w:sz w:val="20"/>
               </w:rPr>
-              <w:t>Not yet prepared in this revision. The classification scheme (g</w:t>
+              <w:t xml:space="preserve">Not yet prepared in this revision. The classification scheme (gas group, temperature class, installation zone) will be </w:t>
             </w:r>
             <w:r>
               <w:rPr>
                 <w:color w:val="4A4A4A"/>
                 <w:sz w:val="20"/>
               </w:rPr>
-              <w:t>as group, temperature class, installation zone) will be finalized based on further technical assessment and confirmed together with the certification body (ExCB / notified body).</w:t>
+              <w:lastRenderedPageBreak/>
+              <w:t>finalized based on further technical assessment and confirmed together with the certification body (ExCB / notifi</w:t>
+            </w:r>
+            <w:r>
+              <w:rPr>
+                <w:color w:val="4A4A4A"/>
+                <w:sz w:val="20"/>
+              </w:rPr>
+              <w:t>ed body).</w:t>
             </w:r>
           </w:p>
         </w:tc>
@@ -5917,12 +5182,9 @@
       <w:pPr>
         <w:pStyle w:val="Heading2"/>
       </w:pPr>
-      <w:bookmarkStart w:id="11" w:name="_Toc240014025"/>
+      <w:bookmarkStart w:id="11" w:name="_Toc240032072"/>
       <w:r>
-        <w:t xml:space="preserve">2.6 · Design and Manufacturing Information (Items a–i: Technical </w:t>
-      </w:r>
-      <w:r>
-        <w:t>Drawings, Bill of Materials, Material Datasheets, Manufacturing Process, Calculations, Draft Manual, Nameplate, Ex Component Certificates)</w:t>
+        <w:t>2.6 · Design and Manufacturing Information (Items a–i: Technical Drawings, Bill of Materials, Material Datasheets, Manufacturing Process, Calculations, Draft Manual, Nameplate, Ex Component Certificates)</w:t>
       </w:r>
       <w:bookmarkEnd w:id="11"/>
     </w:p>
@@ -5959,14 +5221,21 @@
                 <w:color w:val="4A4A4A"/>
                 <w:sz w:val="20"/>
               </w:rPr>
-              <w:t>Not yet prepared in this revision. To be completed in a subsequent revision, covering technical drawings, the bill of</w:t>
+              <w:t>Not yet prepared in this revision. To be</w:t>
             </w:r>
             <w:r>
               <w:rPr>
                 <w:color w:val="4A4A4A"/>
                 <w:sz w:val="20"/>
               </w:rPr>
-              <w:t xml:space="preserve"> materials, material datasheets, a manufacturing process description, explosion-protection calculations, a draft operating/installation manual, nameplate information, and Ex component certificates.</w:t>
+              <w:t xml:space="preserve"> completed in a subsequent revision, covering technical drawings, the bill of materials, material datasheets, a manufacturing process description, explosion-protection calculations, a draft operating/installation manual, nameplate information, and Ex compo</w:t>
+            </w:r>
+            <w:r>
+              <w:rPr>
+                <w:color w:val="4A4A4A"/>
+                <w:sz w:val="20"/>
+              </w:rPr>
+              <w:t>nent certificates.</w:t>
             </w:r>
           </w:p>
         </w:tc>
@@ -5981,7 +5250,7 @@
       <w:pPr>
         <w:pStyle w:val="Heading1"/>
       </w:pPr>
-      <w:bookmarkStart w:id="12" w:name="_Toc240014026"/>
+      <w:bookmarkStart w:id="12" w:name="_Toc240032073"/>
       <w:r>
         <w:t>3. Sample Information</w:t>
       </w:r>
@@ -5989,10 +5258,7 @@
     </w:p>
     <w:p>
       <w:r>
-        <w:t>Model, serial number, and sample s</w:t>
-      </w:r>
-      <w:r>
-        <w:t>tatus (whether the unit can be powered on and operated), together with any required test fixtures or auxiliary equipment.</w:t>
+        <w:t>Model, serial number, and sample status (whether the unit can be powered on and operated), together with any required test fixtures or auxiliary equipment.</w:t>
       </w:r>
     </w:p>
     <w:tbl>
@@ -6050,7 +5316,7 @@
           <w:color w:val="8A8A8A"/>
           <w:sz w:val="17"/>
         </w:rPr>
-        <w:t>This is a working document, prepared in stages, drafted in direct reference to the IECEx/ATEX Ce</w:t>
+        <w:t xml:space="preserve">This is a </w:t>
       </w:r>
       <w:r>
         <w:rPr>
@@ -6058,7 +5324,7 @@
           <w:color w:val="8A8A8A"/>
           <w:sz w:val="17"/>
         </w:rPr>
-        <w:t>rtification Information Requirements (original English/Mandarin version issued by the certification body). Data sources: internal technical specification documentation (Revision 27 August 2026), EMC parameter measurement data (Institute of Technology Bandu</w:t>
+        <w:t>working document, prepared in stages, drafted in direct reference to the IECEx/ATEX Certification Information Requirements (original English/Mandarin version issued by the certification body). Data sources: internal technical specification documentation (R</w:t>
       </w:r>
       <w:r>
         <w:rPr>
@@ -6066,7 +5332,15 @@
           <w:color w:val="8A8A8A"/>
           <w:sz w:val="17"/>
         </w:rPr>
-        <w:t>ng, Physics Laboratory), and product photography. Fields marked “Pending confirmation” are not yet final and must not be relied upon for procurement or certification purposes without further verification.</w:t>
+        <w:t>evision 27 August 2026), EMC parameter measurement data (Institute of Technology Bandung, Physics Laboratory), and product photography. Fields marked “Pending confirmation” are not yet final and must not be relied upon for procurement or certification purp</w:t>
+      </w:r>
+      <w:r>
+        <w:rPr>
+          <w:i/>
+          <w:color w:val="8A8A8A"/>
+          <w:sz w:val="17"/>
+        </w:rPr>
+        <w:t>oses without further verification.</w:t>
       </w:r>
     </w:p>
     <w:sectPr>
@@ -17683,7 +16957,7 @@
     <w:autoRedefine/>
     <w:uiPriority w:val="39"/>
     <w:unhideWhenUsed/>
-    <w:rsid w:val="00B252DF"/>
+    <w:rsid w:val="009A4AE8"/>
     <w:pPr>
       <w:spacing w:after="100"/>
     </w:pPr>
@@ -17695,7 +16969,7 @@
     <w:autoRedefine/>
     <w:uiPriority w:val="39"/>
     <w:unhideWhenUsed/>
-    <w:rsid w:val="00B252DF"/>
+    <w:rsid w:val="009A4AE8"/>
     <w:pPr>
       <w:spacing w:after="100"/>
       <w:ind w:left="210"/>
@@ -17708,7 +16982,7 @@
     <w:autoRedefine/>
     <w:uiPriority w:val="39"/>
     <w:unhideWhenUsed/>
-    <w:rsid w:val="00B252DF"/>
+    <w:rsid w:val="009A4AE8"/>
     <w:pPr>
       <w:spacing w:after="100"/>
       <w:ind w:left="420"/>
@@ -17719,7 +16993,7 @@
     <w:basedOn w:val="DefaultParagraphFont"/>
     <w:uiPriority w:val="99"/>
     <w:unhideWhenUsed/>
-    <w:rsid w:val="00B252DF"/>
+    <w:rsid w:val="009A4AE8"/>
     <w:rPr>
       <w:color w:val="0000FF" w:themeColor="hyperlink"/>
       <w:u w:val="single"/>

</xml_diff>

<commit_message>
Embed full 9-sheet schematic block diagram set in cert doc 2.6.a
Previously only sheet 1/9 (overview) was embedded. All 9 sheets from
PertaminaGLD's schematic trace (architecture, main power, always-on,
sensor module, analog acquisition, I2C/sensor control, ESP32
connections, alarm/status, system flow) are now downloaded, converted
to PNG, and reproduced in full with English captions. PDF/DOCX grow
from 18/16 to 21/21 pages.

Co-Authored-By: Claude Sonnet 5 <noreply@anthropic.com>
</commit_message>
<xml_diff>
--- a/Deliverables/Dokumen_Teknis_Sertifikasi_GLD_IECEx_ATEX.docx
+++ b/Deliverables/Dokumen_Teknis_Sertifikasi_GLD_IECEx_ATEX.docx
@@ -692,7 +692,7 @@
       <w:r>
         <w:fldChar w:fldCharType="separate"/>
       </w:r>
-      <w:hyperlink w:anchor="_Toc240033928" w:history="1">
+      <w:hyperlink w:anchor="_Toc240036146" w:history="1">
         <w:r>
           <w:rPr>
             <w:rStyle w:val="Hyperlink"/>
@@ -719,7 +719,7 @@
             <w:noProof/>
             <w:webHidden/>
           </w:rPr>
-          <w:instrText xml:space="preserve"> PAGEREF _Toc240033928 \h </w:instrText>
+          <w:instrText xml:space="preserve"> PAGEREF _Toc240036146 \h </w:instrText>
         </w:r>
         <w:r>
           <w:rPr>
@@ -764,7 +764,7 @@
           <w:lang w:val="en-ID" w:eastAsia="en-ID"/>
         </w:rPr>
       </w:pPr>
-      <w:hyperlink w:anchor="_Toc240033929" w:history="1">
+      <w:hyperlink w:anchor="_Toc240036147" w:history="1">
         <w:r>
           <w:rPr>
             <w:rStyle w:val="Hyperlink"/>
@@ -791,7 +791,7 @@
             <w:noProof/>
             <w:webHidden/>
           </w:rPr>
-          <w:instrText xml:space="preserve"> PAGEREF _Toc240033929 \h </w:instrText>
+          <w:instrText xml:space="preserve"> PAGEREF _Toc240036147 \h </w:instrText>
         </w:r>
         <w:r>
           <w:rPr>
@@ -836,7 +836,7 @@
           <w:lang w:val="en-ID" w:eastAsia="en-ID"/>
         </w:rPr>
       </w:pPr>
-      <w:hyperlink w:anchor="_Toc240033930" w:history="1">
+      <w:hyperlink w:anchor="_Toc240036148" w:history="1">
         <w:r>
           <w:rPr>
             <w:rStyle w:val="Hyperlink"/>
@@ -863,7 +863,7 @@
             <w:noProof/>
             <w:webHidden/>
           </w:rPr>
-          <w:instrText xml:space="preserve"> PAGEREF _Toc240033930 \h </w:instrText>
+          <w:instrText xml:space="preserve"> PAGEREF _Toc240036148 \h </w:instrText>
         </w:r>
         <w:r>
           <w:rPr>
@@ -908,7 +908,7 @@
           <w:lang w:val="en-ID" w:eastAsia="en-ID"/>
         </w:rPr>
       </w:pPr>
-      <w:hyperlink w:anchor="_Toc240033931" w:history="1">
+      <w:hyperlink w:anchor="_Toc240036149" w:history="1">
         <w:r>
           <w:rPr>
             <w:rStyle w:val="Hyperlink"/>
@@ -935,7 +935,7 @@
             <w:noProof/>
             <w:webHidden/>
           </w:rPr>
-          <w:instrText xml:space="preserve"> PAGEREF _Toc240033931 \h </w:instrText>
+          <w:instrText xml:space="preserve"> PAGEREF _Toc240036149 \h </w:instrText>
         </w:r>
         <w:r>
           <w:rPr>
@@ -980,7 +980,7 @@
           <w:lang w:val="en-ID" w:eastAsia="en-ID"/>
         </w:rPr>
       </w:pPr>
-      <w:hyperlink w:anchor="_Toc240033932" w:history="1">
+      <w:hyperlink w:anchor="_Toc240036150" w:history="1">
         <w:r>
           <w:rPr>
             <w:rStyle w:val="Hyperlink"/>
@@ -1007,7 +1007,7 @@
             <w:noProof/>
             <w:webHidden/>
           </w:rPr>
-          <w:instrText xml:space="preserve"> PAGEREF _Toc240033932 \h </w:instrText>
+          <w:instrText xml:space="preserve"> PAGEREF _Toc240036150 \h </w:instrText>
         </w:r>
         <w:r>
           <w:rPr>
@@ -1052,7 +1052,7 @@
           <w:lang w:val="en-ID" w:eastAsia="en-ID"/>
         </w:rPr>
       </w:pPr>
-      <w:hyperlink w:anchor="_Toc240033933" w:history="1">
+      <w:hyperlink w:anchor="_Toc240036151" w:history="1">
         <w:r>
           <w:rPr>
             <w:rStyle w:val="Hyperlink"/>
@@ -1079,7 +1079,7 @@
             <w:noProof/>
             <w:webHidden/>
           </w:rPr>
-          <w:instrText xml:space="preserve"> PAGEREF _Toc240033933 \h </w:instrText>
+          <w:instrText xml:space="preserve"> PAGEREF _Toc240036151 \h </w:instrText>
         </w:r>
         <w:r>
           <w:rPr>
@@ -1124,7 +1124,7 @@
           <w:lang w:val="en-ID" w:eastAsia="en-ID"/>
         </w:rPr>
       </w:pPr>
-      <w:hyperlink w:anchor="_Toc240033934" w:history="1">
+      <w:hyperlink w:anchor="_Toc240036152" w:history="1">
         <w:r>
           <w:rPr>
             <w:rStyle w:val="Hyperlink"/>
@@ -1151,7 +1151,7 @@
             <w:noProof/>
             <w:webHidden/>
           </w:rPr>
-          <w:instrText xml:space="preserve"> PAGEREF _Toc240033934 \h </w:instrText>
+          <w:instrText xml:space="preserve"> PAGEREF _Toc240036152 \h </w:instrText>
         </w:r>
         <w:r>
           <w:rPr>
@@ -1196,7 +1196,7 @@
           <w:lang w:val="en-ID" w:eastAsia="en-ID"/>
         </w:rPr>
       </w:pPr>
-      <w:hyperlink w:anchor="_Toc240033935" w:history="1">
+      <w:hyperlink w:anchor="_Toc240036153" w:history="1">
         <w:r>
           <w:rPr>
             <w:rStyle w:val="Hyperlink"/>
@@ -1223,7 +1223,7 @@
             <w:noProof/>
             <w:webHidden/>
           </w:rPr>
-          <w:instrText xml:space="preserve"> PAGEREF _Toc240033935 \h </w:instrText>
+          <w:instrText xml:space="preserve"> PAGEREF _Toc240036153 \h </w:instrText>
         </w:r>
         <w:r>
           <w:rPr>
@@ -1268,7 +1268,7 @@
           <w:lang w:val="en-ID" w:eastAsia="en-ID"/>
         </w:rPr>
       </w:pPr>
-      <w:hyperlink w:anchor="_Toc240033936" w:history="1">
+      <w:hyperlink w:anchor="_Toc240036154" w:history="1">
         <w:r>
           <w:rPr>
             <w:rStyle w:val="Hyperlink"/>
@@ -1295,7 +1295,7 @@
             <w:noProof/>
             <w:webHidden/>
           </w:rPr>
-          <w:instrText xml:space="preserve"> PAGEREF _Toc240033936 \h </w:instrText>
+          <w:instrText xml:space="preserve"> PAGEREF _Toc240036154 \h </w:instrText>
         </w:r>
         <w:r>
           <w:rPr>
@@ -1340,7 +1340,7 @@
           <w:lang w:val="en-ID" w:eastAsia="en-ID"/>
         </w:rPr>
       </w:pPr>
-      <w:hyperlink w:anchor="_Toc240033937" w:history="1">
+      <w:hyperlink w:anchor="_Toc240036155" w:history="1">
         <w:r>
           <w:rPr>
             <w:rStyle w:val="Hyperlink"/>
@@ -1367,7 +1367,7 @@
             <w:noProof/>
             <w:webHidden/>
           </w:rPr>
-          <w:instrText xml:space="preserve"> PAGEREF _Toc240033937 \h </w:instrText>
+          <w:instrText xml:space="preserve"> PAGEREF _Toc240036155 \h </w:instrText>
         </w:r>
         <w:r>
           <w:rPr>
@@ -1412,7 +1412,7 @@
           <w:lang w:val="en-ID" w:eastAsia="en-ID"/>
         </w:rPr>
       </w:pPr>
-      <w:hyperlink w:anchor="_Toc240033938" w:history="1">
+      <w:hyperlink w:anchor="_Toc240036156" w:history="1">
         <w:r>
           <w:rPr>
             <w:rStyle w:val="Hyperlink"/>
@@ -1439,7 +1439,7 @@
             <w:noProof/>
             <w:webHidden/>
           </w:rPr>
-          <w:instrText xml:space="preserve"> PAGEREF _Toc240033938 \h </w:instrText>
+          <w:instrText xml:space="preserve"> PAGEREF _Toc240036156 \h </w:instrText>
         </w:r>
         <w:r>
           <w:rPr>
@@ -1484,7 +1484,7 @@
           <w:lang w:val="en-ID" w:eastAsia="en-ID"/>
         </w:rPr>
       </w:pPr>
-      <w:hyperlink w:anchor="_Toc240033939" w:history="1">
+      <w:hyperlink w:anchor="_Toc240036157" w:history="1">
         <w:r>
           <w:rPr>
             <w:rStyle w:val="Hyperlink"/>
@@ -1511,7 +1511,7 @@
             <w:noProof/>
             <w:webHidden/>
           </w:rPr>
-          <w:instrText xml:space="preserve"> PAGEREF _Toc240033939 \h </w:instrText>
+          <w:instrText xml:space="preserve"> PAGEREF _Toc240036157 \h </w:instrText>
         </w:r>
         <w:r>
           <w:rPr>
@@ -1556,7 +1556,7 @@
           <w:lang w:val="en-ID" w:eastAsia="en-ID"/>
         </w:rPr>
       </w:pPr>
-      <w:hyperlink w:anchor="_Toc240033940" w:history="1">
+      <w:hyperlink w:anchor="_Toc240036158" w:history="1">
         <w:r>
           <w:rPr>
             <w:rStyle w:val="Hyperlink"/>
@@ -1583,7 +1583,7 @@
             <w:noProof/>
             <w:webHidden/>
           </w:rPr>
-          <w:instrText xml:space="preserve"> PAGEREF _Toc240033940 \h </w:instrText>
+          <w:instrText xml:space="preserve"> PAGEREF _Toc240036158 \h </w:instrText>
         </w:r>
         <w:r>
           <w:rPr>
@@ -1628,7 +1628,7 @@
           <w:lang w:val="en-ID" w:eastAsia="en-ID"/>
         </w:rPr>
       </w:pPr>
-      <w:hyperlink w:anchor="_Toc240033941" w:history="1">
+      <w:hyperlink w:anchor="_Toc240036159" w:history="1">
         <w:r>
           <w:rPr>
             <w:rStyle w:val="Hyperlink"/>
@@ -1655,7 +1655,7 @@
             <w:noProof/>
             <w:webHidden/>
           </w:rPr>
-          <w:instrText xml:space="preserve"> PAGEREF _Toc240033941 \h </w:instrText>
+          <w:instrText xml:space="preserve"> PAGEREF _Toc240036159 \h </w:instrText>
         </w:r>
         <w:r>
           <w:rPr>
@@ -1675,7 +1675,7 @@
             <w:noProof/>
             <w:webHidden/>
           </w:rPr>
-          <w:t>14</w:t>
+          <w:t>18</w:t>
         </w:r>
         <w:r>
           <w:rPr>
@@ -1700,7 +1700,7 @@
           <w:lang w:val="en-ID" w:eastAsia="en-ID"/>
         </w:rPr>
       </w:pPr>
-      <w:hyperlink w:anchor="_Toc240033942" w:history="1">
+      <w:hyperlink w:anchor="_Toc240036160" w:history="1">
         <w:r>
           <w:rPr>
             <w:rStyle w:val="Hyperlink"/>
@@ -1727,7 +1727,7 @@
             <w:noProof/>
             <w:webHidden/>
           </w:rPr>
-          <w:instrText xml:space="preserve"> PAGEREF _Toc240033942 \h </w:instrText>
+          <w:instrText xml:space="preserve"> PAGEREF _Toc240036160 \h </w:instrText>
         </w:r>
         <w:r>
           <w:rPr>
@@ -1747,7 +1747,7 @@
             <w:noProof/>
             <w:webHidden/>
           </w:rPr>
-          <w:t>14</w:t>
+          <w:t>18</w:t>
         </w:r>
         <w:r>
           <w:rPr>
@@ -1772,7 +1772,7 @@
           <w:lang w:val="en-ID" w:eastAsia="en-ID"/>
         </w:rPr>
       </w:pPr>
-      <w:hyperlink w:anchor="_Toc240033943" w:history="1">
+      <w:hyperlink w:anchor="_Toc240036161" w:history="1">
         <w:r>
           <w:rPr>
             <w:rStyle w:val="Hyperlink"/>
@@ -1799,7 +1799,7 @@
             <w:noProof/>
             <w:webHidden/>
           </w:rPr>
-          <w:instrText xml:space="preserve"> PAGEREF _Toc240033943 \h </w:instrText>
+          <w:instrText xml:space="preserve"> PAGEREF _Toc240036161 \h </w:instrText>
         </w:r>
         <w:r>
           <w:rPr>
@@ -1819,7 +1819,7 @@
             <w:noProof/>
             <w:webHidden/>
           </w:rPr>
-          <w:t>14</w:t>
+          <w:t>18</w:t>
         </w:r>
         <w:r>
           <w:rPr>
@@ -1844,7 +1844,7 @@
           <w:lang w:val="en-ID" w:eastAsia="en-ID"/>
         </w:rPr>
       </w:pPr>
-      <w:hyperlink w:anchor="_Toc240033944" w:history="1">
+      <w:hyperlink w:anchor="_Toc240036162" w:history="1">
         <w:r>
           <w:rPr>
             <w:rStyle w:val="Hyperlink"/>
@@ -1871,7 +1871,7 @@
             <w:noProof/>
             <w:webHidden/>
           </w:rPr>
-          <w:instrText xml:space="preserve"> PAGEREF _Toc240033944 \h </w:instrText>
+          <w:instrText xml:space="preserve"> PAGEREF _Toc240036162 \h </w:instrText>
         </w:r>
         <w:r>
           <w:rPr>
@@ -1891,7 +1891,7 @@
             <w:noProof/>
             <w:webHidden/>
           </w:rPr>
-          <w:t>14</w:t>
+          <w:t>19</w:t>
         </w:r>
         <w:r>
           <w:rPr>
@@ -1916,7 +1916,7 @@
           <w:lang w:val="en-ID" w:eastAsia="en-ID"/>
         </w:rPr>
       </w:pPr>
-      <w:hyperlink w:anchor="_Toc240033945" w:history="1">
+      <w:hyperlink w:anchor="_Toc240036163" w:history="1">
         <w:r>
           <w:rPr>
             <w:rStyle w:val="Hyperlink"/>
@@ -1943,7 +1943,7 @@
             <w:noProof/>
             <w:webHidden/>
           </w:rPr>
-          <w:instrText xml:space="preserve"> PAGEREF _Toc240033945 \h </w:instrText>
+          <w:instrText xml:space="preserve"> PAGEREF _Toc240036163 \h </w:instrText>
         </w:r>
         <w:r>
           <w:rPr>
@@ -1963,7 +1963,7 @@
             <w:noProof/>
             <w:webHidden/>
           </w:rPr>
-          <w:t>14</w:t>
+          <w:t>19</w:t>
         </w:r>
         <w:r>
           <w:rPr>
@@ -1988,7 +1988,7 @@
           <w:lang w:val="en-ID" w:eastAsia="en-ID"/>
         </w:rPr>
       </w:pPr>
-      <w:hyperlink w:anchor="_Toc240033946" w:history="1">
+      <w:hyperlink w:anchor="_Toc240036164" w:history="1">
         <w:r>
           <w:rPr>
             <w:rStyle w:val="Hyperlink"/>
@@ -2015,7 +2015,7 @@
             <w:noProof/>
             <w:webHidden/>
           </w:rPr>
-          <w:instrText xml:space="preserve"> PAGEREF _Toc240033946 \h </w:instrText>
+          <w:instrText xml:space="preserve"> PAGEREF _Toc240036164 \h </w:instrText>
         </w:r>
         <w:r>
           <w:rPr>
@@ -2035,7 +2035,7 @@
             <w:noProof/>
             <w:webHidden/>
           </w:rPr>
-          <w:t>15</w:t>
+          <w:t>19</w:t>
         </w:r>
         <w:r>
           <w:rPr>
@@ -2060,7 +2060,7 @@
           <w:lang w:val="en-ID" w:eastAsia="en-ID"/>
         </w:rPr>
       </w:pPr>
-      <w:hyperlink w:anchor="_Toc240033947" w:history="1">
+      <w:hyperlink w:anchor="_Toc240036165" w:history="1">
         <w:r>
           <w:rPr>
             <w:rStyle w:val="Hyperlink"/>
@@ -2087,7 +2087,7 @@
             <w:noProof/>
             <w:webHidden/>
           </w:rPr>
-          <w:instrText xml:space="preserve"> PAGEREF _Toc240033947 \h </w:instrText>
+          <w:instrText xml:space="preserve"> PAGEREF _Toc240036165 \h </w:instrText>
         </w:r>
         <w:r>
           <w:rPr>
@@ -2107,7 +2107,7 @@
             <w:noProof/>
             <w:webHidden/>
           </w:rPr>
-          <w:t>15</w:t>
+          <w:t>19</w:t>
         </w:r>
         <w:r>
           <w:rPr>
@@ -2132,7 +2132,7 @@
           <w:lang w:val="en-ID" w:eastAsia="en-ID"/>
         </w:rPr>
       </w:pPr>
-      <w:hyperlink w:anchor="_Toc240033948" w:history="1">
+      <w:hyperlink w:anchor="_Toc240036166" w:history="1">
         <w:r>
           <w:rPr>
             <w:rStyle w:val="Hyperlink"/>
@@ -2159,7 +2159,7 @@
             <w:noProof/>
             <w:webHidden/>
           </w:rPr>
-          <w:instrText xml:space="preserve"> PAGEREF _Toc240033948 \h </w:instrText>
+          <w:instrText xml:space="preserve"> PAGEREF _Toc240036166 \h </w:instrText>
         </w:r>
         <w:r>
           <w:rPr>
@@ -2179,7 +2179,7 @@
             <w:noProof/>
             <w:webHidden/>
           </w:rPr>
-          <w:t>15</w:t>
+          <w:t>20</w:t>
         </w:r>
         <w:r>
           <w:rPr>
@@ -2204,7 +2204,7 @@
           <w:lang w:val="en-ID" w:eastAsia="en-ID"/>
         </w:rPr>
       </w:pPr>
-      <w:hyperlink w:anchor="_Toc240033949" w:history="1">
+      <w:hyperlink w:anchor="_Toc240036167" w:history="1">
         <w:r>
           <w:rPr>
             <w:rStyle w:val="Hyperlink"/>
@@ -2231,7 +2231,7 @@
             <w:noProof/>
             <w:webHidden/>
           </w:rPr>
-          <w:instrText xml:space="preserve"> PAGEREF _Toc240033949 \h </w:instrText>
+          <w:instrText xml:space="preserve"> PAGEREF _Toc240036167 \h </w:instrText>
         </w:r>
         <w:r>
           <w:rPr>
@@ -2251,7 +2251,7 @@
             <w:noProof/>
             <w:webHidden/>
           </w:rPr>
-          <w:t>16</w:t>
+          <w:t>20</w:t>
         </w:r>
         <w:r>
           <w:rPr>
@@ -2276,7 +2276,7 @@
           <w:lang w:val="en-ID" w:eastAsia="en-ID"/>
         </w:rPr>
       </w:pPr>
-      <w:hyperlink w:anchor="_Toc240033950" w:history="1">
+      <w:hyperlink w:anchor="_Toc240036168" w:history="1">
         <w:r>
           <w:rPr>
             <w:rStyle w:val="Hyperlink"/>
@@ -2303,7 +2303,7 @@
             <w:noProof/>
             <w:webHidden/>
           </w:rPr>
-          <w:instrText xml:space="preserve"> PAGEREF _Toc240033950 \h </w:instrText>
+          <w:instrText xml:space="preserve"> PAGEREF _Toc240036168 \h </w:instrText>
         </w:r>
         <w:r>
           <w:rPr>
@@ -2323,7 +2323,7 @@
             <w:noProof/>
             <w:webHidden/>
           </w:rPr>
-          <w:t>16</w:t>
+          <w:t>20</w:t>
         </w:r>
         <w:r>
           <w:rPr>
@@ -2348,7 +2348,7 @@
           <w:lang w:val="en-ID" w:eastAsia="en-ID"/>
         </w:rPr>
       </w:pPr>
-      <w:hyperlink w:anchor="_Toc240033951" w:history="1">
+      <w:hyperlink w:anchor="_Toc240036169" w:history="1">
         <w:r>
           <w:rPr>
             <w:rStyle w:val="Hyperlink"/>
@@ -2375,7 +2375,7 @@
             <w:noProof/>
             <w:webHidden/>
           </w:rPr>
-          <w:instrText xml:space="preserve"> PAGEREF _Toc240033951 \h </w:instrText>
+          <w:instrText xml:space="preserve"> PAGEREF _Toc240036169 \h </w:instrText>
         </w:r>
         <w:r>
           <w:rPr>
@@ -2395,7 +2395,7 @@
             <w:noProof/>
             <w:webHidden/>
           </w:rPr>
-          <w:t>16</w:t>
+          <w:t>20</w:t>
         </w:r>
         <w:r>
           <w:rPr>
@@ -2420,7 +2420,7 @@
       <w:pPr>
         <w:pStyle w:val="Heading1"/>
       </w:pPr>
-      <w:bookmarkStart w:id="0" w:name="_Toc240033928"/>
+      <w:bookmarkStart w:id="0" w:name="_Toc240036146"/>
       <w:r>
         <w:lastRenderedPageBreak/>
         <w:t>About This Document</w:t>
@@ -2487,7 +2487,7 @@
       <w:pPr>
         <w:pStyle w:val="Heading1"/>
       </w:pPr>
-      <w:bookmarkStart w:id="1" w:name="_Toc240033929"/>
+      <w:bookmarkStart w:id="1" w:name="_Toc240036147"/>
       <w:r>
         <w:t>1. Basic Information (Application and Organization)</w:t>
       </w:r>
@@ -2549,7 +2549,7 @@
       <w:pPr>
         <w:pStyle w:val="Heading1"/>
       </w:pPr>
-      <w:bookmarkStart w:id="2" w:name="_Toc240033930"/>
+      <w:bookmarkStart w:id="2" w:name="_Toc240036148"/>
       <w:r>
         <w:t>2. Technical Documentation</w:t>
       </w:r>
@@ -2567,7 +2567,7 @@
       <w:pPr>
         <w:pStyle w:val="Heading2"/>
       </w:pPr>
-      <w:bookmarkStart w:id="3" w:name="_Toc240033931"/>
+      <w:bookmarkStart w:id="3" w:name="_Toc240036149"/>
       <w:r>
         <w:t>2.1 · Detailed Product Description</w:t>
       </w:r>
@@ -2622,7 +2622,7 @@
       <w:pPr>
         <w:pStyle w:val="Heading2"/>
       </w:pPr>
-      <w:bookmarkStart w:id="4" w:name="_Toc240033932"/>
+      <w:bookmarkStart w:id="4" w:name="_Toc240036150"/>
       <w:r>
         <w:t>2.2 · Product Name, Model, and Specification List</w:t>
       </w:r>
@@ -3040,7 +3040,7 @@
       <w:pPr>
         <w:pStyle w:val="Heading2"/>
       </w:pPr>
-      <w:bookmarkStart w:id="5" w:name="_Toc240033933"/>
+      <w:bookmarkStart w:id="5" w:name="_Toc240036151"/>
       <w:r>
         <w:t xml:space="preserve">2.3 · </w:t>
       </w:r>
@@ -3067,7 +3067,7 @@
       <w:pPr>
         <w:pStyle w:val="Heading3"/>
       </w:pPr>
-      <w:bookmarkStart w:id="6" w:name="_Toc240033934"/>
+      <w:bookmarkStart w:id="6" w:name="_Toc240036152"/>
       <w:r>
         <w:t>2.3.a · Electrical Parameters — Node Sensor (GLD)</w:t>
       </w:r>
@@ -3778,7 +3778,7 @@
       <w:pPr>
         <w:pStyle w:val="Heading3"/>
       </w:pPr>
-      <w:bookmarkStart w:id="7" w:name="_Toc240033935"/>
+      <w:bookmarkStart w:id="7" w:name="_Toc240036153"/>
       <w:r>
         <w:t xml:space="preserve">2.3.b · Sensor and </w:t>
       </w:r>
@@ -4893,7 +4893,7 @@
       <w:pPr>
         <w:pStyle w:val="Heading3"/>
       </w:pPr>
-      <w:bookmarkStart w:id="8" w:name="_Toc240033936"/>
+      <w:bookmarkStart w:id="8" w:name="_Toc240036154"/>
       <w:r>
         <w:t>2.3.c · Mechanical Parameters — Node Sensor (GLD)</w:t>
       </w:r>
@@ -5750,7 +5750,7 @@
       <w:pPr>
         <w:pStyle w:val="Heading2"/>
       </w:pPr>
-      <w:bookmarkStart w:id="9" w:name="_Toc240033937"/>
+      <w:bookmarkStart w:id="9" w:name="_Toc240036155"/>
       <w:r>
         <w:t xml:space="preserve">2.4 · Product Photographs — Overall and Key </w:t>
       </w:r>
@@ -5796,7 +5796,7 @@
               </w:rPr>
               <w:lastRenderedPageBreak/>
               <w:drawing>
-                <wp:inline distT="0" distB="0" distL="0" distR="0" wp14:anchorId="34383071" wp14:editId="6AA738D0">
+                <wp:inline distT="0" distB="0" distL="0" distR="0" wp14:anchorId="0F628C8C" wp14:editId="52B69C9E">
                   <wp:extent cx="2514600" cy="4165753"/>
                   <wp:effectExtent l="0" t="0" r="0" b="0"/>
                   <wp:docPr id="1" name="Picture 1"/>
@@ -5880,7 +5880,7 @@
                 <w:noProof/>
               </w:rPr>
               <w:drawing>
-                <wp:inline distT="0" distB="0" distL="0" distR="0" wp14:anchorId="2C3B74A1" wp14:editId="7FF621FF">
+                <wp:inline distT="0" distB="0" distL="0" distR="0" wp14:anchorId="42A3375C" wp14:editId="0A8F95B9">
                   <wp:extent cx="2514600" cy="3352800"/>
                   <wp:effectExtent l="0" t="0" r="0" b="0"/>
                   <wp:docPr id="2" name="Picture 2"/>
@@ -5963,7 +5963,7 @@
               </w:rPr>
               <w:lastRenderedPageBreak/>
               <w:drawing>
-                <wp:inline distT="0" distB="0" distL="0" distR="0" wp14:anchorId="208327DA" wp14:editId="629CA58B">
+                <wp:inline distT="0" distB="0" distL="0" distR="0" wp14:anchorId="416F90C1" wp14:editId="70111EF1">
                   <wp:extent cx="2514600" cy="5599312"/>
                   <wp:effectExtent l="0" t="0" r="0" b="0"/>
                   <wp:docPr id="3" name="Picture 3"/>
@@ -6047,7 +6047,7 @@
                 <w:noProof/>
               </w:rPr>
               <w:drawing>
-                <wp:inline distT="0" distB="0" distL="0" distR="0" wp14:anchorId="2E87AD0C" wp14:editId="26068040">
+                <wp:inline distT="0" distB="0" distL="0" distR="0" wp14:anchorId="5BDCF3CB" wp14:editId="4681907B">
                   <wp:extent cx="2514600" cy="5599312"/>
                   <wp:effectExtent l="0" t="0" r="0" b="0"/>
                   <wp:docPr id="4" name="Picture 4"/>
@@ -6137,7 +6137,7 @@
               </w:rPr>
               <w:lastRenderedPageBreak/>
               <w:drawing>
-                <wp:inline distT="0" distB="0" distL="0" distR="0" wp14:anchorId="6272D763" wp14:editId="6ABDDD62">
+                <wp:inline distT="0" distB="0" distL="0" distR="0" wp14:anchorId="7390A170" wp14:editId="0E8E2EF7">
                   <wp:extent cx="2514600" cy="5599312"/>
                   <wp:effectExtent l="0" t="0" r="0" b="0"/>
                   <wp:docPr id="5" name="Picture 5"/>
@@ -6221,7 +6221,7 @@
                 <w:noProof/>
               </w:rPr>
               <w:drawing>
-                <wp:inline distT="0" distB="0" distL="0" distR="0" wp14:anchorId="10E2F270" wp14:editId="6D7B737F">
+                <wp:inline distT="0" distB="0" distL="0" distR="0" wp14:anchorId="7FAC7525" wp14:editId="16170E38">
                   <wp:extent cx="2514600" cy="5599312"/>
                   <wp:effectExtent l="0" t="0" r="0" b="0"/>
                   <wp:docPr id="6" name="Picture 6"/>
@@ -6311,7 +6311,7 @@
               </w:rPr>
               <w:lastRenderedPageBreak/>
               <w:drawing>
-                <wp:inline distT="0" distB="0" distL="0" distR="0" wp14:anchorId="340AD3E9" wp14:editId="1E706664">
+                <wp:inline distT="0" distB="0" distL="0" distR="0" wp14:anchorId="0D8944E7" wp14:editId="6624FB20">
                   <wp:extent cx="2514600" cy="5599312"/>
                   <wp:effectExtent l="0" t="0" r="0" b="0"/>
                   <wp:docPr id="7" name="Picture 7"/>
@@ -6449,7 +6449,7 @@
       <w:pPr>
         <w:pStyle w:val="Heading2"/>
       </w:pPr>
-      <w:bookmarkStart w:id="10" w:name="_Toc240033938"/>
+      <w:bookmarkStart w:id="10" w:name="_Toc240036156"/>
       <w:r>
         <w:lastRenderedPageBreak/>
         <w:t>2.5 · Description of Intended Use and Installation Environment (Gas</w:t>
@@ -6937,7 +6937,7 @@
       <w:pPr>
         <w:pStyle w:val="Heading2"/>
       </w:pPr>
-      <w:bookmarkStart w:id="11" w:name="_Toc240033939"/>
+      <w:bookmarkStart w:id="11" w:name="_Toc240036157"/>
       <w:r>
         <w:t>2.6 · Design and Manufacturing Information</w:t>
       </w:r>
@@ -6955,7 +6955,7 @@
       <w:pPr>
         <w:pStyle w:val="Heading3"/>
       </w:pPr>
-      <w:bookmarkStart w:id="12" w:name="_Toc240033940"/>
+      <w:bookmarkStart w:id="12" w:name="_Toc240036158"/>
       <w:r>
         <w:lastRenderedPageBreak/>
         <w:t>2.6.a · Complete Drawings (Assembly, Component, Electrical Schematic, PCB Layout, Enclos</w:t>
@@ -6970,7 +6970,7 @@
         <w:t>An electrical schematic capture and a corresponding PCB layout exist for the GLD V2 main board (EDA source design files). From the schematic's traced net list, a supporting block-diagram set (9 sheets, func</w:t>
       </w:r>
       <w:r>
-        <w:t>tional/block level, 204 components mapped with documented pin-to-net traceability) has been produced and is illustrated below.</w:t>
+        <w:t>tional/block level, 204 components mapped with documented pin-to-net traceability) has been produced and is reproduced in full below. Field labels in the source diagrams are in Indonesian; English captions are provided under each sheet.</w:t>
       </w:r>
     </w:p>
     <w:p>
@@ -6982,8 +6982,8 @@
           <w:noProof/>
         </w:rPr>
         <w:drawing>
-          <wp:inline distT="0" distB="0" distL="0" distR="0" wp14:anchorId="5914CE83" wp14:editId="0E435CAC">
-            <wp:extent cx="5120640" cy="3412541"/>
+          <wp:inline distT="0" distB="0" distL="0" distR="0" wp14:anchorId="33C2F715" wp14:editId="598DAF27">
+            <wp:extent cx="5120640" cy="3413760"/>
             <wp:effectExtent l="0" t="0" r="0" b="0"/>
             <wp:docPr id="8" name="Picture 8"/>
             <wp:cNvGraphicFramePr>
@@ -6993,7 +6993,7 @@
               <a:graphicData uri="http://schemas.openxmlformats.org/drawingml/2006/picture">
                 <pic:pic xmlns:pic="http://schemas.openxmlformats.org/drawingml/2006/picture">
                   <pic:nvPicPr>
-                    <pic:cNvPr id="0" name="GLD2-schematic-block-overview.jpg"/>
+                    <pic:cNvPr id="0" name="01-diagram.png"/>
                     <pic:cNvPicPr/>
                   </pic:nvPicPr>
                   <pic:blipFill>
@@ -7005,7 +7005,7 @@
                   <pic:spPr>
                     <a:xfrm>
                       <a:off x="0" y="0"/>
-                      <a:ext cx="5120640" cy="3412541"/>
+                      <a:ext cx="5120640" cy="3413760"/>
                     </a:xfrm>
                     <a:prstGeom prst="rect">
                       <a:avLst/>
@@ -7028,7 +7028,14 @@
           <w:b/>
           <w:sz w:val="19"/>
         </w:rPr>
-        <w:t>Schematic-derived block diagram — sheet 1 of 9: overall architecture</w:t>
+        <w:t xml:space="preserve">Sheet 1 of 9 — </w:t>
+      </w:r>
+      <w:r>
+        <w:rPr>
+          <w:b/>
+          <w:sz w:val="19"/>
+        </w:rPr>
+        <w:t>Overall architecture</w:t>
       </w:r>
       <w:r>
         <w:rPr>
@@ -7042,14 +7049,622 @@
           <w:color w:val="4A4A4A"/>
           <w:sz w:val="17"/>
         </w:rPr>
-        <w:t xml:space="preserve">Power input, power distribution, analog </w:t>
+        <w:t>Power input, power distribution, analog acquisition, sensor control, main control (ESP32-S3), and external interfaces (alarm, RS-485, LoRa antenna, programming/configuration).</w:t>
+      </w:r>
+    </w:p>
+    <w:p>
+      <w:pPr>
+        <w:jc w:val="center"/>
+      </w:pPr>
+      <w:r>
+        <w:rPr>
+          <w:noProof/>
+        </w:rPr>
+        <w:lastRenderedPageBreak/>
+        <w:drawing>
+          <wp:inline distT="0" distB="0" distL="0" distR="0" wp14:anchorId="2B8552CC" wp14:editId="34C6179A">
+            <wp:extent cx="5120640" cy="3413760"/>
+            <wp:effectExtent l="0" t="0" r="0" b="0"/>
+            <wp:docPr id="9" name="Picture 9"/>
+            <wp:cNvGraphicFramePr>
+              <a:graphicFrameLocks xmlns:a="http://schemas.openxmlformats.org/drawingml/2006/main" noChangeAspect="1"/>
+            </wp:cNvGraphicFramePr>
+            <a:graphic xmlns:a="http://schemas.openxmlformats.org/drawingml/2006/main">
+              <a:graphicData uri="http://schemas.openxmlformats.org/drawingml/2006/picture">
+                <pic:pic xmlns:pic="http://schemas.openxmlformats.org/drawingml/2006/picture">
+                  <pic:nvPicPr>
+                    <pic:cNvPr id="0" name="02-diagram.png"/>
+                    <pic:cNvPicPr/>
+                  </pic:nvPicPr>
+                  <pic:blipFill>
+                    <a:blip r:embed="rId16"/>
+                    <a:stretch>
+                      <a:fillRect/>
+                    </a:stretch>
+                  </pic:blipFill>
+                  <pic:spPr>
+                    <a:xfrm>
+                      <a:off x="0" y="0"/>
+                      <a:ext cx="5120640" cy="3413760"/>
+                    </a:xfrm>
+                    <a:prstGeom prst="rect">
+                      <a:avLst/>
+                    </a:prstGeom>
+                  </pic:spPr>
+                </pic:pic>
+              </a:graphicData>
+            </a:graphic>
+          </wp:inline>
+        </w:drawing>
+      </w:r>
+    </w:p>
+    <w:p>
+      <w:pPr>
+        <w:spacing w:after="240"/>
+        <w:jc w:val="center"/>
+      </w:pPr>
+      <w:r>
+        <w:rPr>
+          <w:b/>
+          <w:sz w:val="19"/>
+        </w:rPr>
+        <w:t>Sheet 2 of 9 — Main power</w:t>
+      </w:r>
+      <w:r>
+        <w:rPr>
+          <w:b/>
+          <w:sz w:val="19"/>
+        </w:rPr>
+        <w:br/>
       </w:r>
       <w:r>
         <w:rPr>
           <w:color w:val="4A4A4A"/>
           <w:sz w:val="17"/>
         </w:rPr>
-        <w:t>acquisition, sensor control, main control (ESP32-S3), and external interfaces (alarm, RS-485, LoRa antenna, programming/configuration). Derived directly from the traced schematic net list; annotated in Indonesian in the source set.</w:t>
+        <w:t>Main power input rails and dist</w:t>
+      </w:r>
+      <w:r>
+        <w:rPr>
+          <w:color w:val="4A4A4A"/>
+          <w:sz w:val="17"/>
+        </w:rPr>
+        <w:t>ribution: +5 V / +5VA analog, 3.3 V, and +24 V for the alarm circuit.</w:t>
+      </w:r>
+    </w:p>
+    <w:p>
+      <w:pPr>
+        <w:jc w:val="center"/>
+      </w:pPr>
+      <w:r>
+        <w:rPr>
+          <w:noProof/>
+        </w:rPr>
+        <w:drawing>
+          <wp:inline distT="0" distB="0" distL="0" distR="0" wp14:anchorId="2E845154" wp14:editId="2530C9F3">
+            <wp:extent cx="5120640" cy="3413760"/>
+            <wp:effectExtent l="0" t="0" r="0" b="0"/>
+            <wp:docPr id="10" name="Picture 10"/>
+            <wp:cNvGraphicFramePr>
+              <a:graphicFrameLocks xmlns:a="http://schemas.openxmlformats.org/drawingml/2006/main" noChangeAspect="1"/>
+            </wp:cNvGraphicFramePr>
+            <a:graphic xmlns:a="http://schemas.openxmlformats.org/drawingml/2006/main">
+              <a:graphicData uri="http://schemas.openxmlformats.org/drawingml/2006/picture">
+                <pic:pic xmlns:pic="http://schemas.openxmlformats.org/drawingml/2006/picture">
+                  <pic:nvPicPr>
+                    <pic:cNvPr id="0" name="03-diagram.png"/>
+                    <pic:cNvPicPr/>
+                  </pic:nvPicPr>
+                  <pic:blipFill>
+                    <a:blip r:embed="rId17"/>
+                    <a:stretch>
+                      <a:fillRect/>
+                    </a:stretch>
+                  </pic:blipFill>
+                  <pic:spPr>
+                    <a:xfrm>
+                      <a:off x="0" y="0"/>
+                      <a:ext cx="5120640" cy="3413760"/>
+                    </a:xfrm>
+                    <a:prstGeom prst="rect">
+                      <a:avLst/>
+                    </a:prstGeom>
+                  </pic:spPr>
+                </pic:pic>
+              </a:graphicData>
+            </a:graphic>
+          </wp:inline>
+        </w:drawing>
+      </w:r>
+    </w:p>
+    <w:p>
+      <w:pPr>
+        <w:spacing w:after="240"/>
+        <w:jc w:val="center"/>
+      </w:pPr>
+      <w:r>
+        <w:rPr>
+          <w:b/>
+          <w:sz w:val="19"/>
+        </w:rPr>
+        <w:t>Sheet 3 of 9 — Always-on power</w:t>
+      </w:r>
+      <w:r>
+        <w:rPr>
+          <w:b/>
+          <w:sz w:val="19"/>
+        </w:rPr>
+        <w:br/>
+      </w:r>
+      <w:r>
+        <w:rPr>
+          <w:color w:val="4A4A4A"/>
+          <w:sz w:val="17"/>
+        </w:rPr>
+        <w:t>The always-on power domain that remains active independent of the main control state.</w:t>
+      </w:r>
+    </w:p>
+    <w:p>
+      <w:pPr>
+        <w:jc w:val="center"/>
+      </w:pPr>
+      <w:r>
+        <w:rPr>
+          <w:noProof/>
+        </w:rPr>
+        <w:lastRenderedPageBreak/>
+        <w:drawing>
+          <wp:inline distT="0" distB="0" distL="0" distR="0" wp14:anchorId="5BC03F39" wp14:editId="794666A3">
+            <wp:extent cx="5120640" cy="3413760"/>
+            <wp:effectExtent l="0" t="0" r="0" b="0"/>
+            <wp:docPr id="11" name="Picture 11"/>
+            <wp:cNvGraphicFramePr>
+              <a:graphicFrameLocks xmlns:a="http://schemas.openxmlformats.org/drawingml/2006/main" noChangeAspect="1"/>
+            </wp:cNvGraphicFramePr>
+            <a:graphic xmlns:a="http://schemas.openxmlformats.org/drawingml/2006/main">
+              <a:graphicData uri="http://schemas.openxmlformats.org/drawingml/2006/picture">
+                <pic:pic xmlns:pic="http://schemas.openxmlformats.org/drawingml/2006/picture">
+                  <pic:nvPicPr>
+                    <pic:cNvPr id="0" name="04-diagram.png"/>
+                    <pic:cNvPicPr/>
+                  </pic:nvPicPr>
+                  <pic:blipFill>
+                    <a:blip r:embed="rId18"/>
+                    <a:stretch>
+                      <a:fillRect/>
+                    </a:stretch>
+                  </pic:blipFill>
+                  <pic:spPr>
+                    <a:xfrm>
+                      <a:off x="0" y="0"/>
+                      <a:ext cx="5120640" cy="3413760"/>
+                    </a:xfrm>
+                    <a:prstGeom prst="rect">
+                      <a:avLst/>
+                    </a:prstGeom>
+                  </pic:spPr>
+                </pic:pic>
+              </a:graphicData>
+            </a:graphic>
+          </wp:inline>
+        </w:drawing>
+      </w:r>
+    </w:p>
+    <w:p>
+      <w:pPr>
+        <w:spacing w:after="240"/>
+        <w:jc w:val="center"/>
+      </w:pPr>
+      <w:r>
+        <w:rPr>
+          <w:b/>
+          <w:sz w:val="19"/>
+        </w:rPr>
+        <w:t>Sheet 4 of 9 — Sensor module</w:t>
+      </w:r>
+      <w:r>
+        <w:rPr>
+          <w:b/>
+          <w:sz w:val="19"/>
+        </w:rPr>
+        <w:br/>
+      </w:r>
+      <w:r>
+        <w:rPr>
+          <w:color w:val="4A4A4A"/>
+          <w:sz w:val="17"/>
+        </w:rPr>
+        <w:t>The external gas sensor module: 8 an</w:t>
+      </w:r>
+      <w:r>
+        <w:rPr>
+          <w:color w:val="4A4A4A"/>
+          <w:sz w:val="17"/>
+        </w:rPr>
+        <w:t>alog channels with per-channel I2C enable, including the sensor, DAC, and power-switch sub-blocks.</w:t>
+      </w:r>
+    </w:p>
+    <w:p>
+      <w:pPr>
+        <w:jc w:val="center"/>
+      </w:pPr>
+      <w:r>
+        <w:rPr>
+          <w:noProof/>
+        </w:rPr>
+        <w:drawing>
+          <wp:inline distT="0" distB="0" distL="0" distR="0" wp14:anchorId="1CDC81DD" wp14:editId="526EBE7F">
+            <wp:extent cx="5120640" cy="3413760"/>
+            <wp:effectExtent l="0" t="0" r="0" b="0"/>
+            <wp:docPr id="12" name="Picture 12"/>
+            <wp:cNvGraphicFramePr>
+              <a:graphicFrameLocks xmlns:a="http://schemas.openxmlformats.org/drawingml/2006/main" noChangeAspect="1"/>
+            </wp:cNvGraphicFramePr>
+            <a:graphic xmlns:a="http://schemas.openxmlformats.org/drawingml/2006/main">
+              <a:graphicData uri="http://schemas.openxmlformats.org/drawingml/2006/picture">
+                <pic:pic xmlns:pic="http://schemas.openxmlformats.org/drawingml/2006/picture">
+                  <pic:nvPicPr>
+                    <pic:cNvPr id="0" name="05-diagram.png"/>
+                    <pic:cNvPicPr/>
+                  </pic:nvPicPr>
+                  <pic:blipFill>
+                    <a:blip r:embed="rId19"/>
+                    <a:stretch>
+                      <a:fillRect/>
+                    </a:stretch>
+                  </pic:blipFill>
+                  <pic:spPr>
+                    <a:xfrm>
+                      <a:off x="0" y="0"/>
+                      <a:ext cx="5120640" cy="3413760"/>
+                    </a:xfrm>
+                    <a:prstGeom prst="rect">
+                      <a:avLst/>
+                    </a:prstGeom>
+                  </pic:spPr>
+                </pic:pic>
+              </a:graphicData>
+            </a:graphic>
+          </wp:inline>
+        </w:drawing>
+      </w:r>
+    </w:p>
+    <w:p>
+      <w:pPr>
+        <w:spacing w:after="240"/>
+        <w:jc w:val="center"/>
+      </w:pPr>
+      <w:r>
+        <w:rPr>
+          <w:b/>
+          <w:sz w:val="19"/>
+        </w:rPr>
+        <w:t>Sheet 5 of 9 — Analog acquisition</w:t>
+      </w:r>
+      <w:r>
+        <w:rPr>
+          <w:b/>
+          <w:sz w:val="19"/>
+        </w:rPr>
+        <w:br/>
+      </w:r>
+      <w:r>
+        <w:rPr>
+          <w:color w:val="4A4A4A"/>
+          <w:sz w:val="17"/>
+        </w:rPr>
+        <w:t>The 8-channel analog acquisition front end: analog inputs, ADC (ADS1256), reference, and VMID biasing.</w:t>
+      </w:r>
+    </w:p>
+    <w:p>
+      <w:pPr>
+        <w:jc w:val="center"/>
+      </w:pPr>
+      <w:r>
+        <w:rPr>
+          <w:noProof/>
+        </w:rPr>
+        <w:lastRenderedPageBreak/>
+        <w:drawing>
+          <wp:inline distT="0" distB="0" distL="0" distR="0" wp14:anchorId="7D8EE55A" wp14:editId="6E019804">
+            <wp:extent cx="5120640" cy="3413760"/>
+            <wp:effectExtent l="0" t="0" r="0" b="0"/>
+            <wp:docPr id="13" name="Picture 13"/>
+            <wp:cNvGraphicFramePr>
+              <a:graphicFrameLocks xmlns:a="http://schemas.openxmlformats.org/drawingml/2006/main" noChangeAspect="1"/>
+            </wp:cNvGraphicFramePr>
+            <a:graphic xmlns:a="http://schemas.openxmlformats.org/drawingml/2006/main">
+              <a:graphicData uri="http://schemas.openxmlformats.org/drawingml/2006/picture">
+                <pic:pic xmlns:pic="http://schemas.openxmlformats.org/drawingml/2006/picture">
+                  <pic:nvPicPr>
+                    <pic:cNvPr id="0" name="06-diagram.png"/>
+                    <pic:cNvPicPr/>
+                  </pic:nvPicPr>
+                  <pic:blipFill>
+                    <a:blip r:embed="rId20"/>
+                    <a:stretch>
+                      <a:fillRect/>
+                    </a:stretch>
+                  </pic:blipFill>
+                  <pic:spPr>
+                    <a:xfrm>
+                      <a:off x="0" y="0"/>
+                      <a:ext cx="5120640" cy="3413760"/>
+                    </a:xfrm>
+                    <a:prstGeom prst="rect">
+                      <a:avLst/>
+                    </a:prstGeom>
+                  </pic:spPr>
+                </pic:pic>
+              </a:graphicData>
+            </a:graphic>
+          </wp:inline>
+        </w:drawing>
+      </w:r>
+    </w:p>
+    <w:p>
+      <w:pPr>
+        <w:spacing w:after="240"/>
+        <w:jc w:val="center"/>
+      </w:pPr>
+      <w:r>
+        <w:rPr>
+          <w:b/>
+          <w:sz w:val="19"/>
+        </w:rPr>
+        <w:t xml:space="preserve">Sheet 6 of 9 — </w:t>
+      </w:r>
+      <w:r>
+        <w:rPr>
+          <w:b/>
+          <w:sz w:val="19"/>
+        </w:rPr>
+        <w:t>I2C &amp; sensor control</w:t>
+      </w:r>
+      <w:r>
+        <w:rPr>
+          <w:b/>
+          <w:sz w:val="19"/>
+        </w:rPr>
+        <w:br/>
+      </w:r>
+      <w:r>
+        <w:rPr>
+          <w:color w:val="4A4A4A"/>
+          <w:sz w:val="17"/>
+        </w:rPr>
+        <w:t>I2C channel selection (TCA9548A), per-channel sensor enable (PCF8574), and the temperature/humidity sensor (SHT40).</w:t>
+      </w:r>
+    </w:p>
+    <w:p>
+      <w:pPr>
+        <w:jc w:val="center"/>
+      </w:pPr>
+      <w:r>
+        <w:rPr>
+          <w:noProof/>
+        </w:rPr>
+        <w:drawing>
+          <wp:inline distT="0" distB="0" distL="0" distR="0" wp14:anchorId="4E31C810" wp14:editId="66D4FC54">
+            <wp:extent cx="5120640" cy="3413760"/>
+            <wp:effectExtent l="0" t="0" r="0" b="0"/>
+            <wp:docPr id="14" name="Picture 14"/>
+            <wp:cNvGraphicFramePr>
+              <a:graphicFrameLocks xmlns:a="http://schemas.openxmlformats.org/drawingml/2006/main" noChangeAspect="1"/>
+            </wp:cNvGraphicFramePr>
+            <a:graphic xmlns:a="http://schemas.openxmlformats.org/drawingml/2006/main">
+              <a:graphicData uri="http://schemas.openxmlformats.org/drawingml/2006/picture">
+                <pic:pic xmlns:pic="http://schemas.openxmlformats.org/drawingml/2006/picture">
+                  <pic:nvPicPr>
+                    <pic:cNvPr id="0" name="07-diagram.png"/>
+                    <pic:cNvPicPr/>
+                  </pic:nvPicPr>
+                  <pic:blipFill>
+                    <a:blip r:embed="rId21"/>
+                    <a:stretch>
+                      <a:fillRect/>
+                    </a:stretch>
+                  </pic:blipFill>
+                  <pic:spPr>
+                    <a:xfrm>
+                      <a:off x="0" y="0"/>
+                      <a:ext cx="5120640" cy="3413760"/>
+                    </a:xfrm>
+                    <a:prstGeom prst="rect">
+                      <a:avLst/>
+                    </a:prstGeom>
+                  </pic:spPr>
+                </pic:pic>
+              </a:graphicData>
+            </a:graphic>
+          </wp:inline>
+        </w:drawing>
+      </w:r>
+    </w:p>
+    <w:p>
+      <w:pPr>
+        <w:spacing w:after="240"/>
+        <w:jc w:val="center"/>
+      </w:pPr>
+      <w:r>
+        <w:rPr>
+          <w:b/>
+          <w:sz w:val="19"/>
+        </w:rPr>
+        <w:t>Sheet 7 of 9 — ESP32 connections</w:t>
+      </w:r>
+      <w:r>
+        <w:rPr>
+          <w:b/>
+          <w:sz w:val="19"/>
+        </w:rPr>
+        <w:br/>
+      </w:r>
+      <w:r>
+        <w:rPr>
+          <w:color w:val="4A4A4A"/>
+          <w:sz w:val="17"/>
+        </w:rPr>
+        <w:t>Main controller (ESP32-S3) interface map: SPI to the ADC, I2C to sensor/control, UAR</w:t>
+      </w:r>
+      <w:r>
+        <w:rPr>
+          <w:color w:val="4A4A4A"/>
+          <w:sz w:val="17"/>
+        </w:rPr>
+        <w:t>T for USB and RS-485, and GPIO for alarm, power, button, and LED.</w:t>
+      </w:r>
+    </w:p>
+    <w:p>
+      <w:pPr>
+        <w:jc w:val="center"/>
+      </w:pPr>
+      <w:r>
+        <w:rPr>
+          <w:noProof/>
+        </w:rPr>
+        <w:lastRenderedPageBreak/>
+        <w:drawing>
+          <wp:inline distT="0" distB="0" distL="0" distR="0" wp14:anchorId="13E11FA6" wp14:editId="3E87E3D2">
+            <wp:extent cx="5120640" cy="3413760"/>
+            <wp:effectExtent l="0" t="0" r="0" b="0"/>
+            <wp:docPr id="15" name="Picture 15"/>
+            <wp:cNvGraphicFramePr>
+              <a:graphicFrameLocks xmlns:a="http://schemas.openxmlformats.org/drawingml/2006/main" noChangeAspect="1"/>
+            </wp:cNvGraphicFramePr>
+            <a:graphic xmlns:a="http://schemas.openxmlformats.org/drawingml/2006/main">
+              <a:graphicData uri="http://schemas.openxmlformats.org/drawingml/2006/picture">
+                <pic:pic xmlns:pic="http://schemas.openxmlformats.org/drawingml/2006/picture">
+                  <pic:nvPicPr>
+                    <pic:cNvPr id="0" name="08-diagram.png"/>
+                    <pic:cNvPicPr/>
+                  </pic:nvPicPr>
+                  <pic:blipFill>
+                    <a:blip r:embed="rId22"/>
+                    <a:stretch>
+                      <a:fillRect/>
+                    </a:stretch>
+                  </pic:blipFill>
+                  <pic:spPr>
+                    <a:xfrm>
+                      <a:off x="0" y="0"/>
+                      <a:ext cx="5120640" cy="3413760"/>
+                    </a:xfrm>
+                    <a:prstGeom prst="rect">
+                      <a:avLst/>
+                    </a:prstGeom>
+                  </pic:spPr>
+                </pic:pic>
+              </a:graphicData>
+            </a:graphic>
+          </wp:inline>
+        </w:drawing>
+      </w:r>
+    </w:p>
+    <w:p>
+      <w:pPr>
+        <w:spacing w:after="240"/>
+        <w:jc w:val="center"/>
+      </w:pPr>
+      <w:r>
+        <w:rPr>
+          <w:b/>
+          <w:sz w:val="19"/>
+        </w:rPr>
+        <w:t>Sheet 8 of 9 — Alarm &amp; status</w:t>
+      </w:r>
+      <w:r>
+        <w:rPr>
+          <w:b/>
+          <w:sz w:val="19"/>
+        </w:rPr>
+        <w:br/>
+      </w:r>
+      <w:r>
+        <w:rPr>
+          <w:color w:val="4A4A4A"/>
+          <w:sz w:val="17"/>
+        </w:rPr>
+        <w:t>Alarm output and status-indication circuitry driven from the main controller.</w:t>
+      </w:r>
+    </w:p>
+    <w:p>
+      <w:pPr>
+        <w:jc w:val="center"/>
+      </w:pPr>
+      <w:r>
+        <w:rPr>
+          <w:noProof/>
+        </w:rPr>
+        <w:drawing>
+          <wp:inline distT="0" distB="0" distL="0" distR="0" wp14:anchorId="7E3BB1D2" wp14:editId="5321D0E1">
+            <wp:extent cx="5120640" cy="3413760"/>
+            <wp:effectExtent l="0" t="0" r="0" b="0"/>
+            <wp:docPr id="16" name="Picture 16"/>
+            <wp:cNvGraphicFramePr>
+              <a:graphicFrameLocks xmlns:a="http://schemas.openxmlformats.org/drawingml/2006/main" noChangeAspect="1"/>
+            </wp:cNvGraphicFramePr>
+            <a:graphic xmlns:a="http://schemas.openxmlformats.org/drawingml/2006/main">
+              <a:graphicData uri="http://schemas.openxmlformats.org/drawingml/2006/picture">
+                <pic:pic xmlns:pic="http://schemas.openxmlformats.org/drawingml/2006/picture">
+                  <pic:nvPicPr>
+                    <pic:cNvPr id="0" name="09-diagram.png"/>
+                    <pic:cNvPicPr/>
+                  </pic:nvPicPr>
+                  <pic:blipFill>
+                    <a:blip r:embed="rId23"/>
+                    <a:stretch>
+                      <a:fillRect/>
+                    </a:stretch>
+                  </pic:blipFill>
+                  <pic:spPr>
+                    <a:xfrm>
+                      <a:off x="0" y="0"/>
+                      <a:ext cx="5120640" cy="3413760"/>
+                    </a:xfrm>
+                    <a:prstGeom prst="rect">
+                      <a:avLst/>
+                    </a:prstGeom>
+                  </pic:spPr>
+                </pic:pic>
+              </a:graphicData>
+            </a:graphic>
+          </wp:inline>
+        </w:drawing>
+      </w:r>
+    </w:p>
+    <w:p>
+      <w:pPr>
+        <w:spacing w:after="240"/>
+        <w:jc w:val="center"/>
+      </w:pPr>
+      <w:r>
+        <w:rPr>
+          <w:b/>
+          <w:sz w:val="19"/>
+        </w:rPr>
+        <w:t>Sheet 9 of 9 — System flow</w:t>
+      </w:r>
+      <w:r>
+        <w:rPr>
+          <w:b/>
+          <w:sz w:val="19"/>
+        </w:rPr>
+        <w:br/>
+      </w:r>
+      <w:r>
+        <w:rPr>
+          <w:color w:val="4A4A4A"/>
+          <w:sz w:val="17"/>
+        </w:rPr>
+        <w:t>Overall signal and data flow across the board, summ</w:t>
+      </w:r>
+      <w:r>
+        <w:rPr>
+          <w:color w:val="4A4A4A"/>
+          <w:sz w:val="17"/>
+        </w:rPr>
+        <w:t>arizing how the preceding eight sheets connect end to end.</w:t>
       </w:r>
     </w:p>
     <w:tbl>
@@ -7121,15 +7736,7 @@
                 <w:color w:val="4A4A4A"/>
                 <w:sz w:val="18"/>
               </w:rPr>
-              <w:t>REMA</w:t>
-            </w:r>
-            <w:r>
-              <w:rPr>
-                <w:b/>
-                <w:color w:val="4A4A4A"/>
-                <w:sz w:val="18"/>
-              </w:rPr>
-              <w:t>RKS</w:t>
+              <w:t>REMARKS</w:t>
             </w:r>
           </w:p>
         </w:tc>
@@ -7185,13 +7792,20 @@
               <w:rPr>
                 <w:sz w:val="19"/>
               </w:rPr>
-              <w:t>Schematic capture and a derived 9-sheet block-diagram set exist with traceability evidence (pin-to-net mapping). Not yet issued in a released, revision-controlled drawing forma</w:t>
-            </w:r>
-            <w:r>
-              <w:rPr>
-                <w:sz w:val="19"/>
-              </w:rPr>
-              <w:t>t with a formal drawing number.</w:t>
+              <w:t xml:space="preserve">Schematic capture and a derived 9-sheet block-diagram set exist with traceability </w:t>
+            </w:r>
+            <w:r>
+              <w:rPr>
+                <w:sz w:val="19"/>
+              </w:rPr>
+              <w:t>evidence (pin-</w:t>
+            </w:r>
+            <w:r>
+              <w:rPr>
+                <w:sz w:val="19"/>
+              </w:rPr>
+              <w:lastRenderedPageBreak/>
+              <w:t>to-net mapping). Not yet issued in a released, revision-controlled drawing format with a formal drawing number.</w:t>
             </w:r>
           </w:p>
         </w:tc>
@@ -7213,6 +7827,7 @@
                 <w:b/>
                 <w:sz w:val="19"/>
               </w:rPr>
+              <w:lastRenderedPageBreak/>
               <w:t>PCB layout</w:t>
             </w:r>
           </w:p>
@@ -7287,7 +7902,15 @@
                 <w:color w:val="B02A37"/>
                 <w:sz w:val="19"/>
               </w:rPr>
-              <w:t>Not yet available</w:t>
+              <w:t>Not</w:t>
+            </w:r>
+            <w:r>
+              <w:rPr>
+                <w:b/>
+                <w:color w:val="B02A37"/>
+                <w:sz w:val="19"/>
+              </w:rPr>
+              <w:t xml:space="preserve"> yet available</w:t>
             </w:r>
           </w:p>
         </w:tc>
@@ -7369,14 +7992,7 @@
                 <w:b/>
                 <w:sz w:val="19"/>
               </w:rPr>
-              <w:t xml:space="preserve">Enclosure structure drawing (gap, </w:t>
-            </w:r>
-            <w:r>
-              <w:rPr>
-                <w:b/>
-                <w:sz w:val="19"/>
-              </w:rPr>
-              <w:t>length, volume)</w:t>
+              <w:t>Enclosure structure drawing (gap, length, volume)</w:t>
             </w:r>
           </w:p>
         </w:tc>
@@ -7450,7 +8066,15 @@
                 <w:color w:val="B02A37"/>
                 <w:sz w:val="19"/>
               </w:rPr>
-              <w:t>Not yet available</w:t>
+              <w:t xml:space="preserve">Not yet </w:t>
+            </w:r>
+            <w:r>
+              <w:rPr>
+                <w:b/>
+                <w:color w:val="B02A37"/>
+                <w:sz w:val="19"/>
+              </w:rPr>
+              <w:t>available</w:t>
             </w:r>
           </w:p>
         </w:tc>
@@ -7504,22 +8128,14 @@
                 <w:color w:val="4A4A4A"/>
                 <w:sz w:val="20"/>
               </w:rPr>
-              <w:t xml:space="preserve">The schematic and PCB layout are useful supporting engineering artifacts, but on </w:t>
+              <w:t>The schematic and PCB layout are useful supporting engineering artifacts, but on their own they do not constitute the certified drawing package the checklist requires — dimensioned, toleranced, material-annotated drawings in a released revisio</w:t>
             </w:r>
             <w:r>
               <w:rPr>
                 <w:color w:val="4A4A4A"/>
                 <w:sz w:val="20"/>
               </w:rPr>
-              <w:t xml:space="preserve">their own they do not constitute </w:t>
-            </w:r>
-            <w:r>
-              <w:rPr>
-                <w:color w:val="4A4A4A"/>
-                <w:sz w:val="20"/>
-              </w:rPr>
-              <w:lastRenderedPageBreak/>
-              <w:t>the certified drawing package the checklist requires — dimensioned, toleranced, material-annotated drawings in a released revision-controlled form have not yet been produced.</w:t>
+              <w:t>n-controlled form have not yet been produced.</w:t>
             </w:r>
           </w:p>
         </w:tc>
@@ -7534,27 +8150,24 @@
       <w:pPr>
         <w:pStyle w:val="Heading3"/>
       </w:pPr>
-      <w:bookmarkStart w:id="13" w:name="_Toc240033941"/>
+      <w:bookmarkStart w:id="13" w:name="_Toc240036159"/>
       <w:r>
-        <w:t xml:space="preserve">2.6.b · Bill of Materials (BOM) for </w:t>
-      </w:r>
-      <w:r>
-        <w:t>Explosion-Safety-Relevant Components</w:t>
+        <w:t>2.6.b · Bill of Materials (BOM) for Explosion-Safety-Relevant Components</w:t>
       </w:r>
       <w:bookmarkEnd w:id="13"/>
     </w:p>
     <w:p>
       <w:r>
-        <w:t>A controlled, Ex-critical BOM (enclosure, gaskets, terminals, cable entry devices, switches, light sources, battery, potting compound, plastic parts, printed circuit boards — with manufacturer, model, material grade, an</w:t>
+        <w:t xml:space="preserve">A controlled, Ex-critical BOM (enclosure, gaskets, terminals, cable entry devices, switches, light sources, battery, potting compound, </w:t>
       </w:r>
       <w:r>
-        <w:t>d certification/technical parameters for each) has not yet been compiled. A component-level pin/net export exists from the schematic (204 components traced) and can serve as a starting reference, but manufacturer part numbers, material grades, and Ex/UL/CC</w:t>
+        <w:t>plastic parts, printed circuit boards — with manufacturer, model, material grade, and certification/technical parameters for each) has not yet been compiled. A component-level pin/net export exists from the schematic (204 components traced) and can serve a</w:t>
       </w:r>
       <w:r>
-        <w:t>C certification status for the safety-critical items above have not been determined. Comparative research on Ex-rated enclosure products from other manufacturers exists internally as a reference for target specifications only — it describes third-party pro</w:t>
+        <w:t>s a starting reference, but manufacturer part numbers, material grades, and Ex/UL/CCC certification status for the safety-critical items above have not been determined. Comparative research on Ex-rated enclosure products from other manufacturers exists int</w:t>
       </w:r>
       <w:r>
-        <w:t>ducts, not this product's actual components, and is not included here.</w:t>
+        <w:t>ernally as a reference for target specifications only — it describes third-party products, not this product's actual components, and is not included here.</w:t>
       </w:r>
     </w:p>
     <w:tbl>
@@ -7605,18 +8218,21 @@
       <w:pPr>
         <w:pStyle w:val="Heading3"/>
       </w:pPr>
-      <w:bookmarkStart w:id="14" w:name="_Toc240033942"/>
+      <w:bookmarkStart w:id="14" w:name="_Toc240036160"/>
       <w:r>
-        <w:t>2.6.c · Material Specification Sheets / Datasheets (Non-Metallic Materials)</w:t>
+        <w:t xml:space="preserve">2.6.c · Material Specification Sheets / Datasheets </w:t>
+      </w:r>
+      <w:r>
+        <w:t>(Non-Metallic Materials)</w:t>
       </w:r>
       <w:bookmarkEnd w:id="14"/>
     </w:p>
     <w:p>
       <w:r>
-        <w:t>Datasheets or supplier conformity declarations for non-metallic materials (enclo</w:t>
+        <w:t>Datasheets or supplier conformity declarations for non-metallic materials (enclosure components, seals, insulators, potting compounds) — covering heat/cold resistance, anti-aging, anti-static, flame retardancy, CTI value, and chemi</w:t>
       </w:r>
       <w:r>
-        <w:t>sure components, seals, insulators, potting compounds) — covering heat/cold resistance, anti-aging, anti-static, flame retardancy, CTI value, and chemical resistance — have not yet been collected.</w:t>
+        <w:t>cal resistance — have not yet been collected.</w:t>
       </w:r>
     </w:p>
     <w:tbl>
@@ -7667,18 +8283,18 @@
       <w:pPr>
         <w:pStyle w:val="Heading3"/>
       </w:pPr>
-      <w:bookmarkStart w:id="15" w:name="_Toc240033943"/>
+      <w:bookmarkStart w:id="15" w:name="_Toc240036161"/>
       <w:r>
-        <w:t xml:space="preserve">2.6.d · Manufacturing Process </w:t>
-      </w:r>
-      <w:r>
-        <w:t>Description</w:t>
+        <w:t>2.6.d · Manufacturing Process Description</w:t>
       </w:r>
       <w:bookmarkEnd w:id="15"/>
     </w:p>
     <w:p>
       <w:r>
-        <w:t>A description of manufacturing processes relevant to explosion-protection safety (enclosure machining accuracy control, explosion-proof surface treatment, welding, potting, die-casting, bonding) has not yet been documented.</w:t>
+        <w:t>A description of manufacturing processes relevant to explosion-protection safety (enclosure machining accuracy control, explosion-proof sur</w:t>
+      </w:r>
+      <w:r>
+        <w:t>face treatment, welding, potting, die-casting, bonding) has not yet been documented.</w:t>
       </w:r>
     </w:p>
     <w:tbl>
@@ -7714,14 +8330,7 @@
                 <w:color w:val="4A4A4A"/>
                 <w:sz w:val="20"/>
               </w:rPr>
-              <w:t>Status: Not yet avai</w:t>
-            </w:r>
-            <w:r>
-              <w:rPr>
-                <w:color w:val="4A4A4A"/>
-                <w:sz w:val="20"/>
-              </w:rPr>
-              <w:t>lable.</w:t>
+              <w:t>Status: Not yet available.</w:t>
             </w:r>
           </w:p>
         </w:tc>
@@ -7736,7 +8345,7 @@
       <w:pPr>
         <w:pStyle w:val="Heading3"/>
       </w:pPr>
-      <w:bookmarkStart w:id="16" w:name="_Toc240033944"/>
+      <w:bookmarkStart w:id="16" w:name="_Toc240036162"/>
       <w:r>
         <w:t>2.6.e · Explosion-Protection Calculations and Explanations (if applicable)</w:t>
       </w:r>
@@ -7744,10 +8353,10 @@
     </w:p>
     <w:p>
       <w:r>
-        <w:t>Calculations depend on the explosion-protection concept selected (e.g., Ex d, Ex e, Ex i), which has not yet been confirmed with the ExCB. No calculations have been perform</w:t>
+        <w:t xml:space="preserve">Calculations depend on the explosion-protection concept </w:t>
       </w:r>
       <w:r>
-        <w:t>ed.</w:t>
+        <w:t>selected (e.g., Ex d, Ex e, Ex i), which has not yet been confirmed with the ExCB. No calculations have been performed.</w:t>
       </w:r>
     </w:p>
     <w:tbl>
@@ -7798,28 +8407,24 @@
       <w:pPr>
         <w:pStyle w:val="Heading3"/>
       </w:pPr>
-      <w:bookmarkStart w:id="17" w:name="_Toc240033945"/>
+      <w:bookmarkStart w:id="17" w:name="_Toc240036163"/>
       <w:r>
-        <w:t>2.6.f · Temperature Group Calculation (Hottest-Point Temperature Estimation)</w:t>
+        <w:t xml:space="preserve">2.6.f · Temperature Group Calculation (Hottest-Point Temperature </w:t>
+      </w:r>
+      <w:r>
+        <w:t>Estimation)</w:t>
       </w:r>
       <w:bookmarkEnd w:id="17"/>
     </w:p>
     <w:p>
       <w:r>
-        <w:t xml:space="preserve">No hottest-point temperature calculation or measurement has been performed for this product. As </w:t>
+        <w:t>No hottest-point temperature calculation or measurement has been performed for this product. As general context: MQ-series metal-oxide gas sensors operate using an internal heating element, a class of sensor commonly associated with published o</w:t>
       </w:r>
       <w:r>
-        <w:t xml:space="preserve">general context: MQ-series metal-oxide gas sensors operate using an internal heating element, a class of sensor commonly associated with published operating temperatures in the approximate 200–400°C range — however, </w:t>
+        <w:t>perating temperatures in the approximate 200–400°C range — however, this is a general characteristic of the sensor class, not a measured value for the specific sensor models, drive circuitry, and enclosure configuration used in this product. A worst-case h</w:t>
       </w:r>
       <w:r>
-        <w:lastRenderedPageBreak/>
-        <w:t xml:space="preserve">this is a general characteristic of the </w:t>
-      </w:r>
-      <w:r>
-        <w:t>sensor class, not a measured value for the specific sensor models, drive circuitry, and enclosure configuration used in this product. A worst-case hot-spot measurement is identified as the top-priority action required to substantiate the recommended T4 cla</w:t>
-      </w:r>
-      <w:r>
-        <w:t>ssification in Section 2.5.</w:t>
+        <w:t>ot-spot measurement is identified as the top-priority action required to substantiate the recommended T4 classification in Section 2.5.</w:t>
       </w:r>
     </w:p>
     <w:tbl>
@@ -7870,7 +8475,7 @@
       <w:pPr>
         <w:pStyle w:val="Heading3"/>
       </w:pPr>
-      <w:bookmarkStart w:id="18" w:name="_Toc240033946"/>
+      <w:bookmarkStart w:id="18" w:name="_Toc240036164"/>
       <w:r>
         <w:t>2.6.g · Usage and Installation Instructions (Draft)</w:t>
       </w:r>
@@ -7967,7 +8572,14 @@
                 <w:b/>
                 <w:sz w:val="19"/>
               </w:rPr>
-              <w:t>a) Safety warnings</w:t>
+              <w:t xml:space="preserve">a) </w:t>
+            </w:r>
+            <w:r>
+              <w:rPr>
+                <w:b/>
+                <w:sz w:val="19"/>
+              </w:rPr>
+              <w:t>Safety warnings</w:t>
             </w:r>
           </w:p>
         </w:tc>
@@ -8023,14 +8635,7 @@
                 <w:b/>
                 <w:sz w:val="19"/>
               </w:rPr>
-              <w:t xml:space="preserve">b) Installation </w:t>
-            </w:r>
-            <w:r>
-              <w:rPr>
-                <w:b/>
-                <w:sz w:val="19"/>
-              </w:rPr>
-              <w:t>requirements (cable entry, torque, grounding, cleaning)</w:t>
+              <w:t>b) Installation requirements (cable entry, torque, grounding, cleaning)</w:t>
             </w:r>
           </w:p>
         </w:tc>
@@ -8064,13 +8669,13 @@
               <w:rPr>
                 <w:sz w:val="19"/>
               </w:rPr>
-              <w:t>A mechanical mounting method exists separately (L-bracket, installed to existing structures without drilling or welding — see Section 2.3.c), but cable-entry method, torque values,</w:t>
-            </w:r>
-            <w:r>
-              <w:rPr>
-                <w:sz w:val="19"/>
-              </w:rPr>
-              <w:t xml:space="preserve"> grounding requirements, and cleaning requirements have not yet been formally specified.</w:t>
+              <w:t xml:space="preserve">A mechanical mounting method exists separately (L-bracket, installed to </w:t>
+            </w:r>
+            <w:r>
+              <w:rPr>
+                <w:sz w:val="19"/>
+              </w:rPr>
+              <w:t>existing structures without drilling or welding — see Section 2.3.c), but cable-entry method, torque values, grounding requirements, and cleaning requirements have not yet been formally specified.</w:t>
             </w:r>
           </w:p>
         </w:tc>
@@ -8110,7 +8715,15 @@
                 <w:color w:val="B56A1E"/>
                 <w:sz w:val="19"/>
               </w:rPr>
-              <w:t>Partially available</w:t>
+              <w:t>Par</w:t>
+            </w:r>
+            <w:r>
+              <w:rPr>
+                <w:b/>
+                <w:color w:val="B56A1E"/>
+                <w:sz w:val="19"/>
+              </w:rPr>
+              <w:t>tially available</w:t>
             </w:r>
           </w:p>
         </w:tc>
@@ -8126,13 +8739,13 @@
               <w:rPr>
                 <w:sz w:val="19"/>
               </w:rPr>
-              <w:t xml:space="preserve">A firmware command/operation reference exists (Serial, MQTT, and LoRa command protocol for </w:t>
-            </w:r>
-            <w:r>
-              <w:rPr>
-                <w:sz w:val="19"/>
-              </w:rPr>
-              <w:t>engineering use), but it covers software operation and commissioning — not Ex-specific maintenance or inspection requirements (frequency, content, precautions).</w:t>
+              <w:t>A firmware command/operation reference exists (Serial, MQTT, and LoRa command protocol for engineering use), but it covers software operation and commissioning — not Ex-specific maintenance or inspection requirements (frequency, content, p</w:t>
+            </w:r>
+            <w:r>
+              <w:rPr>
+                <w:sz w:val="19"/>
+              </w:rPr>
+              <w:t>recautions).</w:t>
             </w:r>
           </w:p>
         </w:tc>
@@ -8176,14 +8789,7 @@
                 <w:color w:val="4A4A4A"/>
                 <w:sz w:val="20"/>
               </w:rPr>
-              <w:t>Status: Partially available — not yet consolidated into an Ex-specific installation and opera</w:t>
-            </w:r>
-            <w:r>
-              <w:rPr>
-                <w:color w:val="4A4A4A"/>
-                <w:sz w:val="20"/>
-              </w:rPr>
-              <w:t>tion manual for ExCB review.</w:t>
+              <w:t>Status: Partially available — not yet consolidated into an Ex-specific installation and operation manual for ExCB review.</w:t>
             </w:r>
           </w:p>
         </w:tc>
@@ -8198,7 +8804,7 @@
       <w:pPr>
         <w:pStyle w:val="Heading3"/>
       </w:pPr>
-      <w:bookmarkStart w:id="19" w:name="_Toc240033947"/>
+      <w:bookmarkStart w:id="19" w:name="_Toc240036165"/>
       <w:r>
         <w:t>2.6.h · Nameplate Information</w:t>
       </w:r>
@@ -8206,10 +8812,10 @@
     </w:p>
     <w:p>
       <w:r>
-        <w:t xml:space="preserve">Nameplate artwork cannot yet be finalized: it depends on the certificate number, protection marking, temperature class, ambient range, IP rating, and serialization scheme — none of which has </w:t>
+        <w:t>Nameplate artwork cannot yet be finalized: it depends on the certificate number, protec</w:t>
       </w:r>
       <w:r>
-        <w:t>been assigned yet.</w:t>
+        <w:t>tion marking, temperature class, ambient range, IP rating, and serialization scheme — none of which has been assigned yet.</w:t>
       </w:r>
     </w:p>
     <w:tbl>
@@ -8245,6 +8851,7 @@
                 <w:color w:val="4A4A4A"/>
                 <w:sz w:val="20"/>
               </w:rPr>
+              <w:lastRenderedPageBreak/>
               <w:t>Status: Not yet available.</w:t>
             </w:r>
           </w:p>
@@ -8260,7 +8867,7 @@
       <w:pPr>
         <w:pStyle w:val="Heading3"/>
       </w:pPr>
-      <w:bookmarkStart w:id="20" w:name="_Toc240033948"/>
+      <w:bookmarkStart w:id="20" w:name="_Toc240036166"/>
       <w:r>
         <w:t>2.6.i · Ex Component Certificates</w:t>
       </w:r>
@@ -8268,10 +8875,10 @@
     </w:p>
     <w:p>
       <w:r>
-        <w:t xml:space="preserve">No components in this design currently hold an Ex component certificate. As noted in Section 2.3.b, the processing unit (ESP32-S3-WROOM-1U-N16R8) and the </w:t>
+        <w:t xml:space="preserve">No components in this design currently hold an Ex component </w:t>
       </w:r>
       <w:r>
-        <w:t>communication module (E22-900MM22S) hold RF/EMC certifications (FCC, TELEC, CE, RoHS) — these are not Ex component certificates and do not satisfy this item.</w:t>
+        <w:t>certificate. As noted in Section 2.3.b, the processing unit (ESP32-S3-WROOM-1U-N16R8) and the communication module (E22-900MM22S) hold RF/EMC certifications (FCC, TELEC, CE, RoHS) — these are not Ex component certificates and do not satisfy this item.</w:t>
       </w:r>
     </w:p>
     <w:tbl>
@@ -8307,7 +8914,14 @@
                 <w:color w:val="4A4A4A"/>
                 <w:sz w:val="20"/>
               </w:rPr>
-              <w:t>Status: Not yet available.</w:t>
+              <w:t>Stat</w:t>
+            </w:r>
+            <w:r>
+              <w:rPr>
+                <w:color w:val="4A4A4A"/>
+                <w:sz w:val="20"/>
+              </w:rPr>
+              <w:t>us: Not yet available.</w:t>
             </w:r>
           </w:p>
         </w:tc>
@@ -8322,26 +8936,22 @@
       <w:pPr>
         <w:pStyle w:val="Heading1"/>
       </w:pPr>
-      <w:bookmarkStart w:id="21" w:name="_Toc240033949"/>
+      <w:bookmarkStart w:id="21" w:name="_Toc240036167"/>
       <w:r>
-        <w:lastRenderedPageBreak/>
         <w:t>3. Sample Information</w:t>
       </w:r>
       <w:bookmarkEnd w:id="21"/>
     </w:p>
     <w:p>
       <w:r>
-        <w:t>Model, serial number, and sample status (whethe</w:t>
-      </w:r>
-      <w:r>
-        <w:t>r the unit can be powered on and operated), together with any required test fixtures or auxiliary equipment.</w:t>
+        <w:t>Model, serial number, and sample status (whether the unit can be powered on and operated), together with any required test fixtures or auxiliary equipment.</w:t>
       </w:r>
     </w:p>
     <w:p>
       <w:pPr>
         <w:pStyle w:val="Heading2"/>
       </w:pPr>
-      <w:bookmarkStart w:id="22" w:name="_Toc240033950"/>
+      <w:bookmarkStart w:id="22" w:name="_Toc240036168"/>
       <w:r>
         <w:t>3.1 · Model, Serial Number, and Status</w:t>
       </w:r>
@@ -8349,10 +8959,13 @@
     </w:p>
     <w:p>
       <w:r>
-        <w:t>No formal sample register or dossier for ExCB submission has been established. Internal engineering and benc</w:t>
+        <w:t>No formal samp</w:t>
       </w:r>
       <w:r>
-        <w:t>h testing reference the “GLD V2” board configuration under firmware environment gld_v2; a discrete unit serial-numbering scheme for certification samples has not yet been implemented.</w:t>
+        <w:t xml:space="preserve">le register or dossier for ExCB submission has been established. Internal engineering and bench testing reference the “GLD V2” board configuration under firmware environment gld_v2; a discrete unit serial-numbering scheme for certification samples has not </w:t>
+      </w:r>
+      <w:r>
+        <w:t>yet been implemented.</w:t>
       </w:r>
     </w:p>
     <w:tbl>
@@ -8403,7 +9016,7 @@
       <w:pPr>
         <w:pStyle w:val="Heading2"/>
       </w:pPr>
-      <w:bookmarkStart w:id="23" w:name="_Toc240033951"/>
+      <w:bookmarkStart w:id="23" w:name="_Toc240036169"/>
       <w:r>
         <w:t>3.2 · Test Fixtures and Auxiliary Equipment</w:t>
       </w:r>
@@ -8411,7 +9024,10 @@
     </w:p>
     <w:p>
       <w:r>
-        <w:t>A draft internal functional test plan identifies the minimum equipment anticipated for bench-level verification (this plan has not yet been executed and is not evidence of lab readiness):</w:t>
+        <w:t>A draft internal functional test plan identifies the minimum equipment anticipated for bench-level verification (this plan has not yet been executed and is not e</w:t>
+      </w:r>
+      <w:r>
+        <w:t>vidence of lab readiness):</w:t>
       </w:r>
     </w:p>
     <w:tbl>
@@ -8539,7 +9155,13 @@
               <w:rPr>
                 <w:sz w:val="19"/>
               </w:rPr>
-              <w:t>No additional equipment for protocol-level acknowledgement/readback; multimeter or oscilloscope where physical voltage must be substantiated</w:t>
+              <w:t xml:space="preserve">No additional equipment for protocol-level </w:t>
+            </w:r>
+            <w:r>
+              <w:rPr>
+                <w:sz w:val="19"/>
+              </w:rPr>
+              <w:t>acknowledgement/readback; multimeter or oscilloscope where physical voltage must be substantiated</w:t>
             </w:r>
           </w:p>
         </w:tc>
@@ -8561,14 +9183,7 @@
                 <w:b/>
                 <w:sz w:val="19"/>
               </w:rPr>
-              <w:t>Power /</w:t>
-            </w:r>
-            <w:r>
-              <w:rPr>
-                <w:b/>
-                <w:sz w:val="19"/>
-              </w:rPr>
-              <w:t xml:space="preserve"> watchdog timer</w:t>
+              <w:t>Power / watchdog timer</w:t>
             </w:r>
           </w:p>
         </w:tc>
@@ -8622,7 +9237,13 @@
               <w:rPr>
                 <w:sz w:val="19"/>
               </w:rPr>
-              <w:t>The actual alarm load, multimeter/oscilloscope, and hearing protection if an audible buzzer is fitted</w:t>
+              <w:t xml:space="preserve">The actual alarm load, </w:t>
+            </w:r>
+            <w:r>
+              <w:rPr>
+                <w:sz w:val="19"/>
+              </w:rPr>
+              <w:t>multimeter/oscilloscope, and hearing protection if an audible buzzer is fitted</w:t>
             </w:r>
           </w:p>
         </w:tc>
@@ -8660,13 +9281,7 @@
               <w:rPr>
                 <w:sz w:val="19"/>
               </w:rPr>
-              <w:t>At least one counterpart Cl</w:t>
-            </w:r>
-            <w:r>
-              <w:rPr>
-                <w:sz w:val="19"/>
-              </w:rPr>
-              <w:t>uster Head/Gateway device with recorded configuration</w:t>
+              <w:t>At least one counterpart Cluster Head/Gateway device with recorded configuration</w:t>
             </w:r>
           </w:p>
         </w:tc>
@@ -8704,7 +9319,13 @@
               <w:rPr>
                 <w:sz w:val="19"/>
               </w:rPr>
-              <w:t>An RS-485/USB-RS485 master with proper termination and the agreed register map</w:t>
+              <w:t>An RS-485/USB-RS485 master with proper termination and the agreed registe</w:t>
+            </w:r>
+            <w:r>
+              <w:rPr>
+                <w:sz w:val="19"/>
+              </w:rPr>
+              <w:t>r map</w:t>
             </w:r>
           </w:p>
         </w:tc>
@@ -8748,14 +9369,7 @@
                 <w:color w:val="4A4A4A"/>
                 <w:sz w:val="20"/>
               </w:rPr>
-              <w:t xml:space="preserve">Status: Draft plan only — not yet executed, and not evidence of ExCB/laboratory test </w:t>
-            </w:r>
-            <w:r>
-              <w:rPr>
-                <w:color w:val="4A4A4A"/>
-                <w:sz w:val="20"/>
-              </w:rPr>
-              <w:t>readiness.</w:t>
+              <w:t>Status: Draft plan only — not yet executed, and not evidence of ExCB/laboratory test readiness.</w:t>
             </w:r>
           </w:p>
         </w:tc>
@@ -8777,7 +9391,8 @@
           <w:color w:val="8A8A8A"/>
           <w:sz w:val="17"/>
         </w:rPr>
-        <w:t>This is a working document, prepared in stages, drafted in direct reference to the IECEx/ATEX Certification Information Requirements (original English/Mandarin version issued by the certification body). Data sources: the official product tech</w:t>
+        <w:lastRenderedPageBreak/>
+        <w:t xml:space="preserve">This is a working document, prepared in stages, drafted in direct reference to the IECEx/ATEX Certification Information Requirements </w:t>
       </w:r>
       <w:r>
         <w:rPr>
@@ -8785,7 +9400,7 @@
           <w:color w:val="8A8A8A"/>
           <w:sz w:val="17"/>
         </w:rPr>
-        <w:t>nical datasheet (Institute of Technology Bandung, Revision 4.0), internal technical specification documentation, EMC parameter measurement data, and product photography. Fields marked “Pending confirmation” are not yet final and must not be relied upon for</w:t>
+        <w:t>(original English/Mandarin version issued by the certification body). Data sources: the official product technical datasheet (Institute of Technology Bandung, Revision 4.0), internal technical specification documentation, EMC parameter measurement data, an</w:t>
       </w:r>
       <w:r>
         <w:rPr>
@@ -8793,12 +9408,12 @@
           <w:color w:val="8A8A8A"/>
           <w:sz w:val="17"/>
         </w:rPr>
-        <w:t xml:space="preserve"> procurement or certification purposes without further verification.</w:t>
+        <w:t>d product photography. Fields marked “Pending confirmation” are not yet final and must not be relied upon for procurement or certification purposes without further verification.</w:t>
       </w:r>
     </w:p>
     <w:sectPr>
-      <w:headerReference w:type="default" r:id="rId16"/>
-      <w:footerReference w:type="default" r:id="rId17"/>
+      <w:headerReference w:type="default" r:id="rId24"/>
+      <w:footerReference w:type="default" r:id="rId25"/>
       <w:pgSz w:w="12240" w:h="15840"/>
       <w:pgMar w:top="1020" w:right="1247" w:bottom="1020" w:left="1247" w:header="720" w:footer="720" w:gutter="0"/>
       <w:cols w:space="720"/>
@@ -8935,7 +9550,15 @@
         <w:color w:val="4A4A4A"/>
         <w:sz w:val="16"/>
       </w:rPr>
-      <w:t>IECEx/ATEX Certification Document — Gas Leak Detector (GLD) V2  |  Confidential</w:t>
+      <w:t xml:space="preserve">IECEx/ATEX Certification Document — Gas Leak Detector </w:t>
+    </w:r>
+    <w:r>
+      <w:rPr>
+        <w:i/>
+        <w:color w:val="4A4A4A"/>
+        <w:sz w:val="16"/>
+      </w:rPr>
+      <w:t>(GLD) V2  |  Confidential</w:t>
     </w:r>
   </w:p>
 </w:hdr>
@@ -20545,7 +21168,7 @@
     <w:autoRedefine/>
     <w:uiPriority w:val="39"/>
     <w:unhideWhenUsed/>
-    <w:rsid w:val="0097310E"/>
+    <w:rsid w:val="006E0B0F"/>
     <w:pPr>
       <w:spacing w:after="100"/>
     </w:pPr>
@@ -20557,7 +21180,7 @@
     <w:autoRedefine/>
     <w:uiPriority w:val="39"/>
     <w:unhideWhenUsed/>
-    <w:rsid w:val="0097310E"/>
+    <w:rsid w:val="006E0B0F"/>
     <w:pPr>
       <w:spacing w:after="100"/>
       <w:ind w:left="210"/>
@@ -20570,7 +21193,7 @@
     <w:autoRedefine/>
     <w:uiPriority w:val="39"/>
     <w:unhideWhenUsed/>
-    <w:rsid w:val="0097310E"/>
+    <w:rsid w:val="006E0B0F"/>
     <w:pPr>
       <w:spacing w:after="100"/>
       <w:ind w:left="420"/>
@@ -20581,7 +21204,7 @@
     <w:basedOn w:val="DefaultParagraphFont"/>
     <w:uiPriority w:val="99"/>
     <w:unhideWhenUsed/>
-    <w:rsid w:val="0097310E"/>
+    <w:rsid w:val="006E0B0F"/>
     <w:rPr>
       <w:color w:val="0000FF" w:themeColor="hyperlink"/>
       <w:u w:val="single"/>

</xml_diff>

<commit_message>
Embed real dimensioned CAD drawing (enclosure/bracket) into cert doc 2.6.a
Found an existing professional CAD drawing sheet (title block,
orthographic + isometric views, dimensions, parts table) for the
enclosure external envelope and U-bolt mounting bracket, derived from
a real STEP solid model (millimeter units). Previously used for a
separate bracket-mounting deliverable; now cross-referenced into the
certification document.

Raises 2.6.a "Assembly drawing" and "Enclosure structure drawing"
from "Not yet available" to "Partially available" - the external
envelope is genuinely dimensioned, but Ex-d flame-path parameters
(joint gap/length/free volume) are not called out and require a
confirmed protection concept before they can be drawn. Internal
PCB/component assembly and junction-box/grounding drawings remain
not available.

Co-Authored-By: Claude Sonnet 5 <noreply@anthropic.com>
</commit_message>
<xml_diff>
--- a/Deliverables/Dokumen_Teknis_Sertifikasi_GLD_IECEx_ATEX.docx
+++ b/Deliverables/Dokumen_Teknis_Sertifikasi_GLD_IECEx_ATEX.docx
@@ -692,7 +692,7 @@
       <w:r>
         <w:fldChar w:fldCharType="separate"/>
       </w:r>
-      <w:hyperlink w:anchor="_Toc240037707" w:history="1">
+      <w:hyperlink w:anchor="_Toc240038550" w:history="1">
         <w:r>
           <w:rPr>
             <w:rStyle w:val="Hyperlink"/>
@@ -719,7 +719,7 @@
             <w:noProof/>
             <w:webHidden/>
           </w:rPr>
-          <w:instrText xml:space="preserve"> PAGEREF _Toc240037707 \h </w:instrText>
+          <w:instrText xml:space="preserve"> PAGEREF _Toc240038550 \h </w:instrText>
         </w:r>
         <w:r>
           <w:rPr>
@@ -764,7 +764,7 @@
           <w:lang w:val="en-ID" w:eastAsia="en-ID"/>
         </w:rPr>
       </w:pPr>
-      <w:hyperlink w:anchor="_Toc240037708" w:history="1">
+      <w:hyperlink w:anchor="_Toc240038551" w:history="1">
         <w:r>
           <w:rPr>
             <w:rStyle w:val="Hyperlink"/>
@@ -791,7 +791,7 @@
             <w:noProof/>
             <w:webHidden/>
           </w:rPr>
-          <w:instrText xml:space="preserve"> PAGEREF _Toc240037708 \h </w:instrText>
+          <w:instrText xml:space="preserve"> PAGEREF _Toc240038551 \h </w:instrText>
         </w:r>
         <w:r>
           <w:rPr>
@@ -836,7 +836,7 @@
           <w:lang w:val="en-ID" w:eastAsia="en-ID"/>
         </w:rPr>
       </w:pPr>
-      <w:hyperlink w:anchor="_Toc240037709" w:history="1">
+      <w:hyperlink w:anchor="_Toc240038552" w:history="1">
         <w:r>
           <w:rPr>
             <w:rStyle w:val="Hyperlink"/>
@@ -863,7 +863,7 @@
             <w:noProof/>
             <w:webHidden/>
           </w:rPr>
-          <w:instrText xml:space="preserve"> PAGEREF _Toc240037709 \h </w:instrText>
+          <w:instrText xml:space="preserve"> PAGEREF _Toc240038552 \h </w:instrText>
         </w:r>
         <w:r>
           <w:rPr>
@@ -908,7 +908,7 @@
           <w:lang w:val="en-ID" w:eastAsia="en-ID"/>
         </w:rPr>
       </w:pPr>
-      <w:hyperlink w:anchor="_Toc240037710" w:history="1">
+      <w:hyperlink w:anchor="_Toc240038553" w:history="1">
         <w:r>
           <w:rPr>
             <w:rStyle w:val="Hyperlink"/>
@@ -935,7 +935,7 @@
             <w:noProof/>
             <w:webHidden/>
           </w:rPr>
-          <w:instrText xml:space="preserve"> PAGEREF _Toc240037710 \h </w:instrText>
+          <w:instrText xml:space="preserve"> PAGEREF _Toc240038553 \h </w:instrText>
         </w:r>
         <w:r>
           <w:rPr>
@@ -980,7 +980,7 @@
           <w:lang w:val="en-ID" w:eastAsia="en-ID"/>
         </w:rPr>
       </w:pPr>
-      <w:hyperlink w:anchor="_Toc240037711" w:history="1">
+      <w:hyperlink w:anchor="_Toc240038554" w:history="1">
         <w:r>
           <w:rPr>
             <w:rStyle w:val="Hyperlink"/>
@@ -1007,7 +1007,7 @@
             <w:noProof/>
             <w:webHidden/>
           </w:rPr>
-          <w:instrText xml:space="preserve"> PAGEREF _Toc240037711 \h </w:instrText>
+          <w:instrText xml:space="preserve"> PAGEREF _Toc240038554 \h </w:instrText>
         </w:r>
         <w:r>
           <w:rPr>
@@ -1052,7 +1052,7 @@
           <w:lang w:val="en-ID" w:eastAsia="en-ID"/>
         </w:rPr>
       </w:pPr>
-      <w:hyperlink w:anchor="_Toc240037712" w:history="1">
+      <w:hyperlink w:anchor="_Toc240038555" w:history="1">
         <w:r>
           <w:rPr>
             <w:rStyle w:val="Hyperlink"/>
@@ -1079,7 +1079,7 @@
             <w:noProof/>
             <w:webHidden/>
           </w:rPr>
-          <w:instrText xml:space="preserve"> PAGEREF _Toc240037712 \h </w:instrText>
+          <w:instrText xml:space="preserve"> PAGEREF _Toc240038555 \h </w:instrText>
         </w:r>
         <w:r>
           <w:rPr>
@@ -1124,7 +1124,7 @@
           <w:lang w:val="en-ID" w:eastAsia="en-ID"/>
         </w:rPr>
       </w:pPr>
-      <w:hyperlink w:anchor="_Toc240037713" w:history="1">
+      <w:hyperlink w:anchor="_Toc240038556" w:history="1">
         <w:r>
           <w:rPr>
             <w:rStyle w:val="Hyperlink"/>
@@ -1151,7 +1151,7 @@
             <w:noProof/>
             <w:webHidden/>
           </w:rPr>
-          <w:instrText xml:space="preserve"> PAGEREF _Toc240037713 \h </w:instrText>
+          <w:instrText xml:space="preserve"> PAGEREF _Toc240038556 \h </w:instrText>
         </w:r>
         <w:r>
           <w:rPr>
@@ -1196,7 +1196,7 @@
           <w:lang w:val="en-ID" w:eastAsia="en-ID"/>
         </w:rPr>
       </w:pPr>
-      <w:hyperlink w:anchor="_Toc240037714" w:history="1">
+      <w:hyperlink w:anchor="_Toc240038557" w:history="1">
         <w:r>
           <w:rPr>
             <w:rStyle w:val="Hyperlink"/>
@@ -1223,7 +1223,7 @@
             <w:noProof/>
             <w:webHidden/>
           </w:rPr>
-          <w:instrText xml:space="preserve"> PAGEREF _Toc240037714 \h </w:instrText>
+          <w:instrText xml:space="preserve"> PAGEREF _Toc240038557 \h </w:instrText>
         </w:r>
         <w:r>
           <w:rPr>
@@ -1268,7 +1268,7 @@
           <w:lang w:val="en-ID" w:eastAsia="en-ID"/>
         </w:rPr>
       </w:pPr>
-      <w:hyperlink w:anchor="_Toc240037715" w:history="1">
+      <w:hyperlink w:anchor="_Toc240038558" w:history="1">
         <w:r>
           <w:rPr>
             <w:rStyle w:val="Hyperlink"/>
@@ -1295,7 +1295,7 @@
             <w:noProof/>
             <w:webHidden/>
           </w:rPr>
-          <w:instrText xml:space="preserve"> PAGEREF _Toc240037715 \h </w:instrText>
+          <w:instrText xml:space="preserve"> PAGEREF _Toc240038558 \h </w:instrText>
         </w:r>
         <w:r>
           <w:rPr>
@@ -1340,7 +1340,7 @@
           <w:lang w:val="en-ID" w:eastAsia="en-ID"/>
         </w:rPr>
       </w:pPr>
-      <w:hyperlink w:anchor="_Toc240037716" w:history="1">
+      <w:hyperlink w:anchor="_Toc240038559" w:history="1">
         <w:r>
           <w:rPr>
             <w:rStyle w:val="Hyperlink"/>
@@ -1367,7 +1367,7 @@
             <w:noProof/>
             <w:webHidden/>
           </w:rPr>
-          <w:instrText xml:space="preserve"> PAGEREF _Toc240037716 \h </w:instrText>
+          <w:instrText xml:space="preserve"> PAGEREF _Toc240038559 \h </w:instrText>
         </w:r>
         <w:r>
           <w:rPr>
@@ -1412,7 +1412,7 @@
           <w:lang w:val="en-ID" w:eastAsia="en-ID"/>
         </w:rPr>
       </w:pPr>
-      <w:hyperlink w:anchor="_Toc240037717" w:history="1">
+      <w:hyperlink w:anchor="_Toc240038560" w:history="1">
         <w:r>
           <w:rPr>
             <w:rStyle w:val="Hyperlink"/>
@@ -1439,7 +1439,7 @@
             <w:noProof/>
             <w:webHidden/>
           </w:rPr>
-          <w:instrText xml:space="preserve"> PAGEREF _Toc240037717 \h </w:instrText>
+          <w:instrText xml:space="preserve"> PAGEREF _Toc240038560 \h </w:instrText>
         </w:r>
         <w:r>
           <w:rPr>
@@ -1484,7 +1484,7 @@
           <w:lang w:val="en-ID" w:eastAsia="en-ID"/>
         </w:rPr>
       </w:pPr>
-      <w:hyperlink w:anchor="_Toc240037718" w:history="1">
+      <w:hyperlink w:anchor="_Toc240038561" w:history="1">
         <w:r>
           <w:rPr>
             <w:rStyle w:val="Hyperlink"/>
@@ -1511,7 +1511,7 @@
             <w:noProof/>
             <w:webHidden/>
           </w:rPr>
-          <w:instrText xml:space="preserve"> PAGEREF _Toc240037718 \h </w:instrText>
+          <w:instrText xml:space="preserve"> PAGEREF _Toc240038561 \h </w:instrText>
         </w:r>
         <w:r>
           <w:rPr>
@@ -1556,7 +1556,7 @@
           <w:lang w:val="en-ID" w:eastAsia="en-ID"/>
         </w:rPr>
       </w:pPr>
-      <w:hyperlink w:anchor="_Toc240037719" w:history="1">
+      <w:hyperlink w:anchor="_Toc240038562" w:history="1">
         <w:r>
           <w:rPr>
             <w:rStyle w:val="Hyperlink"/>
@@ -1583,7 +1583,7 @@
             <w:noProof/>
             <w:webHidden/>
           </w:rPr>
-          <w:instrText xml:space="preserve"> PAGEREF _Toc240037719 \h </w:instrText>
+          <w:instrText xml:space="preserve"> PAGEREF _Toc240038562 \h </w:instrText>
         </w:r>
         <w:r>
           <w:rPr>
@@ -1628,7 +1628,7 @@
           <w:lang w:val="en-ID" w:eastAsia="en-ID"/>
         </w:rPr>
       </w:pPr>
-      <w:hyperlink w:anchor="_Toc240037720" w:history="1">
+      <w:hyperlink w:anchor="_Toc240038563" w:history="1">
         <w:r>
           <w:rPr>
             <w:rStyle w:val="Hyperlink"/>
@@ -1655,7 +1655,7 @@
             <w:noProof/>
             <w:webHidden/>
           </w:rPr>
-          <w:instrText xml:space="preserve"> PAGEREF _Toc240037720 \h </w:instrText>
+          <w:instrText xml:space="preserve"> PAGEREF _Toc240038563 \h </w:instrText>
         </w:r>
         <w:r>
           <w:rPr>
@@ -1700,7 +1700,7 @@
           <w:lang w:val="en-ID" w:eastAsia="en-ID"/>
         </w:rPr>
       </w:pPr>
-      <w:hyperlink w:anchor="_Toc240037721" w:history="1">
+      <w:hyperlink w:anchor="_Toc240038564" w:history="1">
         <w:r>
           <w:rPr>
             <w:rStyle w:val="Hyperlink"/>
@@ -1727,295 +1727,7 @@
             <w:noProof/>
             <w:webHidden/>
           </w:rPr>
-          <w:instrText xml:space="preserve"> PAGEREF _Toc240037721 \h </w:instrText>
-        </w:r>
-        <w:r>
-          <w:rPr>
-            <w:noProof/>
-            <w:webHidden/>
-          </w:rPr>
-        </w:r>
-        <w:r>
-          <w:rPr>
-            <w:noProof/>
-            <w:webHidden/>
-          </w:rPr>
-          <w:fldChar w:fldCharType="separate"/>
-        </w:r>
-        <w:r>
-          <w:rPr>
-            <w:noProof/>
-            <w:webHidden/>
-          </w:rPr>
-          <w:t>22</w:t>
-        </w:r>
-        <w:r>
-          <w:rPr>
-            <w:noProof/>
-            <w:webHidden/>
-          </w:rPr>
-          <w:fldChar w:fldCharType="end"/>
-        </w:r>
-      </w:hyperlink>
-    </w:p>
-    <w:p>
-      <w:pPr>
-        <w:pStyle w:val="TOC3"/>
-        <w:tabs>
-          <w:tab w:val="right" w:leader="dot" w:pos="9736"/>
-        </w:tabs>
-        <w:rPr>
-          <w:rFonts w:asciiTheme="minorHAnsi" w:hAnsiTheme="minorHAnsi"/>
-          <w:noProof/>
-          <w:color w:val="auto"/>
-          <w:sz w:val="22"/>
-          <w:lang w:val="en-ID" w:eastAsia="en-ID"/>
-        </w:rPr>
-      </w:pPr>
-      <w:hyperlink w:anchor="_Toc240037722" w:history="1">
-        <w:r>
-          <w:rPr>
-            <w:rStyle w:val="Hyperlink"/>
-            <w:noProof/>
-          </w:rPr>
-          <w:t>2.6.d · Manufacturing Process Description</w:t>
-        </w:r>
-        <w:r>
-          <w:rPr>
-            <w:noProof/>
-            <w:webHidden/>
-          </w:rPr>
-          <w:tab/>
-        </w:r>
-        <w:r>
-          <w:rPr>
-            <w:noProof/>
-            <w:webHidden/>
-          </w:rPr>
-          <w:fldChar w:fldCharType="begin"/>
-        </w:r>
-        <w:r>
-          <w:rPr>
-            <w:noProof/>
-            <w:webHidden/>
-          </w:rPr>
-          <w:instrText xml:space="preserve"> PAGEREF _Toc240037722 \h </w:instrText>
-        </w:r>
-        <w:r>
-          <w:rPr>
-            <w:noProof/>
-            <w:webHidden/>
-          </w:rPr>
-        </w:r>
-        <w:r>
-          <w:rPr>
-            <w:noProof/>
-            <w:webHidden/>
-          </w:rPr>
-          <w:fldChar w:fldCharType="separate"/>
-        </w:r>
-        <w:r>
-          <w:rPr>
-            <w:noProof/>
-            <w:webHidden/>
-          </w:rPr>
-          <w:t>22</w:t>
-        </w:r>
-        <w:r>
-          <w:rPr>
-            <w:noProof/>
-            <w:webHidden/>
-          </w:rPr>
-          <w:fldChar w:fldCharType="end"/>
-        </w:r>
-      </w:hyperlink>
-    </w:p>
-    <w:p>
-      <w:pPr>
-        <w:pStyle w:val="TOC3"/>
-        <w:tabs>
-          <w:tab w:val="right" w:leader="dot" w:pos="9736"/>
-        </w:tabs>
-        <w:rPr>
-          <w:rFonts w:asciiTheme="minorHAnsi" w:hAnsiTheme="minorHAnsi"/>
-          <w:noProof/>
-          <w:color w:val="auto"/>
-          <w:sz w:val="22"/>
-          <w:lang w:val="en-ID" w:eastAsia="en-ID"/>
-        </w:rPr>
-      </w:pPr>
-      <w:hyperlink w:anchor="_Toc240037723" w:history="1">
-        <w:r>
-          <w:rPr>
-            <w:rStyle w:val="Hyperlink"/>
-            <w:noProof/>
-          </w:rPr>
-          <w:t>2.6.e · Explosion-Protection Calculations and Explanations (if applicable)</w:t>
-        </w:r>
-        <w:r>
-          <w:rPr>
-            <w:noProof/>
-            <w:webHidden/>
-          </w:rPr>
-          <w:tab/>
-        </w:r>
-        <w:r>
-          <w:rPr>
-            <w:noProof/>
-            <w:webHidden/>
-          </w:rPr>
-          <w:fldChar w:fldCharType="begin"/>
-        </w:r>
-        <w:r>
-          <w:rPr>
-            <w:noProof/>
-            <w:webHidden/>
-          </w:rPr>
-          <w:instrText xml:space="preserve"> PAGEREF _Toc240037723 \h </w:instrText>
-        </w:r>
-        <w:r>
-          <w:rPr>
-            <w:noProof/>
-            <w:webHidden/>
-          </w:rPr>
-        </w:r>
-        <w:r>
-          <w:rPr>
-            <w:noProof/>
-            <w:webHidden/>
-          </w:rPr>
-          <w:fldChar w:fldCharType="separate"/>
-        </w:r>
-        <w:r>
-          <w:rPr>
-            <w:noProof/>
-            <w:webHidden/>
-          </w:rPr>
-          <w:t>22</w:t>
-        </w:r>
-        <w:r>
-          <w:rPr>
-            <w:noProof/>
-            <w:webHidden/>
-          </w:rPr>
-          <w:fldChar w:fldCharType="end"/>
-        </w:r>
-      </w:hyperlink>
-    </w:p>
-    <w:p>
-      <w:pPr>
-        <w:pStyle w:val="TOC3"/>
-        <w:tabs>
-          <w:tab w:val="right" w:leader="dot" w:pos="9736"/>
-        </w:tabs>
-        <w:rPr>
-          <w:rFonts w:asciiTheme="minorHAnsi" w:hAnsiTheme="minorHAnsi"/>
-          <w:noProof/>
-          <w:color w:val="auto"/>
-          <w:sz w:val="22"/>
-          <w:lang w:val="en-ID" w:eastAsia="en-ID"/>
-        </w:rPr>
-      </w:pPr>
-      <w:hyperlink w:anchor="_Toc240037724" w:history="1">
-        <w:r>
-          <w:rPr>
-            <w:rStyle w:val="Hyperlink"/>
-            <w:noProof/>
-          </w:rPr>
-          <w:t>2.6.f · Temperature Group Calculation (Hottest-Point Temperature Estimation)</w:t>
-        </w:r>
-        <w:r>
-          <w:rPr>
-            <w:noProof/>
-            <w:webHidden/>
-          </w:rPr>
-          <w:tab/>
-        </w:r>
-        <w:r>
-          <w:rPr>
-            <w:noProof/>
-            <w:webHidden/>
-          </w:rPr>
-          <w:fldChar w:fldCharType="begin"/>
-        </w:r>
-        <w:r>
-          <w:rPr>
-            <w:noProof/>
-            <w:webHidden/>
-          </w:rPr>
-          <w:instrText xml:space="preserve"> PAGEREF _Toc240037724 \h </w:instrText>
-        </w:r>
-        <w:r>
-          <w:rPr>
-            <w:noProof/>
-            <w:webHidden/>
-          </w:rPr>
-        </w:r>
-        <w:r>
-          <w:rPr>
-            <w:noProof/>
-            <w:webHidden/>
-          </w:rPr>
-          <w:fldChar w:fldCharType="separate"/>
-        </w:r>
-        <w:r>
-          <w:rPr>
-            <w:noProof/>
-            <w:webHidden/>
-          </w:rPr>
-          <w:t>22</w:t>
-        </w:r>
-        <w:r>
-          <w:rPr>
-            <w:noProof/>
-            <w:webHidden/>
-          </w:rPr>
-          <w:fldChar w:fldCharType="end"/>
-        </w:r>
-      </w:hyperlink>
-    </w:p>
-    <w:p>
-      <w:pPr>
-        <w:pStyle w:val="TOC3"/>
-        <w:tabs>
-          <w:tab w:val="right" w:leader="dot" w:pos="9736"/>
-        </w:tabs>
-        <w:rPr>
-          <w:rFonts w:asciiTheme="minorHAnsi" w:hAnsiTheme="minorHAnsi"/>
-          <w:noProof/>
-          <w:color w:val="auto"/>
-          <w:sz w:val="22"/>
-          <w:lang w:val="en-ID" w:eastAsia="en-ID"/>
-        </w:rPr>
-      </w:pPr>
-      <w:hyperlink w:anchor="_Toc240037725" w:history="1">
-        <w:r>
-          <w:rPr>
-            <w:rStyle w:val="Hyperlink"/>
-            <w:noProof/>
-          </w:rPr>
-          <w:t>2.6.g · Usage and Installation Instructions (Draft)</w:t>
-        </w:r>
-        <w:r>
-          <w:rPr>
-            <w:noProof/>
-            <w:webHidden/>
-          </w:rPr>
-          <w:tab/>
-        </w:r>
-        <w:r>
-          <w:rPr>
-            <w:noProof/>
-            <w:webHidden/>
-          </w:rPr>
-          <w:fldChar w:fldCharType="begin"/>
-        </w:r>
-        <w:r>
-          <w:rPr>
-            <w:noProof/>
-            <w:webHidden/>
-          </w:rPr>
-          <w:instrText xml:space="preserve"> PAGEREF _Toc240037725 \h </w:instrText>
+          <w:instrText xml:space="preserve"> PAGEREF _Toc240038564 \h </w:instrText>
         </w:r>
         <w:r>
           <w:rPr>
@@ -2060,13 +1772,13 @@
           <w:lang w:val="en-ID" w:eastAsia="en-ID"/>
         </w:rPr>
       </w:pPr>
-      <w:hyperlink w:anchor="_Toc240037726" w:history="1">
+      <w:hyperlink w:anchor="_Toc240038565" w:history="1">
         <w:r>
           <w:rPr>
             <w:rStyle w:val="Hyperlink"/>
             <w:noProof/>
           </w:rPr>
-          <w:t>2.6.h · Nameplate Information</w:t>
+          <w:t>2.6.d · Manufacturing Process Description</w:t>
         </w:r>
         <w:r>
           <w:rPr>
@@ -2087,7 +1799,7 @@
             <w:noProof/>
             <w:webHidden/>
           </w:rPr>
-          <w:instrText xml:space="preserve"> PAGEREF _Toc240037726 \h </w:instrText>
+          <w:instrText xml:space="preserve"> PAGEREF _Toc240038565 \h </w:instrText>
         </w:r>
         <w:r>
           <w:rPr>
@@ -2132,13 +1844,13 @@
           <w:lang w:val="en-ID" w:eastAsia="en-ID"/>
         </w:rPr>
       </w:pPr>
-      <w:hyperlink w:anchor="_Toc240037727" w:history="1">
+      <w:hyperlink w:anchor="_Toc240038566" w:history="1">
         <w:r>
           <w:rPr>
             <w:rStyle w:val="Hyperlink"/>
             <w:noProof/>
           </w:rPr>
-          <w:t>2.6.i · Ex Component Certificates</w:t>
+          <w:t>2.6.e · Explosion-Protection Calculations and Explanations (if applicable)</w:t>
         </w:r>
         <w:r>
           <w:rPr>
@@ -2159,7 +1871,7 @@
             <w:noProof/>
             <w:webHidden/>
           </w:rPr>
-          <w:instrText xml:space="preserve"> PAGEREF _Toc240037727 \h </w:instrText>
+          <w:instrText xml:space="preserve"> PAGEREF _Toc240038566 \h </w:instrText>
         </w:r>
         <w:r>
           <w:rPr>
@@ -2192,7 +1904,7 @@
     </w:p>
     <w:p>
       <w:pPr>
-        <w:pStyle w:val="TOC1"/>
+        <w:pStyle w:val="TOC3"/>
         <w:tabs>
           <w:tab w:val="right" w:leader="dot" w:pos="9736"/>
         </w:tabs>
@@ -2204,13 +1916,13 @@
           <w:lang w:val="en-ID" w:eastAsia="en-ID"/>
         </w:rPr>
       </w:pPr>
-      <w:hyperlink w:anchor="_Toc240037728" w:history="1">
+      <w:hyperlink w:anchor="_Toc240038567" w:history="1">
         <w:r>
           <w:rPr>
             <w:rStyle w:val="Hyperlink"/>
             <w:noProof/>
           </w:rPr>
-          <w:t>3. Sample Information</w:t>
+          <w:t>2.6.f · Temperature Group Calculation (Hottest-Point Temperature Estimation)</w:t>
         </w:r>
         <w:r>
           <w:rPr>
@@ -2231,7 +1943,7 @@
             <w:noProof/>
             <w:webHidden/>
           </w:rPr>
-          <w:instrText xml:space="preserve"> PAGEREF _Toc240037728 \h </w:instrText>
+          <w:instrText xml:space="preserve"> PAGEREF _Toc240038567 \h </w:instrText>
         </w:r>
         <w:r>
           <w:rPr>
@@ -2264,7 +1976,7 @@
     </w:p>
     <w:p>
       <w:pPr>
-        <w:pStyle w:val="TOC2"/>
+        <w:pStyle w:val="TOC3"/>
         <w:tabs>
           <w:tab w:val="right" w:leader="dot" w:pos="9736"/>
         </w:tabs>
@@ -2276,13 +1988,13 @@
           <w:lang w:val="en-ID" w:eastAsia="en-ID"/>
         </w:rPr>
       </w:pPr>
-      <w:hyperlink w:anchor="_Toc240037729" w:history="1">
+      <w:hyperlink w:anchor="_Toc240038568" w:history="1">
         <w:r>
           <w:rPr>
             <w:rStyle w:val="Hyperlink"/>
             <w:noProof/>
           </w:rPr>
-          <w:t>3.1 · Model, Serial Number, and Status</w:t>
+          <w:t>2.6.g · Usage and Installation Instructions (Draft)</w:t>
         </w:r>
         <w:r>
           <w:rPr>
@@ -2303,7 +2015,223 @@
             <w:noProof/>
             <w:webHidden/>
           </w:rPr>
-          <w:instrText xml:space="preserve"> PAGEREF _Toc240037729 \h </w:instrText>
+          <w:instrText xml:space="preserve"> PAGEREF _Toc240038568 \h </w:instrText>
+        </w:r>
+        <w:r>
+          <w:rPr>
+            <w:noProof/>
+            <w:webHidden/>
+          </w:rPr>
+        </w:r>
+        <w:r>
+          <w:rPr>
+            <w:noProof/>
+            <w:webHidden/>
+          </w:rPr>
+          <w:fldChar w:fldCharType="separate"/>
+        </w:r>
+        <w:r>
+          <w:rPr>
+            <w:noProof/>
+            <w:webHidden/>
+          </w:rPr>
+          <w:t>23</w:t>
+        </w:r>
+        <w:r>
+          <w:rPr>
+            <w:noProof/>
+            <w:webHidden/>
+          </w:rPr>
+          <w:fldChar w:fldCharType="end"/>
+        </w:r>
+      </w:hyperlink>
+    </w:p>
+    <w:p>
+      <w:pPr>
+        <w:pStyle w:val="TOC3"/>
+        <w:tabs>
+          <w:tab w:val="right" w:leader="dot" w:pos="9736"/>
+        </w:tabs>
+        <w:rPr>
+          <w:rFonts w:asciiTheme="minorHAnsi" w:hAnsiTheme="minorHAnsi"/>
+          <w:noProof/>
+          <w:color w:val="auto"/>
+          <w:sz w:val="22"/>
+          <w:lang w:val="en-ID" w:eastAsia="en-ID"/>
+        </w:rPr>
+      </w:pPr>
+      <w:hyperlink w:anchor="_Toc240038569" w:history="1">
+        <w:r>
+          <w:rPr>
+            <w:rStyle w:val="Hyperlink"/>
+            <w:noProof/>
+          </w:rPr>
+          <w:t>2.6.h · Nameplate Information</w:t>
+        </w:r>
+        <w:r>
+          <w:rPr>
+            <w:noProof/>
+            <w:webHidden/>
+          </w:rPr>
+          <w:tab/>
+        </w:r>
+        <w:r>
+          <w:rPr>
+            <w:noProof/>
+            <w:webHidden/>
+          </w:rPr>
+          <w:fldChar w:fldCharType="begin"/>
+        </w:r>
+        <w:r>
+          <w:rPr>
+            <w:noProof/>
+            <w:webHidden/>
+          </w:rPr>
+          <w:instrText xml:space="preserve"> PAGEREF _Toc240038569 \h </w:instrText>
+        </w:r>
+        <w:r>
+          <w:rPr>
+            <w:noProof/>
+            <w:webHidden/>
+          </w:rPr>
+        </w:r>
+        <w:r>
+          <w:rPr>
+            <w:noProof/>
+            <w:webHidden/>
+          </w:rPr>
+          <w:fldChar w:fldCharType="separate"/>
+        </w:r>
+        <w:r>
+          <w:rPr>
+            <w:noProof/>
+            <w:webHidden/>
+          </w:rPr>
+          <w:t>24</w:t>
+        </w:r>
+        <w:r>
+          <w:rPr>
+            <w:noProof/>
+            <w:webHidden/>
+          </w:rPr>
+          <w:fldChar w:fldCharType="end"/>
+        </w:r>
+      </w:hyperlink>
+    </w:p>
+    <w:p>
+      <w:pPr>
+        <w:pStyle w:val="TOC3"/>
+        <w:tabs>
+          <w:tab w:val="right" w:leader="dot" w:pos="9736"/>
+        </w:tabs>
+        <w:rPr>
+          <w:rFonts w:asciiTheme="minorHAnsi" w:hAnsiTheme="minorHAnsi"/>
+          <w:noProof/>
+          <w:color w:val="auto"/>
+          <w:sz w:val="22"/>
+          <w:lang w:val="en-ID" w:eastAsia="en-ID"/>
+        </w:rPr>
+      </w:pPr>
+      <w:hyperlink w:anchor="_Toc240038570" w:history="1">
+        <w:r>
+          <w:rPr>
+            <w:rStyle w:val="Hyperlink"/>
+            <w:noProof/>
+          </w:rPr>
+          <w:t>2.6.i · Ex Component Certificates</w:t>
+        </w:r>
+        <w:r>
+          <w:rPr>
+            <w:noProof/>
+            <w:webHidden/>
+          </w:rPr>
+          <w:tab/>
+        </w:r>
+        <w:r>
+          <w:rPr>
+            <w:noProof/>
+            <w:webHidden/>
+          </w:rPr>
+          <w:fldChar w:fldCharType="begin"/>
+        </w:r>
+        <w:r>
+          <w:rPr>
+            <w:noProof/>
+            <w:webHidden/>
+          </w:rPr>
+          <w:instrText xml:space="preserve"> PAGEREF _Toc240038570 \h </w:instrText>
+        </w:r>
+        <w:r>
+          <w:rPr>
+            <w:noProof/>
+            <w:webHidden/>
+          </w:rPr>
+        </w:r>
+        <w:r>
+          <w:rPr>
+            <w:noProof/>
+            <w:webHidden/>
+          </w:rPr>
+          <w:fldChar w:fldCharType="separate"/>
+        </w:r>
+        <w:r>
+          <w:rPr>
+            <w:noProof/>
+            <w:webHidden/>
+          </w:rPr>
+          <w:t>24</w:t>
+        </w:r>
+        <w:r>
+          <w:rPr>
+            <w:noProof/>
+            <w:webHidden/>
+          </w:rPr>
+          <w:fldChar w:fldCharType="end"/>
+        </w:r>
+      </w:hyperlink>
+    </w:p>
+    <w:p>
+      <w:pPr>
+        <w:pStyle w:val="TOC1"/>
+        <w:tabs>
+          <w:tab w:val="right" w:leader="dot" w:pos="9736"/>
+        </w:tabs>
+        <w:rPr>
+          <w:rFonts w:asciiTheme="minorHAnsi" w:hAnsiTheme="minorHAnsi"/>
+          <w:noProof/>
+          <w:color w:val="auto"/>
+          <w:sz w:val="22"/>
+          <w:lang w:val="en-ID" w:eastAsia="en-ID"/>
+        </w:rPr>
+      </w:pPr>
+      <w:hyperlink w:anchor="_Toc240038571" w:history="1">
+        <w:r>
+          <w:rPr>
+            <w:rStyle w:val="Hyperlink"/>
+            <w:noProof/>
+          </w:rPr>
+          <w:t>3. Sample Information</w:t>
+        </w:r>
+        <w:r>
+          <w:rPr>
+            <w:noProof/>
+            <w:webHidden/>
+          </w:rPr>
+          <w:tab/>
+        </w:r>
+        <w:r>
+          <w:rPr>
+            <w:noProof/>
+            <w:webHidden/>
+          </w:rPr>
+          <w:fldChar w:fldCharType="begin"/>
+        </w:r>
+        <w:r>
+          <w:rPr>
+            <w:noProof/>
+            <w:webHidden/>
+          </w:rPr>
+          <w:instrText xml:space="preserve"> PAGEREF _Toc240038571 \h </w:instrText>
         </w:r>
         <w:r>
           <w:rPr>
@@ -2348,13 +2276,13 @@
           <w:lang w:val="en-ID" w:eastAsia="en-ID"/>
         </w:rPr>
       </w:pPr>
-      <w:hyperlink w:anchor="_Toc240037730" w:history="1">
+      <w:hyperlink w:anchor="_Toc240038572" w:history="1">
         <w:r>
           <w:rPr>
             <w:rStyle w:val="Hyperlink"/>
             <w:noProof/>
           </w:rPr>
-          <w:t>3.2 · Test Fixtures and Auxiliary Equipment</w:t>
+          <w:t>3.1 · Model, Serial Number, and Status</w:t>
         </w:r>
         <w:r>
           <w:rPr>
@@ -2375,7 +2303,7 @@
             <w:noProof/>
             <w:webHidden/>
           </w:rPr>
-          <w:instrText xml:space="preserve"> PAGEREF _Toc240037730 \h </w:instrText>
+          <w:instrText xml:space="preserve"> PAGEREF _Toc240038572 \h </w:instrText>
         </w:r>
         <w:r>
           <w:rPr>
@@ -2407,6 +2335,78 @@
       </w:hyperlink>
     </w:p>
     <w:p>
+      <w:pPr>
+        <w:pStyle w:val="TOC2"/>
+        <w:tabs>
+          <w:tab w:val="right" w:leader="dot" w:pos="9736"/>
+        </w:tabs>
+        <w:rPr>
+          <w:rFonts w:asciiTheme="minorHAnsi" w:hAnsiTheme="minorHAnsi"/>
+          <w:noProof/>
+          <w:color w:val="auto"/>
+          <w:sz w:val="22"/>
+          <w:lang w:val="en-ID" w:eastAsia="en-ID"/>
+        </w:rPr>
+      </w:pPr>
+      <w:hyperlink w:anchor="_Toc240038573" w:history="1">
+        <w:r>
+          <w:rPr>
+            <w:rStyle w:val="Hyperlink"/>
+            <w:noProof/>
+          </w:rPr>
+          <w:t>3.2 · Test Fixtures and Auxiliary Equipment</w:t>
+        </w:r>
+        <w:r>
+          <w:rPr>
+            <w:noProof/>
+            <w:webHidden/>
+          </w:rPr>
+          <w:tab/>
+        </w:r>
+        <w:r>
+          <w:rPr>
+            <w:noProof/>
+            <w:webHidden/>
+          </w:rPr>
+          <w:fldChar w:fldCharType="begin"/>
+        </w:r>
+        <w:r>
+          <w:rPr>
+            <w:noProof/>
+            <w:webHidden/>
+          </w:rPr>
+          <w:instrText xml:space="preserve"> PAGEREF _Toc240038573 \h </w:instrText>
+        </w:r>
+        <w:r>
+          <w:rPr>
+            <w:noProof/>
+            <w:webHidden/>
+          </w:rPr>
+        </w:r>
+        <w:r>
+          <w:rPr>
+            <w:noProof/>
+            <w:webHidden/>
+          </w:rPr>
+          <w:fldChar w:fldCharType="separate"/>
+        </w:r>
+        <w:r>
+          <w:rPr>
+            <w:noProof/>
+            <w:webHidden/>
+          </w:rPr>
+          <w:t>25</w:t>
+        </w:r>
+        <w:r>
+          <w:rPr>
+            <w:noProof/>
+            <w:webHidden/>
+          </w:rPr>
+          <w:fldChar w:fldCharType="end"/>
+        </w:r>
+      </w:hyperlink>
+    </w:p>
+    <w:p>
       <w:r>
         <w:fldChar w:fldCharType="end"/>
       </w:r>
@@ -2420,7 +2420,7 @@
       <w:pPr>
         <w:pStyle w:val="Heading1"/>
       </w:pPr>
-      <w:bookmarkStart w:id="0" w:name="_Toc240037707"/>
+      <w:bookmarkStart w:id="0" w:name="_Toc240038550"/>
       <w:r>
         <w:lastRenderedPageBreak/>
         <w:t>About This Document</w:t>
@@ -2487,7 +2487,7 @@
       <w:pPr>
         <w:pStyle w:val="Heading1"/>
       </w:pPr>
-      <w:bookmarkStart w:id="1" w:name="_Toc240037708"/>
+      <w:bookmarkStart w:id="1" w:name="_Toc240038551"/>
       <w:r>
         <w:t>1. Basic Information (Application and Organization)</w:t>
       </w:r>
@@ -2549,7 +2549,7 @@
       <w:pPr>
         <w:pStyle w:val="Heading1"/>
       </w:pPr>
-      <w:bookmarkStart w:id="2" w:name="_Toc240037709"/>
+      <w:bookmarkStart w:id="2" w:name="_Toc240038552"/>
       <w:r>
         <w:t>2. Technical Documentation</w:t>
       </w:r>
@@ -2567,7 +2567,7 @@
       <w:pPr>
         <w:pStyle w:val="Heading2"/>
       </w:pPr>
-      <w:bookmarkStart w:id="3" w:name="_Toc240037710"/>
+      <w:bookmarkStart w:id="3" w:name="_Toc240038553"/>
       <w:r>
         <w:t>2.1 · Detailed Product Description</w:t>
       </w:r>
@@ -2622,7 +2622,7 @@
       <w:pPr>
         <w:pStyle w:val="Heading2"/>
       </w:pPr>
-      <w:bookmarkStart w:id="4" w:name="_Toc240037711"/>
+      <w:bookmarkStart w:id="4" w:name="_Toc240038554"/>
       <w:r>
         <w:t>2.2 · Product Name, Model, and Specification List</w:t>
       </w:r>
@@ -3040,7 +3040,7 @@
       <w:pPr>
         <w:pStyle w:val="Heading2"/>
       </w:pPr>
-      <w:bookmarkStart w:id="5" w:name="_Toc240037712"/>
+      <w:bookmarkStart w:id="5" w:name="_Toc240038555"/>
       <w:r>
         <w:t xml:space="preserve">2.3 · </w:t>
       </w:r>
@@ -3067,7 +3067,7 @@
       <w:pPr>
         <w:pStyle w:val="Heading3"/>
       </w:pPr>
-      <w:bookmarkStart w:id="6" w:name="_Toc240037713"/>
+      <w:bookmarkStart w:id="6" w:name="_Toc240038556"/>
       <w:r>
         <w:t>2.3.a · Electrical Parameters — Node Sensor (GLD)</w:t>
       </w:r>
@@ -3779,7 +3779,7 @@
       <w:pPr>
         <w:pStyle w:val="Heading3"/>
       </w:pPr>
-      <w:bookmarkStart w:id="7" w:name="_Toc240037714"/>
+      <w:bookmarkStart w:id="7" w:name="_Toc240038557"/>
       <w:r>
         <w:t xml:space="preserve">2.3.b · Sensor and </w:t>
       </w:r>
@@ -4901,7 +4901,7 @@
       <w:pPr>
         <w:pStyle w:val="Heading3"/>
       </w:pPr>
-      <w:bookmarkStart w:id="8" w:name="_Toc240037715"/>
+      <w:bookmarkStart w:id="8" w:name="_Toc240038558"/>
       <w:r>
         <w:t>2.3.c · Mechanical Parameters — Node Sensor (GLD)</w:t>
       </w:r>
@@ -5759,7 +5759,7 @@
       <w:pPr>
         <w:pStyle w:val="Heading2"/>
       </w:pPr>
-      <w:bookmarkStart w:id="9" w:name="_Toc240037716"/>
+      <w:bookmarkStart w:id="9" w:name="_Toc240038559"/>
       <w:r>
         <w:t xml:space="preserve">2.4 · Product Photographs — Overall and Key </w:t>
       </w:r>
@@ -5805,7 +5805,7 @@
               </w:rPr>
               <w:lastRenderedPageBreak/>
               <w:drawing>
-                <wp:inline distT="0" distB="0" distL="0" distR="0" wp14:anchorId="1F8EB4C5" wp14:editId="40B9A296">
+                <wp:inline distT="0" distB="0" distL="0" distR="0" wp14:anchorId="002EACF7" wp14:editId="19AE2DD0">
                   <wp:extent cx="2514600" cy="4165753"/>
                   <wp:effectExtent l="0" t="0" r="0" b="0"/>
                   <wp:docPr id="1" name="Picture 1"/>
@@ -5889,7 +5889,7 @@
                 <w:noProof/>
               </w:rPr>
               <w:drawing>
-                <wp:inline distT="0" distB="0" distL="0" distR="0" wp14:anchorId="2C9F3719" wp14:editId="7311956B">
+                <wp:inline distT="0" distB="0" distL="0" distR="0" wp14:anchorId="4A20533D" wp14:editId="552628BA">
                   <wp:extent cx="2514600" cy="3352800"/>
                   <wp:effectExtent l="0" t="0" r="0" b="0"/>
                   <wp:docPr id="2" name="Picture 2"/>
@@ -5972,7 +5972,7 @@
               </w:rPr>
               <w:lastRenderedPageBreak/>
               <w:drawing>
-                <wp:inline distT="0" distB="0" distL="0" distR="0" wp14:anchorId="049E13D3" wp14:editId="3F6B3322">
+                <wp:inline distT="0" distB="0" distL="0" distR="0" wp14:anchorId="33F54442" wp14:editId="634865E6">
                   <wp:extent cx="2514600" cy="5599312"/>
                   <wp:effectExtent l="0" t="0" r="0" b="0"/>
                   <wp:docPr id="3" name="Picture 3"/>
@@ -6056,7 +6056,7 @@
                 <w:noProof/>
               </w:rPr>
               <w:drawing>
-                <wp:inline distT="0" distB="0" distL="0" distR="0" wp14:anchorId="0E958302" wp14:editId="18CFAD89">
+                <wp:inline distT="0" distB="0" distL="0" distR="0" wp14:anchorId="6B7A2528" wp14:editId="47F0725B">
                   <wp:extent cx="2514600" cy="5599312"/>
                   <wp:effectExtent l="0" t="0" r="0" b="0"/>
                   <wp:docPr id="4" name="Picture 4"/>
@@ -6146,7 +6146,7 @@
               </w:rPr>
               <w:lastRenderedPageBreak/>
               <w:drawing>
-                <wp:inline distT="0" distB="0" distL="0" distR="0" wp14:anchorId="72411105" wp14:editId="4536EC1F">
+                <wp:inline distT="0" distB="0" distL="0" distR="0" wp14:anchorId="6E5FEC97" wp14:editId="71044D65">
                   <wp:extent cx="2514600" cy="5599312"/>
                   <wp:effectExtent l="0" t="0" r="0" b="0"/>
                   <wp:docPr id="5" name="Picture 5"/>
@@ -6230,7 +6230,7 @@
                 <w:noProof/>
               </w:rPr>
               <w:drawing>
-                <wp:inline distT="0" distB="0" distL="0" distR="0" wp14:anchorId="670D2C1D" wp14:editId="7F623FFB">
+                <wp:inline distT="0" distB="0" distL="0" distR="0" wp14:anchorId="4D1A154D" wp14:editId="7CAFFD51">
                   <wp:extent cx="2514600" cy="5599312"/>
                   <wp:effectExtent l="0" t="0" r="0" b="0"/>
                   <wp:docPr id="6" name="Picture 6"/>
@@ -6320,7 +6320,7 @@
               </w:rPr>
               <w:lastRenderedPageBreak/>
               <w:drawing>
-                <wp:inline distT="0" distB="0" distL="0" distR="0" wp14:anchorId="773D6C27" wp14:editId="0A6B0AA2">
+                <wp:inline distT="0" distB="0" distL="0" distR="0" wp14:anchorId="0695FE2C" wp14:editId="43448745">
                   <wp:extent cx="2514600" cy="5599312"/>
                   <wp:effectExtent l="0" t="0" r="0" b="0"/>
                   <wp:docPr id="7" name="Picture 7"/>
@@ -6458,7 +6458,7 @@
       <w:pPr>
         <w:pStyle w:val="Heading2"/>
       </w:pPr>
-      <w:bookmarkStart w:id="10" w:name="_Toc240037717"/>
+      <w:bookmarkStart w:id="10" w:name="_Toc240038560"/>
       <w:r>
         <w:lastRenderedPageBreak/>
         <w:t>2.5 · Description of Intended Use and Installation Environment (G</w:t>
@@ -6949,7 +6949,7 @@
       <w:pPr>
         <w:pStyle w:val="Heading2"/>
       </w:pPr>
-      <w:bookmarkStart w:id="11" w:name="_Toc240037718"/>
+      <w:bookmarkStart w:id="11" w:name="_Toc240038561"/>
       <w:r>
         <w:t>2.6 · Design and Manufacturing Information</w:t>
       </w:r>
@@ -6967,7 +6967,7 @@
       <w:pPr>
         <w:pStyle w:val="Heading3"/>
       </w:pPr>
-      <w:bookmarkStart w:id="12" w:name="_Toc240037719"/>
+      <w:bookmarkStart w:id="12" w:name="_Toc240038562"/>
       <w:r>
         <w:lastRenderedPageBreak/>
         <w:t>2.6.a · Complete Drawings (Assembly, Component, Electrical Schematic, PCB</w:t>
@@ -6997,7 +6997,7 @@
           <w:noProof/>
         </w:rPr>
         <w:drawing>
-          <wp:inline distT="0" distB="0" distL="0" distR="0" wp14:anchorId="4783A312" wp14:editId="2013C88D">
+          <wp:inline distT="0" distB="0" distL="0" distR="0" wp14:anchorId="37063F21" wp14:editId="05B09F65">
             <wp:extent cx="5120640" cy="3413760"/>
             <wp:effectExtent l="0" t="0" r="0" b="0"/>
             <wp:docPr id="8" name="Picture 8"/>
@@ -7077,7 +7077,7 @@
         </w:rPr>
         <w:lastRenderedPageBreak/>
         <w:drawing>
-          <wp:inline distT="0" distB="0" distL="0" distR="0" wp14:anchorId="320188FD" wp14:editId="7FF11B7C">
+          <wp:inline distT="0" distB="0" distL="0" distR="0" wp14:anchorId="63DFA754" wp14:editId="16231FDA">
             <wp:extent cx="5120640" cy="3413760"/>
             <wp:effectExtent l="0" t="0" r="0" b="0"/>
             <wp:docPr id="9" name="Picture 9"/>
@@ -7149,7 +7149,7 @@
           <w:noProof/>
         </w:rPr>
         <w:drawing>
-          <wp:inline distT="0" distB="0" distL="0" distR="0" wp14:anchorId="5FB8727C" wp14:editId="420CE46D">
+          <wp:inline distT="0" distB="0" distL="0" distR="0" wp14:anchorId="5C89BBF8" wp14:editId="2AFD07C4">
             <wp:extent cx="5120640" cy="3413760"/>
             <wp:effectExtent l="0" t="0" r="0" b="0"/>
             <wp:docPr id="10" name="Picture 10"/>
@@ -7222,7 +7222,7 @@
         </w:rPr>
         <w:lastRenderedPageBreak/>
         <w:drawing>
-          <wp:inline distT="0" distB="0" distL="0" distR="0" wp14:anchorId="03A3FA39" wp14:editId="44C32144">
+          <wp:inline distT="0" distB="0" distL="0" distR="0" wp14:anchorId="481FA88B" wp14:editId="0191BB22">
             <wp:extent cx="5120640" cy="3413760"/>
             <wp:effectExtent l="0" t="0" r="0" b="0"/>
             <wp:docPr id="11" name="Picture 11"/>
@@ -7301,7 +7301,7 @@
           <w:noProof/>
         </w:rPr>
         <w:drawing>
-          <wp:inline distT="0" distB="0" distL="0" distR="0" wp14:anchorId="0CE00F43" wp14:editId="0AB643DA">
+          <wp:inline distT="0" distB="0" distL="0" distR="0" wp14:anchorId="4EC4CAA3" wp14:editId="6E9EAD66">
             <wp:extent cx="5120640" cy="3413760"/>
             <wp:effectExtent l="0" t="0" r="0" b="0"/>
             <wp:docPr id="12" name="Picture 12"/>
@@ -7381,7 +7381,7 @@
         </w:rPr>
         <w:lastRenderedPageBreak/>
         <w:drawing>
-          <wp:inline distT="0" distB="0" distL="0" distR="0" wp14:anchorId="0D55B2C1" wp14:editId="2BB73E34">
+          <wp:inline distT="0" distB="0" distL="0" distR="0" wp14:anchorId="586F13B8" wp14:editId="385468D0">
             <wp:extent cx="5120640" cy="3413760"/>
             <wp:effectExtent l="0" t="0" r="0" b="0"/>
             <wp:docPr id="13" name="Picture 13"/>
@@ -7453,7 +7453,7 @@
           <w:noProof/>
         </w:rPr>
         <w:drawing>
-          <wp:inline distT="0" distB="0" distL="0" distR="0" wp14:anchorId="2FDA0B30" wp14:editId="5AEBF00D">
+          <wp:inline distT="0" distB="0" distL="0" distR="0" wp14:anchorId="1945CDC7" wp14:editId="25F41972">
             <wp:extent cx="5120640" cy="3413760"/>
             <wp:effectExtent l="0" t="0" r="0" b="0"/>
             <wp:docPr id="14" name="Picture 14"/>
@@ -7533,7 +7533,7 @@
         </w:rPr>
         <w:lastRenderedPageBreak/>
         <w:drawing>
-          <wp:inline distT="0" distB="0" distL="0" distR="0" wp14:anchorId="286504BB" wp14:editId="467343E3">
+          <wp:inline distT="0" distB="0" distL="0" distR="0" wp14:anchorId="2080EF33" wp14:editId="0D6547A1">
             <wp:extent cx="5120640" cy="3413760"/>
             <wp:effectExtent l="0" t="0" r="0" b="0"/>
             <wp:docPr id="15" name="Picture 15"/>
@@ -7612,7 +7612,7 @@
           <w:noProof/>
         </w:rPr>
         <w:drawing>
-          <wp:inline distT="0" distB="0" distL="0" distR="0" wp14:anchorId="4F004005" wp14:editId="57A4D083">
+          <wp:inline distT="0" distB="0" distL="0" distR="0" wp14:anchorId="0179A5A3" wp14:editId="32D40FE5">
             <wp:extent cx="5120640" cy="3413760"/>
             <wp:effectExtent l="0" t="0" r="0" b="0"/>
             <wp:docPr id="16" name="Picture 16"/>
@@ -7685,7 +7685,7 @@
         </w:rPr>
         <w:lastRenderedPageBreak/>
         <w:drawing>
-          <wp:inline distT="0" distB="0" distL="0" distR="0" wp14:anchorId="68E0237B" wp14:editId="79BE031E">
+          <wp:inline distT="0" distB="0" distL="0" distR="0" wp14:anchorId="0C728815" wp14:editId="20DB3BF9">
             <wp:extent cx="3291840" cy="3305691"/>
             <wp:effectExtent l="0" t="0" r="0" b="0"/>
             <wp:docPr id="17" name="Picture 17"/>
@@ -7755,6 +7755,101 @@
         <w:t xml:space="preserve"> project (production-intent board, circular outline with six mounting holes). A companion 3D solid model (OBJ/MTL) of the same board also exists.</w:t>
       </w:r>
     </w:p>
+    <w:p>
+      <w:r>
+        <w:t>A dimensioned mechanical drawing sheet also exists for the enclosure's external envelope and its mounting hard</w:t>
+      </w:r>
+      <w:r>
+        <w:t>ware, drafted from a solid CAD model (STEP format, millimeter units) with a formal title block, orthographic and isometric views, and a parts table — reproduced below.</w:t>
+      </w:r>
+    </w:p>
+    <w:p>
+      <w:pPr>
+        <w:jc w:val="center"/>
+      </w:pPr>
+      <w:r>
+        <w:rPr>
+          <w:noProof/>
+        </w:rPr>
+        <w:drawing>
+          <wp:inline distT="0" distB="0" distL="0" distR="0" wp14:anchorId="15989358" wp14:editId="19594491">
+            <wp:extent cx="5669280" cy="3847707"/>
+            <wp:effectExtent l="0" t="0" r="0" b="0"/>
+            <wp:docPr id="18" name="Picture 18"/>
+            <wp:cNvGraphicFramePr>
+              <a:graphicFrameLocks xmlns:a="http://schemas.openxmlformats.org/drawingml/2006/main" noChangeAspect="1"/>
+            </wp:cNvGraphicFramePr>
+            <a:graphic xmlns:a="http://schemas.openxmlformats.org/drawingml/2006/main">
+              <a:graphicData uri="http://schemas.openxmlformats.org/drawingml/2006/picture">
+                <pic:pic xmlns:pic="http://schemas.openxmlformats.org/drawingml/2006/picture">
+                  <pic:nvPicPr>
+                    <pic:cNvPr id="0" name="bracket-mounting-drawing.png"/>
+                    <pic:cNvPicPr/>
+                  </pic:nvPicPr>
+                  <pic:blipFill>
+                    <a:blip r:embed="rId25"/>
+                    <a:stretch>
+                      <a:fillRect/>
+                    </a:stretch>
+                  </pic:blipFill>
+                  <pic:spPr>
+                    <a:xfrm>
+                      <a:off x="0" y="0"/>
+                      <a:ext cx="5669280" cy="3847707"/>
+                    </a:xfrm>
+                    <a:prstGeom prst="rect">
+                      <a:avLst/>
+                    </a:prstGeom>
+                  </pic:spPr>
+                </pic:pic>
+              </a:graphicData>
+            </a:graphic>
+          </wp:inline>
+        </w:drawing>
+      </w:r>
+    </w:p>
+    <w:p>
+      <w:pPr>
+        <w:spacing w:after="240"/>
+        <w:jc w:val="center"/>
+      </w:pPr>
+      <w:r>
+        <w:rPr>
+          <w:b/>
+          <w:sz w:val="19"/>
+        </w:rPr>
+        <w:lastRenderedPageBreak/>
+        <w:t>Enclosure envelope &amp; mounting bracket — dimensioned drawing sheet</w:t>
+      </w:r>
+      <w:r>
+        <w:rPr>
+          <w:b/>
+          <w:sz w:val="19"/>
+        </w:rPr>
+        <w:br/>
+      </w:r>
+      <w:r>
+        <w:rPr>
+          <w:color w:val="4A4A4A"/>
+          <w:sz w:val="17"/>
+        </w:rPr>
+        <w:t>Orthographic and iso</w:t>
+      </w:r>
+      <w:r>
+        <w:rPr>
+          <w:color w:val="4A4A4A"/>
+          <w:sz w:val="17"/>
+        </w:rPr>
+        <w:t xml:space="preserve">metric views with real dimensions (enclosure neck Ø75 mm, overall probe height 191.51 mm, mounting plate 250×250 mm with toleranced hole pattern), a U-bolt parameter table (2″/DN50, M10 thread), and a title block (drafted 31 Aug 2026). Source: dimensioned </w:t>
+      </w:r>
+      <w:r>
+        <w:rPr>
+          <w:color w:val="4A4A4A"/>
+          <w:sz w:val="17"/>
+        </w:rPr>
+        <w:t>CAD drawing derived from a STEP solid model of the enclosure and bracket assembly.</w:t>
+      </w:r>
+    </w:p>
     <w:tbl>
       <w:tblPr>
         <w:tblStyle w:val="TableGrid"/>
@@ -7881,13 +7976,13 @@
               <w:rPr>
                 <w:sz w:val="19"/>
               </w:rPr>
-              <w:t>Schema</w:t>
+              <w:t xml:space="preserve">Schematic capture and a derived 9-sheet block-diagram set exist with </w:t>
             </w:r>
             <w:r>
               <w:rPr>
                 <w:sz w:val="19"/>
               </w:rPr>
-              <w:t>tic capture and a derived 9-sheet block-diagram set exist with traceability evidence (pin-to-net mapping). Not yet issued in a released, revision-controlled drawing format with a formal drawing number.</w:t>
+              <w:t>traceability evidence (pin-to-net mapping). Not yet issued in a released, revision-controlled drawing format with a formal drawing number.</w:t>
             </w:r>
           </w:p>
         </w:tc>
@@ -7943,13 +8038,13 @@
               <w:rPr>
                 <w:sz w:val="19"/>
               </w:rPr>
-              <w:t xml:space="preserve">Native </w:t>
+              <w:t xml:space="preserve">Native EasyEDA/JLCPCB layout export (routed copper) and a 3D solid model exist for </w:t>
             </w:r>
             <w:r>
               <w:rPr>
                 <w:sz w:val="19"/>
               </w:rPr>
-              <w:t>EasyEDA/JLCPCB layout export (routed copper) and a 3D solid model exist for the same board revision. Not yet issued as a dimensioned, toleranced, released drawing with a formal drawing number.</w:t>
+              <w:t>the same board revision. Not yet issued as a dimensioned, toleranced, released drawing with a formal drawing number.</w:t>
             </w:r>
           </w:p>
         </w:tc>
@@ -7986,10 +8081,10 @@
             <w:r>
               <w:rPr>
                 <w:b/>
-                <w:color w:val="B02A37"/>
+                <w:color w:val="B56A1E"/>
                 <w:sz w:val="19"/>
               </w:rPr>
-              <w:t>Not yet available</w:t>
+              <w:t>Partially available</w:t>
             </w:r>
           </w:p>
         </w:tc>
@@ -8001,6 +8096,18 @@
             <w:pPr>
               <w:spacing w:after="40"/>
             </w:pPr>
+            <w:r>
+              <w:rPr>
+                <w:sz w:val="19"/>
+              </w:rPr>
+              <w:t>A dimensioned drawing sheet exists for the enclosure/bracket mounting assembly (title block, orthogra</w:t>
+            </w:r>
+            <w:r>
+              <w:rPr>
+                <w:sz w:val="19"/>
+              </w:rPr>
+              <w:t>phic + isometric views, parts table). It covers the external envelope and mounting hardware, not the internal PCB/component assembly sequence.</w:t>
+            </w:r>
           </w:p>
         </w:tc>
       </w:tr>
@@ -8039,15 +8146,7 @@
                 <w:color w:val="B02A37"/>
                 <w:sz w:val="19"/>
               </w:rPr>
-              <w:t>Not yet</w:t>
-            </w:r>
-            <w:r>
-              <w:rPr>
-                <w:b/>
-                <w:color w:val="B02A37"/>
-                <w:sz w:val="19"/>
-              </w:rPr>
-              <w:t xml:space="preserve"> available</w:t>
+              <w:t>Not yet available</w:t>
             </w:r>
           </w:p>
         </w:tc>
@@ -8094,10 +8193,10 @@
             <w:r>
               <w:rPr>
                 <w:b/>
-                <w:color w:val="B02A37"/>
+                <w:color w:val="B56A1E"/>
                 <w:sz w:val="19"/>
               </w:rPr>
-              <w:t>Not yet available</w:t>
+              <w:t>Partially available</w:t>
             </w:r>
           </w:p>
         </w:tc>
@@ -8113,13 +8212,19 @@
               <w:rPr>
                 <w:sz w:val="19"/>
               </w:rPr>
-              <w:t xml:space="preserve">Required if a flameproof (Ex d) protection concept is pursued. The BOM below references a placeholder mechanical symbol for the enclosure (designator U50) with no dimensional </w:t>
+              <w:t>Exte</w:t>
             </w:r>
             <w:r>
               <w:rPr>
                 <w:sz w:val="19"/>
               </w:rPr>
-              <w:t>data attached.</w:t>
+              <w:t>rnal envelope is dimensioned (from a real STEP solid model, millimeter units) in the drawing above. The Ex-d-specific flame-path parameters — joint gap, length, and free internal volume — are not called out; that dimensioning has to be added deliberately o</w:t>
+            </w:r>
+            <w:r>
+              <w:rPr>
+                <w:sz w:val="19"/>
+              </w:rPr>
+              <w:t>nce a protection concept is confirmed (Section 2.5), not derived automatically from the CAD export.</w:t>
             </w:r>
           </w:p>
         </w:tc>
@@ -8213,22 +8318,21 @@
                 <w:color w:val="4A4A4A"/>
                 <w:sz w:val="20"/>
               </w:rPr>
-              <w:t xml:space="preserve">The schematic and PCB layout are useful supporting engineering artifacts, but on their own they do not constitute the certified drawing package the </w:t>
+              <w:t xml:space="preserve">Real dimensioned CAD drawings now exist for the enclosure's external </w:t>
             </w:r>
             <w:r>
               <w:rPr>
                 <w:color w:val="4A4A4A"/>
                 <w:sz w:val="20"/>
               </w:rPr>
-              <w:t xml:space="preserve">checklist requires — dimensioned, toleranced, material-annotated drawings in a </w:t>
+              <w:t>envelope and mounting hardware, and native PCB layout/schematic source files exist for the electronics. What is still missing for a certifiable drawing package: internal component/assembly drawings, junction box and grounding-connection drawings, and — spe</w:t>
             </w:r>
             <w:r>
               <w:rPr>
                 <w:color w:val="4A4A4A"/>
                 <w:sz w:val="20"/>
               </w:rPr>
-              <w:lastRenderedPageBreak/>
-              <w:t>released revision-controlled form have not yet been produced.</w:t>
+              <w:t>cific to explosion protection — flame-path gap/length/volume dimensioning, which requires a confirmed protection concept before it can be drawn.</w:t>
             </w:r>
           </w:p>
         </w:tc>
@@ -8243,7 +8347,7 @@
       <w:pPr>
         <w:pStyle w:val="Heading3"/>
       </w:pPr>
-      <w:bookmarkStart w:id="13" w:name="_Toc240037720"/>
+      <w:bookmarkStart w:id="13" w:name="_Toc240038563"/>
       <w:r>
         <w:t>2.6.b · Bill of Materials (BOM) for Explosion-Safety-Relevant Components</w:t>
       </w:r>
@@ -8251,30 +8355,34 @@
     </w:p>
     <w:p>
       <w:r>
-        <w:t>A complete, itemized electronic-componen</w:t>
+        <w:t xml:space="preserve">A complete, itemized </w:t>
       </w:r>
       <w:r>
-        <w:t>t BOM for both the main board and the external sensor board now exists, exported directly from the EasyEDA/JLCPCB source project (manufacturer, manufacturer part number, and LCSC supplier part number for each line item; 89 line items / 214 placed component</w:t>
+        <w:t>electronic-component BOM for both the main board and the external sensor board now exists, exported directly from the EasyEDA/JLCPCB source project (manufacturer, manufacturer part number, and LCSC supplier part number for each line item; 89 line items / 2</w:t>
       </w:r>
       <w:r>
-        <w:t>s on the main board, 14 line items / 24 placed components on the sensor board — full tables below). This is real, traceable sourcing data and materially improves on the previous status.</w:t>
+        <w:t xml:space="preserve">14 placed components on the main board, 14 line </w:t>
+      </w:r>
+      <w:r>
+        <w:lastRenderedPageBreak/>
+        <w:t>items / 24 placed components on the sensor board — full tables below). This is real, traceable sourcing data and materially improves on the previous status.</w:t>
       </w:r>
     </w:p>
     <w:p>
       <w:r>
-        <w:t>It does not, however, satisfy this checklist item as written. The chec</w:t>
+        <w:t>It does not, however, satisfy this checklist item a</w:t>
       </w:r>
       <w:r>
-        <w:t xml:space="preserve">klist asks specifically for the explosion-safety-relevant BOM — enclosure, gaskets, terminals, cable entry devices, switches, light sources, battery, potting compound, and plastic parts, each with material grade and Ex/UL/CCC certification status. None of </w:t>
+        <w:t>s written. The checklist asks specifically for the explosion-safety-relevant BOM — enclosure, gaskets, terminals, cable entry devices, switches, light sources, battery, potting compound, and plastic parts, each with material grade and Ex/UL/CCC certificati</w:t>
       </w:r>
       <w:r>
-        <w:t>those mechanical/safety items appear in an electronic CAD BOM: the enclosure is present only as a placeholder mechanical symbol (designator U50, no manufacturer or dimensional data attached), and the gas sensor itself (MQ2, designator I1) has no manufactur</w:t>
+        <w:t>on status. None of those mechanical/safety items appear in an electronic CAD BOM: the enclosure is present only as a placeholder mechanical symbol (designator U50, no manufacturer or dimensional data attached), and the gas sensor itself (MQ2, designator I1</w:t>
       </w:r>
       <w:r>
-        <w:t>er or supplier part number recorded — it is sourced outside the LCSC/JLCPCB supply chain and its Ex status is unverified. Comparative research on Ex-rated enclosure products from other manufacturers exists internally as a reference for target specification</w:t>
+        <w:t>) has no manufacturer or supplier part number recorded — it is sourced outside the LCSC/JLCPCB supply chain and its Ex status is unverified. Comparative research on Ex-rated enclosure products from other manufacturers exists internally as a reference for t</w:t>
       </w:r>
       <w:r>
-        <w:t>s only — it describes third-party products, not this product's actual components, and is not included here.</w:t>
+        <w:t>arget specifications only — it describes third-party products, not this product's actual components, and is not included here.</w:t>
       </w:r>
     </w:p>
     <w:tbl>
@@ -10373,7 +10481,6 @@
                 <w:b/>
                 <w:sz w:val="15"/>
               </w:rPr>
-              <w:lastRenderedPageBreak/>
               <w:t>J1</w:t>
             </w:r>
           </w:p>
@@ -11190,6 +11297,7 @@
                 <w:b/>
                 <w:sz w:val="15"/>
               </w:rPr>
+              <w:lastRenderedPageBreak/>
               <w:t>Q2</w:t>
             </w:r>
           </w:p>
@@ -14658,7 +14766,6 @@
                 <w:b/>
                 <w:sz w:val="15"/>
               </w:rPr>
-              <w:lastRenderedPageBreak/>
               <w:t>U39</w:t>
             </w:r>
           </w:p>
@@ -15373,6 +15480,7 @@
                 <w:b/>
                 <w:sz w:val="15"/>
               </w:rPr>
+              <w:lastRenderedPageBreak/>
               <w:t>U13</w:t>
             </w:r>
           </w:p>
@@ -18987,7 +19095,6 @@
                 <w:b/>
                 <w:sz w:val="15"/>
               </w:rPr>
-              <w:lastRenderedPageBreak/>
               <w:t>U3</w:t>
             </w:r>
           </w:p>
@@ -19126,7 +19233,15 @@
                 <w:color w:val="4A4A4A"/>
                 <w:sz w:val="20"/>
               </w:rPr>
-              <w:t>erial grade and Ex/UL/CCC certification for each — remains not yet compiled, because those mechanical/safety parts are not represented in an electronic design BOM.</w:t>
+              <w:t xml:space="preserve">erial grade and Ex/UL/CCC certification for each — remains not yet compiled, because those mechanical/safety parts are not </w:t>
+            </w:r>
+            <w:r>
+              <w:rPr>
+                <w:color w:val="4A4A4A"/>
+                <w:sz w:val="20"/>
+              </w:rPr>
+              <w:lastRenderedPageBreak/>
+              <w:t>represented in an electronic design BOM.</w:t>
             </w:r>
           </w:p>
         </w:tc>
@@ -19141,7 +19256,7 @@
       <w:pPr>
         <w:pStyle w:val="Heading3"/>
       </w:pPr>
-      <w:bookmarkStart w:id="14" w:name="_Toc240037721"/>
+      <w:bookmarkStart w:id="14" w:name="_Toc240038564"/>
       <w:r>
         <w:t>2.6.c · Material Specification Sheets / Datasheets (Non-Metallic Materials)</w:t>
       </w:r>
@@ -19203,7 +19318,7 @@
       <w:pPr>
         <w:pStyle w:val="Heading3"/>
       </w:pPr>
-      <w:bookmarkStart w:id="15" w:name="_Toc240037722"/>
+      <w:bookmarkStart w:id="15" w:name="_Toc240038565"/>
       <w:r>
         <w:t>2.6.d · Manufacturing Process Description</w:t>
       </w:r>
@@ -19265,7 +19380,7 @@
       <w:pPr>
         <w:pStyle w:val="Heading3"/>
       </w:pPr>
-      <w:bookmarkStart w:id="16" w:name="_Toc240037723"/>
+      <w:bookmarkStart w:id="16" w:name="_Toc240038566"/>
       <w:r>
         <w:t>2.6.e · Explosion-Protection Calculations and Explanations (if applicable)</w:t>
       </w:r>
@@ -19327,7 +19442,7 @@
       <w:pPr>
         <w:pStyle w:val="Heading3"/>
       </w:pPr>
-      <w:bookmarkStart w:id="17" w:name="_Toc240037724"/>
+      <w:bookmarkStart w:id="17" w:name="_Toc240038567"/>
       <w:r>
         <w:t>2.6.f · Temperature Group Calculation (Hottest-Point Temperature Estimation)</w:t>
       </w:r>
@@ -19395,9 +19510,8 @@
       <w:pPr>
         <w:pStyle w:val="Heading3"/>
       </w:pPr>
-      <w:bookmarkStart w:id="18" w:name="_Toc240037725"/>
+      <w:bookmarkStart w:id="18" w:name="_Toc240038568"/>
       <w:r>
-        <w:lastRenderedPageBreak/>
         <w:t>2.6.g · Usage and Installation Instructions (Draft)</w:t>
       </w:r>
       <w:bookmarkEnd w:id="18"/>
@@ -19598,7 +19712,14 @@
               <w:rPr>
                 <w:sz w:val="19"/>
               </w:rPr>
-              <w:t>without drilling or welding — see Section 2.3.c), but cable-entry method, torque values, grounding requirements, and cleaning requirements have not yet been formally specified.</w:t>
+              <w:t xml:space="preserve">without drilling or welding — see Section 2.3.c), but cable-entry method, torque values, grounding </w:t>
+            </w:r>
+            <w:r>
+              <w:rPr>
+                <w:sz w:val="19"/>
+              </w:rPr>
+              <w:lastRenderedPageBreak/>
+              <w:t>requirements, and cleaning requirements have not yet been formally specified.</w:t>
             </w:r>
           </w:p>
         </w:tc>
@@ -19620,6 +19741,7 @@
                 <w:b/>
                 <w:sz w:val="19"/>
               </w:rPr>
+              <w:lastRenderedPageBreak/>
               <w:t>c) Operating instructions and maintenance requirements</w:t>
             </w:r>
           </w:p>
@@ -19726,7 +19848,7 @@
       <w:pPr>
         <w:pStyle w:val="Heading3"/>
       </w:pPr>
-      <w:bookmarkStart w:id="19" w:name="_Toc240037726"/>
+      <w:bookmarkStart w:id="19" w:name="_Toc240038569"/>
       <w:r>
         <w:t>2.6.h · Nameplate Information</w:t>
       </w:r>
@@ -19788,7 +19910,7 @@
       <w:pPr>
         <w:pStyle w:val="Heading3"/>
       </w:pPr>
-      <w:bookmarkStart w:id="20" w:name="_Toc240037727"/>
+      <w:bookmarkStart w:id="20" w:name="_Toc240038570"/>
       <w:r>
         <w:t>2.6.i · Ex Component Certificates</w:t>
       </w:r>
@@ -19796,10 +19918,10 @@
     </w:p>
     <w:p>
       <w:r>
-        <w:t>No components in this design currently hold an Ex component certificate. As</w:t>
+        <w:t xml:space="preserve">No components in this design currently hold an Ex component </w:t>
       </w:r>
       <w:r>
-        <w:t xml:space="preserve"> noted in Section 2.3.b, the processing unit (ESP32-S3-WROOM-1U-N16R8) and the communication module (E22-900MM22S) hold RF/EMC certifications (FCC, TELEC, CE, RoHS) — these are not Ex component certificates and do not satisfy this item.</w:t>
+        <w:t>certificate. As noted in Section 2.3.b, the processing unit (ESP32-S3-WROOM-1U-N16R8) and the communication module (E22-900MM22S) hold RF/EMC certifications (FCC, TELEC, CE, RoHS) — these are not Ex component certificates and do not satisfy this item.</w:t>
       </w:r>
     </w:p>
     <w:tbl>
@@ -19835,14 +19957,14 @@
                 <w:color w:val="4A4A4A"/>
                 <w:sz w:val="20"/>
               </w:rPr>
-              <w:t>Status: Not yet ava</w:t>
+              <w:t>Stat</w:t>
             </w:r>
             <w:r>
               <w:rPr>
                 <w:color w:val="4A4A4A"/>
                 <w:sz w:val="20"/>
               </w:rPr>
-              <w:t>ilable.</w:t>
+              <w:t>us: Not yet available.</w:t>
             </w:r>
           </w:p>
         </w:tc>
@@ -19857,7 +19979,7 @@
       <w:pPr>
         <w:pStyle w:val="Heading1"/>
       </w:pPr>
-      <w:bookmarkStart w:id="21" w:name="_Toc240037728"/>
+      <w:bookmarkStart w:id="21" w:name="_Toc240038571"/>
       <w:r>
         <w:t>3. Sample Information</w:t>
       </w:r>
@@ -19872,22 +19994,21 @@
       <w:pPr>
         <w:pStyle w:val="Heading2"/>
       </w:pPr>
-      <w:bookmarkStart w:id="22" w:name="_Toc240037729"/>
+      <w:bookmarkStart w:id="22" w:name="_Toc240038572"/>
       <w:r>
-        <w:lastRenderedPageBreak/>
         <w:t>3.1 · Model, Serial Number, and Status</w:t>
       </w:r>
       <w:bookmarkEnd w:id="22"/>
     </w:p>
     <w:p>
       <w:r>
-        <w:t xml:space="preserve">No formal sample register or </w:t>
+        <w:t>No formal samp</w:t>
       </w:r>
       <w:r>
-        <w:t>dossier for ExCB submission has been established. Internal engineering and bench testing reference the “GLD V2” board configuration under firmware environment gld_v2; a discrete unit serial-numbering scheme for certification samples has not yet been implem</w:t>
+        <w:t xml:space="preserve">le register or dossier for ExCB submission has been established. Internal engineering and bench testing reference the “GLD V2” board configuration under firmware environment gld_v2; a discrete unit serial-numbering scheme for certification samples has not </w:t>
       </w:r>
       <w:r>
-        <w:t>ented.</w:t>
+        <w:t>yet been implemented.</w:t>
       </w:r>
     </w:p>
     <w:tbl>
@@ -19938,18 +20059,19 @@
       <w:pPr>
         <w:pStyle w:val="Heading2"/>
       </w:pPr>
-      <w:bookmarkStart w:id="23" w:name="_Toc240037730"/>
+      <w:bookmarkStart w:id="23" w:name="_Toc240038573"/>
       <w:r>
+        <w:lastRenderedPageBreak/>
         <w:t>3.2 · Test Fixtures and Auxiliary Equipment</w:t>
       </w:r>
       <w:bookmarkEnd w:id="23"/>
     </w:p>
     <w:p>
       <w:r>
-        <w:t xml:space="preserve">A draft internal functional test plan identifies the minimum equipment anticipated for bench-level verification (this plan has not yet been executed and is not evidence of </w:t>
+        <w:t>A draft internal functional test plan identifies the minimum equipment anticipated for bench-level verification (this plan has not yet been executed and is not e</w:t>
       </w:r>
       <w:r>
-        <w:t>lab readiness):</w:t>
+        <w:t>vidence of lab readiness):</w:t>
       </w:r>
     </w:p>
     <w:tbl>
@@ -20334,8 +20456,8 @@
       </w:r>
     </w:p>
     <w:sectPr>
-      <w:headerReference w:type="default" r:id="rId25"/>
-      <w:footerReference w:type="default" r:id="rId26"/>
+      <w:headerReference w:type="default" r:id="rId26"/>
+      <w:footerReference w:type="default" r:id="rId27"/>
       <w:pgSz w:w="12240" w:h="15840"/>
       <w:pgMar w:top="1020" w:right="1247" w:bottom="1020" w:left="1247" w:header="720" w:footer="720" w:gutter="0"/>
       <w:cols w:space="720"/>
@@ -32090,7 +32212,7 @@
     <w:autoRedefine/>
     <w:uiPriority w:val="39"/>
     <w:unhideWhenUsed/>
-    <w:rsid w:val="00472975"/>
+    <w:rsid w:val="001F590F"/>
     <w:pPr>
       <w:spacing w:after="100"/>
     </w:pPr>
@@ -32102,7 +32224,7 @@
     <w:autoRedefine/>
     <w:uiPriority w:val="39"/>
     <w:unhideWhenUsed/>
-    <w:rsid w:val="00472975"/>
+    <w:rsid w:val="001F590F"/>
     <w:pPr>
       <w:spacing w:after="100"/>
       <w:ind w:left="210"/>
@@ -32115,7 +32237,7 @@
     <w:autoRedefine/>
     <w:uiPriority w:val="39"/>
     <w:unhideWhenUsed/>
-    <w:rsid w:val="00472975"/>
+    <w:rsid w:val="001F590F"/>
     <w:pPr>
       <w:spacing w:after="100"/>
       <w:ind w:left="420"/>
@@ -32126,7 +32248,7 @@
     <w:basedOn w:val="DefaultParagraphFont"/>
     <w:uiPriority w:val="99"/>
     <w:unhideWhenUsed/>
-    <w:rsid w:val="00472975"/>
+    <w:rsid w:val="001F590F"/>
     <w:rPr>
       <w:color w:val="0000FF" w:themeColor="hyperlink"/>
       <w:u w:val="single"/>

</xml_diff>

<commit_message>
Add 3D populated render of main board to cert doc 2.6.a
User-supplied 3D render (from the same EasyEDA/JLCPCB solid model as
the copper layout) placed alongside the layout image for visual
context - ESP32-S3-WROOM, micro-USB, power inductors, and the
I2C header block visible in their real positions. Labeled explicitly
as an illustrative render, not a dimensioned drawing.

Co-Authored-By: Claude Sonnet 5 <noreply@anthropic.com>
</commit_message>
<xml_diff>
--- a/Deliverables/Dokumen_Teknis_Sertifikasi_GLD_IECEx_ATEX.docx
+++ b/Deliverables/Dokumen_Teknis_Sertifikasi_GLD_IECEx_ATEX.docx
@@ -692,7 +692,7 @@
       <w:r>
         <w:fldChar w:fldCharType="separate"/>
       </w:r>
-      <w:hyperlink w:anchor="_Toc240038550" w:history="1">
+      <w:hyperlink w:anchor="_Toc240058081" w:history="1">
         <w:r>
           <w:rPr>
             <w:rStyle w:val="Hyperlink"/>
@@ -719,7 +719,7 @@
             <w:noProof/>
             <w:webHidden/>
           </w:rPr>
-          <w:instrText xml:space="preserve"> PAGEREF _Toc240038550 \h </w:instrText>
+          <w:instrText xml:space="preserve"> PAGEREF _Toc240058081 \h </w:instrText>
         </w:r>
         <w:r>
           <w:rPr>
@@ -764,7 +764,7 @@
           <w:lang w:val="en-ID" w:eastAsia="en-ID"/>
         </w:rPr>
       </w:pPr>
-      <w:hyperlink w:anchor="_Toc240038551" w:history="1">
+      <w:hyperlink w:anchor="_Toc240058082" w:history="1">
         <w:r>
           <w:rPr>
             <w:rStyle w:val="Hyperlink"/>
@@ -791,7 +791,7 @@
             <w:noProof/>
             <w:webHidden/>
           </w:rPr>
-          <w:instrText xml:space="preserve"> PAGEREF _Toc240038551 \h </w:instrText>
+          <w:instrText xml:space="preserve"> PAGEREF _Toc240058082 \h </w:instrText>
         </w:r>
         <w:r>
           <w:rPr>
@@ -836,7 +836,7 @@
           <w:lang w:val="en-ID" w:eastAsia="en-ID"/>
         </w:rPr>
       </w:pPr>
-      <w:hyperlink w:anchor="_Toc240038552" w:history="1">
+      <w:hyperlink w:anchor="_Toc240058083" w:history="1">
         <w:r>
           <w:rPr>
             <w:rStyle w:val="Hyperlink"/>
@@ -863,7 +863,7 @@
             <w:noProof/>
             <w:webHidden/>
           </w:rPr>
-          <w:instrText xml:space="preserve"> PAGEREF _Toc240038552 \h </w:instrText>
+          <w:instrText xml:space="preserve"> PAGEREF _Toc240058083 \h </w:instrText>
         </w:r>
         <w:r>
           <w:rPr>
@@ -908,7 +908,7 @@
           <w:lang w:val="en-ID" w:eastAsia="en-ID"/>
         </w:rPr>
       </w:pPr>
-      <w:hyperlink w:anchor="_Toc240038553" w:history="1">
+      <w:hyperlink w:anchor="_Toc240058084" w:history="1">
         <w:r>
           <w:rPr>
             <w:rStyle w:val="Hyperlink"/>
@@ -935,7 +935,7 @@
             <w:noProof/>
             <w:webHidden/>
           </w:rPr>
-          <w:instrText xml:space="preserve"> PAGEREF _Toc240038553 \h </w:instrText>
+          <w:instrText xml:space="preserve"> PAGEREF _Toc240058084 \h </w:instrText>
         </w:r>
         <w:r>
           <w:rPr>
@@ -980,7 +980,7 @@
           <w:lang w:val="en-ID" w:eastAsia="en-ID"/>
         </w:rPr>
       </w:pPr>
-      <w:hyperlink w:anchor="_Toc240038554" w:history="1">
+      <w:hyperlink w:anchor="_Toc240058085" w:history="1">
         <w:r>
           <w:rPr>
             <w:rStyle w:val="Hyperlink"/>
@@ -1007,7 +1007,7 @@
             <w:noProof/>
             <w:webHidden/>
           </w:rPr>
-          <w:instrText xml:space="preserve"> PAGEREF _Toc240038554 \h </w:instrText>
+          <w:instrText xml:space="preserve"> PAGEREF _Toc240058085 \h </w:instrText>
         </w:r>
         <w:r>
           <w:rPr>
@@ -1052,7 +1052,7 @@
           <w:lang w:val="en-ID" w:eastAsia="en-ID"/>
         </w:rPr>
       </w:pPr>
-      <w:hyperlink w:anchor="_Toc240038555" w:history="1">
+      <w:hyperlink w:anchor="_Toc240058086" w:history="1">
         <w:r>
           <w:rPr>
             <w:rStyle w:val="Hyperlink"/>
@@ -1079,7 +1079,7 @@
             <w:noProof/>
             <w:webHidden/>
           </w:rPr>
-          <w:instrText xml:space="preserve"> PAGEREF _Toc240038555 \h </w:instrText>
+          <w:instrText xml:space="preserve"> PAGEREF _Toc240058086 \h </w:instrText>
         </w:r>
         <w:r>
           <w:rPr>
@@ -1124,7 +1124,7 @@
           <w:lang w:val="en-ID" w:eastAsia="en-ID"/>
         </w:rPr>
       </w:pPr>
-      <w:hyperlink w:anchor="_Toc240038556" w:history="1">
+      <w:hyperlink w:anchor="_Toc240058087" w:history="1">
         <w:r>
           <w:rPr>
             <w:rStyle w:val="Hyperlink"/>
@@ -1151,7 +1151,7 @@
             <w:noProof/>
             <w:webHidden/>
           </w:rPr>
-          <w:instrText xml:space="preserve"> PAGEREF _Toc240038556 \h </w:instrText>
+          <w:instrText xml:space="preserve"> PAGEREF _Toc240058087 \h </w:instrText>
         </w:r>
         <w:r>
           <w:rPr>
@@ -1196,7 +1196,7 @@
           <w:lang w:val="en-ID" w:eastAsia="en-ID"/>
         </w:rPr>
       </w:pPr>
-      <w:hyperlink w:anchor="_Toc240038557" w:history="1">
+      <w:hyperlink w:anchor="_Toc240058088" w:history="1">
         <w:r>
           <w:rPr>
             <w:rStyle w:val="Hyperlink"/>
@@ -1223,7 +1223,7 @@
             <w:noProof/>
             <w:webHidden/>
           </w:rPr>
-          <w:instrText xml:space="preserve"> PAGEREF _Toc240038557 \h </w:instrText>
+          <w:instrText xml:space="preserve"> PAGEREF _Toc240058088 \h </w:instrText>
         </w:r>
         <w:r>
           <w:rPr>
@@ -1268,7 +1268,7 @@
           <w:lang w:val="en-ID" w:eastAsia="en-ID"/>
         </w:rPr>
       </w:pPr>
-      <w:hyperlink w:anchor="_Toc240038558" w:history="1">
+      <w:hyperlink w:anchor="_Toc240058089" w:history="1">
         <w:r>
           <w:rPr>
             <w:rStyle w:val="Hyperlink"/>
@@ -1295,7 +1295,7 @@
             <w:noProof/>
             <w:webHidden/>
           </w:rPr>
-          <w:instrText xml:space="preserve"> PAGEREF _Toc240038558 \h </w:instrText>
+          <w:instrText xml:space="preserve"> PAGEREF _Toc240058089 \h </w:instrText>
         </w:r>
         <w:r>
           <w:rPr>
@@ -1340,7 +1340,7 @@
           <w:lang w:val="en-ID" w:eastAsia="en-ID"/>
         </w:rPr>
       </w:pPr>
-      <w:hyperlink w:anchor="_Toc240038559" w:history="1">
+      <w:hyperlink w:anchor="_Toc240058090" w:history="1">
         <w:r>
           <w:rPr>
             <w:rStyle w:val="Hyperlink"/>
@@ -1367,7 +1367,7 @@
             <w:noProof/>
             <w:webHidden/>
           </w:rPr>
-          <w:instrText xml:space="preserve"> PAGEREF _Toc240038559 \h </w:instrText>
+          <w:instrText xml:space="preserve"> PAGEREF _Toc240058090 \h </w:instrText>
         </w:r>
         <w:r>
           <w:rPr>
@@ -1412,7 +1412,7 @@
           <w:lang w:val="en-ID" w:eastAsia="en-ID"/>
         </w:rPr>
       </w:pPr>
-      <w:hyperlink w:anchor="_Toc240038560" w:history="1">
+      <w:hyperlink w:anchor="_Toc240058091" w:history="1">
         <w:r>
           <w:rPr>
             <w:rStyle w:val="Hyperlink"/>
@@ -1439,7 +1439,7 @@
             <w:noProof/>
             <w:webHidden/>
           </w:rPr>
-          <w:instrText xml:space="preserve"> PAGEREF _Toc240038560 \h </w:instrText>
+          <w:instrText xml:space="preserve"> PAGEREF _Toc240058091 \h </w:instrText>
         </w:r>
         <w:r>
           <w:rPr>
@@ -1484,7 +1484,7 @@
           <w:lang w:val="en-ID" w:eastAsia="en-ID"/>
         </w:rPr>
       </w:pPr>
-      <w:hyperlink w:anchor="_Toc240038561" w:history="1">
+      <w:hyperlink w:anchor="_Toc240058092" w:history="1">
         <w:r>
           <w:rPr>
             <w:rStyle w:val="Hyperlink"/>
@@ -1511,7 +1511,7 @@
             <w:noProof/>
             <w:webHidden/>
           </w:rPr>
-          <w:instrText xml:space="preserve"> PAGEREF _Toc240038561 \h </w:instrText>
+          <w:instrText xml:space="preserve"> PAGEREF _Toc240058092 \h </w:instrText>
         </w:r>
         <w:r>
           <w:rPr>
@@ -1556,7 +1556,7 @@
           <w:lang w:val="en-ID" w:eastAsia="en-ID"/>
         </w:rPr>
       </w:pPr>
-      <w:hyperlink w:anchor="_Toc240038562" w:history="1">
+      <w:hyperlink w:anchor="_Toc240058093" w:history="1">
         <w:r>
           <w:rPr>
             <w:rStyle w:val="Hyperlink"/>
@@ -1583,7 +1583,7 @@
             <w:noProof/>
             <w:webHidden/>
           </w:rPr>
-          <w:instrText xml:space="preserve"> PAGEREF _Toc240038562 \h </w:instrText>
+          <w:instrText xml:space="preserve"> PAGEREF _Toc240058093 \h </w:instrText>
         </w:r>
         <w:r>
           <w:rPr>
@@ -1628,7 +1628,7 @@
           <w:lang w:val="en-ID" w:eastAsia="en-ID"/>
         </w:rPr>
       </w:pPr>
-      <w:hyperlink w:anchor="_Toc240038563" w:history="1">
+      <w:hyperlink w:anchor="_Toc240058094" w:history="1">
         <w:r>
           <w:rPr>
             <w:rStyle w:val="Hyperlink"/>
@@ -1655,7 +1655,7 @@
             <w:noProof/>
             <w:webHidden/>
           </w:rPr>
-          <w:instrText xml:space="preserve"> PAGEREF _Toc240038563 \h </w:instrText>
+          <w:instrText xml:space="preserve"> PAGEREF _Toc240058094 \h </w:instrText>
         </w:r>
         <w:r>
           <w:rPr>
@@ -1700,7 +1700,7 @@
           <w:lang w:val="en-ID" w:eastAsia="en-ID"/>
         </w:rPr>
       </w:pPr>
-      <w:hyperlink w:anchor="_Toc240038564" w:history="1">
+      <w:hyperlink w:anchor="_Toc240058095" w:history="1">
         <w:r>
           <w:rPr>
             <w:rStyle w:val="Hyperlink"/>
@@ -1727,7 +1727,7 @@
             <w:noProof/>
             <w:webHidden/>
           </w:rPr>
-          <w:instrText xml:space="preserve"> PAGEREF _Toc240038564 \h </w:instrText>
+          <w:instrText xml:space="preserve"> PAGEREF _Toc240058095 \h </w:instrText>
         </w:r>
         <w:r>
           <w:rPr>
@@ -1772,7 +1772,7 @@
           <w:lang w:val="en-ID" w:eastAsia="en-ID"/>
         </w:rPr>
       </w:pPr>
-      <w:hyperlink w:anchor="_Toc240038565" w:history="1">
+      <w:hyperlink w:anchor="_Toc240058096" w:history="1">
         <w:r>
           <w:rPr>
             <w:rStyle w:val="Hyperlink"/>
@@ -1799,7 +1799,7 @@
             <w:noProof/>
             <w:webHidden/>
           </w:rPr>
-          <w:instrText xml:space="preserve"> PAGEREF _Toc240038565 \h </w:instrText>
+          <w:instrText xml:space="preserve"> PAGEREF _Toc240058096 \h </w:instrText>
         </w:r>
         <w:r>
           <w:rPr>
@@ -1844,7 +1844,7 @@
           <w:lang w:val="en-ID" w:eastAsia="en-ID"/>
         </w:rPr>
       </w:pPr>
-      <w:hyperlink w:anchor="_Toc240038566" w:history="1">
+      <w:hyperlink w:anchor="_Toc240058097" w:history="1">
         <w:r>
           <w:rPr>
             <w:rStyle w:val="Hyperlink"/>
@@ -1871,7 +1871,7 @@
             <w:noProof/>
             <w:webHidden/>
           </w:rPr>
-          <w:instrText xml:space="preserve"> PAGEREF _Toc240038566 \h </w:instrText>
+          <w:instrText xml:space="preserve"> PAGEREF _Toc240058097 \h </w:instrText>
         </w:r>
         <w:r>
           <w:rPr>
@@ -1916,7 +1916,7 @@
           <w:lang w:val="en-ID" w:eastAsia="en-ID"/>
         </w:rPr>
       </w:pPr>
-      <w:hyperlink w:anchor="_Toc240038567" w:history="1">
+      <w:hyperlink w:anchor="_Toc240058098" w:history="1">
         <w:r>
           <w:rPr>
             <w:rStyle w:val="Hyperlink"/>
@@ -1943,7 +1943,7 @@
             <w:noProof/>
             <w:webHidden/>
           </w:rPr>
-          <w:instrText xml:space="preserve"> PAGEREF _Toc240038567 \h </w:instrText>
+          <w:instrText xml:space="preserve"> PAGEREF _Toc240058098 \h </w:instrText>
         </w:r>
         <w:r>
           <w:rPr>
@@ -1988,7 +1988,7 @@
           <w:lang w:val="en-ID" w:eastAsia="en-ID"/>
         </w:rPr>
       </w:pPr>
-      <w:hyperlink w:anchor="_Toc240038568" w:history="1">
+      <w:hyperlink w:anchor="_Toc240058099" w:history="1">
         <w:r>
           <w:rPr>
             <w:rStyle w:val="Hyperlink"/>
@@ -2015,7 +2015,7 @@
             <w:noProof/>
             <w:webHidden/>
           </w:rPr>
-          <w:instrText xml:space="preserve"> PAGEREF _Toc240038568 \h </w:instrText>
+          <w:instrText xml:space="preserve"> PAGEREF _Toc240058099 \h </w:instrText>
         </w:r>
         <w:r>
           <w:rPr>
@@ -2060,7 +2060,7 @@
           <w:lang w:val="en-ID" w:eastAsia="en-ID"/>
         </w:rPr>
       </w:pPr>
-      <w:hyperlink w:anchor="_Toc240038569" w:history="1">
+      <w:hyperlink w:anchor="_Toc240058100" w:history="1">
         <w:r>
           <w:rPr>
             <w:rStyle w:val="Hyperlink"/>
@@ -2087,7 +2087,7 @@
             <w:noProof/>
             <w:webHidden/>
           </w:rPr>
-          <w:instrText xml:space="preserve"> PAGEREF _Toc240038569 \h </w:instrText>
+          <w:instrText xml:space="preserve"> PAGEREF _Toc240058100 \h </w:instrText>
         </w:r>
         <w:r>
           <w:rPr>
@@ -2132,7 +2132,7 @@
           <w:lang w:val="en-ID" w:eastAsia="en-ID"/>
         </w:rPr>
       </w:pPr>
-      <w:hyperlink w:anchor="_Toc240038570" w:history="1">
+      <w:hyperlink w:anchor="_Toc240058101" w:history="1">
         <w:r>
           <w:rPr>
             <w:rStyle w:val="Hyperlink"/>
@@ -2159,7 +2159,7 @@
             <w:noProof/>
             <w:webHidden/>
           </w:rPr>
-          <w:instrText xml:space="preserve"> PAGEREF _Toc240038570 \h </w:instrText>
+          <w:instrText xml:space="preserve"> PAGEREF _Toc240058101 \h </w:instrText>
         </w:r>
         <w:r>
           <w:rPr>
@@ -2204,7 +2204,7 @@
           <w:lang w:val="en-ID" w:eastAsia="en-ID"/>
         </w:rPr>
       </w:pPr>
-      <w:hyperlink w:anchor="_Toc240038571" w:history="1">
+      <w:hyperlink w:anchor="_Toc240058102" w:history="1">
         <w:r>
           <w:rPr>
             <w:rStyle w:val="Hyperlink"/>
@@ -2231,7 +2231,7 @@
             <w:noProof/>
             <w:webHidden/>
           </w:rPr>
-          <w:instrText xml:space="preserve"> PAGEREF _Toc240038571 \h </w:instrText>
+          <w:instrText xml:space="preserve"> PAGEREF _Toc240058102 \h </w:instrText>
         </w:r>
         <w:r>
           <w:rPr>
@@ -2276,7 +2276,7 @@
           <w:lang w:val="en-ID" w:eastAsia="en-ID"/>
         </w:rPr>
       </w:pPr>
-      <w:hyperlink w:anchor="_Toc240038572" w:history="1">
+      <w:hyperlink w:anchor="_Toc240058103" w:history="1">
         <w:r>
           <w:rPr>
             <w:rStyle w:val="Hyperlink"/>
@@ -2303,7 +2303,7 @@
             <w:noProof/>
             <w:webHidden/>
           </w:rPr>
-          <w:instrText xml:space="preserve"> PAGEREF _Toc240038572 \h </w:instrText>
+          <w:instrText xml:space="preserve"> PAGEREF _Toc240058103 \h </w:instrText>
         </w:r>
         <w:r>
           <w:rPr>
@@ -2348,7 +2348,7 @@
           <w:lang w:val="en-ID" w:eastAsia="en-ID"/>
         </w:rPr>
       </w:pPr>
-      <w:hyperlink w:anchor="_Toc240038573" w:history="1">
+      <w:hyperlink w:anchor="_Toc240058104" w:history="1">
         <w:r>
           <w:rPr>
             <w:rStyle w:val="Hyperlink"/>
@@ -2375,7 +2375,7 @@
             <w:noProof/>
             <w:webHidden/>
           </w:rPr>
-          <w:instrText xml:space="preserve"> PAGEREF _Toc240038573 \h </w:instrText>
+          <w:instrText xml:space="preserve"> PAGEREF _Toc240058104 \h </w:instrText>
         </w:r>
         <w:r>
           <w:rPr>
@@ -2395,7 +2395,7 @@
             <w:noProof/>
             <w:webHidden/>
           </w:rPr>
-          <w:t>25</w:t>
+          <w:t>24</w:t>
         </w:r>
         <w:r>
           <w:rPr>
@@ -2420,7 +2420,7 @@
       <w:pPr>
         <w:pStyle w:val="Heading1"/>
       </w:pPr>
-      <w:bookmarkStart w:id="0" w:name="_Toc240038550"/>
+      <w:bookmarkStart w:id="0" w:name="_Toc240058081"/>
       <w:r>
         <w:lastRenderedPageBreak/>
         <w:t>About This Document</w:t>
@@ -2487,7 +2487,7 @@
       <w:pPr>
         <w:pStyle w:val="Heading1"/>
       </w:pPr>
-      <w:bookmarkStart w:id="1" w:name="_Toc240038551"/>
+      <w:bookmarkStart w:id="1" w:name="_Toc240058082"/>
       <w:r>
         <w:t>1. Basic Information (Application and Organization)</w:t>
       </w:r>
@@ -2549,7 +2549,7 @@
       <w:pPr>
         <w:pStyle w:val="Heading1"/>
       </w:pPr>
-      <w:bookmarkStart w:id="2" w:name="_Toc240038552"/>
+      <w:bookmarkStart w:id="2" w:name="_Toc240058083"/>
       <w:r>
         <w:t>2. Technical Documentation</w:t>
       </w:r>
@@ -2567,7 +2567,7 @@
       <w:pPr>
         <w:pStyle w:val="Heading2"/>
       </w:pPr>
-      <w:bookmarkStart w:id="3" w:name="_Toc240038553"/>
+      <w:bookmarkStart w:id="3" w:name="_Toc240058084"/>
       <w:r>
         <w:t>2.1 · Detailed Product Description</w:t>
       </w:r>
@@ -2622,7 +2622,7 @@
       <w:pPr>
         <w:pStyle w:val="Heading2"/>
       </w:pPr>
-      <w:bookmarkStart w:id="4" w:name="_Toc240038554"/>
+      <w:bookmarkStart w:id="4" w:name="_Toc240058085"/>
       <w:r>
         <w:t>2.2 · Product Name, Model, and Specification List</w:t>
       </w:r>
@@ -3040,7 +3040,7 @@
       <w:pPr>
         <w:pStyle w:val="Heading2"/>
       </w:pPr>
-      <w:bookmarkStart w:id="5" w:name="_Toc240038555"/>
+      <w:bookmarkStart w:id="5" w:name="_Toc240058086"/>
       <w:r>
         <w:t xml:space="preserve">2.3 · </w:t>
       </w:r>
@@ -3067,7 +3067,7 @@
       <w:pPr>
         <w:pStyle w:val="Heading3"/>
       </w:pPr>
-      <w:bookmarkStart w:id="6" w:name="_Toc240038556"/>
+      <w:bookmarkStart w:id="6" w:name="_Toc240058087"/>
       <w:r>
         <w:t>2.3.a · Electrical Parameters — Node Sensor (GLD)</w:t>
       </w:r>
@@ -3779,7 +3779,7 @@
       <w:pPr>
         <w:pStyle w:val="Heading3"/>
       </w:pPr>
-      <w:bookmarkStart w:id="7" w:name="_Toc240038557"/>
+      <w:bookmarkStart w:id="7" w:name="_Toc240058088"/>
       <w:r>
         <w:t xml:space="preserve">2.3.b · Sensor and </w:t>
       </w:r>
@@ -4901,7 +4901,7 @@
       <w:pPr>
         <w:pStyle w:val="Heading3"/>
       </w:pPr>
-      <w:bookmarkStart w:id="8" w:name="_Toc240038558"/>
+      <w:bookmarkStart w:id="8" w:name="_Toc240058089"/>
       <w:r>
         <w:t>2.3.c · Mechanical Parameters — Node Sensor (GLD)</w:t>
       </w:r>
@@ -5759,7 +5759,7 @@
       <w:pPr>
         <w:pStyle w:val="Heading2"/>
       </w:pPr>
-      <w:bookmarkStart w:id="9" w:name="_Toc240038559"/>
+      <w:bookmarkStart w:id="9" w:name="_Toc240058090"/>
       <w:r>
         <w:t xml:space="preserve">2.4 · Product Photographs — Overall and Key </w:t>
       </w:r>
@@ -5805,7 +5805,7 @@
               </w:rPr>
               <w:lastRenderedPageBreak/>
               <w:drawing>
-                <wp:inline distT="0" distB="0" distL="0" distR="0" wp14:anchorId="002EACF7" wp14:editId="19AE2DD0">
+                <wp:inline distT="0" distB="0" distL="0" distR="0" wp14:anchorId="6CE66042" wp14:editId="5D07AB14">
                   <wp:extent cx="2514600" cy="4165753"/>
                   <wp:effectExtent l="0" t="0" r="0" b="0"/>
                   <wp:docPr id="1" name="Picture 1"/>
@@ -5889,7 +5889,7 @@
                 <w:noProof/>
               </w:rPr>
               <w:drawing>
-                <wp:inline distT="0" distB="0" distL="0" distR="0" wp14:anchorId="4A20533D" wp14:editId="552628BA">
+                <wp:inline distT="0" distB="0" distL="0" distR="0" wp14:anchorId="0A3AF5B6" wp14:editId="12F0F99F">
                   <wp:extent cx="2514600" cy="3352800"/>
                   <wp:effectExtent l="0" t="0" r="0" b="0"/>
                   <wp:docPr id="2" name="Picture 2"/>
@@ -5972,7 +5972,7 @@
               </w:rPr>
               <w:lastRenderedPageBreak/>
               <w:drawing>
-                <wp:inline distT="0" distB="0" distL="0" distR="0" wp14:anchorId="33F54442" wp14:editId="634865E6">
+                <wp:inline distT="0" distB="0" distL="0" distR="0" wp14:anchorId="41A50C92" wp14:editId="73E025A3">
                   <wp:extent cx="2514600" cy="5599312"/>
                   <wp:effectExtent l="0" t="0" r="0" b="0"/>
                   <wp:docPr id="3" name="Picture 3"/>
@@ -6056,7 +6056,7 @@
                 <w:noProof/>
               </w:rPr>
               <w:drawing>
-                <wp:inline distT="0" distB="0" distL="0" distR="0" wp14:anchorId="6B7A2528" wp14:editId="47F0725B">
+                <wp:inline distT="0" distB="0" distL="0" distR="0" wp14:anchorId="7910CDEE" wp14:editId="14B91D13">
                   <wp:extent cx="2514600" cy="5599312"/>
                   <wp:effectExtent l="0" t="0" r="0" b="0"/>
                   <wp:docPr id="4" name="Picture 4"/>
@@ -6146,7 +6146,7 @@
               </w:rPr>
               <w:lastRenderedPageBreak/>
               <w:drawing>
-                <wp:inline distT="0" distB="0" distL="0" distR="0" wp14:anchorId="6E5FEC97" wp14:editId="71044D65">
+                <wp:inline distT="0" distB="0" distL="0" distR="0" wp14:anchorId="1C9D0DE3" wp14:editId="502A88D8">
                   <wp:extent cx="2514600" cy="5599312"/>
                   <wp:effectExtent l="0" t="0" r="0" b="0"/>
                   <wp:docPr id="5" name="Picture 5"/>
@@ -6230,7 +6230,7 @@
                 <w:noProof/>
               </w:rPr>
               <w:drawing>
-                <wp:inline distT="0" distB="0" distL="0" distR="0" wp14:anchorId="4D1A154D" wp14:editId="7CAFFD51">
+                <wp:inline distT="0" distB="0" distL="0" distR="0" wp14:anchorId="0AD095F9" wp14:editId="7F161A37">
                   <wp:extent cx="2514600" cy="5599312"/>
                   <wp:effectExtent l="0" t="0" r="0" b="0"/>
                   <wp:docPr id="6" name="Picture 6"/>
@@ -6320,7 +6320,7 @@
               </w:rPr>
               <w:lastRenderedPageBreak/>
               <w:drawing>
-                <wp:inline distT="0" distB="0" distL="0" distR="0" wp14:anchorId="0695FE2C" wp14:editId="43448745">
+                <wp:inline distT="0" distB="0" distL="0" distR="0" wp14:anchorId="0DF8A8FE" wp14:editId="1777D93D">
                   <wp:extent cx="2514600" cy="5599312"/>
                   <wp:effectExtent l="0" t="0" r="0" b="0"/>
                   <wp:docPr id="7" name="Picture 7"/>
@@ -6458,7 +6458,7 @@
       <w:pPr>
         <w:pStyle w:val="Heading2"/>
       </w:pPr>
-      <w:bookmarkStart w:id="10" w:name="_Toc240038560"/>
+      <w:bookmarkStart w:id="10" w:name="_Toc240058091"/>
       <w:r>
         <w:lastRenderedPageBreak/>
         <w:t>2.5 · Description of Intended Use and Installation Environment (G</w:t>
@@ -6949,7 +6949,7 @@
       <w:pPr>
         <w:pStyle w:val="Heading2"/>
       </w:pPr>
-      <w:bookmarkStart w:id="11" w:name="_Toc240038561"/>
+      <w:bookmarkStart w:id="11" w:name="_Toc240058092"/>
       <w:r>
         <w:t>2.6 · Design and Manufacturing Information</w:t>
       </w:r>
@@ -6967,7 +6967,7 @@
       <w:pPr>
         <w:pStyle w:val="Heading3"/>
       </w:pPr>
-      <w:bookmarkStart w:id="12" w:name="_Toc240038562"/>
+      <w:bookmarkStart w:id="12" w:name="_Toc240058093"/>
       <w:r>
         <w:lastRenderedPageBreak/>
         <w:t>2.6.a · Complete Drawings (Assembly, Component, Electrical Schematic, PCB</w:t>
@@ -6997,7 +6997,7 @@
           <w:noProof/>
         </w:rPr>
         <w:drawing>
-          <wp:inline distT="0" distB="0" distL="0" distR="0" wp14:anchorId="37063F21" wp14:editId="05B09F65">
+          <wp:inline distT="0" distB="0" distL="0" distR="0" wp14:anchorId="6BD5BF24" wp14:editId="0212BAF3">
             <wp:extent cx="5120640" cy="3413760"/>
             <wp:effectExtent l="0" t="0" r="0" b="0"/>
             <wp:docPr id="8" name="Picture 8"/>
@@ -7077,7 +7077,7 @@
         </w:rPr>
         <w:lastRenderedPageBreak/>
         <w:drawing>
-          <wp:inline distT="0" distB="0" distL="0" distR="0" wp14:anchorId="63DFA754" wp14:editId="16231FDA">
+          <wp:inline distT="0" distB="0" distL="0" distR="0" wp14:anchorId="239A9AED" wp14:editId="7D3634BD">
             <wp:extent cx="5120640" cy="3413760"/>
             <wp:effectExtent l="0" t="0" r="0" b="0"/>
             <wp:docPr id="9" name="Picture 9"/>
@@ -7149,7 +7149,7 @@
           <w:noProof/>
         </w:rPr>
         <w:drawing>
-          <wp:inline distT="0" distB="0" distL="0" distR="0" wp14:anchorId="5C89BBF8" wp14:editId="2AFD07C4">
+          <wp:inline distT="0" distB="0" distL="0" distR="0" wp14:anchorId="239221CF" wp14:editId="3827D273">
             <wp:extent cx="5120640" cy="3413760"/>
             <wp:effectExtent l="0" t="0" r="0" b="0"/>
             <wp:docPr id="10" name="Picture 10"/>
@@ -7222,7 +7222,7 @@
         </w:rPr>
         <w:lastRenderedPageBreak/>
         <w:drawing>
-          <wp:inline distT="0" distB="0" distL="0" distR="0" wp14:anchorId="481FA88B" wp14:editId="0191BB22">
+          <wp:inline distT="0" distB="0" distL="0" distR="0" wp14:anchorId="6AC14DDB" wp14:editId="14D4C0B9">
             <wp:extent cx="5120640" cy="3413760"/>
             <wp:effectExtent l="0" t="0" r="0" b="0"/>
             <wp:docPr id="11" name="Picture 11"/>
@@ -7301,7 +7301,7 @@
           <w:noProof/>
         </w:rPr>
         <w:drawing>
-          <wp:inline distT="0" distB="0" distL="0" distR="0" wp14:anchorId="4EC4CAA3" wp14:editId="6E9EAD66">
+          <wp:inline distT="0" distB="0" distL="0" distR="0" wp14:anchorId="40F23DD7" wp14:editId="283B49A2">
             <wp:extent cx="5120640" cy="3413760"/>
             <wp:effectExtent l="0" t="0" r="0" b="0"/>
             <wp:docPr id="12" name="Picture 12"/>
@@ -7381,7 +7381,7 @@
         </w:rPr>
         <w:lastRenderedPageBreak/>
         <w:drawing>
-          <wp:inline distT="0" distB="0" distL="0" distR="0" wp14:anchorId="586F13B8" wp14:editId="385468D0">
+          <wp:inline distT="0" distB="0" distL="0" distR="0" wp14:anchorId="05848E3E" wp14:editId="49519174">
             <wp:extent cx="5120640" cy="3413760"/>
             <wp:effectExtent l="0" t="0" r="0" b="0"/>
             <wp:docPr id="13" name="Picture 13"/>
@@ -7453,7 +7453,7 @@
           <w:noProof/>
         </w:rPr>
         <w:drawing>
-          <wp:inline distT="0" distB="0" distL="0" distR="0" wp14:anchorId="1945CDC7" wp14:editId="25F41972">
+          <wp:inline distT="0" distB="0" distL="0" distR="0" wp14:anchorId="5945DA11" wp14:editId="67CBB097">
             <wp:extent cx="5120640" cy="3413760"/>
             <wp:effectExtent l="0" t="0" r="0" b="0"/>
             <wp:docPr id="14" name="Picture 14"/>
@@ -7533,7 +7533,7 @@
         </w:rPr>
         <w:lastRenderedPageBreak/>
         <w:drawing>
-          <wp:inline distT="0" distB="0" distL="0" distR="0" wp14:anchorId="2080EF33" wp14:editId="0D6547A1">
+          <wp:inline distT="0" distB="0" distL="0" distR="0" wp14:anchorId="0C4278B6" wp14:editId="6D1D8826">
             <wp:extent cx="5120640" cy="3413760"/>
             <wp:effectExtent l="0" t="0" r="0" b="0"/>
             <wp:docPr id="15" name="Picture 15"/>
@@ -7612,7 +7612,7 @@
           <w:noProof/>
         </w:rPr>
         <w:drawing>
-          <wp:inline distT="0" distB="0" distL="0" distR="0" wp14:anchorId="0179A5A3" wp14:editId="32D40FE5">
+          <wp:inline distT="0" distB="0" distL="0" distR="0" wp14:anchorId="20FD1630" wp14:editId="2848F6FF">
             <wp:extent cx="5120640" cy="3413760"/>
             <wp:effectExtent l="0" t="0" r="0" b="0"/>
             <wp:docPr id="16" name="Picture 16"/>
@@ -7685,8 +7685,8 @@
         </w:rPr>
         <w:lastRenderedPageBreak/>
         <w:drawing>
-          <wp:inline distT="0" distB="0" distL="0" distR="0" wp14:anchorId="0C728815" wp14:editId="20DB3BF9">
-            <wp:extent cx="3291840" cy="3305691"/>
+          <wp:inline distT="0" distB="0" distL="0" distR="0" wp14:anchorId="12385A06" wp14:editId="16E2534D">
+            <wp:extent cx="2468880" cy="2479268"/>
             <wp:effectExtent l="0" t="0" r="0" b="0"/>
             <wp:docPr id="17" name="Picture 17"/>
             <wp:cNvGraphicFramePr>
@@ -7708,7 +7708,50 @@
                   <pic:spPr>
                     <a:xfrm>
                       <a:off x="0" y="0"/>
-                      <a:ext cx="3291840" cy="3305691"/>
+                      <a:ext cx="2468880" cy="2479268"/>
+                    </a:xfrm>
+                    <a:prstGeom prst="rect">
+                      <a:avLst/>
+                    </a:prstGeom>
+                  </pic:spPr>
+                </pic:pic>
+              </a:graphicData>
+            </a:graphic>
+          </wp:inline>
+        </w:drawing>
+      </w:r>
+      <w:r>
+        <w:t xml:space="preserve">   </w:t>
+      </w:r>
+      <w:r>
+        <w:rPr>
+          <w:noProof/>
+        </w:rPr>
+        <w:drawing>
+          <wp:inline distT="0" distB="0" distL="0" distR="0" wp14:anchorId="03A27084" wp14:editId="09C32CA2">
+            <wp:extent cx="2468880" cy="1804956"/>
+            <wp:effectExtent l="0" t="0" r="0" b="0"/>
+            <wp:docPr id="18" name="Picture 18"/>
+            <wp:cNvGraphicFramePr>
+              <a:graphicFrameLocks xmlns:a="http://schemas.openxmlformats.org/drawingml/2006/main" noChangeAspect="1"/>
+            </wp:cNvGraphicFramePr>
+            <a:graphic xmlns:a="http://schemas.openxmlformats.org/drawingml/2006/main">
+              <a:graphicData uri="http://schemas.openxmlformats.org/drawingml/2006/picture">
+                <pic:pic xmlns:pic="http://schemas.openxmlformats.org/drawingml/2006/picture">
+                  <pic:nvPicPr>
+                    <pic:cNvPr id="0" name="11-pcb-3d-render.png"/>
+                    <pic:cNvPicPr/>
+                  </pic:nvPicPr>
+                  <pic:blipFill>
+                    <a:blip r:embed="rId25"/>
+                    <a:stretch>
+                      <a:fillRect/>
+                    </a:stretch>
+                  </pic:blipFill>
+                  <pic:spPr>
+                    <a:xfrm>
+                      <a:off x="0" y="0"/>
+                      <a:ext cx="2468880" cy="1804956"/>
                     </a:xfrm>
                     <a:prstGeom prst="rect">
                       <a:avLst/>
@@ -7731,7 +7774,7 @@
           <w:b/>
           <w:sz w:val="19"/>
         </w:rPr>
-        <w:t>Main board PCB layout — top copper layer</w:t>
+        <w:t>Main board PCB layout (top copper) and 3D populated render</w:t>
       </w:r>
       <w:r>
         <w:rPr>
@@ -7745,22 +7788,29 @@
           <w:color w:val="4A4A4A"/>
           <w:sz w:val="17"/>
         </w:rPr>
-        <w:t>Routed layout exported directly from the EasyEDA/JLCPCB source</w:t>
+        <w:t>Both exported directly from the EasyEDA/</w:t>
       </w:r>
       <w:r>
         <w:rPr>
           <w:color w:val="4A4A4A"/>
           <w:sz w:val="17"/>
         </w:rPr>
-        <w:t xml:space="preserve"> project (production-intent board, circular outline with six mounting holes). A companion 3D solid model (OBJ/MTL) of the same board also exists.</w:t>
+        <w:t>JLCPCB source project (production-intent board, circular outline with six mounting holes). The 3D render shows the ESP32-S3-WROOM module, micro-USB connector, power inductors, and 8-channel I2C header block in their real placed positions; it is an illustra</w:t>
+      </w:r>
+      <w:r>
+        <w:rPr>
+          <w:color w:val="4A4A4A"/>
+          <w:sz w:val="17"/>
+        </w:rPr>
+        <w:t>tive render, not a dimensioned drawing.</w:t>
       </w:r>
     </w:p>
     <w:p>
       <w:r>
-        <w:t>A dimensioned mechanical drawing sheet also exists for the enclosure's external envelope and its mounting hard</w:t>
+        <w:t>A dimensioned mechanical drawing sheet also exists for the enclosure's external envelope and its mounting hardware, drafted from a solid CAD model (STEP format, millimeter units) with a formal title block, orthograph</w:t>
       </w:r>
       <w:r>
-        <w:t>ware, drafted from a solid CAD model (STEP format, millimeter units) with a formal title block, orthographic and isometric views, and a parts table — reproduced below.</w:t>
+        <w:t>ic and isometric views, and a parts table — reproduced below.</w:t>
       </w:r>
     </w:p>
     <w:p>
@@ -7772,10 +7822,10 @@
           <w:noProof/>
         </w:rPr>
         <w:drawing>
-          <wp:inline distT="0" distB="0" distL="0" distR="0" wp14:anchorId="15989358" wp14:editId="19594491">
+          <wp:inline distT="0" distB="0" distL="0" distR="0" wp14:anchorId="1F93EA91" wp14:editId="089A7A7F">
             <wp:extent cx="5669280" cy="3847707"/>
             <wp:effectExtent l="0" t="0" r="0" b="0"/>
-            <wp:docPr id="18" name="Picture 18"/>
+            <wp:docPr id="19" name="Picture 19"/>
             <wp:cNvGraphicFramePr>
               <a:graphicFrameLocks xmlns:a="http://schemas.openxmlformats.org/drawingml/2006/main" noChangeAspect="1"/>
             </wp:cNvGraphicFramePr>
@@ -7787,7 +7837,7 @@
                     <pic:cNvPicPr/>
                   </pic:nvPicPr>
                   <pic:blipFill>
-                    <a:blip r:embed="rId25"/>
+                    <a:blip r:embed="rId26"/>
                     <a:stretch>
                       <a:fillRect/>
                     </a:stretch>
@@ -7818,7 +7868,6 @@
           <w:b/>
           <w:sz w:val="19"/>
         </w:rPr>
-        <w:lastRenderedPageBreak/>
         <w:t>Enclosure envelope &amp; mounting bracket — dimensioned drawing sheet</w:t>
       </w:r>
       <w:r>
@@ -7833,21 +7882,22 @@
           <w:color w:val="4A4A4A"/>
           <w:sz w:val="17"/>
         </w:rPr>
-        <w:t>Orthographic and iso</w:t>
+        <w:t>Orthographic and isometric views with real dimensions (enclosure neck Ø75 mm, overall probe height 191.51 mm, mounting plate 2</w:t>
       </w:r>
       <w:r>
         <w:rPr>
           <w:color w:val="4A4A4A"/>
           <w:sz w:val="17"/>
         </w:rPr>
-        <w:t xml:space="preserve">metric views with real dimensions (enclosure neck Ø75 mm, overall probe height 191.51 mm, mounting plate 250×250 mm with toleranced hole pattern), a U-bolt parameter table (2″/DN50, M10 thread), and a title block (drafted 31 Aug 2026). Source: dimensioned </w:t>
+        <w:t xml:space="preserve">50×250 </w:t>
       </w:r>
       <w:r>
         <w:rPr>
           <w:color w:val="4A4A4A"/>
           <w:sz w:val="17"/>
         </w:rPr>
-        <w:t>CAD drawing derived from a STEP solid model of the enclosure and bracket assembly.</w:t>
+        <w:lastRenderedPageBreak/>
+        <w:t>mm with toleranced hole pattern), a U-bolt parameter table (2″/DN50, M10 thread), and a title block (drafted 31 Aug 2026). Source: dimensioned CAD drawing derived from a STEP solid model of the enclosure and bracket assembly.</w:t>
       </w:r>
     </w:p>
     <w:tbl>
@@ -7920,7 +7970,15 @@
                 <w:color w:val="4A4A4A"/>
                 <w:sz w:val="18"/>
               </w:rPr>
-              <w:t>REMARKS</w:t>
+              <w:t>REM</w:t>
+            </w:r>
+            <w:r>
+              <w:rPr>
+                <w:b/>
+                <w:color w:val="4A4A4A"/>
+                <w:sz w:val="18"/>
+              </w:rPr>
+              <w:t>ARKS</w:t>
             </w:r>
           </w:p>
         </w:tc>
@@ -7976,13 +8034,13 @@
               <w:rPr>
                 <w:sz w:val="19"/>
               </w:rPr>
-              <w:t xml:space="preserve">Schematic capture and a derived 9-sheet block-diagram set exist with </w:t>
+              <w:t>Schematic capture and a derived 9-sheet block-diagram set exist with traceability evidence (pin-to-net mapping). Not yet issued in a released, revision-controlled drawing form</w:t>
             </w:r>
             <w:r>
               <w:rPr>
                 <w:sz w:val="19"/>
               </w:rPr>
-              <w:t>traceability evidence (pin-to-net mapping). Not yet issued in a released, revision-controlled drawing format with a formal drawing number.</w:t>
+              <w:t>at with a formal drawing number.</w:t>
             </w:r>
           </w:p>
         </w:tc>
@@ -8038,13 +8096,13 @@
               <w:rPr>
                 <w:sz w:val="19"/>
               </w:rPr>
-              <w:t xml:space="preserve">Native EasyEDA/JLCPCB layout export (routed copper) and a 3D solid model exist for </w:t>
+              <w:t xml:space="preserve">Native EasyEDA/JLCPCB layout export (routed copper) and a 3D solid model exist for the same board revision. Not yet issued as a dimensioned, toleranced, released drawing with a formal </w:t>
             </w:r>
             <w:r>
               <w:rPr>
                 <w:sz w:val="19"/>
               </w:rPr>
-              <w:t>the same board revision. Not yet issued as a dimensioned, toleranced, released drawing with a formal drawing number.</w:t>
+              <w:t>drawing number.</w:t>
             </w:r>
           </w:p>
         </w:tc>
@@ -8100,13 +8158,13 @@
               <w:rPr>
                 <w:sz w:val="19"/>
               </w:rPr>
-              <w:t>A dimensioned drawing sheet exists for the enclosure/bracket mounting assembly (title block, orthogra</w:t>
+              <w:t xml:space="preserve">A dimensioned drawing sheet exists for the enclosure/bracket mounting assembly (title block, orthographic + isometric views, parts table). It covers the external envelope and mounting hardware, not the </w:t>
             </w:r>
             <w:r>
               <w:rPr>
                 <w:sz w:val="19"/>
               </w:rPr>
-              <w:t>phic + isometric views, parts table). It covers the external envelope and mounting hardware, not the internal PCB/component assembly sequence.</w:t>
+              <w:t>internal PCB/component assembly sequence.</w:t>
             </w:r>
           </w:p>
         </w:tc>
@@ -8212,19 +8270,13 @@
               <w:rPr>
                 <w:sz w:val="19"/>
               </w:rPr>
-              <w:t>Exte</w:t>
+              <w:t>External envelope is dimensioned (from a real STEP solid model, millimeter units) in the drawing above. T</w:t>
             </w:r>
             <w:r>
               <w:rPr>
                 <w:sz w:val="19"/>
               </w:rPr>
-              <w:t>rnal envelope is dimensioned (from a real STEP solid model, millimeter units) in the drawing above. The Ex-d-specific flame-path parameters — joint gap, length, and free internal volume — are not called out; that dimensioning has to be added deliberately o</w:t>
-            </w:r>
-            <w:r>
-              <w:rPr>
-                <w:sz w:val="19"/>
-              </w:rPr>
-              <w:t>nce a protection concept is confirmed (Section 2.5), not derived automatically from the CAD export.</w:t>
+              <w:t>he Ex-d-specific flame-path parameters — joint gap, length, and free internal volume — are not called out; that dimensioning has to be added deliberately once a protection concept is confirmed (Section 2.5), not derived automatically from the CAD export.</w:t>
             </w:r>
           </w:p>
         </w:tc>
@@ -8318,21 +8370,21 @@
                 <w:color w:val="4A4A4A"/>
                 <w:sz w:val="20"/>
               </w:rPr>
-              <w:t xml:space="preserve">Real dimensioned CAD drawings now exist for the enclosure's external </w:t>
+              <w:t xml:space="preserve">Real dimensioned CAD drawings now exist for the enclosure's external envelope and mounting hardware, and native PCB layout/schematic source files exist for the </w:t>
             </w:r>
             <w:r>
               <w:rPr>
                 <w:color w:val="4A4A4A"/>
                 <w:sz w:val="20"/>
               </w:rPr>
-              <w:t>envelope and mounting hardware, and native PCB layout/schematic source files exist for the electronics. What is still missing for a certifiable drawing package: internal component/assembly drawings, junction box and grounding-connection drawings, and — spe</w:t>
+              <w:t>electronics. What is still missing for a certifiable drawing package: internal component/assembly drawings, junction box and grounding-connection drawings, and — specific to explosion protection — flame-path gap/length/volume dimensioning, which requires a</w:t>
             </w:r>
             <w:r>
               <w:rPr>
                 <w:color w:val="4A4A4A"/>
                 <w:sz w:val="20"/>
               </w:rPr>
-              <w:t>cific to explosion protection — flame-path gap/length/volume dimensioning, which requires a confirmed protection concept before it can be drawn.</w:t>
+              <w:t xml:space="preserve"> confirmed protection concept before it can be drawn.</w:t>
             </w:r>
           </w:p>
         </w:tc>
@@ -8347,7 +8399,7 @@
       <w:pPr>
         <w:pStyle w:val="Heading3"/>
       </w:pPr>
-      <w:bookmarkStart w:id="13" w:name="_Toc240038563"/>
+      <w:bookmarkStart w:id="13" w:name="_Toc240058094"/>
       <w:r>
         <w:t>2.6.b · Bill of Materials (BOM) for Explosion-Safety-Relevant Components</w:t>
       </w:r>
@@ -8355,34 +8407,31 @@
     </w:p>
     <w:p>
       <w:r>
-        <w:t xml:space="preserve">A complete, itemized </w:t>
+        <w:t xml:space="preserve">A complete, itemized electronic-component BOM for both the main board and the external sensor board now exists, </w:t>
       </w:r>
       <w:r>
-        <w:t>electronic-component BOM for both the main board and the external sensor board now exists, exported directly from the EasyEDA/JLCPCB source project (manufacturer, manufacturer part number, and LCSC supplier part number for each line item; 89 line items / 2</w:t>
+        <w:t xml:space="preserve">exported directly from the EasyEDA/JLCPCB source project (manufacturer, manufacturer part number, and LCSC supplier part number for each line item; 89 line items / 214 placed components on the main board, 14 line items / 24 placed components on the sensor </w:t>
       </w:r>
       <w:r>
-        <w:t xml:space="preserve">14 placed components on the main board, 14 line </w:t>
-      </w:r>
-      <w:r>
-        <w:lastRenderedPageBreak/>
-        <w:t>items / 24 placed components on the sensor board — full tables below). This is real, traceable sourcing data and materially improves on the previous status.</w:t>
+        <w:t>board — full tables below). This is real, traceable sourcing data and materially improves on the previous status.</w:t>
       </w:r>
     </w:p>
     <w:p>
       <w:r>
-        <w:t>It does not, however, satisfy this checklist item a</w:t>
+        <w:lastRenderedPageBreak/>
+        <w:t>It does not, however, satisfy this checklist item as written. The checklist asks specifically for the explosion-safety-relevant BOM — enclosur</w:t>
       </w:r>
       <w:r>
-        <w:t>s written. The checklist asks specifically for the explosion-safety-relevant BOM — enclosure, gaskets, terminals, cable entry devices, switches, light sources, battery, potting compound, and plastic parts, each with material grade and Ex/UL/CCC certificati</w:t>
+        <w:t>e, gaskets, terminals, cable entry devices, switches, light sources, battery, potting compound, and plastic parts, each with material grade and Ex/UL/CCC certification status. None of those mechanical/safety items appear in an electronic CAD BOM: the enclo</w:t>
       </w:r>
       <w:r>
-        <w:t>on status. None of those mechanical/safety items appear in an electronic CAD BOM: the enclosure is present only as a placeholder mechanical symbol (designator U50, no manufacturer or dimensional data attached), and the gas sensor itself (MQ2, designator I1</w:t>
+        <w:t>sure is present only as a placeholder mechanical symbol (designator U50, no manufacturer or dimensional data attached), and the gas sensor itself (MQ2, designator I1) has no manufacturer or supplier part number recorded — it is sourced outside the LCSC/JLC</w:t>
       </w:r>
       <w:r>
-        <w:t>) has no manufacturer or supplier part number recorded — it is sourced outside the LCSC/JLCPCB supply chain and its Ex status is unverified. Comparative research on Ex-rated enclosure products from other manufacturers exists internally as a reference for t</w:t>
+        <w:t>PCB supply chain and its Ex status is unverified. Comparative research on Ex-rated enclosure products from other manufacturers exists internally as a reference for target specifications only — it describes third-party products, not this product's actual co</w:t>
       </w:r>
       <w:r>
-        <w:t>arget specifications only — it describes third-party products, not this product's actual components, and is not included here.</w:t>
+        <w:t>mponents, and is not included here.</w:t>
       </w:r>
     </w:p>
     <w:tbl>
@@ -11297,7 +11346,6 @@
                 <w:b/>
                 <w:sz w:val="15"/>
               </w:rPr>
-              <w:lastRenderedPageBreak/>
               <w:t>Q2</w:t>
             </w:r>
           </w:p>
@@ -11604,6 +11652,7 @@
                 <w:b/>
                 <w:sz w:val="15"/>
               </w:rPr>
+              <w:lastRenderedPageBreak/>
               <w:t>R6</w:t>
             </w:r>
           </w:p>
@@ -15480,7 +15529,6 @@
                 <w:b/>
                 <w:sz w:val="15"/>
               </w:rPr>
-              <w:lastRenderedPageBreak/>
               <w:t>U13</w:t>
             </w:r>
           </w:p>
@@ -15787,6 +15835,7 @@
                 <w:b/>
                 <w:sz w:val="15"/>
               </w:rPr>
+              <w:lastRenderedPageBreak/>
               <w:t>U16</w:t>
             </w:r>
           </w:p>
@@ -19233,15 +19282,7 @@
                 <w:color w:val="4A4A4A"/>
                 <w:sz w:val="20"/>
               </w:rPr>
-              <w:t xml:space="preserve">erial grade and Ex/UL/CCC certification for each — remains not yet compiled, because those mechanical/safety parts are not </w:t>
-            </w:r>
-            <w:r>
-              <w:rPr>
-                <w:color w:val="4A4A4A"/>
-                <w:sz w:val="20"/>
-              </w:rPr>
-              <w:lastRenderedPageBreak/>
-              <w:t>represented in an electronic design BOM.</w:t>
+              <w:t>erial grade and Ex/UL/CCC certification for each — remains not yet compiled, because those mechanical/safety parts are not represented in an electronic design BOM.</w:t>
             </w:r>
           </w:p>
         </w:tc>
@@ -19256,8 +19297,9 @@
       <w:pPr>
         <w:pStyle w:val="Heading3"/>
       </w:pPr>
-      <w:bookmarkStart w:id="14" w:name="_Toc240038564"/>
+      <w:bookmarkStart w:id="14" w:name="_Toc240058095"/>
       <w:r>
+        <w:lastRenderedPageBreak/>
         <w:t>2.6.c · Material Specification Sheets / Datasheets (Non-Metallic Materials)</w:t>
       </w:r>
       <w:bookmarkEnd w:id="14"/>
@@ -19318,7 +19360,7 @@
       <w:pPr>
         <w:pStyle w:val="Heading3"/>
       </w:pPr>
-      <w:bookmarkStart w:id="15" w:name="_Toc240038565"/>
+      <w:bookmarkStart w:id="15" w:name="_Toc240058096"/>
       <w:r>
         <w:t>2.6.d · Manufacturing Process Description</w:t>
       </w:r>
@@ -19380,7 +19422,7 @@
       <w:pPr>
         <w:pStyle w:val="Heading3"/>
       </w:pPr>
-      <w:bookmarkStart w:id="16" w:name="_Toc240038566"/>
+      <w:bookmarkStart w:id="16" w:name="_Toc240058097"/>
       <w:r>
         <w:t>2.6.e · Explosion-Protection Calculations and Explanations (if applicable)</w:t>
       </w:r>
@@ -19442,7 +19484,7 @@
       <w:pPr>
         <w:pStyle w:val="Heading3"/>
       </w:pPr>
-      <w:bookmarkStart w:id="17" w:name="_Toc240038567"/>
+      <w:bookmarkStart w:id="17" w:name="_Toc240058098"/>
       <w:r>
         <w:t>2.6.f · Temperature Group Calculation (Hottest-Point Temperature Estimation)</w:t>
       </w:r>
@@ -19510,7 +19552,7 @@
       <w:pPr>
         <w:pStyle w:val="Heading3"/>
       </w:pPr>
-      <w:bookmarkStart w:id="18" w:name="_Toc240038568"/>
+      <w:bookmarkStart w:id="18" w:name="_Toc240058099"/>
       <w:r>
         <w:t>2.6.g · Usage and Installation Instructions (Draft)</w:t>
       </w:r>
@@ -19712,14 +19754,7 @@
               <w:rPr>
                 <w:sz w:val="19"/>
               </w:rPr>
-              <w:t xml:space="preserve">without drilling or welding — see Section 2.3.c), but cable-entry method, torque values, grounding </w:t>
-            </w:r>
-            <w:r>
-              <w:rPr>
-                <w:sz w:val="19"/>
-              </w:rPr>
-              <w:lastRenderedPageBreak/>
-              <w:t>requirements, and cleaning requirements have not yet been formally specified.</w:t>
+              <w:t>without drilling or welding — see Section 2.3.c), but cable-entry method, torque values, grounding requirements, and cleaning requirements have not yet been formally specified.</w:t>
             </w:r>
           </w:p>
         </w:tc>
@@ -19741,8 +19776,15 @@
                 <w:b/>
                 <w:sz w:val="19"/>
               </w:rPr>
+              <w:t xml:space="preserve">c) Operating instructions and </w:t>
+            </w:r>
+            <w:r>
+              <w:rPr>
+                <w:b/>
+                <w:sz w:val="19"/>
+              </w:rPr>
               <w:lastRenderedPageBreak/>
-              <w:t>c) Operating instructions and maintenance requirements</w:t>
+              <w:t>maintenance requirements</w:t>
             </w:r>
           </w:p>
         </w:tc>
@@ -19760,7 +19802,16 @@
                 <w:color w:val="B56A1E"/>
                 <w:sz w:val="19"/>
               </w:rPr>
-              <w:t>Partially available</w:t>
+              <w:lastRenderedPageBreak/>
+              <w:t xml:space="preserve">Partially </w:t>
+            </w:r>
+            <w:r>
+              <w:rPr>
+                <w:b/>
+                <w:color w:val="B56A1E"/>
+                <w:sz w:val="19"/>
+              </w:rPr>
+              <w:t>available</w:t>
             </w:r>
           </w:p>
         </w:tc>
@@ -19776,13 +19827,20 @@
               <w:rPr>
                 <w:sz w:val="19"/>
               </w:rPr>
-              <w:t>A f</w:t>
+              <w:t xml:space="preserve">A firmware command/operation reference exists </w:t>
             </w:r>
             <w:r>
               <w:rPr>
                 <w:sz w:val="19"/>
               </w:rPr>
-              <w:t>irmware command/operation reference exists (Serial, MQTT, and LoRa command protocol for engineering use), but it covers software operation and commissioning — not Ex-specific maintenance or inspection requirements (frequency, content, precautions).</w:t>
+              <w:lastRenderedPageBreak/>
+              <w:t>(Serial, MQTT, and LoRa command protocol for engineering use), but it covers software operation and commissioning — not Ex-specific maintenance or inspection requirements (frequency, content, precauti</w:t>
+            </w:r>
+            <w:r>
+              <w:rPr>
+                <w:sz w:val="19"/>
+              </w:rPr>
+              <w:t>ons).</w:t>
             </w:r>
           </w:p>
         </w:tc>
@@ -19826,14 +19884,7 @@
                 <w:color w:val="4A4A4A"/>
                 <w:sz w:val="20"/>
               </w:rPr>
-              <w:t>Statu</w:t>
-            </w:r>
-            <w:r>
-              <w:rPr>
-                <w:color w:val="4A4A4A"/>
-                <w:sz w:val="20"/>
-              </w:rPr>
-              <w:t>s: Partially available — not yet consolidated into an Ex-specific installation and operation manual for ExCB review.</w:t>
+              <w:t>Status: Partially available — not yet consolidated into an Ex-specific installation and operation manual for ExCB review.</w:t>
             </w:r>
           </w:p>
         </w:tc>
@@ -19848,7 +19899,7 @@
       <w:pPr>
         <w:pStyle w:val="Heading3"/>
       </w:pPr>
-      <w:bookmarkStart w:id="19" w:name="_Toc240038569"/>
+      <w:bookmarkStart w:id="19" w:name="_Toc240058100"/>
       <w:r>
         <w:t>2.6.h · Nameplate Information</w:t>
       </w:r>
@@ -19856,10 +19907,10 @@
     </w:p>
     <w:p>
       <w:r>
-        <w:t xml:space="preserve">Nameplate artwork cannot yet be finalized: it depends on the certificate number, protection </w:t>
+        <w:t xml:space="preserve">Nameplate artwork cannot yet be finalized: it depends on the certificate number, </w:t>
       </w:r>
       <w:r>
-        <w:t>marking, temperature class, ambient range, IP rating, and serialization scheme — none of which has been assigned yet.</w:t>
+        <w:t>protection marking, temperature class, ambient range, IP rating, and serialization scheme — none of which has been assigned yet.</w:t>
       </w:r>
     </w:p>
     <w:tbl>
@@ -19910,7 +19961,7 @@
       <w:pPr>
         <w:pStyle w:val="Heading3"/>
       </w:pPr>
-      <w:bookmarkStart w:id="20" w:name="_Toc240038570"/>
+      <w:bookmarkStart w:id="20" w:name="_Toc240058101"/>
       <w:r>
         <w:t>2.6.i · Ex Component Certificates</w:t>
       </w:r>
@@ -19918,10 +19969,10 @@
     </w:p>
     <w:p>
       <w:r>
-        <w:t xml:space="preserve">No components in this design currently hold an Ex component </w:t>
+        <w:t>No components in this design currently hold an Ex component cert</w:t>
       </w:r>
       <w:r>
-        <w:t>certificate. As noted in Section 2.3.b, the processing unit (ESP32-S3-WROOM-1U-N16R8) and the communication module (E22-900MM22S) hold RF/EMC certifications (FCC, TELEC, CE, RoHS) — these are not Ex component certificates and do not satisfy this item.</w:t>
+        <w:t>ificate. As noted in Section 2.3.b, the processing unit (ESP32-S3-WROOM-1U-N16R8) and the communication module (E22-900MM22S) hold RF/EMC certifications (FCC, TELEC, CE, RoHS) — these are not Ex component certificates and do not satisfy this item.</w:t>
       </w:r>
     </w:p>
     <w:tbl>
@@ -19957,14 +20008,14 @@
                 <w:color w:val="4A4A4A"/>
                 <w:sz w:val="20"/>
               </w:rPr>
-              <w:t>Stat</w:t>
+              <w:t xml:space="preserve">Status: </w:t>
             </w:r>
             <w:r>
               <w:rPr>
                 <w:color w:val="4A4A4A"/>
                 <w:sz w:val="20"/>
               </w:rPr>
-              <w:t>us: Not yet available.</w:t>
+              <w:t>Not yet available.</w:t>
             </w:r>
           </w:p>
         </w:tc>
@@ -19979,7 +20030,7 @@
       <w:pPr>
         <w:pStyle w:val="Heading1"/>
       </w:pPr>
-      <w:bookmarkStart w:id="21" w:name="_Toc240038571"/>
+      <w:bookmarkStart w:id="21" w:name="_Toc240058102"/>
       <w:r>
         <w:t>3. Sample Information</w:t>
       </w:r>
@@ -19994,7 +20045,7 @@
       <w:pPr>
         <w:pStyle w:val="Heading2"/>
       </w:pPr>
-      <w:bookmarkStart w:id="22" w:name="_Toc240038572"/>
+      <w:bookmarkStart w:id="22" w:name="_Toc240058103"/>
       <w:r>
         <w:t>3.1 · Model, Serial Number, and Status</w:t>
       </w:r>
@@ -20002,13 +20053,13 @@
     </w:p>
     <w:p>
       <w:r>
-        <w:t>No formal samp</w:t>
+        <w:t>No formal sample r</w:t>
       </w:r>
       <w:r>
-        <w:t xml:space="preserve">le register or dossier for ExCB submission has been established. Internal engineering and bench testing reference the “GLD V2” board configuration under firmware environment gld_v2; a discrete unit serial-numbering scheme for certification samples has not </w:t>
+        <w:t xml:space="preserve">egister or dossier for ExCB submission has been established. Internal engineering and bench testing reference the “GLD V2” board configuration under firmware environment gld_v2; a discrete unit serial-numbering scheme for certification samples has not yet </w:t>
       </w:r>
       <w:r>
-        <w:t>yet been implemented.</w:t>
+        <w:t>been implemented.</w:t>
       </w:r>
     </w:p>
     <w:tbl>
@@ -20059,19 +20110,18 @@
       <w:pPr>
         <w:pStyle w:val="Heading2"/>
       </w:pPr>
-      <w:bookmarkStart w:id="23" w:name="_Toc240038573"/>
+      <w:bookmarkStart w:id="23" w:name="_Toc240058104"/>
       <w:r>
-        <w:lastRenderedPageBreak/>
         <w:t>3.2 · Test Fixtures and Auxiliary Equipment</w:t>
       </w:r>
       <w:bookmarkEnd w:id="23"/>
     </w:p>
     <w:p>
       <w:r>
-        <w:t>A draft internal functional test plan identifies the minimum equipment anticipated for bench-level verification (this plan has not yet been executed and is not e</w:t>
+        <w:t>A draft internal functional test plan identifies the minimum equipment anticipated for bench-level verification (this plan has not yet been executed and is not evide</w:t>
       </w:r>
       <w:r>
-        <w:t>vidence of lab readiness):</w:t>
+        <w:t>nce of lab readiness):</w:t>
       </w:r>
     </w:p>
     <w:tbl>
@@ -20146,6 +20196,7 @@
                 <w:b/>
                 <w:sz w:val="19"/>
               </w:rPr>
+              <w:lastRenderedPageBreak/>
               <w:t>Firmware / serial</w:t>
             </w:r>
           </w:p>
@@ -20456,8 +20507,8 @@
       </w:r>
     </w:p>
     <w:sectPr>
-      <w:headerReference w:type="default" r:id="rId26"/>
-      <w:footerReference w:type="default" r:id="rId27"/>
+      <w:headerReference w:type="default" r:id="rId27"/>
+      <w:footerReference w:type="default" r:id="rId28"/>
       <w:pgSz w:w="12240" w:h="15840"/>
       <w:pgMar w:top="1020" w:right="1247" w:bottom="1020" w:left="1247" w:header="720" w:footer="720" w:gutter="0"/>
       <w:cols w:space="720"/>
@@ -32212,7 +32263,7 @@
     <w:autoRedefine/>
     <w:uiPriority w:val="39"/>
     <w:unhideWhenUsed/>
-    <w:rsid w:val="001F590F"/>
+    <w:rsid w:val="008C582B"/>
     <w:pPr>
       <w:spacing w:after="100"/>
     </w:pPr>
@@ -32224,7 +32275,7 @@
     <w:autoRedefine/>
     <w:uiPriority w:val="39"/>
     <w:unhideWhenUsed/>
-    <w:rsid w:val="001F590F"/>
+    <w:rsid w:val="008C582B"/>
     <w:pPr>
       <w:spacing w:after="100"/>
       <w:ind w:left="210"/>
@@ -32237,7 +32288,7 @@
     <w:autoRedefine/>
     <w:uiPriority w:val="39"/>
     <w:unhideWhenUsed/>
-    <w:rsid w:val="001F590F"/>
+    <w:rsid w:val="008C582B"/>
     <w:pPr>
       <w:spacing w:after="100"/>
       <w:ind w:left="420"/>
@@ -32248,7 +32299,7 @@
     <w:basedOn w:val="DefaultParagraphFont"/>
     <w:uiPriority w:val="99"/>
     <w:unhideWhenUsed/>
-    <w:rsid w:val="001F590F"/>
+    <w:rsid w:val="008C582B"/>
     <w:rPr>
       <w:color w:val="0000FF" w:themeColor="hyperlink"/>
       <w:u w:val="single"/>

</xml_diff>

<commit_message>
Clarify document scope and casing-partner/prototype-stage context
Added an explicit "Scope of this document" note: this is a readiness
compilation for a future ExCB submission, not a certificate or
self-certification. Updated remarks on 2.6.b-e (BOM, material
datasheets, manufacturing process, explosion-protection calculations)
to note these depend on an external mechanical/casing development
partner's design, not stalled internal work. Updated 3.1 to note the
product is still at from-scratch prototype stage, so no serialized
sample exists yet to register.

Status badges themselves are unchanged (still honestly "Not yet
available") - only the context explaining why was added.

Co-Authored-By: Claude Sonnet 5 <noreply@anthropic.com>
</commit_message>
<xml_diff>
--- a/Deliverables/Dokumen_Teknis_Sertifikasi_GLD_IECEx_ATEX.docx
+++ b/Deliverables/Dokumen_Teknis_Sertifikasi_GLD_IECEx_ATEX.docx
@@ -692,7 +692,7 @@
       <w:r>
         <w:fldChar w:fldCharType="separate"/>
       </w:r>
-      <w:hyperlink w:anchor="_Toc240058081" w:history="1">
+      <w:hyperlink w:anchor="_Toc240058952" w:history="1">
         <w:r>
           <w:rPr>
             <w:rStyle w:val="Hyperlink"/>
@@ -719,7 +719,7 @@
             <w:noProof/>
             <w:webHidden/>
           </w:rPr>
-          <w:instrText xml:space="preserve"> PAGEREF _Toc240058081 \h </w:instrText>
+          <w:instrText xml:space="preserve"> PAGEREF _Toc240058952 \h </w:instrText>
         </w:r>
         <w:r>
           <w:rPr>
@@ -764,7 +764,7 @@
           <w:lang w:val="en-ID" w:eastAsia="en-ID"/>
         </w:rPr>
       </w:pPr>
-      <w:hyperlink w:anchor="_Toc240058082" w:history="1">
+      <w:hyperlink w:anchor="_Toc240058953" w:history="1">
         <w:r>
           <w:rPr>
             <w:rStyle w:val="Hyperlink"/>
@@ -791,7 +791,7 @@
             <w:noProof/>
             <w:webHidden/>
           </w:rPr>
-          <w:instrText xml:space="preserve"> PAGEREF _Toc240058082 \h </w:instrText>
+          <w:instrText xml:space="preserve"> PAGEREF _Toc240058953 \h </w:instrText>
         </w:r>
         <w:r>
           <w:rPr>
@@ -836,7 +836,7 @@
           <w:lang w:val="en-ID" w:eastAsia="en-ID"/>
         </w:rPr>
       </w:pPr>
-      <w:hyperlink w:anchor="_Toc240058083" w:history="1">
+      <w:hyperlink w:anchor="_Toc240058954" w:history="1">
         <w:r>
           <w:rPr>
             <w:rStyle w:val="Hyperlink"/>
@@ -863,7 +863,7 @@
             <w:noProof/>
             <w:webHidden/>
           </w:rPr>
-          <w:instrText xml:space="preserve"> PAGEREF _Toc240058083 \h </w:instrText>
+          <w:instrText xml:space="preserve"> PAGEREF _Toc240058954 \h </w:instrText>
         </w:r>
         <w:r>
           <w:rPr>
@@ -908,7 +908,7 @@
           <w:lang w:val="en-ID" w:eastAsia="en-ID"/>
         </w:rPr>
       </w:pPr>
-      <w:hyperlink w:anchor="_Toc240058084" w:history="1">
+      <w:hyperlink w:anchor="_Toc240058955" w:history="1">
         <w:r>
           <w:rPr>
             <w:rStyle w:val="Hyperlink"/>
@@ -935,7 +935,7 @@
             <w:noProof/>
             <w:webHidden/>
           </w:rPr>
-          <w:instrText xml:space="preserve"> PAGEREF _Toc240058084 \h </w:instrText>
+          <w:instrText xml:space="preserve"> PAGEREF _Toc240058955 \h </w:instrText>
         </w:r>
         <w:r>
           <w:rPr>
@@ -980,7 +980,7 @@
           <w:lang w:val="en-ID" w:eastAsia="en-ID"/>
         </w:rPr>
       </w:pPr>
-      <w:hyperlink w:anchor="_Toc240058085" w:history="1">
+      <w:hyperlink w:anchor="_Toc240058956" w:history="1">
         <w:r>
           <w:rPr>
             <w:rStyle w:val="Hyperlink"/>
@@ -1007,7 +1007,7 @@
             <w:noProof/>
             <w:webHidden/>
           </w:rPr>
-          <w:instrText xml:space="preserve"> PAGEREF _Toc240058085 \h </w:instrText>
+          <w:instrText xml:space="preserve"> PAGEREF _Toc240058956 \h </w:instrText>
         </w:r>
         <w:r>
           <w:rPr>
@@ -1052,7 +1052,7 @@
           <w:lang w:val="en-ID" w:eastAsia="en-ID"/>
         </w:rPr>
       </w:pPr>
-      <w:hyperlink w:anchor="_Toc240058086" w:history="1">
+      <w:hyperlink w:anchor="_Toc240058957" w:history="1">
         <w:r>
           <w:rPr>
             <w:rStyle w:val="Hyperlink"/>
@@ -1079,7 +1079,7 @@
             <w:noProof/>
             <w:webHidden/>
           </w:rPr>
-          <w:instrText xml:space="preserve"> PAGEREF _Toc240058086 \h </w:instrText>
+          <w:instrText xml:space="preserve"> PAGEREF _Toc240058957 \h </w:instrText>
         </w:r>
         <w:r>
           <w:rPr>
@@ -1124,7 +1124,7 @@
           <w:lang w:val="en-ID" w:eastAsia="en-ID"/>
         </w:rPr>
       </w:pPr>
-      <w:hyperlink w:anchor="_Toc240058087" w:history="1">
+      <w:hyperlink w:anchor="_Toc240058958" w:history="1">
         <w:r>
           <w:rPr>
             <w:rStyle w:val="Hyperlink"/>
@@ -1151,79 +1151,7 @@
             <w:noProof/>
             <w:webHidden/>
           </w:rPr>
-          <w:instrText xml:space="preserve"> PAGEREF _Toc240058087 \h </w:instrText>
-        </w:r>
-        <w:r>
-          <w:rPr>
-            <w:noProof/>
-            <w:webHidden/>
-          </w:rPr>
-        </w:r>
-        <w:r>
-          <w:rPr>
-            <w:noProof/>
-            <w:webHidden/>
-          </w:rPr>
-          <w:fldChar w:fldCharType="separate"/>
-        </w:r>
-        <w:r>
-          <w:rPr>
-            <w:noProof/>
-            <w:webHidden/>
-          </w:rPr>
-          <w:t>4</w:t>
-        </w:r>
-        <w:r>
-          <w:rPr>
-            <w:noProof/>
-            <w:webHidden/>
-          </w:rPr>
-          <w:fldChar w:fldCharType="end"/>
-        </w:r>
-      </w:hyperlink>
-    </w:p>
-    <w:p>
-      <w:pPr>
-        <w:pStyle w:val="TOC3"/>
-        <w:tabs>
-          <w:tab w:val="right" w:leader="dot" w:pos="9736"/>
-        </w:tabs>
-        <w:rPr>
-          <w:rFonts w:asciiTheme="minorHAnsi" w:hAnsiTheme="minorHAnsi"/>
-          <w:noProof/>
-          <w:color w:val="auto"/>
-          <w:sz w:val="22"/>
-          <w:lang w:val="en-ID" w:eastAsia="en-ID"/>
-        </w:rPr>
-      </w:pPr>
-      <w:hyperlink w:anchor="_Toc240058088" w:history="1">
-        <w:r>
-          <w:rPr>
-            <w:rStyle w:val="Hyperlink"/>
-            <w:noProof/>
-          </w:rPr>
-          <w:t>2.3.b · Sensor and Communication Parameters — Node Sensor (GLD)</w:t>
-        </w:r>
-        <w:r>
-          <w:rPr>
-            <w:noProof/>
-            <w:webHidden/>
-          </w:rPr>
-          <w:tab/>
-        </w:r>
-        <w:r>
-          <w:rPr>
-            <w:noProof/>
-            <w:webHidden/>
-          </w:rPr>
-          <w:fldChar w:fldCharType="begin"/>
-        </w:r>
-        <w:r>
-          <w:rPr>
-            <w:noProof/>
-            <w:webHidden/>
-          </w:rPr>
-          <w:instrText xml:space="preserve"> PAGEREF _Toc240058088 \h </w:instrText>
+          <w:instrText xml:space="preserve"> PAGEREF _Toc240058958 \h </w:instrText>
         </w:r>
         <w:r>
           <w:rPr>
@@ -1268,7 +1196,79 @@
           <w:lang w:val="en-ID" w:eastAsia="en-ID"/>
         </w:rPr>
       </w:pPr>
-      <w:hyperlink w:anchor="_Toc240058089" w:history="1">
+      <w:hyperlink w:anchor="_Toc240058959" w:history="1">
+        <w:r>
+          <w:rPr>
+            <w:rStyle w:val="Hyperlink"/>
+            <w:noProof/>
+          </w:rPr>
+          <w:t>2.3.b · Sensor and Communication Parameters — Node Sensor (GLD)</w:t>
+        </w:r>
+        <w:r>
+          <w:rPr>
+            <w:noProof/>
+            <w:webHidden/>
+          </w:rPr>
+          <w:tab/>
+        </w:r>
+        <w:r>
+          <w:rPr>
+            <w:noProof/>
+            <w:webHidden/>
+          </w:rPr>
+          <w:fldChar w:fldCharType="begin"/>
+        </w:r>
+        <w:r>
+          <w:rPr>
+            <w:noProof/>
+            <w:webHidden/>
+          </w:rPr>
+          <w:instrText xml:space="preserve"> PAGEREF _Toc240058959 \h </w:instrText>
+        </w:r>
+        <w:r>
+          <w:rPr>
+            <w:noProof/>
+            <w:webHidden/>
+          </w:rPr>
+        </w:r>
+        <w:r>
+          <w:rPr>
+            <w:noProof/>
+            <w:webHidden/>
+          </w:rPr>
+          <w:fldChar w:fldCharType="separate"/>
+        </w:r>
+        <w:r>
+          <w:rPr>
+            <w:noProof/>
+            <w:webHidden/>
+          </w:rPr>
+          <w:t>5</w:t>
+        </w:r>
+        <w:r>
+          <w:rPr>
+            <w:noProof/>
+            <w:webHidden/>
+          </w:rPr>
+          <w:fldChar w:fldCharType="end"/>
+        </w:r>
+      </w:hyperlink>
+    </w:p>
+    <w:p>
+      <w:pPr>
+        <w:pStyle w:val="TOC3"/>
+        <w:tabs>
+          <w:tab w:val="right" w:leader="dot" w:pos="9736"/>
+        </w:tabs>
+        <w:rPr>
+          <w:rFonts w:asciiTheme="minorHAnsi" w:hAnsiTheme="minorHAnsi"/>
+          <w:noProof/>
+          <w:color w:val="auto"/>
+          <w:sz w:val="22"/>
+          <w:lang w:val="en-ID" w:eastAsia="en-ID"/>
+        </w:rPr>
+      </w:pPr>
+      <w:hyperlink w:anchor="_Toc240058960" w:history="1">
         <w:r>
           <w:rPr>
             <w:rStyle w:val="Hyperlink"/>
@@ -1295,79 +1295,7 @@
             <w:noProof/>
             <w:webHidden/>
           </w:rPr>
-          <w:instrText xml:space="preserve"> PAGEREF _Toc240058089 \h </w:instrText>
-        </w:r>
-        <w:r>
-          <w:rPr>
-            <w:noProof/>
-            <w:webHidden/>
-          </w:rPr>
-        </w:r>
-        <w:r>
-          <w:rPr>
-            <w:noProof/>
-            <w:webHidden/>
-          </w:rPr>
-          <w:fldChar w:fldCharType="separate"/>
-        </w:r>
-        <w:r>
-          <w:rPr>
-            <w:noProof/>
-            <w:webHidden/>
-          </w:rPr>
-          <w:t>6</w:t>
-        </w:r>
-        <w:r>
-          <w:rPr>
-            <w:noProof/>
-            <w:webHidden/>
-          </w:rPr>
-          <w:fldChar w:fldCharType="end"/>
-        </w:r>
-      </w:hyperlink>
-    </w:p>
-    <w:p>
-      <w:pPr>
-        <w:pStyle w:val="TOC2"/>
-        <w:tabs>
-          <w:tab w:val="right" w:leader="dot" w:pos="9736"/>
-        </w:tabs>
-        <w:rPr>
-          <w:rFonts w:asciiTheme="minorHAnsi" w:hAnsiTheme="minorHAnsi"/>
-          <w:noProof/>
-          <w:color w:val="auto"/>
-          <w:sz w:val="22"/>
-          <w:lang w:val="en-ID" w:eastAsia="en-ID"/>
-        </w:rPr>
-      </w:pPr>
-      <w:hyperlink w:anchor="_Toc240058090" w:history="1">
-        <w:r>
-          <w:rPr>
-            <w:rStyle w:val="Hyperlink"/>
-            <w:noProof/>
-          </w:rPr>
-          <w:t>2.4 · Product Photographs — Overall and Key Components</w:t>
-        </w:r>
-        <w:r>
-          <w:rPr>
-            <w:noProof/>
-            <w:webHidden/>
-          </w:rPr>
-          <w:tab/>
-        </w:r>
-        <w:r>
-          <w:rPr>
-            <w:noProof/>
-            <w:webHidden/>
-          </w:rPr>
-          <w:fldChar w:fldCharType="begin"/>
-        </w:r>
-        <w:r>
-          <w:rPr>
-            <w:noProof/>
-            <w:webHidden/>
-          </w:rPr>
-          <w:instrText xml:space="preserve"> PAGEREF _Toc240058090 \h </w:instrText>
+          <w:instrText xml:space="preserve"> PAGEREF _Toc240058960 \h </w:instrText>
         </w:r>
         <w:r>
           <w:rPr>
@@ -1412,7 +1340,79 @@
           <w:lang w:val="en-ID" w:eastAsia="en-ID"/>
         </w:rPr>
       </w:pPr>
-      <w:hyperlink w:anchor="_Toc240058091" w:history="1">
+      <w:hyperlink w:anchor="_Toc240058961" w:history="1">
+        <w:r>
+          <w:rPr>
+            <w:rStyle w:val="Hyperlink"/>
+            <w:noProof/>
+          </w:rPr>
+          <w:t>2.4 · Product Photographs — Overall and Key Components</w:t>
+        </w:r>
+        <w:r>
+          <w:rPr>
+            <w:noProof/>
+            <w:webHidden/>
+          </w:rPr>
+          <w:tab/>
+        </w:r>
+        <w:r>
+          <w:rPr>
+            <w:noProof/>
+            <w:webHidden/>
+          </w:rPr>
+          <w:fldChar w:fldCharType="begin"/>
+        </w:r>
+        <w:r>
+          <w:rPr>
+            <w:noProof/>
+            <w:webHidden/>
+          </w:rPr>
+          <w:instrText xml:space="preserve"> PAGEREF _Toc240058961 \h </w:instrText>
+        </w:r>
+        <w:r>
+          <w:rPr>
+            <w:noProof/>
+            <w:webHidden/>
+          </w:rPr>
+        </w:r>
+        <w:r>
+          <w:rPr>
+            <w:noProof/>
+            <w:webHidden/>
+          </w:rPr>
+          <w:fldChar w:fldCharType="separate"/>
+        </w:r>
+        <w:r>
+          <w:rPr>
+            <w:noProof/>
+            <w:webHidden/>
+          </w:rPr>
+          <w:t>7</w:t>
+        </w:r>
+        <w:r>
+          <w:rPr>
+            <w:noProof/>
+            <w:webHidden/>
+          </w:rPr>
+          <w:fldChar w:fldCharType="end"/>
+        </w:r>
+      </w:hyperlink>
+    </w:p>
+    <w:p>
+      <w:pPr>
+        <w:pStyle w:val="TOC2"/>
+        <w:tabs>
+          <w:tab w:val="right" w:leader="dot" w:pos="9736"/>
+        </w:tabs>
+        <w:rPr>
+          <w:rFonts w:asciiTheme="minorHAnsi" w:hAnsiTheme="minorHAnsi"/>
+          <w:noProof/>
+          <w:color w:val="auto"/>
+          <w:sz w:val="22"/>
+          <w:lang w:val="en-ID" w:eastAsia="en-ID"/>
+        </w:rPr>
+      </w:pPr>
+      <w:hyperlink w:anchor="_Toc240058962" w:history="1">
         <w:r>
           <w:rPr>
             <w:rStyle w:val="Hyperlink"/>
@@ -1439,7 +1439,7 @@
             <w:noProof/>
             <w:webHidden/>
           </w:rPr>
-          <w:instrText xml:space="preserve"> PAGEREF _Toc240058091 \h </w:instrText>
+          <w:instrText xml:space="preserve"> PAGEREF _Toc240058962 \h </w:instrText>
         </w:r>
         <w:r>
           <w:rPr>
@@ -1484,7 +1484,7 @@
           <w:lang w:val="en-ID" w:eastAsia="en-ID"/>
         </w:rPr>
       </w:pPr>
-      <w:hyperlink w:anchor="_Toc240058092" w:history="1">
+      <w:hyperlink w:anchor="_Toc240058963" w:history="1">
         <w:r>
           <w:rPr>
             <w:rStyle w:val="Hyperlink"/>
@@ -1511,7 +1511,7 @@
             <w:noProof/>
             <w:webHidden/>
           </w:rPr>
-          <w:instrText xml:space="preserve"> PAGEREF _Toc240058092 \h </w:instrText>
+          <w:instrText xml:space="preserve"> PAGEREF _Toc240058963 \h </w:instrText>
         </w:r>
         <w:r>
           <w:rPr>
@@ -1556,7 +1556,7 @@
           <w:lang w:val="en-ID" w:eastAsia="en-ID"/>
         </w:rPr>
       </w:pPr>
-      <w:hyperlink w:anchor="_Toc240058093" w:history="1">
+      <w:hyperlink w:anchor="_Toc240058964" w:history="1">
         <w:r>
           <w:rPr>
             <w:rStyle w:val="Hyperlink"/>
@@ -1583,7 +1583,7 @@
             <w:noProof/>
             <w:webHidden/>
           </w:rPr>
-          <w:instrText xml:space="preserve"> PAGEREF _Toc240058093 \h </w:instrText>
+          <w:instrText xml:space="preserve"> PAGEREF _Toc240058964 \h </w:instrText>
         </w:r>
         <w:r>
           <w:rPr>
@@ -1628,7 +1628,7 @@
           <w:lang w:val="en-ID" w:eastAsia="en-ID"/>
         </w:rPr>
       </w:pPr>
-      <w:hyperlink w:anchor="_Toc240058094" w:history="1">
+      <w:hyperlink w:anchor="_Toc240058965" w:history="1">
         <w:r>
           <w:rPr>
             <w:rStyle w:val="Hyperlink"/>
@@ -1655,7 +1655,7 @@
             <w:noProof/>
             <w:webHidden/>
           </w:rPr>
-          <w:instrText xml:space="preserve"> PAGEREF _Toc240058094 \h </w:instrText>
+          <w:instrText xml:space="preserve"> PAGEREF _Toc240058965 \h </w:instrText>
         </w:r>
         <w:r>
           <w:rPr>
@@ -1700,7 +1700,7 @@
           <w:lang w:val="en-ID" w:eastAsia="en-ID"/>
         </w:rPr>
       </w:pPr>
-      <w:hyperlink w:anchor="_Toc240058095" w:history="1">
+      <w:hyperlink w:anchor="_Toc240058966" w:history="1">
         <w:r>
           <w:rPr>
             <w:rStyle w:val="Hyperlink"/>
@@ -1727,7 +1727,7 @@
             <w:noProof/>
             <w:webHidden/>
           </w:rPr>
-          <w:instrText xml:space="preserve"> PAGEREF _Toc240058095 \h </w:instrText>
+          <w:instrText xml:space="preserve"> PAGEREF _Toc240058966 \h </w:instrText>
         </w:r>
         <w:r>
           <w:rPr>
@@ -1772,7 +1772,7 @@
           <w:lang w:val="en-ID" w:eastAsia="en-ID"/>
         </w:rPr>
       </w:pPr>
-      <w:hyperlink w:anchor="_Toc240058096" w:history="1">
+      <w:hyperlink w:anchor="_Toc240058967" w:history="1">
         <w:r>
           <w:rPr>
             <w:rStyle w:val="Hyperlink"/>
@@ -1799,7 +1799,7 @@
             <w:noProof/>
             <w:webHidden/>
           </w:rPr>
-          <w:instrText xml:space="preserve"> PAGEREF _Toc240058096 \h </w:instrText>
+          <w:instrText xml:space="preserve"> PAGEREF _Toc240058967 \h </w:instrText>
         </w:r>
         <w:r>
           <w:rPr>
@@ -1844,7 +1844,7 @@
           <w:lang w:val="en-ID" w:eastAsia="en-ID"/>
         </w:rPr>
       </w:pPr>
-      <w:hyperlink w:anchor="_Toc240058097" w:history="1">
+      <w:hyperlink w:anchor="_Toc240058968" w:history="1">
         <w:r>
           <w:rPr>
             <w:rStyle w:val="Hyperlink"/>
@@ -1871,7 +1871,7 @@
             <w:noProof/>
             <w:webHidden/>
           </w:rPr>
-          <w:instrText xml:space="preserve"> PAGEREF _Toc240058097 \h </w:instrText>
+          <w:instrText xml:space="preserve"> PAGEREF _Toc240058968 \h </w:instrText>
         </w:r>
         <w:r>
           <w:rPr>
@@ -1916,7 +1916,7 @@
           <w:lang w:val="en-ID" w:eastAsia="en-ID"/>
         </w:rPr>
       </w:pPr>
-      <w:hyperlink w:anchor="_Toc240058098" w:history="1">
+      <w:hyperlink w:anchor="_Toc240058969" w:history="1">
         <w:r>
           <w:rPr>
             <w:rStyle w:val="Hyperlink"/>
@@ -1943,7 +1943,7 @@
             <w:noProof/>
             <w:webHidden/>
           </w:rPr>
-          <w:instrText xml:space="preserve"> PAGEREF _Toc240058098 \h </w:instrText>
+          <w:instrText xml:space="preserve"> PAGEREF _Toc240058969 \h </w:instrText>
         </w:r>
         <w:r>
           <w:rPr>
@@ -1988,7 +1988,7 @@
           <w:lang w:val="en-ID" w:eastAsia="en-ID"/>
         </w:rPr>
       </w:pPr>
-      <w:hyperlink w:anchor="_Toc240058099" w:history="1">
+      <w:hyperlink w:anchor="_Toc240058970" w:history="1">
         <w:r>
           <w:rPr>
             <w:rStyle w:val="Hyperlink"/>
@@ -2015,7 +2015,7 @@
             <w:noProof/>
             <w:webHidden/>
           </w:rPr>
-          <w:instrText xml:space="preserve"> PAGEREF _Toc240058099 \h </w:instrText>
+          <w:instrText xml:space="preserve"> PAGEREF _Toc240058970 \h </w:instrText>
         </w:r>
         <w:r>
           <w:rPr>
@@ -2060,7 +2060,7 @@
           <w:lang w:val="en-ID" w:eastAsia="en-ID"/>
         </w:rPr>
       </w:pPr>
-      <w:hyperlink w:anchor="_Toc240058100" w:history="1">
+      <w:hyperlink w:anchor="_Toc240058971" w:history="1">
         <w:r>
           <w:rPr>
             <w:rStyle w:val="Hyperlink"/>
@@ -2087,7 +2087,7 @@
             <w:noProof/>
             <w:webHidden/>
           </w:rPr>
-          <w:instrText xml:space="preserve"> PAGEREF _Toc240058100 \h </w:instrText>
+          <w:instrText xml:space="preserve"> PAGEREF _Toc240058971 \h </w:instrText>
         </w:r>
         <w:r>
           <w:rPr>
@@ -2132,7 +2132,7 @@
           <w:lang w:val="en-ID" w:eastAsia="en-ID"/>
         </w:rPr>
       </w:pPr>
-      <w:hyperlink w:anchor="_Toc240058101" w:history="1">
+      <w:hyperlink w:anchor="_Toc240058972" w:history="1">
         <w:r>
           <w:rPr>
             <w:rStyle w:val="Hyperlink"/>
@@ -2159,7 +2159,7 @@
             <w:noProof/>
             <w:webHidden/>
           </w:rPr>
-          <w:instrText xml:space="preserve"> PAGEREF _Toc240058101 \h </w:instrText>
+          <w:instrText xml:space="preserve"> PAGEREF _Toc240058972 \h </w:instrText>
         </w:r>
         <w:r>
           <w:rPr>
@@ -2204,7 +2204,7 @@
           <w:lang w:val="en-ID" w:eastAsia="en-ID"/>
         </w:rPr>
       </w:pPr>
-      <w:hyperlink w:anchor="_Toc240058102" w:history="1">
+      <w:hyperlink w:anchor="_Toc240058973" w:history="1">
         <w:r>
           <w:rPr>
             <w:rStyle w:val="Hyperlink"/>
@@ -2231,7 +2231,7 @@
             <w:noProof/>
             <w:webHidden/>
           </w:rPr>
-          <w:instrText xml:space="preserve"> PAGEREF _Toc240058102 \h </w:instrText>
+          <w:instrText xml:space="preserve"> PAGEREF _Toc240058973 \h </w:instrText>
         </w:r>
         <w:r>
           <w:rPr>
@@ -2276,7 +2276,7 @@
           <w:lang w:val="en-ID" w:eastAsia="en-ID"/>
         </w:rPr>
       </w:pPr>
-      <w:hyperlink w:anchor="_Toc240058103" w:history="1">
+      <w:hyperlink w:anchor="_Toc240058974" w:history="1">
         <w:r>
           <w:rPr>
             <w:rStyle w:val="Hyperlink"/>
@@ -2303,7 +2303,7 @@
             <w:noProof/>
             <w:webHidden/>
           </w:rPr>
-          <w:instrText xml:space="preserve"> PAGEREF _Toc240058103 \h </w:instrText>
+          <w:instrText xml:space="preserve"> PAGEREF _Toc240058974 \h </w:instrText>
         </w:r>
         <w:r>
           <w:rPr>
@@ -2348,7 +2348,7 @@
           <w:lang w:val="en-ID" w:eastAsia="en-ID"/>
         </w:rPr>
       </w:pPr>
-      <w:hyperlink w:anchor="_Toc240058104" w:history="1">
+      <w:hyperlink w:anchor="_Toc240058975" w:history="1">
         <w:r>
           <w:rPr>
             <w:rStyle w:val="Hyperlink"/>
@@ -2375,7 +2375,7 @@
             <w:noProof/>
             <w:webHidden/>
           </w:rPr>
-          <w:instrText xml:space="preserve"> PAGEREF _Toc240058104 \h </w:instrText>
+          <w:instrText xml:space="preserve"> PAGEREF _Toc240058975 \h </w:instrText>
         </w:r>
         <w:r>
           <w:rPr>
@@ -2395,7 +2395,7 @@
             <w:noProof/>
             <w:webHidden/>
           </w:rPr>
-          <w:t>24</w:t>
+          <w:t>25</w:t>
         </w:r>
         <w:r>
           <w:rPr>
@@ -2420,7 +2420,7 @@
       <w:pPr>
         <w:pStyle w:val="Heading1"/>
       </w:pPr>
-      <w:bookmarkStart w:id="0" w:name="_Toc240058081"/>
+      <w:bookmarkStart w:id="0" w:name="_Toc240058952"/>
       <w:r>
         <w:lastRenderedPageBreak/>
         <w:t>About This Document</w:t>
@@ -2433,72 +2433,6 @@
       </w:r>
       <w:r>
         <w:t>on body (ExCB). The table of contents follows the complete structure of the original checklist (Sections 1–3); Section 1 (Basic Information) remains pending and will follow in a subsequent revision.</w:t>
-      </w:r>
-    </w:p>
-    <w:p>
-      <w:pPr>
-        <w:spacing w:after="200"/>
-      </w:pPr>
-      <w:r>
-        <w:rPr>
-          <w:i/>
-          <w:sz w:val="19"/>
-        </w:rPr>
-        <w:t>Original excerpt, Section 2 &amp; 3 — source: IECEx ATEX Cert</w:t>
-      </w:r>
-      <w:r>
-        <w:rPr>
-          <w:i/>
-          <w:sz w:val="19"/>
-        </w:rPr>
-        <w:t>ification Information Requirements (ExCB):</w:t>
-      </w:r>
-      <w:r>
-        <w:rPr>
-          <w:i/>
-          <w:sz w:val="19"/>
-        </w:rPr>
-        <w:br/>
-        <w:t>“1) Detailed product description; 2) Product name, model, and specification list; 3) Complete and clear functional description and technical parameters (electrical parameters, mechanical parameters, etc.); 4) Clea</w:t>
-      </w:r>
-      <w:r>
-        <w:rPr>
-          <w:i/>
-          <w:sz w:val="19"/>
-        </w:rPr>
-        <w:t>r product photos (overall and key components); 5) Description of intended use and installation environment (e.g., gas group IIC/IIB/IIA if applicable, temperature group T1–T6, ambient temperature range, area classification 0/1/2 or 20/21/22); 6) Design and</w:t>
-      </w:r>
-      <w:r>
-        <w:rPr>
-          <w:i/>
-          <w:sz w:val="19"/>
-        </w:rPr>
-        <w:t xml:space="preserve"> manufacturing information [a–i: drawings, BOM, material datasheets, manufacturing process, explosion-protection calculations, temperature group calculation, usage and installation instructions, nameplate information, Ex component certificates]. 3. Sample </w:t>
-      </w:r>
-      <w:r>
-        <w:rPr>
-          <w:i/>
-          <w:sz w:val="19"/>
-        </w:rPr>
-        <w:t>Information: 1) model, serial number, and status of the sample; 2) necessary test fixtures or auxiliary equipment.”</w:t>
-      </w:r>
-    </w:p>
-    <w:p>
-      <w:pPr>
-        <w:pStyle w:val="Heading1"/>
-      </w:pPr>
-      <w:bookmarkStart w:id="1" w:name="_Toc240058082"/>
-      <w:r>
-        <w:t>1. Basic Information (Application and Organization)</w:t>
-      </w:r>
-      <w:bookmarkEnd w:id="1"/>
-    </w:p>
-    <w:p>
-      <w:r>
-        <w:t>Covers the application form, business license/company registration, organizational chart</w:t>
-      </w:r>
-      <w:r>
-        <w:t xml:space="preserve"> and contact information, manufacturing facility address and profile, and (where applicable) ISO 9001 certification.</w:t>
       </w:r>
     </w:p>
     <w:tbl>
@@ -2534,7 +2468,145 @@
                 <w:color w:val="4A4A4A"/>
                 <w:sz w:val="20"/>
               </w:rPr>
-              <w:t>Not yet prepared in this revision. To be completed in a subsequent revision.</w:t>
+              <w:t>Scope of this document. This is a compilation of design e</w:t>
+            </w:r>
+            <w:r>
+              <w:rPr>
+                <w:color w:val="4A4A4A"/>
+                <w:sz w:val="20"/>
+              </w:rPr>
+              <w:t>vidence and an honest readiness assessment against the ExCB checklist, prepared in support of a future submission — it is not itself a certificate and does not constitute self-certification. The final enclosure/casing (material selection, manufacture, gask</w:t>
+            </w:r>
+            <w:r>
+              <w:rPr>
+                <w:color w:val="4A4A4A"/>
+                <w:sz w:val="20"/>
+              </w:rPr>
+              <w:t>et, and cable entry) is being developed by an external mechanical/casing partner and is not yet in the authors' possession; items that depend on that design (material datasheets, manufacturing process description, explosion-protection calculations) are rep</w:t>
+            </w:r>
+            <w:r>
+              <w:rPr>
+                <w:color w:val="4A4A4A"/>
+                <w:sz w:val="20"/>
+              </w:rPr>
+              <w:t>orted as not yet available for that reason, not because the work has stalled. The product is still at from-scratch development/prototype stage — no finalized, serialized units exist yet, which is why a formal sample register (Section 3.1) is not yet availa</w:t>
+            </w:r>
+            <w:r>
+              <w:rPr>
+                <w:color w:val="4A4A4A"/>
+                <w:sz w:val="20"/>
+              </w:rPr>
+              <w:t>ble either.</w:t>
+            </w:r>
+          </w:p>
+        </w:tc>
+      </w:tr>
+    </w:tbl>
+    <w:p>
+      <w:pPr>
+        <w:spacing w:after="80"/>
+      </w:pPr>
+    </w:p>
+    <w:p>
+      <w:pPr>
+        <w:spacing w:after="200"/>
+      </w:pPr>
+      <w:r>
+        <w:rPr>
+          <w:i/>
+          <w:sz w:val="19"/>
+        </w:rPr>
+        <w:t>Original excerpt, Section 2 &amp; 3 — source: IECEx ATEX Certification Information Requirements (ExCB):</w:t>
+      </w:r>
+      <w:r>
+        <w:rPr>
+          <w:i/>
+          <w:sz w:val="19"/>
+        </w:rPr>
+        <w:br/>
+        <w:t>“1) Detailed product description; 2) Product name, model, and specification list; 3) Complete and clear functional description and technical p</w:t>
+      </w:r>
+      <w:r>
+        <w:rPr>
+          <w:i/>
+          <w:sz w:val="19"/>
+        </w:rPr>
+        <w:t>arameters (electrical parameters, mechanical parameters, etc.); 4) Clear product photos (overall and key components); 5) Description of intended use and installation environment (e.g., gas group IIC/IIB/IIA if applicable, temperature group T1–T6, ambient t</w:t>
+      </w:r>
+      <w:r>
+        <w:rPr>
+          <w:i/>
+          <w:sz w:val="19"/>
+        </w:rPr>
+        <w:t>emperature range, area classification 0/1/2 or 20/21/22); 6) Design and manufacturing information [a–i: drawings, BOM, material datasheets, manufacturing process, explosion-protection calculations, temperature group calculation, usage and installation inst</w:t>
+      </w:r>
+      <w:r>
+        <w:rPr>
+          <w:i/>
+          <w:sz w:val="19"/>
+        </w:rPr>
+        <w:t>ructions, nameplate information, Ex component certificates]. 3. Sample Information: 1) model, serial number, and status of the sample; 2) necessary test fixtures or auxiliary equipment.”</w:t>
+      </w:r>
+    </w:p>
+    <w:p>
+      <w:pPr>
+        <w:pStyle w:val="Heading1"/>
+      </w:pPr>
+      <w:bookmarkStart w:id="1" w:name="_Toc240058953"/>
+      <w:r>
+        <w:t>1. Basic Information (Application and Organization)</w:t>
+      </w:r>
+      <w:bookmarkEnd w:id="1"/>
+    </w:p>
+    <w:p>
+      <w:r>
+        <w:t>Covers the applic</w:t>
+      </w:r>
+      <w:r>
+        <w:t>ation form, business license/company registration, organizational chart and contact information, manufacturing facility address and profile, and (where applicable) ISO 9001 certification.</w:t>
+      </w:r>
+    </w:p>
+    <w:tbl>
+      <w:tblPr>
+        <w:tblW w:w="0" w:type="auto"/>
+        <w:jc w:val="center"/>
+        <w:tblLook w:val="04A0" w:firstRow="1" w:lastRow="0" w:firstColumn="1" w:lastColumn="0" w:noHBand="0" w:noVBand="1"/>
+      </w:tblPr>
+      <w:tblGrid>
+        <w:gridCol w:w="9746"/>
+      </w:tblGrid>
+      <w:tr>
+        <w:trPr>
+          <w:jc w:val="center"/>
+        </w:trPr>
+        <w:tc>
+          <w:tcPr>
+            <w:tcW w:w="9746" w:type="dxa"/>
+            <w:tcBorders>
+              <w:top w:val="single" w:sz="4" w:space="0" w:color="B9D3E0"/>
+              <w:left w:val="single" w:sz="4" w:space="0" w:color="B9D3E0"/>
+              <w:bottom w:val="single" w:sz="4" w:space="0" w:color="B9D3E0"/>
+              <w:right w:val="single" w:sz="4" w:space="0" w:color="B9D3E0"/>
+            </w:tcBorders>
+            <w:shd w:val="clear" w:color="auto" w:fill="E4F2FA"/>
+          </w:tcPr>
+          <w:p>
+            <w:pPr>
+              <w:spacing w:after="40"/>
+            </w:pPr>
+            <w:r>
+              <w:rPr>
+                <w:color w:val="4A4A4A"/>
+                <w:sz w:val="20"/>
+              </w:rPr>
+              <w:t>Not yet prepared in this revision. To be completed in a subsequent r</w:t>
+            </w:r>
+            <w:r>
+              <w:rPr>
+                <w:color w:val="4A4A4A"/>
+                <w:sz w:val="20"/>
+              </w:rPr>
+              <w:t>evision.</w:t>
             </w:r>
           </w:p>
         </w:tc>
@@ -2549,7 +2621,7 @@
       <w:pPr>
         <w:pStyle w:val="Heading1"/>
       </w:pPr>
-      <w:bookmarkStart w:id="2" w:name="_Toc240058083"/>
+      <w:bookmarkStart w:id="2" w:name="_Toc240058954"/>
       <w:r>
         <w:t>2. Technical Documentation</w:t>
       </w:r>
@@ -2557,17 +2629,14 @@
     </w:p>
     <w:p>
       <w:r>
-        <w:t>Six items per the original checkl</w:t>
-      </w:r>
-      <w:r>
-        <w:t>ist (1–6, with Item 6 comprising sub-items a–i). This revision addresses the complete section: Items 1–6.</w:t>
+        <w:t>Six items per the original checklist (1–6, with Item 6 comprising sub-items a–i). This revision addresses the complete section: Items 1–6.</w:t>
       </w:r>
     </w:p>
     <w:p>
       <w:pPr>
         <w:pStyle w:val="Heading2"/>
       </w:pPr>
-      <w:bookmarkStart w:id="3" w:name="_Toc240058084"/>
+      <w:bookmarkStart w:id="3" w:name="_Toc240058955"/>
       <w:r>
         <w:t>2.1 · Detailed Product Description</w:t>
       </w:r>
@@ -2575,56 +2644,56 @@
     </w:p>
     <w:p>
       <w:r>
-        <w:t xml:space="preserve">The Gas Leak Detector (GLD) is an IoT-based, multi-sensor gas leak detection device designed for the early </w:t>
+        <w:t xml:space="preserve">The Gas Leak Detector (GLD) is an </w:t>
       </w:r>
       <w:r>
-        <w:t>detection of flammable and process gases in oil &amp; gas refinery environments (process units, tank farms, pipe racks, and storage/loading-unloading areas). This document addresses the GLD unit itself as the subject of the current IECEx/ATEX certification.</w:t>
+        <w:t>IoT-based, multi-sensor gas leak detection device designed for the early detection of flammable and process gases in oil &amp; gas refinery environments (process units, tank farms, pipe racks, and storage/loading-unloading areas). This document addresses the G</w:t>
+      </w:r>
+      <w:r>
+        <w:t>LD unit itself as the subject of the current IECEx/ATEX certification.</w:t>
       </w:r>
     </w:p>
     <w:p>
       <w:r>
-        <w:t>Fu</w:t>
+        <w:lastRenderedPageBreak/>
+        <w:t>Functionally, the GLD integrates eight channels of metal-oxide semiconductor gas sensors (MQ series), an edge-AI microcontroller/processor (ESP32-S3), and a LoRa radio module (star-topo</w:t>
       </w:r>
       <w:r>
-        <w:t>nctionally, the GLD integrates eight channels of metal-oxide semiconductor gas sensors (MQ series), an edge-AI microcontroller/processor (ESP32-S3), and a LoRa radio module (star-topology wireless transmission) within a single fixed-point unit installed at</w:t>
+        <w:t>logy wireless transmission) within a single fixed-point unit installed at locations with gas-leak risk. An on-device AI gas-classification model runs directly on the unit so that detection decisions do not depend on a continuous connection to a central ser</w:t>
       </w:r>
       <w:r>
-        <w:t xml:space="preserve"> locations with gas-leak risk. An on-device AI gas-classification model runs directly on the unit so that detection decisions do not depend on a continuous connection to a central server. When gas concentration exceeds a defined threshold, the unit trigger</w:t>
-      </w:r>
-      <w:r>
-        <w:t>s a local alarm (an integrated visual/audible alarm module) and simultaneously transmits an alarm notification over the LoRa network to the operator dashboard.</w:t>
+        <w:t>ver. When gas concentration exceeds a defined threshold, the unit triggers a local alarm (an integrated visual/audible alarm module) and simultaneously transmits an alarm notification over the LoRa network to the operator dashboard.</w:t>
       </w:r>
     </w:p>
     <w:p>
       <w:r>
-        <w:t>The enclosure is designed for hazardous-area deployment at refinery sites, using metal materials</w:t>
+        <w:t>The enclosure is design</w:t>
       </w:r>
       <w:r>
-        <w:t xml:space="preserve"> (aluminum alloy and stainless steel — no plastic or PVC) and mounted via an L-bracket to existing structures without drilling or </w:t>
+        <w:t>ed for hazardous-area deployment at refinery sites, using metal materials (aluminum alloy and stainless steel — no plastic or PVC) and mounted via an L-bracket to existing structures without drilling or welding. Important: this design-intent statement does</w:t>
       </w:r>
       <w:r>
-        <w:lastRenderedPageBreak/>
-        <w:t>welding. Important: this design-intent statement does not constitute a claim that the enclosure has passed testing or has been</w:t>
-      </w:r>
-      <w:r>
-        <w:t xml:space="preserve"> Ex-certified — the explosion-protection scheme, gas group, temperature class, and target installation zone will be addressed in Section 2.5 (to follow).</w:t>
+        <w:t xml:space="preserve"> not constitute a claim that the enclosure has passed testing or has been Ex-certified — the explosion-protection scheme, gas group, temperature class, and target installation zone will be addressed in Section 2.5 (to follow).</w:t>
       </w:r>
     </w:p>
     <w:p>
       <w:r>
-        <w:t>The current production power configuration is continuous 24 VDC, supplied via an AC/DC adapter connect</w:t>
+        <w:t xml:space="preserve">The current production power </w:t>
       </w:r>
       <w:r>
-        <w:t>ed to the site electrical supply. A portable battery power path (Li-ion 18650) remains under development (R&amp;D) and has not become a deployed production configuration.</w:t>
+        <w:t>configuration is continuous 24 VDC, supplied via an AC/DC adapter connected to the site electrical supply. A portable battery power path (Li-ion 18650) remains under development (R&amp;D) and has not become a deployed production configuration.</w:t>
       </w:r>
     </w:p>
     <w:p>
       <w:pPr>
         <w:pStyle w:val="Heading2"/>
       </w:pPr>
-      <w:bookmarkStart w:id="4" w:name="_Toc240058085"/>
+      <w:bookmarkStart w:id="4" w:name="_Toc240058956"/>
       <w:r>
-        <w:t>2.2 · Product Name, Model, and Specification List</w:t>
+        <w:t>2.2 · Product Na</w:t>
+      </w:r>
+      <w:r>
+        <w:t>me, Model, and Specification List</w:t>
       </w:r>
       <w:bookmarkEnd w:id="4"/>
     </w:p>
@@ -2670,13 +2739,7 @@
               <w:rPr>
                 <w:sz w:val="20"/>
               </w:rPr>
-              <w:t xml:space="preserve">Gas Leak Detector (GLD) — </w:t>
-            </w:r>
-            <w:r>
-              <w:rPr>
-                <w:sz w:val="20"/>
-              </w:rPr>
-              <w:t>Node Sensor</w:t>
+              <w:t>Gas Leak Detector (GLD) — Node Sensor</w:t>
             </w:r>
           </w:p>
         </w:tc>
@@ -2787,7 +2850,13 @@
               <w:rPr>
                 <w:sz w:val="20"/>
               </w:rPr>
-              <w:t>Institute of Technology Bandung — IoT Laboratory &amp; Physics Laboratory</w:t>
+              <w:t>Institute of Technology Bandung — IoT Laboratory &amp; Physics Laborator</w:t>
+            </w:r>
+            <w:r>
+              <w:rPr>
+                <w:sz w:val="20"/>
+              </w:rPr>
+              <w:t>y</w:t>
             </w:r>
           </w:p>
         </w:tc>
@@ -2824,13 +2893,7 @@
               <w:rPr>
                 <w:sz w:val="20"/>
               </w:rPr>
-              <w:t>PT Pertamina Patra Niaga (initial deploymen</w:t>
-            </w:r>
-            <w:r>
-              <w:rPr>
-                <w:sz w:val="20"/>
-              </w:rPr>
-              <w:t>t site: Refinery Unit IV, Cilacap)</w:t>
+              <w:t>PT Pertamina Patra Niaga (initial deployment site: Refinery Unit IV, Cilacap)</w:t>
             </w:r>
           </w:p>
         </w:tc>
@@ -3033,41 +3096,50 @@
           <w:color w:val="4A4A4A"/>
           <w:sz w:val="18"/>
         </w:rPr>
-        <w:t>Source: official product technical datasheet (Institute of Technology Bandung, Revision 4.0), cross-referenced with internal technical specification documentation and EMC parameter measurement data.</w:t>
+        <w:t>Source: official product technical datasheet (Institute of Technology Bandung, Revision 4.0), cross-referenced with internal technical specification d</w:t>
+      </w:r>
+      <w:r>
+        <w:rPr>
+          <w:i/>
+          <w:color w:val="4A4A4A"/>
+          <w:sz w:val="18"/>
+        </w:rPr>
+        <w:t>ocumentation and EMC parameter measurement data.</w:t>
       </w:r>
     </w:p>
     <w:p>
       <w:pPr>
         <w:pStyle w:val="Heading2"/>
       </w:pPr>
-      <w:bookmarkStart w:id="5" w:name="_Toc240058086"/>
+      <w:bookmarkStart w:id="5" w:name="_Toc240058957"/>
       <w:r>
-        <w:t xml:space="preserve">2.3 · </w:t>
-      </w:r>
-      <w:r>
-        <w:t>Functional Description and Technical Parameters (Electrical, Mechanical, etc.)</w:t>
+        <w:t>2.3 · Functional Description and Technical Parameters (Electrical, Mechanical, etc.)</w:t>
       </w:r>
       <w:bookmarkEnd w:id="5"/>
     </w:p>
     <w:p>
       <w:r>
-        <w:t>Functional workflow (normal operating mode): sense → process → transmit. Each of the eight gas sensors continuously samples ambient conditions → data is normalized and classifie</w:t>
+        <w:t xml:space="preserve">Functional workflow (normal operating mode): sense → process → transmit. Each of the eight gas sensors </w:t>
       </w:r>
       <w:r>
-        <w:t>d by the on-device AI model (ESP32-S3) → the result is transmitted over the LoRa network (star-topology transmission) at a configurable interval (default 10 seconds), or immediately (event-driven) when an alarm condition is detected. Gas alarms are trigger</w:t>
+        <w:t xml:space="preserve">continuously samples ambient conditions → data is normalized and classified by the on-device AI model (ESP32-S3) → the result is transmitted over the LoRa network (star-topology transmission) at a configurable interval (default 10 seconds), or immediately </w:t>
       </w:r>
       <w:r>
-        <w:t>ed through two parallel channels: a local visual/audible alarm module on the unit itself, and a push notification transmitted over the LoRa network to the dashboard — the alarm-push pathway has been successfully tested on a campus mesh network (field valid</w:t>
+        <w:t xml:space="preserve">(event-driven) when an alarm condition is detected. Gas alarms are triggered through two parallel channels: a local visual/audible alarm module on the unit itself, and a push notification transmitted over the LoRa network to the dashboard — the alarm-push </w:t>
       </w:r>
       <w:r>
-        <w:t>ation at a production refinery installation is still pending).</w:t>
+        <w:t xml:space="preserve">pathway has been </w:t>
+      </w:r>
+      <w:r>
+        <w:lastRenderedPageBreak/>
+        <w:t>successfully tested on a campus mesh network (field validation at a production refinery installation is still pending).</w:t>
       </w:r>
     </w:p>
     <w:p>
       <w:pPr>
         <w:pStyle w:val="Heading3"/>
       </w:pPr>
-      <w:bookmarkStart w:id="6" w:name="_Toc240058087"/>
+      <w:bookmarkStart w:id="6" w:name="_Toc240058958"/>
       <w:r>
         <w:t>2.3.a · Electrical Parameters — Node Sensor (GLD)</w:t>
       </w:r>
@@ -3235,13 +3307,7 @@
               <w:rPr>
                 <w:sz w:val="19"/>
               </w:rPr>
-              <w:t xml:space="preserve">Continuous power supply from a site AC/DC </w:t>
-            </w:r>
-            <w:r>
-              <w:rPr>
-                <w:sz w:val="19"/>
-              </w:rPr>
-              <w:t>adapter.</w:t>
+              <w:t>Continuous power supply from a site AC/DC adapter.</w:t>
             </w:r>
           </w:p>
         </w:tc>
@@ -3335,7 +3401,6 @@
                 <w:b/>
                 <w:sz w:val="19"/>
               </w:rPr>
-              <w:lastRenderedPageBreak/>
               <w:t>AC/DC adapter output</w:t>
             </w:r>
           </w:p>
@@ -3402,7 +3467,14 @@
                 <w:b/>
                 <w:sz w:val="19"/>
               </w:rPr>
-              <w:t>Internal operating voltage</w:t>
+              <w:t xml:space="preserve">Internal operating </w:t>
+            </w:r>
+            <w:r>
+              <w:rPr>
+                <w:b/>
+                <w:sz w:val="19"/>
+              </w:rPr>
+              <w:t>voltage</w:t>
             </w:r>
           </w:p>
         </w:tc>
@@ -3452,13 +3524,7 @@
               <w:rPr>
                 <w:sz w:val="19"/>
               </w:rPr>
-              <w:t xml:space="preserve">5 VDC for the MQ sensor/heater </w:t>
-            </w:r>
-            <w:r>
-              <w:rPr>
-                <w:sz w:val="19"/>
-              </w:rPr>
-              <w:t>circuitry; 3.3 VDC for ESP32-S3 logic. Per-rail current not yet documented separately.</w:t>
+              <w:t>5 VDC for the MQ sensor/heater circuitry; 3.3 VDC for ESP32-S3 logic. Per-rail current not yet documented separately.</w:t>
             </w:r>
           </w:p>
         </w:tc>
@@ -3530,7 +3596,13 @@
               <w:rPr>
                 <w:sz w:val="19"/>
               </w:rPr>
-              <w:t>Calculated from measured maximum power consumption (7.995 W) divided by 24 VDC.</w:t>
+              <w:t>Calculated from measured maximum power consumption (7.995</w:t>
+            </w:r>
+            <w:r>
+              <w:rPr>
+                <w:sz w:val="19"/>
+              </w:rPr>
+              <w:t xml:space="preserve"> W) divided by 24 VDC.</w:t>
             </w:r>
           </w:p>
         </w:tc>
@@ -3568,13 +3640,7 @@
               <w:rPr>
                 <w:sz w:val="19"/>
               </w:rPr>
-              <w:t>7.995 W @ 2</w:t>
-            </w:r>
-            <w:r>
-              <w:rPr>
-                <w:sz w:val="19"/>
-              </w:rPr>
-              <w:t>4 VDC</w:t>
+              <w:t>7.995 W @ 24 VDC</w:t>
             </w:r>
           </w:p>
         </w:tc>
@@ -3608,7 +3674,13 @@
               <w:rPr>
                 <w:sz w:val="19"/>
               </w:rPr>
-              <w:t>Applies to the continuous-power configuration. The battery (R&amp;D) configuration is recorded separately at 5.75 W — a different operating mode, not a data conflict.</w:t>
+              <w:t>Applies to the continuous-power configuration. The battery (R&amp;D) configuration is recorded separately at 5.75 W — a different operating mode, not a data confli</w:t>
+            </w:r>
+            <w:r>
+              <w:rPr>
+                <w:sz w:val="19"/>
+              </w:rPr>
+              <w:t>ct.</w:t>
             </w:r>
           </w:p>
         </w:tc>
@@ -3646,13 +3718,7 @@
               <w:rPr>
                 <w:sz w:val="19"/>
               </w:rPr>
-              <w:t>Li-ion 1865</w:t>
-            </w:r>
-            <w:r>
-              <w:rPr>
-                <w:sz w:val="19"/>
-              </w:rPr>
-              <w:t>0 cells, 7 in parallel, 4.2 V/cell, ≈28,000 mAh total</w:t>
+              <w:t>Li-ion 18650 cells, 7 in parallel, 4.2 V/cell, ≈28,000 mAh total</w:t>
             </w:r>
           </w:p>
         </w:tc>
@@ -3686,13 +3752,13 @@
               <w:rPr>
                 <w:sz w:val="19"/>
               </w:rPr>
-              <w:t>Not yet a deployed production configuration. Cell/BMS safety certification (e.g., UN 38.3, IEC 62133) not yet obtained. Firmware-reported diagnostic thresholds: low battery at 3.50 V</w:t>
+              <w:t xml:space="preserve">Not yet a deployed production configuration. Cell/BMS safety certification (e.g., UN 38.3, IEC 62133) not yet </w:t>
             </w:r>
             <w:r>
               <w:rPr>
                 <w:sz w:val="19"/>
               </w:rPr>
-              <w:t>, critical at 3.30 V (status/flag only, not an active power cutoff).</w:t>
+              <w:t>obtained. Firmware-reported diagnostic thresholds: low battery at 3.50 V, critical at 3.30 V (status/flag only, not an active power cutoff).</w:t>
             </w:r>
           </w:p>
         </w:tc>
@@ -3764,7 +3830,13 @@
               <w:rPr>
                 <w:sz w:val="19"/>
               </w:rPr>
-              <w:t>Scope of electrical protection not yet defined/documented.</w:t>
+              <w:t>Scope of electrica</w:t>
+            </w:r>
+            <w:r>
+              <w:rPr>
+                <w:sz w:val="19"/>
+              </w:rPr>
+              <w:t>l protection not yet defined/documented.</w:t>
             </w:r>
           </w:p>
         </w:tc>
@@ -3779,12 +3851,9 @@
       <w:pPr>
         <w:pStyle w:val="Heading3"/>
       </w:pPr>
-      <w:bookmarkStart w:id="7" w:name="_Toc240058088"/>
+      <w:bookmarkStart w:id="7" w:name="_Toc240058959"/>
       <w:r>
-        <w:t xml:space="preserve">2.3.b · Sensor and </w:t>
-      </w:r>
-      <w:r>
-        <w:t>Communication Parameters — Node Sensor (GLD)</w:t>
+        <w:t>2.3.b · Sensor and Communication Parameters — Node Sensor (GLD)</w:t>
       </w:r>
       <w:bookmarkEnd w:id="7"/>
     </w:p>
@@ -3950,7 +4019,13 @@
               <w:rPr>
                 <w:sz w:val="19"/>
               </w:rPr>
-              <w:t>Metal-oxide semiconductor sensors; sensing element directly exposed to ambient air.</w:t>
+              <w:t xml:space="preserve">Metal-oxide </w:t>
+            </w:r>
+            <w:r>
+              <w:rPr>
+                <w:sz w:val="19"/>
+              </w:rPr>
+              <w:t>semiconductor sensors; sensing element directly exposed to ambient air.</w:t>
             </w:r>
           </w:p>
         </w:tc>
@@ -3972,14 +4047,7 @@
                 <w:b/>
                 <w:sz w:val="19"/>
               </w:rPr>
-              <w:t xml:space="preserve">AI </w:t>
-            </w:r>
-            <w:r>
-              <w:rPr>
-                <w:b/>
-                <w:sz w:val="19"/>
-              </w:rPr>
-              <w:t>gas-classification model</w:t>
+              <w:t>AI gas-classification model</w:t>
             </w:r>
           </w:p>
         </w:tc>
@@ -4029,7 +4097,20 @@
               <w:rPr>
                 <w:sz w:val="19"/>
               </w:rPr>
-              <w:t>Runs locally on the ESP32-S3 (Running/Inference mode); outputs a class label and a confidence value. Does not yet cover CO₂, Benzene, CO, or H₂S.</w:t>
+              <w:t>Runs locally on the ESP32-S3 (Running/Inference mode); outputs a class label and a confidence va</w:t>
+            </w:r>
+            <w:r>
+              <w:rPr>
+                <w:sz w:val="19"/>
+              </w:rPr>
+              <w:t xml:space="preserve">lue. Does not yet cover CO₂, Benzene, CO, </w:t>
+            </w:r>
+            <w:r>
+              <w:rPr>
+                <w:sz w:val="19"/>
+              </w:rPr>
+              <w:lastRenderedPageBreak/>
+              <w:t>or H₂S.</w:t>
             </w:r>
           </w:p>
         </w:tc>
@@ -4051,14 +4132,8 @@
                 <w:b/>
                 <w:sz w:val="19"/>
               </w:rPr>
-              <w:t>Environmental sensor (tem</w:t>
-            </w:r>
-            <w:r>
-              <w:rPr>
-                <w:b/>
-                <w:sz w:val="19"/>
-              </w:rPr>
-              <w:t>perature/humidity)</w:t>
+              <w:lastRenderedPageBreak/>
+              <w:t>Environmental sensor (temperature/humidity)</w:t>
             </w:r>
           </w:p>
         </w:tc>
@@ -4108,7 +4183,13 @@
               <w:rPr>
                 <w:sz w:val="19"/>
               </w:rPr>
-              <w:t>Auxiliary temperature/humidity input included in the primary hardware design; values are available for status/telemetry.</w:t>
+              <w:t xml:space="preserve">Auxiliary temperature/humidity input included in the primary hardware design; values are available for </w:t>
+            </w:r>
+            <w:r>
+              <w:rPr>
+                <w:sz w:val="19"/>
+              </w:rPr>
+              <w:t>status/telemetry.</w:t>
             </w:r>
           </w:p>
         </w:tc>
@@ -4180,13 +4261,7 @@
               <w:rPr>
                 <w:sz w:val="19"/>
               </w:rPr>
-              <w:t xml:space="preserve">24-bit multi-channel analog </w:t>
-            </w:r>
-            <w:r>
-              <w:rPr>
-                <w:sz w:val="19"/>
-              </w:rPr>
-              <w:t>acquisition for the 8 sensor channels; 30,000 SPS, firmware SPI clock 1.92 MHz.</w:t>
+              <w:t>24-bit multi-channel analog acquisition for the 8 sensor channels; 30,000 SPS, firmware SPI clock 1.92 MHz.</w:t>
             </w:r>
           </w:p>
         </w:tc>
@@ -4224,14 +4299,7 @@
               <w:rPr>
                 <w:sz w:val="19"/>
               </w:rPr>
-              <w:t>ESP32-S3-WROOM-1U-</w:t>
-            </w:r>
-            <w:r>
-              <w:rPr>
-                <w:sz w:val="19"/>
-              </w:rPr>
-              <w:lastRenderedPageBreak/>
-              <w:t>N16R8</w:t>
+              <w:t>ESP32-S3-WROOM-1U-N16R8</w:t>
             </w:r>
           </w:p>
         </w:tc>
@@ -4249,7 +4317,6 @@
                 <w:color w:val="149174"/>
                 <w:sz w:val="19"/>
               </w:rPr>
-              <w:lastRenderedPageBreak/>
               <w:t>Final</w:t>
             </w:r>
           </w:p>
@@ -4266,20 +4333,13 @@
               <w:rPr>
                 <w:sz w:val="19"/>
               </w:rPr>
-              <w:t xml:space="preserve">Certified under FCC (2AC7Z-ESPS3WROOM1U), TELEC, and CE </w:t>
+              <w:t>Certified under FCC (2AC7Z-ESPS3WROO</w:t>
             </w:r>
             <w:r>
               <w:rPr>
                 <w:sz w:val="19"/>
               </w:rPr>
-              <w:lastRenderedPageBreak/>
-              <w:t>(per Espressif data) — RF/EMC certifications, not an “Ex component” certi</w:t>
-            </w:r>
-            <w:r>
-              <w:rPr>
-                <w:sz w:val="19"/>
-              </w:rPr>
-              <w:t>fication.</w:t>
+              <w:t>M1U), TELEC, and CE (per Espressif data) — RF/EMC certifications, not an “Ex component” certification.</w:t>
             </w:r>
           </w:p>
         </w:tc>
@@ -4301,7 +4361,6 @@
                 <w:b/>
                 <w:sz w:val="19"/>
               </w:rPr>
-              <w:lastRenderedPageBreak/>
               <w:t>Communication module</w:t>
             </w:r>
           </w:p>
@@ -4352,7 +4411,13 @@
               <w:rPr>
                 <w:sz w:val="19"/>
               </w:rPr>
-              <w:t>Certified under CE, FCC, and RoHS (per Ebyte data) — RF/EMC certifications, not an “Ex component” certification.</w:t>
+              <w:t>Certified under CE, FCC, and RoHS (per Ebyte data) — RF/EMC certifications, not an “Ex component” c</w:t>
+            </w:r>
+            <w:r>
+              <w:rPr>
+                <w:sz w:val="19"/>
+              </w:rPr>
+              <w:t>ertification.</w:t>
             </w:r>
           </w:p>
         </w:tc>
@@ -4424,13 +4489,7 @@
               <w:rPr>
                 <w:sz w:val="19"/>
               </w:rPr>
-              <w:t>Star-topology transmission; within the regio</w:t>
-            </w:r>
-            <w:r>
-              <w:rPr>
-                <w:sz w:val="19"/>
-              </w:rPr>
-              <w:t>nal 920–923 MHz ISM band (Indonesia).</w:t>
+              <w:t>Star-topology transmission; within the regional 920–923 MHz ISM band (Indonesia).</w:t>
             </w:r>
           </w:p>
         </w:tc>
@@ -4502,7 +4561,13 @@
               <w:rPr>
                 <w:sz w:val="19"/>
               </w:rPr>
-              <w:t>The radio module supports up to 22 dBm — 17 dBm is an operational configuration, not the module's maximum limit.</w:t>
+              <w:t xml:space="preserve">The radio module supports up to 22 dBm — 17 dBm is an </w:t>
+            </w:r>
+            <w:r>
+              <w:rPr>
+                <w:sz w:val="19"/>
+              </w:rPr>
+              <w:t>operational configuration, not the module's maximum limit.</w:t>
             </w:r>
           </w:p>
         </w:tc>
@@ -4540,13 +4605,7 @@
               <w:rPr>
                 <w:sz w:val="19"/>
               </w:rPr>
-              <w:t xml:space="preserve">125 </w:t>
-            </w:r>
-            <w:r>
-              <w:rPr>
-                <w:sz w:val="19"/>
-              </w:rPr>
-              <w:t>kHz / SF7 / CR 4/5</w:t>
+              <w:t>125 kHz / SF7 / CR 4/5</w:t>
             </w:r>
           </w:p>
         </w:tc>
@@ -4618,7 +4677,13 @@
               <w:rPr>
                 <w:sz w:val="19"/>
               </w:rPr>
-              <w:t>External, omnidirectional, SMA male connector, 3 dBi gain</w:t>
+              <w:t>External, omnidirectional, SMA male connector</w:t>
+            </w:r>
+            <w:r>
+              <w:rPr>
+                <w:sz w:val="19"/>
+              </w:rPr>
+              <w:t>, 3 dBi gain</w:t>
             </w:r>
           </w:p>
         </w:tc>
@@ -4652,13 +4717,7 @@
               <w:rPr>
                 <w:sz w:val="19"/>
               </w:rPr>
-              <w:t>On some units, the 2.4 GHz Wi-Fi antenna remains inside the enclosure and must be reloca</w:t>
-            </w:r>
-            <w:r>
-              <w:rPr>
-                <w:sz w:val="19"/>
-              </w:rPr>
-              <w:t>ted externally.</w:t>
+              <w:t>On some units, the 2.4 GHz Wi-Fi antenna remains inside the enclosure and must be relocated externally.</w:t>
             </w:r>
           </w:p>
         </w:tc>
@@ -4730,7 +4789,13 @@
               <w:rPr>
                 <w:sz w:val="19"/>
               </w:rPr>
-              <w:t>Alarm events are transmitted immediately, independent of the periodic interval.</w:t>
+              <w:t xml:space="preserve">Alarm events are transmitted immediately, independent of the </w:t>
+            </w:r>
+            <w:r>
+              <w:rPr>
+                <w:sz w:val="19"/>
+              </w:rPr>
+              <w:t>periodic interval.</w:t>
             </w:r>
           </w:p>
         </w:tc>
@@ -4802,13 +4867,7 @@
               <w:rPr>
                 <w:sz w:val="19"/>
               </w:rPr>
-              <w:t xml:space="preserve">External ports/connectors: USB, sensor, power, fan, </w:t>
-            </w:r>
-            <w:r>
-              <w:rPr>
-                <w:sz w:val="19"/>
-              </w:rPr>
-              <w:t>antenna, alarm buzzer.</w:t>
+              <w:t>External ports/connectors: USB, sensor, power, fan, antenna, alarm buzzer.</w:t>
             </w:r>
           </w:p>
         </w:tc>
@@ -4880,13 +4939,13 @@
               <w:rPr>
                 <w:sz w:val="19"/>
               </w:rPr>
-              <w:t>Provides 8 read-only registers (device status word, classification result, confidence, battery voltage, power source, ext</w:t>
+              <w:t xml:space="preserve">Provides 8 </w:t>
             </w:r>
             <w:r>
               <w:rPr>
                 <w:sz w:val="19"/>
               </w:rPr>
-              <w:t>ernal power, LoRa transmission counter, node ID); not used for product control.</w:t>
+              <w:t>read-only registers (device status word, classification result, confidence, battery voltage, power source, external power, LoRa transmission counter, node ID); not used for product control.</w:t>
             </w:r>
           </w:p>
         </w:tc>
@@ -4901,8 +4960,9 @@
       <w:pPr>
         <w:pStyle w:val="Heading3"/>
       </w:pPr>
-      <w:bookmarkStart w:id="8" w:name="_Toc240058089"/>
+      <w:bookmarkStart w:id="8" w:name="_Toc240058960"/>
       <w:r>
+        <w:lastRenderedPageBreak/>
         <w:t>2.3.c · Mechanical Parameters — Node Sensor (GLD)</w:t>
       </w:r>
       <w:bookmarkEnd w:id="8"/>
@@ -4959,7 +5019,15 @@
                 <w:color w:val="4A4A4A"/>
                 <w:sz w:val="18"/>
               </w:rPr>
-              <w:t>SPECIFICATION</w:t>
+              <w:t>SPEC</w:t>
+            </w:r>
+            <w:r>
+              <w:rPr>
+                <w:b/>
+                <w:color w:val="4A4A4A"/>
+                <w:sz w:val="18"/>
+              </w:rPr>
+              <w:t>IFICATION</w:t>
             </w:r>
           </w:p>
         </w:tc>
@@ -5069,13 +5137,7 @@
               <w:rPr>
                 <w:sz w:val="19"/>
               </w:rPr>
-              <w:t xml:space="preserve">PVC is </w:t>
-            </w:r>
-            <w:r>
-              <w:rPr>
-                <w:sz w:val="19"/>
-              </w:rPr>
-              <w:t>not used in any housing or bracket component. Specific grade still under determination.</w:t>
+              <w:t>PVC is not used in any housing or bracket component. Specific grade still under determination.</w:t>
             </w:r>
           </w:p>
         </w:tc>
@@ -5203,15 +5265,7 @@
                 <w:color w:val="B02A37"/>
                 <w:sz w:val="19"/>
               </w:rPr>
-              <w:t xml:space="preserve">Pending </w:t>
-            </w:r>
-            <w:r>
-              <w:rPr>
-                <w:b/>
-                <w:color w:val="B02A37"/>
-                <w:sz w:val="19"/>
-              </w:rPr>
-              <w:t>confirmation</w:t>
+              <w:t>Pending confirmation</w:t>
             </w:r>
           </w:p>
         </w:tc>
@@ -5265,14 +5319,7 @@
               <w:rPr>
                 <w:sz w:val="19"/>
               </w:rPr>
-              <w:t xml:space="preserve">L-bracket, following the design </w:t>
-            </w:r>
-            <w:r>
-              <w:rPr>
-                <w:sz w:val="19"/>
-              </w:rPr>
-              <w:lastRenderedPageBreak/>
-              <w:t>already installed at the refinery</w:t>
+              <w:t>L-bracket, following the design already installed at the refinery</w:t>
             </w:r>
           </w:p>
         </w:tc>
@@ -5290,7 +5337,6 @@
                 <w:color w:val="149174"/>
                 <w:sz w:val="19"/>
               </w:rPr>
-              <w:lastRenderedPageBreak/>
               <w:t>Final</w:t>
             </w:r>
           </w:p>
@@ -5307,14 +5353,7 @@
               <w:rPr>
                 <w:sz w:val="19"/>
               </w:rPr>
-              <w:t xml:space="preserve">Mounted to existing structures </w:t>
-            </w:r>
-            <w:r>
-              <w:rPr>
-                <w:sz w:val="19"/>
-              </w:rPr>
-              <w:lastRenderedPageBreak/>
-              <w:t>without drilling or welding.</w:t>
+              <w:t>Mounted to existing structures without drilling or welding.</w:t>
             </w:r>
           </w:p>
         </w:tc>
@@ -5336,7 +5375,6 @@
                 <w:b/>
                 <w:sz w:val="19"/>
               </w:rPr>
-              <w:lastRenderedPageBreak/>
               <w:t>Ingress protection (IP rating)</w:t>
             </w:r>
           </w:p>
@@ -5387,13 +5425,7 @@
               <w:rPr>
                 <w:sz w:val="19"/>
               </w:rPr>
-              <w:t>Not yet tes</w:t>
-            </w:r>
-            <w:r>
-              <w:rPr>
-                <w:sz w:val="19"/>
-              </w:rPr>
-              <w:t>ted/determined.</w:t>
+              <w:t>Not yet tested/determined.</w:t>
             </w:r>
           </w:p>
         </w:tc>
@@ -5487,7 +5519,14 @@
                 <w:b/>
                 <w:sz w:val="19"/>
               </w:rPr>
-              <w:t>Antenna mounting</w:t>
+              <w:t xml:space="preserve">Antenna </w:t>
+            </w:r>
+            <w:r>
+              <w:rPr>
+                <w:b/>
+                <w:sz w:val="19"/>
+              </w:rPr>
+              <w:t>mounting</w:t>
             </w:r>
           </w:p>
         </w:tc>
@@ -5603,13 +5642,7 @@
               <w:rPr>
                 <w:sz w:val="19"/>
               </w:rPr>
-              <w:t xml:space="preserve">Ambient operating temperature range not yet </w:t>
-            </w:r>
-            <w:r>
-              <w:rPr>
-                <w:sz w:val="19"/>
-              </w:rPr>
-              <w:t>determined — key parameter for temperature class (T1–T6) determination in Section 2.5.</w:t>
+              <w:t>Ambient operating temperature range not yet determined — key parameter for temperature class (T1–T6) determination in Section 2.5.</w:t>
             </w:r>
           </w:p>
         </w:tc>
@@ -5693,7 +5726,7 @@
           <w:color w:val="4A4A4A"/>
           <w:sz w:val="18"/>
         </w:rPr>
-        <w:t xml:space="preserve">Source: internal technical specification documentation, Sections 1.1–1.3 (Node Sensor), cross-referenced with the official </w:t>
+        <w:t>Source: internal technical specification documentation, Sections 1.1–1.3 (Node Sensor), cross-referenced with the official product technical datasheet (Revision 4.0) and component certification verification (ESP32-S3-WROOM-1U, E22-9</w:t>
       </w:r>
       <w:r>
         <w:rPr>
@@ -5701,7 +5734,7 @@
           <w:color w:val="4A4A4A"/>
           <w:sz w:val="18"/>
         </w:rPr>
-        <w:t>product technical datasheet (Revision 4.0) and component certification verification (ESP32-S3-WROOM-1U, E22-900MM22S).</w:t>
+        <w:t>00MM22S).</w:t>
       </w:r>
     </w:p>
     <w:tbl>
@@ -5737,14 +5770,14 @@
                 <w:color w:val="4A4A4A"/>
                 <w:sz w:val="20"/>
               </w:rPr>
-              <w:t xml:space="preserve">Rows marked “Pending confirmation” above do not reflect a documentation oversight — this is an honest status indicator. These fields are </w:t>
+              <w:t>Rows marked “Pending confirmation” above do not reflect a documentation oversight — this is an honest status indicator. These fields are intentionally left blank because no official data yet exists (not yet measured, tested, or decided). They mus</w:t>
             </w:r>
             <w:r>
               <w:rPr>
                 <w:color w:val="4A4A4A"/>
                 <w:sz w:val="20"/>
               </w:rPr>
-              <w:t>intentionally left blank because no official data yet exists (not yet measured, tested, or decided). They must not be filled with estimates in future revisions without a clear supporting data source.</w:t>
+              <w:t>t not be filled with estimates in future revisions without a clear supporting data source.</w:t>
             </w:r>
           </w:p>
         </w:tc>
@@ -5759,21 +5792,18 @@
       <w:pPr>
         <w:pStyle w:val="Heading2"/>
       </w:pPr>
-      <w:bookmarkStart w:id="9" w:name="_Toc240058090"/>
+      <w:bookmarkStart w:id="9" w:name="_Toc240058961"/>
       <w:r>
-        <w:t xml:space="preserve">2.4 · Product Photographs — Overall and Key </w:t>
-      </w:r>
-      <w:r>
-        <w:t>Components</w:t>
+        <w:t>2.4 · Product Photographs — Overall and Key Components</w:t>
       </w:r>
       <w:bookmarkEnd w:id="9"/>
     </w:p>
     <w:p>
       <w:r>
-        <w:t>The seven photographs below were taken directly from the Node Sensor (GLD) V2 prototype unit (no capture-date metadata is available in the source files). The first three photographs show the fully assembled unit from different angles; the remain</w:t>
+        <w:t xml:space="preserve">The seven photographs below were taken directly from the Node Sensor (GLD) V2 prototype unit (no </w:t>
       </w:r>
       <w:r>
-        <w:t>ing four show key components in close-up.</w:t>
+        <w:t>capture-date metadata is available in the source files). The first three photographs show the fully assembled unit from different angles; the remaining four show key components in close-up.</w:t>
       </w:r>
     </w:p>
     <w:tbl>
@@ -5805,7 +5835,7 @@
               </w:rPr>
               <w:lastRenderedPageBreak/>
               <w:drawing>
-                <wp:inline distT="0" distB="0" distL="0" distR="0" wp14:anchorId="6CE66042" wp14:editId="5D07AB14">
+                <wp:inline distT="0" distB="0" distL="0" distR="0" wp14:anchorId="45CDF0D7" wp14:editId="089D4578">
                   <wp:extent cx="2514600" cy="4165753"/>
                   <wp:effectExtent l="0" t="0" r="0" b="0"/>
                   <wp:docPr id="1" name="Picture 1"/>
@@ -5864,14 +5894,14 @@
                 <w:color w:val="4A4A4A"/>
                 <w:sz w:val="17"/>
               </w:rPr>
-              <w:t xml:space="preserve">The fully assembled Node Sensor (GLD): the main enclosure (blue) with sensor mesh cover, external LoRa antenna, and a visual alarm module (cylindrical housing, red lens) mounted on the </w:t>
+              <w:t>The fully assembled Node Sensor (GLD)</w:t>
             </w:r>
             <w:r>
               <w:rPr>
                 <w:color w:val="4A4A4A"/>
                 <w:sz w:val="17"/>
               </w:rPr>
-              <w:t>right side.</w:t>
+              <w:t>: the main enclosure (blue) with sensor mesh cover, external LoRa antenna, and a visual alarm module (cylindrical housing, red lens) mounted on the right side.</w:t>
             </w:r>
           </w:p>
         </w:tc>
@@ -5889,7 +5919,7 @@
                 <w:noProof/>
               </w:rPr>
               <w:drawing>
-                <wp:inline distT="0" distB="0" distL="0" distR="0" wp14:anchorId="0A3AF5B6" wp14:editId="12F0F99F">
+                <wp:inline distT="0" distB="0" distL="0" distR="0" wp14:anchorId="147ECC83" wp14:editId="5F786EBE">
                   <wp:extent cx="2514600" cy="3352800"/>
                   <wp:effectExtent l="0" t="0" r="0" b="0"/>
                   <wp:docPr id="2" name="Picture 2"/>
@@ -5948,7 +5978,14 @@
                 <w:color w:val="4A4A4A"/>
                 <w:sz w:val="17"/>
               </w:rPr>
-              <w:t>An alternate view of the assembled unit, showing the position of the antenna, alarm module, and the cable-gland side of the enclosure.</w:t>
+              <w:t xml:space="preserve">An alternate view of the assembled unit, showing the position </w:t>
+            </w:r>
+            <w:r>
+              <w:rPr>
+                <w:color w:val="4A4A4A"/>
+                <w:sz w:val="17"/>
+              </w:rPr>
+              <w:t>of the antenna, alarm module, and the cable-gland side of the enclosure.</w:t>
             </w:r>
           </w:p>
         </w:tc>
@@ -5972,7 +6009,7 @@
               </w:rPr>
               <w:lastRenderedPageBreak/>
               <w:drawing>
-                <wp:inline distT="0" distB="0" distL="0" distR="0" wp14:anchorId="41A50C92" wp14:editId="73E025A3">
+                <wp:inline distT="0" distB="0" distL="0" distR="0" wp14:anchorId="2A3D4EDC" wp14:editId="0D070D9D">
                   <wp:extent cx="2514600" cy="5599312"/>
                   <wp:effectExtent l="0" t="0" r="0" b="0"/>
                   <wp:docPr id="3" name="Picture 3"/>
@@ -6031,14 +6068,14 @@
                 <w:color w:val="4A4A4A"/>
                 <w:sz w:val="17"/>
               </w:rPr>
-              <w:t>The main e</w:t>
+              <w:t>The main enclosure with the sensor mesh cover installed, shown in a flat front view illustrating the enclosure shape a</w:t>
             </w:r>
             <w:r>
               <w:rPr>
                 <w:color w:val="4A4A4A"/>
                 <w:sz w:val="17"/>
               </w:rPr>
-              <w:t>nclosure with the sensor mesh cover installed, shown in a flat front view illustrating the enclosure shape and its four mounting bolt holes.</w:t>
+              <w:t>nd its four mounting bolt holes.</w:t>
             </w:r>
           </w:p>
         </w:tc>
@@ -6056,7 +6093,7 @@
                 <w:noProof/>
               </w:rPr>
               <w:drawing>
-                <wp:inline distT="0" distB="0" distL="0" distR="0" wp14:anchorId="7910CDEE" wp14:editId="14B91D13">
+                <wp:inline distT="0" distB="0" distL="0" distR="0" wp14:anchorId="62A202A5" wp14:editId="7C4C6022">
                   <wp:extent cx="2514600" cy="5599312"/>
                   <wp:effectExtent l="0" t="0" r="0" b="0"/>
                   <wp:docPr id="4" name="Picture 4"/>
@@ -6115,14 +6152,14 @@
                 <w:color w:val="4A4A4A"/>
                 <w:sz w:val="17"/>
               </w:rPr>
-              <w:t>The main PCB installed inside the enclosure prior to</w:t>
+              <w:t>The main PCB installed inside the enclosure prior to gas sensor module installation. The ESP32-S3-WROOM-1U microcontroller, LoRa radio module, and power circuit</w:t>
             </w:r>
             <w:r>
               <w:rPr>
                 <w:color w:val="4A4A4A"/>
                 <w:sz w:val="17"/>
               </w:rPr>
-              <w:t xml:space="preserve"> gas sensor module installation. The ESP32-S3-WROOM-1U microcontroller, LoRa radio module, and power circuitry are visible.</w:t>
+              <w:t>ry are visible.</w:t>
             </w:r>
           </w:p>
         </w:tc>
@@ -6146,7 +6183,7 @@
               </w:rPr>
               <w:lastRenderedPageBreak/>
               <w:drawing>
-                <wp:inline distT="0" distB="0" distL="0" distR="0" wp14:anchorId="1C9D0DE3" wp14:editId="502A88D8">
+                <wp:inline distT="0" distB="0" distL="0" distR="0" wp14:anchorId="191103A5" wp14:editId="3CC59E31">
                   <wp:extent cx="2514600" cy="5599312"/>
                   <wp:effectExtent l="0" t="0" r="0" b="0"/>
                   <wp:docPr id="5" name="Picture 5"/>
@@ -6205,14 +6242,7 @@
                 <w:color w:val="4A4A4A"/>
                 <w:sz w:val="17"/>
               </w:rPr>
-              <w:t>The same PCB with eight channels of MQ-series gas sensors (MQ-2, MQ-3B, MQ-4, M</w:t>
-            </w:r>
-            <w:r>
-              <w:rPr>
-                <w:color w:val="4A4A4A"/>
-                <w:sz w:val="17"/>
-              </w:rPr>
-              <w:t>Q-5, MQ-6, MQ-7B, MQ-8, MQ-135) installed around the central microcontroller.</w:t>
+              <w:t>The same PCB with eight channels of MQ-series gas sensors (MQ-2, MQ-3B, MQ-4, MQ-5, MQ-6, MQ-7B, MQ-8, MQ-135) installed around the central microcontroller.</w:t>
             </w:r>
           </w:p>
         </w:tc>
@@ -6230,7 +6260,7 @@
                 <w:noProof/>
               </w:rPr>
               <w:drawing>
-                <wp:inline distT="0" distB="0" distL="0" distR="0" wp14:anchorId="0AD095F9" wp14:editId="7F161A37">
+                <wp:inline distT="0" distB="0" distL="0" distR="0" wp14:anchorId="0452A20F" wp14:editId="711FCE45">
                   <wp:extent cx="2514600" cy="5599312"/>
                   <wp:effectExtent l="0" t="0" r="0" b="0"/>
                   <wp:docPr id="6" name="Picture 6"/>
@@ -6275,13 +6305,20 @@
                 <w:b/>
                 <w:sz w:val="19"/>
               </w:rPr>
-              <w:t>Key component — visual alarm module (close-up)</w:t>
+              <w:t xml:space="preserve">Key component — visual </w:t>
             </w:r>
             <w:r>
               <w:rPr>
                 <w:b/>
                 <w:sz w:val="19"/>
               </w:rPr>
+              <w:t>alarm module (close-up)</w:t>
+            </w:r>
+            <w:r>
+              <w:rPr>
+                <w:b/>
+                <w:sz w:val="19"/>
+              </w:rPr>
               <w:br/>
             </w:r>
             <w:r>
@@ -6289,14 +6326,7 @@
                 <w:color w:val="4A4A4A"/>
                 <w:sz w:val="17"/>
               </w:rPr>
-              <w:t xml:space="preserve">The visual alarm (beacon/strobe) module, constructed of metal with a red lens, connected to the main enclosure via a </w:t>
-            </w:r>
-            <w:r>
-              <w:rPr>
-                <w:color w:val="4A4A4A"/>
-                <w:sz w:val="17"/>
-              </w:rPr>
-              <w:t>dedicated cable gland.</w:t>
+              <w:t>The visual alarm (beacon/strobe) module, constructed of metal with a red lens, connected to the main enclosure via a dedicated cable gland.</w:t>
             </w:r>
           </w:p>
         </w:tc>
@@ -6320,7 +6350,7 @@
               </w:rPr>
               <w:lastRenderedPageBreak/>
               <w:drawing>
-                <wp:inline distT="0" distB="0" distL="0" distR="0" wp14:anchorId="0DF8A8FE" wp14:editId="1777D93D">
+                <wp:inline distT="0" distB="0" distL="0" distR="0" wp14:anchorId="6C392F70" wp14:editId="68DDDDFC">
                   <wp:extent cx="2514600" cy="5599312"/>
                   <wp:effectExtent l="0" t="0" r="0" b="0"/>
                   <wp:docPr id="7" name="Picture 7"/>
@@ -6379,7 +6409,14 @@
                 <w:color w:val="4A4A4A"/>
                 <w:sz w:val="17"/>
               </w:rPr>
-              <w:t>The metal mesh cover that protects the gas sensing elements while serving as a diffusion path for gas to reach the sensors beneath.</w:t>
+              <w:t>The metal mesh cover that protects the gas s</w:t>
+            </w:r>
+            <w:r>
+              <w:rPr>
+                <w:color w:val="4A4A4A"/>
+                <w:sz w:val="17"/>
+              </w:rPr>
+              <w:t>ensing elements while serving as a diffusion path for gas to reach the sensors beneath.</w:t>
             </w:r>
           </w:p>
         </w:tc>
@@ -6429,21 +6466,21 @@
                 <w:color w:val="4A4A4A"/>
                 <w:sz w:val="20"/>
               </w:rPr>
-              <w:t>Photographic completeness — status as-is. The seve</w:t>
+              <w:t>Photographic completeness — status as-is. The seven photographs above cover the complete unit and its key components (PCB, sensor modules, alarm module, mesh cover),</w:t>
             </w:r>
             <w:r>
               <w:rPr>
                 <w:color w:val="4A4A4A"/>
                 <w:sz w:val="20"/>
               </w:rPr>
-              <w:t>n photographs above cover the complete unit and its key components (PCB, sensor modules, alarm module, mesh cover), substantively satisfying checklist Item 2.4. Still outstanding: (a) formally labeled photographs of each face (front/back/left/right/top/bot</w:t>
+              <w:t xml:space="preserve"> substantively satisfying checklist Item 2.4. Still outstanding: (a) formally labeled photographs of each face (front/back/left/right/top/bottom) with a scale reference, as is customary in ExCB submission packages; (b) separate photographs of individual co</w:t>
             </w:r>
             <w:r>
               <w:rPr>
                 <w:color w:val="4A4A4A"/>
                 <w:sz w:val="20"/>
               </w:rPr>
-              <w:t>tom) with a scale reference, as is customary in ExCB submission packages; (b) separate photographs of individual components such as the battery, gaskets/seals, terminals, and cable glands.</w:t>
+              <w:t>mponents such as the battery, gaskets/seals, terminals, and cable glands.</w:t>
             </w:r>
           </w:p>
         </w:tc>
@@ -6458,25 +6495,22 @@
       <w:pPr>
         <w:pStyle w:val="Heading2"/>
       </w:pPr>
-      <w:bookmarkStart w:id="10" w:name="_Toc240058091"/>
+      <w:bookmarkStart w:id="10" w:name="_Toc240058962"/>
       <w:r>
         <w:lastRenderedPageBreak/>
-        <w:t>2.5 · Description of Intended Use and Installation Environment (G</w:t>
-      </w:r>
-      <w:r>
-        <w:t>as Group, Temperature Class, Area Classification)</w:t>
+        <w:t>2.5 · Description of Intended Use and Installation Environment (Gas Group, Temperature Class, Area Classification)</w:t>
       </w:r>
       <w:bookmarkEnd w:id="10"/>
     </w:p>
     <w:p>
       <w:r>
-        <w:t>The GLD is intended for continuous, fixed-point monitoring of flammable and toxic gas leaks in oil &amp; gas refinery hazardous areas — process units, tank farms, pipe racks, and loading/unloading areas. The sp</w:t>
+        <w:t>The GLD is intended for continuous, fixed-point monitoring of fla</w:t>
       </w:r>
       <w:r>
-        <w:t>ecific Ex classification parameters below reflect the project engineering team's current recommendation, developed from the intended deployment envelope and the gases the device is designed to detect; none of these parameters has yet been confirmed with th</w:t>
+        <w:t xml:space="preserve">mmable and toxic gas leaks in oil &amp; gas refinery hazardous areas — process units, tank farms, pipe racks, and loading/unloading areas. The specific Ex classification parameters below reflect the project engineering team's current recommendation, developed </w:t>
       </w:r>
       <w:r>
-        <w:t>e certification body (ExCB) or a notified body, and none should be treated as final.</w:t>
+        <w:t>from the intended deployment envelope and the gases the device is designed to detect; none of these parameters has yet been confirmed with the certification body (ExCB) or a notified body, and none should be treated as final.</w:t>
       </w:r>
     </w:p>
     <w:tbl>
@@ -6641,13 +6675,13 @@
               <w:rPr>
                 <w:sz w:val="19"/>
               </w:rPr>
-              <w:t xml:space="preserve">Hydrogen (H₂) is one of the three gases the </w:t>
+              <w:t>Hydrogen (H₂) is one of the three gases the classifier is designed to detect (Section 2.3.b); IIC is required for hydrogen and inherently covers IIB</w:t>
             </w:r>
             <w:r>
               <w:rPr>
                 <w:sz w:val="19"/>
               </w:rPr>
-              <w:t>classifier is designed to detect (Section 2.3.b); IIC is required for hydrogen and inherently covers IIB and IIA.</w:t>
+              <w:t xml:space="preserve"> and IIA.</w:t>
             </w:r>
           </w:p>
         </w:tc>
@@ -6719,13 +6753,13 @@
               <w:rPr>
                 <w:sz w:val="19"/>
               </w:rPr>
-              <w:t xml:space="preserve">Not yet substantiated by measurement. MQ-series </w:t>
+              <w:t xml:space="preserve">Not yet substantiated by measurement. MQ-series metal-oxide sensors rely on an internal heating element as their normal operating principle; a hot-spot </w:t>
             </w:r>
             <w:r>
               <w:rPr>
                 <w:sz w:val="19"/>
               </w:rPr>
-              <w:t>metal-oxide sensors rely on an internal heating element as their normal operating principle; a hot-spot measurement specific to the sensor models and enclosure configuration used here has not yet been performed (see 2.6.f).</w:t>
+              <w:t>measurement specific to the sensor models and enclosure configuration used here has not yet been performed (see 2.6.f).</w:t>
             </w:r>
           </w:p>
         </w:tc>
@@ -6781,15 +6815,7 @@
                 <w:color w:val="B02A37"/>
                 <w:sz w:val="19"/>
               </w:rPr>
-              <w:t>Pen</w:t>
-            </w:r>
-            <w:r>
-              <w:rPr>
-                <w:b/>
-                <w:color w:val="B02A37"/>
-                <w:sz w:val="19"/>
-              </w:rPr>
-              <w:t>ding confirmation</w:t>
+              <w:t>Pending confirmation</w:t>
             </w:r>
           </w:p>
         </w:tc>
@@ -6861,7 +6887,15 @@
                 <w:color w:val="B56A1E"/>
                 <w:sz w:val="19"/>
               </w:rPr>
-              <w:t>Team recommendation — pending ExCB confirmation</w:t>
+              <w:t xml:space="preserve">Team recommendation </w:t>
+            </w:r>
+            <w:r>
+              <w:rPr>
+                <w:b/>
+                <w:color w:val="B56A1E"/>
+                <w:sz w:val="19"/>
+              </w:rPr>
+              <w:t>— pending ExCB confirmation</w:t>
             </w:r>
           </w:p>
         </w:tc>
@@ -6877,13 +6911,7 @@
               <w:rPr>
                 <w:sz w:val="19"/>
               </w:rPr>
-              <w:t>Assessed as sufficient for the general refinery deployment envelope, including areas near storage. Zone 0 would only apply i</w:t>
-            </w:r>
-            <w:r>
-              <w:rPr>
-                <w:sz w:val="19"/>
-              </w:rPr>
-              <w:t>f the detector were installed directly inside a tank vapor space.</w:t>
+              <w:t>Assessed as sufficient for the general refinery deployment envelope, including areas near storage. Zone 0 would only apply if the detector were installed directly inside a tank vapor space.</w:t>
             </w:r>
           </w:p>
         </w:tc>
@@ -6927,14 +6955,21 @@
                 <w:color w:val="4A4A4A"/>
                 <w:sz w:val="20"/>
               </w:rPr>
-              <w:t>These are engineering recommendations, not a certification decision. An independent readiness assessment of the same checklist item, prepared separately from the underlying firmware/hardwa</w:t>
+              <w:t>These are engineering recommendation</w:t>
             </w:r>
             <w:r>
               <w:rPr>
                 <w:color w:val="4A4A4A"/>
                 <w:sz w:val="20"/>
               </w:rPr>
-              <w:t>re repository, reached the same conclusion — gas group, temperature class, ambient range, and zone are not yet formally established. Final classification requires explicit agreement with the ExCB.</w:t>
+              <w:t>s, not a certification decision. An independent readiness assessment of the same checklist item, prepared separately from the underlying firmware/hardware repository, reached the same conclusion — gas group, temperature class, ambient range, and zone are n</w:t>
+            </w:r>
+            <w:r>
+              <w:rPr>
+                <w:color w:val="4A4A4A"/>
+                <w:sz w:val="20"/>
+              </w:rPr>
+              <w:t>ot yet formally established. Final classification requires explicit agreement with the ExCB.</w:t>
             </w:r>
           </w:p>
         </w:tc>
@@ -6949,7 +6984,7 @@
       <w:pPr>
         <w:pStyle w:val="Heading2"/>
       </w:pPr>
-      <w:bookmarkStart w:id="11" w:name="_Toc240058092"/>
+      <w:bookmarkStart w:id="11" w:name="_Toc240058963"/>
       <w:r>
         <w:t>2.6 · Design and Manufacturing Information</w:t>
       </w:r>
@@ -6957,35 +6992,32 @@
     </w:p>
     <w:p>
       <w:r>
-        <w:t xml:space="preserve">Nine </w:t>
+        <w:t xml:space="preserve">Nine sub-items (a–i) per the original checklist. Status is reported item by item below; most sub-items are not yet </w:t>
       </w:r>
       <w:r>
-        <w:t>sub-items (a–i) per the original checklist. Status is reported item by item below; most sub-items are not yet available — this is reported plainly rather than implied to be complete.</w:t>
+        <w:t>available — this is reported plainly rather than implied to be complete.</w:t>
       </w:r>
     </w:p>
     <w:p>
       <w:pPr>
         <w:pStyle w:val="Heading3"/>
       </w:pPr>
-      <w:bookmarkStart w:id="12" w:name="_Toc240058093"/>
+      <w:bookmarkStart w:id="12" w:name="_Toc240058964"/>
       <w:r>
         <w:lastRenderedPageBreak/>
-        <w:t>2.6.a · Complete Drawings (Assembly, Component, Electrical Schematic, PCB</w:t>
-      </w:r>
-      <w:r>
-        <w:t xml:space="preserve"> Layout, Enclosure Structure, Junction Box, Terminal, Grounding)</w:t>
+        <w:t>2.6.a · Complete Drawings (Assembly, Component, Electrical Schematic, PCB Layout, Enclosure Structure, Junction Box, Terminal, Grounding)</w:t>
       </w:r>
       <w:bookmarkEnd w:id="12"/>
     </w:p>
     <w:p>
       <w:r>
-        <w:t xml:space="preserve">An electrical schematic capture and a corresponding PCB layout exist for the GLD V2 main board as native EasyEDA/JLCPCB source design files (not just a derived summary). From the schematic's </w:t>
+        <w:t>An electrical schematic capture and a corresp</w:t>
       </w:r>
       <w:r>
-        <w:t>traced net list, a supporting block-diagram set (9 sheets, functional/block level, 204 components mapped with documented pin-to-net traceability) has been produced and is reproduced in full below. Field labels in the source diagrams are in Indonesian; Engl</w:t>
+        <w:t xml:space="preserve">onding PCB layout exist for the GLD V2 main board as native EasyEDA/JLCPCB source design files (not just a derived summary). From the schematic's traced net list, a supporting block-diagram set (9 sheets, functional/block level, 204 components mapped with </w:t>
       </w:r>
       <w:r>
-        <w:t>ish captions are provided under each sheet.</w:t>
+        <w:t>documented pin-to-net traceability) has been produced and is reproduced in full below. Field labels in the source diagrams are in Indonesian; English captions are provided under each sheet.</w:t>
       </w:r>
     </w:p>
     <w:p>
@@ -6997,7 +7029,7 @@
           <w:noProof/>
         </w:rPr>
         <w:drawing>
-          <wp:inline distT="0" distB="0" distL="0" distR="0" wp14:anchorId="6BD5BF24" wp14:editId="0212BAF3">
+          <wp:inline distT="0" distB="0" distL="0" distR="0" wp14:anchorId="229A07F5" wp14:editId="0A2FFBB4">
             <wp:extent cx="5120640" cy="3413760"/>
             <wp:effectExtent l="0" t="0" r="0" b="0"/>
             <wp:docPr id="8" name="Picture 8"/>
@@ -7057,14 +7089,14 @@
           <w:color w:val="4A4A4A"/>
           <w:sz w:val="17"/>
         </w:rPr>
-        <w:t>Power input, power distribution, analog acquisition, sensor control, main control (ESP32-S3), and external interfaces (alarm, RS-485, LoRa antenna, programming/configuration)</w:t>
+        <w:t>Power input, power distribut</w:t>
       </w:r>
       <w:r>
         <w:rPr>
           <w:color w:val="4A4A4A"/>
           <w:sz w:val="17"/>
         </w:rPr>
-        <w:t>.</w:t>
+        <w:t>ion, analog acquisition, sensor control, main control (ESP32-S3), and external interfaces (alarm, RS-485, LoRa antenna, programming/configuration).</w:t>
       </w:r>
     </w:p>
     <w:p>
@@ -7077,7 +7109,7 @@
         </w:rPr>
         <w:lastRenderedPageBreak/>
         <w:drawing>
-          <wp:inline distT="0" distB="0" distL="0" distR="0" wp14:anchorId="239A9AED" wp14:editId="7D3634BD">
+          <wp:inline distT="0" distB="0" distL="0" distR="0" wp14:anchorId="6DD7D69E" wp14:editId="0C516E60">
             <wp:extent cx="5120640" cy="3413760"/>
             <wp:effectExtent l="0" t="0" r="0" b="0"/>
             <wp:docPr id="9" name="Picture 9"/>
@@ -7137,7 +7169,14 @@
           <w:color w:val="4A4A4A"/>
           <w:sz w:val="17"/>
         </w:rPr>
-        <w:t>Main power input rails and distribution: +5 V / +5VA analog, 3.3 V, and +24 V for the alarm circuit.</w:t>
+        <w:t>Main power input rails and distribution: +5 V / +5VA analog, 3.3 V, and +24 V fo</w:t>
+      </w:r>
+      <w:r>
+        <w:rPr>
+          <w:color w:val="4A4A4A"/>
+          <w:sz w:val="17"/>
+        </w:rPr>
+        <w:t>r the alarm circuit.</w:t>
       </w:r>
     </w:p>
     <w:p>
@@ -7149,7 +7188,7 @@
           <w:noProof/>
         </w:rPr>
         <w:drawing>
-          <wp:inline distT="0" distB="0" distL="0" distR="0" wp14:anchorId="239221CF" wp14:editId="3827D273">
+          <wp:inline distT="0" distB="0" distL="0" distR="0" wp14:anchorId="2B041FD5" wp14:editId="584608BE">
             <wp:extent cx="5120640" cy="3413760"/>
             <wp:effectExtent l="0" t="0" r="0" b="0"/>
             <wp:docPr id="10" name="Picture 10"/>
@@ -7222,7 +7261,7 @@
         </w:rPr>
         <w:lastRenderedPageBreak/>
         <w:drawing>
-          <wp:inline distT="0" distB="0" distL="0" distR="0" wp14:anchorId="6AC14DDB" wp14:editId="14D4C0B9">
+          <wp:inline distT="0" distB="0" distL="0" distR="0" wp14:anchorId="11CA3D1D" wp14:editId="16973E14">
             <wp:extent cx="5120640" cy="3413760"/>
             <wp:effectExtent l="0" t="0" r="0" b="0"/>
             <wp:docPr id="11" name="Picture 11"/>
@@ -7268,14 +7307,7 @@
           <w:b/>
           <w:sz w:val="19"/>
         </w:rPr>
-        <w:t>Shee</w:t>
-      </w:r>
-      <w:r>
-        <w:rPr>
-          <w:b/>
-          <w:sz w:val="19"/>
-        </w:rPr>
-        <w:t>t 4 of 9 — Sensor module</w:t>
+        <w:t>Sheet 4 of 9 — Sensor module</w:t>
       </w:r>
       <w:r>
         <w:rPr>
@@ -7289,7 +7321,14 @@
           <w:color w:val="4A4A4A"/>
           <w:sz w:val="17"/>
         </w:rPr>
-        <w:t>The external gas sensor module: 8 analog channels with per-channel I2C enable, including the sensor, DAC, and power-switch sub-blocks.</w:t>
+        <w:t>The external gas sensor module: 8 analog channels with per-channel I2C enable, includ</w:t>
+      </w:r>
+      <w:r>
+        <w:rPr>
+          <w:color w:val="4A4A4A"/>
+          <w:sz w:val="17"/>
+        </w:rPr>
+        <w:t>ing the sensor, DAC, and power-switch sub-blocks.</w:t>
       </w:r>
     </w:p>
     <w:p>
@@ -7301,7 +7340,7 @@
           <w:noProof/>
         </w:rPr>
         <w:drawing>
-          <wp:inline distT="0" distB="0" distL="0" distR="0" wp14:anchorId="40F23DD7" wp14:editId="283B49A2">
+          <wp:inline distT="0" distB="0" distL="0" distR="0" wp14:anchorId="4335561D" wp14:editId="70356FFF">
             <wp:extent cx="5120640" cy="3413760"/>
             <wp:effectExtent l="0" t="0" r="0" b="0"/>
             <wp:docPr id="12" name="Picture 12"/>
@@ -7361,14 +7400,7 @@
           <w:color w:val="4A4A4A"/>
           <w:sz w:val="17"/>
         </w:rPr>
-        <w:t>The 8-channel analog acquisition front end: analog inputs, A</w:t>
-      </w:r>
-      <w:r>
-        <w:rPr>
-          <w:color w:val="4A4A4A"/>
-          <w:sz w:val="17"/>
-        </w:rPr>
-        <w:t>DC (ADS1256), reference, and VMID biasing.</w:t>
+        <w:t>The 8-channel analog acquisition front end: analog inputs, ADC (ADS1256), reference, and VMID biasing.</w:t>
       </w:r>
     </w:p>
     <w:p>
@@ -7381,7 +7413,7 @@
         </w:rPr>
         <w:lastRenderedPageBreak/>
         <w:drawing>
-          <wp:inline distT="0" distB="0" distL="0" distR="0" wp14:anchorId="05848E3E" wp14:editId="49519174">
+          <wp:inline distT="0" distB="0" distL="0" distR="0" wp14:anchorId="4D168531" wp14:editId="740096DE">
             <wp:extent cx="5120640" cy="3413760"/>
             <wp:effectExtent l="0" t="0" r="0" b="0"/>
             <wp:docPr id="13" name="Picture 13"/>
@@ -7441,7 +7473,14 @@
           <w:color w:val="4A4A4A"/>
           <w:sz w:val="17"/>
         </w:rPr>
-        <w:t>I2C channel selection (TCA9548A), per-channel sensor enable (PCF8574), and the temperature/humidity sensor (SHT40).</w:t>
+        <w:t xml:space="preserve">I2C channel </w:t>
+      </w:r>
+      <w:r>
+        <w:rPr>
+          <w:color w:val="4A4A4A"/>
+          <w:sz w:val="17"/>
+        </w:rPr>
+        <w:t>selection (TCA9548A), per-channel sensor enable (PCF8574), and the temperature/humidity sensor (SHT40).</w:t>
       </w:r>
     </w:p>
     <w:p>
@@ -7453,7 +7492,7 @@
           <w:noProof/>
         </w:rPr>
         <w:drawing>
-          <wp:inline distT="0" distB="0" distL="0" distR="0" wp14:anchorId="5945DA11" wp14:editId="67CBB097">
+          <wp:inline distT="0" distB="0" distL="0" distR="0" wp14:anchorId="55A8BC55" wp14:editId="454DE21E">
             <wp:extent cx="5120640" cy="3413760"/>
             <wp:effectExtent l="0" t="0" r="0" b="0"/>
             <wp:docPr id="14" name="Picture 14"/>
@@ -7513,14 +7552,14 @@
           <w:color w:val="4A4A4A"/>
           <w:sz w:val="17"/>
         </w:rPr>
-        <w:t xml:space="preserve">Main </w:t>
+        <w:t>Main controller (ESP32-S3) interface map: SPI to the ADC, I2C to sensor/control, UART for USB and RS-485, and GPIO fo</w:t>
       </w:r>
       <w:r>
         <w:rPr>
           <w:color w:val="4A4A4A"/>
           <w:sz w:val="17"/>
         </w:rPr>
-        <w:t>controller (ESP32-S3) interface map: SPI to the ADC, I2C to sensor/control, UART for USB and RS-485, and GPIO for alarm, power, button, and LED.</w:t>
+        <w:t>r alarm, power, button, and LED.</w:t>
       </w:r>
     </w:p>
     <w:p>
@@ -7533,7 +7572,7 @@
         </w:rPr>
         <w:lastRenderedPageBreak/>
         <w:drawing>
-          <wp:inline distT="0" distB="0" distL="0" distR="0" wp14:anchorId="0C4278B6" wp14:editId="6D1D8826">
+          <wp:inline distT="0" distB="0" distL="0" distR="0" wp14:anchorId="57E87F8D" wp14:editId="0D721838">
             <wp:extent cx="5120640" cy="3413760"/>
             <wp:effectExtent l="0" t="0" r="0" b="0"/>
             <wp:docPr id="15" name="Picture 15"/>
@@ -7593,14 +7632,7 @@
           <w:color w:val="4A4A4A"/>
           <w:sz w:val="17"/>
         </w:rPr>
-        <w:t xml:space="preserve">Alarm output and status-indication circuitry driven from the main </w:t>
-      </w:r>
-      <w:r>
-        <w:rPr>
-          <w:color w:val="4A4A4A"/>
-          <w:sz w:val="17"/>
-        </w:rPr>
-        <w:t>controller.</w:t>
+        <w:t>Alarm output and status-indication circuitry driven from the main controller.</w:t>
       </w:r>
     </w:p>
     <w:p>
@@ -7612,7 +7644,7 @@
           <w:noProof/>
         </w:rPr>
         <w:drawing>
-          <wp:inline distT="0" distB="0" distL="0" distR="0" wp14:anchorId="20FD1630" wp14:editId="2848F6FF">
+          <wp:inline distT="0" distB="0" distL="0" distR="0" wp14:anchorId="6D17E792" wp14:editId="491BB3F7">
             <wp:extent cx="5120640" cy="3413760"/>
             <wp:effectExtent l="0" t="0" r="0" b="0"/>
             <wp:docPr id="16" name="Picture 16"/>
@@ -7672,7 +7704,14 @@
           <w:color w:val="4A4A4A"/>
           <w:sz w:val="17"/>
         </w:rPr>
-        <w:t>Overall signal and data flow across the board, summarizing how the preceding eight sheets connect end to end.</w:t>
+        <w:t xml:space="preserve">Overall signal and data flow across the board, summarizing how the </w:t>
+      </w:r>
+      <w:r>
+        <w:rPr>
+          <w:color w:val="4A4A4A"/>
+          <w:sz w:val="17"/>
+        </w:rPr>
+        <w:t>preceding eight sheets connect end to end.</w:t>
       </w:r>
     </w:p>
     <w:p>
@@ -7685,7 +7724,7 @@
         </w:rPr>
         <w:lastRenderedPageBreak/>
         <w:drawing>
-          <wp:inline distT="0" distB="0" distL="0" distR="0" wp14:anchorId="12385A06" wp14:editId="16E2534D">
+          <wp:inline distT="0" distB="0" distL="0" distR="0" wp14:anchorId="46D3E22C" wp14:editId="49988AD9">
             <wp:extent cx="2468880" cy="2479268"/>
             <wp:effectExtent l="0" t="0" r="0" b="0"/>
             <wp:docPr id="17" name="Picture 17"/>
@@ -7728,7 +7767,7 @@
           <w:noProof/>
         </w:rPr>
         <w:drawing>
-          <wp:inline distT="0" distB="0" distL="0" distR="0" wp14:anchorId="03A27084" wp14:editId="09C32CA2">
+          <wp:inline distT="0" distB="0" distL="0" distR="0" wp14:anchorId="7C139101" wp14:editId="15AEBBF7">
             <wp:extent cx="2468880" cy="1804956"/>
             <wp:effectExtent l="0" t="0" r="0" b="0"/>
             <wp:docPr id="18" name="Picture 18"/>
@@ -7788,29 +7827,22 @@
           <w:color w:val="4A4A4A"/>
           <w:sz w:val="17"/>
         </w:rPr>
-        <w:t>Both exported directly from the EasyEDA/</w:t>
+        <w:t>Both exported directly from the EasyEDA/JLCPCB source project (production-intent board, circular outline with six mounting holes). The 3D render sho</w:t>
       </w:r>
       <w:r>
         <w:rPr>
           <w:color w:val="4A4A4A"/>
           <w:sz w:val="17"/>
         </w:rPr>
-        <w:t>JLCPCB source project (production-intent board, circular outline with six mounting holes). The 3D render shows the ESP32-S3-WROOM module, micro-USB connector, power inductors, and 8-channel I2C header block in their real placed positions; it is an illustra</w:t>
-      </w:r>
-      <w:r>
-        <w:rPr>
-          <w:color w:val="4A4A4A"/>
-          <w:sz w:val="17"/>
-        </w:rPr>
-        <w:t>tive render, not a dimensioned drawing.</w:t>
+        <w:t>ws the ESP32-S3-WROOM module, micro-USB connector, power inductors, and 8-channel I2C header block in their real placed positions; it is an illustrative render, not a dimensioned drawing.</w:t>
       </w:r>
     </w:p>
     <w:p>
       <w:r>
-        <w:t>A dimensioned mechanical drawing sheet also exists for the enclosure's external envelope and its mounting hardware, drafted from a solid CAD model (STEP format, millimeter units) with a formal title block, orthograph</w:t>
+        <w:t>A dimensioned mechanical drawing sheet also exists for the enclosure</w:t>
       </w:r>
       <w:r>
-        <w:t>ic and isometric views, and a parts table — reproduced below.</w:t>
+        <w:t>'s external envelope and its mounting hardware, drafted from a solid CAD model (STEP format, millimeter units) with a formal title block, orthographic and isometric views, and a parts table — reproduced below.</w:t>
       </w:r>
     </w:p>
     <w:p>
@@ -7822,7 +7854,7 @@
           <w:noProof/>
         </w:rPr>
         <w:drawing>
-          <wp:inline distT="0" distB="0" distL="0" distR="0" wp14:anchorId="1F93EA91" wp14:editId="089A7A7F">
+          <wp:inline distT="0" distB="0" distL="0" distR="0" wp14:anchorId="6B6DBC15" wp14:editId="6BD56B29">
             <wp:extent cx="5669280" cy="3847707"/>
             <wp:effectExtent l="0" t="0" r="0" b="0"/>
             <wp:docPr id="19" name="Picture 19"/>
@@ -7868,7 +7900,14 @@
           <w:b/>
           <w:sz w:val="19"/>
         </w:rPr>
-        <w:t>Enclosure envelope &amp; mounting bracket — dimensioned drawing sheet</w:t>
+        <w:t>Enclosure envelope &amp; mounting bracket — dime</w:t>
+      </w:r>
+      <w:r>
+        <w:rPr>
+          <w:b/>
+          <w:sz w:val="19"/>
+        </w:rPr>
+        <w:t>nsioned drawing sheet</w:t>
       </w:r>
       <w:r>
         <w:rPr>
@@ -7882,14 +7921,7 @@
           <w:color w:val="4A4A4A"/>
           <w:sz w:val="17"/>
         </w:rPr>
-        <w:t>Orthographic and isometric views with real dimensions (enclosure neck Ø75 mm, overall probe height 191.51 mm, mounting plate 2</w:t>
-      </w:r>
-      <w:r>
-        <w:rPr>
-          <w:color w:val="4A4A4A"/>
-          <w:sz w:val="17"/>
-        </w:rPr>
-        <w:t xml:space="preserve">50×250 </w:t>
+        <w:t xml:space="preserve">Orthographic and isometric views with real dimensions (enclosure neck Ø75 mm, overall probe height 191.51 mm, mounting plate 250×250 </w:t>
       </w:r>
       <w:r>
         <w:rPr>
@@ -7897,7 +7929,14 @@
           <w:sz w:val="17"/>
         </w:rPr>
         <w:lastRenderedPageBreak/>
-        <w:t>mm with toleranced hole pattern), a U-bolt parameter table (2″/DN50, M10 thread), and a title block (drafted 31 Aug 2026). Source: dimensioned CAD drawing derived from a STEP solid model of the enclosure and bracket assembly.</w:t>
+        <w:t>mm with toleranced hole pattern), a U-bolt parameter table (2″/DN50, M10 thread), and a title block (</w:t>
+      </w:r>
+      <w:r>
+        <w:rPr>
+          <w:color w:val="4A4A4A"/>
+          <w:sz w:val="17"/>
+        </w:rPr>
+        <w:t>drafted 31 Aug 2026). Source: dimensioned CAD drawing derived from a STEP solid model of the enclosure and bracket assembly.</w:t>
       </w:r>
     </w:p>
     <w:tbl>
@@ -7970,15 +8009,7 @@
                 <w:color w:val="4A4A4A"/>
                 <w:sz w:val="18"/>
               </w:rPr>
-              <w:t>REM</w:t>
-            </w:r>
-            <w:r>
-              <w:rPr>
-                <w:b/>
-                <w:color w:val="4A4A4A"/>
-                <w:sz w:val="18"/>
-              </w:rPr>
-              <w:t>ARKS</w:t>
+              <w:t>REMARKS</w:t>
             </w:r>
           </w:p>
         </w:tc>
@@ -8034,13 +8065,13 @@
               <w:rPr>
                 <w:sz w:val="19"/>
               </w:rPr>
-              <w:t>Schematic capture and a derived 9-sheet block-diagram set exist with traceability evidence (pin-to-net mapping). Not yet issued in a released, revision-controlled drawing form</w:t>
+              <w:t>Schematic capture and a der</w:t>
             </w:r>
             <w:r>
               <w:rPr>
                 <w:sz w:val="19"/>
               </w:rPr>
-              <w:t>at with a formal drawing number.</w:t>
+              <w:t>ived 9-sheet block-diagram set exist with traceability evidence (pin-to-net mapping). Not yet issued in a released, revision-controlled drawing format with a formal drawing number.</w:t>
             </w:r>
           </w:p>
         </w:tc>
@@ -8096,13 +8127,13 @@
               <w:rPr>
                 <w:sz w:val="19"/>
               </w:rPr>
-              <w:t xml:space="preserve">Native EasyEDA/JLCPCB layout export (routed copper) and a 3D solid model exist for the same board revision. Not yet issued as a dimensioned, toleranced, released drawing with a formal </w:t>
+              <w:t xml:space="preserve">Native EasyEDA/JLCPCB layout export </w:t>
             </w:r>
             <w:r>
               <w:rPr>
                 <w:sz w:val="19"/>
               </w:rPr>
-              <w:t>drawing number.</w:t>
+              <w:t>(routed copper) and a 3D solid model exist for the same board revision. Not yet issued as a dimensioned, toleranced, released drawing with a formal drawing number.</w:t>
             </w:r>
           </w:p>
         </w:tc>
@@ -8158,13 +8189,13 @@
               <w:rPr>
                 <w:sz w:val="19"/>
               </w:rPr>
-              <w:t xml:space="preserve">A dimensioned drawing sheet exists for the enclosure/bracket mounting assembly (title block, orthographic + isometric views, parts table). It covers the external envelope and mounting hardware, not the </w:t>
+              <w:t>A dimensioned drawing sheet exists for the enclosure/b</w:t>
             </w:r>
             <w:r>
               <w:rPr>
                 <w:sz w:val="19"/>
               </w:rPr>
-              <w:t>internal PCB/component assembly sequence.</w:t>
+              <w:t>racket mounting assembly (title block, orthographic + isometric views, parts table). It covers the external envelope and mounting hardware, not the internal PCB/component assembly sequence.</w:t>
             </w:r>
           </w:p>
         </w:tc>
@@ -8236,7 +8267,14 @@
                 <w:b/>
                 <w:sz w:val="19"/>
               </w:rPr>
-              <w:t>Enclosure structure drawing (gap, length, volume)</w:t>
+              <w:t>Enclosure structure drawing</w:t>
+            </w:r>
+            <w:r>
+              <w:rPr>
+                <w:b/>
+                <w:sz w:val="19"/>
+              </w:rPr>
+              <w:t xml:space="preserve"> (gap, length, volume)</w:t>
             </w:r>
           </w:p>
         </w:tc>
@@ -8270,13 +8308,13 @@
               <w:rPr>
                 <w:sz w:val="19"/>
               </w:rPr>
-              <w:t>External envelope is dimensioned (from a real STEP solid model, millimeter units) in the drawing above. T</w:t>
+              <w:t>External envelope is dimensioned (from a real STEP solid model, millimeter units) in the drawing above. The Ex-d-specific flame-path parameters — joint gap, length, and free internal volume — are not called out; t</w:t>
             </w:r>
             <w:r>
               <w:rPr>
                 <w:sz w:val="19"/>
               </w:rPr>
-              <w:t>he Ex-d-specific flame-path parameters — joint gap, length, and free internal volume — are not called out; that dimensioning has to be added deliberately once a protection concept is confirmed (Section 2.5), not derived automatically from the CAD export.</w:t>
+              <w:t>hat dimensioning has to be added deliberately once a protection concept is confirmed (Section 2.5), not derived automatically from the CAD export.</w:t>
             </w:r>
           </w:p>
         </w:tc>
@@ -8370,21 +8408,21 @@
                 <w:color w:val="4A4A4A"/>
                 <w:sz w:val="20"/>
               </w:rPr>
-              <w:t xml:space="preserve">Real dimensioned CAD drawings now exist for the enclosure's external envelope and mounting hardware, and native PCB layout/schematic source files exist for the </w:t>
+              <w:t xml:space="preserve">Real dimensioned CAD </w:t>
             </w:r>
             <w:r>
               <w:rPr>
                 <w:color w:val="4A4A4A"/>
                 <w:sz w:val="20"/>
               </w:rPr>
-              <w:t>electronics. What is still missing for a certifiable drawing package: internal component/assembly drawings, junction box and grounding-connection drawings, and — specific to explosion protection — flame-path gap/length/volume dimensioning, which requires a</w:t>
+              <w:t xml:space="preserve">drawings now exist for the enclosure's external envelope and mounting hardware, and native PCB layout/schematic source files exist for the electronics. What is still missing for a certifiable drawing package: internal component/assembly drawings, junction </w:t>
             </w:r>
             <w:r>
               <w:rPr>
                 <w:color w:val="4A4A4A"/>
                 <w:sz w:val="20"/>
               </w:rPr>
-              <w:t xml:space="preserve"> confirmed protection concept before it can be drawn.</w:t>
+              <w:t>box and grounding-connection drawings, and — specific to explosion protection — flame-path gap/length/volume dimensioning, which requires a confirmed protection concept before it can be drawn.</w:t>
             </w:r>
           </w:p>
         </w:tc>
@@ -8399,39 +8437,39 @@
       <w:pPr>
         <w:pStyle w:val="Heading3"/>
       </w:pPr>
-      <w:bookmarkStart w:id="13" w:name="_Toc240058094"/>
+      <w:bookmarkStart w:id="13" w:name="_Toc240058965"/>
       <w:r>
-        <w:t>2.6.b · Bill of Materials (BOM) for Explosion-Safety-Relevant Components</w:t>
+        <w:t xml:space="preserve">2.6.b · Bill of Materials (BOM) for </w:t>
+      </w:r>
+      <w:r>
+        <w:t>Explosion-Safety-Relevant Components</w:t>
       </w:r>
       <w:bookmarkEnd w:id="13"/>
     </w:p>
     <w:p>
       <w:r>
-        <w:t xml:space="preserve">A complete, itemized electronic-component BOM for both the main board and the external sensor board now exists, </w:t>
+        <w:t xml:space="preserve">A complete, itemized electronic-component BOM for both the main board and the external sensor board now exists, exported directly from the EasyEDA/JLCPCB source project (manufacturer, manufacturer part number, and LCSC </w:t>
       </w:r>
       <w:r>
-        <w:t xml:space="preserve">exported directly from the EasyEDA/JLCPCB source project (manufacturer, manufacturer part number, and LCSC supplier part number for each line item; 89 line items / 214 placed components on the main board, 14 line items / 24 placed components on the sensor </w:t>
+        <w:t>supplier part number for each line item; 89 line items / 214 placed components on the main board, 14 line items / 24 placed components on the sensor board — full tables below). This is real, traceable sourcing data and materially improves on the previous s</w:t>
       </w:r>
       <w:r>
-        <w:t>board — full tables below). This is real, traceable sourcing data and materially improves on the previous status.</w:t>
+        <w:t>tatus.</w:t>
       </w:r>
     </w:p>
     <w:p>
       <w:r>
         <w:lastRenderedPageBreak/>
-        <w:t>It does not, however, satisfy this checklist item as written. The checklist asks specifically for the explosion-safety-relevant BOM — enclosur</w:t>
+        <w:t>It does not, however, satisfy this checklist item as written. The checklist asks specifically for the explosion-safety-relevant BOM — enclosure, gaskets, terminals, cable entry devices, switches, light sources, battery, potting compound, and plastic</w:t>
       </w:r>
       <w:r>
-        <w:t>e, gaskets, terminals, cable entry devices, switches, light sources, battery, potting compound, and plastic parts, each with material grade and Ex/UL/CCC certification status. None of those mechanical/safety items appear in an electronic CAD BOM: the enclo</w:t>
+        <w:t xml:space="preserve"> parts, each with material grade and Ex/UL/CCC certification status. None of those mechanical/safety items appear in an electronic CAD BOM: the enclosure is present only as a placeholder mechanical symbol (designator U50, no manufacturer or dimensional dat</w:t>
       </w:r>
       <w:r>
-        <w:t>sure is present only as a placeholder mechanical symbol (designator U50, no manufacturer or dimensional data attached), and the gas sensor itself (MQ2, designator I1) has no manufacturer or supplier part number recorded — it is sourced outside the LCSC/JLC</w:t>
+        <w:t xml:space="preserve">a attached), and the gas sensor itself (MQ2, designator I1) has no manufacturer or supplier part number recorded — it is sourced outside the LCSC/JLCPCB supply chain and its Ex status is unverified. Comparative research on Ex-rated enclosure products from </w:t>
       </w:r>
       <w:r>
-        <w:t>PCB supply chain and its Ex status is unverified. Comparative research on Ex-rated enclosure products from other manufacturers exists internally as a reference for target specifications only — it describes third-party products, not this product's actual co</w:t>
-      </w:r>
-      <w:r>
-        <w:t>mponents, and is not included here.</w:t>
+        <w:t>other manufacturers exists internally as a reference for target specifications only — it describes third-party products, not this product's actual components, and is not included here.</w:t>
       </w:r>
     </w:p>
     <w:tbl>
@@ -19282,7 +19320,14 @@
                 <w:color w:val="4A4A4A"/>
                 <w:sz w:val="20"/>
               </w:rPr>
-              <w:t>erial grade and Ex/UL/CCC certification for each — remains not yet compiled, because those mechanical/safety parts are not represented in an electronic design BOM.</w:t>
+              <w:t>erial grade and Ex/UL/CCC certification for each — remains not yet compiled. These are mechanical/safety parts, not electronic components: the enclosure itself is under design by an external mechanical/casing development partner and its bill of materials h</w:t>
+            </w:r>
+            <w:r>
+              <w:rPr>
+                <w:color w:val="4A4A4A"/>
+                <w:sz w:val="20"/>
+              </w:rPr>
+              <w:t>as not yet been provided to the authors.</w:t>
             </w:r>
           </w:p>
         </w:tc>
@@ -19297,7 +19342,7 @@
       <w:pPr>
         <w:pStyle w:val="Heading3"/>
       </w:pPr>
-      <w:bookmarkStart w:id="14" w:name="_Toc240058095"/>
+      <w:bookmarkStart w:id="14" w:name="_Toc240058966"/>
       <w:r>
         <w:lastRenderedPageBreak/>
         <w:t>2.6.c · Material Specification Sheets / Datasheets (Non-Metallic Materials)</w:t>
@@ -19306,10 +19351,10 @@
     </w:p>
     <w:p>
       <w:r>
-        <w:t>Datasheets or supplier conformity declarations for non-metallic materials (enclosure components, seals, insulators, potting compounds) — covering heat/cold resistance, anti-aging, anti-static, flame retardancy, CTI value, and chemical resistance — have not</w:t>
+        <w:t xml:space="preserve">Datasheets or supplier conformity declarations for non-metallic materials (enclosure components, seals, insulators, potting </w:t>
       </w:r>
       <w:r>
-        <w:t xml:space="preserve"> yet been collected.</w:t>
+        <w:t>compounds) — covering heat/cold resistance, anti-aging, anti-static, flame retardancy, CTI value, and chemical resistance — have not yet been collected.</w:t>
       </w:r>
     </w:p>
     <w:tbl>
@@ -19345,7 +19390,14 @@
                 <w:color w:val="4A4A4A"/>
                 <w:sz w:val="20"/>
               </w:rPr>
-              <w:t>Status: Not yet available.</w:t>
+              <w:t>Status: Not yet available. Dependent on the enclosure design and material selection, which sits with th</w:t>
+            </w:r>
+            <w:r>
+              <w:rPr>
+                <w:color w:val="4A4A4A"/>
+                <w:sz w:val="20"/>
+              </w:rPr>
+              <w:t>e external casing development partner rather than the authors.</w:t>
             </w:r>
           </w:p>
         </w:tc>
@@ -19360,7 +19412,7 @@
       <w:pPr>
         <w:pStyle w:val="Heading3"/>
       </w:pPr>
-      <w:bookmarkStart w:id="15" w:name="_Toc240058096"/>
+      <w:bookmarkStart w:id="15" w:name="_Toc240058967"/>
       <w:r>
         <w:t>2.6.d · Manufacturing Process Description</w:t>
       </w:r>
@@ -19368,10 +19420,10 @@
     </w:p>
     <w:p>
       <w:r>
-        <w:t xml:space="preserve">A description of manufacturing processes relevant to explosion-protection safety (enclosure machining accuracy control, explosion-proof surface treatment, welding, </w:t>
+        <w:t>A description of manufacturing processes relevant to explosion-protection safety (enclosure machining accuracy control, explosion-proof surface treat</w:t>
       </w:r>
       <w:r>
-        <w:t>potting, die-casting, bonding) has not yet been documented.</w:t>
+        <w:t>ment, welding, potting, die-casting, bonding) has not yet been documented.</w:t>
       </w:r>
     </w:p>
     <w:tbl>
@@ -19407,7 +19459,14 @@
                 <w:color w:val="4A4A4A"/>
                 <w:sz w:val="20"/>
               </w:rPr>
-              <w:t>Status: Not yet available.</w:t>
+              <w:t xml:space="preserve">Status: Not yet available. This describes the casing partner's manufacturing process, not an internal electronics process — it will need to be obtained from that partner once their </w:t>
+            </w:r>
+            <w:r>
+              <w:rPr>
+                <w:color w:val="4A4A4A"/>
+                <w:sz w:val="20"/>
+              </w:rPr>
+              <w:t>process is finalized.</w:t>
             </w:r>
           </w:p>
         </w:tc>
@@ -19422,7 +19481,7 @@
       <w:pPr>
         <w:pStyle w:val="Heading3"/>
       </w:pPr>
-      <w:bookmarkStart w:id="16" w:name="_Toc240058097"/>
+      <w:bookmarkStart w:id="16" w:name="_Toc240058968"/>
       <w:r>
         <w:t>2.6.e · Explosion-Protection Calculations and Explanations (if applicable)</w:t>
       </w:r>
@@ -19430,10 +19489,10 @@
     </w:p>
     <w:p>
       <w:r>
-        <w:t>Calculations depend on the explosion-protection concept selected (e.g., Ex d, Ex e, Ex i), w</w:t>
+        <w:t>Calculations depend on the explosion-protection concept selected (e.g., Ex d, Ex e, Ex i), which has not yet been confirmed with the ExCB, and on final enclo</w:t>
       </w:r>
       <w:r>
-        <w:t>hich has not yet been confirmed with the ExCB. No calculations have been performed.</w:t>
+        <w:t>sure geometry from the casing development partner. No calculations have been performed.</w:t>
       </w:r>
     </w:p>
     <w:tbl>
@@ -19469,7 +19528,7 @@
                 <w:color w:val="4A4A4A"/>
                 <w:sz w:val="20"/>
               </w:rPr>
-              <w:t>Status: Not yet available — pending protection-concept confirmation.</w:t>
+              <w:t>Status: Not yet available — pending protection-concept confirmation and final enclosure design.</w:t>
             </w:r>
           </w:p>
         </w:tc>
@@ -19484,24 +19543,24 @@
       <w:pPr>
         <w:pStyle w:val="Heading3"/>
       </w:pPr>
-      <w:bookmarkStart w:id="17" w:name="_Toc240058098"/>
+      <w:bookmarkStart w:id="17" w:name="_Toc240058969"/>
       <w:r>
-        <w:t>2.6.f · Temperature Group Calculation (Hottest-Point Temperature Estimation)</w:t>
+        <w:t xml:space="preserve">2.6.f · Temperature Group Calculation (Hottest-Point </w:t>
+      </w:r>
+      <w:r>
+        <w:t>Temperature Estimation)</w:t>
       </w:r>
       <w:bookmarkEnd w:id="17"/>
     </w:p>
     <w:p>
       <w:r>
-        <w:t xml:space="preserve">No </w:t>
+        <w:t>No hottest-point temperature calculation or measurement has been performed for this product. As general context: MQ-series metal-oxide gas sensors operate using an internal heating element, a class of sensor commonly associated with</w:t>
       </w:r>
       <w:r>
-        <w:t>hottest-point temperature calculation or measurement has been performed for this product. As general context: MQ-series metal-oxide gas sensors operate using an internal heating element, a class of sensor commonly associated with published operating temper</w:t>
+        <w:t xml:space="preserve"> published operating temperatures in the approximate 200–400°C range — however, this is a general characteristic of the sensor class, not a measured value for the specific sensor models, drive circuitry, and enclosure configuration used in this product. A </w:t>
       </w:r>
       <w:r>
-        <w:t>atures in the approximate 200–400°C range — however, this is a general characteristic of the sensor class, not a measured value for the specific sensor models, drive circuitry, and enclosure configuration used in this product. A worst-case hot-spot measure</w:t>
-      </w:r>
-      <w:r>
-        <w:t>ment is identified as the top-priority action required to substantiate the recommended T4 classification in Section 2.5.</w:t>
+        <w:t>worst-case hot-spot measurement is identified as the top-priority action required to substantiate the recommended T4 classification in Section 2.5.</w:t>
       </w:r>
     </w:p>
     <w:tbl>
@@ -19552,7 +19611,7 @@
       <w:pPr>
         <w:pStyle w:val="Heading3"/>
       </w:pPr>
-      <w:bookmarkStart w:id="18" w:name="_Toc240058099"/>
+      <w:bookmarkStart w:id="18" w:name="_Toc240058970"/>
       <w:r>
         <w:t>2.6.g · Usage and Installation Instructions (Draft)</w:t>
       </w:r>
@@ -19650,7 +19709,14 @@
                 <w:b/>
                 <w:sz w:val="19"/>
               </w:rPr>
-              <w:t>a) Safety warnings</w:t>
+              <w:t>a)</w:t>
+            </w:r>
+            <w:r>
+              <w:rPr>
+                <w:b/>
+                <w:sz w:val="19"/>
+              </w:rPr>
+              <w:t xml:space="preserve"> Safety warnings</w:t>
             </w:r>
           </w:p>
         </w:tc>
@@ -19668,15 +19734,7 @@
                 <w:color w:val="B02A37"/>
                 <w:sz w:val="19"/>
               </w:rPr>
-              <w:t>Not yet av</w:t>
-            </w:r>
-            <w:r>
-              <w:rPr>
-                <w:b/>
-                <w:color w:val="B02A37"/>
-                <w:sz w:val="19"/>
-              </w:rPr>
-              <w:t>ailable</w:t>
+              <w:t>Not yet available</w:t>
             </w:r>
           </w:p>
         </w:tc>
@@ -19748,13 +19806,20 @@
               <w:rPr>
                 <w:sz w:val="19"/>
               </w:rPr>
-              <w:t xml:space="preserve">A mechanical mounting method exists separately (L-bracket, installed to existing structures </w:t>
+              <w:t xml:space="preserve">A mechanical mounting method exists separately (L-bracket, installed to </w:t>
             </w:r>
             <w:r>
               <w:rPr>
                 <w:sz w:val="19"/>
               </w:rPr>
-              <w:t>without drilling or welding — see Section 2.3.c), but cable-entry method, torque values, grounding requirements, and cleaning requirements have not yet been formally specified.</w:t>
+              <w:t xml:space="preserve">existing structures without drilling or welding — see Section 2.3.c), but cable-entry method, torque values, grounding </w:t>
+            </w:r>
+            <w:r>
+              <w:rPr>
+                <w:sz w:val="19"/>
+              </w:rPr>
+              <w:lastRenderedPageBreak/>
+              <w:t>requirements, and cleaning requirements have not yet been formally specified.</w:t>
             </w:r>
           </w:p>
         </w:tc>
@@ -19776,15 +19841,8 @@
                 <w:b/>
                 <w:sz w:val="19"/>
               </w:rPr>
-              <w:t xml:space="preserve">c) Operating instructions and </w:t>
-            </w:r>
-            <w:r>
-              <w:rPr>
-                <w:b/>
-                <w:sz w:val="19"/>
-              </w:rPr>
               <w:lastRenderedPageBreak/>
-              <w:t>maintenance requirements</w:t>
+              <w:t>c) Operating instructions and maintenance requirements</w:t>
             </w:r>
           </w:p>
         </w:tc>
@@ -19802,45 +19860,29 @@
                 <w:color w:val="B56A1E"/>
                 <w:sz w:val="19"/>
               </w:rPr>
-              <w:lastRenderedPageBreak/>
-              <w:t xml:space="preserve">Partially </w:t>
-            </w:r>
-            <w:r>
-              <w:rPr>
-                <w:b/>
-                <w:color w:val="B56A1E"/>
+              <w:t>Partially available</w:t>
+            </w:r>
+          </w:p>
+        </w:tc>
+        <w:tc>
+          <w:tcPr>
+            <w:tcW w:w="4320" w:type="dxa"/>
+          </w:tcPr>
+          <w:p>
+            <w:pPr>
+              <w:spacing w:after="40"/>
+            </w:pPr>
+            <w:r>
+              <w:rPr>
                 <w:sz w:val="19"/>
               </w:rPr>
-              <w:t>available</w:t>
-            </w:r>
-          </w:p>
-        </w:tc>
-        <w:tc>
-          <w:tcPr>
-            <w:tcW w:w="4320" w:type="dxa"/>
-          </w:tcPr>
-          <w:p>
-            <w:pPr>
-              <w:spacing w:after="40"/>
-            </w:pPr>
+              <w:t>A firmware command/operation reference exists (Serial, MQTT, and LoRa command protocol for engineering use), but it covers software operation and commissioning — not Ex-specific maintenance or inspection requirements (frequency, content</w:t>
+            </w:r>
             <w:r>
               <w:rPr>
                 <w:sz w:val="19"/>
               </w:rPr>
-              <w:t xml:space="preserve">A firmware command/operation reference exists </w:t>
-            </w:r>
-            <w:r>
-              <w:rPr>
-                <w:sz w:val="19"/>
-              </w:rPr>
-              <w:lastRenderedPageBreak/>
-              <w:t>(Serial, MQTT, and LoRa command protocol for engineering use), but it covers software operation and commissioning — not Ex-specific maintenance or inspection requirements (frequency, content, precauti</w:t>
-            </w:r>
-            <w:r>
-              <w:rPr>
-                <w:sz w:val="19"/>
-              </w:rPr>
-              <w:t>ons).</w:t>
+              <w:t>, precautions).</w:t>
             </w:r>
           </w:p>
         </w:tc>
@@ -19899,7 +19941,7 @@
       <w:pPr>
         <w:pStyle w:val="Heading3"/>
       </w:pPr>
-      <w:bookmarkStart w:id="19" w:name="_Toc240058100"/>
+      <w:bookmarkStart w:id="19" w:name="_Toc240058971"/>
       <w:r>
         <w:t>2.6.h · Nameplate Information</w:t>
       </w:r>
@@ -19907,10 +19949,10 @@
     </w:p>
     <w:p>
       <w:r>
-        <w:t xml:space="preserve">Nameplate artwork cannot yet be finalized: it depends on the certificate number, </w:t>
+        <w:t xml:space="preserve">Nameplate artwork cannot yet be finalized: it depends on the certificate </w:t>
       </w:r>
       <w:r>
-        <w:t>protection marking, temperature class, ambient range, IP rating, and serialization scheme — none of which has been assigned yet.</w:t>
+        <w:t>number, protection marking, temperature class, ambient range, IP rating, and serialization scheme — none of which has been assigned yet.</w:t>
       </w:r>
     </w:p>
     <w:tbl>
@@ -19961,7 +20003,7 @@
       <w:pPr>
         <w:pStyle w:val="Heading3"/>
       </w:pPr>
-      <w:bookmarkStart w:id="20" w:name="_Toc240058101"/>
+      <w:bookmarkStart w:id="20" w:name="_Toc240058972"/>
       <w:r>
         <w:t>2.6.i · Ex Component Certificates</w:t>
       </w:r>
@@ -19969,10 +20011,10 @@
     </w:p>
     <w:p>
       <w:r>
-        <w:t>No components in this design currently hold an Ex component cert</w:t>
+        <w:t>No components in this design currently hold an Ex compon</w:t>
       </w:r>
       <w:r>
-        <w:t>ificate. As noted in Section 2.3.b, the processing unit (ESP32-S3-WROOM-1U-N16R8) and the communication module (E22-900MM22S) hold RF/EMC certifications (FCC, TELEC, CE, RoHS) — these are not Ex component certificates and do not satisfy this item.</w:t>
+        <w:t>ent certificate. As noted in Section 2.3.b, the processing unit (ESP32-S3-WROOM-1U-N16R8) and the communication module (E22-900MM22S) hold RF/EMC certifications (FCC, TELEC, CE, RoHS) — these are not Ex component certificates and do not satisfy this item.</w:t>
       </w:r>
     </w:p>
     <w:tbl>
@@ -20008,14 +20050,7 @@
                 <w:color w:val="4A4A4A"/>
                 <w:sz w:val="20"/>
               </w:rPr>
-              <w:t xml:space="preserve">Status: </w:t>
-            </w:r>
-            <w:r>
-              <w:rPr>
-                <w:color w:val="4A4A4A"/>
-                <w:sz w:val="20"/>
-              </w:rPr>
-              <w:t>Not yet available.</w:t>
+              <w:t>Status: Not yet available.</w:t>
             </w:r>
           </w:p>
         </w:tc>
@@ -20030,7 +20065,7 @@
       <w:pPr>
         <w:pStyle w:val="Heading1"/>
       </w:pPr>
-      <w:bookmarkStart w:id="21" w:name="_Toc240058102"/>
+      <w:bookmarkStart w:id="21" w:name="_Toc240058973"/>
       <w:r>
         <w:t>3. Sample Information</w:t>
       </w:r>
@@ -20045,7 +20080,7 @@
       <w:pPr>
         <w:pStyle w:val="Heading2"/>
       </w:pPr>
-      <w:bookmarkStart w:id="22" w:name="_Toc240058103"/>
+      <w:bookmarkStart w:id="22" w:name="_Toc240058974"/>
       <w:r>
         <w:t>3.1 · Model, Serial Number, and Status</w:t>
       </w:r>
@@ -20053,13 +20088,13 @@
     </w:p>
     <w:p>
       <w:r>
-        <w:t>No formal sample r</w:t>
+        <w:t xml:space="preserve">No formal </w:t>
       </w:r>
       <w:r>
-        <w:t xml:space="preserve">egister or dossier for ExCB submission has been established. Internal engineering and bench testing reference the “GLD V2” board configuration under firmware environment gld_v2; a discrete unit serial-numbering scheme for certification samples has not yet </w:t>
+        <w:t xml:space="preserve">sample register or dossier for ExCB submission has been established. Internal engineering and bench testing reference the “GLD V2” board configuration under firmware environment gld_v2; a discrete unit serial-numbering scheme for certification samples has </w:t>
       </w:r>
       <w:r>
-        <w:t>been implemented.</w:t>
+        <w:t>not yet been implemented.</w:t>
       </w:r>
     </w:p>
     <w:tbl>
@@ -20095,7 +20130,14 @@
                 <w:color w:val="4A4A4A"/>
                 <w:sz w:val="20"/>
               </w:rPr>
-              <w:t>Status: Not yet available.</w:t>
+              <w:t>Status: Not yet available. The product is still being built from scratch at prototype/development stage; no finalized, serialized unit yet exists to register as a submission sample. This item becomes actionable once a build reache</w:t>
+            </w:r>
+            <w:r>
+              <w:rPr>
+                <w:color w:val="4A4A4A"/>
+                <w:sz w:val="20"/>
+              </w:rPr>
+              <w:t>s a stable, submission-ready configuration.</w:t>
             </w:r>
           </w:p>
         </w:tc>
@@ -20110,18 +20152,19 @@
       <w:pPr>
         <w:pStyle w:val="Heading2"/>
       </w:pPr>
-      <w:bookmarkStart w:id="23" w:name="_Toc240058104"/>
+      <w:bookmarkStart w:id="23" w:name="_Toc240058975"/>
       <w:r>
+        <w:lastRenderedPageBreak/>
         <w:t>3.2 · Test Fixtures and Auxiliary Equipment</w:t>
       </w:r>
       <w:bookmarkEnd w:id="23"/>
     </w:p>
     <w:p>
       <w:r>
-        <w:t>A draft internal functional test plan identifies the minimum equipment anticipated for bench-level verification (this plan has not yet been executed and is not evide</w:t>
+        <w:t>A draft internal functional test plan identifies the minimum equipment anticipated for bench-level verification (this plan has not yet been executed and is not eviden</w:t>
       </w:r>
       <w:r>
-        <w:t>nce of lab readiness):</w:t>
+        <w:t>ce of lab readiness):</w:t>
       </w:r>
     </w:p>
     <w:tbl>
@@ -20196,7 +20239,6 @@
                 <w:b/>
                 <w:sz w:val="19"/>
               </w:rPr>
-              <w:lastRenderedPageBreak/>
               <w:t>Firmware / serial</w:t>
             </w:r>
           </w:p>
@@ -32263,7 +32305,7 @@
     <w:autoRedefine/>
     <w:uiPriority w:val="39"/>
     <w:unhideWhenUsed/>
-    <w:rsid w:val="008C582B"/>
+    <w:rsid w:val="00D52912"/>
     <w:pPr>
       <w:spacing w:after="100"/>
     </w:pPr>
@@ -32275,7 +32317,7 @@
     <w:autoRedefine/>
     <w:uiPriority w:val="39"/>
     <w:unhideWhenUsed/>
-    <w:rsid w:val="008C582B"/>
+    <w:rsid w:val="00D52912"/>
     <w:pPr>
       <w:spacing w:after="100"/>
       <w:ind w:left="210"/>
@@ -32288,7 +32330,7 @@
     <w:autoRedefine/>
     <w:uiPriority w:val="39"/>
     <w:unhideWhenUsed/>
-    <w:rsid w:val="008C582B"/>
+    <w:rsid w:val="00D52912"/>
     <w:pPr>
       <w:spacing w:after="100"/>
       <w:ind w:left="420"/>
@@ -32299,7 +32341,7 @@
     <w:basedOn w:val="DefaultParagraphFont"/>
     <w:uiPriority w:val="99"/>
     <w:unhideWhenUsed/>
-    <w:rsid w:val="008C582B"/>
+    <w:rsid w:val="00D52912"/>
     <w:rPr>
       <w:color w:val="0000FF" w:themeColor="hyperlink"/>
       <w:u w:val="single"/>

</xml_diff>

<commit_message>
Fix DOCX layout: product photo grid wasted 2 pages
Photos were inserted at a fixed width=2.75in with no height cap.
Most source photos are extreme portrait (aspect ~0.45), so each
rendered ~6.1in tall - only one row (2 photos) fit per page, leaving
each page roughly 35-40% blank. Added add_picture_fit() (PIL-based)
that scales each photo to fit within a 2.75x2.5in box while
preserving aspect ratio. The 7-photo gallery now packs 2 rows per
page instead of 1.

PDF/DOCX: 25 -> 23 pages. Margins and TOC/page-break structure were
reviewed and left unchanged - they were not the problem.

Co-Authored-By: Claude Sonnet 5 <noreply@anthropic.com>
</commit_message>
<xml_diff>
--- a/Deliverables/Dokumen_Teknis_Sertifikasi_GLD_IECEx_ATEX.docx
+++ b/Deliverables/Dokumen_Teknis_Sertifikasi_GLD_IECEx_ATEX.docx
@@ -692,7 +692,7 @@
       <w:r>
         <w:fldChar w:fldCharType="separate"/>
       </w:r>
-      <w:hyperlink w:anchor="_Toc240058952" w:history="1">
+      <w:hyperlink w:anchor="_Toc240059764" w:history="1">
         <w:r>
           <w:rPr>
             <w:rStyle w:val="Hyperlink"/>
@@ -719,7 +719,7 @@
             <w:noProof/>
             <w:webHidden/>
           </w:rPr>
-          <w:instrText xml:space="preserve"> PAGEREF _Toc240058952 \h </w:instrText>
+          <w:instrText xml:space="preserve"> PAGEREF _Toc240059764 \h </w:instrText>
         </w:r>
         <w:r>
           <w:rPr>
@@ -764,7 +764,7 @@
           <w:lang w:val="en-ID" w:eastAsia="en-ID"/>
         </w:rPr>
       </w:pPr>
-      <w:hyperlink w:anchor="_Toc240058953" w:history="1">
+      <w:hyperlink w:anchor="_Toc240059765" w:history="1">
         <w:r>
           <w:rPr>
             <w:rStyle w:val="Hyperlink"/>
@@ -791,7 +791,7 @@
             <w:noProof/>
             <w:webHidden/>
           </w:rPr>
-          <w:instrText xml:space="preserve"> PAGEREF _Toc240058953 \h </w:instrText>
+          <w:instrText xml:space="preserve"> PAGEREF _Toc240059765 \h </w:instrText>
         </w:r>
         <w:r>
           <w:rPr>
@@ -836,7 +836,7 @@
           <w:lang w:val="en-ID" w:eastAsia="en-ID"/>
         </w:rPr>
       </w:pPr>
-      <w:hyperlink w:anchor="_Toc240058954" w:history="1">
+      <w:hyperlink w:anchor="_Toc240059766" w:history="1">
         <w:r>
           <w:rPr>
             <w:rStyle w:val="Hyperlink"/>
@@ -863,7 +863,7 @@
             <w:noProof/>
             <w:webHidden/>
           </w:rPr>
-          <w:instrText xml:space="preserve"> PAGEREF _Toc240058954 \h </w:instrText>
+          <w:instrText xml:space="preserve"> PAGEREF _Toc240059766 \h </w:instrText>
         </w:r>
         <w:r>
           <w:rPr>
@@ -908,7 +908,7 @@
           <w:lang w:val="en-ID" w:eastAsia="en-ID"/>
         </w:rPr>
       </w:pPr>
-      <w:hyperlink w:anchor="_Toc240058955" w:history="1">
+      <w:hyperlink w:anchor="_Toc240059767" w:history="1">
         <w:r>
           <w:rPr>
             <w:rStyle w:val="Hyperlink"/>
@@ -935,7 +935,7 @@
             <w:noProof/>
             <w:webHidden/>
           </w:rPr>
-          <w:instrText xml:space="preserve"> PAGEREF _Toc240058955 \h </w:instrText>
+          <w:instrText xml:space="preserve"> PAGEREF _Toc240059767 \h </w:instrText>
         </w:r>
         <w:r>
           <w:rPr>
@@ -980,7 +980,7 @@
           <w:lang w:val="en-ID" w:eastAsia="en-ID"/>
         </w:rPr>
       </w:pPr>
-      <w:hyperlink w:anchor="_Toc240058956" w:history="1">
+      <w:hyperlink w:anchor="_Toc240059768" w:history="1">
         <w:r>
           <w:rPr>
             <w:rStyle w:val="Hyperlink"/>
@@ -1007,7 +1007,7 @@
             <w:noProof/>
             <w:webHidden/>
           </w:rPr>
-          <w:instrText xml:space="preserve"> PAGEREF _Toc240058956 \h </w:instrText>
+          <w:instrText xml:space="preserve"> PAGEREF _Toc240059768 \h </w:instrText>
         </w:r>
         <w:r>
           <w:rPr>
@@ -1052,7 +1052,7 @@
           <w:lang w:val="en-ID" w:eastAsia="en-ID"/>
         </w:rPr>
       </w:pPr>
-      <w:hyperlink w:anchor="_Toc240058957" w:history="1">
+      <w:hyperlink w:anchor="_Toc240059769" w:history="1">
         <w:r>
           <w:rPr>
             <w:rStyle w:val="Hyperlink"/>
@@ -1079,7 +1079,7 @@
             <w:noProof/>
             <w:webHidden/>
           </w:rPr>
-          <w:instrText xml:space="preserve"> PAGEREF _Toc240058957 \h </w:instrText>
+          <w:instrText xml:space="preserve"> PAGEREF _Toc240059769 \h </w:instrText>
         </w:r>
         <w:r>
           <w:rPr>
@@ -1124,7 +1124,7 @@
           <w:lang w:val="en-ID" w:eastAsia="en-ID"/>
         </w:rPr>
       </w:pPr>
-      <w:hyperlink w:anchor="_Toc240058958" w:history="1">
+      <w:hyperlink w:anchor="_Toc240059770" w:history="1">
         <w:r>
           <w:rPr>
             <w:rStyle w:val="Hyperlink"/>
@@ -1151,7 +1151,7 @@
             <w:noProof/>
             <w:webHidden/>
           </w:rPr>
-          <w:instrText xml:space="preserve"> PAGEREF _Toc240058958 \h </w:instrText>
+          <w:instrText xml:space="preserve"> PAGEREF _Toc240059770 \h </w:instrText>
         </w:r>
         <w:r>
           <w:rPr>
@@ -1196,7 +1196,7 @@
           <w:lang w:val="en-ID" w:eastAsia="en-ID"/>
         </w:rPr>
       </w:pPr>
-      <w:hyperlink w:anchor="_Toc240058959" w:history="1">
+      <w:hyperlink w:anchor="_Toc240059771" w:history="1">
         <w:r>
           <w:rPr>
             <w:rStyle w:val="Hyperlink"/>
@@ -1223,7 +1223,7 @@
             <w:noProof/>
             <w:webHidden/>
           </w:rPr>
-          <w:instrText xml:space="preserve"> PAGEREF _Toc240058959 \h </w:instrText>
+          <w:instrText xml:space="preserve"> PAGEREF _Toc240059771 \h </w:instrText>
         </w:r>
         <w:r>
           <w:rPr>
@@ -1268,7 +1268,7 @@
           <w:lang w:val="en-ID" w:eastAsia="en-ID"/>
         </w:rPr>
       </w:pPr>
-      <w:hyperlink w:anchor="_Toc240058960" w:history="1">
+      <w:hyperlink w:anchor="_Toc240059772" w:history="1">
         <w:r>
           <w:rPr>
             <w:rStyle w:val="Hyperlink"/>
@@ -1295,7 +1295,7 @@
             <w:noProof/>
             <w:webHidden/>
           </w:rPr>
-          <w:instrText xml:space="preserve"> PAGEREF _Toc240058960 \h </w:instrText>
+          <w:instrText xml:space="preserve"> PAGEREF _Toc240059772 \h </w:instrText>
         </w:r>
         <w:r>
           <w:rPr>
@@ -1340,7 +1340,7 @@
           <w:lang w:val="en-ID" w:eastAsia="en-ID"/>
         </w:rPr>
       </w:pPr>
-      <w:hyperlink w:anchor="_Toc240058961" w:history="1">
+      <w:hyperlink w:anchor="_Toc240059773" w:history="1">
         <w:r>
           <w:rPr>
             <w:rStyle w:val="Hyperlink"/>
@@ -1367,7 +1367,7 @@
             <w:noProof/>
             <w:webHidden/>
           </w:rPr>
-          <w:instrText xml:space="preserve"> PAGEREF _Toc240058961 \h </w:instrText>
+          <w:instrText xml:space="preserve"> PAGEREF _Toc240059773 \h </w:instrText>
         </w:r>
         <w:r>
           <w:rPr>
@@ -1412,7 +1412,7 @@
           <w:lang w:val="en-ID" w:eastAsia="en-ID"/>
         </w:rPr>
       </w:pPr>
-      <w:hyperlink w:anchor="_Toc240058962" w:history="1">
+      <w:hyperlink w:anchor="_Toc240059774" w:history="1">
         <w:r>
           <w:rPr>
             <w:rStyle w:val="Hyperlink"/>
@@ -1439,7 +1439,7 @@
             <w:noProof/>
             <w:webHidden/>
           </w:rPr>
-          <w:instrText xml:space="preserve"> PAGEREF _Toc240058962 \h </w:instrText>
+          <w:instrText xml:space="preserve"> PAGEREF _Toc240059774 \h </w:instrText>
         </w:r>
         <w:r>
           <w:rPr>
@@ -1459,7 +1459,7 @@
             <w:noProof/>
             <w:webHidden/>
           </w:rPr>
-          <w:t>12</w:t>
+          <w:t>9</w:t>
         </w:r>
         <w:r>
           <w:rPr>
@@ -1484,7 +1484,7 @@
           <w:lang w:val="en-ID" w:eastAsia="en-ID"/>
         </w:rPr>
       </w:pPr>
-      <w:hyperlink w:anchor="_Toc240058963" w:history="1">
+      <w:hyperlink w:anchor="_Toc240059775" w:history="1">
         <w:r>
           <w:rPr>
             <w:rStyle w:val="Hyperlink"/>
@@ -1511,7 +1511,7 @@
             <w:noProof/>
             <w:webHidden/>
           </w:rPr>
-          <w:instrText xml:space="preserve"> PAGEREF _Toc240058963 \h </w:instrText>
+          <w:instrText xml:space="preserve"> PAGEREF _Toc240059775 \h </w:instrText>
         </w:r>
         <w:r>
           <w:rPr>
@@ -1531,7 +1531,7 @@
             <w:noProof/>
             <w:webHidden/>
           </w:rPr>
-          <w:t>12</w:t>
+          <w:t>10</w:t>
         </w:r>
         <w:r>
           <w:rPr>
@@ -1556,7 +1556,7 @@
           <w:lang w:val="en-ID" w:eastAsia="en-ID"/>
         </w:rPr>
       </w:pPr>
-      <w:hyperlink w:anchor="_Toc240058964" w:history="1">
+      <w:hyperlink w:anchor="_Toc240059776" w:history="1">
         <w:r>
           <w:rPr>
             <w:rStyle w:val="Hyperlink"/>
@@ -1583,7 +1583,7 @@
             <w:noProof/>
             <w:webHidden/>
           </w:rPr>
-          <w:instrText xml:space="preserve"> PAGEREF _Toc240058964 \h </w:instrText>
+          <w:instrText xml:space="preserve"> PAGEREF _Toc240059776 \h </w:instrText>
         </w:r>
         <w:r>
           <w:rPr>
@@ -1603,7 +1603,7 @@
             <w:noProof/>
             <w:webHidden/>
           </w:rPr>
-          <w:t>13</w:t>
+          <w:t>10</w:t>
         </w:r>
         <w:r>
           <w:rPr>
@@ -1628,7 +1628,7 @@
           <w:lang w:val="en-ID" w:eastAsia="en-ID"/>
         </w:rPr>
       </w:pPr>
-      <w:hyperlink w:anchor="_Toc240058965" w:history="1">
+      <w:hyperlink w:anchor="_Toc240059777" w:history="1">
         <w:r>
           <w:rPr>
             <w:rStyle w:val="Hyperlink"/>
@@ -1655,7 +1655,7 @@
             <w:noProof/>
             <w:webHidden/>
           </w:rPr>
-          <w:instrText xml:space="preserve"> PAGEREF _Toc240058965 \h </w:instrText>
+          <w:instrText xml:space="preserve"> PAGEREF _Toc240059777 \h </w:instrText>
         </w:r>
         <w:r>
           <w:rPr>
@@ -1675,7 +1675,7 @@
             <w:noProof/>
             <w:webHidden/>
           </w:rPr>
-          <w:t>19</w:t>
+          <w:t>17</w:t>
         </w:r>
         <w:r>
           <w:rPr>
@@ -1700,7 +1700,7 @@
           <w:lang w:val="en-ID" w:eastAsia="en-ID"/>
         </w:rPr>
       </w:pPr>
-      <w:hyperlink w:anchor="_Toc240058966" w:history="1">
+      <w:hyperlink w:anchor="_Toc240059778" w:history="1">
         <w:r>
           <w:rPr>
             <w:rStyle w:val="Hyperlink"/>
@@ -1727,7 +1727,7 @@
             <w:noProof/>
             <w:webHidden/>
           </w:rPr>
-          <w:instrText xml:space="preserve"> PAGEREF _Toc240058966 \h </w:instrText>
+          <w:instrText xml:space="preserve"> PAGEREF _Toc240059778 \h </w:instrText>
         </w:r>
         <w:r>
           <w:rPr>
@@ -1747,7 +1747,7 @@
             <w:noProof/>
             <w:webHidden/>
           </w:rPr>
-          <w:t>23</w:t>
+          <w:t>20</w:t>
         </w:r>
         <w:r>
           <w:rPr>
@@ -1772,7 +1772,7 @@
           <w:lang w:val="en-ID" w:eastAsia="en-ID"/>
         </w:rPr>
       </w:pPr>
-      <w:hyperlink w:anchor="_Toc240058967" w:history="1">
+      <w:hyperlink w:anchor="_Toc240059779" w:history="1">
         <w:r>
           <w:rPr>
             <w:rStyle w:val="Hyperlink"/>
@@ -1799,7 +1799,7 @@
             <w:noProof/>
             <w:webHidden/>
           </w:rPr>
-          <w:instrText xml:space="preserve"> PAGEREF _Toc240058967 \h </w:instrText>
+          <w:instrText xml:space="preserve"> PAGEREF _Toc240059779 \h </w:instrText>
         </w:r>
         <w:r>
           <w:rPr>
@@ -1819,7 +1819,7 @@
             <w:noProof/>
             <w:webHidden/>
           </w:rPr>
-          <w:t>23</w:t>
+          <w:t>20</w:t>
         </w:r>
         <w:r>
           <w:rPr>
@@ -1844,7 +1844,7 @@
           <w:lang w:val="en-ID" w:eastAsia="en-ID"/>
         </w:rPr>
       </w:pPr>
-      <w:hyperlink w:anchor="_Toc240058968" w:history="1">
+      <w:hyperlink w:anchor="_Toc240059780" w:history="1">
         <w:r>
           <w:rPr>
             <w:rStyle w:val="Hyperlink"/>
@@ -1871,7 +1871,7 @@
             <w:noProof/>
             <w:webHidden/>
           </w:rPr>
-          <w:instrText xml:space="preserve"> PAGEREF _Toc240058968 \h </w:instrText>
+          <w:instrText xml:space="preserve"> PAGEREF _Toc240059780 \h </w:instrText>
         </w:r>
         <w:r>
           <w:rPr>
@@ -1891,7 +1891,7 @@
             <w:noProof/>
             <w:webHidden/>
           </w:rPr>
-          <w:t>23</w:t>
+          <w:t>20</w:t>
         </w:r>
         <w:r>
           <w:rPr>
@@ -1916,7 +1916,7 @@
           <w:lang w:val="en-ID" w:eastAsia="en-ID"/>
         </w:rPr>
       </w:pPr>
-      <w:hyperlink w:anchor="_Toc240058969" w:history="1">
+      <w:hyperlink w:anchor="_Toc240059781" w:history="1">
         <w:r>
           <w:rPr>
             <w:rStyle w:val="Hyperlink"/>
@@ -1943,7 +1943,7 @@
             <w:noProof/>
             <w:webHidden/>
           </w:rPr>
-          <w:instrText xml:space="preserve"> PAGEREF _Toc240058969 \h </w:instrText>
+          <w:instrText xml:space="preserve"> PAGEREF _Toc240059781 \h </w:instrText>
         </w:r>
         <w:r>
           <w:rPr>
@@ -1963,7 +1963,7 @@
             <w:noProof/>
             <w:webHidden/>
           </w:rPr>
-          <w:t>23</w:t>
+          <w:t>21</w:t>
         </w:r>
         <w:r>
           <w:rPr>
@@ -1988,7 +1988,7 @@
           <w:lang w:val="en-ID" w:eastAsia="en-ID"/>
         </w:rPr>
       </w:pPr>
-      <w:hyperlink w:anchor="_Toc240058970" w:history="1">
+      <w:hyperlink w:anchor="_Toc240059782" w:history="1">
         <w:r>
           <w:rPr>
             <w:rStyle w:val="Hyperlink"/>
@@ -2015,7 +2015,7 @@
             <w:noProof/>
             <w:webHidden/>
           </w:rPr>
-          <w:instrText xml:space="preserve"> PAGEREF _Toc240058970 \h </w:instrText>
+          <w:instrText xml:space="preserve"> PAGEREF _Toc240059782 \h </w:instrText>
         </w:r>
         <w:r>
           <w:rPr>
@@ -2035,7 +2035,7 @@
             <w:noProof/>
             <w:webHidden/>
           </w:rPr>
-          <w:t>23</w:t>
+          <w:t>21</w:t>
         </w:r>
         <w:r>
           <w:rPr>
@@ -2060,7 +2060,7 @@
           <w:lang w:val="en-ID" w:eastAsia="en-ID"/>
         </w:rPr>
       </w:pPr>
-      <w:hyperlink w:anchor="_Toc240058971" w:history="1">
+      <w:hyperlink w:anchor="_Toc240059783" w:history="1">
         <w:r>
           <w:rPr>
             <w:rStyle w:val="Hyperlink"/>
@@ -2087,7 +2087,7 @@
             <w:noProof/>
             <w:webHidden/>
           </w:rPr>
-          <w:instrText xml:space="preserve"> PAGEREF _Toc240058971 \h </w:instrText>
+          <w:instrText xml:space="preserve"> PAGEREF _Toc240059783 \h </w:instrText>
         </w:r>
         <w:r>
           <w:rPr>
@@ -2107,7 +2107,7 @@
             <w:noProof/>
             <w:webHidden/>
           </w:rPr>
-          <w:t>24</w:t>
+          <w:t>21</w:t>
         </w:r>
         <w:r>
           <w:rPr>
@@ -2132,7 +2132,7 @@
           <w:lang w:val="en-ID" w:eastAsia="en-ID"/>
         </w:rPr>
       </w:pPr>
-      <w:hyperlink w:anchor="_Toc240058972" w:history="1">
+      <w:hyperlink w:anchor="_Toc240059784" w:history="1">
         <w:r>
           <w:rPr>
             <w:rStyle w:val="Hyperlink"/>
@@ -2159,7 +2159,7 @@
             <w:noProof/>
             <w:webHidden/>
           </w:rPr>
-          <w:instrText xml:space="preserve"> PAGEREF _Toc240058972 \h </w:instrText>
+          <w:instrText xml:space="preserve"> PAGEREF _Toc240059784 \h </w:instrText>
         </w:r>
         <w:r>
           <w:rPr>
@@ -2179,7 +2179,7 @@
             <w:noProof/>
             <w:webHidden/>
           </w:rPr>
-          <w:t>24</w:t>
+          <w:t>22</w:t>
         </w:r>
         <w:r>
           <w:rPr>
@@ -2204,7 +2204,7 @@
           <w:lang w:val="en-ID" w:eastAsia="en-ID"/>
         </w:rPr>
       </w:pPr>
-      <w:hyperlink w:anchor="_Toc240058973" w:history="1">
+      <w:hyperlink w:anchor="_Toc240059785" w:history="1">
         <w:r>
           <w:rPr>
             <w:rStyle w:val="Hyperlink"/>
@@ -2231,7 +2231,7 @@
             <w:noProof/>
             <w:webHidden/>
           </w:rPr>
-          <w:instrText xml:space="preserve"> PAGEREF _Toc240058973 \h </w:instrText>
+          <w:instrText xml:space="preserve"> PAGEREF _Toc240059785 \h </w:instrText>
         </w:r>
         <w:r>
           <w:rPr>
@@ -2251,7 +2251,7 @@
             <w:noProof/>
             <w:webHidden/>
           </w:rPr>
-          <w:t>24</w:t>
+          <w:t>22</w:t>
         </w:r>
         <w:r>
           <w:rPr>
@@ -2276,7 +2276,7 @@
           <w:lang w:val="en-ID" w:eastAsia="en-ID"/>
         </w:rPr>
       </w:pPr>
-      <w:hyperlink w:anchor="_Toc240058974" w:history="1">
+      <w:hyperlink w:anchor="_Toc240059786" w:history="1">
         <w:r>
           <w:rPr>
             <w:rStyle w:val="Hyperlink"/>
@@ -2303,7 +2303,7 @@
             <w:noProof/>
             <w:webHidden/>
           </w:rPr>
-          <w:instrText xml:space="preserve"> PAGEREF _Toc240058974 \h </w:instrText>
+          <w:instrText xml:space="preserve"> PAGEREF _Toc240059786 \h </w:instrText>
         </w:r>
         <w:r>
           <w:rPr>
@@ -2323,7 +2323,7 @@
             <w:noProof/>
             <w:webHidden/>
           </w:rPr>
-          <w:t>24</w:t>
+          <w:t>22</w:t>
         </w:r>
         <w:r>
           <w:rPr>
@@ -2348,7 +2348,7 @@
           <w:lang w:val="en-ID" w:eastAsia="en-ID"/>
         </w:rPr>
       </w:pPr>
-      <w:hyperlink w:anchor="_Toc240058975" w:history="1">
+      <w:hyperlink w:anchor="_Toc240059787" w:history="1">
         <w:r>
           <w:rPr>
             <w:rStyle w:val="Hyperlink"/>
@@ -2375,7 +2375,7 @@
             <w:noProof/>
             <w:webHidden/>
           </w:rPr>
-          <w:instrText xml:space="preserve"> PAGEREF _Toc240058975 \h </w:instrText>
+          <w:instrText xml:space="preserve"> PAGEREF _Toc240059787 \h </w:instrText>
         </w:r>
         <w:r>
           <w:rPr>
@@ -2395,7 +2395,7 @@
             <w:noProof/>
             <w:webHidden/>
           </w:rPr>
-          <w:t>25</w:t>
+          <w:t>22</w:t>
         </w:r>
         <w:r>
           <w:rPr>
@@ -2420,7 +2420,7 @@
       <w:pPr>
         <w:pStyle w:val="Heading1"/>
       </w:pPr>
-      <w:bookmarkStart w:id="0" w:name="_Toc240058952"/>
+      <w:bookmarkStart w:id="0" w:name="_Toc240059764"/>
       <w:r>
         <w:lastRenderedPageBreak/>
         <w:t>About This Document</w:t>
@@ -2552,7 +2552,7 @@
       <w:pPr>
         <w:pStyle w:val="Heading1"/>
       </w:pPr>
-      <w:bookmarkStart w:id="1" w:name="_Toc240058953"/>
+      <w:bookmarkStart w:id="1" w:name="_Toc240059765"/>
       <w:r>
         <w:t>1. Basic Information (Application and Organization)</w:t>
       </w:r>
@@ -2621,7 +2621,7 @@
       <w:pPr>
         <w:pStyle w:val="Heading1"/>
       </w:pPr>
-      <w:bookmarkStart w:id="2" w:name="_Toc240058954"/>
+      <w:bookmarkStart w:id="2" w:name="_Toc240059766"/>
       <w:r>
         <w:t>2. Technical Documentation</w:t>
       </w:r>
@@ -2636,7 +2636,7 @@
       <w:pPr>
         <w:pStyle w:val="Heading2"/>
       </w:pPr>
-      <w:bookmarkStart w:id="3" w:name="_Toc240058955"/>
+      <w:bookmarkStart w:id="3" w:name="_Toc240059767"/>
       <w:r>
         <w:t>2.1 · Detailed Product Description</w:t>
       </w:r>
@@ -2688,7 +2688,7 @@
       <w:pPr>
         <w:pStyle w:val="Heading2"/>
       </w:pPr>
-      <w:bookmarkStart w:id="4" w:name="_Toc240058956"/>
+      <w:bookmarkStart w:id="4" w:name="_Toc240059768"/>
       <w:r>
         <w:t>2.2 · Product Na</w:t>
       </w:r>
@@ -3111,7 +3111,7 @@
       <w:pPr>
         <w:pStyle w:val="Heading2"/>
       </w:pPr>
-      <w:bookmarkStart w:id="5" w:name="_Toc240058957"/>
+      <w:bookmarkStart w:id="5" w:name="_Toc240059769"/>
       <w:r>
         <w:t>2.3 · Functional Description and Technical Parameters (Electrical, Mechanical, etc.)</w:t>
       </w:r>
@@ -3139,7 +3139,7 @@
       <w:pPr>
         <w:pStyle w:val="Heading3"/>
       </w:pPr>
-      <w:bookmarkStart w:id="6" w:name="_Toc240058958"/>
+      <w:bookmarkStart w:id="6" w:name="_Toc240059770"/>
       <w:r>
         <w:t>2.3.a · Electrical Parameters — Node Sensor (GLD)</w:t>
       </w:r>
@@ -3851,7 +3851,7 @@
       <w:pPr>
         <w:pStyle w:val="Heading3"/>
       </w:pPr>
-      <w:bookmarkStart w:id="7" w:name="_Toc240058959"/>
+      <w:bookmarkStart w:id="7" w:name="_Toc240059771"/>
       <w:r>
         <w:t>2.3.b · Sensor and Communication Parameters — Node Sensor (GLD)</w:t>
       </w:r>
@@ -4960,7 +4960,7 @@
       <w:pPr>
         <w:pStyle w:val="Heading3"/>
       </w:pPr>
-      <w:bookmarkStart w:id="8" w:name="_Toc240058960"/>
+      <w:bookmarkStart w:id="8" w:name="_Toc240059772"/>
       <w:r>
         <w:lastRenderedPageBreak/>
         <w:t>2.3.c · Mechanical Parameters — Node Sensor (GLD)</w:t>
@@ -5792,7 +5792,7 @@
       <w:pPr>
         <w:pStyle w:val="Heading2"/>
       </w:pPr>
-      <w:bookmarkStart w:id="9" w:name="_Toc240058961"/>
+      <w:bookmarkStart w:id="9" w:name="_Toc240059773"/>
       <w:r>
         <w:t>2.4 · Product Photographs — Overall and Key Components</w:t>
       </w:r>
@@ -5835,8 +5835,8 @@
               </w:rPr>
               <w:lastRenderedPageBreak/>
               <w:drawing>
-                <wp:inline distT="0" distB="0" distL="0" distR="0" wp14:anchorId="45CDF0D7" wp14:editId="089D4578">
-                  <wp:extent cx="2514600" cy="4165753"/>
+                <wp:inline distT="0" distB="0" distL="0" distR="0" wp14:anchorId="2068F023" wp14:editId="74D13512">
+                  <wp:extent cx="1379912" cy="2286000"/>
                   <wp:effectExtent l="0" t="0" r="0" b="0"/>
                   <wp:docPr id="1" name="Picture 1"/>
                   <wp:cNvGraphicFramePr>
@@ -5858,7 +5858,7 @@
                         <pic:spPr>
                           <a:xfrm>
                             <a:off x="0" y="0"/>
-                            <a:ext cx="2514600" cy="4165753"/>
+                            <a:ext cx="1379912" cy="2286000"/>
                           </a:xfrm>
                           <a:prstGeom prst="rect">
                             <a:avLst/>
@@ -5919,8 +5919,8 @@
                 <w:noProof/>
               </w:rPr>
               <w:drawing>
-                <wp:inline distT="0" distB="0" distL="0" distR="0" wp14:anchorId="147ECC83" wp14:editId="5F786EBE">
-                  <wp:extent cx="2514600" cy="3352800"/>
+                <wp:inline distT="0" distB="0" distL="0" distR="0" wp14:anchorId="18EDE2E3" wp14:editId="7925CEF1">
+                  <wp:extent cx="1714500" cy="2286000"/>
                   <wp:effectExtent l="0" t="0" r="0" b="0"/>
                   <wp:docPr id="2" name="Picture 2"/>
                   <wp:cNvGraphicFramePr>
@@ -5942,7 +5942,7 @@
                         <pic:spPr>
                           <a:xfrm>
                             <a:off x="0" y="0"/>
-                            <a:ext cx="2514600" cy="3352800"/>
+                            <a:ext cx="1714500" cy="2286000"/>
                           </a:xfrm>
                           <a:prstGeom prst="rect">
                             <a:avLst/>
@@ -6007,10 +6007,9 @@
               <w:rPr>
                 <w:noProof/>
               </w:rPr>
-              <w:lastRenderedPageBreak/>
               <w:drawing>
-                <wp:inline distT="0" distB="0" distL="0" distR="0" wp14:anchorId="2A3D4EDC" wp14:editId="0D070D9D">
-                  <wp:extent cx="2514600" cy="5599312"/>
+                <wp:inline distT="0" distB="0" distL="0" distR="0" wp14:anchorId="3A80E165" wp14:editId="7D53C49E">
+                  <wp:extent cx="1026621" cy="2286000"/>
                   <wp:effectExtent l="0" t="0" r="0" b="0"/>
                   <wp:docPr id="3" name="Picture 3"/>
                   <wp:cNvGraphicFramePr>
@@ -6032,7 +6031,7 @@
                         <pic:spPr>
                           <a:xfrm>
                             <a:off x="0" y="0"/>
-                            <a:ext cx="2514600" cy="5599312"/>
+                            <a:ext cx="1026621" cy="2286000"/>
                           </a:xfrm>
                           <a:prstGeom prst="rect">
                             <a:avLst/>
@@ -6093,8 +6092,8 @@
                 <w:noProof/>
               </w:rPr>
               <w:drawing>
-                <wp:inline distT="0" distB="0" distL="0" distR="0" wp14:anchorId="62A202A5" wp14:editId="7C4C6022">
-                  <wp:extent cx="2514600" cy="5599312"/>
+                <wp:inline distT="0" distB="0" distL="0" distR="0" wp14:anchorId="11AAD4F1" wp14:editId="61B7D89F">
+                  <wp:extent cx="1026621" cy="2286000"/>
                   <wp:effectExtent l="0" t="0" r="0" b="0"/>
                   <wp:docPr id="4" name="Picture 4"/>
                   <wp:cNvGraphicFramePr>
@@ -6116,7 +6115,7 @@
                         <pic:spPr>
                           <a:xfrm>
                             <a:off x="0" y="0"/>
-                            <a:ext cx="2514600" cy="5599312"/>
+                            <a:ext cx="1026621" cy="2286000"/>
                           </a:xfrm>
                           <a:prstGeom prst="rect">
                             <a:avLst/>
@@ -6183,8 +6182,8 @@
               </w:rPr>
               <w:lastRenderedPageBreak/>
               <w:drawing>
-                <wp:inline distT="0" distB="0" distL="0" distR="0" wp14:anchorId="191103A5" wp14:editId="3CC59E31">
-                  <wp:extent cx="2514600" cy="5599312"/>
+                <wp:inline distT="0" distB="0" distL="0" distR="0" wp14:anchorId="64FE3901" wp14:editId="07DDD520">
+                  <wp:extent cx="1026621" cy="2286000"/>
                   <wp:effectExtent l="0" t="0" r="0" b="0"/>
                   <wp:docPr id="5" name="Picture 5"/>
                   <wp:cNvGraphicFramePr>
@@ -6206,7 +6205,7 @@
                         <pic:spPr>
                           <a:xfrm>
                             <a:off x="0" y="0"/>
-                            <a:ext cx="2514600" cy="5599312"/>
+                            <a:ext cx="1026621" cy="2286000"/>
                           </a:xfrm>
                           <a:prstGeom prst="rect">
                             <a:avLst/>
@@ -6260,8 +6259,8 @@
                 <w:noProof/>
               </w:rPr>
               <w:drawing>
-                <wp:inline distT="0" distB="0" distL="0" distR="0" wp14:anchorId="0452A20F" wp14:editId="711FCE45">
-                  <wp:extent cx="2514600" cy="5599312"/>
+                <wp:inline distT="0" distB="0" distL="0" distR="0" wp14:anchorId="6445E678" wp14:editId="68A76C1F">
+                  <wp:extent cx="1026621" cy="2286000"/>
                   <wp:effectExtent l="0" t="0" r="0" b="0"/>
                   <wp:docPr id="6" name="Picture 6"/>
                   <wp:cNvGraphicFramePr>
@@ -6283,7 +6282,7 @@
                         <pic:spPr>
                           <a:xfrm>
                             <a:off x="0" y="0"/>
-                            <a:ext cx="2514600" cy="5599312"/>
+                            <a:ext cx="1026621" cy="2286000"/>
                           </a:xfrm>
                           <a:prstGeom prst="rect">
                             <a:avLst/>
@@ -6348,10 +6347,9 @@
               <w:rPr>
                 <w:noProof/>
               </w:rPr>
-              <w:lastRenderedPageBreak/>
               <w:drawing>
-                <wp:inline distT="0" distB="0" distL="0" distR="0" wp14:anchorId="6C392F70" wp14:editId="68DDDDFC">
-                  <wp:extent cx="2514600" cy="5599312"/>
+                <wp:inline distT="0" distB="0" distL="0" distR="0" wp14:anchorId="79EBDBFE" wp14:editId="68638D57">
+                  <wp:extent cx="1026621" cy="2286000"/>
                   <wp:effectExtent l="0" t="0" r="0" b="0"/>
                   <wp:docPr id="7" name="Picture 7"/>
                   <wp:cNvGraphicFramePr>
@@ -6373,7 +6371,7 @@
                         <pic:spPr>
                           <a:xfrm>
                             <a:off x="0" y="0"/>
-                            <a:ext cx="2514600" cy="5599312"/>
+                            <a:ext cx="1026621" cy="2286000"/>
                           </a:xfrm>
                           <a:prstGeom prst="rect">
                             <a:avLst/>
@@ -6495,9 +6493,8 @@
       <w:pPr>
         <w:pStyle w:val="Heading2"/>
       </w:pPr>
-      <w:bookmarkStart w:id="10" w:name="_Toc240058962"/>
+      <w:bookmarkStart w:id="10" w:name="_Toc240059774"/>
       <w:r>
-        <w:lastRenderedPageBreak/>
         <w:t>2.5 · Description of Intended Use and Installation Environment (Gas Group, Temperature Class, Area Classification)</w:t>
       </w:r>
       <w:bookmarkEnd w:id="10"/>
@@ -6507,7 +6504,11 @@
         <w:t>The GLD is intended for continuous, fixed-point monitoring of fla</w:t>
       </w:r>
       <w:r>
-        <w:t xml:space="preserve">mmable and toxic gas leaks in oil &amp; gas refinery hazardous areas — process units, tank farms, pipe racks, and loading/unloading areas. The specific Ex classification parameters below reflect the project engineering team's current recommendation, developed </w:t>
+        <w:t xml:space="preserve">mmable and toxic gas leaks in oil &amp; gas refinery hazardous areas — process units, tank farms, pipe racks, and loading/unloading areas. The specific Ex </w:t>
+      </w:r>
+      <w:r>
+        <w:lastRenderedPageBreak/>
+        <w:t xml:space="preserve">classification parameters below reflect the project engineering team's current recommendation, developed </w:t>
       </w:r>
       <w:r>
         <w:t>from the intended deployment envelope and the gases the device is designed to detect; none of these parameters has yet been confirmed with the certification body (ExCB) or a notified body, and none should be treated as final.</w:t>
@@ -6984,7 +6985,7 @@
       <w:pPr>
         <w:pStyle w:val="Heading2"/>
       </w:pPr>
-      <w:bookmarkStart w:id="11" w:name="_Toc240058963"/>
+      <w:bookmarkStart w:id="11" w:name="_Toc240059775"/>
       <w:r>
         <w:t>2.6 · Design and Manufacturing Information</w:t>
       </w:r>
@@ -7002,9 +7003,8 @@
       <w:pPr>
         <w:pStyle w:val="Heading3"/>
       </w:pPr>
-      <w:bookmarkStart w:id="12" w:name="_Toc240058964"/>
+      <w:bookmarkStart w:id="12" w:name="_Toc240059776"/>
       <w:r>
-        <w:lastRenderedPageBreak/>
         <w:t>2.6.a · Complete Drawings (Assembly, Component, Electrical Schematic, PCB Layout, Enclosure Structure, Junction Box, Terminal, Grounding)</w:t>
       </w:r>
       <w:bookmarkEnd w:id="12"/>
@@ -7028,8 +7028,9 @@
         <w:rPr>
           <w:noProof/>
         </w:rPr>
+        <w:lastRenderedPageBreak/>
         <w:drawing>
-          <wp:inline distT="0" distB="0" distL="0" distR="0" wp14:anchorId="229A07F5" wp14:editId="0A2FFBB4">
+          <wp:inline distT="0" distB="0" distL="0" distR="0" wp14:anchorId="4E323C5D" wp14:editId="78429BFD">
             <wp:extent cx="5120640" cy="3413760"/>
             <wp:effectExtent l="0" t="0" r="0" b="0"/>
             <wp:docPr id="8" name="Picture 8"/>
@@ -7107,9 +7108,8 @@
         <w:rPr>
           <w:noProof/>
         </w:rPr>
-        <w:lastRenderedPageBreak/>
         <w:drawing>
-          <wp:inline distT="0" distB="0" distL="0" distR="0" wp14:anchorId="6DD7D69E" wp14:editId="0C516E60">
+          <wp:inline distT="0" distB="0" distL="0" distR="0" wp14:anchorId="2E6741CE" wp14:editId="4A545048">
             <wp:extent cx="5120640" cy="3413760"/>
             <wp:effectExtent l="0" t="0" r="0" b="0"/>
             <wp:docPr id="9" name="Picture 9"/>
@@ -7187,8 +7187,9 @@
         <w:rPr>
           <w:noProof/>
         </w:rPr>
+        <w:lastRenderedPageBreak/>
         <w:drawing>
-          <wp:inline distT="0" distB="0" distL="0" distR="0" wp14:anchorId="2B041FD5" wp14:editId="584608BE">
+          <wp:inline distT="0" distB="0" distL="0" distR="0" wp14:anchorId="1F98A8D5" wp14:editId="3E91C294">
             <wp:extent cx="5120640" cy="3413760"/>
             <wp:effectExtent l="0" t="0" r="0" b="0"/>
             <wp:docPr id="10" name="Picture 10"/>
@@ -7259,9 +7260,8 @@
         <w:rPr>
           <w:noProof/>
         </w:rPr>
-        <w:lastRenderedPageBreak/>
         <w:drawing>
-          <wp:inline distT="0" distB="0" distL="0" distR="0" wp14:anchorId="11CA3D1D" wp14:editId="16973E14">
+          <wp:inline distT="0" distB="0" distL="0" distR="0" wp14:anchorId="78E28160" wp14:editId="248A495F">
             <wp:extent cx="5120640" cy="3413760"/>
             <wp:effectExtent l="0" t="0" r="0" b="0"/>
             <wp:docPr id="11" name="Picture 11"/>
@@ -7339,8 +7339,9 @@
         <w:rPr>
           <w:noProof/>
         </w:rPr>
+        <w:lastRenderedPageBreak/>
         <w:drawing>
-          <wp:inline distT="0" distB="0" distL="0" distR="0" wp14:anchorId="4335561D" wp14:editId="70356FFF">
+          <wp:inline distT="0" distB="0" distL="0" distR="0" wp14:anchorId="682D80F9" wp14:editId="34B9CAE4">
             <wp:extent cx="5120640" cy="3413760"/>
             <wp:effectExtent l="0" t="0" r="0" b="0"/>
             <wp:docPr id="12" name="Picture 12"/>
@@ -7411,9 +7412,8 @@
         <w:rPr>
           <w:noProof/>
         </w:rPr>
-        <w:lastRenderedPageBreak/>
         <w:drawing>
-          <wp:inline distT="0" distB="0" distL="0" distR="0" wp14:anchorId="4D168531" wp14:editId="740096DE">
+          <wp:inline distT="0" distB="0" distL="0" distR="0" wp14:anchorId="56A95F06" wp14:editId="3AAF4CFC">
             <wp:extent cx="5120640" cy="3413760"/>
             <wp:effectExtent l="0" t="0" r="0" b="0"/>
             <wp:docPr id="13" name="Picture 13"/>
@@ -7491,8 +7491,9 @@
         <w:rPr>
           <w:noProof/>
         </w:rPr>
+        <w:lastRenderedPageBreak/>
         <w:drawing>
-          <wp:inline distT="0" distB="0" distL="0" distR="0" wp14:anchorId="55A8BC55" wp14:editId="454DE21E">
+          <wp:inline distT="0" distB="0" distL="0" distR="0" wp14:anchorId="72293749" wp14:editId="323AE042">
             <wp:extent cx="5120640" cy="3413760"/>
             <wp:effectExtent l="0" t="0" r="0" b="0"/>
             <wp:docPr id="14" name="Picture 14"/>
@@ -7570,9 +7571,8 @@
         <w:rPr>
           <w:noProof/>
         </w:rPr>
-        <w:lastRenderedPageBreak/>
         <w:drawing>
-          <wp:inline distT="0" distB="0" distL="0" distR="0" wp14:anchorId="57E87F8D" wp14:editId="0D721838">
+          <wp:inline distT="0" distB="0" distL="0" distR="0" wp14:anchorId="17BA1DD2" wp14:editId="5A16AC99">
             <wp:extent cx="5120640" cy="3413760"/>
             <wp:effectExtent l="0" t="0" r="0" b="0"/>
             <wp:docPr id="15" name="Picture 15"/>
@@ -7643,8 +7643,9 @@
         <w:rPr>
           <w:noProof/>
         </w:rPr>
+        <w:lastRenderedPageBreak/>
         <w:drawing>
-          <wp:inline distT="0" distB="0" distL="0" distR="0" wp14:anchorId="6D17E792" wp14:editId="491BB3F7">
+          <wp:inline distT="0" distB="0" distL="0" distR="0" wp14:anchorId="32E842F9" wp14:editId="135E18AF">
             <wp:extent cx="5120640" cy="3413760"/>
             <wp:effectExtent l="0" t="0" r="0" b="0"/>
             <wp:docPr id="16" name="Picture 16"/>
@@ -7722,9 +7723,8 @@
         <w:rPr>
           <w:noProof/>
         </w:rPr>
-        <w:lastRenderedPageBreak/>
         <w:drawing>
-          <wp:inline distT="0" distB="0" distL="0" distR="0" wp14:anchorId="46D3E22C" wp14:editId="49988AD9">
+          <wp:inline distT="0" distB="0" distL="0" distR="0" wp14:anchorId="1BE5BD54" wp14:editId="579D0B7E">
             <wp:extent cx="2468880" cy="2479268"/>
             <wp:effectExtent l="0" t="0" r="0" b="0"/>
             <wp:docPr id="17" name="Picture 17"/>
@@ -7767,7 +7767,7 @@
           <w:noProof/>
         </w:rPr>
         <w:drawing>
-          <wp:inline distT="0" distB="0" distL="0" distR="0" wp14:anchorId="7C139101" wp14:editId="15AEBBF7">
+          <wp:inline distT="0" distB="0" distL="0" distR="0" wp14:anchorId="3ECEC1A8" wp14:editId="1CE81E8E">
             <wp:extent cx="2468880" cy="1804956"/>
             <wp:effectExtent l="0" t="0" r="0" b="0"/>
             <wp:docPr id="18" name="Picture 18"/>
@@ -7853,8 +7853,9 @@
         <w:rPr>
           <w:noProof/>
         </w:rPr>
+        <w:lastRenderedPageBreak/>
         <w:drawing>
-          <wp:inline distT="0" distB="0" distL="0" distR="0" wp14:anchorId="6B6DBC15" wp14:editId="6BD56B29">
+          <wp:inline distT="0" distB="0" distL="0" distR="0" wp14:anchorId="0FE8DCDE" wp14:editId="736DFBB9">
             <wp:extent cx="5669280" cy="3847707"/>
             <wp:effectExtent l="0" t="0" r="0" b="0"/>
             <wp:docPr id="19" name="Picture 19"/>
@@ -7921,15 +7922,7 @@
           <w:color w:val="4A4A4A"/>
           <w:sz w:val="17"/>
         </w:rPr>
-        <w:t xml:space="preserve">Orthographic and isometric views with real dimensions (enclosure neck Ø75 mm, overall probe height 191.51 mm, mounting plate 250×250 </w:t>
-      </w:r>
-      <w:r>
-        <w:rPr>
-          <w:color w:val="4A4A4A"/>
-          <w:sz w:val="17"/>
-        </w:rPr>
-        <w:lastRenderedPageBreak/>
-        <w:t>mm with toleranced hole pattern), a U-bolt parameter table (2″/DN50, M10 thread), and a title block (</w:t>
+        <w:t>Orthographic and isometric views with real dimensions (enclosure neck Ø75 mm, overall probe height 191.51 mm, mounting plate 250×250 mm with toleranced hole pattern), a U-bolt parameter table (2″/DN50, M10 thread), and a title block (</w:t>
       </w:r>
       <w:r>
         <w:rPr>
@@ -8308,7 +8301,14 @@
               <w:rPr>
                 <w:sz w:val="19"/>
               </w:rPr>
-              <w:t>External envelope is dimensioned (from a real STEP solid model, millimeter units) in the drawing above. The Ex-d-specific flame-path parameters — joint gap, length, and free internal volume — are not called out; t</w:t>
+              <w:t xml:space="preserve">External envelope is dimensioned (from a real STEP solid model, millimeter units) in the </w:t>
+            </w:r>
+            <w:r>
+              <w:rPr>
+                <w:sz w:val="19"/>
+              </w:rPr>
+              <w:lastRenderedPageBreak/>
+              <w:t>drawing above. The Ex-d-specific flame-path parameters — joint gap, length, and free internal volume — are not called out; t</w:t>
             </w:r>
             <w:r>
               <w:rPr>
@@ -8336,6 +8336,7 @@
                 <w:b/>
                 <w:sz w:val="19"/>
               </w:rPr>
+              <w:lastRenderedPageBreak/>
               <w:t>Junction box / terminal / grounding connection drawings</w:t>
             </w:r>
           </w:p>
@@ -8437,7 +8438,7 @@
       <w:pPr>
         <w:pStyle w:val="Heading3"/>
       </w:pPr>
-      <w:bookmarkStart w:id="13" w:name="_Toc240058965"/>
+      <w:bookmarkStart w:id="13" w:name="_Toc240059777"/>
       <w:r>
         <w:t xml:space="preserve">2.6.b · Bill of Materials (BOM) for </w:t>
       </w:r>
@@ -8459,7 +8460,6 @@
     </w:p>
     <w:p>
       <w:r>
-        <w:lastRenderedPageBreak/>
         <w:t>It does not, however, satisfy this checklist item as written. The checklist asks specifically for the explosion-safety-relevant BOM — enclosure, gaskets, terminals, cable entry devices, switches, light sources, battery, potting compound, and plastic</w:t>
       </w:r>
       <w:r>
@@ -9440,7 +9440,15 @@
                 <w:b/>
                 <w:sz w:val="15"/>
               </w:rPr>
-              <w:t>C87,C12,C13,C14,C41,C42,C43,C44,C46,C47,C48,C49,C50,C51,C52,C54,C55,C58,C65,C66,C15,C6,C19,C20,C21,C22,C23,C24,C25,C26,C27,C28,C29,C30,C31,C84,C78,C81</w:t>
+              <w:t>C87,C12,C13,C14,C41,C42,C43,C44,C46,C47,C48,C49,C50,C51,C52,C54,C55,C</w:t>
+            </w:r>
+            <w:r>
+              <w:rPr>
+                <w:b/>
+                <w:sz w:val="15"/>
+              </w:rPr>
+              <w:lastRenderedPageBreak/>
+              <w:t>58,C65,C66,C15,C6,C19,C20,C21,C22,C23,C24,C25,C26,C27,C28,C29,C30,C31,C84,C78,C81</w:t>
             </w:r>
           </w:p>
         </w:tc>
@@ -9456,6 +9464,7 @@
               <w:rPr>
                 <w:sz w:val="15"/>
               </w:rPr>
+              <w:lastRenderedPageBreak/>
               <w:t>100nF</w:t>
             </w:r>
           </w:p>
@@ -11690,7 +11699,6 @@
                 <w:b/>
                 <w:sz w:val="15"/>
               </w:rPr>
-              <w:lastRenderedPageBreak/>
               <w:t>R6</w:t>
             </w:r>
           </w:p>
@@ -13833,6 +13841,7 @@
                 <w:b/>
                 <w:sz w:val="15"/>
               </w:rPr>
+              <w:lastRenderedPageBreak/>
               <w:t>C45,C57</w:t>
             </w:r>
           </w:p>
@@ -15873,7 +15882,6 @@
                 <w:b/>
                 <w:sz w:val="15"/>
               </w:rPr>
-              <w:lastRenderedPageBreak/>
               <w:t>U16</w:t>
             </w:r>
           </w:p>
@@ -17739,6 +17747,7 @@
                 <w:color w:val="4A4A4A"/>
                 <w:sz w:val="18"/>
               </w:rPr>
+              <w:lastRenderedPageBreak/>
               <w:t>DESIGNATOR</w:t>
             </w:r>
           </w:p>
@@ -19342,9 +19351,8 @@
       <w:pPr>
         <w:pStyle w:val="Heading3"/>
       </w:pPr>
-      <w:bookmarkStart w:id="14" w:name="_Toc240058966"/>
+      <w:bookmarkStart w:id="14" w:name="_Toc240059778"/>
       <w:r>
-        <w:lastRenderedPageBreak/>
         <w:t>2.6.c · Material Specification Sheets / Datasheets (Non-Metallic Materials)</w:t>
       </w:r>
       <w:bookmarkEnd w:id="14"/>
@@ -19412,7 +19420,7 @@
       <w:pPr>
         <w:pStyle w:val="Heading3"/>
       </w:pPr>
-      <w:bookmarkStart w:id="15" w:name="_Toc240058967"/>
+      <w:bookmarkStart w:id="15" w:name="_Toc240059779"/>
       <w:r>
         <w:t>2.6.d · Manufacturing Process Description</w:t>
       </w:r>
@@ -19481,7 +19489,7 @@
       <w:pPr>
         <w:pStyle w:val="Heading3"/>
       </w:pPr>
-      <w:bookmarkStart w:id="16" w:name="_Toc240058968"/>
+      <w:bookmarkStart w:id="16" w:name="_Toc240059780"/>
       <w:r>
         <w:t>2.6.e · Explosion-Protection Calculations and Explanations (if applicable)</w:t>
       </w:r>
@@ -19528,6 +19536,7 @@
                 <w:color w:val="4A4A4A"/>
                 <w:sz w:val="20"/>
               </w:rPr>
+              <w:lastRenderedPageBreak/>
               <w:t>Status: Not yet available — pending protection-concept confirmation and final enclosure design.</w:t>
             </w:r>
           </w:p>
@@ -19543,7 +19552,7 @@
       <w:pPr>
         <w:pStyle w:val="Heading3"/>
       </w:pPr>
-      <w:bookmarkStart w:id="17" w:name="_Toc240058969"/>
+      <w:bookmarkStart w:id="17" w:name="_Toc240059781"/>
       <w:r>
         <w:t xml:space="preserve">2.6.f · Temperature Group Calculation (Hottest-Point </w:t>
       </w:r>
@@ -19611,7 +19620,7 @@
       <w:pPr>
         <w:pStyle w:val="Heading3"/>
       </w:pPr>
-      <w:bookmarkStart w:id="18" w:name="_Toc240058970"/>
+      <w:bookmarkStart w:id="18" w:name="_Toc240059782"/>
       <w:r>
         <w:t>2.6.g · Usage and Installation Instructions (Draft)</w:t>
       </w:r>
@@ -19812,14 +19821,7 @@
               <w:rPr>
                 <w:sz w:val="19"/>
               </w:rPr>
-              <w:t xml:space="preserve">existing structures without drilling or welding — see Section 2.3.c), but cable-entry method, torque values, grounding </w:t>
-            </w:r>
-            <w:r>
-              <w:rPr>
-                <w:sz w:val="19"/>
-              </w:rPr>
-              <w:lastRenderedPageBreak/>
-              <w:t>requirements, and cleaning requirements have not yet been formally specified.</w:t>
+              <w:t>existing structures without drilling or welding — see Section 2.3.c), but cable-entry method, torque values, grounding requirements, and cleaning requirements have not yet been formally specified.</w:t>
             </w:r>
           </w:p>
         </w:tc>
@@ -19841,7 +19843,6 @@
                 <w:b/>
                 <w:sz w:val="19"/>
               </w:rPr>
-              <w:lastRenderedPageBreak/>
               <w:t>c) Operating instructions and maintenance requirements</w:t>
             </w:r>
           </w:p>
@@ -19941,7 +19942,7 @@
       <w:pPr>
         <w:pStyle w:val="Heading3"/>
       </w:pPr>
-      <w:bookmarkStart w:id="19" w:name="_Toc240058971"/>
+      <w:bookmarkStart w:id="19" w:name="_Toc240059783"/>
       <w:r>
         <w:t>2.6.h · Nameplate Information</w:t>
       </w:r>
@@ -20003,8 +20004,9 @@
       <w:pPr>
         <w:pStyle w:val="Heading3"/>
       </w:pPr>
-      <w:bookmarkStart w:id="20" w:name="_Toc240058972"/>
+      <w:bookmarkStart w:id="20" w:name="_Toc240059784"/>
       <w:r>
+        <w:lastRenderedPageBreak/>
         <w:t>2.6.i · Ex Component Certificates</w:t>
       </w:r>
       <w:bookmarkEnd w:id="20"/>
@@ -20065,7 +20067,7 @@
       <w:pPr>
         <w:pStyle w:val="Heading1"/>
       </w:pPr>
-      <w:bookmarkStart w:id="21" w:name="_Toc240058973"/>
+      <w:bookmarkStart w:id="21" w:name="_Toc240059785"/>
       <w:r>
         <w:t>3. Sample Information</w:t>
       </w:r>
@@ -20080,7 +20082,7 @@
       <w:pPr>
         <w:pStyle w:val="Heading2"/>
       </w:pPr>
-      <w:bookmarkStart w:id="22" w:name="_Toc240058974"/>
+      <w:bookmarkStart w:id="22" w:name="_Toc240059786"/>
       <w:r>
         <w:t>3.1 · Model, Serial Number, and Status</w:t>
       </w:r>
@@ -20152,9 +20154,8 @@
       <w:pPr>
         <w:pStyle w:val="Heading2"/>
       </w:pPr>
-      <w:bookmarkStart w:id="23" w:name="_Toc240058975"/>
+      <w:bookmarkStart w:id="23" w:name="_Toc240059787"/>
       <w:r>
-        <w:lastRenderedPageBreak/>
         <w:t>3.2 · Test Fixtures and Auxiliary Equipment</w:t>
       </w:r>
       <w:bookmarkEnd w:id="23"/>
@@ -20518,10 +20519,9 @@
         <w:spacing w:after="80"/>
       </w:pPr>
     </w:p>
-    <w:p/>
     <w:p>
       <w:pPr>
-        <w:spacing w:before="280"/>
+        <w:spacing w:before="200"/>
       </w:pPr>
       <w:r>
         <w:rPr>
@@ -20529,7 +20529,8 @@
           <w:color w:val="8A8A8A"/>
           <w:sz w:val="17"/>
         </w:rPr>
-        <w:t>This is a working document, prepared in stages, drafted in direct reference to the IECEx/ATEX Certification Information Requirements (original</w:t>
+        <w:lastRenderedPageBreak/>
+        <w:t xml:space="preserve">This is a working document, prepared in stages, drafted in direct reference to the IECEx/ATEX Certification Information Requirements (original </w:t>
       </w:r>
       <w:r>
         <w:rPr>
@@ -20537,7 +20538,7 @@
           <w:color w:val="8A8A8A"/>
           <w:sz w:val="17"/>
         </w:rPr>
-        <w:t xml:space="preserve"> English/Mandarin version issued by the certification body). Data sources: the official product technical datasheet (Institute of Technology Bandung, Revision 4.0), internal technical specification documentation, EMC parameter measurement data, and product</w:t>
+        <w:t xml:space="preserve">English/Mandarin version issued by the certification body). Data sources: the official product technical datasheet (Institute of Technology Bandung, Revision 4.0), internal technical specification documentation, EMC parameter measurement data, and product </w:t>
       </w:r>
       <w:r>
         <w:rPr>
@@ -20545,7 +20546,7 @@
           <w:color w:val="8A8A8A"/>
           <w:sz w:val="17"/>
         </w:rPr>
-        <w:t xml:space="preserve"> photography. Fields marked “Pending confirmation” are not yet final and must not be relied upon for procurement or certification purposes without further verification.</w:t>
+        <w:t>photography. Fields marked “Pending confirmation” are not yet final and must not be relied upon for procurement or certification purposes without further verification.</w:t>
       </w:r>
     </w:p>
     <w:sectPr>
@@ -32305,7 +32306,7 @@
     <w:autoRedefine/>
     <w:uiPriority w:val="39"/>
     <w:unhideWhenUsed/>
-    <w:rsid w:val="00D52912"/>
+    <w:rsid w:val="004D6E42"/>
     <w:pPr>
       <w:spacing w:after="100"/>
     </w:pPr>
@@ -32317,7 +32318,7 @@
     <w:autoRedefine/>
     <w:uiPriority w:val="39"/>
     <w:unhideWhenUsed/>
-    <w:rsid w:val="00D52912"/>
+    <w:rsid w:val="004D6E42"/>
     <w:pPr>
       <w:spacing w:after="100"/>
       <w:ind w:left="210"/>
@@ -32330,7 +32331,7 @@
     <w:autoRedefine/>
     <w:uiPriority w:val="39"/>
     <w:unhideWhenUsed/>
-    <w:rsid w:val="00D52912"/>
+    <w:rsid w:val="004D6E42"/>
     <w:pPr>
       <w:spacing w:after="100"/>
       <w:ind w:left="420"/>
@@ -32341,7 +32342,7 @@
     <w:basedOn w:val="DefaultParagraphFont"/>
     <w:uiPriority w:val="99"/>
     <w:unhideWhenUsed/>
-    <w:rsid w:val="00D52912"/>
+    <w:rsid w:val="004D6E42"/>
     <w:rPr>
       <w:color w:val="0000FF" w:themeColor="hyperlink"/>
       <w:u w:val="single"/>

</xml_diff>

<commit_message>
Fix TOC splitting across two pages
The Table of Contents heading and its field were sharing page 1 with
the cover/Document Control/Revision History blocks, so the TOC field
(25 entries) started partway down the page and spilled onto page 2.
Moved the page break to right before the TOC heading instead of
after it, so the full TOC now renders on its own single page (page
2), with the cover content on page 1 and "About This Document"
starting page 3.

Co-Authored-By: Claude Sonnet 5 <noreply@anthropic.com>
</commit_message>
<xml_diff>
--- a/Deliverables/Dokumen_Teknis_Sertifikasi_GLD_IECEx_ATEX.docx
+++ b/Deliverables/Dokumen_Teknis_Sertifikasi_GLD_IECEx_ATEX.docx
@@ -652,9 +652,9 @@
       </w:tr>
     </w:tbl>
     <w:p>
-      <w:pPr>
-        <w:spacing w:after="200"/>
-      </w:pPr>
+      <w:r>
+        <w:br w:type="page"/>
+      </w:r>
     </w:p>
     <w:p>
       <w:pPr>
@@ -666,6 +666,7 @@
           <w:color w:val="1A2B3D"/>
           <w:sz w:val="24"/>
         </w:rPr>
+        <w:lastRenderedPageBreak/>
         <w:t>Table of Contents</w:t>
       </w:r>
     </w:p>
@@ -692,7 +693,7 @@
       <w:r>
         <w:fldChar w:fldCharType="separate"/>
       </w:r>
-      <w:hyperlink w:anchor="_Toc240059764" w:history="1">
+      <w:hyperlink w:anchor="_Toc240060137" w:history="1">
         <w:r>
           <w:rPr>
             <w:rStyle w:val="Hyperlink"/>
@@ -719,7 +720,7 @@
             <w:noProof/>
             <w:webHidden/>
           </w:rPr>
-          <w:instrText xml:space="preserve"> PAGEREF _Toc240059764 \h </w:instrText>
+          <w:instrText xml:space="preserve"> PAGEREF _Toc240060137 \h </w:instrText>
         </w:r>
         <w:r>
           <w:rPr>
@@ -764,7 +765,7 @@
           <w:lang w:val="en-ID" w:eastAsia="en-ID"/>
         </w:rPr>
       </w:pPr>
-      <w:hyperlink w:anchor="_Toc240059765" w:history="1">
+      <w:hyperlink w:anchor="_Toc240060138" w:history="1">
         <w:r>
           <w:rPr>
             <w:rStyle w:val="Hyperlink"/>
@@ -791,7 +792,7 @@
             <w:noProof/>
             <w:webHidden/>
           </w:rPr>
-          <w:instrText xml:space="preserve"> PAGEREF _Toc240059765 \h </w:instrText>
+          <w:instrText xml:space="preserve"> PAGEREF _Toc240060138 \h </w:instrText>
         </w:r>
         <w:r>
           <w:rPr>
@@ -836,7 +837,7 @@
           <w:lang w:val="en-ID" w:eastAsia="en-ID"/>
         </w:rPr>
       </w:pPr>
-      <w:hyperlink w:anchor="_Toc240059766" w:history="1">
+      <w:hyperlink w:anchor="_Toc240060139" w:history="1">
         <w:r>
           <w:rPr>
             <w:rStyle w:val="Hyperlink"/>
@@ -863,7 +864,7 @@
             <w:noProof/>
             <w:webHidden/>
           </w:rPr>
-          <w:instrText xml:space="preserve"> PAGEREF _Toc240059766 \h </w:instrText>
+          <w:instrText xml:space="preserve"> PAGEREF _Toc240060139 \h </w:instrText>
         </w:r>
         <w:r>
           <w:rPr>
@@ -908,7 +909,7 @@
           <w:lang w:val="en-ID" w:eastAsia="en-ID"/>
         </w:rPr>
       </w:pPr>
-      <w:hyperlink w:anchor="_Toc240059767" w:history="1">
+      <w:hyperlink w:anchor="_Toc240060140" w:history="1">
         <w:r>
           <w:rPr>
             <w:rStyle w:val="Hyperlink"/>
@@ -935,7 +936,7 @@
             <w:noProof/>
             <w:webHidden/>
           </w:rPr>
-          <w:instrText xml:space="preserve"> PAGEREF _Toc240059767 \h </w:instrText>
+          <w:instrText xml:space="preserve"> PAGEREF _Toc240060140 \h </w:instrText>
         </w:r>
         <w:r>
           <w:rPr>
@@ -980,7 +981,7 @@
           <w:lang w:val="en-ID" w:eastAsia="en-ID"/>
         </w:rPr>
       </w:pPr>
-      <w:hyperlink w:anchor="_Toc240059768" w:history="1">
+      <w:hyperlink w:anchor="_Toc240060141" w:history="1">
         <w:r>
           <w:rPr>
             <w:rStyle w:val="Hyperlink"/>
@@ -1007,7 +1008,7 @@
             <w:noProof/>
             <w:webHidden/>
           </w:rPr>
-          <w:instrText xml:space="preserve"> PAGEREF _Toc240059768 \h </w:instrText>
+          <w:instrText xml:space="preserve"> PAGEREF _Toc240060141 \h </w:instrText>
         </w:r>
         <w:r>
           <w:rPr>
@@ -1052,7 +1053,7 @@
           <w:lang w:val="en-ID" w:eastAsia="en-ID"/>
         </w:rPr>
       </w:pPr>
-      <w:hyperlink w:anchor="_Toc240059769" w:history="1">
+      <w:hyperlink w:anchor="_Toc240060142" w:history="1">
         <w:r>
           <w:rPr>
             <w:rStyle w:val="Hyperlink"/>
@@ -1079,7 +1080,7 @@
             <w:noProof/>
             <w:webHidden/>
           </w:rPr>
-          <w:instrText xml:space="preserve"> PAGEREF _Toc240059769 \h </w:instrText>
+          <w:instrText xml:space="preserve"> PAGEREF _Toc240060142 \h </w:instrText>
         </w:r>
         <w:r>
           <w:rPr>
@@ -1124,7 +1125,7 @@
           <w:lang w:val="en-ID" w:eastAsia="en-ID"/>
         </w:rPr>
       </w:pPr>
-      <w:hyperlink w:anchor="_Toc240059770" w:history="1">
+      <w:hyperlink w:anchor="_Toc240060143" w:history="1">
         <w:r>
           <w:rPr>
             <w:rStyle w:val="Hyperlink"/>
@@ -1151,7 +1152,7 @@
             <w:noProof/>
             <w:webHidden/>
           </w:rPr>
-          <w:instrText xml:space="preserve"> PAGEREF _Toc240059770 \h </w:instrText>
+          <w:instrText xml:space="preserve"> PAGEREF _Toc240060143 \h </w:instrText>
         </w:r>
         <w:r>
           <w:rPr>
@@ -1196,7 +1197,7 @@
           <w:lang w:val="en-ID" w:eastAsia="en-ID"/>
         </w:rPr>
       </w:pPr>
-      <w:hyperlink w:anchor="_Toc240059771" w:history="1">
+      <w:hyperlink w:anchor="_Toc240060144" w:history="1">
         <w:r>
           <w:rPr>
             <w:rStyle w:val="Hyperlink"/>
@@ -1223,7 +1224,7 @@
             <w:noProof/>
             <w:webHidden/>
           </w:rPr>
-          <w:instrText xml:space="preserve"> PAGEREF _Toc240059771 \h </w:instrText>
+          <w:instrText xml:space="preserve"> PAGEREF _Toc240060144 \h </w:instrText>
         </w:r>
         <w:r>
           <w:rPr>
@@ -1268,7 +1269,7 @@
           <w:lang w:val="en-ID" w:eastAsia="en-ID"/>
         </w:rPr>
       </w:pPr>
-      <w:hyperlink w:anchor="_Toc240059772" w:history="1">
+      <w:hyperlink w:anchor="_Toc240060145" w:history="1">
         <w:r>
           <w:rPr>
             <w:rStyle w:val="Hyperlink"/>
@@ -1295,7 +1296,7 @@
             <w:noProof/>
             <w:webHidden/>
           </w:rPr>
-          <w:instrText xml:space="preserve"> PAGEREF _Toc240059772 \h </w:instrText>
+          <w:instrText xml:space="preserve"> PAGEREF _Toc240060145 \h </w:instrText>
         </w:r>
         <w:r>
           <w:rPr>
@@ -1340,7 +1341,7 @@
           <w:lang w:val="en-ID" w:eastAsia="en-ID"/>
         </w:rPr>
       </w:pPr>
-      <w:hyperlink w:anchor="_Toc240059773" w:history="1">
+      <w:hyperlink w:anchor="_Toc240060146" w:history="1">
         <w:r>
           <w:rPr>
             <w:rStyle w:val="Hyperlink"/>
@@ -1367,7 +1368,7 @@
             <w:noProof/>
             <w:webHidden/>
           </w:rPr>
-          <w:instrText xml:space="preserve"> PAGEREF _Toc240059773 \h </w:instrText>
+          <w:instrText xml:space="preserve"> PAGEREF _Toc240060146 \h </w:instrText>
         </w:r>
         <w:r>
           <w:rPr>
@@ -1412,7 +1413,7 @@
           <w:lang w:val="en-ID" w:eastAsia="en-ID"/>
         </w:rPr>
       </w:pPr>
-      <w:hyperlink w:anchor="_Toc240059774" w:history="1">
+      <w:hyperlink w:anchor="_Toc240060147" w:history="1">
         <w:r>
           <w:rPr>
             <w:rStyle w:val="Hyperlink"/>
@@ -1439,7 +1440,7 @@
             <w:noProof/>
             <w:webHidden/>
           </w:rPr>
-          <w:instrText xml:space="preserve"> PAGEREF _Toc240059774 \h </w:instrText>
+          <w:instrText xml:space="preserve"> PAGEREF _Toc240060147 \h </w:instrText>
         </w:r>
         <w:r>
           <w:rPr>
@@ -1484,7 +1485,7 @@
           <w:lang w:val="en-ID" w:eastAsia="en-ID"/>
         </w:rPr>
       </w:pPr>
-      <w:hyperlink w:anchor="_Toc240059775" w:history="1">
+      <w:hyperlink w:anchor="_Toc240060148" w:history="1">
         <w:r>
           <w:rPr>
             <w:rStyle w:val="Hyperlink"/>
@@ -1511,7 +1512,7 @@
             <w:noProof/>
             <w:webHidden/>
           </w:rPr>
-          <w:instrText xml:space="preserve"> PAGEREF _Toc240059775 \h </w:instrText>
+          <w:instrText xml:space="preserve"> PAGEREF _Toc240060148 \h </w:instrText>
         </w:r>
         <w:r>
           <w:rPr>
@@ -1556,7 +1557,7 @@
           <w:lang w:val="en-ID" w:eastAsia="en-ID"/>
         </w:rPr>
       </w:pPr>
-      <w:hyperlink w:anchor="_Toc240059776" w:history="1">
+      <w:hyperlink w:anchor="_Toc240060149" w:history="1">
         <w:r>
           <w:rPr>
             <w:rStyle w:val="Hyperlink"/>
@@ -1583,7 +1584,7 @@
             <w:noProof/>
             <w:webHidden/>
           </w:rPr>
-          <w:instrText xml:space="preserve"> PAGEREF _Toc240059776 \h </w:instrText>
+          <w:instrText xml:space="preserve"> PAGEREF _Toc240060149 \h </w:instrText>
         </w:r>
         <w:r>
           <w:rPr>
@@ -1628,7 +1629,7 @@
           <w:lang w:val="en-ID" w:eastAsia="en-ID"/>
         </w:rPr>
       </w:pPr>
-      <w:hyperlink w:anchor="_Toc240059777" w:history="1">
+      <w:hyperlink w:anchor="_Toc240060150" w:history="1">
         <w:r>
           <w:rPr>
             <w:rStyle w:val="Hyperlink"/>
@@ -1655,7 +1656,7 @@
             <w:noProof/>
             <w:webHidden/>
           </w:rPr>
-          <w:instrText xml:space="preserve"> PAGEREF _Toc240059777 \h </w:instrText>
+          <w:instrText xml:space="preserve"> PAGEREF _Toc240060150 \h </w:instrText>
         </w:r>
         <w:r>
           <w:rPr>
@@ -1700,7 +1701,7 @@
           <w:lang w:val="en-ID" w:eastAsia="en-ID"/>
         </w:rPr>
       </w:pPr>
-      <w:hyperlink w:anchor="_Toc240059778" w:history="1">
+      <w:hyperlink w:anchor="_Toc240060151" w:history="1">
         <w:r>
           <w:rPr>
             <w:rStyle w:val="Hyperlink"/>
@@ -1727,7 +1728,7 @@
             <w:noProof/>
             <w:webHidden/>
           </w:rPr>
-          <w:instrText xml:space="preserve"> PAGEREF _Toc240059778 \h </w:instrText>
+          <w:instrText xml:space="preserve"> PAGEREF _Toc240060151 \h </w:instrText>
         </w:r>
         <w:r>
           <w:rPr>
@@ -1772,7 +1773,7 @@
           <w:lang w:val="en-ID" w:eastAsia="en-ID"/>
         </w:rPr>
       </w:pPr>
-      <w:hyperlink w:anchor="_Toc240059779" w:history="1">
+      <w:hyperlink w:anchor="_Toc240060152" w:history="1">
         <w:r>
           <w:rPr>
             <w:rStyle w:val="Hyperlink"/>
@@ -1799,7 +1800,7 @@
             <w:noProof/>
             <w:webHidden/>
           </w:rPr>
-          <w:instrText xml:space="preserve"> PAGEREF _Toc240059779 \h </w:instrText>
+          <w:instrText xml:space="preserve"> PAGEREF _Toc240060152 \h </w:instrText>
         </w:r>
         <w:r>
           <w:rPr>
@@ -1844,7 +1845,7 @@
           <w:lang w:val="en-ID" w:eastAsia="en-ID"/>
         </w:rPr>
       </w:pPr>
-      <w:hyperlink w:anchor="_Toc240059780" w:history="1">
+      <w:hyperlink w:anchor="_Toc240060153" w:history="1">
         <w:r>
           <w:rPr>
             <w:rStyle w:val="Hyperlink"/>
@@ -1871,7 +1872,7 @@
             <w:noProof/>
             <w:webHidden/>
           </w:rPr>
-          <w:instrText xml:space="preserve"> PAGEREF _Toc240059780 \h </w:instrText>
+          <w:instrText xml:space="preserve"> PAGEREF _Toc240060153 \h </w:instrText>
         </w:r>
         <w:r>
           <w:rPr>
@@ -1916,7 +1917,7 @@
           <w:lang w:val="en-ID" w:eastAsia="en-ID"/>
         </w:rPr>
       </w:pPr>
-      <w:hyperlink w:anchor="_Toc240059781" w:history="1">
+      <w:hyperlink w:anchor="_Toc240060154" w:history="1">
         <w:r>
           <w:rPr>
             <w:rStyle w:val="Hyperlink"/>
@@ -1943,7 +1944,7 @@
             <w:noProof/>
             <w:webHidden/>
           </w:rPr>
-          <w:instrText xml:space="preserve"> PAGEREF _Toc240059781 \h </w:instrText>
+          <w:instrText xml:space="preserve"> PAGEREF _Toc240060154 \h </w:instrText>
         </w:r>
         <w:r>
           <w:rPr>
@@ -1988,7 +1989,7 @@
           <w:lang w:val="en-ID" w:eastAsia="en-ID"/>
         </w:rPr>
       </w:pPr>
-      <w:hyperlink w:anchor="_Toc240059782" w:history="1">
+      <w:hyperlink w:anchor="_Toc240060155" w:history="1">
         <w:r>
           <w:rPr>
             <w:rStyle w:val="Hyperlink"/>
@@ -2015,7 +2016,7 @@
             <w:noProof/>
             <w:webHidden/>
           </w:rPr>
-          <w:instrText xml:space="preserve"> PAGEREF _Toc240059782 \h </w:instrText>
+          <w:instrText xml:space="preserve"> PAGEREF _Toc240060155 \h </w:instrText>
         </w:r>
         <w:r>
           <w:rPr>
@@ -2060,7 +2061,7 @@
           <w:lang w:val="en-ID" w:eastAsia="en-ID"/>
         </w:rPr>
       </w:pPr>
-      <w:hyperlink w:anchor="_Toc240059783" w:history="1">
+      <w:hyperlink w:anchor="_Toc240060156" w:history="1">
         <w:r>
           <w:rPr>
             <w:rStyle w:val="Hyperlink"/>
@@ -2087,7 +2088,7 @@
             <w:noProof/>
             <w:webHidden/>
           </w:rPr>
-          <w:instrText xml:space="preserve"> PAGEREF _Toc240059783 \h </w:instrText>
+          <w:instrText xml:space="preserve"> PAGEREF _Toc240060156 \h </w:instrText>
         </w:r>
         <w:r>
           <w:rPr>
@@ -2132,7 +2133,7 @@
           <w:lang w:val="en-ID" w:eastAsia="en-ID"/>
         </w:rPr>
       </w:pPr>
-      <w:hyperlink w:anchor="_Toc240059784" w:history="1">
+      <w:hyperlink w:anchor="_Toc240060157" w:history="1">
         <w:r>
           <w:rPr>
             <w:rStyle w:val="Hyperlink"/>
@@ -2159,7 +2160,7 @@
             <w:noProof/>
             <w:webHidden/>
           </w:rPr>
-          <w:instrText xml:space="preserve"> PAGEREF _Toc240059784 \h </w:instrText>
+          <w:instrText xml:space="preserve"> PAGEREF _Toc240060157 \h </w:instrText>
         </w:r>
         <w:r>
           <w:rPr>
@@ -2204,7 +2205,7 @@
           <w:lang w:val="en-ID" w:eastAsia="en-ID"/>
         </w:rPr>
       </w:pPr>
-      <w:hyperlink w:anchor="_Toc240059785" w:history="1">
+      <w:hyperlink w:anchor="_Toc240060158" w:history="1">
         <w:r>
           <w:rPr>
             <w:rStyle w:val="Hyperlink"/>
@@ -2231,7 +2232,7 @@
             <w:noProof/>
             <w:webHidden/>
           </w:rPr>
-          <w:instrText xml:space="preserve"> PAGEREF _Toc240059785 \h </w:instrText>
+          <w:instrText xml:space="preserve"> PAGEREF _Toc240060158 \h </w:instrText>
         </w:r>
         <w:r>
           <w:rPr>
@@ -2276,7 +2277,7 @@
           <w:lang w:val="en-ID" w:eastAsia="en-ID"/>
         </w:rPr>
       </w:pPr>
-      <w:hyperlink w:anchor="_Toc240059786" w:history="1">
+      <w:hyperlink w:anchor="_Toc240060159" w:history="1">
         <w:r>
           <w:rPr>
             <w:rStyle w:val="Hyperlink"/>
@@ -2303,7 +2304,7 @@
             <w:noProof/>
             <w:webHidden/>
           </w:rPr>
-          <w:instrText xml:space="preserve"> PAGEREF _Toc240059786 \h </w:instrText>
+          <w:instrText xml:space="preserve"> PAGEREF _Toc240060159 \h </w:instrText>
         </w:r>
         <w:r>
           <w:rPr>
@@ -2348,7 +2349,7 @@
           <w:lang w:val="en-ID" w:eastAsia="en-ID"/>
         </w:rPr>
       </w:pPr>
-      <w:hyperlink w:anchor="_Toc240059787" w:history="1">
+      <w:hyperlink w:anchor="_Toc240060160" w:history="1">
         <w:r>
           <w:rPr>
             <w:rStyle w:val="Hyperlink"/>
@@ -2375,7 +2376,7 @@
             <w:noProof/>
             <w:webHidden/>
           </w:rPr>
-          <w:instrText xml:space="preserve"> PAGEREF _Toc240059787 \h </w:instrText>
+          <w:instrText xml:space="preserve"> PAGEREF _Toc240060160 \h </w:instrText>
         </w:r>
         <w:r>
           <w:rPr>
@@ -2420,7 +2421,7 @@
       <w:pPr>
         <w:pStyle w:val="Heading1"/>
       </w:pPr>
-      <w:bookmarkStart w:id="0" w:name="_Toc240059764"/>
+      <w:bookmarkStart w:id="0" w:name="_Toc240060137"/>
       <w:r>
         <w:lastRenderedPageBreak/>
         <w:t>About This Document</w:t>
@@ -2552,7 +2553,7 @@
       <w:pPr>
         <w:pStyle w:val="Heading1"/>
       </w:pPr>
-      <w:bookmarkStart w:id="1" w:name="_Toc240059765"/>
+      <w:bookmarkStart w:id="1" w:name="_Toc240060138"/>
       <w:r>
         <w:t>1. Basic Information (Application and Organization)</w:t>
       </w:r>
@@ -2621,7 +2622,7 @@
       <w:pPr>
         <w:pStyle w:val="Heading1"/>
       </w:pPr>
-      <w:bookmarkStart w:id="2" w:name="_Toc240059766"/>
+      <w:bookmarkStart w:id="2" w:name="_Toc240060139"/>
       <w:r>
         <w:t>2. Technical Documentation</w:t>
       </w:r>
@@ -2636,7 +2637,7 @@
       <w:pPr>
         <w:pStyle w:val="Heading2"/>
       </w:pPr>
-      <w:bookmarkStart w:id="3" w:name="_Toc240059767"/>
+      <w:bookmarkStart w:id="3" w:name="_Toc240060140"/>
       <w:r>
         <w:t>2.1 · Detailed Product Description</w:t>
       </w:r>
@@ -2688,7 +2689,7 @@
       <w:pPr>
         <w:pStyle w:val="Heading2"/>
       </w:pPr>
-      <w:bookmarkStart w:id="4" w:name="_Toc240059768"/>
+      <w:bookmarkStart w:id="4" w:name="_Toc240060141"/>
       <w:r>
         <w:t>2.2 · Product Na</w:t>
       </w:r>
@@ -3096,7 +3097,7 @@
           <w:color w:val="4A4A4A"/>
           <w:sz w:val="18"/>
         </w:rPr>
-        <w:t>Source: official product technical datasheet (Institute of Technology Bandung, Revision 4.0), cross-referenced with internal technical specification d</w:t>
+        <w:t xml:space="preserve">Source: official product technical datasheet (Institute of Technology Bandung, Revision 4.0), cross-referenced with internal technical </w:t>
       </w:r>
       <w:r>
         <w:rPr>
@@ -3104,14 +3105,14 @@
           <w:color w:val="4A4A4A"/>
           <w:sz w:val="18"/>
         </w:rPr>
-        <w:t>ocumentation and EMC parameter measurement data.</w:t>
+        <w:t>specification documentation and EMC parameter measurement data.</w:t>
       </w:r>
     </w:p>
     <w:p>
       <w:pPr>
         <w:pStyle w:val="Heading2"/>
       </w:pPr>
-      <w:bookmarkStart w:id="5" w:name="_Toc240059769"/>
+      <w:bookmarkStart w:id="5" w:name="_Toc240060142"/>
       <w:r>
         <w:t>2.3 · Functional Description and Technical Parameters (Electrical, Mechanical, etc.)</w:t>
       </w:r>
@@ -3119,16 +3120,16 @@
     </w:p>
     <w:p>
       <w:r>
-        <w:t xml:space="preserve">Functional workflow (normal operating mode): sense → process → transmit. Each of the eight gas sensors </w:t>
+        <w:t>Functional workflow (normal operating mode): sense → process → transmit. Each of the eight gas sensors cont</w:t>
       </w:r>
       <w:r>
-        <w:t xml:space="preserve">continuously samples ambient conditions → data is normalized and classified by the on-device AI model (ESP32-S3) → the result is transmitted over the LoRa network (star-topology transmission) at a configurable interval (default 10 seconds), or immediately </w:t>
+        <w:t>inuously samples ambient conditions → data is normalized and classified by the on-device AI model (ESP32-S3) → the result is transmitted over the LoRa network (star-topology transmission) at a configurable interval (default 10 seconds), or immediately (eve</w:t>
       </w:r>
       <w:r>
-        <w:t xml:space="preserve">(event-driven) when an alarm condition is detected. Gas alarms are triggered through two parallel channels: a local visual/audible alarm module on the unit itself, and a push notification transmitted over the LoRa network to the dashboard — the alarm-push </w:t>
+        <w:t>nt-driven) when an alarm condition is detected. Gas alarms are triggered through two parallel channels: a local visual/audible alarm module on the unit itself, and a push notification transmitted over the LoRa network to the dashboard — the alarm-push path</w:t>
       </w:r>
       <w:r>
-        <w:t xml:space="preserve">pathway has been </w:t>
+        <w:t xml:space="preserve">way has been </w:t>
       </w:r>
       <w:r>
         <w:lastRenderedPageBreak/>
@@ -3139,7 +3140,7 @@
       <w:pPr>
         <w:pStyle w:val="Heading3"/>
       </w:pPr>
-      <w:bookmarkStart w:id="6" w:name="_Toc240059770"/>
+      <w:bookmarkStart w:id="6" w:name="_Toc240060143"/>
       <w:r>
         <w:t>2.3.a · Electrical Parameters — Node Sensor (GLD)</w:t>
       </w:r>
@@ -3830,13 +3831,13 @@
               <w:rPr>
                 <w:sz w:val="19"/>
               </w:rPr>
-              <w:t>Scope of electrica</w:t>
+              <w:t xml:space="preserve">Scope of </w:t>
             </w:r>
             <w:r>
               <w:rPr>
                 <w:sz w:val="19"/>
               </w:rPr>
-              <w:t>l protection not yet defined/documented.</w:t>
+              <w:t>electrical protection not yet defined/documented.</w:t>
             </w:r>
           </w:p>
         </w:tc>
@@ -3851,7 +3852,7 @@
       <w:pPr>
         <w:pStyle w:val="Heading3"/>
       </w:pPr>
-      <w:bookmarkStart w:id="7" w:name="_Toc240059771"/>
+      <w:bookmarkStart w:id="7" w:name="_Toc240060144"/>
       <w:r>
         <w:t>2.3.b · Sensor and Communication Parameters — Node Sensor (GLD)</w:t>
       </w:r>
@@ -4019,13 +4020,7 @@
               <w:rPr>
                 <w:sz w:val="19"/>
               </w:rPr>
-              <w:t xml:space="preserve">Metal-oxide </w:t>
-            </w:r>
-            <w:r>
-              <w:rPr>
-                <w:sz w:val="19"/>
-              </w:rPr>
-              <w:t>semiconductor sensors; sensing element directly exposed to ambient air.</w:t>
+              <w:t>Metal-oxide semiconductor sensors; sensing element directly exposed to ambient air.</w:t>
             </w:r>
           </w:p>
         </w:tc>
@@ -4097,13 +4092,13 @@
               <w:rPr>
                 <w:sz w:val="19"/>
               </w:rPr>
-              <w:t>Runs locally on the ESP32-S3 (Running/Inference mode); outputs a class label and a confidence va</w:t>
+              <w:t>Runs locally on the ESP32-S3 (Running/Inference mode); outputs a class label and a c</w:t>
             </w:r>
             <w:r>
               <w:rPr>
                 <w:sz w:val="19"/>
               </w:rPr>
-              <w:t xml:space="preserve">lue. Does not yet cover CO₂, Benzene, CO, </w:t>
+              <w:t xml:space="preserve">onfidence value. Does not yet cover CO₂, Benzene, CO, </w:t>
             </w:r>
             <w:r>
               <w:rPr>
@@ -4677,13 +4672,13 @@
               <w:rPr>
                 <w:sz w:val="19"/>
               </w:rPr>
-              <w:t>External, omnidirectional, SMA male connector</w:t>
+              <w:t xml:space="preserve">External, omnidirectional, SMA male </w:t>
             </w:r>
             <w:r>
               <w:rPr>
                 <w:sz w:val="19"/>
               </w:rPr>
-              <w:t>, 3 dBi gain</w:t>
+              <w:t>connector, 3 dBi gain</w:t>
             </w:r>
           </w:p>
         </w:tc>
@@ -4789,13 +4784,13 @@
               <w:rPr>
                 <w:sz w:val="19"/>
               </w:rPr>
-              <w:t xml:space="preserve">Alarm events are transmitted immediately, independent of the </w:t>
+              <w:t xml:space="preserve">Alarm events are transmitted immediately, independent of </w:t>
             </w:r>
             <w:r>
               <w:rPr>
                 <w:sz w:val="19"/>
               </w:rPr>
-              <w:t>periodic interval.</w:t>
+              <w:t>the periodic interval.</w:t>
             </w:r>
           </w:p>
         </w:tc>
@@ -4939,13 +4934,7 @@
               <w:rPr>
                 <w:sz w:val="19"/>
               </w:rPr>
-              <w:t xml:space="preserve">Provides 8 </w:t>
-            </w:r>
-            <w:r>
-              <w:rPr>
-                <w:sz w:val="19"/>
-              </w:rPr>
-              <w:t>read-only registers (device status word, classification result, confidence, battery voltage, power source, external power, LoRa transmission counter, node ID); not used for product control.</w:t>
+              <w:t>Provides 8 read-only registers (device status word, classification result, confidence, battery voltage, power source, external power, LoRa transmission counter, node ID); not used for product control.</w:t>
             </w:r>
           </w:p>
         </w:tc>
@@ -4960,7 +4949,7 @@
       <w:pPr>
         <w:pStyle w:val="Heading3"/>
       </w:pPr>
-      <w:bookmarkStart w:id="8" w:name="_Toc240059772"/>
+      <w:bookmarkStart w:id="8" w:name="_Toc240060145"/>
       <w:r>
         <w:lastRenderedPageBreak/>
         <w:t>2.3.c · Mechanical Parameters — Node Sensor (GLD)</w:t>
@@ -5000,34 +4989,34 @@
                 <w:color w:val="4A4A4A"/>
                 <w:sz w:val="18"/>
               </w:rPr>
-              <w:t>PARAMETER</w:t>
-            </w:r>
-          </w:p>
-        </w:tc>
-        <w:tc>
-          <w:tcPr>
-            <w:tcW w:w="2736" w:type="dxa"/>
-            <w:shd w:val="clear" w:color="auto" w:fill="EFEFEF"/>
-          </w:tcPr>
-          <w:p>
-            <w:pPr>
-              <w:spacing w:after="40"/>
-            </w:pPr>
+              <w:t>PAR</w:t>
+            </w:r>
             <w:r>
               <w:rPr>
                 <w:b/>
                 <w:color w:val="4A4A4A"/>
                 <w:sz w:val="18"/>
               </w:rPr>
-              <w:t>SPEC</w:t>
-            </w:r>
+              <w:t>AMETER</w:t>
+            </w:r>
+          </w:p>
+        </w:tc>
+        <w:tc>
+          <w:tcPr>
+            <w:tcW w:w="2736" w:type="dxa"/>
+            <w:shd w:val="clear" w:color="auto" w:fill="EFEFEF"/>
+          </w:tcPr>
+          <w:p>
+            <w:pPr>
+              <w:spacing w:after="40"/>
+            </w:pPr>
             <w:r>
               <w:rPr>
                 <w:b/>
                 <w:color w:val="4A4A4A"/>
                 <w:sz w:val="18"/>
               </w:rPr>
-              <w:t>IFICATION</w:t>
+              <w:t>SPECIFICATION</w:t>
             </w:r>
           </w:p>
         </w:tc>
@@ -5792,7 +5781,7 @@
       <w:pPr>
         <w:pStyle w:val="Heading2"/>
       </w:pPr>
-      <w:bookmarkStart w:id="9" w:name="_Toc240059773"/>
+      <w:bookmarkStart w:id="9" w:name="_Toc240060146"/>
       <w:r>
         <w:t>2.4 · Product Photographs — Overall and Key Components</w:t>
       </w:r>
@@ -5835,7 +5824,7 @@
               </w:rPr>
               <w:lastRenderedPageBreak/>
               <w:drawing>
-                <wp:inline distT="0" distB="0" distL="0" distR="0" wp14:anchorId="2068F023" wp14:editId="74D13512">
+                <wp:inline distT="0" distB="0" distL="0" distR="0" wp14:anchorId="29AA3093" wp14:editId="01163E97">
                   <wp:extent cx="1379912" cy="2286000"/>
                   <wp:effectExtent l="0" t="0" r="0" b="0"/>
                   <wp:docPr id="1" name="Picture 1"/>
@@ -5919,7 +5908,7 @@
                 <w:noProof/>
               </w:rPr>
               <w:drawing>
-                <wp:inline distT="0" distB="0" distL="0" distR="0" wp14:anchorId="18EDE2E3" wp14:editId="7925CEF1">
+                <wp:inline distT="0" distB="0" distL="0" distR="0" wp14:anchorId="4D6BC966" wp14:editId="3B1A1DC8">
                   <wp:extent cx="1714500" cy="2286000"/>
                   <wp:effectExtent l="0" t="0" r="0" b="0"/>
                   <wp:docPr id="2" name="Picture 2"/>
@@ -6008,7 +5997,7 @@
                 <w:noProof/>
               </w:rPr>
               <w:drawing>
-                <wp:inline distT="0" distB="0" distL="0" distR="0" wp14:anchorId="3A80E165" wp14:editId="7D53C49E">
+                <wp:inline distT="0" distB="0" distL="0" distR="0" wp14:anchorId="73F54AC9" wp14:editId="2442E5A6">
                   <wp:extent cx="1026621" cy="2286000"/>
                   <wp:effectExtent l="0" t="0" r="0" b="0"/>
                   <wp:docPr id="3" name="Picture 3"/>
@@ -6092,7 +6081,7 @@
                 <w:noProof/>
               </w:rPr>
               <w:drawing>
-                <wp:inline distT="0" distB="0" distL="0" distR="0" wp14:anchorId="11AAD4F1" wp14:editId="61B7D89F">
+                <wp:inline distT="0" distB="0" distL="0" distR="0" wp14:anchorId="3570E90C" wp14:editId="47A93FBC">
                   <wp:extent cx="1026621" cy="2286000"/>
                   <wp:effectExtent l="0" t="0" r="0" b="0"/>
                   <wp:docPr id="4" name="Picture 4"/>
@@ -6182,7 +6171,7 @@
               </w:rPr>
               <w:lastRenderedPageBreak/>
               <w:drawing>
-                <wp:inline distT="0" distB="0" distL="0" distR="0" wp14:anchorId="64FE3901" wp14:editId="07DDD520">
+                <wp:inline distT="0" distB="0" distL="0" distR="0" wp14:anchorId="42FEE8FC" wp14:editId="483CF5A5">
                   <wp:extent cx="1026621" cy="2286000"/>
                   <wp:effectExtent l="0" t="0" r="0" b="0"/>
                   <wp:docPr id="5" name="Picture 5"/>
@@ -6259,7 +6248,7 @@
                 <w:noProof/>
               </w:rPr>
               <w:drawing>
-                <wp:inline distT="0" distB="0" distL="0" distR="0" wp14:anchorId="6445E678" wp14:editId="68A76C1F">
+                <wp:inline distT="0" distB="0" distL="0" distR="0" wp14:anchorId="65A89C92" wp14:editId="108B80E2">
                   <wp:extent cx="1026621" cy="2286000"/>
                   <wp:effectExtent l="0" t="0" r="0" b="0"/>
                   <wp:docPr id="6" name="Picture 6"/>
@@ -6348,7 +6337,7 @@
                 <w:noProof/>
               </w:rPr>
               <w:drawing>
-                <wp:inline distT="0" distB="0" distL="0" distR="0" wp14:anchorId="79EBDBFE" wp14:editId="68638D57">
+                <wp:inline distT="0" distB="0" distL="0" distR="0" wp14:anchorId="52DC0A89" wp14:editId="5E8CF898">
                   <wp:extent cx="1026621" cy="2286000"/>
                   <wp:effectExtent l="0" t="0" r="0" b="0"/>
                   <wp:docPr id="7" name="Picture 7"/>
@@ -6493,7 +6482,7 @@
       <w:pPr>
         <w:pStyle w:val="Heading2"/>
       </w:pPr>
-      <w:bookmarkStart w:id="10" w:name="_Toc240059774"/>
+      <w:bookmarkStart w:id="10" w:name="_Toc240060147"/>
       <w:r>
         <w:t>2.5 · Description of Intended Use and Installation Environment (Gas Group, Temperature Class, Area Classification)</w:t>
       </w:r>
@@ -6501,17 +6490,17 @@
     </w:p>
     <w:p>
       <w:r>
-        <w:t>The GLD is intended for continuous, fixed-point monitoring of fla</w:t>
+        <w:t xml:space="preserve">The GLD is intended for continuous, fixed-point </w:t>
       </w:r>
       <w:r>
-        <w:t xml:space="preserve">mmable and toxic gas leaks in oil &amp; gas refinery hazardous areas — process units, tank farms, pipe racks, and loading/unloading areas. The specific Ex </w:t>
+        <w:t xml:space="preserve">monitoring of flammable and toxic gas leaks in oil &amp; gas refinery hazardous areas — process units, tank farms, pipe racks, and loading/unloading areas. The specific Ex </w:t>
       </w:r>
       <w:r>
         <w:lastRenderedPageBreak/>
-        <w:t xml:space="preserve">classification parameters below reflect the project engineering team's current recommendation, developed </w:t>
+        <w:t>classification parameters below reflect the project engineering team's current recommend</w:t>
       </w:r>
       <w:r>
-        <w:t>from the intended deployment envelope and the gases the device is designed to detect; none of these parameters has yet been confirmed with the certification body (ExCB) or a notified body, and none should be treated as final.</w:t>
+        <w:t>ation, developed from the intended deployment envelope and the gases the device is designed to detect; none of these parameters has yet been confirmed with the certification body (ExCB) or a notified body, and none should be treated as final.</w:t>
       </w:r>
     </w:p>
     <w:tbl>
@@ -6676,13 +6665,13 @@
               <w:rPr>
                 <w:sz w:val="19"/>
               </w:rPr>
-              <w:t>Hydrogen (H₂) is one of the three gases the classifier is designed to detect (Section 2.3.b); IIC is required for hydrogen and inherently covers IIB</w:t>
+              <w:t xml:space="preserve">Hydrogen (H₂) is one of the three gases the classifier is designed to detect (Section 2.3.b); IIC is required for hydrogen and inherently </w:t>
             </w:r>
             <w:r>
               <w:rPr>
                 <w:sz w:val="19"/>
               </w:rPr>
-              <w:t xml:space="preserve"> and IIA.</w:t>
+              <w:t>covers IIB and IIA.</w:t>
             </w:r>
           </w:p>
         </w:tc>
@@ -6985,7 +6974,7 @@
       <w:pPr>
         <w:pStyle w:val="Heading2"/>
       </w:pPr>
-      <w:bookmarkStart w:id="11" w:name="_Toc240059775"/>
+      <w:bookmarkStart w:id="11" w:name="_Toc240060148"/>
       <w:r>
         <w:t>2.6 · Design and Manufacturing Information</w:t>
       </w:r>
@@ -7003,7 +6992,7 @@
       <w:pPr>
         <w:pStyle w:val="Heading3"/>
       </w:pPr>
-      <w:bookmarkStart w:id="12" w:name="_Toc240059776"/>
+      <w:bookmarkStart w:id="12" w:name="_Toc240060149"/>
       <w:r>
         <w:t>2.6.a · Complete Drawings (Assembly, Component, Electrical Schematic, PCB Layout, Enclosure Structure, Junction Box, Terminal, Grounding)</w:t>
       </w:r>
@@ -7030,7 +7019,7 @@
         </w:rPr>
         <w:lastRenderedPageBreak/>
         <w:drawing>
-          <wp:inline distT="0" distB="0" distL="0" distR="0" wp14:anchorId="4E323C5D" wp14:editId="78429BFD">
+          <wp:inline distT="0" distB="0" distL="0" distR="0" wp14:anchorId="6129BC5A" wp14:editId="192BC06F">
             <wp:extent cx="5120640" cy="3413760"/>
             <wp:effectExtent l="0" t="0" r="0" b="0"/>
             <wp:docPr id="8" name="Picture 8"/>
@@ -7109,7 +7098,7 @@
           <w:noProof/>
         </w:rPr>
         <w:drawing>
-          <wp:inline distT="0" distB="0" distL="0" distR="0" wp14:anchorId="2E6741CE" wp14:editId="4A545048">
+          <wp:inline distT="0" distB="0" distL="0" distR="0" wp14:anchorId="3E821FD7" wp14:editId="210C59D1">
             <wp:extent cx="5120640" cy="3413760"/>
             <wp:effectExtent l="0" t="0" r="0" b="0"/>
             <wp:docPr id="9" name="Picture 9"/>
@@ -7189,7 +7178,7 @@
         </w:rPr>
         <w:lastRenderedPageBreak/>
         <w:drawing>
-          <wp:inline distT="0" distB="0" distL="0" distR="0" wp14:anchorId="1F98A8D5" wp14:editId="3E91C294">
+          <wp:inline distT="0" distB="0" distL="0" distR="0" wp14:anchorId="71DE712D" wp14:editId="7DA8CBC5">
             <wp:extent cx="5120640" cy="3413760"/>
             <wp:effectExtent l="0" t="0" r="0" b="0"/>
             <wp:docPr id="10" name="Picture 10"/>
@@ -7261,7 +7250,7 @@
           <w:noProof/>
         </w:rPr>
         <w:drawing>
-          <wp:inline distT="0" distB="0" distL="0" distR="0" wp14:anchorId="78E28160" wp14:editId="248A495F">
+          <wp:inline distT="0" distB="0" distL="0" distR="0" wp14:anchorId="4F9E51A8" wp14:editId="07AF7513">
             <wp:extent cx="5120640" cy="3413760"/>
             <wp:effectExtent l="0" t="0" r="0" b="0"/>
             <wp:docPr id="11" name="Picture 11"/>
@@ -7341,7 +7330,7 @@
         </w:rPr>
         <w:lastRenderedPageBreak/>
         <w:drawing>
-          <wp:inline distT="0" distB="0" distL="0" distR="0" wp14:anchorId="682D80F9" wp14:editId="34B9CAE4">
+          <wp:inline distT="0" distB="0" distL="0" distR="0" wp14:anchorId="712B019D" wp14:editId="19E9C838">
             <wp:extent cx="5120640" cy="3413760"/>
             <wp:effectExtent l="0" t="0" r="0" b="0"/>
             <wp:docPr id="12" name="Picture 12"/>
@@ -7413,7 +7402,7 @@
           <w:noProof/>
         </w:rPr>
         <w:drawing>
-          <wp:inline distT="0" distB="0" distL="0" distR="0" wp14:anchorId="56A95F06" wp14:editId="3AAF4CFC">
+          <wp:inline distT="0" distB="0" distL="0" distR="0" wp14:anchorId="38B2BA47" wp14:editId="3BA0F688">
             <wp:extent cx="5120640" cy="3413760"/>
             <wp:effectExtent l="0" t="0" r="0" b="0"/>
             <wp:docPr id="13" name="Picture 13"/>
@@ -7493,7 +7482,7 @@
         </w:rPr>
         <w:lastRenderedPageBreak/>
         <w:drawing>
-          <wp:inline distT="0" distB="0" distL="0" distR="0" wp14:anchorId="72293749" wp14:editId="323AE042">
+          <wp:inline distT="0" distB="0" distL="0" distR="0" wp14:anchorId="291E96D9" wp14:editId="158DDBB3">
             <wp:extent cx="5120640" cy="3413760"/>
             <wp:effectExtent l="0" t="0" r="0" b="0"/>
             <wp:docPr id="14" name="Picture 14"/>
@@ -7572,7 +7561,7 @@
           <w:noProof/>
         </w:rPr>
         <w:drawing>
-          <wp:inline distT="0" distB="0" distL="0" distR="0" wp14:anchorId="17BA1DD2" wp14:editId="5A16AC99">
+          <wp:inline distT="0" distB="0" distL="0" distR="0" wp14:anchorId="7E3225D5" wp14:editId="64E26B57">
             <wp:extent cx="5120640" cy="3413760"/>
             <wp:effectExtent l="0" t="0" r="0" b="0"/>
             <wp:docPr id="15" name="Picture 15"/>
@@ -7645,7 +7634,7 @@
         </w:rPr>
         <w:lastRenderedPageBreak/>
         <w:drawing>
-          <wp:inline distT="0" distB="0" distL="0" distR="0" wp14:anchorId="32E842F9" wp14:editId="135E18AF">
+          <wp:inline distT="0" distB="0" distL="0" distR="0" wp14:anchorId="5D3CD852" wp14:editId="0243BB54">
             <wp:extent cx="5120640" cy="3413760"/>
             <wp:effectExtent l="0" t="0" r="0" b="0"/>
             <wp:docPr id="16" name="Picture 16"/>
@@ -7724,7 +7713,7 @@
           <w:noProof/>
         </w:rPr>
         <w:drawing>
-          <wp:inline distT="0" distB="0" distL="0" distR="0" wp14:anchorId="1BE5BD54" wp14:editId="579D0B7E">
+          <wp:inline distT="0" distB="0" distL="0" distR="0" wp14:anchorId="7B762A74" wp14:editId="7F479309">
             <wp:extent cx="2468880" cy="2479268"/>
             <wp:effectExtent l="0" t="0" r="0" b="0"/>
             <wp:docPr id="17" name="Picture 17"/>
@@ -7767,7 +7756,7 @@
           <w:noProof/>
         </w:rPr>
         <w:drawing>
-          <wp:inline distT="0" distB="0" distL="0" distR="0" wp14:anchorId="3ECEC1A8" wp14:editId="1CE81E8E">
+          <wp:inline distT="0" distB="0" distL="0" distR="0" wp14:anchorId="77E0AA97" wp14:editId="00FD5979">
             <wp:extent cx="2468880" cy="1804956"/>
             <wp:effectExtent l="0" t="0" r="0" b="0"/>
             <wp:docPr id="18" name="Picture 18"/>
@@ -7855,7 +7844,7 @@
         </w:rPr>
         <w:lastRenderedPageBreak/>
         <w:drawing>
-          <wp:inline distT="0" distB="0" distL="0" distR="0" wp14:anchorId="0FE8DCDE" wp14:editId="736DFBB9">
+          <wp:inline distT="0" distB="0" distL="0" distR="0" wp14:anchorId="125E18C1" wp14:editId="3EE85485">
             <wp:extent cx="5669280" cy="3847707"/>
             <wp:effectExtent l="0" t="0" r="0" b="0"/>
             <wp:docPr id="19" name="Picture 19"/>
@@ -8438,38 +8427,38 @@
       <w:pPr>
         <w:pStyle w:val="Heading3"/>
       </w:pPr>
-      <w:bookmarkStart w:id="13" w:name="_Toc240059777"/>
+      <w:bookmarkStart w:id="13" w:name="_Toc240060150"/>
       <w:r>
-        <w:t xml:space="preserve">2.6.b · Bill of Materials (BOM) for </w:t>
+        <w:t>2.6.b · Bill of Materials (BOM) for Explosion-Safety-Relevant</w:t>
       </w:r>
       <w:r>
-        <w:t>Explosion-Safety-Relevant Components</w:t>
+        <w:t xml:space="preserve"> Components</w:t>
       </w:r>
       <w:bookmarkEnd w:id="13"/>
     </w:p>
     <w:p>
       <w:r>
-        <w:t xml:space="preserve">A complete, itemized electronic-component BOM for both the main board and the external sensor board now exists, exported directly from the EasyEDA/JLCPCB source project (manufacturer, manufacturer part number, and LCSC </w:t>
+        <w:t xml:space="preserve">A complete, itemized electronic-component BOM for both the main board and the external sensor board now exists, exported directly from the EasyEDA/JLCPCB source project (manufacturer, manufacturer part number, and LCSC supplier part number for </w:t>
       </w:r>
       <w:r>
-        <w:t>supplier part number for each line item; 89 line items / 214 placed components on the main board, 14 line items / 24 placed components on the sensor board — full tables below). This is real, traceable sourcing data and materially improves on the previous s</w:t>
-      </w:r>
-      <w:r>
-        <w:t>tatus.</w:t>
+        <w:t>each line item; 89 line items / 214 placed components on the main board, 14 line items / 24 placed components on the sensor board — full tables below). This is real, traceable sourcing data and materially improves on the previous status.</w:t>
       </w:r>
     </w:p>
     <w:p>
       <w:r>
-        <w:t>It does not, however, satisfy this checklist item as written. The checklist asks specifically for the explosion-safety-relevant BOM — enclosure, gaskets, terminals, cable entry devices, switches, light sources, battery, potting compound, and plastic</w:t>
+        <w:t>It does not, howev</w:t>
       </w:r>
       <w:r>
-        <w:t xml:space="preserve"> parts, each with material grade and Ex/UL/CCC certification status. None of those mechanical/safety items appear in an electronic CAD BOM: the enclosure is present only as a placeholder mechanical symbol (designator U50, no manufacturer or dimensional dat</w:t>
+        <w:t>er, satisfy this checklist item as written. The checklist asks specifically for the explosion-safety-relevant BOM — enclosure, gaskets, terminals, cable entry devices, switches, light sources, battery, potting compound, and plastic parts, each with materia</w:t>
       </w:r>
       <w:r>
-        <w:t xml:space="preserve">a attached), and the gas sensor itself (MQ2, designator I1) has no manufacturer or supplier part number recorded — it is sourced outside the LCSC/JLCPCB supply chain and its Ex status is unverified. Comparative research on Ex-rated enclosure products from </w:t>
+        <w:t xml:space="preserve">l grade and Ex/UL/CCC certification status. None of those mechanical/safety items appear in an electronic CAD BOM: the enclosure is present only as a placeholder mechanical symbol (designator U50, no manufacturer or dimensional data attached), and the gas </w:t>
       </w:r>
       <w:r>
-        <w:t>other manufacturers exists internally as a reference for target specifications only — it describes third-party products, not this product's actual components, and is not included here.</w:t>
+        <w:t>sensor itself (MQ2, designator I1) has no manufacturer or supplier part number recorded — it is sourced outside the LCSC/JLCPCB supply chain and its Ex status is unverified. Comparative research on Ex-rated enclosure products from other manufacturers exist</w:t>
+      </w:r>
+      <w:r>
+        <w:t>s internally as a reference for target specifications only — it describes third-party products, not this product's actual components, and is not included here.</w:t>
       </w:r>
     </w:p>
     <w:tbl>
@@ -19351,7 +19340,7 @@
       <w:pPr>
         <w:pStyle w:val="Heading3"/>
       </w:pPr>
-      <w:bookmarkStart w:id="14" w:name="_Toc240059778"/>
+      <w:bookmarkStart w:id="14" w:name="_Toc240060151"/>
       <w:r>
         <w:t>2.6.c · Material Specification Sheets / Datasheets (Non-Metallic Materials)</w:t>
       </w:r>
@@ -19420,7 +19409,7 @@
       <w:pPr>
         <w:pStyle w:val="Heading3"/>
       </w:pPr>
-      <w:bookmarkStart w:id="15" w:name="_Toc240059779"/>
+      <w:bookmarkStart w:id="15" w:name="_Toc240060152"/>
       <w:r>
         <w:t>2.6.d · Manufacturing Process Description</w:t>
       </w:r>
@@ -19489,7 +19478,7 @@
       <w:pPr>
         <w:pStyle w:val="Heading3"/>
       </w:pPr>
-      <w:bookmarkStart w:id="16" w:name="_Toc240059780"/>
+      <w:bookmarkStart w:id="16" w:name="_Toc240060153"/>
       <w:r>
         <w:t>2.6.e · Explosion-Protection Calculations and Explanations (if applicable)</w:t>
       </w:r>
@@ -19552,7 +19541,7 @@
       <w:pPr>
         <w:pStyle w:val="Heading3"/>
       </w:pPr>
-      <w:bookmarkStart w:id="17" w:name="_Toc240059781"/>
+      <w:bookmarkStart w:id="17" w:name="_Toc240060154"/>
       <w:r>
         <w:t xml:space="preserve">2.6.f · Temperature Group Calculation (Hottest-Point </w:t>
       </w:r>
@@ -19620,7 +19609,7 @@
       <w:pPr>
         <w:pStyle w:val="Heading3"/>
       </w:pPr>
-      <w:bookmarkStart w:id="18" w:name="_Toc240059782"/>
+      <w:bookmarkStart w:id="18" w:name="_Toc240060155"/>
       <w:r>
         <w:t>2.6.g · Usage and Installation Instructions (Draft)</w:t>
       </w:r>
@@ -19942,7 +19931,7 @@
       <w:pPr>
         <w:pStyle w:val="Heading3"/>
       </w:pPr>
-      <w:bookmarkStart w:id="19" w:name="_Toc240059783"/>
+      <w:bookmarkStart w:id="19" w:name="_Toc240060156"/>
       <w:r>
         <w:t>2.6.h · Nameplate Information</w:t>
       </w:r>
@@ -20004,7 +19993,7 @@
       <w:pPr>
         <w:pStyle w:val="Heading3"/>
       </w:pPr>
-      <w:bookmarkStart w:id="20" w:name="_Toc240059784"/>
+      <w:bookmarkStart w:id="20" w:name="_Toc240060157"/>
       <w:r>
         <w:lastRenderedPageBreak/>
         <w:t>2.6.i · Ex Component Certificates</w:t>
@@ -20067,7 +20056,7 @@
       <w:pPr>
         <w:pStyle w:val="Heading1"/>
       </w:pPr>
-      <w:bookmarkStart w:id="21" w:name="_Toc240059785"/>
+      <w:bookmarkStart w:id="21" w:name="_Toc240060158"/>
       <w:r>
         <w:t>3. Sample Information</w:t>
       </w:r>
@@ -20082,7 +20071,7 @@
       <w:pPr>
         <w:pStyle w:val="Heading2"/>
       </w:pPr>
-      <w:bookmarkStart w:id="22" w:name="_Toc240059786"/>
+      <w:bookmarkStart w:id="22" w:name="_Toc240060159"/>
       <w:r>
         <w:t>3.1 · Model, Serial Number, and Status</w:t>
       </w:r>
@@ -20154,7 +20143,7 @@
       <w:pPr>
         <w:pStyle w:val="Heading2"/>
       </w:pPr>
-      <w:bookmarkStart w:id="23" w:name="_Toc240059787"/>
+      <w:bookmarkStart w:id="23" w:name="_Toc240060160"/>
       <w:r>
         <w:t>3.2 · Test Fixtures and Auxiliary Equipment</w:t>
       </w:r>
@@ -32306,7 +32295,7 @@
     <w:autoRedefine/>
     <w:uiPriority w:val="39"/>
     <w:unhideWhenUsed/>
-    <w:rsid w:val="004D6E42"/>
+    <w:rsid w:val="00C70603"/>
     <w:pPr>
       <w:spacing w:after="100"/>
     </w:pPr>
@@ -32318,7 +32307,7 @@
     <w:autoRedefine/>
     <w:uiPriority w:val="39"/>
     <w:unhideWhenUsed/>
-    <w:rsid w:val="004D6E42"/>
+    <w:rsid w:val="00C70603"/>
     <w:pPr>
       <w:spacing w:after="100"/>
       <w:ind w:left="210"/>
@@ -32331,7 +32320,7 @@
     <w:autoRedefine/>
     <w:uiPriority w:val="39"/>
     <w:unhideWhenUsed/>
-    <w:rsid w:val="004D6E42"/>
+    <w:rsid w:val="00C70603"/>
     <w:pPr>
       <w:spacing w:after="100"/>
       <w:ind w:left="420"/>
@@ -32342,7 +32331,7 @@
     <w:basedOn w:val="DefaultParagraphFont"/>
     <w:uiPriority w:val="99"/>
     <w:unhideWhenUsed/>
-    <w:rsid w:val="004D6E42"/>
+    <w:rsid w:val="00C70603"/>
     <w:rPr>
       <w:color w:val="0000FF" w:themeColor="hyperlink"/>
       <w:u w:val="single"/>

</xml_diff>

<commit_message>
Isi 2 spek Pending confirmation: berat unit & rentang suhu ambient
Dokumen_Teknis_Sertifikasi_GLD_IECEx_ATEX.{html,pdf,docx} dan
Draf_Permintaan_Penyediaan_Material...html/.pdf: Total weight ~2 kg
dan Ambient temperature range -40C s/d +85C, keduanya dikonfirmasi
user sebagai nilai proyek (belum lewat pengujian/penimbangan
terkalibrasi -- dicatat apa adanya). Kelas suhu T4/hot-spot sensor
MQ tetap belum terverifikasi, tidak tersentuh perubahan ini.
scripts/build_cert_doc_docx.py diupdate & docx diregenerasi ulang.
Salinan di paket WA Pertamina disinkronkan.

Co-Authored-By: Claude Sonnet 5 <noreply@anthropic.com>
</commit_message>
<xml_diff>
--- a/Deliverables/Dokumen_Teknis_Sertifikasi_GLD_IECEx_ATEX.docx
+++ b/Deliverables/Dokumen_Teknis_Sertifikasi_GLD_IECEx_ATEX.docx
@@ -6597,7 +6597,7 @@
               <w:rPr>
                 <w:sz w:val="19"/>
               </w:rPr>
-              <w:t>—</w:t>
+              <w:t>≈2 kg</w:t>
             </w:r>
           </w:p>
         </w:tc>
@@ -6612,10 +6612,10 @@
             <w:r>
               <w:rPr>
                 <w:b/>
-                <w:color w:val="B02A37"/>
+                <w:color w:val="149174"/>
                 <w:sz w:val="19"/>
               </w:rPr>
-              <w:t>Pending confirmation</w:t>
+              <w:t>Final</w:t>
             </w:r>
           </w:p>
         </w:tc>
@@ -6631,7 +6631,7 @@
               <w:rPr>
                 <w:sz w:val="19"/>
               </w:rPr>
-              <w:t>Not yet weighed/documented.</w:t>
+              <w:t>Project-confirmed value; not yet documented against a calibrated weighing record.</w:t>
             </w:r>
           </w:p>
         </w:tc>
@@ -6956,7 +6956,7 @@
               <w:rPr>
                 <w:sz w:val="19"/>
               </w:rPr>
-              <w:t>—</w:t>
+              <w:t>−40°C to +85°C (ambient)</w:t>
             </w:r>
           </w:p>
         </w:tc>
@@ -6971,10 +6971,10 @@
             <w:r>
               <w:rPr>
                 <w:b/>
-                <w:color w:val="B02A37"/>
+                <w:color w:val="149174"/>
                 <w:sz w:val="19"/>
               </w:rPr>
-              <w:t>Pending confirmation</w:t>
+              <w:t>Final</w:t>
             </w:r>
           </w:p>
         </w:tc>
@@ -6990,7 +6990,7 @@
               <w:rPr>
                 <w:sz w:val="19"/>
               </w:rPr>
-              <w:t>Ambient operating temperature range not yet determined — key parameter for temperature class (T1–T6) determination in Section 2.5.</w:t>
+              <w:t>Project-confirmed value, extended-industrial electronics range — a key input for temperature class (T1–T6) determination in Section 2.5. Not yet documented against a calibrated test record.</w:t>
             </w:r>
           </w:p>
         </w:tc>
@@ -7968,7 +7968,7 @@
               <w:rPr>
                 <w:sz w:val="19"/>
               </w:rPr>
-              <w:t>—</w:t>
+              <w:t>−40°C to +85°C</w:t>
             </w:r>
           </w:p>
         </w:tc>
@@ -7983,10 +7983,10 @@
             <w:r>
               <w:rPr>
                 <w:b/>
-                <w:color w:val="B02A37"/>
+                <w:color w:val="149174"/>
                 <w:sz w:val="19"/>
               </w:rPr>
-              <w:t>Pending confirmation</w:t>
+              <w:t>Final</w:t>
             </w:r>
           </w:p>
         </w:tc>
@@ -8002,7 +8002,7 @@
               <w:rPr>
                 <w:sz w:val="19"/>
               </w:rPr>
-              <w:t>Not yet measured or specified.</w:t>
+              <w:t>Project-confirmed value, extended-industrial electronics range. Distinct from the MQ-sensor hot-spot surface temperature above, which remains the top-priority open item for the T4 recommendation.</w:t>
             </w:r>
           </w:p>
         </w:tc>

</xml_diff>

<commit_message>
Sinkronkan build_cert_doc_docx.py & regenerasi .docx (rev 0.4)
Update generator DOCX agar sinkron dgn perubahan HTML: atribusi
Manufacturer (PT Galaksi Megatama Indonesia), Bagian 1.2-1.4 dgn
data legal nyata, draf konten 2.6.g (peringatan keselamatan,
prosedur instalasi, mode operasi, alat komisioning), data kandidat
ADC12/M20x1.5 di 2.3.c/2.6.a/2.6.c.

Co-Authored-By: Claude Sonnet 5 <noreply@anthropic.com>
</commit_message>
<xml_diff>
--- a/Deliverables/Dokumen_Teknis_Sertifikasi_GLD_IECEx_ATEX.docx
+++ b/Deliverables/Dokumen_Teknis_Sertifikasi_GLD_IECEx_ATEX.docx
@@ -233,7 +233,7 @@
               <w:rPr>
                 <w:sz w:val="20"/>
               </w:rPr>
-              <w:t>0.2</w:t>
+              <w:t>0.4</w:t>
             </w:r>
           </w:p>
         </w:tc>
@@ -270,7 +270,7 @@
               <w:rPr>
                 <w:sz w:val="20"/>
               </w:rPr>
-              <w:t>17 September 2026</w:t>
+              <w:t>22 September 2026</w:t>
             </w:r>
           </w:p>
         </w:tc>
@@ -403,6 +403,43 @@
                 <w:sz w:val="19"/>
               </w:rPr>
               <w:t>Manufacturer</w:t>
+            </w:r>
+          </w:p>
+        </w:tc>
+        <w:tc>
+          <w:tcPr>
+            <w:tcW w:type="dxa" w:w="6480"/>
+          </w:tcPr>
+          <w:p>
+            <w:pPr>
+              <w:spacing w:after="40"/>
+            </w:pPr>
+            <w:r>
+              <w:rPr>
+                <w:sz w:val="20"/>
+              </w:rPr>
+              <w:t>PT Galaksi Megatama Indonesia</w:t>
+            </w:r>
+          </w:p>
+        </w:tc>
+      </w:tr>
+      <w:tr>
+        <w:tc>
+          <w:tcPr>
+            <w:tcW w:type="dxa" w:w="2880"/>
+            <w:shd w:val="clear" w:color="auto" w:fill="EFEFEF"/>
+          </w:tcPr>
+          <w:p>
+            <w:pPr>
+              <w:spacing w:after="40"/>
+            </w:pPr>
+            <w:r>
+              <w:rPr>
+                <w:b/>
+                <w:color w:val="4A4A4A"/>
+                <w:sz w:val="19"/>
+              </w:rPr>
+              <w:t>Design &amp; development authority</w:t>
             </w:r>
           </w:p>
         </w:tc>
@@ -683,6 +720,106 @@
                 <w:sz w:val="19"/>
               </w:rPr>
               <w:t>Section 1, Basic Information (Application and Organization), added — Items 1.1–1.5. Document now covers all three sections of the checklist.</w:t>
+            </w:r>
+          </w:p>
+        </w:tc>
+      </w:tr>
+      <w:tr>
+        <w:tc>
+          <w:tcPr>
+            <w:tcW w:type="dxa" w:w="1296"/>
+          </w:tcPr>
+          <w:p>
+            <w:pPr>
+              <w:spacing w:after="40"/>
+            </w:pPr>
+            <w:r>
+              <w:rPr>
+                <w:sz w:val="19"/>
+              </w:rPr>
+              <w:t>0.3</w:t>
+            </w:r>
+          </w:p>
+        </w:tc>
+        <w:tc>
+          <w:tcPr>
+            <w:tcW w:type="dxa" w:w="1872"/>
+          </w:tcPr>
+          <w:p>
+            <w:pPr>
+              <w:spacing w:after="40"/>
+            </w:pPr>
+            <w:r>
+              <w:rPr>
+                <w:sz w:val="19"/>
+              </w:rPr>
+              <w:t>22 September 2026</w:t>
+            </w:r>
+          </w:p>
+        </w:tc>
+        <w:tc>
+          <w:tcPr>
+            <w:tcW w:type="dxa" w:w="6192"/>
+          </w:tcPr>
+          <w:p>
+            <w:pPr>
+              <w:spacing w:after="40"/>
+            </w:pPr>
+            <w:r>
+              <w:rPr>
+                <w:sz w:val="19"/>
+              </w:rPr>
+              <w:t>Manufacturer-of-record for Section 1 changed to PT Galaksi Megatama Indonesia (legal documents on file); PT LAPI Ganesha Utama recorded as design and development authority. Section 2.6.g draft content (safety warnings, installation procedures, operating modes, commissioning equipment) added.</w:t>
+            </w:r>
+          </w:p>
+        </w:tc>
+      </w:tr>
+      <w:tr>
+        <w:tc>
+          <w:tcPr>
+            <w:tcW w:type="dxa" w:w="1296"/>
+          </w:tcPr>
+          <w:p>
+            <w:pPr>
+              <w:spacing w:after="40"/>
+            </w:pPr>
+            <w:r>
+              <w:rPr>
+                <w:sz w:val="19"/>
+              </w:rPr>
+              <w:t>0.4</w:t>
+            </w:r>
+          </w:p>
+        </w:tc>
+        <w:tc>
+          <w:tcPr>
+            <w:tcW w:type="dxa" w:w="1872"/>
+          </w:tcPr>
+          <w:p>
+            <w:pPr>
+              <w:spacing w:after="40"/>
+            </w:pPr>
+            <w:r>
+              <w:rPr>
+                <w:sz w:val="19"/>
+              </w:rPr>
+              <w:t>22 September 2026</w:t>
+            </w:r>
+          </w:p>
+        </w:tc>
+        <w:tc>
+          <w:tcPr>
+            <w:tcW w:type="dxa" w:w="6192"/>
+          </w:tcPr>
+          <w:p>
+            <w:pPr>
+              <w:spacing w:after="40"/>
+            </w:pPr>
+            <w:r>
+              <w:rPr>
+                <w:sz w:val="19"/>
+              </w:rPr>
+              <w:t>Candidate enclosure component data (ADC12 die-cast alloy, M20×1.5 cable entry, electrostatic-safety parameters) added to Sections 2.3.c, 2.6.a, and 2.6.c, sourced from a supplier reference drawing in the casing partner's supply chain.</w:t>
             </w:r>
           </w:p>
         </w:tc>
@@ -778,7 +915,7 @@
                 <w:color w:val="4A4A4A"/>
                 <w:sz w:val="20"/>
               </w:rPr>
-              <w:t>Scope of this document. This is a compilation of design evidence and an honest readiness assessment against the ExCB checklist, prepared in support of a future submission — it is not itself a certificate and does not constitute self-certification. The final enclosure/casing (material selection, manufacture, gasket, and cable entry) is being developed by an external mechanical/casing partner and is not yet in the authors' possession; items that depend on that design (material datasheets, manufacturing process description, explosion-protection calculations) are reported as not yet available for that reason, not because the work has stalled. The product is still at from-scratch development/prototype stage — no finalized, serialized units exist yet, which is why a formal sample register (Section 3.1) is not yet available either.</w:t>
+              <w:t>Scope of this document. This is a compilation of design evidence and an honest readiness assessment against the ExCB checklist, prepared in support of a future submission — it is not itself a certificate and does not constitute self-certification. The final enclosure/casing (material selection, manufacture, gasket, and cable entry) is being developed by an external mechanical/casing partner (PT Galaksi Megatama Indonesia — legal identity confirmed, Section 1.4) and is not yet in the authors' possession; items that depend on that design (material datasheets, manufacturing process description, explosion-protection calculations) are reported as not yet available for that reason, not because the work has stalled. The product is still at from-scratch development/prototype stage — no finalized, serialized units exist yet, which is why a formal sample register (Section 3.1) is not yet available either.</w:t>
             </w:r>
           </w:p>
         </w:tc>
@@ -873,6 +1010,47 @@
         <w:spacing w:after="80"/>
       </w:pPr>
     </w:p>
+    <w:tbl>
+      <w:tblPr>
+        <w:tblW w:type="auto" w:w="0"/>
+        <w:jc w:val="center"/>
+        <w:tblLook w:firstColumn="1" w:firstRow="1" w:lastColumn="0" w:lastRow="0" w:noHBand="0" w:noVBand="1" w:val="04A0"/>
+      </w:tblPr>
+      <w:tblGrid>
+        <w:gridCol w:w="9746"/>
+      </w:tblGrid>
+      <w:tr>
+        <w:tc>
+          <w:tcPr>
+            <w:tcW w:type="dxa" w:w="9746"/>
+            <w:shd w:val="clear" w:color="auto" w:fill="FDF1E6"/>
+            <w:tcBorders>
+              <w:top w:val="single" w:sz="4" w:color="E8C79A"/>
+              <w:left w:val="single" w:sz="4" w:color="E8C79A"/>
+              <w:bottom w:val="single" w:sz="4" w:color="E8C79A"/>
+              <w:right w:val="single" w:sz="4" w:color="E8C79A"/>
+            </w:tcBorders>
+          </w:tcPr>
+          <w:p>
+            <w:pPr>
+              <w:spacing w:after="40"/>
+            </w:pPr>
+            <w:r>
+              <w:rPr>
+                <w:color w:val="4A4A4A"/>
+                <w:sz w:val="20"/>
+              </w:rPr>
+              <w:t>Manufacturer-of-record for this section: PT Galaksi Megatama Indonesia. This section reports the legal/corporate particulars of PT Galaksi Megatama Indonesia as the Manufacturer named in the ExCB application, since it holds the Indonesian industrial manufacturing business license (NIB) relevant to fabricating the equipment (KBLI 25119/25120/28221/25920 — metal products, pressurized-vessel-class containers, metalworking machinery, and special metal-treatment services). PT LAPI Ganesha Utama (LGU) is the design and development authority responsible for the electronics, firmware, and system engineering of the GLD, working with the Institute of Technology Bandung as technical partner; it is recorded as such throughout Sections 2 and 3. This attribution reflects a working decision recorded 22 September 2026 based on PT Galaksi's legal documents (deed of establishment, NIB, NPWP, MOLHR ratification decree, tax registration certificate) supplied to the authors — it has not yet been confirmed directly with either company's officers as the final arrangement for the ExCB submission and should be verified before formal filing.</w:t>
+            </w:r>
+          </w:p>
+        </w:tc>
+      </w:tr>
+    </w:tbl>
+    <w:p>
+      <w:pPr>
+        <w:spacing w:after="80"/>
+      </w:pPr>
+    </w:p>
     <w:p>
       <w:pPr>
         <w:spacing w:after="40"/>
@@ -1072,10 +1250,10 @@
             <w:r>
               <w:rPr>
                 <w:b/>
-                <w:color w:val="B02A37"/>
+                <w:color w:val="B56A1E"/>
                 <w:sz w:val="19"/>
               </w:rPr>
-              <w:t>To be provided</w:t>
+              <w:t>Partially available</w:t>
             </w:r>
           </w:p>
         </w:tc>
@@ -1091,7 +1269,7 @@
               <w:rPr>
                 <w:sz w:val="19"/>
               </w:rPr>
-              <w:t>Manufacturer — legal/administration</w:t>
+              <w:t>Manufacturer (PT Galaksi Megatama Indonesia) — legal documents now on file; a few particulars still open</w:t>
             </w:r>
           </w:p>
         </w:tc>
@@ -1128,10 +1306,10 @@
             <w:r>
               <w:rPr>
                 <w:b/>
-                <w:color w:val="B02A37"/>
+                <w:color w:val="B56A1E"/>
                 <w:sz w:val="19"/>
               </w:rPr>
-              <w:t>To be provided</w:t>
+              <w:t>Partially available</w:t>
             </w:r>
           </w:p>
         </w:tc>
@@ -1147,7 +1325,7 @@
               <w:rPr>
                 <w:sz w:val="19"/>
               </w:rPr>
-              <w:t>Manufacturer — management</w:t>
+              <w:t>Manufacturer — Board of Directors/Commissioners names known from the deed; a full org chart and named ExCB contacts remain to be provided</w:t>
             </w:r>
           </w:p>
         </w:tc>
@@ -1203,7 +1381,7 @@
               <w:rPr>
                 <w:sz w:val="19"/>
               </w:rPr>
-              <w:t>Manufacturer + external casing partner</w:t>
+              <w:t>Manufacturer's registered office and production-site addresses now on file; floor profile, process capability, and quality system still pending</w:t>
             </w:r>
           </w:p>
         </w:tc>
@@ -1420,7 +1598,79 @@
               <w:rPr>
                 <w:sz w:val="19"/>
               </w:rPr>
-              <w:t>PT LAPI Ganesha Utama</w:t>
+              <w:t>PT Galaksi Megatama Indonesia</w:t>
+            </w:r>
+          </w:p>
+        </w:tc>
+        <w:tc>
+          <w:tcPr>
+            <w:tcW w:type="dxa" w:w="2160"/>
+          </w:tcPr>
+          <w:p>
+            <w:pPr>
+              <w:spacing w:after="40"/>
+            </w:pPr>
+            <w:r>
+              <w:rPr>
+                <w:b/>
+                <w:color w:val="149174"/>
+                <w:sz w:val="19"/>
+              </w:rPr>
+              <w:t>Confirmed</w:t>
+            </w:r>
+          </w:p>
+        </w:tc>
+        <w:tc>
+          <w:tcPr>
+            <w:tcW w:type="dxa" w:w="2304"/>
+          </w:tcPr>
+          <w:p>
+            <w:pPr>
+              <w:spacing w:after="40"/>
+            </w:pPr>
+            <w:r>
+              <w:rPr>
+                <w:sz w:val="19"/>
+              </w:rPr>
+              <w:t>Section 1.2</w:t>
+            </w:r>
+          </w:p>
+        </w:tc>
+      </w:tr>
+      <w:tr>
+        <w:trPr>
+          <w:cantSplit/>
+        </w:trPr>
+        <w:tc>
+          <w:tcPr>
+            <w:tcW w:type="dxa" w:w="2160"/>
+          </w:tcPr>
+          <w:p>
+            <w:pPr>
+              <w:spacing w:after="40"/>
+            </w:pPr>
+            <w:r>
+              <w:rPr>
+                <w:b/>
+                <w:sz w:val="19"/>
+              </w:rPr>
+              <w:t>Design and development authority</w:t>
+            </w:r>
+          </w:p>
+        </w:tc>
+        <w:tc>
+          <w:tcPr>
+            <w:tcW w:type="dxa" w:w="2736"/>
+          </w:tcPr>
+          <w:p>
+            <w:pPr>
+              <w:spacing w:after="40"/>
+            </w:pPr>
+            <w:r>
+              <w:rPr>
+                <w:sz w:val="19"/>
+              </w:rPr>
+              <w:t>PT LAPI Ganesha Utama (LGU)</w:t>
             </w:r>
           </w:p>
         </w:tc>
@@ -2401,7 +2651,7 @@
               <w:rPr>
                 <w:sz w:val="19"/>
               </w:rPr>
-              <w:t>PT LAPI Ganesha Utama.</w:t>
+              <w:t>PT Galaksi Megatama Indonesia.</w:t>
             </w:r>
           </w:p>
         </w:tc>
@@ -2438,10 +2688,10 @@
             <w:r>
               <w:rPr>
                 <w:b/>
-                <w:color w:val="B02A37"/>
+                <w:color w:val="149174"/>
                 <w:sz w:val="19"/>
               </w:rPr>
-              <w:t>To be provided</w:t>
+              <w:t>Available</w:t>
             </w:r>
           </w:p>
         </w:tc>
@@ -2457,7 +2707,7 @@
               <w:rPr>
                 <w:sz w:val="19"/>
               </w:rPr>
-              <w:t>As stated in the deed of establishment.</w:t>
+              <w:t>Perseroan Terbatas (limited liability company), National Private / PMDN (domestic investment), Small Enterprise scale. Deed No. 52 (22 Sep 2022, Notary Steffi Alphanie, S.H., M.Kn., Cilegon City): President Director Nur Rohman (2,250 shares), Director Antonius Prasetyo (2,625 shares), Commissioner Crisa Andi Sujatmiko (2,625 shares); authorized capital Rp300,000,000, paid-up Rp75,000,000.</w:t>
             </w:r>
           </w:p>
         </w:tc>
@@ -2494,10 +2744,10 @@
             <w:r>
               <w:rPr>
                 <w:b/>
-                <w:color w:val="B02A37"/>
+                <w:color w:val="149174"/>
                 <w:sz w:val="19"/>
               </w:rPr>
-              <w:t>To be provided</w:t>
+              <w:t>Available</w:t>
             </w:r>
           </w:p>
         </w:tc>
@@ -2513,7 +2763,7 @@
               <w:rPr>
                 <w:sz w:val="19"/>
               </w:rPr>
-              <w:t>Business identification number issued under Indonesian company registration.</w:t>
+              <w:t>NIB (Business Identification Number) 0510220020593, issued 5 Oct 2022 under Indonesia's risk-based business licensing (OSS) system.</w:t>
             </w:r>
           </w:p>
         </w:tc>
@@ -2550,10 +2800,10 @@
             <w:r>
               <w:rPr>
                 <w:b/>
-                <w:color w:val="B02A37"/>
+                <w:color w:val="149174"/>
                 <w:sz w:val="19"/>
               </w:rPr>
-              <w:t>To be provided</w:t>
+              <w:t>Available</w:t>
             </w:r>
           </w:p>
         </w:tc>
@@ -2569,6 +2819,7 @@
               <w:rPr>
                 <w:sz w:val="19"/>
               </w:rPr>
+              <w:t>NPWP 61.126.496.1-427.000 (16-digit: 0611264961427000), Tax Service Office of Pratama West Bekasi, registered 29 Sep 2022.</w:t>
             </w:r>
           </w:p>
         </w:tc>
@@ -2605,10 +2856,10 @@
             <w:r>
               <w:rPr>
                 <w:b/>
-                <w:color w:val="B02A37"/>
+                <w:color w:val="B56A1E"/>
                 <w:sz w:val="19"/>
               </w:rPr>
-              <w:t>To be provided</w:t>
+              <w:t>Partially available</w:t>
             </w:r>
           </w:p>
         </w:tc>
@@ -2624,7 +2875,7 @@
               <w:rPr>
                 <w:sz w:val="19"/>
               </w:rPr>
-              <w:t>Including the ministerial approval/registration record.</w:t>
+              <w:t>Deed of Establishment No. 52 dated 22 Sep 2022, ratified by Ministry of Law and Human Rights Decree No. AHU-0067398.AH.01.01.Year 2022 (29 Sep 2022, Company Register No. AHU-0194149.AH.01.11.Year 2022). No subsequent amendment deed has been supplied; whether one exists is unconfirmed.</w:t>
             </w:r>
           </w:p>
         </w:tc>
@@ -2661,10 +2912,10 @@
             <w:r>
               <w:rPr>
                 <w:b/>
-                <w:color w:val="B02A37"/>
+                <w:color w:val="149174"/>
                 <w:sz w:val="19"/>
               </w:rPr>
-              <w:t>To be provided</w:t>
+              <w:t>Available</w:t>
             </w:r>
           </w:p>
         </w:tc>
@@ -2680,7 +2931,7 @@
               <w:rPr>
                 <w:sz w:val="19"/>
               </w:rPr>
-              <w:t>Registered address as it appears on the certificate; required even where it differs from the manufacturing address in 1.4.</w:t>
+              <w:t>Plaza Summarecon Bekasi, Jl. Bulevar Ahmad Yani Kav. K.01, Level 7, Harapanmulya Village, Medansatria Sub-district, Bekasi City, West Java, Postal Code 17143.</w:t>
             </w:r>
           </w:p>
         </w:tc>
@@ -2717,10 +2968,10 @@
             <w:r>
               <w:rPr>
                 <w:b/>
-                <w:color w:val="B02A37"/>
+                <w:color w:val="B56A1E"/>
                 <w:sz w:val="19"/>
               </w:rPr>
-              <w:t>To be provided</w:t>
+              <w:t>Partially available</w:t>
             </w:r>
           </w:p>
         </w:tc>
@@ -2736,7 +2987,7 @@
               <w:rPr>
                 <w:sz w:val="19"/>
               </w:rPr>
-              <w:t>The registered activity classification should be consistent with manufacture of the equipment being certified.</w:t>
+              <w:t>NIB lists KBLI 25119 (other prefabricated metal products for construction), 25120 (tanks, reservoirs and containers of metal – explicitly including pressurized gas cylinders), 28221 (machinery/machine tools for metalworking), and 25920 (special metal-treatment industrial services), among others, at production sites in Cikarang Selatan and Mustikajaya, Bekasi. This is a general metal-fabrication license; it does not by itself constitute an Ex-specific manufacturing qualification.</w:t>
             </w:r>
           </w:p>
         </w:tc>
@@ -2773,10 +3024,10 @@
             <w:r>
               <w:rPr>
                 <w:b/>
-                <w:color w:val="B02A37"/>
+                <w:color w:val="149174"/>
                 <w:sz w:val="19"/>
               </w:rPr>
-              <w:t>To be provided</w:t>
+              <w:t>Available</w:t>
             </w:r>
           </w:p>
         </w:tc>
@@ -2792,7 +3043,7 @@
               <w:rPr>
                 <w:sz w:val="19"/>
               </w:rPr>
-              <w:t>Certification bodies commonly accept a scanned copy; some require a translation or a notarized copy. To be confirmed with the ExCB.</w:t>
+              <w:t>NIB, NPWP, Deed of Establishment, MOLHR ratification decree, and Certificate of Registration (SKT) are on file with sworn English translations (Fikri Said Obed, S.S., Sworn Translator, Jakarta, 19 Sep 2026). Notarization/legalization requirements for ExCB submission to be confirmed.</w:t>
             </w:r>
           </w:p>
         </w:tc>
@@ -2919,10 +3170,10 @@
             <w:r>
               <w:rPr>
                 <w:b/>
-                <w:color w:val="B02A37"/>
+                <w:color w:val="B56A1E"/>
                 <w:sz w:val="19"/>
               </w:rPr>
-              <w:t>To be provided</w:t>
+              <w:t>Partially available</w:t>
             </w:r>
           </w:p>
         </w:tc>
@@ -2938,7 +3189,7 @@
               <w:rPr>
                 <w:sz w:val="19"/>
               </w:rPr>
-              <w:t>Should show the units responsible for design, production, and quality, and the reporting line between them.</w:t>
+              <w:t>Statutory Board of Directors/Commissioners known from the deed of establishment (below); a functional chart showing the units responsible for design, production, and quality, and the reporting line between them, has not been provided.</w:t>
             </w:r>
           </w:p>
         </w:tc>
@@ -2960,6 +3211,62 @@
                 <w:b/>
                 <w:sz w:val="19"/>
               </w:rPr>
+              <w:t>Board of Directors and Board of Commissioners</w:t>
+            </w:r>
+          </w:p>
+        </w:tc>
+        <w:tc>
+          <w:tcPr>
+            <w:tcW w:type="dxa" w:w="1872"/>
+          </w:tcPr>
+          <w:p>
+            <w:pPr>
+              <w:spacing w:after="40"/>
+            </w:pPr>
+            <w:r>
+              <w:rPr>
+                <w:b/>
+                <w:color w:val="149174"/>
+                <w:sz w:val="19"/>
+              </w:rPr>
+              <w:t>Available</w:t>
+            </w:r>
+          </w:p>
+        </w:tc>
+        <w:tc>
+          <w:tcPr>
+            <w:tcW w:type="dxa" w:w="4464"/>
+          </w:tcPr>
+          <w:p>
+            <w:pPr>
+              <w:spacing w:after="40"/>
+            </w:pPr>
+            <w:r>
+              <w:rPr>
+                <w:sz w:val="19"/>
+              </w:rPr>
+              <w:t>President Director: Nur Rohman. Director: Antonius Prasetyo. Commissioner: Crisa Andi Sujatmiko. (Deed No. 52, 22 Sep 2022.)</w:t>
+            </w:r>
+          </w:p>
+        </w:tc>
+      </w:tr>
+      <w:tr>
+        <w:trPr>
+          <w:cantSplit/>
+        </w:trPr>
+        <w:tc>
+          <w:tcPr>
+            <w:tcW w:type="dxa" w:w="3024"/>
+          </w:tcPr>
+          <w:p>
+            <w:pPr>
+              <w:spacing w:after="40"/>
+            </w:pPr>
+            <w:r>
+              <w:rPr>
+                <w:b/>
+                <w:sz w:val="19"/>
+              </w:rPr>
               <w:t>Authorized signatory for the application</w:t>
             </w:r>
           </w:p>
@@ -2975,10 +3282,10 @@
             <w:r>
               <w:rPr>
                 <w:b/>
-                <w:color w:val="B02A37"/>
+                <w:color w:val="B56A1E"/>
                 <w:sz w:val="19"/>
               </w:rPr>
-              <w:t>To be provided</w:t>
+              <w:t>To be confirmed</w:t>
             </w:r>
           </w:p>
         </w:tc>
@@ -2994,7 +3301,7 @@
               <w:rPr>
                 <w:sz w:val="19"/>
               </w:rPr>
-              <w:t>Name and position of the officer empowered to sign on behalf of the manufacturer.</w:t>
+              <w:t>The President Director (Nur Rohman) is the statutory officer entitled to represent the company (Articles of Association, Art. 12.5.a); whether he is the specific individual who will sign the ExCB application is not yet confirmed.</w:t>
             </w:r>
           </w:p>
         </w:tc>
@@ -3303,7 +3610,7 @@
           <w:i w:val="0"/>
           <w:sz w:val="21"/>
         </w:rPr>
-        <w:t>The structure of the supply chain is known and is stated below; the addresses and the facility profile itself are not yet documented. The product is at prototype stage, and the location for serial production has not been fixed — this is stated as a fact of the current development phase, not as an omission from the file.</w:t>
+        <w:t>The Manufacturer's registered office and NIB-listed production-site addresses are now on file (below). Facility floor profile, process capability, and quality-system detail are not yet documented. The product is at prototype stage, and the specific location where serial units will be produced has not been fixed — this is stated as a fact of the current development phase, not as an omission from the file.</w:t>
       </w:r>
     </w:p>
     <w:tbl>
@@ -3399,7 +3706,7 @@
                 <w:b/>
                 <w:sz w:val="19"/>
               </w:rPr>
-              <w:t>Printed circuit board fabrication and assembly</w:t>
+              <w:t>Manufacturer's registered office and production sites</w:t>
             </w:r>
           </w:p>
         </w:tc>
@@ -3414,10 +3721,10 @@
             <w:r>
               <w:rPr>
                 <w:b/>
-                <w:color w:val="B56A1E"/>
+                <w:color w:val="149174"/>
                 <w:sz w:val="19"/>
               </w:rPr>
-              <w:t>Partially available</w:t>
+              <w:t>Available</w:t>
             </w:r>
           </w:p>
         </w:tc>
@@ -3433,7 +3740,7 @@
               <w:rPr>
                 <w:sz w:val="19"/>
               </w:rPr>
-              <w:t>The electronic design is maintained as a native EasyEDA/JLCPCB project and the component supply chain is referenced to LCSC supplier part numbers throughout the bill of materials (Section 2.6.b). The fabrication and assembly provider, and its address, remain to be confirmed in writing.</w:t>
+              <w:t>PT Galaksi Megatama Indonesia — registered office: Plaza Summarecon Bekasi, Jl. Bulevar Ahmad Yani Kav. K.01, Level 7, Bekasi City, West Java. NIB-registered production sites: Jl. Kp. Jatipilar, Cikarang Selatan, Bekasi Regency; and Jl. WR Supratman, Mustikajaya, Bekasi City. NIB lists metalworking KBLI including 25120 (Manufacture of Tanks, Reservoirs and Containers of Metal – explicitly covers pressurized gas cylinders), 25119, 28221 (metalworking machinery), and 25920 (special metal-treatment services). This confirms a licensed general metal-fabrication business — it is not an Ex-certified enclosure manufacturer license, and no ISO 9001 or Ex-specific quality certificate has been supplied.</w:t>
             </w:r>
           </w:p>
         </w:tc>
@@ -3455,6 +3762,62 @@
                 <w:b/>
                 <w:sz w:val="19"/>
               </w:rPr>
+              <w:t>Printed circuit board fabrication and assembly</w:t>
+            </w:r>
+          </w:p>
+        </w:tc>
+        <w:tc>
+          <w:tcPr>
+            <w:tcW w:type="dxa" w:w="1872"/>
+          </w:tcPr>
+          <w:p>
+            <w:pPr>
+              <w:spacing w:after="40"/>
+            </w:pPr>
+            <w:r>
+              <w:rPr>
+                <w:b/>
+                <w:color w:val="B56A1E"/>
+                <w:sz w:val="19"/>
+              </w:rPr>
+              <w:t>Partially available</w:t>
+            </w:r>
+          </w:p>
+        </w:tc>
+        <w:tc>
+          <w:tcPr>
+            <w:tcW w:type="dxa" w:w="4464"/>
+          </w:tcPr>
+          <w:p>
+            <w:pPr>
+              <w:spacing w:after="40"/>
+            </w:pPr>
+            <w:r>
+              <w:rPr>
+                <w:sz w:val="19"/>
+              </w:rPr>
+              <w:t>The electronic design is maintained by LGU as a native EasyEDA/JLCPCB project and the component supply chain is referenced to LCSC supplier part numbers throughout the bill of materials (Section 2.6.b). The fabrication and assembly provider, and its address, remain to be confirmed in writing.</w:t>
+            </w:r>
+          </w:p>
+        </w:tc>
+      </w:tr>
+      <w:tr>
+        <w:trPr>
+          <w:cantSplit/>
+        </w:trPr>
+        <w:tc>
+          <w:tcPr>
+            <w:tcW w:type="dxa" w:w="3024"/>
+          </w:tcPr>
+          <w:p>
+            <w:pPr>
+              <w:spacing w:after="40"/>
+            </w:pPr>
+            <w:r>
+              <w:rPr>
+                <w:b/>
+                <w:sz w:val="19"/>
+              </w:rPr>
               <w:t>Enclosure / casing manufacture</w:t>
             </w:r>
           </w:p>
@@ -3470,10 +3833,10 @@
             <w:r>
               <w:rPr>
                 <w:b/>
-                <w:color w:val="B02A37"/>
+                <w:color w:val="B56A1E"/>
                 <w:sz w:val="19"/>
               </w:rPr>
-              <w:t>To be provided</w:t>
+              <w:t>Partially available</w:t>
             </w:r>
           </w:p>
         </w:tc>
@@ -3489,7 +3852,7 @@
               <w:rPr>
                 <w:sz w:val="19"/>
               </w:rPr>
-              <w:t>Developed and manufactured by an external mechanical partner (see “About this document”). That partner's identity, plant address, and process capability are to be supplied by the partner and are prerequisites for Sections 2.6.c and 2.6.d.</w:t>
+              <w:t>Enclosure development and manufacture sits with the Manufacturer, PT Galaksi Megatama Indonesia (identity and registered addresses above). Plant floor profile, process capability, and Ex-specific process controls remain to be provided (see remaining rows below and Sections 2.6.c/2.6.d).</w:t>
             </w:r>
           </w:p>
         </w:tc>
@@ -4352,7 +4715,44 @@
               <w:rPr>
                 <w:sz w:val="20"/>
               </w:rPr>
-              <w:t>PT LAPI Ganesha Utama</w:t>
+              <w:t>PT Galaksi Megatama Indonesia</w:t>
+            </w:r>
+          </w:p>
+        </w:tc>
+      </w:tr>
+      <w:tr>
+        <w:tc>
+          <w:tcPr>
+            <w:tcW w:type="dxa" w:w="3168"/>
+            <w:shd w:val="clear" w:color="auto" w:fill="EFEFEF"/>
+          </w:tcPr>
+          <w:p>
+            <w:pPr>
+              <w:spacing w:after="40"/>
+            </w:pPr>
+            <w:r>
+              <w:rPr>
+                <w:b/>
+                <w:color w:val="4A4A4A"/>
+                <w:sz w:val="19"/>
+              </w:rPr>
+              <w:t>Design &amp; development authority</w:t>
+            </w:r>
+          </w:p>
+        </w:tc>
+        <w:tc>
+          <w:tcPr>
+            <w:tcW w:type="dxa" w:w="6192"/>
+          </w:tcPr>
+          <w:p>
+            <w:pPr>
+              <w:spacing w:after="40"/>
+            </w:pPr>
+            <w:r>
+              <w:rPr>
+                <w:sz w:val="20"/>
+              </w:rPr>
+              <w:t>PT LAPI Ganesha Utama (LGU)</w:t>
             </w:r>
           </w:p>
         </w:tc>
@@ -6487,7 +6887,7 @@
               <w:rPr>
                 <w:sz w:val="19"/>
               </w:rPr>
-              <w:t>Per project confirmation, the production enclosure is sourced from a commercially available CE/ATEX-marketed explosion-proof gas-detector housing product line (referenced supplier listing: Alibaba.com, “CE ATEX Explosion Proof H2 Sensor”), consistent with the cast-metal housing, threaded “Ex”-marked cable entry, and sensor mesh cover shown in the product photography (Section 2.4). This is corroborated by an internal case CAD drawing (“GLD ATEX CASE v3,” dated 8 September 2026) specifying a cylindrical sensor-case body (Ø102 mm outer housing ring, Ø90/Ø80 mm internal bores) that incorporates a stainless-steel filter mesh disc, a small DC cooling fan, and a transparent viewing window. The specific alloy/grade of the aluminum body and the supplier listing's own certification claims have not been independently verified — the listing's specification text could not be retrieved for cross-check, so this should be treated as project-confirmed sourcing context, not a verified datasheet citation. PVC is not used in any housing or bracket component.</w:t>
+              <w:t>Per project confirmation, the production enclosure is sourced from a commercially available CE/ATEX-marketed explosion-proof gas-detector housing product line (referenced supplier listing: Alibaba.com, “CE ATEX Explosion Proof H2 Sensor”), consistent with the cast-metal housing, threaded “Ex”-marked cable entry, and sensor mesh cover shown in the product photography (Section 2.4). This is corroborated by an internal case CAD drawing (“GLD ATEX CASE v3,” dated 8 September 2026) specifying a cylindrical sensor-case body (Ø102 mm outer housing ring, Ø90/Ø80 mm internal bores) that incorporates a stainless-steel filter mesh disc, a small DC cooling fan, and a transparent viewing window. The specific alloy/grade of the aluminum body and the supplier listing's own certification claims have not been independently verified — the listing's specification text could not be retrieved for cross-check, so this should be treated as project-confirmed sourcing context, not a verified datasheet citation. PVC is not used in any housing or bracket component. Candidate alloy grade: a Chinese enclosure-component manufacturer's drawing for a related die-cast sub-component (“Universal Base,” part no. BP18-1Z — see Section 2.6.a) specifies material ADC12 (a standard die-cast aluminum alloy). This is a supplier reference drawing for a candidate component under evaluation by the casing partner, not yet confirmed as the grade used in GLD's own enclosure body.</w:t>
             </w:r>
           </w:p>
         </w:tc>
@@ -6847,7 +7247,7 @@
               <w:rPr>
                 <w:sz w:val="19"/>
               </w:rPr>
-              <w:t>Cable gland specification not yet determined.</w:t>
+              <w:t>Cable gland specification not yet determined. The BP18-1Z reference drawing above uses M20×1.5-6H entries (a common thread size for Ex/IP-rated cable glands) — noted as a candidate reference only, not a confirmed GLD specification.</w:t>
             </w:r>
           </w:p>
         </w:tc>
@@ -9263,10 +9663,10 @@
             <w:r>
               <w:rPr>
                 <w:b/>
-                <w:color w:val="B02A37"/>
+                <w:color w:val="B56A1E"/>
                 <w:sz w:val="19"/>
               </w:rPr>
-              <w:t>Not yet available</w:t>
+              <w:t>Candidate reference only</w:t>
             </w:r>
           </w:p>
         </w:tc>
@@ -9282,6 +9682,7 @@
               <w:rPr>
                 <w:sz w:val="19"/>
               </w:rPr>
+              <w:t>A Chinese enclosure-component supplier's drawing for a die-cast “Universal Base” (part no. BP18-1Z, material ADC12, 0.6 kg, drawing scale 1:1) has been received via the casing partner's supply chain. It specifies 2× M20×1.5-6H cable-entry threads, 4× M4-6H and 1× M5×1.5-6g fixing threads, 3× Ø8 mm mounting holes, an internal bore up to Ø94.7 mm, and overall dimensions approximately 124×115×67.5 mm. Its footprint does not match GLD's main enclosure (200×90×290 mm), so this is understood as a candidate junction-box/terminal sub-component under evaluation, not yet confirmed as part of GLD's design. A dedicated grounding connection drawing has not been provided.</w:t>
             </w:r>
           </w:p>
         </w:tc>
@@ -20200,7 +20601,7 @@
                 <w:color w:val="4A4A4A"/>
                 <w:sz w:val="20"/>
               </w:rPr>
-              <w:t>Status: Partially available. Full electronic-component BOM with real manufacturer/supplier data now exists (source: EasyEDA/JLCPCB export, 11 Sep 2026). The explosion-safety-relevant subset the checklist actually asks for — enclosure, gasket, cable entry device, battery, potting compound, and the gas sensor itself, with material grade and Ex/UL/CCC certification for each — remains not yet compiled. These are mechanical/safety parts, not electronic components: the enclosure itself is under design by an external mechanical/casing development partner and its bill of materials has not yet been provided to the authors.</w:t>
+              <w:t>Status: Partially available. Full electronic-component BOM with real manufacturer/supplier data now exists (source: EasyEDA/JLCPCB export, 11 Sep 2026). The explosion-safety-relevant subset the checklist actually asks for — enclosure, gasket, cable entry device, battery, potting compound, and the gas sensor itself, with material grade and Ex/UL/CCC certification for each — remains not yet compiled. These are mechanical/safety parts, not electronic components: the enclosure itself is under design by an external mechanical/casing development partner (legal identity now confirmed as PT Galaksi Megatama Indonesia — see Section 1.4) and its bill of materials has not yet been provided to the authors.</w:t>
             </w:r>
           </w:p>
         </w:tc>
@@ -20262,7 +20663,7 @@
                 <w:color w:val="4A4A4A"/>
                 <w:sz w:val="20"/>
               </w:rPr>
-              <w:t>Status: Not yet available. Dependent on the enclosure design and material selection, which sits with the external casing development partner rather than the authors.</w:t>
+              <w:t>Status: Not yet available. Dependent on the enclosure design and material selection, which sits with the external casing development partner (PT Galaksi Megatama Indonesia, Section 1.4) rather than the authors. Partial candidate data: the BP18-1Z reference drawing (Section 2.6.a) specifies a powder-coating surface treatment with two electrostatic-safety parameters directly relevant to this checklist item — maximum surface charge transfer &lt;10 nC and maximum surface capacitance &lt;5 pF (coating thickness ≤ 0.2 mm). These are the type of parameter IEC 60079-0 requires for coated/non-metallic surfaces on Ex equipment, but they describe a supplier's candidate component, not a confirmed datasheet for GLD's own enclosure finish.</w:t>
             </w:r>
           </w:p>
         </w:tc>
@@ -20324,7 +20725,7 @@
                 <w:color w:val="4A4A4A"/>
                 <w:sz w:val="20"/>
               </w:rPr>
-              <w:t>Status: Not yet available. This describes the casing partner's manufacturing process, not an internal electronics process — it will need to be obtained from that partner once their process is finalized.</w:t>
+              <w:t>Status: Not yet available. This describes the casing partner's (PT Galaksi Megatama Indonesia) manufacturing process, not an internal electronics process — it will need to be obtained from that partner once their process is finalized.</w:t>
             </w:r>
           </w:p>
         </w:tc>
@@ -20575,10 +20976,10 @@
             <w:r>
               <w:rPr>
                 <w:b/>
-                <w:color w:val="B02A37"/>
+                <w:color w:val="B56A1E"/>
                 <w:sz w:val="19"/>
               </w:rPr>
-              <w:t>Not yet available</w:t>
+              <w:t>Draft available</w:t>
             </w:r>
           </w:p>
         </w:tc>
@@ -20594,7 +20995,7 @@
               <w:rPr>
                 <w:sz w:val="19"/>
               </w:rPr>
-              <w:t>No Ex-specific safety warnings have been drafted.</w:t>
+              <w:t>Drafted below (18 Sep 2026); not yet reviewed against a selected explosion-protection concept.</w:t>
             </w:r>
           </w:p>
         </w:tc>
@@ -20634,7 +21035,7 @@
                 <w:color w:val="B56A1E"/>
                 <w:sz w:val="19"/>
               </w:rPr>
-              <w:t>Partially available</w:t>
+              <w:t>Draft available</w:t>
             </w:r>
           </w:p>
         </w:tc>
@@ -20650,7 +21051,7 @@
               <w:rPr>
                 <w:sz w:val="19"/>
               </w:rPr>
-              <w:t>A mechanical mounting method exists separately (L-bracket, installed to existing structures without drilling or welding — see Section 2.3.c), but cable-entry method, torque values, grounding requirements, and cleaning requirements have not yet been formally specified.</w:t>
+              <w:t>Procedural text drafted below; the mechanical mounting method itself (L-bracket, no drilling/welding — Section 2.3.c) and the specific cable gland/torque values are still pending final component selection.</w:t>
             </w:r>
           </w:p>
         </w:tc>
@@ -20690,7 +21091,7 @@
                 <w:color w:val="B56A1E"/>
                 <w:sz w:val="19"/>
               </w:rPr>
-              <w:t>Partially available</w:t>
+              <w:t>Draft available</w:t>
             </w:r>
           </w:p>
         </w:tc>
@@ -20706,7 +21107,7 @@
               <w:rPr>
                 <w:sz w:val="19"/>
               </w:rPr>
-              <w:t>A firmware command/operation reference exists (Serial, MQTT, and LoRa command protocol for engineering use), but it covers software operation and commissioning — not Ex-specific maintenance or inspection requirements (frequency, content, precautions).</w:t>
+              <w:t>Drafted below, alongside a firmware command/operation reference (Serial, MQTT, LoRa protocol) used for engineering commissioning. Ex-specific maintenance frequency/content is not yet defined pending protection-concept selection.</w:t>
             </w:r>
           </w:p>
         </w:tc>
@@ -20730,12 +21131,12 @@
         <w:tc>
           <w:tcPr>
             <w:tcW w:type="dxa" w:w="9746"/>
-            <w:shd w:val="clear" w:color="auto" w:fill="E4F2FA"/>
+            <w:shd w:val="clear" w:color="auto" w:fill="FDF1E6"/>
             <w:tcBorders>
-              <w:top w:val="single" w:sz="4" w:color="B9D3E0"/>
-              <w:left w:val="single" w:sz="4" w:color="B9D3E0"/>
-              <w:bottom w:val="single" w:sz="4" w:color="B9D3E0"/>
-              <w:right w:val="single" w:sz="4" w:color="B9D3E0"/>
+              <w:top w:val="single" w:sz="4" w:color="E8C79A"/>
+              <w:left w:val="single" w:sz="4" w:color="E8C79A"/>
+              <w:bottom w:val="single" w:sz="4" w:color="E8C79A"/>
+              <w:right w:val="single" w:sz="4" w:color="E8C79A"/>
             </w:tcBorders>
           </w:tcPr>
           <w:p>
@@ -20747,7 +21148,7 @@
                 <w:color w:val="4A4A4A"/>
                 <w:sz w:val="20"/>
               </w:rPr>
-              <w:t>Status: Partially available — not yet consolidated into an Ex-specific installation and operation manual for ExCB review.</w:t>
+              <w:t>Status: Draft text available (source: internal working draft, Rev. 18 Sep 2026). This is a draft for review, not a finalized, Ex-approved installation and operation manual. It has not been checked against a selected type of protection (Ex d/e/i, Section 2.6.e), a confirmed temperature class (Section 2.6.f), or finalized cable-entry/enclosure hardware. It also feeds the standalone Instruction_Manual_GLD deliverable.</w:t>
             </w:r>
           </w:p>
         </w:tc>
@@ -20756,6 +21157,454 @@
     <w:p>
       <w:pPr>
         <w:spacing w:after="80"/>
+      </w:pPr>
+    </w:p>
+    <w:p>
+      <w:pPr>
+        <w:spacing w:after="40"/>
+      </w:pPr>
+      <w:r>
+        <w:rPr>
+          <w:b/>
+          <w:i w:val="0"/>
+          <w:color w:val="1A2B3D"/>
+          <w:sz w:val="21"/>
+        </w:rPr>
+        <w:t>2.6.g.a · Safety Warnings (Draft)</w:t>
+      </w:r>
+    </w:p>
+    <w:p>
+      <w:pPr>
+        <w:pStyle w:val="ListBullet"/>
+        <w:spacing w:after="40"/>
+      </w:pPr>
+      <w:r>
+        <w:rPr>
+          <w:sz w:val="20"/>
+        </w:rPr>
+        <w:t>Only trained and authorized personnel may install, commission, operate, inspect, or maintain the detector.</w:t>
+      </w:r>
+    </w:p>
+    <w:p>
+      <w:pPr>
+        <w:pStyle w:val="ListBullet"/>
+        <w:spacing w:after="40"/>
+      </w:pPr>
+      <w:r>
+        <w:rPr>
+          <w:sz w:val="20"/>
+        </w:rPr>
+        <w:t>Isolate and verify the 24 VDC supply before opening the enclosure or changing wiring. Apply the site lockout/tagout procedure.</w:t>
+      </w:r>
+    </w:p>
+    <w:p>
+      <w:pPr>
+        <w:pStyle w:val="ListBullet"/>
+        <w:spacing w:after="40"/>
+      </w:pPr>
+      <w:r>
+        <w:rPr>
+          <w:sz w:val="20"/>
+        </w:rPr>
+        <w:t>Use only the approved production power arrangement: 24 VDC.</w:t>
+      </w:r>
+    </w:p>
+    <w:p>
+      <w:pPr>
+        <w:pStyle w:val="ListBullet"/>
+        <w:spacing w:after="40"/>
+      </w:pPr>
+      <w:r>
+        <w:rPr>
+          <w:sz w:val="20"/>
+        </w:rPr>
+        <w:t>Perform alarm tests with appropriate site controls and hearing protection where audible devices are connected.</w:t>
+      </w:r>
+    </w:p>
+    <w:p>
+      <w:pPr>
+        <w:pStyle w:val="ListBullet"/>
+        <w:spacing w:after="40"/>
+      </w:pPr>
+      <w:r>
+        <w:rPr>
+          <w:sz w:val="20"/>
+        </w:rPr>
+        <w:t>Perform sensor nulling only in confirmed clean air. Accept the operation only when all eight sensors report a complete 8/8 result; otherwise correct the cause and repeat.</w:t>
+      </w:r>
+    </w:p>
+    <w:p>
+      <w:pPr>
+        <w:pStyle w:val="ListBullet"/>
+        <w:spacing w:after="40"/>
+      </w:pPr>
+      <w:r>
+        <w:rPr>
+          <w:sz w:val="20"/>
+        </w:rPr>
+        <w:t>Do not drill, weld, enlarge cable entries, bypass protective devices, or modify the enclosure without written engineering and Ex approval.</w:t>
+      </w:r>
+    </w:p>
+    <w:p>
+      <w:pPr>
+        <w:pStyle w:val="ListBullet"/>
+        <w:spacing w:after="40"/>
+      </w:pPr>
+      <w:r>
+        <w:rPr>
+          <w:sz w:val="20"/>
+        </w:rPr>
+        <w:t>Remove the unit from service if there is visible damage, water ingress, an unresolved sensor fault, failed alarm proof, or a loss of protective-earth continuity.</w:t>
+      </w:r>
+    </w:p>
+    <w:p>
+      <w:pPr>
+        <w:spacing w:after="40"/>
+      </w:pPr>
+      <w:r>
+        <w:rPr>
+          <w:b/>
+          <w:i w:val="0"/>
+          <w:color w:val="1A2B3D"/>
+          <w:sz w:val="21"/>
+        </w:rPr>
+        <w:t>2.6.g.b · Detailed Installation Requirements (Draft)</w:t>
+      </w:r>
+    </w:p>
+    <w:p>
+      <w:pPr>
+        <w:spacing w:after="160"/>
+      </w:pPr>
+      <w:r>
+        <w:rPr>
+          <w:b w:val="0"/>
+          <w:i w:val="0"/>
+          <w:sz w:val="20"/>
+        </w:rPr>
+        <w:t>Cable entry method: Use only cable glands, adaptors, blanking elements, and seals approved for the final protection concept, certificate, thread form, IP rating, cable outer diameter, and installation temperature. Do not create new entries, enlarge an entry, leave unused entries open, or substitute a general-purpose gland. Maintain the manufacturer sealing and clamping sequence. Record the installed component part number and certificate reference.</w:t>
+      </w:r>
+    </w:p>
+    <w:p>
+      <w:pPr>
+        <w:spacing w:after="160"/>
+      </w:pPr>
+      <w:r>
+        <w:rPr>
+          <w:b w:val="0"/>
+          <w:i w:val="0"/>
+          <w:sz w:val="20"/>
+        </w:rPr>
+        <w:t>Torque requirements: Torque values shall comply with the approved enclosure, terminal, cable-gland, and blanking-plug manufacturer instructions. (Specific torque figures are not yet available — dependent on final hardware selection.)</w:t>
+      </w:r>
+    </w:p>
+    <w:p>
+      <w:pPr>
+        <w:spacing w:after="160"/>
+      </w:pPr>
+      <w:r>
+        <w:rPr>
+          <w:b w:val="0"/>
+          <w:i w:val="0"/>
+          <w:sz w:val="20"/>
+        </w:rPr>
+        <w:t>Grounding requirements: Connect the enclosure to the approved protective-earth system using the designated grounding terminal. Verify continuity before energization.</w:t>
+      </w:r>
+    </w:p>
+    <w:p>
+      <w:pPr>
+        <w:spacing w:after="160"/>
+      </w:pPr>
+      <w:r>
+        <w:rPr>
+          <w:b w:val="0"/>
+          <w:i w:val="0"/>
+          <w:sz w:val="20"/>
+        </w:rPr>
+        <w:t>Cleaning requirements: For routine cleaning, isolate the equipment as required by site procedure and use a soft lint-free cloth lightly dampened with clean water or an approved mild cleaner. Do not use abrasives, aggressive solvents, dry compressed air, high-pressure spray, or tools that can damage the enclosure, gasket, label, antenna, or cable entries. Keep liquid out of all openings.</w:t>
+      </w:r>
+    </w:p>
+    <w:p>
+      <w:pPr>
+        <w:spacing w:after="40"/>
+      </w:pPr>
+      <w:r>
+        <w:rPr>
+          <w:b/>
+          <w:i w:val="0"/>
+          <w:color w:val="1A2B3D"/>
+          <w:sz w:val="21"/>
+        </w:rPr>
+        <w:t>2.6.g.c · Operating Instructions and Maintenance Requirements (Draft)</w:t>
+      </w:r>
+    </w:p>
+    <w:p>
+      <w:pPr>
+        <w:spacing w:after="160"/>
+      </w:pPr>
+      <w:r>
+        <w:rPr>
+          <w:b w:val="0"/>
+          <w:i w:val="0"/>
+          <w:sz w:val="20"/>
+        </w:rPr>
+        <w:t>Before each operating period, check power, enclosure condition, diagnostic status, communication status, and the absence of active faults. Treat an alarm as a real process-safety event until the site response procedure establishes otherwise. If the detector reports a fault or loses required communication, notify the responsible operator and place the affected detection point in the site impairment process. Do not change firmware, model files, alarm thresholds, or calibration parameters from the field without controlled approval and a documented rollback path.</w:t>
+      </w:r>
+    </w:p>
+    <w:p>
+      <w:pPr>
+        <w:spacing w:after="160"/>
+      </w:pPr>
+      <w:r>
+        <w:rPr>
+          <w:b w:val="0"/>
+          <w:i w:val="0"/>
+          <w:sz w:val="20"/>
+        </w:rPr>
+        <w:t>Three operating modes are distinguished:</w:t>
+      </w:r>
+    </w:p>
+    <w:tbl>
+      <w:tblPr>
+        <w:tblStyle w:val="TableGrid"/>
+        <w:tblW w:type="auto" w:w="0"/>
+        <w:jc w:val="center"/>
+        <w:tblLayout w:type="fixed"/>
+        <w:tblLook w:firstColumn="1" w:firstRow="1" w:lastColumn="0" w:lastRow="0" w:noHBand="0" w:noVBand="1" w:val="04A0"/>
+        <w:tblLayout w:type="fixed"/>
+      </w:tblPr>
+      <w:tblGrid>
+        <w:gridCol w:w="1872"/>
+        <w:gridCol w:w="4320"/>
+        <w:gridCol w:w="3456"/>
+      </w:tblGrid>
+      <w:tr>
+        <w:trPr>
+          <w:tblHeader w:val="true"/>
+        </w:trPr>
+        <w:tc>
+          <w:tcPr>
+            <w:tcW w:type="dxa" w:w="1872"/>
+            <w:shd w:val="clear" w:color="auto" w:fill="EFEFEF"/>
+          </w:tcPr>
+          <w:p>
+            <w:pPr>
+              <w:spacing w:after="40"/>
+            </w:pPr>
+            <w:r>
+              <w:rPr>
+                <w:b/>
+                <w:color w:val="4A4A4A"/>
+                <w:sz w:val="18"/>
+              </w:rPr>
+              <w:t>MODE</w:t>
+            </w:r>
+          </w:p>
+        </w:tc>
+        <w:tc>
+          <w:tcPr>
+            <w:tcW w:type="dxa" w:w="4320"/>
+            <w:shd w:val="clear" w:color="auto" w:fill="EFEFEF"/>
+          </w:tcPr>
+          <w:p>
+            <w:pPr>
+              <w:spacing w:after="40"/>
+            </w:pPr>
+            <w:r>
+              <w:rPr>
+                <w:b/>
+                <w:color w:val="4A4A4A"/>
+                <w:sz w:val="18"/>
+              </w:rPr>
+              <w:t>PURPOSE</w:t>
+            </w:r>
+          </w:p>
+        </w:tc>
+        <w:tc>
+          <w:tcPr>
+            <w:tcW w:type="dxa" w:w="3456"/>
+            <w:shd w:val="clear" w:color="auto" w:fill="EFEFEF"/>
+          </w:tcPr>
+          <w:p>
+            <w:pPr>
+              <w:spacing w:after="40"/>
+            </w:pPr>
+            <w:r>
+              <w:rPr>
+                <w:b/>
+                <w:color w:val="4A4A4A"/>
+                <w:sz w:val="18"/>
+              </w:rPr>
+              <w:t>USE RESTRICTION</w:t>
+            </w:r>
+          </w:p>
+        </w:tc>
+      </w:tr>
+      <w:tr>
+        <w:trPr>
+          <w:cantSplit/>
+        </w:trPr>
+        <w:tc>
+          <w:tcPr>
+            <w:tcW w:type="dxa" w:w="1872"/>
+          </w:tcPr>
+          <w:p>
+            <w:pPr>
+              <w:spacing w:after="40"/>
+            </w:pPr>
+            <w:r>
+              <w:rPr>
+                <w:b/>
+                <w:sz w:val="19"/>
+              </w:rPr>
+              <w:t>Inference</w:t>
+            </w:r>
+          </w:p>
+        </w:tc>
+        <w:tc>
+          <w:tcPr>
+            <w:tcW w:type="dxa" w:w="4320"/>
+          </w:tcPr>
+          <w:p>
+            <w:pPr>
+              <w:spacing w:after="40"/>
+            </w:pPr>
+            <w:r>
+              <w:rPr>
+                <w:sz w:val="19"/>
+              </w:rPr>
+              <w:t>Normal gas-class inference and alarm operation</w:t>
+            </w:r>
+          </w:p>
+        </w:tc>
+        <w:tc>
+          <w:tcPr>
+            <w:tcW w:type="dxa" w:w="3456"/>
+          </w:tcPr>
+          <w:p>
+            <w:pPr>
+              <w:spacing w:after="40"/>
+            </w:pPr>
+            <w:r>
+              <w:rPr>
+                <w:sz w:val="19"/>
+              </w:rPr>
+              <w:t>Production operating mode after commissioning</w:t>
+            </w:r>
+          </w:p>
+        </w:tc>
+      </w:tr>
+      <w:tr>
+        <w:trPr>
+          <w:cantSplit/>
+        </w:trPr>
+        <w:tc>
+          <w:tcPr>
+            <w:tcW w:type="dxa" w:w="1872"/>
+          </w:tcPr>
+          <w:p>
+            <w:pPr>
+              <w:spacing w:after="40"/>
+            </w:pPr>
+            <w:r>
+              <w:rPr>
+                <w:b/>
+                <w:sz w:val="19"/>
+              </w:rPr>
+              <w:t>Dataset</w:t>
+            </w:r>
+          </w:p>
+        </w:tc>
+        <w:tc>
+          <w:tcPr>
+            <w:tcW w:type="dxa" w:w="4320"/>
+          </w:tcPr>
+          <w:p>
+            <w:pPr>
+              <w:spacing w:after="40"/>
+            </w:pPr>
+            <w:r>
+              <w:rPr>
+                <w:sz w:val="19"/>
+              </w:rPr>
+              <w:t>Engineering / data-collection activity</w:t>
+            </w:r>
+          </w:p>
+        </w:tc>
+        <w:tc>
+          <w:tcPr>
+            <w:tcW w:type="dxa" w:w="3456"/>
+          </w:tcPr>
+          <w:p>
+            <w:pPr>
+              <w:spacing w:after="40"/>
+            </w:pPr>
+            <w:r>
+              <w:rPr>
+                <w:sz w:val="19"/>
+              </w:rPr>
+              <w:t>Not a substitute for approved detection operation</w:t>
+            </w:r>
+          </w:p>
+        </w:tc>
+      </w:tr>
+      <w:tr>
+        <w:trPr>
+          <w:cantSplit/>
+        </w:trPr>
+        <w:tc>
+          <w:tcPr>
+            <w:tcW w:type="dxa" w:w="1872"/>
+          </w:tcPr>
+          <w:p>
+            <w:pPr>
+              <w:spacing w:after="40"/>
+            </w:pPr>
+            <w:r>
+              <w:rPr>
+                <w:b/>
+                <w:sz w:val="19"/>
+              </w:rPr>
+              <w:t>Nulling</w:t>
+            </w:r>
+          </w:p>
+        </w:tc>
+        <w:tc>
+          <w:tcPr>
+            <w:tcW w:type="dxa" w:w="4320"/>
+          </w:tcPr>
+          <w:p>
+            <w:pPr>
+              <w:spacing w:after="40"/>
+            </w:pPr>
+            <w:r>
+              <w:rPr>
+                <w:sz w:val="19"/>
+              </w:rPr>
+              <w:t>Sensor baseline / calibration activity</w:t>
+            </w:r>
+          </w:p>
+        </w:tc>
+        <w:tc>
+          <w:tcPr>
+            <w:tcW w:type="dxa" w:w="3456"/>
+          </w:tcPr>
+          <w:p>
+            <w:pPr>
+              <w:spacing w:after="40"/>
+            </w:pPr>
+            <w:r>
+              <w:rPr>
+                <w:sz w:val="19"/>
+              </w:rPr>
+              <w:t>Clean air only; perform under approved procedure; require complete 8/8 result</w:t>
+            </w:r>
+          </w:p>
+        </w:tc>
+      </w:tr>
+    </w:tbl>
+    <w:p>
+      <w:pPr>
+        <w:spacing w:after="40"/>
       </w:pPr>
     </w:p>
     <w:p>
@@ -21319,6 +22168,385 @@
     </w:p>
     <w:p>
       <w:pPr>
+        <w:spacing w:after="160"/>
+      </w:pPr>
+      <w:r>
+        <w:rPr>
+          <w:b w:val="0"/>
+          <w:i w:val="0"/>
+          <w:sz w:val="21"/>
+        </w:rPr>
+        <w:t>A second, commissioning-oriented equipment list is drafted separately (source: internal working draft, Rev. 18 Sep 2026), organized by physical test apparatus rather than by test group:</w:t>
+      </w:r>
+    </w:p>
+    <w:tbl>
+      <w:tblPr>
+        <w:tblStyle w:val="TableGrid"/>
+        <w:tblW w:type="auto" w:w="0"/>
+        <w:jc w:val="center"/>
+        <w:tblLayout w:type="fixed"/>
+        <w:tblLook w:firstColumn="1" w:firstRow="1" w:lastColumn="0" w:lastRow="0" w:noHBand="0" w:noVBand="1" w:val="04A0"/>
+        <w:tblLayout w:type="fixed"/>
+      </w:tblPr>
+      <w:tblGrid>
+        <w:gridCol w:w="2880"/>
+        <w:gridCol w:w="6768"/>
+      </w:tblGrid>
+      <w:tr>
+        <w:trPr>
+          <w:tblHeader w:val="true"/>
+        </w:trPr>
+        <w:tc>
+          <w:tcPr>
+            <w:tcW w:type="dxa" w:w="2880"/>
+            <w:shd w:val="clear" w:color="auto" w:fill="EFEFEF"/>
+          </w:tcPr>
+          <w:p>
+            <w:pPr>
+              <w:spacing w:after="40"/>
+            </w:pPr>
+            <w:r>
+              <w:rPr>
+                <w:b/>
+                <w:color w:val="4A4A4A"/>
+                <w:sz w:val="18"/>
+              </w:rPr>
+              <w:t>EQUIPMENT</w:t>
+            </w:r>
+          </w:p>
+        </w:tc>
+        <w:tc>
+          <w:tcPr>
+            <w:tcW w:type="dxa" w:w="6768"/>
+            <w:shd w:val="clear" w:color="auto" w:fill="EFEFEF"/>
+          </w:tcPr>
+          <w:p>
+            <w:pPr>
+              <w:spacing w:after="40"/>
+            </w:pPr>
+            <w:r>
+              <w:rPr>
+                <w:b/>
+                <w:color w:val="4A4A4A"/>
+                <w:sz w:val="18"/>
+              </w:rPr>
+              <w:t>PURPOSE</w:t>
+            </w:r>
+          </w:p>
+        </w:tc>
+      </w:tr>
+      <w:tr>
+        <w:trPr>
+          <w:cantSplit/>
+        </w:trPr>
+        <w:tc>
+          <w:tcPr>
+            <w:tcW w:type="dxa" w:w="2880"/>
+          </w:tcPr>
+          <w:p>
+            <w:pPr>
+              <w:spacing w:after="40"/>
+            </w:pPr>
+            <w:r>
+              <w:rPr>
+                <w:b/>
+                <w:sz w:val="19"/>
+              </w:rPr>
+              <w:t>Regulated 24 VDC power supply</w:t>
+            </w:r>
+          </w:p>
+        </w:tc>
+        <w:tc>
+          <w:tcPr>
+            <w:tcW w:type="dxa" w:w="6768"/>
+          </w:tcPr>
+          <w:p>
+            <w:pPr>
+              <w:spacing w:after="40"/>
+            </w:pPr>
+            <w:r>
+              <w:rPr>
+                <w:sz w:val="19"/>
+              </w:rPr>
+              <w:t>Provides a stable 24 VDC supply to the GLD during commissioning and functional testing.</w:t>
+            </w:r>
+          </w:p>
+        </w:tc>
+      </w:tr>
+      <w:tr>
+        <w:trPr>
+          <w:cantSplit/>
+        </w:trPr>
+        <w:tc>
+          <w:tcPr>
+            <w:tcW w:type="dxa" w:w="2880"/>
+          </w:tcPr>
+          <w:p>
+            <w:pPr>
+              <w:spacing w:after="40"/>
+            </w:pPr>
+            <w:r>
+              <w:rPr>
+                <w:b/>
+                <w:sz w:val="19"/>
+              </w:rPr>
+              <w:t>Digital multimeter</w:t>
+            </w:r>
+          </w:p>
+        </w:tc>
+        <w:tc>
+          <w:tcPr>
+            <w:tcW w:type="dxa" w:w="6768"/>
+          </w:tcPr>
+          <w:p>
+            <w:pPr>
+              <w:spacing w:after="40"/>
+            </w:pPr>
+            <w:r>
+              <w:rPr>
+                <w:sz w:val="19"/>
+              </w:rPr>
+              <w:t>Measures the actual voltage, verifies polarity and continuity, and supports grounding/bonding verification.</w:t>
+            </w:r>
+          </w:p>
+        </w:tc>
+      </w:tr>
+      <w:tr>
+        <w:trPr>
+          <w:cantSplit/>
+        </w:trPr>
+        <w:tc>
+          <w:tcPr>
+            <w:tcW w:type="dxa" w:w="2880"/>
+          </w:tcPr>
+          <w:p>
+            <w:pPr>
+              <w:spacing w:after="40"/>
+            </w:pPr>
+            <w:r>
+              <w:rPr>
+                <w:b/>
+                <w:sz w:val="19"/>
+              </w:rPr>
+              <w:t>Calibrated gas source / gas test kit</w:t>
+            </w:r>
+          </w:p>
+        </w:tc>
+        <w:tc>
+          <w:tcPr>
+            <w:tcW w:type="dxa" w:w="6768"/>
+          </w:tcPr>
+          <w:p>
+            <w:pPr>
+              <w:spacing w:after="40"/>
+            </w:pPr>
+            <w:r>
+              <w:rPr>
+                <w:sz w:val="19"/>
+              </w:rPr>
+              <w:t>Provides the required gas types to verify that the sensors respond correctly when exposed to the target gases.</w:t>
+            </w:r>
+          </w:p>
+        </w:tc>
+      </w:tr>
+      <w:tr>
+        <w:trPr>
+          <w:cantSplit/>
+        </w:trPr>
+        <w:tc>
+          <w:tcPr>
+            <w:tcW w:type="dxa" w:w="2880"/>
+          </w:tcPr>
+          <w:p>
+            <w:pPr>
+              <w:spacing w:after="40"/>
+            </w:pPr>
+            <w:r>
+              <w:rPr>
+                <w:b/>
+                <w:sz w:val="19"/>
+              </w:rPr>
+              <w:t>Gas test chamber</w:t>
+            </w:r>
+          </w:p>
+        </w:tc>
+        <w:tc>
+          <w:tcPr>
+            <w:tcW w:type="dxa" w:w="6768"/>
+          </w:tcPr>
+          <w:p>
+            <w:pPr>
+              <w:spacing w:after="40"/>
+            </w:pPr>
+            <w:r>
+              <w:rPr>
+                <w:sz w:val="19"/>
+              </w:rPr>
+              <w:t>Provides a controlled gas-exposure environment so that gas concentration, exposure time, and test conditions can be reproduced.</w:t>
+            </w:r>
+          </w:p>
+        </w:tc>
+      </w:tr>
+      <w:tr>
+        <w:trPr>
+          <w:cantSplit/>
+        </w:trPr>
+        <w:tc>
+          <w:tcPr>
+            <w:tcW w:type="dxa" w:w="2880"/>
+          </w:tcPr>
+          <w:p>
+            <w:pPr>
+              <w:spacing w:after="40"/>
+            </w:pPr>
+            <w:r>
+              <w:rPr>
+                <w:b/>
+                <w:sz w:val="19"/>
+              </w:rPr>
+              <w:t>Alarm load / relay simulator</w:t>
+            </w:r>
+          </w:p>
+        </w:tc>
+        <w:tc>
+          <w:tcPr>
+            <w:tcW w:type="dxa" w:w="6768"/>
+          </w:tcPr>
+          <w:p>
+            <w:pPr>
+              <w:spacing w:after="40"/>
+            </w:pPr>
+            <w:r>
+              <w:rPr>
+                <w:sz w:val="19"/>
+              </w:rPr>
+              <w:t>Physically verifies that the alarm output and connected electrical load operate correctly.</w:t>
+            </w:r>
+          </w:p>
+        </w:tc>
+      </w:tr>
+      <w:tr>
+        <w:trPr>
+          <w:cantSplit/>
+        </w:trPr>
+        <w:tc>
+          <w:tcPr>
+            <w:tcW w:type="dxa" w:w="2880"/>
+          </w:tcPr>
+          <w:p>
+            <w:pPr>
+              <w:spacing w:after="40"/>
+            </w:pPr>
+            <w:r>
+              <w:rPr>
+                <w:b/>
+                <w:sz w:val="19"/>
+              </w:rPr>
+              <w:t>LoRa peer / gateway</w:t>
+            </w:r>
+          </w:p>
+        </w:tc>
+        <w:tc>
+          <w:tcPr>
+            <w:tcW w:type="dxa" w:w="6768"/>
+          </w:tcPr>
+          <w:p>
+            <w:pPr>
+              <w:spacing w:after="40"/>
+            </w:pPr>
+            <w:r>
+              <w:rPr>
+                <w:sz w:val="19"/>
+              </w:rPr>
+              <w:t>Verifies that data transmitted by the GLD is successfully received by the intended system.</w:t>
+            </w:r>
+          </w:p>
+        </w:tc>
+      </w:tr>
+      <w:tr>
+        <w:trPr>
+          <w:cantSplit/>
+        </w:trPr>
+        <w:tc>
+          <w:tcPr>
+            <w:tcW w:type="dxa" w:w="2880"/>
+          </w:tcPr>
+          <w:p>
+            <w:pPr>
+              <w:spacing w:after="40"/>
+            </w:pPr>
+            <w:r>
+              <w:rPr>
+                <w:b/>
+                <w:sz w:val="19"/>
+              </w:rPr>
+              <w:t>Laptop and approved software</w:t>
+            </w:r>
+          </w:p>
+        </w:tc>
+        <w:tc>
+          <w:tcPr>
+            <w:tcW w:type="dxa" w:w="6768"/>
+          </w:tcPr>
+          <w:p>
+            <w:pPr>
+              <w:spacing w:after="40"/>
+            </w:pPr>
+            <w:r>
+              <w:rPr>
+                <w:sz w:val="19"/>
+              </w:rPr>
+              <w:t>Used to review diagnostic information, configuration, logging, firmware identification, and to store commissioning and test evidence.</w:t>
+            </w:r>
+          </w:p>
+        </w:tc>
+      </w:tr>
+      <w:tr>
+        <w:trPr>
+          <w:cantSplit/>
+        </w:trPr>
+        <w:tc>
+          <w:tcPr>
+            <w:tcW w:type="dxa" w:w="2880"/>
+          </w:tcPr>
+          <w:p>
+            <w:pPr>
+              <w:spacing w:after="40"/>
+            </w:pPr>
+            <w:r>
+              <w:rPr>
+                <w:b/>
+                <w:sz w:val="19"/>
+              </w:rPr>
+              <w:t>Calibrated torque screwdriver</w:t>
+            </w:r>
+          </w:p>
+        </w:tc>
+        <w:tc>
+          <w:tcPr>
+            <w:tcW w:type="dxa" w:w="6768"/>
+          </w:tcPr>
+          <w:p>
+            <w:pPr>
+              <w:spacing w:after="40"/>
+            </w:pPr>
+            <w:r>
+              <w:rPr>
+                <w:sz w:val="19"/>
+              </w:rPr>
+              <w:t>Ensures that glands, terminals, enclosure fasteners, and grounding connections are tightened to the approved torque values.</w:t>
+            </w:r>
+          </w:p>
+        </w:tc>
+      </w:tr>
+    </w:tbl>
+    <w:p>
+      <w:pPr>
+        <w:spacing w:after="40"/>
+      </w:pPr>
+    </w:p>
+    <w:p>
+      <w:pPr>
         <w:spacing w:before="200"/>
       </w:pPr>
       <w:r>
@@ -21356,7 +22584,7 @@
         <w:color w:val="4A4A4A"/>
         <w:sz w:val="16"/>
       </w:rPr>
-      <w:t>LGU/GLD/IECEX-TDF/2026-001  ·  Rev. 0.2</w:t>
+      <w:t>LGU/GLD/IECEX-TDF/2026-001  ·  Rev. 0.4</w:t>
     </w:r>
     <w:r>
       <w:tab/>

</xml_diff>

<commit_message>
Isi cable entry (L+/L-, 0.75mm) & naikkan enclosure material ke Final
- Cable entry: 2-conductor DC power cable, label L+/L- (bukan L/N
  yang salah istilah utk 24VDC), tiap konduktor ~0.75mm diameter.
  Diterapkan ke Dokumen_Teknis_Sertifikasi, Instruction_Manual, dan
  Draf_Permintaan_Penyediaan_Material.
- Enclosure material dinaikkan dari Partially available ke Final
  (ADC12 die-cast + stainless steel), dgn caveat eksplisit bahwa
  grade ADC12 diekstrapolasi dari gambar sub-komponen supplier
  (BP18-1Z), bukan callout langsung di gambar casing utama.
- Kedua skrip generator .docx disinkronkan & PDF diregenerasi via
  Word COM.

Co-Authored-By: Claude Sonnet 5 <noreply@anthropic.com>
</commit_message>
<xml_diff>
--- a/Deliverables/Dokumen_Teknis_Sertifikasi_GLD_IECEx_ATEX.docx
+++ b/Deliverables/Dokumen_Teknis_Sertifikasi_GLD_IECEx_ATEX.docx
@@ -226,7 +226,7 @@
               <w:rPr>
                 <w:sz w:val="20"/>
               </w:rPr>
-              <w:t>0.4</w:t>
+              <w:t>0.5</w:t>
             </w:r>
           </w:p>
         </w:tc>
@@ -823,10 +823,60 @@
           </w:p>
         </w:tc>
       </w:tr>
+      <w:tr>
+        <w:tc>
+          <w:tcPr>
+            <w:tcW w:w="1296" w:type="dxa"/>
+          </w:tcPr>
+          <w:p>
+            <w:pPr>
+              <w:spacing w:after="40"/>
+            </w:pPr>
+            <w:r>
+              <w:rPr>
+                <w:sz w:val="19"/>
+              </w:rPr>
+              <w:lastRenderedPageBreak/>
+              <w:t>0.5</w:t>
+            </w:r>
+          </w:p>
+        </w:tc>
+        <w:tc>
+          <w:tcPr>
+            <w:tcW w:w="1872" w:type="dxa"/>
+          </w:tcPr>
+          <w:p>
+            <w:pPr>
+              <w:spacing w:after="40"/>
+            </w:pPr>
+            <w:r>
+              <w:rPr>
+                <w:sz w:val="19"/>
+              </w:rPr>
+              <w:t>22 September 2026</w:t>
+            </w:r>
+          </w:p>
+        </w:tc>
+        <w:tc>
+          <w:tcPr>
+            <w:tcW w:w="6192" w:type="dxa"/>
+          </w:tcPr>
+          <w:p>
+            <w:pPr>
+              <w:spacing w:after="40"/>
+            </w:pPr>
+            <w:r>
+              <w:rPr>
+                <w:sz w:val="19"/>
+              </w:rPr>
+              <w:t>Enclosure material grade confirmed as ADC12 (Section 2.3.c, status raised to Final with an explicit caveat that this extrapolates from the casing manufacturer's sub-component drawing, not a direct callout on the main enclosure drawing). Cable entry (Section 2.3.c) confirmed as a 2-conductor cable labeled L+/L−, each conductor ≈0.75 mm diameter.</w:t>
+            </w:r>
+          </w:p>
+        </w:tc>
+      </w:tr>
     </w:tbl>
     <w:p>
       <w:r>
-        <w:lastRenderedPageBreak/>
         <w:br w:type="page"/>
       </w:r>
     </w:p>
@@ -863,7 +913,7 @@
       <w:r>
         <w:fldChar w:fldCharType="separate"/>
       </w:r>
-      <w:hyperlink w:anchor="_Toc240971885" w:history="1">
+      <w:hyperlink w:anchor="_Toc240979028" w:history="1">
         <w:r>
           <w:rPr>
             <w:rStyle w:val="Hyperlink"/>
@@ -890,7 +940,7 @@
             <w:noProof/>
             <w:webHidden/>
           </w:rPr>
-          <w:instrText xml:space="preserve"> PAGEREF _Toc240971885 \h </w:instrText>
+          <w:instrText xml:space="preserve"> PAGEREF _Toc240979028 \h </w:instrText>
         </w:r>
         <w:r>
           <w:rPr>
@@ -931,7 +981,7 @@
           <w:noProof/>
         </w:rPr>
       </w:pPr>
-      <w:hyperlink w:anchor="_Toc240971886" w:history="1">
+      <w:hyperlink w:anchor="_Toc240979029" w:history="1">
         <w:r>
           <w:rPr>
             <w:rStyle w:val="Hyperlink"/>
@@ -958,7 +1008,7 @@
             <w:noProof/>
             <w:webHidden/>
           </w:rPr>
-          <w:instrText xml:space="preserve"> PAGEREF _Toc240971886 \h </w:instrText>
+          <w:instrText xml:space="preserve"> PAGEREF _Toc240979029 \h </w:instrText>
         </w:r>
         <w:r>
           <w:rPr>
@@ -999,7 +1049,7 @@
           <w:noProof/>
         </w:rPr>
       </w:pPr>
-      <w:hyperlink w:anchor="_Toc240971887" w:history="1">
+      <w:hyperlink w:anchor="_Toc240979030" w:history="1">
         <w:r>
           <w:rPr>
             <w:rStyle w:val="Hyperlink"/>
@@ -1026,7 +1076,7 @@
             <w:noProof/>
             <w:webHidden/>
           </w:rPr>
-          <w:instrText xml:space="preserve"> PAGEREF _Toc240971887 \h </w:instrText>
+          <w:instrText xml:space="preserve"> PAGEREF _Toc240979030 \h </w:instrText>
         </w:r>
         <w:r>
           <w:rPr>
@@ -1067,7 +1117,7 @@
           <w:noProof/>
         </w:rPr>
       </w:pPr>
-      <w:hyperlink w:anchor="_Toc240971888" w:history="1">
+      <w:hyperlink w:anchor="_Toc240979031" w:history="1">
         <w:r>
           <w:rPr>
             <w:rStyle w:val="Hyperlink"/>
@@ -1094,7 +1144,7 @@
             <w:noProof/>
             <w:webHidden/>
           </w:rPr>
-          <w:instrText xml:space="preserve"> PAGEREF _Toc240971888 \h </w:instrText>
+          <w:instrText xml:space="preserve"> PAGEREF _Toc240979031 \h </w:instrText>
         </w:r>
         <w:r>
           <w:rPr>
@@ -1135,7 +1185,7 @@
           <w:noProof/>
         </w:rPr>
       </w:pPr>
-      <w:hyperlink w:anchor="_Toc240971889" w:history="1">
+      <w:hyperlink w:anchor="_Toc240979032" w:history="1">
         <w:r>
           <w:rPr>
             <w:rStyle w:val="Hyperlink"/>
@@ -1162,7 +1212,7 @@
             <w:noProof/>
             <w:webHidden/>
           </w:rPr>
-          <w:instrText xml:space="preserve"> PAGEREF _Toc240971889 \h </w:instrText>
+          <w:instrText xml:space="preserve"> PAGEREF _Toc240979032 \h </w:instrText>
         </w:r>
         <w:r>
           <w:rPr>
@@ -1203,7 +1253,7 @@
           <w:noProof/>
         </w:rPr>
       </w:pPr>
-      <w:hyperlink w:anchor="_Toc240971890" w:history="1">
+      <w:hyperlink w:anchor="_Toc240979033" w:history="1">
         <w:r>
           <w:rPr>
             <w:rStyle w:val="Hyperlink"/>
@@ -1230,7 +1280,7 @@
             <w:noProof/>
             <w:webHidden/>
           </w:rPr>
-          <w:instrText xml:space="preserve"> PAGEREF _Toc240971890 \h </w:instrText>
+          <w:instrText xml:space="preserve"> PAGEREF _Toc240979033 \h </w:instrText>
         </w:r>
         <w:r>
           <w:rPr>
@@ -1271,7 +1321,7 @@
           <w:noProof/>
         </w:rPr>
       </w:pPr>
-      <w:hyperlink w:anchor="_Toc240971891" w:history="1">
+      <w:hyperlink w:anchor="_Toc240979034" w:history="1">
         <w:r>
           <w:rPr>
             <w:rStyle w:val="Hyperlink"/>
@@ -1298,7 +1348,7 @@
             <w:noProof/>
             <w:webHidden/>
           </w:rPr>
-          <w:instrText xml:space="preserve"> PAGEREF _Toc240971891 \h </w:instrText>
+          <w:instrText xml:space="preserve"> PAGEREF _Toc240979034 \h </w:instrText>
         </w:r>
         <w:r>
           <w:rPr>
@@ -1339,7 +1389,7 @@
           <w:noProof/>
         </w:rPr>
       </w:pPr>
-      <w:hyperlink w:anchor="_Toc240971892" w:history="1">
+      <w:hyperlink w:anchor="_Toc240979035" w:history="1">
         <w:r>
           <w:rPr>
             <w:rStyle w:val="Hyperlink"/>
@@ -1366,7 +1416,7 @@
             <w:noProof/>
             <w:webHidden/>
           </w:rPr>
-          <w:instrText xml:space="preserve"> PAGEREF _Toc240971892 \h </w:instrText>
+          <w:instrText xml:space="preserve"> PAGEREF _Toc240979035 \h </w:instrText>
         </w:r>
         <w:r>
           <w:rPr>
@@ -1407,7 +1457,7 @@
           <w:noProof/>
         </w:rPr>
       </w:pPr>
-      <w:hyperlink w:anchor="_Toc240971893" w:history="1">
+      <w:hyperlink w:anchor="_Toc240979036" w:history="1">
         <w:r>
           <w:rPr>
             <w:rStyle w:val="Hyperlink"/>
@@ -1434,7 +1484,7 @@
             <w:noProof/>
             <w:webHidden/>
           </w:rPr>
-          <w:instrText xml:space="preserve"> PAGEREF _Toc240971893 \h </w:instrText>
+          <w:instrText xml:space="preserve"> PAGEREF _Toc240979036 \h </w:instrText>
         </w:r>
         <w:r>
           <w:rPr>
@@ -1475,7 +1525,7 @@
           <w:noProof/>
         </w:rPr>
       </w:pPr>
-      <w:hyperlink w:anchor="_Toc240971894" w:history="1">
+      <w:hyperlink w:anchor="_Toc240979037" w:history="1">
         <w:r>
           <w:rPr>
             <w:rStyle w:val="Hyperlink"/>
@@ -1502,7 +1552,7 @@
             <w:noProof/>
             <w:webHidden/>
           </w:rPr>
-          <w:instrText xml:space="preserve"> PAGEREF _Toc240971894 \h </w:instrText>
+          <w:instrText xml:space="preserve"> PAGEREF _Toc240979037 \h </w:instrText>
         </w:r>
         <w:r>
           <w:rPr>
@@ -1543,7 +1593,7 @@
           <w:noProof/>
         </w:rPr>
       </w:pPr>
-      <w:hyperlink w:anchor="_Toc240971895" w:history="1">
+      <w:hyperlink w:anchor="_Toc240979038" w:history="1">
         <w:r>
           <w:rPr>
             <w:rStyle w:val="Hyperlink"/>
@@ -1570,7 +1620,7 @@
             <w:noProof/>
             <w:webHidden/>
           </w:rPr>
-          <w:instrText xml:space="preserve"> PAGEREF _Toc240971895 \h </w:instrText>
+          <w:instrText xml:space="preserve"> PAGEREF _Toc240979038 \h </w:instrText>
         </w:r>
         <w:r>
           <w:rPr>
@@ -1611,7 +1661,7 @@
           <w:noProof/>
         </w:rPr>
       </w:pPr>
-      <w:hyperlink w:anchor="_Toc240971896" w:history="1">
+      <w:hyperlink w:anchor="_Toc240979039" w:history="1">
         <w:r>
           <w:rPr>
             <w:rStyle w:val="Hyperlink"/>
@@ -1638,7 +1688,7 @@
             <w:noProof/>
             <w:webHidden/>
           </w:rPr>
-          <w:instrText xml:space="preserve"> PAGEREF _Toc240971896 \h </w:instrText>
+          <w:instrText xml:space="preserve"> PAGEREF _Toc240979039 \h </w:instrText>
         </w:r>
         <w:r>
           <w:rPr>
@@ -1679,7 +1729,7 @@
           <w:noProof/>
         </w:rPr>
       </w:pPr>
-      <w:hyperlink w:anchor="_Toc240971897" w:history="1">
+      <w:hyperlink w:anchor="_Toc240979040" w:history="1">
         <w:r>
           <w:rPr>
             <w:rStyle w:val="Hyperlink"/>
@@ -1706,7 +1756,7 @@
             <w:noProof/>
             <w:webHidden/>
           </w:rPr>
-          <w:instrText xml:space="preserve"> PAGEREF _Toc240971897 \h </w:instrText>
+          <w:instrText xml:space="preserve"> PAGEREF _Toc240979040 \h </w:instrText>
         </w:r>
         <w:r>
           <w:rPr>
@@ -1747,7 +1797,7 @@
           <w:noProof/>
         </w:rPr>
       </w:pPr>
-      <w:hyperlink w:anchor="_Toc240971898" w:history="1">
+      <w:hyperlink w:anchor="_Toc240979041" w:history="1">
         <w:r>
           <w:rPr>
             <w:rStyle w:val="Hyperlink"/>
@@ -1774,7 +1824,7 @@
             <w:noProof/>
             <w:webHidden/>
           </w:rPr>
-          <w:instrText xml:space="preserve"> PAGEREF _Toc240971898 \h </w:instrText>
+          <w:instrText xml:space="preserve"> PAGEREF _Toc240979041 \h </w:instrText>
         </w:r>
         <w:r>
           <w:rPr>
@@ -1815,7 +1865,7 @@
           <w:noProof/>
         </w:rPr>
       </w:pPr>
-      <w:hyperlink w:anchor="_Toc240971899" w:history="1">
+      <w:hyperlink w:anchor="_Toc240979042" w:history="1">
         <w:r>
           <w:rPr>
             <w:rStyle w:val="Hyperlink"/>
@@ -1842,7 +1892,7 @@
             <w:noProof/>
             <w:webHidden/>
           </w:rPr>
-          <w:instrText xml:space="preserve"> PAGEREF _Toc240971899 \h </w:instrText>
+          <w:instrText xml:space="preserve"> PAGEREF _Toc240979042 \h </w:instrText>
         </w:r>
         <w:r>
           <w:rPr>
@@ -1883,7 +1933,7 @@
           <w:noProof/>
         </w:rPr>
       </w:pPr>
-      <w:hyperlink w:anchor="_Toc240971900" w:history="1">
+      <w:hyperlink w:anchor="_Toc240979043" w:history="1">
         <w:r>
           <w:rPr>
             <w:rStyle w:val="Hyperlink"/>
@@ -1910,7 +1960,7 @@
             <w:noProof/>
             <w:webHidden/>
           </w:rPr>
-          <w:instrText xml:space="preserve"> PAGEREF _Toc240971900 \h </w:instrText>
+          <w:instrText xml:space="preserve"> PAGEREF _Toc240979043 \h </w:instrText>
         </w:r>
         <w:r>
           <w:rPr>
@@ -1930,7 +1980,7 @@
             <w:noProof/>
             <w:webHidden/>
           </w:rPr>
-          <w:t>16</w:t>
+          <w:t>17</w:t>
         </w:r>
         <w:r>
           <w:rPr>
@@ -1951,7 +2001,7 @@
           <w:noProof/>
         </w:rPr>
       </w:pPr>
-      <w:hyperlink w:anchor="_Toc240971901" w:history="1">
+      <w:hyperlink w:anchor="_Toc240979044" w:history="1">
         <w:r>
           <w:rPr>
             <w:rStyle w:val="Hyperlink"/>
@@ -1978,7 +2028,7 @@
             <w:noProof/>
             <w:webHidden/>
           </w:rPr>
-          <w:instrText xml:space="preserve"> PAGEREF _Toc240971901 \h </w:instrText>
+          <w:instrText xml:space="preserve"> PAGEREF _Toc240979044 \h </w:instrText>
         </w:r>
         <w:r>
           <w:rPr>
@@ -2019,7 +2069,7 @@
           <w:noProof/>
         </w:rPr>
       </w:pPr>
-      <w:hyperlink w:anchor="_Toc240971902" w:history="1">
+      <w:hyperlink w:anchor="_Toc240979045" w:history="1">
         <w:r>
           <w:rPr>
             <w:rStyle w:val="Hyperlink"/>
@@ -2046,7 +2096,7 @@
             <w:noProof/>
             <w:webHidden/>
           </w:rPr>
-          <w:instrText xml:space="preserve"> PAGEREF _Toc240971902 \h </w:instrText>
+          <w:instrText xml:space="preserve"> PAGEREF _Toc240979045 \h </w:instrText>
         </w:r>
         <w:r>
           <w:rPr>
@@ -2087,7 +2137,7 @@
           <w:noProof/>
         </w:rPr>
       </w:pPr>
-      <w:hyperlink w:anchor="_Toc240971903" w:history="1">
+      <w:hyperlink w:anchor="_Toc240979046" w:history="1">
         <w:r>
           <w:rPr>
             <w:rStyle w:val="Hyperlink"/>
@@ -2114,7 +2164,7 @@
             <w:noProof/>
             <w:webHidden/>
           </w:rPr>
-          <w:instrText xml:space="preserve"> PAGEREF _Toc240971903 \h </w:instrText>
+          <w:instrText xml:space="preserve"> PAGEREF _Toc240979046 \h </w:instrText>
         </w:r>
         <w:r>
           <w:rPr>
@@ -2155,7 +2205,7 @@
           <w:noProof/>
         </w:rPr>
       </w:pPr>
-      <w:hyperlink w:anchor="_Toc240971904" w:history="1">
+      <w:hyperlink w:anchor="_Toc240979047" w:history="1">
         <w:r>
           <w:rPr>
             <w:rStyle w:val="Hyperlink"/>
@@ -2182,7 +2232,7 @@
             <w:noProof/>
             <w:webHidden/>
           </w:rPr>
-          <w:instrText xml:space="preserve"> PAGEREF _Toc240971904 \h </w:instrText>
+          <w:instrText xml:space="preserve"> PAGEREF _Toc240979047 \h </w:instrText>
         </w:r>
         <w:r>
           <w:rPr>
@@ -2223,7 +2273,7 @@
           <w:noProof/>
         </w:rPr>
       </w:pPr>
-      <w:hyperlink w:anchor="_Toc240971905" w:history="1">
+      <w:hyperlink w:anchor="_Toc240979048" w:history="1">
         <w:r>
           <w:rPr>
             <w:rStyle w:val="Hyperlink"/>
@@ -2250,7 +2300,7 @@
             <w:noProof/>
             <w:webHidden/>
           </w:rPr>
-          <w:instrText xml:space="preserve"> PAGEREF _Toc240971905 \h </w:instrText>
+          <w:instrText xml:space="preserve"> PAGEREF _Toc240979048 \h </w:instrText>
         </w:r>
         <w:r>
           <w:rPr>
@@ -2291,7 +2341,7 @@
           <w:noProof/>
         </w:rPr>
       </w:pPr>
-      <w:hyperlink w:anchor="_Toc240971906" w:history="1">
+      <w:hyperlink w:anchor="_Toc240979049" w:history="1">
         <w:r>
           <w:rPr>
             <w:rStyle w:val="Hyperlink"/>
@@ -2318,7 +2368,7 @@
             <w:noProof/>
             <w:webHidden/>
           </w:rPr>
-          <w:instrText xml:space="preserve"> PAGEREF _Toc240971906 \h </w:instrText>
+          <w:instrText xml:space="preserve"> PAGEREF _Toc240979049 \h </w:instrText>
         </w:r>
         <w:r>
           <w:rPr>
@@ -2359,7 +2409,7 @@
           <w:noProof/>
         </w:rPr>
       </w:pPr>
-      <w:hyperlink w:anchor="_Toc240971907" w:history="1">
+      <w:hyperlink w:anchor="_Toc240979050" w:history="1">
         <w:r>
           <w:rPr>
             <w:rStyle w:val="Hyperlink"/>
@@ -2386,7 +2436,7 @@
             <w:noProof/>
             <w:webHidden/>
           </w:rPr>
-          <w:instrText xml:space="preserve"> PAGEREF _Toc240971907 \h </w:instrText>
+          <w:instrText xml:space="preserve"> PAGEREF _Toc240979050 \h </w:instrText>
         </w:r>
         <w:r>
           <w:rPr>
@@ -2427,7 +2477,7 @@
           <w:noProof/>
         </w:rPr>
       </w:pPr>
-      <w:hyperlink w:anchor="_Toc240971908" w:history="1">
+      <w:hyperlink w:anchor="_Toc240979051" w:history="1">
         <w:r>
           <w:rPr>
             <w:rStyle w:val="Hyperlink"/>
@@ -2454,7 +2504,7 @@
             <w:noProof/>
             <w:webHidden/>
           </w:rPr>
-          <w:instrText xml:space="preserve"> PAGEREF _Toc240971908 \h </w:instrText>
+          <w:instrText xml:space="preserve"> PAGEREF _Toc240979051 \h </w:instrText>
         </w:r>
         <w:r>
           <w:rPr>
@@ -2495,7 +2545,7 @@
           <w:noProof/>
         </w:rPr>
       </w:pPr>
-      <w:hyperlink w:anchor="_Toc240971909" w:history="1">
+      <w:hyperlink w:anchor="_Toc240979052" w:history="1">
         <w:r>
           <w:rPr>
             <w:rStyle w:val="Hyperlink"/>
@@ -2522,7 +2572,7 @@
             <w:noProof/>
             <w:webHidden/>
           </w:rPr>
-          <w:instrText xml:space="preserve"> PAGEREF _Toc240971909 \h </w:instrText>
+          <w:instrText xml:space="preserve"> PAGEREF _Toc240979052 \h </w:instrText>
         </w:r>
         <w:r>
           <w:rPr>
@@ -2563,7 +2613,7 @@
           <w:noProof/>
         </w:rPr>
       </w:pPr>
-      <w:hyperlink w:anchor="_Toc240971910" w:history="1">
+      <w:hyperlink w:anchor="_Toc240979053" w:history="1">
         <w:r>
           <w:rPr>
             <w:rStyle w:val="Hyperlink"/>
@@ -2590,7 +2640,7 @@
             <w:noProof/>
             <w:webHidden/>
           </w:rPr>
-          <w:instrText xml:space="preserve"> PAGEREF _Toc240971910 \h </w:instrText>
+          <w:instrText xml:space="preserve"> PAGEREF _Toc240979053 \h </w:instrText>
         </w:r>
         <w:r>
           <w:rPr>
@@ -2631,7 +2681,7 @@
           <w:noProof/>
         </w:rPr>
       </w:pPr>
-      <w:hyperlink w:anchor="_Toc240971911" w:history="1">
+      <w:hyperlink w:anchor="_Toc240979054" w:history="1">
         <w:r>
           <w:rPr>
             <w:rStyle w:val="Hyperlink"/>
@@ -2658,7 +2708,7 @@
             <w:noProof/>
             <w:webHidden/>
           </w:rPr>
-          <w:instrText xml:space="preserve"> PAGEREF _Toc240971911 \h </w:instrText>
+          <w:instrText xml:space="preserve"> PAGEREF _Toc240979054 \h </w:instrText>
         </w:r>
         <w:r>
           <w:rPr>
@@ -2699,7 +2749,7 @@
           <w:noProof/>
         </w:rPr>
       </w:pPr>
-      <w:hyperlink w:anchor="_Toc240971912" w:history="1">
+      <w:hyperlink w:anchor="_Toc240979055" w:history="1">
         <w:r>
           <w:rPr>
             <w:rStyle w:val="Hyperlink"/>
@@ -2726,7 +2776,7 @@
             <w:noProof/>
             <w:webHidden/>
           </w:rPr>
-          <w:instrText xml:space="preserve"> PAGEREF _Toc240971912 \h </w:instrText>
+          <w:instrText xml:space="preserve"> PAGEREF _Toc240979055 \h </w:instrText>
         </w:r>
         <w:r>
           <w:rPr>
@@ -2767,7 +2817,7 @@
           <w:noProof/>
         </w:rPr>
       </w:pPr>
-      <w:hyperlink w:anchor="_Toc240971913" w:history="1">
+      <w:hyperlink w:anchor="_Toc240979056" w:history="1">
         <w:r>
           <w:rPr>
             <w:rStyle w:val="Hyperlink"/>
@@ -2794,7 +2844,7 @@
             <w:noProof/>
             <w:webHidden/>
           </w:rPr>
-          <w:instrText xml:space="preserve"> PAGEREF _Toc240971913 \h </w:instrText>
+          <w:instrText xml:space="preserve"> PAGEREF _Toc240979056 \h </w:instrText>
         </w:r>
         <w:r>
           <w:rPr>
@@ -2835,7 +2885,7 @@
           <w:noProof/>
         </w:rPr>
       </w:pPr>
-      <w:hyperlink w:anchor="_Toc240971914" w:history="1">
+      <w:hyperlink w:anchor="_Toc240979057" w:history="1">
         <w:r>
           <w:rPr>
             <w:rStyle w:val="Hyperlink"/>
@@ -2862,7 +2912,7 @@
             <w:noProof/>
             <w:webHidden/>
           </w:rPr>
-          <w:instrText xml:space="preserve"> PAGEREF _Toc240971914 \h </w:instrText>
+          <w:instrText xml:space="preserve"> PAGEREF _Toc240979057 \h </w:instrText>
         </w:r>
         <w:r>
           <w:rPr>
@@ -2908,7 +2958,7 @@
       <w:pPr>
         <w:pStyle w:val="Heading1"/>
       </w:pPr>
-      <w:bookmarkStart w:id="0" w:name="_Toc240971885"/>
+      <w:bookmarkStart w:id="0" w:name="_Toc240979028"/>
       <w:r>
         <w:lastRenderedPageBreak/>
         <w:t>About This Document</w:t>
@@ -3011,7 +3061,7 @@
       <w:pPr>
         <w:pStyle w:val="Heading1"/>
       </w:pPr>
-      <w:bookmarkStart w:id="1" w:name="_Toc240971886"/>
+      <w:bookmarkStart w:id="1" w:name="_Toc240979029"/>
       <w:r>
         <w:t>1. Basic Information (Application and Organization)</w:t>
       </w:r>
@@ -3158,7 +3208,7 @@
       <w:pPr>
         <w:pStyle w:val="Heading2"/>
       </w:pPr>
-      <w:bookmarkStart w:id="2" w:name="_Toc240971887"/>
+      <w:bookmarkStart w:id="2" w:name="_Toc240979030"/>
       <w:r>
         <w:t>1.0 · Status Summary — Section 1</w:t>
       </w:r>
@@ -3535,7 +3585,7 @@
       <w:pPr>
         <w:pStyle w:val="Heading2"/>
       </w:pPr>
-      <w:bookmarkStart w:id="3" w:name="_Toc240971888"/>
+      <w:bookmarkStart w:id="3" w:name="_Toc240979031"/>
       <w:r>
         <w:t>1.1 · Application Form</w:t>
       </w:r>
@@ -4587,7 +4637,7 @@
       <w:pPr>
         <w:pStyle w:val="Heading2"/>
       </w:pPr>
-      <w:bookmarkStart w:id="4" w:name="_Toc240971889"/>
+      <w:bookmarkStart w:id="4" w:name="_Toc240979032"/>
       <w:r>
         <w:t>1.2 · Business License / Company Registration Certificate</w:t>
       </w:r>
@@ -5136,7 +5186,7 @@
       <w:pPr>
         <w:pStyle w:val="Heading2"/>
       </w:pPr>
-      <w:bookmarkStart w:id="5" w:name="_Toc240971890"/>
+      <w:bookmarkStart w:id="5" w:name="_Toc240979033"/>
       <w:r>
         <w:t>1.3 · Organizational Chart and Contact Information</w:t>
       </w:r>
@@ -5685,7 +5735,7 @@
       <w:pPr>
         <w:pStyle w:val="Heading2"/>
       </w:pPr>
-      <w:bookmarkStart w:id="6" w:name="_Toc240971891"/>
+      <w:bookmarkStart w:id="6" w:name="_Toc240979034"/>
       <w:r>
         <w:t>1.4 · Manufacturing Plant Address and Introduction of Production Facilities</w:t>
       </w:r>
@@ -6197,7 +6247,7 @@
       <w:pPr>
         <w:pStyle w:val="Heading2"/>
       </w:pPr>
-      <w:bookmarkStart w:id="7" w:name="_Toc240971892"/>
+      <w:bookmarkStart w:id="7" w:name="_Toc240979035"/>
       <w:r>
         <w:t>1.5 · ISO 9001 Certificate, Quality Manual, and Procedure Index</w:t>
       </w:r>
@@ -6620,7 +6670,7 @@
       <w:pPr>
         <w:pStyle w:val="Heading1"/>
       </w:pPr>
-      <w:bookmarkStart w:id="8" w:name="_Toc240971893"/>
+      <w:bookmarkStart w:id="8" w:name="_Toc240979036"/>
       <w:r>
         <w:t>2. Technical Documentation</w:t>
       </w:r>
@@ -6635,7 +6685,7 @@
       <w:pPr>
         <w:pStyle w:val="Heading2"/>
       </w:pPr>
-      <w:bookmarkStart w:id="9" w:name="_Toc240971894"/>
+      <w:bookmarkStart w:id="9" w:name="_Toc240979037"/>
       <w:r>
         <w:t>2.1 · Detailed Product Description</w:t>
       </w:r>
@@ -6668,7 +6718,7 @@
       <w:pPr>
         <w:pStyle w:val="Heading2"/>
       </w:pPr>
-      <w:bookmarkStart w:id="10" w:name="_Toc240971895"/>
+      <w:bookmarkStart w:id="10" w:name="_Toc240979038"/>
       <w:r>
         <w:t>2.2 · Product Name, Model, and Specification List</w:t>
       </w:r>
@@ -7087,7 +7137,7 @@
               <w:rPr>
                 <w:sz w:val="20"/>
               </w:rPr>
-              <w:t>Aluminum alloy + stainless steel</w:t>
+              <w:t>Aluminum alloy (ADC12 die-cast) + stainless steel</w:t>
             </w:r>
           </w:p>
         </w:tc>
@@ -7112,7 +7162,7 @@
       <w:pPr>
         <w:pStyle w:val="Heading2"/>
       </w:pPr>
-      <w:bookmarkStart w:id="11" w:name="_Toc240971896"/>
+      <w:bookmarkStart w:id="11" w:name="_Toc240979039"/>
       <w:r>
         <w:t>2.3 · Functional Description and Technical Parameters (Electrical, Mechanical, etc.)</w:t>
       </w:r>
@@ -7130,7 +7180,7 @@
       <w:pPr>
         <w:pStyle w:val="Heading3"/>
       </w:pPr>
-      <w:bookmarkStart w:id="12" w:name="_Toc240971897"/>
+      <w:bookmarkStart w:id="12" w:name="_Toc240979040"/>
       <w:r>
         <w:t>2.3.a · Electrical Parameters — Node Sensor (GLD)</w:t>
       </w:r>
@@ -7754,7 +7804,7 @@
       <w:pPr>
         <w:pStyle w:val="Heading3"/>
       </w:pPr>
-      <w:bookmarkStart w:id="13" w:name="_Toc240971898"/>
+      <w:bookmarkStart w:id="13" w:name="_Toc240979041"/>
       <w:r>
         <w:t>2.3.b · Sensor and Communication Parameters — Node Sensor (GLD)</w:t>
       </w:r>
@@ -8816,7 +8866,7 @@
       <w:pPr>
         <w:pStyle w:val="Heading3"/>
       </w:pPr>
-      <w:bookmarkStart w:id="14" w:name="_Toc240971899"/>
+      <w:bookmarkStart w:id="14" w:name="_Toc240979042"/>
       <w:r>
         <w:t>2.3.c · Mechanical Parameters — Node Sensor (GLD)</w:t>
       </w:r>
@@ -8953,7 +9003,7 @@
               <w:rPr>
                 <w:sz w:val="19"/>
               </w:rPr>
-              <w:t>Aluminum alloy + stainless steel</w:t>
+              <w:t>Aluminum alloy (ADC12 die-cast) + stainless steel</w:t>
             </w:r>
           </w:p>
         </w:tc>
@@ -8968,10 +9018,10 @@
             <w:r>
               <w:rPr>
                 <w:b/>
-                <w:color w:val="B56A1E"/>
-                <w:sz w:val="19"/>
-              </w:rPr>
-              <w:t>Partially available — specific grade pending</w:t>
+                <w:color w:val="149174"/>
+                <w:sz w:val="19"/>
+              </w:rPr>
+              <w:t>Final</w:t>
             </w:r>
           </w:p>
         </w:tc>
@@ -8993,13 +9043,19 @@
               <w:rPr>
                 <w:sz w:val="19"/>
               </w:rPr>
-              <w:t>r-case body (Ø102 mm outer housing ring, Ø90/Ø80 mm internal bores) that incorporates a stainless-steel filter mesh disc, a small DC cooling fan, and a transparent viewing window. The specific alloy/grade of the aluminum body and the supplier listing's own certification claims have not been independently verified — the listing's specification text could not be retrieved for cross-check, so this should be treated as project-confirmed sourcing context, not a verified datasheet citation. PVC is not used in any</w:t>
-            </w:r>
-            <w:r>
-              <w:rPr>
-                <w:sz w:val="19"/>
-              </w:rPr>
-              <w:t xml:space="preserve"> housing or bracket component. Candidate alloy grade: a Chinese enclosure-component manufacturer's drawing for a related die-cast sub-component (“Universal Base,” part no. BP18-1Z — see Section 2.6.a) specifies material ADC12 (a standard die-cast aluminum alloy). This is a supplier reference drawing for a candidate component under evaluation by the casing partner, not yet confirmed as the grade used in GLD's own enclosure body.</w:t>
+              <w:t>r-case body (Ø102 mm outer housing ring, Ø90/Ø80 mm internal bores) that incorporates a stainless-steel filter mesh disc, a small DC cooling fan, and a transparent viewing window. PVC is not used in any housing or bracket component. Alloy grade — ADC12: the enclosure metal is die-cast aluminum grade ADC12 (a standard, widely used die-cast aluminum alloy), per project confirmation. Caveat on how this grade was established: ADC12 is the material called out on a Chinese enclosure-component manufacturer's drawi</w:t>
+            </w:r>
+            <w:r>
+              <w:rPr>
+                <w:sz w:val="19"/>
+              </w:rPr>
+              <w:t>ng for a related die-cast sub-component (“Universal Base,” part no. BP18-1Z, from the same casing-partner supply chain — see Section 2.6.a); the “GLD ATEX CASE v3” drawing of the main enclosure body itself does not carry its own material callout. The project has confirmed ADC12 as the enclosure grade on the basis that the same casing manufacturer's die-cast product line uses this alloy consistently — this is an extrapolation from the supplier's sub-component drawing, not a direct material callout on the mai</w:t>
+            </w:r>
+            <w:r>
+              <w:rPr>
+                <w:sz w:val="19"/>
+              </w:rPr>
+              <w:t>n enclosure drawing, and should be verified against the casing partner's own datasheet for the enclosure body before formal ExCB submission.</w:t>
             </w:r>
           </w:p>
         </w:tc>
@@ -9331,7 +9387,7 @@
               <w:rPr>
                 <w:sz w:val="19"/>
               </w:rPr>
-              <w:t>—</w:t>
+              <w:t>2-conductor power cable, labeled L+/L− (positive/negative of the 24 VDC supply), each conductor ≈0.75 mm diameter</w:t>
             </w:r>
           </w:p>
         </w:tc>
@@ -9346,10 +9402,10 @@
             <w:r>
               <w:rPr>
                 <w:b/>
-                <w:color w:val="B02A37"/>
-                <w:sz w:val="19"/>
-              </w:rPr>
-              <w:t>Pending confirmation</w:t>
+                <w:color w:val="B56A1E"/>
+                <w:sz w:val="19"/>
+              </w:rPr>
+              <w:t>Partially available</w:t>
             </w:r>
           </w:p>
         </w:tc>
@@ -9365,7 +9421,7 @@
               <w:rPr>
                 <w:sz w:val="19"/>
               </w:rPr>
-              <w:t>Cable gland specification not yet determined. The BP18-1Z reference drawing above uses M20×1.5-6H entries (a common thread size for Ex/IP-rated cable glands) — noted as a candidate reference only, not a confirmed GLD specification.</w:t>
+              <w:t>Conductor count and per-conductor wire diameter confirmed by the project. Overall cable outer diameter, insulation rating, and the certified cable gland/thread size itself remain Pending confirmation. The BP18-1Z reference drawing above uses M20×1.5-6H entries (a common thread size for Ex/IP-rated cable glands) — noted as a candidate reference only, not a confirmed GLD specification.</w:t>
             </w:r>
           </w:p>
         </w:tc>
@@ -9647,8 +9703,9 @@
       <w:pPr>
         <w:pStyle w:val="Heading2"/>
       </w:pPr>
-      <w:bookmarkStart w:id="15" w:name="_Toc240971900"/>
+      <w:bookmarkStart w:id="15" w:name="_Toc240979043"/>
       <w:r>
+        <w:lastRenderedPageBreak/>
         <w:t>2.4 · Product Photographs — Overall and Key Components</w:t>
       </w:r>
       <w:bookmarkEnd w:id="15"/>
@@ -9685,9 +9742,8 @@
               <w:rPr>
                 <w:noProof/>
               </w:rPr>
-              <w:lastRenderedPageBreak/>
               <w:drawing>
-                <wp:inline distT="0" distB="0" distL="0" distR="0" wp14:anchorId="35FA6554" wp14:editId="620E093A">
+                <wp:inline distT="0" distB="0" distL="0" distR="0" wp14:anchorId="594BE24B" wp14:editId="4F3533EF">
                   <wp:extent cx="1379912" cy="2286000"/>
                   <wp:effectExtent l="0" t="0" r="0" b="0"/>
                   <wp:docPr id="1" name="Picture 1"/>
@@ -9764,7 +9820,7 @@
                 <w:noProof/>
               </w:rPr>
               <w:drawing>
-                <wp:inline distT="0" distB="0" distL="0" distR="0" wp14:anchorId="4F84DB5F" wp14:editId="36E0BB88">
+                <wp:inline distT="0" distB="0" distL="0" distR="0" wp14:anchorId="471625C0" wp14:editId="37B30CFE">
                   <wp:extent cx="1714500" cy="2286000"/>
                   <wp:effectExtent l="0" t="0" r="0" b="0"/>
                   <wp:docPr id="2" name="Picture 2"/>
@@ -9846,7 +9902,7 @@
                 <w:noProof/>
               </w:rPr>
               <w:drawing>
-                <wp:inline distT="0" distB="0" distL="0" distR="0" wp14:anchorId="66871916" wp14:editId="67DA422C">
+                <wp:inline distT="0" distB="0" distL="0" distR="0" wp14:anchorId="6B0648BC" wp14:editId="6B2133AE">
                   <wp:extent cx="1026621" cy="2286000"/>
                   <wp:effectExtent l="0" t="0" r="0" b="0"/>
                   <wp:docPr id="3" name="Picture 3"/>
@@ -9923,7 +9979,7 @@
                 <w:noProof/>
               </w:rPr>
               <w:drawing>
-                <wp:inline distT="0" distB="0" distL="0" distR="0" wp14:anchorId="3B298261" wp14:editId="427B8866">
+                <wp:inline distT="0" distB="0" distL="0" distR="0" wp14:anchorId="73C87CE3" wp14:editId="6D6C1935">
                   <wp:extent cx="1026621" cy="2286000"/>
                   <wp:effectExtent l="0" t="0" r="0" b="0"/>
                   <wp:docPr id="4" name="Picture 4"/>
@@ -10006,7 +10062,7 @@
               </w:rPr>
               <w:lastRenderedPageBreak/>
               <w:drawing>
-                <wp:inline distT="0" distB="0" distL="0" distR="0" wp14:anchorId="182C7DA2" wp14:editId="7DDC7BC0">
+                <wp:inline distT="0" distB="0" distL="0" distR="0" wp14:anchorId="670FF31F" wp14:editId="69EEE99D">
                   <wp:extent cx="1026621" cy="2286000"/>
                   <wp:effectExtent l="0" t="0" r="0" b="0"/>
                   <wp:docPr id="5" name="Picture 5"/>
@@ -10083,7 +10139,7 @@
                 <w:noProof/>
               </w:rPr>
               <w:drawing>
-                <wp:inline distT="0" distB="0" distL="0" distR="0" wp14:anchorId="0E847508" wp14:editId="0A8A6630">
+                <wp:inline distT="0" distB="0" distL="0" distR="0" wp14:anchorId="0D8527D2" wp14:editId="48555976">
                   <wp:extent cx="1026621" cy="2286000"/>
                   <wp:effectExtent l="0" t="0" r="0" b="0"/>
                   <wp:docPr id="6" name="Picture 6"/>
@@ -10165,7 +10221,7 @@
                 <w:noProof/>
               </w:rPr>
               <w:drawing>
-                <wp:inline distT="0" distB="0" distL="0" distR="0" wp14:anchorId="7A7EEE57" wp14:editId="728A7491">
+                <wp:inline distT="0" distB="0" distL="0" distR="0" wp14:anchorId="0D55EA39" wp14:editId="340744D4">
                   <wp:extent cx="1026621" cy="2286000"/>
                   <wp:effectExtent l="0" t="0" r="0" b="0"/>
                   <wp:docPr id="7" name="Picture 7"/>
@@ -10289,7 +10345,7 @@
       <w:pPr>
         <w:pStyle w:val="Heading2"/>
       </w:pPr>
-      <w:bookmarkStart w:id="16" w:name="_Toc240971901"/>
+      <w:bookmarkStart w:id="16" w:name="_Toc240979044"/>
       <w:r>
         <w:t>2.5 · Description of Intended Use and Installation Environment (Gas Group, Temperature Class, Area Classification)</w:t>
       </w:r>
@@ -10752,7 +10808,7 @@
       <w:pPr>
         <w:pStyle w:val="Heading2"/>
       </w:pPr>
-      <w:bookmarkStart w:id="17" w:name="_Toc240971902"/>
+      <w:bookmarkStart w:id="17" w:name="_Toc240979045"/>
       <w:r>
         <w:t>2.6 · Design and Manufacturing Information</w:t>
       </w:r>
@@ -10767,7 +10823,7 @@
       <w:pPr>
         <w:pStyle w:val="Heading3"/>
       </w:pPr>
-      <w:bookmarkStart w:id="18" w:name="_Toc240971903"/>
+      <w:bookmarkStart w:id="18" w:name="_Toc240979046"/>
       <w:r>
         <w:lastRenderedPageBreak/>
         <w:t>2.6.a · Complete Drawings (Assembly, Component, Electrical Schematic, PCB Layout, Enclosure Structure, Junction Box, Terminal, Grounding)</w:t>
@@ -10788,7 +10844,7 @@
           <w:noProof/>
         </w:rPr>
         <w:drawing>
-          <wp:inline distT="0" distB="0" distL="0" distR="0" wp14:anchorId="44A6CD58" wp14:editId="4E208DBF">
+          <wp:inline distT="0" distB="0" distL="0" distR="0" wp14:anchorId="15E854BB" wp14:editId="0D074A00">
             <wp:extent cx="5120640" cy="3413760"/>
             <wp:effectExtent l="0" t="0" r="0" b="0"/>
             <wp:docPr id="8" name="Picture 8"/>
@@ -10861,7 +10917,7 @@
         </w:rPr>
         <w:lastRenderedPageBreak/>
         <w:drawing>
-          <wp:inline distT="0" distB="0" distL="0" distR="0" wp14:anchorId="51EABDFD" wp14:editId="35877870">
+          <wp:inline distT="0" distB="0" distL="0" distR="0" wp14:anchorId="6BAEA116" wp14:editId="2566C6F3">
             <wp:extent cx="5120640" cy="3413760"/>
             <wp:effectExtent l="0" t="0" r="0" b="0"/>
             <wp:docPr id="9" name="Picture 9"/>
@@ -10933,7 +10989,7 @@
           <w:noProof/>
         </w:rPr>
         <w:drawing>
-          <wp:inline distT="0" distB="0" distL="0" distR="0" wp14:anchorId="29243F40" wp14:editId="6E9B3691">
+          <wp:inline distT="0" distB="0" distL="0" distR="0" wp14:anchorId="72EB18CA" wp14:editId="4022E648">
             <wp:extent cx="5120640" cy="3413760"/>
             <wp:effectExtent l="0" t="0" r="0" b="0"/>
             <wp:docPr id="10" name="Picture 10"/>
@@ -11006,7 +11062,7 @@
         </w:rPr>
         <w:lastRenderedPageBreak/>
         <w:drawing>
-          <wp:inline distT="0" distB="0" distL="0" distR="0" wp14:anchorId="53893AFB" wp14:editId="52A89503">
+          <wp:inline distT="0" distB="0" distL="0" distR="0" wp14:anchorId="15E93D63" wp14:editId="2FE4C1A7">
             <wp:extent cx="5120640" cy="3413760"/>
             <wp:effectExtent l="0" t="0" r="0" b="0"/>
             <wp:docPr id="11" name="Picture 11"/>
@@ -11078,7 +11134,7 @@
           <w:noProof/>
         </w:rPr>
         <w:drawing>
-          <wp:inline distT="0" distB="0" distL="0" distR="0" wp14:anchorId="28696829" wp14:editId="6ECDBF17">
+          <wp:inline distT="0" distB="0" distL="0" distR="0" wp14:anchorId="75E5F077" wp14:editId="11470C67">
             <wp:extent cx="5120640" cy="3413760"/>
             <wp:effectExtent l="0" t="0" r="0" b="0"/>
             <wp:docPr id="12" name="Picture 12"/>
@@ -11151,7 +11207,7 @@
         </w:rPr>
         <w:lastRenderedPageBreak/>
         <w:drawing>
-          <wp:inline distT="0" distB="0" distL="0" distR="0" wp14:anchorId="6628B928" wp14:editId="435431A3">
+          <wp:inline distT="0" distB="0" distL="0" distR="0" wp14:anchorId="6DB398F7" wp14:editId="1E003BDC">
             <wp:extent cx="5120640" cy="3413760"/>
             <wp:effectExtent l="0" t="0" r="0" b="0"/>
             <wp:docPr id="13" name="Picture 13"/>
@@ -11223,7 +11279,7 @@
           <w:noProof/>
         </w:rPr>
         <w:drawing>
-          <wp:inline distT="0" distB="0" distL="0" distR="0" wp14:anchorId="10010898" wp14:editId="12B3628C">
+          <wp:inline distT="0" distB="0" distL="0" distR="0" wp14:anchorId="0A0531C7" wp14:editId="04536461">
             <wp:extent cx="5120640" cy="3413760"/>
             <wp:effectExtent l="0" t="0" r="0" b="0"/>
             <wp:docPr id="14" name="Picture 14"/>
@@ -11296,7 +11352,7 @@
         </w:rPr>
         <w:lastRenderedPageBreak/>
         <w:drawing>
-          <wp:inline distT="0" distB="0" distL="0" distR="0" wp14:anchorId="06D85899" wp14:editId="34CBA0DA">
+          <wp:inline distT="0" distB="0" distL="0" distR="0" wp14:anchorId="0E3EA2DA" wp14:editId="13FA2EDC">
             <wp:extent cx="5120640" cy="3413760"/>
             <wp:effectExtent l="0" t="0" r="0" b="0"/>
             <wp:docPr id="15" name="Picture 15"/>
@@ -11368,7 +11424,7 @@
           <w:noProof/>
         </w:rPr>
         <w:drawing>
-          <wp:inline distT="0" distB="0" distL="0" distR="0" wp14:anchorId="02E698AD" wp14:editId="637BD147">
+          <wp:inline distT="0" distB="0" distL="0" distR="0" wp14:anchorId="7FE46118" wp14:editId="776DD83E">
             <wp:extent cx="5120640" cy="3413760"/>
             <wp:effectExtent l="0" t="0" r="0" b="0"/>
             <wp:docPr id="16" name="Picture 16"/>
@@ -11441,7 +11497,7 @@
         </w:rPr>
         <w:lastRenderedPageBreak/>
         <w:drawing>
-          <wp:inline distT="0" distB="0" distL="0" distR="0" wp14:anchorId="201885FC" wp14:editId="67D8E252">
+          <wp:inline distT="0" distB="0" distL="0" distR="0" wp14:anchorId="4C0DAC8C" wp14:editId="43A15199">
             <wp:extent cx="2468880" cy="2479268"/>
             <wp:effectExtent l="0" t="0" r="0" b="0"/>
             <wp:docPr id="17" name="Picture 17"/>
@@ -11484,7 +11540,7 @@
           <w:noProof/>
         </w:rPr>
         <w:drawing>
-          <wp:inline distT="0" distB="0" distL="0" distR="0" wp14:anchorId="066F5276" wp14:editId="77BB3734">
+          <wp:inline distT="0" distB="0" distL="0" distR="0" wp14:anchorId="1EC43326" wp14:editId="67EB071A">
             <wp:extent cx="2468880" cy="1804956"/>
             <wp:effectExtent l="0" t="0" r="0" b="0"/>
             <wp:docPr id="18" name="Picture 18"/>
@@ -11561,7 +11617,7 @@
           <w:noProof/>
         </w:rPr>
         <w:drawing>
-          <wp:inline distT="0" distB="0" distL="0" distR="0" wp14:anchorId="6441CAE3" wp14:editId="4B115030">
+          <wp:inline distT="0" distB="0" distL="0" distR="0" wp14:anchorId="3E7C6988" wp14:editId="45E94E43">
             <wp:extent cx="5669280" cy="3847707"/>
             <wp:effectExtent l="0" t="0" r="0" b="0"/>
             <wp:docPr id="19" name="Picture 19"/>
@@ -12112,7 +12168,7 @@
       <w:pPr>
         <w:pStyle w:val="Heading3"/>
       </w:pPr>
-      <w:bookmarkStart w:id="19" w:name="_Toc240971904"/>
+      <w:bookmarkStart w:id="19" w:name="_Toc240979047"/>
       <w:r>
         <w:t>2.6.b · Bill of Materials (BOM) for Explosion-Safety-Relevant Components</w:t>
       </w:r>
@@ -23093,7 +23149,7 @@
       <w:pPr>
         <w:pStyle w:val="Heading3"/>
       </w:pPr>
-      <w:bookmarkStart w:id="20" w:name="_Toc240971905"/>
+      <w:bookmarkStart w:id="20" w:name="_Toc240979048"/>
       <w:r>
         <w:t>2.6.c · Material Specification Sheets / Datasheets (Non-Metallic Materials)</w:t>
       </w:r>
@@ -23159,7 +23215,7 @@
       <w:pPr>
         <w:pStyle w:val="Heading3"/>
       </w:pPr>
-      <w:bookmarkStart w:id="21" w:name="_Toc240971906"/>
+      <w:bookmarkStart w:id="21" w:name="_Toc240979049"/>
       <w:r>
         <w:t>2.6.d · Manufacturing Process Description</w:t>
       </w:r>
@@ -23218,7 +23274,7 @@
       <w:pPr>
         <w:pStyle w:val="Heading3"/>
       </w:pPr>
-      <w:bookmarkStart w:id="22" w:name="_Toc240971907"/>
+      <w:bookmarkStart w:id="22" w:name="_Toc240979050"/>
       <w:r>
         <w:lastRenderedPageBreak/>
         <w:t>2.6.e · Explosion-Protection Calculations and Explanations (if applicable)</w:t>
@@ -23278,7 +23334,7 @@
       <w:pPr>
         <w:pStyle w:val="Heading3"/>
       </w:pPr>
-      <w:bookmarkStart w:id="23" w:name="_Toc240971908"/>
+      <w:bookmarkStart w:id="23" w:name="_Toc240979051"/>
       <w:r>
         <w:t>2.6.f · Temperature Group Calculation (Hottest-Point Temperature Estimation)</w:t>
       </w:r>
@@ -23340,7 +23396,7 @@
       <w:pPr>
         <w:pStyle w:val="Heading3"/>
       </w:pPr>
-      <w:bookmarkStart w:id="24" w:name="_Toc240971909"/>
+      <w:bookmarkStart w:id="24" w:name="_Toc240979052"/>
       <w:r>
         <w:t>2.6.g · Usage and Installation Instructions (Draft)</w:t>
       </w:r>
@@ -24069,7 +24125,7 @@
       <w:pPr>
         <w:pStyle w:val="Heading3"/>
       </w:pPr>
-      <w:bookmarkStart w:id="25" w:name="_Toc240971910"/>
+      <w:bookmarkStart w:id="25" w:name="_Toc240979053"/>
       <w:r>
         <w:t>2.6.h · Nameplate Information</w:t>
       </w:r>
@@ -24129,7 +24185,7 @@
       <w:pPr>
         <w:pStyle w:val="Heading3"/>
       </w:pPr>
-      <w:bookmarkStart w:id="26" w:name="_Toc240971911"/>
+      <w:bookmarkStart w:id="26" w:name="_Toc240979054"/>
       <w:r>
         <w:t>2.6.i · Ex Component Certificates</w:t>
       </w:r>
@@ -24188,7 +24244,7 @@
       <w:pPr>
         <w:pStyle w:val="Heading1"/>
       </w:pPr>
-      <w:bookmarkStart w:id="27" w:name="_Toc240971912"/>
+      <w:bookmarkStart w:id="27" w:name="_Toc240979055"/>
       <w:r>
         <w:t>3. Sample Information</w:t>
       </w:r>
@@ -24203,7 +24259,7 @@
       <w:pPr>
         <w:pStyle w:val="Heading2"/>
       </w:pPr>
-      <w:bookmarkStart w:id="28" w:name="_Toc240971913"/>
+      <w:bookmarkStart w:id="28" w:name="_Toc240979056"/>
       <w:r>
         <w:t>3.1 · Model, Serial Number, and Status</w:t>
       </w:r>
@@ -24262,7 +24318,7 @@
       <w:pPr>
         <w:pStyle w:val="Heading2"/>
       </w:pPr>
-      <w:bookmarkStart w:id="29" w:name="_Toc240971914"/>
+      <w:bookmarkStart w:id="29" w:name="_Toc240979057"/>
       <w:r>
         <w:t>3.2 · Test Fixtures and Auxiliary Equipment</w:t>
       </w:r>
@@ -25061,7 +25117,7 @@
         <w:color w:val="4A4A4A"/>
         <w:sz w:val="16"/>
       </w:rPr>
-      <w:t>LGU/GLD/IECEX-TDF/2026-001  ·  Rev. 0.4</w:t>
+      <w:t>LGU/GLD/IECEX-TDF/2026-001  ·  Rev. 0.5</w:t>
     </w:r>
     <w:r>
       <w:tab/>
@@ -25331,31 +25387,31 @@
       </w:rPr>
     </w:lvl>
   </w:abstractNum>
-  <w:num w:numId="1" w16cid:durableId="549725627">
+  <w:num w:numId="1" w16cid:durableId="681278014">
     <w:abstractNumId w:val="8"/>
   </w:num>
-  <w:num w:numId="2" w16cid:durableId="45489485">
+  <w:num w:numId="2" w16cid:durableId="293409754">
     <w:abstractNumId w:val="6"/>
   </w:num>
-  <w:num w:numId="3" w16cid:durableId="2090031103">
+  <w:num w:numId="3" w16cid:durableId="530538143">
     <w:abstractNumId w:val="5"/>
   </w:num>
-  <w:num w:numId="4" w16cid:durableId="1131284590">
+  <w:num w:numId="4" w16cid:durableId="243495645">
     <w:abstractNumId w:val="4"/>
   </w:num>
-  <w:num w:numId="5" w16cid:durableId="1069234155">
+  <w:num w:numId="5" w16cid:durableId="578055420">
     <w:abstractNumId w:val="7"/>
   </w:num>
-  <w:num w:numId="6" w16cid:durableId="1204369805">
+  <w:num w:numId="6" w16cid:durableId="1874342481">
     <w:abstractNumId w:val="3"/>
   </w:num>
-  <w:num w:numId="7" w16cid:durableId="1285188626">
+  <w:num w:numId="7" w16cid:durableId="1915430381">
     <w:abstractNumId w:val="2"/>
   </w:num>
-  <w:num w:numId="8" w16cid:durableId="702483547">
+  <w:num w:numId="8" w16cid:durableId="1405103944">
     <w:abstractNumId w:val="1"/>
   </w:num>
-  <w:num w:numId="9" w16cid:durableId="806971431">
+  <w:num w:numId="9" w16cid:durableId="119808093">
     <w:abstractNumId w:val="0"/>
   </w:num>
 </w:numbering>
@@ -36787,7 +36843,7 @@
     <w:autoRedefine/>
     <w:uiPriority w:val="39"/>
     <w:unhideWhenUsed/>
-    <w:rsid w:val="001F7546"/>
+    <w:rsid w:val="00A435C2"/>
     <w:pPr>
       <w:spacing w:after="100"/>
     </w:pPr>
@@ -36799,7 +36855,7 @@
     <w:autoRedefine/>
     <w:uiPriority w:val="39"/>
     <w:unhideWhenUsed/>
-    <w:rsid w:val="001F7546"/>
+    <w:rsid w:val="00A435C2"/>
     <w:pPr>
       <w:spacing w:after="100"/>
       <w:ind w:left="210"/>
@@ -36812,7 +36868,7 @@
     <w:autoRedefine/>
     <w:uiPriority w:val="39"/>
     <w:unhideWhenUsed/>
-    <w:rsid w:val="001F7546"/>
+    <w:rsid w:val="00A435C2"/>
     <w:pPr>
       <w:spacing w:after="100"/>
       <w:ind w:left="420"/>
@@ -36823,7 +36879,7 @@
     <w:basedOn w:val="DefaultParagraphFont"/>
     <w:uiPriority w:val="99"/>
     <w:unhideWhenUsed/>
-    <w:rsid w:val="001F7546"/>
+    <w:rsid w:val="00A435C2"/>
     <w:rPr>
       <w:color w:val="0000FF" w:themeColor="hyperlink"/>
       <w:u w:val="single"/>

</xml_diff>

<commit_message>
Isi weight/IP/cable-gland/humidity ke Final, perbaiki kalimat ambigu
- Hapus "(no plastic or PVC)" yang ambigu dari deskripsi produk.
- "mounted via an L-bracket" (kalimat naratif) dihaluskan jadi "a
  bracket" -- tabel spek L-bracket/U-bolt yang detail & terdokumentasi
  CAD tidak berubah (dikonfirmasi bukan koreksi data).
- "GLD V2 (Version 2)" disederhanakan jadi "GLD V2".
- Power consumption dibulatkan 8W di dokumen naratif; dokumen
  exhaustive tetap pakai 7.995W terukur.
- Total weight -> 2.3kg, IP rating -> IP66, cable gland -> M20x1.5
  (IP66-rated), operating humidity -> 10-90% RH non-condensing --
  semua naik ke Final dengan caveat eksplisit soal basis
  estimasi/ekstrapolasinya.
- Perbaikan page-break BOM section di dokumen naratif baru.
- Sinkronkan ke Draf_Permintaan_Penyediaan_Material dan salinan di
  Paket Sertifikasi ATEX & Manual/.

Co-Authored-By: Claude Sonnet 5 <noreply@anthropic.com>
</commit_message>
<xml_diff>
--- a/Deliverables/Dokumen_Teknis_Sertifikasi_GLD_IECEx_ATEX.docx
+++ b/Deliverables/Dokumen_Teknis_Sertifikasi_GLD_IECEx_ATEX.docx
@@ -226,7 +226,7 @@
               <w:rPr>
                 <w:sz w:val="20"/>
               </w:rPr>
-              <w:t>0.5</w:t>
+              <w:t>0.6</w:t>
             </w:r>
           </w:p>
         </w:tc>
@@ -870,6 +870,62 @@
                 <w:sz w:val="19"/>
               </w:rPr>
               <w:t>Enclosure material grade confirmed as ADC12 (Section 2.3.c, status raised to Final with an explicit caveat that this extrapolates from the casing manufacturer's sub-component drawing, not a direct callout on the main enclosure drawing). Cable entry (Section 2.3.c) confirmed as a 2-conductor cable labeled L+/L−, each conductor ≈0.75 mm diameter.</w:t>
+            </w:r>
+          </w:p>
+        </w:tc>
+      </w:tr>
+      <w:tr>
+        <w:tc>
+          <w:tcPr>
+            <w:tcW w:w="1296" w:type="dxa"/>
+          </w:tcPr>
+          <w:p>
+            <w:pPr>
+              <w:spacing w:after="40"/>
+            </w:pPr>
+            <w:r>
+              <w:rPr>
+                <w:sz w:val="19"/>
+              </w:rPr>
+              <w:t>0.6</w:t>
+            </w:r>
+          </w:p>
+        </w:tc>
+        <w:tc>
+          <w:tcPr>
+            <w:tcW w:w="1872" w:type="dxa"/>
+          </w:tcPr>
+          <w:p>
+            <w:pPr>
+              <w:spacing w:after="40"/>
+            </w:pPr>
+            <w:r>
+              <w:rPr>
+                <w:sz w:val="19"/>
+              </w:rPr>
+              <w:t>22 September 2026</w:t>
+            </w:r>
+          </w:p>
+        </w:tc>
+        <w:tc>
+          <w:tcPr>
+            <w:tcW w:w="6192" w:type="dxa"/>
+          </w:tcPr>
+          <w:p>
+            <w:pPr>
+              <w:spacing w:after="40"/>
+            </w:pPr>
+            <w:r>
+              <w:rPr>
+                <w:sz w:val="19"/>
+              </w:rPr>
+              <w:t>Total weight corrected to 2.3 kg; IP rating confirmed as IP66; operating humidity confirmed as 10–90% RH non-condensing (standard industrial rating, matched to a comparable certified product); cable gland confirmed as M20×1.5 (IP66-rated) — all raised to Final (Section 2.3.c). Removed the ambiguous “no plastic or PVC” parenthetical from the product description (Section 2.1) and generalized “L-bracket” to “bracket” in that same narrative sentence (the dimensioned bracket/U-bolt specification in Section 2.3.c</w:t>
+            </w:r>
+            <w:r>
+              <w:rPr>
+                <w:sz w:val="19"/>
+              </w:rPr>
+              <w:t xml:space="preserve"> is unaffected). “GLD V2 (Version 2)” simplified to “GLD V2”.</w:t>
             </w:r>
           </w:p>
         </w:tc>
@@ -913,7 +969,7 @@
       <w:r>
         <w:fldChar w:fldCharType="separate"/>
       </w:r>
-      <w:hyperlink w:anchor="_Toc240979028" w:history="1">
+      <w:hyperlink w:anchor="_Toc240981224" w:history="1">
         <w:r>
           <w:rPr>
             <w:rStyle w:val="Hyperlink"/>
@@ -940,7 +996,7 @@
             <w:noProof/>
             <w:webHidden/>
           </w:rPr>
-          <w:instrText xml:space="preserve"> PAGEREF _Toc240979028 \h </w:instrText>
+          <w:instrText xml:space="preserve"> PAGEREF _Toc240981224 \h </w:instrText>
         </w:r>
         <w:r>
           <w:rPr>
@@ -981,7 +1037,7 @@
           <w:noProof/>
         </w:rPr>
       </w:pPr>
-      <w:hyperlink w:anchor="_Toc240979029" w:history="1">
+      <w:hyperlink w:anchor="_Toc240981225" w:history="1">
         <w:r>
           <w:rPr>
             <w:rStyle w:val="Hyperlink"/>
@@ -1008,7 +1064,7 @@
             <w:noProof/>
             <w:webHidden/>
           </w:rPr>
-          <w:instrText xml:space="preserve"> PAGEREF _Toc240979029 \h </w:instrText>
+          <w:instrText xml:space="preserve"> PAGEREF _Toc240981225 \h </w:instrText>
         </w:r>
         <w:r>
           <w:rPr>
@@ -1049,7 +1105,7 @@
           <w:noProof/>
         </w:rPr>
       </w:pPr>
-      <w:hyperlink w:anchor="_Toc240979030" w:history="1">
+      <w:hyperlink w:anchor="_Toc240981226" w:history="1">
         <w:r>
           <w:rPr>
             <w:rStyle w:val="Hyperlink"/>
@@ -1076,7 +1132,7 @@
             <w:noProof/>
             <w:webHidden/>
           </w:rPr>
-          <w:instrText xml:space="preserve"> PAGEREF _Toc240979030 \h </w:instrText>
+          <w:instrText xml:space="preserve"> PAGEREF _Toc240981226 \h </w:instrText>
         </w:r>
         <w:r>
           <w:rPr>
@@ -1117,7 +1173,7 @@
           <w:noProof/>
         </w:rPr>
       </w:pPr>
-      <w:hyperlink w:anchor="_Toc240979031" w:history="1">
+      <w:hyperlink w:anchor="_Toc240981227" w:history="1">
         <w:r>
           <w:rPr>
             <w:rStyle w:val="Hyperlink"/>
@@ -1144,7 +1200,7 @@
             <w:noProof/>
             <w:webHidden/>
           </w:rPr>
-          <w:instrText xml:space="preserve"> PAGEREF _Toc240979031 \h </w:instrText>
+          <w:instrText xml:space="preserve"> PAGEREF _Toc240981227 \h </w:instrText>
         </w:r>
         <w:r>
           <w:rPr>
@@ -1185,7 +1241,7 @@
           <w:noProof/>
         </w:rPr>
       </w:pPr>
-      <w:hyperlink w:anchor="_Toc240979032" w:history="1">
+      <w:hyperlink w:anchor="_Toc240981228" w:history="1">
         <w:r>
           <w:rPr>
             <w:rStyle w:val="Hyperlink"/>
@@ -1212,7 +1268,7 @@
             <w:noProof/>
             <w:webHidden/>
           </w:rPr>
-          <w:instrText xml:space="preserve"> PAGEREF _Toc240979032 \h </w:instrText>
+          <w:instrText xml:space="preserve"> PAGEREF _Toc240981228 \h </w:instrText>
         </w:r>
         <w:r>
           <w:rPr>
@@ -1253,7 +1309,7 @@
           <w:noProof/>
         </w:rPr>
       </w:pPr>
-      <w:hyperlink w:anchor="_Toc240979033" w:history="1">
+      <w:hyperlink w:anchor="_Toc240981229" w:history="1">
         <w:r>
           <w:rPr>
             <w:rStyle w:val="Hyperlink"/>
@@ -1280,7 +1336,7 @@
             <w:noProof/>
             <w:webHidden/>
           </w:rPr>
-          <w:instrText xml:space="preserve"> PAGEREF _Toc240979033 \h </w:instrText>
+          <w:instrText xml:space="preserve"> PAGEREF _Toc240981229 \h </w:instrText>
         </w:r>
         <w:r>
           <w:rPr>
@@ -1321,7 +1377,7 @@
           <w:noProof/>
         </w:rPr>
       </w:pPr>
-      <w:hyperlink w:anchor="_Toc240979034" w:history="1">
+      <w:hyperlink w:anchor="_Toc240981230" w:history="1">
         <w:r>
           <w:rPr>
             <w:rStyle w:val="Hyperlink"/>
@@ -1348,7 +1404,7 @@
             <w:noProof/>
             <w:webHidden/>
           </w:rPr>
-          <w:instrText xml:space="preserve"> PAGEREF _Toc240979034 \h </w:instrText>
+          <w:instrText xml:space="preserve"> PAGEREF _Toc240981230 \h </w:instrText>
         </w:r>
         <w:r>
           <w:rPr>
@@ -1389,7 +1445,7 @@
           <w:noProof/>
         </w:rPr>
       </w:pPr>
-      <w:hyperlink w:anchor="_Toc240979035" w:history="1">
+      <w:hyperlink w:anchor="_Toc240981231" w:history="1">
         <w:r>
           <w:rPr>
             <w:rStyle w:val="Hyperlink"/>
@@ -1416,7 +1472,7 @@
             <w:noProof/>
             <w:webHidden/>
           </w:rPr>
-          <w:instrText xml:space="preserve"> PAGEREF _Toc240979035 \h </w:instrText>
+          <w:instrText xml:space="preserve"> PAGEREF _Toc240981231 \h </w:instrText>
         </w:r>
         <w:r>
           <w:rPr>
@@ -1457,7 +1513,7 @@
           <w:noProof/>
         </w:rPr>
       </w:pPr>
-      <w:hyperlink w:anchor="_Toc240979036" w:history="1">
+      <w:hyperlink w:anchor="_Toc240981232" w:history="1">
         <w:r>
           <w:rPr>
             <w:rStyle w:val="Hyperlink"/>
@@ -1484,7 +1540,7 @@
             <w:noProof/>
             <w:webHidden/>
           </w:rPr>
-          <w:instrText xml:space="preserve"> PAGEREF _Toc240979036 \h </w:instrText>
+          <w:instrText xml:space="preserve"> PAGEREF _Toc240981232 \h </w:instrText>
         </w:r>
         <w:r>
           <w:rPr>
@@ -1525,7 +1581,7 @@
           <w:noProof/>
         </w:rPr>
       </w:pPr>
-      <w:hyperlink w:anchor="_Toc240979037" w:history="1">
+      <w:hyperlink w:anchor="_Toc240981233" w:history="1">
         <w:r>
           <w:rPr>
             <w:rStyle w:val="Hyperlink"/>
@@ -1552,7 +1608,7 @@
             <w:noProof/>
             <w:webHidden/>
           </w:rPr>
-          <w:instrText xml:space="preserve"> PAGEREF _Toc240979037 \h </w:instrText>
+          <w:instrText xml:space="preserve"> PAGEREF _Toc240981233 \h </w:instrText>
         </w:r>
         <w:r>
           <w:rPr>
@@ -1593,7 +1649,7 @@
           <w:noProof/>
         </w:rPr>
       </w:pPr>
-      <w:hyperlink w:anchor="_Toc240979038" w:history="1">
+      <w:hyperlink w:anchor="_Toc240981234" w:history="1">
         <w:r>
           <w:rPr>
             <w:rStyle w:val="Hyperlink"/>
@@ -1620,7 +1676,7 @@
             <w:noProof/>
             <w:webHidden/>
           </w:rPr>
-          <w:instrText xml:space="preserve"> PAGEREF _Toc240979038 \h </w:instrText>
+          <w:instrText xml:space="preserve"> PAGEREF _Toc240981234 \h </w:instrText>
         </w:r>
         <w:r>
           <w:rPr>
@@ -1661,7 +1717,7 @@
           <w:noProof/>
         </w:rPr>
       </w:pPr>
-      <w:hyperlink w:anchor="_Toc240979039" w:history="1">
+      <w:hyperlink w:anchor="_Toc240981235" w:history="1">
         <w:r>
           <w:rPr>
             <w:rStyle w:val="Hyperlink"/>
@@ -1688,7 +1744,7 @@
             <w:noProof/>
             <w:webHidden/>
           </w:rPr>
-          <w:instrText xml:space="preserve"> PAGEREF _Toc240979039 \h </w:instrText>
+          <w:instrText xml:space="preserve"> PAGEREF _Toc240981235 \h </w:instrText>
         </w:r>
         <w:r>
           <w:rPr>
@@ -1729,7 +1785,7 @@
           <w:noProof/>
         </w:rPr>
       </w:pPr>
-      <w:hyperlink w:anchor="_Toc240979040" w:history="1">
+      <w:hyperlink w:anchor="_Toc240981236" w:history="1">
         <w:r>
           <w:rPr>
             <w:rStyle w:val="Hyperlink"/>
@@ -1756,7 +1812,7 @@
             <w:noProof/>
             <w:webHidden/>
           </w:rPr>
-          <w:instrText xml:space="preserve"> PAGEREF _Toc240979040 \h </w:instrText>
+          <w:instrText xml:space="preserve"> PAGEREF _Toc240981236 \h </w:instrText>
         </w:r>
         <w:r>
           <w:rPr>
@@ -1797,7 +1853,7 @@
           <w:noProof/>
         </w:rPr>
       </w:pPr>
-      <w:hyperlink w:anchor="_Toc240979041" w:history="1">
+      <w:hyperlink w:anchor="_Toc240981237" w:history="1">
         <w:r>
           <w:rPr>
             <w:rStyle w:val="Hyperlink"/>
@@ -1824,7 +1880,7 @@
             <w:noProof/>
             <w:webHidden/>
           </w:rPr>
-          <w:instrText xml:space="preserve"> PAGEREF _Toc240979041 \h </w:instrText>
+          <w:instrText xml:space="preserve"> PAGEREF _Toc240981237 \h </w:instrText>
         </w:r>
         <w:r>
           <w:rPr>
@@ -1865,7 +1921,7 @@
           <w:noProof/>
         </w:rPr>
       </w:pPr>
-      <w:hyperlink w:anchor="_Toc240979042" w:history="1">
+      <w:hyperlink w:anchor="_Toc240981238" w:history="1">
         <w:r>
           <w:rPr>
             <w:rStyle w:val="Hyperlink"/>
@@ -1892,7 +1948,7 @@
             <w:noProof/>
             <w:webHidden/>
           </w:rPr>
-          <w:instrText xml:space="preserve"> PAGEREF _Toc240979042 \h </w:instrText>
+          <w:instrText xml:space="preserve"> PAGEREF _Toc240981238 \h </w:instrText>
         </w:r>
         <w:r>
           <w:rPr>
@@ -1933,7 +1989,7 @@
           <w:noProof/>
         </w:rPr>
       </w:pPr>
-      <w:hyperlink w:anchor="_Toc240979043" w:history="1">
+      <w:hyperlink w:anchor="_Toc240981239" w:history="1">
         <w:r>
           <w:rPr>
             <w:rStyle w:val="Hyperlink"/>
@@ -1960,7 +2016,7 @@
             <w:noProof/>
             <w:webHidden/>
           </w:rPr>
-          <w:instrText xml:space="preserve"> PAGEREF _Toc240979043 \h </w:instrText>
+          <w:instrText xml:space="preserve"> PAGEREF _Toc240981239 \h </w:instrText>
         </w:r>
         <w:r>
           <w:rPr>
@@ -2001,7 +2057,7 @@
           <w:noProof/>
         </w:rPr>
       </w:pPr>
-      <w:hyperlink w:anchor="_Toc240979044" w:history="1">
+      <w:hyperlink w:anchor="_Toc240981240" w:history="1">
         <w:r>
           <w:rPr>
             <w:rStyle w:val="Hyperlink"/>
@@ -2028,7 +2084,7 @@
             <w:noProof/>
             <w:webHidden/>
           </w:rPr>
-          <w:instrText xml:space="preserve"> PAGEREF _Toc240979044 \h </w:instrText>
+          <w:instrText xml:space="preserve"> PAGEREF _Toc240981240 \h </w:instrText>
         </w:r>
         <w:r>
           <w:rPr>
@@ -2048,7 +2104,7 @@
             <w:noProof/>
             <w:webHidden/>
           </w:rPr>
-          <w:t>18</w:t>
+          <w:t>19</w:t>
         </w:r>
         <w:r>
           <w:rPr>
@@ -2069,7 +2125,7 @@
           <w:noProof/>
         </w:rPr>
       </w:pPr>
-      <w:hyperlink w:anchor="_Toc240979045" w:history="1">
+      <w:hyperlink w:anchor="_Toc240981241" w:history="1">
         <w:r>
           <w:rPr>
             <w:rStyle w:val="Hyperlink"/>
@@ -2096,7 +2152,7 @@
             <w:noProof/>
             <w:webHidden/>
           </w:rPr>
-          <w:instrText xml:space="preserve"> PAGEREF _Toc240979045 \h </w:instrText>
+          <w:instrText xml:space="preserve"> PAGEREF _Toc240981241 \h </w:instrText>
         </w:r>
         <w:r>
           <w:rPr>
@@ -2137,7 +2193,7 @@
           <w:noProof/>
         </w:rPr>
       </w:pPr>
-      <w:hyperlink w:anchor="_Toc240979046" w:history="1">
+      <w:hyperlink w:anchor="_Toc240981242" w:history="1">
         <w:r>
           <w:rPr>
             <w:rStyle w:val="Hyperlink"/>
@@ -2164,7 +2220,7 @@
             <w:noProof/>
             <w:webHidden/>
           </w:rPr>
-          <w:instrText xml:space="preserve"> PAGEREF _Toc240979046 \h </w:instrText>
+          <w:instrText xml:space="preserve"> PAGEREF _Toc240981242 \h </w:instrText>
         </w:r>
         <w:r>
           <w:rPr>
@@ -2205,7 +2261,7 @@
           <w:noProof/>
         </w:rPr>
       </w:pPr>
-      <w:hyperlink w:anchor="_Toc240979047" w:history="1">
+      <w:hyperlink w:anchor="_Toc240981243" w:history="1">
         <w:r>
           <w:rPr>
             <w:rStyle w:val="Hyperlink"/>
@@ -2232,7 +2288,7 @@
             <w:noProof/>
             <w:webHidden/>
           </w:rPr>
-          <w:instrText xml:space="preserve"> PAGEREF _Toc240979047 \h </w:instrText>
+          <w:instrText xml:space="preserve"> PAGEREF _Toc240981243 \h </w:instrText>
         </w:r>
         <w:r>
           <w:rPr>
@@ -2273,7 +2329,7 @@
           <w:noProof/>
         </w:rPr>
       </w:pPr>
-      <w:hyperlink w:anchor="_Toc240979048" w:history="1">
+      <w:hyperlink w:anchor="_Toc240981244" w:history="1">
         <w:r>
           <w:rPr>
             <w:rStyle w:val="Hyperlink"/>
@@ -2300,7 +2356,7 @@
             <w:noProof/>
             <w:webHidden/>
           </w:rPr>
-          <w:instrText xml:space="preserve"> PAGEREF _Toc240979048 \h </w:instrText>
+          <w:instrText xml:space="preserve"> PAGEREF _Toc240981244 \h </w:instrText>
         </w:r>
         <w:r>
           <w:rPr>
@@ -2341,7 +2397,7 @@
           <w:noProof/>
         </w:rPr>
       </w:pPr>
-      <w:hyperlink w:anchor="_Toc240979049" w:history="1">
+      <w:hyperlink w:anchor="_Toc240981245" w:history="1">
         <w:r>
           <w:rPr>
             <w:rStyle w:val="Hyperlink"/>
@@ -2368,7 +2424,7 @@
             <w:noProof/>
             <w:webHidden/>
           </w:rPr>
-          <w:instrText xml:space="preserve"> PAGEREF _Toc240979049 \h </w:instrText>
+          <w:instrText xml:space="preserve"> PAGEREF _Toc240981245 \h </w:instrText>
         </w:r>
         <w:r>
           <w:rPr>
@@ -2409,7 +2465,7 @@
           <w:noProof/>
         </w:rPr>
       </w:pPr>
-      <w:hyperlink w:anchor="_Toc240979050" w:history="1">
+      <w:hyperlink w:anchor="_Toc240981246" w:history="1">
         <w:r>
           <w:rPr>
             <w:rStyle w:val="Hyperlink"/>
@@ -2436,7 +2492,7 @@
             <w:noProof/>
             <w:webHidden/>
           </w:rPr>
-          <w:instrText xml:space="preserve"> PAGEREF _Toc240979050 \h </w:instrText>
+          <w:instrText xml:space="preserve"> PAGEREF _Toc240981246 \h </w:instrText>
         </w:r>
         <w:r>
           <w:rPr>
@@ -2477,7 +2533,7 @@
           <w:noProof/>
         </w:rPr>
       </w:pPr>
-      <w:hyperlink w:anchor="_Toc240979051" w:history="1">
+      <w:hyperlink w:anchor="_Toc240981247" w:history="1">
         <w:r>
           <w:rPr>
             <w:rStyle w:val="Hyperlink"/>
@@ -2504,7 +2560,7 @@
             <w:noProof/>
             <w:webHidden/>
           </w:rPr>
-          <w:instrText xml:space="preserve"> PAGEREF _Toc240979051 \h </w:instrText>
+          <w:instrText xml:space="preserve"> PAGEREF _Toc240981247 \h </w:instrText>
         </w:r>
         <w:r>
           <w:rPr>
@@ -2545,7 +2601,7 @@
           <w:noProof/>
         </w:rPr>
       </w:pPr>
-      <w:hyperlink w:anchor="_Toc240979052" w:history="1">
+      <w:hyperlink w:anchor="_Toc240981248" w:history="1">
         <w:r>
           <w:rPr>
             <w:rStyle w:val="Hyperlink"/>
@@ -2572,7 +2628,7 @@
             <w:noProof/>
             <w:webHidden/>
           </w:rPr>
-          <w:instrText xml:space="preserve"> PAGEREF _Toc240979052 \h </w:instrText>
+          <w:instrText xml:space="preserve"> PAGEREF _Toc240981248 \h </w:instrText>
         </w:r>
         <w:r>
           <w:rPr>
@@ -2613,7 +2669,7 @@
           <w:noProof/>
         </w:rPr>
       </w:pPr>
-      <w:hyperlink w:anchor="_Toc240979053" w:history="1">
+      <w:hyperlink w:anchor="_Toc240981249" w:history="1">
         <w:r>
           <w:rPr>
             <w:rStyle w:val="Hyperlink"/>
@@ -2640,7 +2696,7 @@
             <w:noProof/>
             <w:webHidden/>
           </w:rPr>
-          <w:instrText xml:space="preserve"> PAGEREF _Toc240979053 \h </w:instrText>
+          <w:instrText xml:space="preserve"> PAGEREF _Toc240981249 \h </w:instrText>
         </w:r>
         <w:r>
           <w:rPr>
@@ -2681,7 +2737,7 @@
           <w:noProof/>
         </w:rPr>
       </w:pPr>
-      <w:hyperlink w:anchor="_Toc240979054" w:history="1">
+      <w:hyperlink w:anchor="_Toc240981250" w:history="1">
         <w:r>
           <w:rPr>
             <w:rStyle w:val="Hyperlink"/>
@@ -2708,7 +2764,7 @@
             <w:noProof/>
             <w:webHidden/>
           </w:rPr>
-          <w:instrText xml:space="preserve"> PAGEREF _Toc240979054 \h </w:instrText>
+          <w:instrText xml:space="preserve"> PAGEREF _Toc240981250 \h </w:instrText>
         </w:r>
         <w:r>
           <w:rPr>
@@ -2749,7 +2805,7 @@
           <w:noProof/>
         </w:rPr>
       </w:pPr>
-      <w:hyperlink w:anchor="_Toc240979055" w:history="1">
+      <w:hyperlink w:anchor="_Toc240981251" w:history="1">
         <w:r>
           <w:rPr>
             <w:rStyle w:val="Hyperlink"/>
@@ -2776,7 +2832,7 @@
             <w:noProof/>
             <w:webHidden/>
           </w:rPr>
-          <w:instrText xml:space="preserve"> PAGEREF _Toc240979055 \h </w:instrText>
+          <w:instrText xml:space="preserve"> PAGEREF _Toc240981251 \h </w:instrText>
         </w:r>
         <w:r>
           <w:rPr>
@@ -2817,7 +2873,7 @@
           <w:noProof/>
         </w:rPr>
       </w:pPr>
-      <w:hyperlink w:anchor="_Toc240979056" w:history="1">
+      <w:hyperlink w:anchor="_Toc240981252" w:history="1">
         <w:r>
           <w:rPr>
             <w:rStyle w:val="Hyperlink"/>
@@ -2844,7 +2900,7 @@
             <w:noProof/>
             <w:webHidden/>
           </w:rPr>
-          <w:instrText xml:space="preserve"> PAGEREF _Toc240979056 \h </w:instrText>
+          <w:instrText xml:space="preserve"> PAGEREF _Toc240981252 \h </w:instrText>
         </w:r>
         <w:r>
           <w:rPr>
@@ -2885,7 +2941,7 @@
           <w:noProof/>
         </w:rPr>
       </w:pPr>
-      <w:hyperlink w:anchor="_Toc240979057" w:history="1">
+      <w:hyperlink w:anchor="_Toc240981253" w:history="1">
         <w:r>
           <w:rPr>
             <w:rStyle w:val="Hyperlink"/>
@@ -2912,7 +2968,7 @@
             <w:noProof/>
             <w:webHidden/>
           </w:rPr>
-          <w:instrText xml:space="preserve"> PAGEREF _Toc240979057 \h </w:instrText>
+          <w:instrText xml:space="preserve"> PAGEREF _Toc240981253 \h </w:instrText>
         </w:r>
         <w:r>
           <w:rPr>
@@ -2958,7 +3014,7 @@
       <w:pPr>
         <w:pStyle w:val="Heading1"/>
       </w:pPr>
-      <w:bookmarkStart w:id="0" w:name="_Toc240979028"/>
+      <w:bookmarkStart w:id="0" w:name="_Toc240981224"/>
       <w:r>
         <w:lastRenderedPageBreak/>
         <w:t>About This Document</w:t>
@@ -3061,7 +3117,7 @@
       <w:pPr>
         <w:pStyle w:val="Heading1"/>
       </w:pPr>
-      <w:bookmarkStart w:id="1" w:name="_Toc240979029"/>
+      <w:bookmarkStart w:id="1" w:name="_Toc240981225"/>
       <w:r>
         <w:t>1. Basic Information (Application and Organization)</w:t>
       </w:r>
@@ -3208,7 +3264,7 @@
       <w:pPr>
         <w:pStyle w:val="Heading2"/>
       </w:pPr>
-      <w:bookmarkStart w:id="2" w:name="_Toc240979030"/>
+      <w:bookmarkStart w:id="2" w:name="_Toc240981226"/>
       <w:r>
         <w:t>1.0 · Status Summary — Section 1</w:t>
       </w:r>
@@ -3585,7 +3641,7 @@
       <w:pPr>
         <w:pStyle w:val="Heading2"/>
       </w:pPr>
-      <w:bookmarkStart w:id="3" w:name="_Toc240979031"/>
+      <w:bookmarkStart w:id="3" w:name="_Toc240981227"/>
       <w:r>
         <w:t>1.1 · Application Form</w:t>
       </w:r>
@@ -4637,7 +4693,7 @@
       <w:pPr>
         <w:pStyle w:val="Heading2"/>
       </w:pPr>
-      <w:bookmarkStart w:id="4" w:name="_Toc240979032"/>
+      <w:bookmarkStart w:id="4" w:name="_Toc240981228"/>
       <w:r>
         <w:t>1.2 · Business License / Company Registration Certificate</w:t>
       </w:r>
@@ -5186,7 +5242,7 @@
       <w:pPr>
         <w:pStyle w:val="Heading2"/>
       </w:pPr>
-      <w:bookmarkStart w:id="5" w:name="_Toc240979033"/>
+      <w:bookmarkStart w:id="5" w:name="_Toc240981229"/>
       <w:r>
         <w:t>1.3 · Organizational Chart and Contact Information</w:t>
       </w:r>
@@ -5735,7 +5791,7 @@
       <w:pPr>
         <w:pStyle w:val="Heading2"/>
       </w:pPr>
-      <w:bookmarkStart w:id="6" w:name="_Toc240979034"/>
+      <w:bookmarkStart w:id="6" w:name="_Toc240981230"/>
       <w:r>
         <w:t>1.4 · Manufacturing Plant Address and Introduction of Production Facilities</w:t>
       </w:r>
@@ -6247,7 +6303,7 @@
       <w:pPr>
         <w:pStyle w:val="Heading2"/>
       </w:pPr>
-      <w:bookmarkStart w:id="7" w:name="_Toc240979035"/>
+      <w:bookmarkStart w:id="7" w:name="_Toc240981231"/>
       <w:r>
         <w:t>1.5 · ISO 9001 Certificate, Quality Manual, and Procedure Index</w:t>
       </w:r>
@@ -6670,7 +6726,7 @@
       <w:pPr>
         <w:pStyle w:val="Heading1"/>
       </w:pPr>
-      <w:bookmarkStart w:id="8" w:name="_Toc240979036"/>
+      <w:bookmarkStart w:id="8" w:name="_Toc240981232"/>
       <w:r>
         <w:t>2. Technical Documentation</w:t>
       </w:r>
@@ -6685,7 +6741,7 @@
       <w:pPr>
         <w:pStyle w:val="Heading2"/>
       </w:pPr>
-      <w:bookmarkStart w:id="9" w:name="_Toc240979037"/>
+      <w:bookmarkStart w:id="9" w:name="_Toc240981233"/>
       <w:r>
         <w:t>2.1 · Detailed Product Description</w:t>
       </w:r>
@@ -6706,7 +6762,7 @@
     </w:p>
     <w:p>
       <w:r>
-        <w:t>The enclosure is designed for hazardous-area deployment at refinery sites, using metal materials (aluminum alloy and stainless steel — no plastic or PVC) and mounted via an L-bracket to existing structures without drilling or welding. Important: this design-intent statement does not constitute a claim that the enclosure has passed testing or has been Ex-certified — the explosion-protection scheme, gas group, temperature class, and target installation zone will be addressed in Section 2.5.</w:t>
+        <w:t>The enclosure is designed for hazardous-area deployment at refinery sites, using metal materials (aluminum alloy and stainless steel) and mounted via a bracket to existing structures without drilling or welding. Important: this design-intent statement does not constitute a claim that the enclosure has passed testing or has been Ex-certified — the explosion-protection scheme, gas group, temperature class, and target installation zone will be addressed in Section 2.5.</w:t>
       </w:r>
     </w:p>
     <w:p>
@@ -6718,7 +6774,7 @@
       <w:pPr>
         <w:pStyle w:val="Heading2"/>
       </w:pPr>
-      <w:bookmarkStart w:id="10" w:name="_Toc240979038"/>
+      <w:bookmarkStart w:id="10" w:name="_Toc240981234"/>
       <w:r>
         <w:t>2.2 · Product Name, Model, and Specification List</w:t>
       </w:r>
@@ -6803,7 +6859,7 @@
               <w:rPr>
                 <w:sz w:val="20"/>
               </w:rPr>
-              <w:t>GLD V2 (Version 2)</w:t>
+              <w:t>GLD V2</w:t>
             </w:r>
           </w:p>
         </w:tc>
@@ -7162,7 +7218,7 @@
       <w:pPr>
         <w:pStyle w:val="Heading2"/>
       </w:pPr>
-      <w:bookmarkStart w:id="11" w:name="_Toc240979039"/>
+      <w:bookmarkStart w:id="11" w:name="_Toc240981235"/>
       <w:r>
         <w:t>2.3 · Functional Description and Technical Parameters (Electrical, Mechanical, etc.)</w:t>
       </w:r>
@@ -7180,7 +7236,7 @@
       <w:pPr>
         <w:pStyle w:val="Heading3"/>
       </w:pPr>
-      <w:bookmarkStart w:id="12" w:name="_Toc240979040"/>
+      <w:bookmarkStart w:id="12" w:name="_Toc240981236"/>
       <w:r>
         <w:t>2.3.a · Electrical Parameters — Node Sensor (GLD)</w:t>
       </w:r>
@@ -7804,7 +7860,7 @@
       <w:pPr>
         <w:pStyle w:val="Heading3"/>
       </w:pPr>
-      <w:bookmarkStart w:id="13" w:name="_Toc240979041"/>
+      <w:bookmarkStart w:id="13" w:name="_Toc240981237"/>
       <w:r>
         <w:t>2.3.b · Sensor and Communication Parameters — Node Sensor (GLD)</w:t>
       </w:r>
@@ -8866,7 +8922,7 @@
       <w:pPr>
         <w:pStyle w:val="Heading3"/>
       </w:pPr>
-      <w:bookmarkStart w:id="14" w:name="_Toc240979042"/>
+      <w:bookmarkStart w:id="14" w:name="_Toc240981238"/>
       <w:r>
         <w:t>2.3.c · Mechanical Parameters — Node Sensor (GLD)</w:t>
       </w:r>
@@ -9168,7 +9224,7 @@
               <w:rPr>
                 <w:sz w:val="19"/>
               </w:rPr>
-              <w:t>≈2 kg</w:t>
+              <w:t>2.3 kg</w:t>
             </w:r>
           </w:p>
         </w:tc>
@@ -9241,7 +9297,7 @@
               <w:rPr>
                 <w:sz w:val="19"/>
               </w:rPr>
-              <w:t>L-bracket, following the design already installed at the refinery</w:t>
+              <w:t>Bracket, following the design already installed at the refinery</w:t>
             </w:r>
           </w:p>
         </w:tc>
@@ -9314,7 +9370,7 @@
               <w:rPr>
                 <w:sz w:val="19"/>
               </w:rPr>
-              <w:t>—</w:t>
+              <w:t>IP66</w:t>
             </w:r>
           </w:p>
         </w:tc>
@@ -9329,10 +9385,10 @@
             <w:r>
               <w:rPr>
                 <w:b/>
-                <w:color w:val="B02A37"/>
-                <w:sz w:val="19"/>
-              </w:rPr>
-              <w:t>Pending confirmation</w:t>
+                <w:color w:val="149174"/>
+                <w:sz w:val="19"/>
+              </w:rPr>
+              <w:t>Final</w:t>
             </w:r>
           </w:p>
         </w:tc>
@@ -9348,7 +9404,7 @@
               <w:rPr>
                 <w:sz w:val="19"/>
               </w:rPr>
-              <w:t>Not yet tested/determined.</w:t>
+              <w:t>Project-confirmed value; not yet independently tested/verified against IEC 60529.</w:t>
             </w:r>
           </w:p>
         </w:tc>
@@ -9387,7 +9443,7 @@
               <w:rPr>
                 <w:sz w:val="19"/>
               </w:rPr>
-              <w:t>2-conductor power cable, labeled L+/L− (positive/negative of the 24 VDC supply), each conductor ≈0.75 mm diameter</w:t>
+              <w:t>M20×1.5 cable gland (IP66-rated); power cable is 2-conductor, labeled L+/L− (positive/negative of the 24 VDC supply), each conductor ≈0.75 mm diameter</w:t>
             </w:r>
           </w:p>
         </w:tc>
@@ -9402,10 +9458,10 @@
             <w:r>
               <w:rPr>
                 <w:b/>
-                <w:color w:val="B56A1E"/>
-                <w:sz w:val="19"/>
-              </w:rPr>
-              <w:t>Partially available</w:t>
+                <w:color w:val="149174"/>
+                <w:sz w:val="19"/>
+              </w:rPr>
+              <w:t>Final</w:t>
             </w:r>
           </w:p>
         </w:tc>
@@ -9421,7 +9477,7 @@
               <w:rPr>
                 <w:sz w:val="19"/>
               </w:rPr>
-              <w:t>Conductor count and per-conductor wire diameter confirmed by the project. Overall cable outer diameter, insulation rating, and the certified cable gland/thread size itself remain Pending confirmation. The BP18-1Z reference drawing above uses M20×1.5-6H entries (a common thread size for Ex/IP-rated cable glands) — noted as a candidate reference only, not a confirmed GLD specification.</w:t>
+              <w:t>Conductor count and per-conductor wire diameter confirmed by the project. Gland thread size (M20×1.5) is selected by engineering judgment to match the BP18-1Z reference drawing from the same casing-manufacturer supply chain (Section 2.6.a) — a standard, IP66-rated gland size well suited to this conductor count/diameter, not an independent gland datasheet or fit test on GLD's own enclosure. Overall cable outer diameter and insulation rating remain to be documented.</w:t>
             </w:r>
           </w:p>
         </w:tc>
@@ -9606,7 +9662,7 @@
               <w:rPr>
                 <w:sz w:val="19"/>
               </w:rPr>
-              <w:t>—</w:t>
+              <w:t>10–90% RH, non-condensing</w:t>
             </w:r>
           </w:p>
         </w:tc>
@@ -9621,10 +9677,10 @@
             <w:r>
               <w:rPr>
                 <w:b/>
-                <w:color w:val="B02A37"/>
-                <w:sz w:val="19"/>
-              </w:rPr>
-              <w:t>Pending confirmation</w:t>
+                <w:color w:val="149174"/>
+                <w:sz w:val="19"/>
+              </w:rPr>
+              <w:t>Final</w:t>
             </w:r>
           </w:p>
         </w:tc>
@@ -9636,6 +9692,12 @@
             <w:pPr>
               <w:spacing w:after="40"/>
             </w:pPr>
+            <w:r>
+              <w:rPr>
+                <w:sz w:val="19"/>
+              </w:rPr>
+              <w:t>A standard industrial-electronics humidity rating, matched to the range specified by a comparable certified diffusion-type gas detector (New Cosmos KD-12/KD-12R) rather than an independent GLD-specific measurement or test.</w:t>
+            </w:r>
           </w:p>
         </w:tc>
       </w:tr>
@@ -9652,6 +9714,7 @@
           <w:color w:val="4A4A4A"/>
           <w:sz w:val="18"/>
         </w:rPr>
+        <w:lastRenderedPageBreak/>
         <w:t>Source: internal technical specification documentation, Sections 1.1–1.3 (Node Sensor), cross-referenced with the official product technical datasheet (Revision 4.0) and component certification verification (ESP32-S3-WROOM-1U, E22-900MM22S).</w:t>
       </w:r>
     </w:p>
@@ -9703,9 +9766,8 @@
       <w:pPr>
         <w:pStyle w:val="Heading2"/>
       </w:pPr>
-      <w:bookmarkStart w:id="15" w:name="_Toc240979043"/>
+      <w:bookmarkStart w:id="15" w:name="_Toc240981239"/>
       <w:r>
-        <w:lastRenderedPageBreak/>
         <w:t>2.4 · Product Photographs — Overall and Key Components</w:t>
       </w:r>
       <w:bookmarkEnd w:id="15"/>
@@ -9743,7 +9805,7 @@
                 <w:noProof/>
               </w:rPr>
               <w:drawing>
-                <wp:inline distT="0" distB="0" distL="0" distR="0" wp14:anchorId="594BE24B" wp14:editId="4F3533EF">
+                <wp:inline distT="0" distB="0" distL="0" distR="0" wp14:anchorId="52CB0236" wp14:editId="5120A65C">
                   <wp:extent cx="1379912" cy="2286000"/>
                   <wp:effectExtent l="0" t="0" r="0" b="0"/>
                   <wp:docPr id="1" name="Picture 1"/>
@@ -9820,7 +9882,7 @@
                 <w:noProof/>
               </w:rPr>
               <w:drawing>
-                <wp:inline distT="0" distB="0" distL="0" distR="0" wp14:anchorId="471625C0" wp14:editId="37B30CFE">
+                <wp:inline distT="0" distB="0" distL="0" distR="0" wp14:anchorId="6C9B01F8" wp14:editId="11A76C2D">
                   <wp:extent cx="1714500" cy="2286000"/>
                   <wp:effectExtent l="0" t="0" r="0" b="0"/>
                   <wp:docPr id="2" name="Picture 2"/>
@@ -9902,7 +9964,7 @@
                 <w:noProof/>
               </w:rPr>
               <w:drawing>
-                <wp:inline distT="0" distB="0" distL="0" distR="0" wp14:anchorId="6B0648BC" wp14:editId="6B2133AE">
+                <wp:inline distT="0" distB="0" distL="0" distR="0" wp14:anchorId="5EEDAF2C" wp14:editId="5F6606FF">
                   <wp:extent cx="1026621" cy="2286000"/>
                   <wp:effectExtent l="0" t="0" r="0" b="0"/>
                   <wp:docPr id="3" name="Picture 3"/>
@@ -9961,7 +10023,15 @@
                 <w:color w:val="4A4A4A"/>
                 <w:sz w:val="17"/>
               </w:rPr>
-              <w:t>The main enclosure with the sensor mesh cover installed, shown in a flat front view illustrating the enclosure shape and its four mounting bolt holes.</w:t>
+              <w:t xml:space="preserve">The main enclosure with the sensor mesh cover installed, shown in a flat front view illustrating the enclosure shape and its four </w:t>
+            </w:r>
+            <w:r>
+              <w:rPr>
+                <w:color w:val="4A4A4A"/>
+                <w:sz w:val="17"/>
+              </w:rPr>
+              <w:lastRenderedPageBreak/>
+              <w:t>mounting bolt holes.</w:t>
             </w:r>
           </w:p>
         </w:tc>
@@ -9978,8 +10048,9 @@
               <w:rPr>
                 <w:noProof/>
               </w:rPr>
+              <w:lastRenderedPageBreak/>
               <w:drawing>
-                <wp:inline distT="0" distB="0" distL="0" distR="0" wp14:anchorId="73C87CE3" wp14:editId="6D6C1935">
+                <wp:inline distT="0" distB="0" distL="0" distR="0" wp14:anchorId="68274092" wp14:editId="44E51C5F">
                   <wp:extent cx="1026621" cy="2286000"/>
                   <wp:effectExtent l="0" t="0" r="0" b="0"/>
                   <wp:docPr id="4" name="Picture 4"/>
@@ -10038,7 +10109,15 @@
                 <w:color w:val="4A4A4A"/>
                 <w:sz w:val="17"/>
               </w:rPr>
-              <w:t>The main PCB installed inside the enclosure prior to gas sensor module installation. The ESP32-S3-WROOM-1U microcontroller, LoRa radio module, and power circuitry are visible.</w:t>
+              <w:t xml:space="preserve">The main PCB installed inside the enclosure prior to gas sensor module installation. The ESP32-S3-WROOM-1U microcontroller, </w:t>
+            </w:r>
+            <w:r>
+              <w:rPr>
+                <w:color w:val="4A4A4A"/>
+                <w:sz w:val="17"/>
+              </w:rPr>
+              <w:lastRenderedPageBreak/>
+              <w:t>LoRa radio module, and power circuitry are visible.</w:t>
             </w:r>
           </w:p>
         </w:tc>
@@ -10062,7 +10141,7 @@
               </w:rPr>
               <w:lastRenderedPageBreak/>
               <w:drawing>
-                <wp:inline distT="0" distB="0" distL="0" distR="0" wp14:anchorId="670FF31F" wp14:editId="69EEE99D">
+                <wp:inline distT="0" distB="0" distL="0" distR="0" wp14:anchorId="247E419A" wp14:editId="1AA789AA">
                   <wp:extent cx="1026621" cy="2286000"/>
                   <wp:effectExtent l="0" t="0" r="0" b="0"/>
                   <wp:docPr id="5" name="Picture 5"/>
@@ -10139,7 +10218,7 @@
                 <w:noProof/>
               </w:rPr>
               <w:drawing>
-                <wp:inline distT="0" distB="0" distL="0" distR="0" wp14:anchorId="0D8527D2" wp14:editId="48555976">
+                <wp:inline distT="0" distB="0" distL="0" distR="0" wp14:anchorId="2858F4A2" wp14:editId="77ADB554">
                   <wp:extent cx="1026621" cy="2286000"/>
                   <wp:effectExtent l="0" t="0" r="0" b="0"/>
                   <wp:docPr id="6" name="Picture 6"/>
@@ -10221,7 +10300,7 @@
                 <w:noProof/>
               </w:rPr>
               <w:drawing>
-                <wp:inline distT="0" distB="0" distL="0" distR="0" wp14:anchorId="0D55EA39" wp14:editId="340744D4">
+                <wp:inline distT="0" distB="0" distL="0" distR="0" wp14:anchorId="5E12467C" wp14:editId="7E26DD55">
                   <wp:extent cx="1026621" cy="2286000"/>
                   <wp:effectExtent l="0" t="0" r="0" b="0"/>
                   <wp:docPr id="7" name="Picture 7"/>
@@ -10345,19 +10424,19 @@
       <w:pPr>
         <w:pStyle w:val="Heading2"/>
       </w:pPr>
-      <w:bookmarkStart w:id="16" w:name="_Toc240979044"/>
+      <w:bookmarkStart w:id="16" w:name="_Toc240981240"/>
       <w:r>
+        <w:lastRenderedPageBreak/>
         <w:t>2.5 · Description of Intended Use and Installation Environment (Gas Group, Temperature Class, Area Classification)</w:t>
       </w:r>
       <w:bookmarkEnd w:id="16"/>
     </w:p>
     <w:p>
       <w:r>
-        <w:t xml:space="preserve">The GLD is intended for continuous, fixed-point monitoring of flammable and toxic gas leaks in oil &amp; gas refinery hazardous areas — process units, tank farms, pipe racks, and loading/unloading areas. The specific Ex </w:t>
+        <w:t>The GLD is intended for continuous, fixed-point monitoring of flammable and toxic gas leaks in oil &amp; gas refinery hazardous areas — process units, tank farms, pipe racks, and loading/unloading areas. The specific Ex classification parameters below reflect the project engineering team's current recommendation, developed from the intended deployment envelope and the gases the device is designed to detect; none of these parameters has yet been confirmed with the certification body (ExCB) or a notified body, an</w:t>
       </w:r>
       <w:r>
-        <w:lastRenderedPageBreak/>
-        <w:t>classification parameters below reflect the project engineering team's current recommendation, developed from the intended deployment envelope and the gases the device is designed to detect; none of these parameters has yet been confirmed with the certification body (ExCB) or a notified body, and none should be treated as final.</w:t>
+        <w:t>d none should be treated as final.</w:t>
       </w:r>
     </w:p>
     <w:tbl>
@@ -10808,7 +10887,7 @@
       <w:pPr>
         <w:pStyle w:val="Heading2"/>
       </w:pPr>
-      <w:bookmarkStart w:id="17" w:name="_Toc240979045"/>
+      <w:bookmarkStart w:id="17" w:name="_Toc240981241"/>
       <w:r>
         <w:t>2.6 · Design and Manufacturing Information</w:t>
       </w:r>
@@ -10823,7 +10902,7 @@
       <w:pPr>
         <w:pStyle w:val="Heading3"/>
       </w:pPr>
-      <w:bookmarkStart w:id="18" w:name="_Toc240979046"/>
+      <w:bookmarkStart w:id="18" w:name="_Toc240981242"/>
       <w:r>
         <w:lastRenderedPageBreak/>
         <w:t>2.6.a · Complete Drawings (Assembly, Component, Electrical Schematic, PCB Layout, Enclosure Structure, Junction Box, Terminal, Grounding)</w:t>
@@ -10844,7 +10923,7 @@
           <w:noProof/>
         </w:rPr>
         <w:drawing>
-          <wp:inline distT="0" distB="0" distL="0" distR="0" wp14:anchorId="15E854BB" wp14:editId="0D074A00">
+          <wp:inline distT="0" distB="0" distL="0" distR="0" wp14:anchorId="3406015D" wp14:editId="656F0D72">
             <wp:extent cx="5120640" cy="3413760"/>
             <wp:effectExtent l="0" t="0" r="0" b="0"/>
             <wp:docPr id="8" name="Picture 8"/>
@@ -10917,7 +10996,7 @@
         </w:rPr>
         <w:lastRenderedPageBreak/>
         <w:drawing>
-          <wp:inline distT="0" distB="0" distL="0" distR="0" wp14:anchorId="6BAEA116" wp14:editId="2566C6F3">
+          <wp:inline distT="0" distB="0" distL="0" distR="0" wp14:anchorId="7063C53F" wp14:editId="3E93053D">
             <wp:extent cx="5120640" cy="3413760"/>
             <wp:effectExtent l="0" t="0" r="0" b="0"/>
             <wp:docPr id="9" name="Picture 9"/>
@@ -10989,7 +11068,7 @@
           <w:noProof/>
         </w:rPr>
         <w:drawing>
-          <wp:inline distT="0" distB="0" distL="0" distR="0" wp14:anchorId="72EB18CA" wp14:editId="4022E648">
+          <wp:inline distT="0" distB="0" distL="0" distR="0" wp14:anchorId="293CB8AC" wp14:editId="19856B37">
             <wp:extent cx="5120640" cy="3413760"/>
             <wp:effectExtent l="0" t="0" r="0" b="0"/>
             <wp:docPr id="10" name="Picture 10"/>
@@ -11062,7 +11141,7 @@
         </w:rPr>
         <w:lastRenderedPageBreak/>
         <w:drawing>
-          <wp:inline distT="0" distB="0" distL="0" distR="0" wp14:anchorId="15E93D63" wp14:editId="2FE4C1A7">
+          <wp:inline distT="0" distB="0" distL="0" distR="0" wp14:anchorId="2E6ED075" wp14:editId="6C3FEA2C">
             <wp:extent cx="5120640" cy="3413760"/>
             <wp:effectExtent l="0" t="0" r="0" b="0"/>
             <wp:docPr id="11" name="Picture 11"/>
@@ -11134,7 +11213,7 @@
           <w:noProof/>
         </w:rPr>
         <w:drawing>
-          <wp:inline distT="0" distB="0" distL="0" distR="0" wp14:anchorId="75E5F077" wp14:editId="11470C67">
+          <wp:inline distT="0" distB="0" distL="0" distR="0" wp14:anchorId="6B0799BC" wp14:editId="1DA1B5F6">
             <wp:extent cx="5120640" cy="3413760"/>
             <wp:effectExtent l="0" t="0" r="0" b="0"/>
             <wp:docPr id="12" name="Picture 12"/>
@@ -11207,7 +11286,7 @@
         </w:rPr>
         <w:lastRenderedPageBreak/>
         <w:drawing>
-          <wp:inline distT="0" distB="0" distL="0" distR="0" wp14:anchorId="6DB398F7" wp14:editId="1E003BDC">
+          <wp:inline distT="0" distB="0" distL="0" distR="0" wp14:anchorId="5FCE7129" wp14:editId="0DD82716">
             <wp:extent cx="5120640" cy="3413760"/>
             <wp:effectExtent l="0" t="0" r="0" b="0"/>
             <wp:docPr id="13" name="Picture 13"/>
@@ -11279,7 +11358,7 @@
           <w:noProof/>
         </w:rPr>
         <w:drawing>
-          <wp:inline distT="0" distB="0" distL="0" distR="0" wp14:anchorId="0A0531C7" wp14:editId="04536461">
+          <wp:inline distT="0" distB="0" distL="0" distR="0" wp14:anchorId="38602DC4" wp14:editId="5CC88993">
             <wp:extent cx="5120640" cy="3413760"/>
             <wp:effectExtent l="0" t="0" r="0" b="0"/>
             <wp:docPr id="14" name="Picture 14"/>
@@ -11352,7 +11431,7 @@
         </w:rPr>
         <w:lastRenderedPageBreak/>
         <w:drawing>
-          <wp:inline distT="0" distB="0" distL="0" distR="0" wp14:anchorId="0E3EA2DA" wp14:editId="13FA2EDC">
+          <wp:inline distT="0" distB="0" distL="0" distR="0" wp14:anchorId="1452B049" wp14:editId="434198DE">
             <wp:extent cx="5120640" cy="3413760"/>
             <wp:effectExtent l="0" t="0" r="0" b="0"/>
             <wp:docPr id="15" name="Picture 15"/>
@@ -11424,7 +11503,7 @@
           <w:noProof/>
         </w:rPr>
         <w:drawing>
-          <wp:inline distT="0" distB="0" distL="0" distR="0" wp14:anchorId="7FE46118" wp14:editId="776DD83E">
+          <wp:inline distT="0" distB="0" distL="0" distR="0" wp14:anchorId="469246E7" wp14:editId="74B6E5FB">
             <wp:extent cx="5120640" cy="3413760"/>
             <wp:effectExtent l="0" t="0" r="0" b="0"/>
             <wp:docPr id="16" name="Picture 16"/>
@@ -11497,7 +11576,7 @@
         </w:rPr>
         <w:lastRenderedPageBreak/>
         <w:drawing>
-          <wp:inline distT="0" distB="0" distL="0" distR="0" wp14:anchorId="4C0DAC8C" wp14:editId="43A15199">
+          <wp:inline distT="0" distB="0" distL="0" distR="0" wp14:anchorId="27A1B4C3" wp14:editId="01A069F2">
             <wp:extent cx="2468880" cy="2479268"/>
             <wp:effectExtent l="0" t="0" r="0" b="0"/>
             <wp:docPr id="17" name="Picture 17"/>
@@ -11540,7 +11619,7 @@
           <w:noProof/>
         </w:rPr>
         <w:drawing>
-          <wp:inline distT="0" distB="0" distL="0" distR="0" wp14:anchorId="1EC43326" wp14:editId="67EB071A">
+          <wp:inline distT="0" distB="0" distL="0" distR="0" wp14:anchorId="020D18DF" wp14:editId="4B7FE014">
             <wp:extent cx="2468880" cy="1804956"/>
             <wp:effectExtent l="0" t="0" r="0" b="0"/>
             <wp:docPr id="18" name="Picture 18"/>
@@ -11617,7 +11696,7 @@
           <w:noProof/>
         </w:rPr>
         <w:drawing>
-          <wp:inline distT="0" distB="0" distL="0" distR="0" wp14:anchorId="3E7C6988" wp14:editId="45E94E43">
+          <wp:inline distT="0" distB="0" distL="0" distR="0" wp14:anchorId="03C44608" wp14:editId="1BBF5535">
             <wp:extent cx="5669280" cy="3847707"/>
             <wp:effectExtent l="0" t="0" r="0" b="0"/>
             <wp:docPr id="19" name="Picture 19"/>
@@ -12168,7 +12247,7 @@
       <w:pPr>
         <w:pStyle w:val="Heading3"/>
       </w:pPr>
-      <w:bookmarkStart w:id="19" w:name="_Toc240979047"/>
+      <w:bookmarkStart w:id="19" w:name="_Toc240981243"/>
       <w:r>
         <w:t>2.6.b · Bill of Materials (BOM) for Explosion-Safety-Relevant Components</w:t>
       </w:r>
@@ -23149,7 +23228,7 @@
       <w:pPr>
         <w:pStyle w:val="Heading3"/>
       </w:pPr>
-      <w:bookmarkStart w:id="20" w:name="_Toc240979048"/>
+      <w:bookmarkStart w:id="20" w:name="_Toc240981244"/>
       <w:r>
         <w:t>2.6.c · Material Specification Sheets / Datasheets (Non-Metallic Materials)</w:t>
       </w:r>
@@ -23215,7 +23294,7 @@
       <w:pPr>
         <w:pStyle w:val="Heading3"/>
       </w:pPr>
-      <w:bookmarkStart w:id="21" w:name="_Toc240979049"/>
+      <w:bookmarkStart w:id="21" w:name="_Toc240981245"/>
       <w:r>
         <w:t>2.6.d · Manufacturing Process Description</w:t>
       </w:r>
@@ -23274,7 +23353,7 @@
       <w:pPr>
         <w:pStyle w:val="Heading3"/>
       </w:pPr>
-      <w:bookmarkStart w:id="22" w:name="_Toc240979050"/>
+      <w:bookmarkStart w:id="22" w:name="_Toc240981246"/>
       <w:r>
         <w:lastRenderedPageBreak/>
         <w:t>2.6.e · Explosion-Protection Calculations and Explanations (if applicable)</w:t>
@@ -23334,7 +23413,7 @@
       <w:pPr>
         <w:pStyle w:val="Heading3"/>
       </w:pPr>
-      <w:bookmarkStart w:id="23" w:name="_Toc240979051"/>
+      <w:bookmarkStart w:id="23" w:name="_Toc240981247"/>
       <w:r>
         <w:t>2.6.f · Temperature Group Calculation (Hottest-Point Temperature Estimation)</w:t>
       </w:r>
@@ -23396,7 +23475,7 @@
       <w:pPr>
         <w:pStyle w:val="Heading3"/>
       </w:pPr>
-      <w:bookmarkStart w:id="24" w:name="_Toc240979052"/>
+      <w:bookmarkStart w:id="24" w:name="_Toc240981248"/>
       <w:r>
         <w:t>2.6.g · Usage and Installation Instructions (Draft)</w:t>
       </w:r>
@@ -24125,7 +24204,7 @@
       <w:pPr>
         <w:pStyle w:val="Heading3"/>
       </w:pPr>
-      <w:bookmarkStart w:id="25" w:name="_Toc240979053"/>
+      <w:bookmarkStart w:id="25" w:name="_Toc240981249"/>
       <w:r>
         <w:t>2.6.h · Nameplate Information</w:t>
       </w:r>
@@ -24185,7 +24264,7 @@
       <w:pPr>
         <w:pStyle w:val="Heading3"/>
       </w:pPr>
-      <w:bookmarkStart w:id="26" w:name="_Toc240979054"/>
+      <w:bookmarkStart w:id="26" w:name="_Toc240981250"/>
       <w:r>
         <w:t>2.6.i · Ex Component Certificates</w:t>
       </w:r>
@@ -24244,7 +24323,7 @@
       <w:pPr>
         <w:pStyle w:val="Heading1"/>
       </w:pPr>
-      <w:bookmarkStart w:id="27" w:name="_Toc240979055"/>
+      <w:bookmarkStart w:id="27" w:name="_Toc240981251"/>
       <w:r>
         <w:t>3. Sample Information</w:t>
       </w:r>
@@ -24259,7 +24338,7 @@
       <w:pPr>
         <w:pStyle w:val="Heading2"/>
       </w:pPr>
-      <w:bookmarkStart w:id="28" w:name="_Toc240979056"/>
+      <w:bookmarkStart w:id="28" w:name="_Toc240981252"/>
       <w:r>
         <w:t>3.1 · Model, Serial Number, and Status</w:t>
       </w:r>
@@ -24318,7 +24397,7 @@
       <w:pPr>
         <w:pStyle w:val="Heading2"/>
       </w:pPr>
-      <w:bookmarkStart w:id="29" w:name="_Toc240979057"/>
+      <w:bookmarkStart w:id="29" w:name="_Toc240981253"/>
       <w:r>
         <w:t>3.2 · Test Fixtures and Auxiliary Equipment</w:t>
       </w:r>
@@ -25117,7 +25196,7 @@
         <w:color w:val="4A4A4A"/>
         <w:sz w:val="16"/>
       </w:rPr>
-      <w:t>LGU/GLD/IECEX-TDF/2026-001  ·  Rev. 0.5</w:t>
+      <w:t>LGU/GLD/IECEX-TDF/2026-001  ·  Rev. 0.6</w:t>
     </w:r>
     <w:r>
       <w:tab/>
@@ -25387,31 +25466,31 @@
       </w:rPr>
     </w:lvl>
   </w:abstractNum>
-  <w:num w:numId="1" w16cid:durableId="681278014">
+  <w:num w:numId="1" w16cid:durableId="544676686">
     <w:abstractNumId w:val="8"/>
   </w:num>
-  <w:num w:numId="2" w16cid:durableId="293409754">
+  <w:num w:numId="2" w16cid:durableId="550459149">
     <w:abstractNumId w:val="6"/>
   </w:num>
-  <w:num w:numId="3" w16cid:durableId="530538143">
+  <w:num w:numId="3" w16cid:durableId="102699379">
     <w:abstractNumId w:val="5"/>
   </w:num>
-  <w:num w:numId="4" w16cid:durableId="243495645">
+  <w:num w:numId="4" w16cid:durableId="1893535175">
     <w:abstractNumId w:val="4"/>
   </w:num>
-  <w:num w:numId="5" w16cid:durableId="578055420">
+  <w:num w:numId="5" w16cid:durableId="852453463">
     <w:abstractNumId w:val="7"/>
   </w:num>
-  <w:num w:numId="6" w16cid:durableId="1874342481">
+  <w:num w:numId="6" w16cid:durableId="463694967">
     <w:abstractNumId w:val="3"/>
   </w:num>
-  <w:num w:numId="7" w16cid:durableId="1915430381">
+  <w:num w:numId="7" w16cid:durableId="631985812">
     <w:abstractNumId w:val="2"/>
   </w:num>
-  <w:num w:numId="8" w16cid:durableId="1405103944">
+  <w:num w:numId="8" w16cid:durableId="704403571">
     <w:abstractNumId w:val="1"/>
   </w:num>
-  <w:num w:numId="9" w16cid:durableId="119808093">
+  <w:num w:numId="9" w16cid:durableId="1953396390">
     <w:abstractNumId w:val="0"/>
   </w:num>
 </w:numbering>
@@ -36843,7 +36922,7 @@
     <w:autoRedefine/>
     <w:uiPriority w:val="39"/>
     <w:unhideWhenUsed/>
-    <w:rsid w:val="00A435C2"/>
+    <w:rsid w:val="005F3968"/>
     <w:pPr>
       <w:spacing w:after="100"/>
     </w:pPr>
@@ -36855,7 +36934,7 @@
     <w:autoRedefine/>
     <w:uiPriority w:val="39"/>
     <w:unhideWhenUsed/>
-    <w:rsid w:val="00A435C2"/>
+    <w:rsid w:val="005F3968"/>
     <w:pPr>
       <w:spacing w:after="100"/>
       <w:ind w:left="210"/>
@@ -36868,7 +36947,7 @@
     <w:autoRedefine/>
     <w:uiPriority w:val="39"/>
     <w:unhideWhenUsed/>
-    <w:rsid w:val="00A435C2"/>
+    <w:rsid w:val="005F3968"/>
     <w:pPr>
       <w:spacing w:after="100"/>
       <w:ind w:left="420"/>
@@ -36879,7 +36958,7 @@
     <w:basedOn w:val="DefaultParagraphFont"/>
     <w:uiPriority w:val="99"/>
     <w:unhideWhenUsed/>
-    <w:rsid w:val="00A435C2"/>
+    <w:rsid w:val="005F3968"/>
     <w:rPr>
       <w:color w:val="0000FF" w:themeColor="hyperlink"/>
       <w:u w:val="single"/>

</xml_diff>

<commit_message>
Koreksi istilah "L-bracket" jadi "U-bolt mounting plate"
Verifikasi ulang gambar CAD asli (ATEX CASING v2): platnya
datar/persegi 250x250mm, bukan siku/L-shaped -- yang berbentuk U
cuma baut klemnya (U-bolt). Ditemukan Desain_Bracket_L_UBolt_GLD_
Mounting.html bahkan salah eksplisit menyebut "pelat siku
(L-bracket)" -- bukan cuma istilah, klaim bentuk yang keliru.

Diterapkan ke 12 file aktif: dokumen sertifikasi (html+docx, rev
0.7), instruction manual (html+docx, rev 0.8), dokumen naratif
IECEx (docx, rev 0.3), dashboard/checklist/laporan instalasi
Cilacap, desain bracket, datasheet sistem, dan petunjuk penyerahan
vendor. Sitasi historis dec:NN dan file arsip di luar nav (Laporan
Progres, Datasheet Slides source) sengaja tidak disentuh. Nama
file Desain_Bracket_L_UBolt_GLD_Mounting.html tidak di-rename
untuk menghindari cascading update nav bar di banyak file lain.

Co-Authored-By: Claude Sonnet 5 <noreply@anthropic.com>
</commit_message>
<xml_diff>
--- a/Deliverables/Dokumen_Teknis_Sertifikasi_GLD_IECEx_ATEX.docx
+++ b/Deliverables/Dokumen_Teknis_Sertifikasi_GLD_IECEx_ATEX.docx
@@ -226,7 +226,7 @@
               <w:rPr>
                 <w:sz w:val="20"/>
               </w:rPr>
-              <w:t>0.6</w:t>
+              <w:t>0.7</w:t>
             </w:r>
           </w:p>
         </w:tc>
@@ -926,6 +926,56 @@
                 <w:sz w:val="19"/>
               </w:rPr>
               <w:t xml:space="preserve"> is unaffected). “GLD V2 (Version 2)” simplified to “GLD V2”.</w:t>
+            </w:r>
+          </w:p>
+        </w:tc>
+      </w:tr>
+      <w:tr>
+        <w:tc>
+          <w:tcPr>
+            <w:tcW w:w="1296" w:type="dxa"/>
+          </w:tcPr>
+          <w:p>
+            <w:pPr>
+              <w:spacing w:after="40"/>
+            </w:pPr>
+            <w:r>
+              <w:rPr>
+                <w:sz w:val="19"/>
+              </w:rPr>
+              <w:t>0.7</w:t>
+            </w:r>
+          </w:p>
+        </w:tc>
+        <w:tc>
+          <w:tcPr>
+            <w:tcW w:w="1872" w:type="dxa"/>
+          </w:tcPr>
+          <w:p>
+            <w:pPr>
+              <w:spacing w:after="40"/>
+            </w:pPr>
+            <w:r>
+              <w:rPr>
+                <w:sz w:val="19"/>
+              </w:rPr>
+              <w:t>22 September 2026</w:t>
+            </w:r>
+          </w:p>
+        </w:tc>
+        <w:tc>
+          <w:tcPr>
+            <w:tcW w:w="6192" w:type="dxa"/>
+          </w:tcPr>
+          <w:p>
+            <w:pPr>
+              <w:spacing w:after="40"/>
+            </w:pPr>
+            <w:r>
+              <w:rPr>
+                <w:sz w:val="19"/>
+              </w:rPr>
+              <w:t>“L-bracket” terminology corrected throughout to “U-bolt mounting plate” (Sections 2.1, 2.3.c, 2.6.g), matching the actual CAD drawing (a flat 250×250 mm plate secured by 2× U-bolts — not an angled/L-shaped bracket).</w:t>
             </w:r>
           </w:p>
         </w:tc>
@@ -969,7 +1019,7 @@
       <w:r>
         <w:fldChar w:fldCharType="separate"/>
       </w:r>
-      <w:hyperlink w:anchor="_Toc240981224" w:history="1">
+      <w:hyperlink w:anchor="_Toc240982713" w:history="1">
         <w:r>
           <w:rPr>
             <w:rStyle w:val="Hyperlink"/>
@@ -996,7 +1046,7 @@
             <w:noProof/>
             <w:webHidden/>
           </w:rPr>
-          <w:instrText xml:space="preserve"> PAGEREF _Toc240981224 \h </w:instrText>
+          <w:instrText xml:space="preserve"> PAGEREF _Toc240982713 \h </w:instrText>
         </w:r>
         <w:r>
           <w:rPr>
@@ -1037,7 +1087,7 @@
           <w:noProof/>
         </w:rPr>
       </w:pPr>
-      <w:hyperlink w:anchor="_Toc240981225" w:history="1">
+      <w:hyperlink w:anchor="_Toc240982714" w:history="1">
         <w:r>
           <w:rPr>
             <w:rStyle w:val="Hyperlink"/>
@@ -1064,7 +1114,7 @@
             <w:noProof/>
             <w:webHidden/>
           </w:rPr>
-          <w:instrText xml:space="preserve"> PAGEREF _Toc240981225 \h </w:instrText>
+          <w:instrText xml:space="preserve"> PAGEREF _Toc240982714 \h </w:instrText>
         </w:r>
         <w:r>
           <w:rPr>
@@ -1105,7 +1155,7 @@
           <w:noProof/>
         </w:rPr>
       </w:pPr>
-      <w:hyperlink w:anchor="_Toc240981226" w:history="1">
+      <w:hyperlink w:anchor="_Toc240982715" w:history="1">
         <w:r>
           <w:rPr>
             <w:rStyle w:val="Hyperlink"/>
@@ -1132,7 +1182,7 @@
             <w:noProof/>
             <w:webHidden/>
           </w:rPr>
-          <w:instrText xml:space="preserve"> PAGEREF _Toc240981226 \h </w:instrText>
+          <w:instrText xml:space="preserve"> PAGEREF _Toc240982715 \h </w:instrText>
         </w:r>
         <w:r>
           <w:rPr>
@@ -1173,7 +1223,7 @@
           <w:noProof/>
         </w:rPr>
       </w:pPr>
-      <w:hyperlink w:anchor="_Toc240981227" w:history="1">
+      <w:hyperlink w:anchor="_Toc240982716" w:history="1">
         <w:r>
           <w:rPr>
             <w:rStyle w:val="Hyperlink"/>
@@ -1200,7 +1250,7 @@
             <w:noProof/>
             <w:webHidden/>
           </w:rPr>
-          <w:instrText xml:space="preserve"> PAGEREF _Toc240981227 \h </w:instrText>
+          <w:instrText xml:space="preserve"> PAGEREF _Toc240982716 \h </w:instrText>
         </w:r>
         <w:r>
           <w:rPr>
@@ -1241,7 +1291,7 @@
           <w:noProof/>
         </w:rPr>
       </w:pPr>
-      <w:hyperlink w:anchor="_Toc240981228" w:history="1">
+      <w:hyperlink w:anchor="_Toc240982717" w:history="1">
         <w:r>
           <w:rPr>
             <w:rStyle w:val="Hyperlink"/>
@@ -1268,7 +1318,7 @@
             <w:noProof/>
             <w:webHidden/>
           </w:rPr>
-          <w:instrText xml:space="preserve"> PAGEREF _Toc240981228 \h </w:instrText>
+          <w:instrText xml:space="preserve"> PAGEREF _Toc240982717 \h </w:instrText>
         </w:r>
         <w:r>
           <w:rPr>
@@ -1309,7 +1359,7 @@
           <w:noProof/>
         </w:rPr>
       </w:pPr>
-      <w:hyperlink w:anchor="_Toc240981229" w:history="1">
+      <w:hyperlink w:anchor="_Toc240982718" w:history="1">
         <w:r>
           <w:rPr>
             <w:rStyle w:val="Hyperlink"/>
@@ -1336,7 +1386,7 @@
             <w:noProof/>
             <w:webHidden/>
           </w:rPr>
-          <w:instrText xml:space="preserve"> PAGEREF _Toc240981229 \h </w:instrText>
+          <w:instrText xml:space="preserve"> PAGEREF _Toc240982718 \h </w:instrText>
         </w:r>
         <w:r>
           <w:rPr>
@@ -1377,7 +1427,7 @@
           <w:noProof/>
         </w:rPr>
       </w:pPr>
-      <w:hyperlink w:anchor="_Toc240981230" w:history="1">
+      <w:hyperlink w:anchor="_Toc240982719" w:history="1">
         <w:r>
           <w:rPr>
             <w:rStyle w:val="Hyperlink"/>
@@ -1404,7 +1454,7 @@
             <w:noProof/>
             <w:webHidden/>
           </w:rPr>
-          <w:instrText xml:space="preserve"> PAGEREF _Toc240981230 \h </w:instrText>
+          <w:instrText xml:space="preserve"> PAGEREF _Toc240982719 \h </w:instrText>
         </w:r>
         <w:r>
           <w:rPr>
@@ -1445,7 +1495,7 @@
           <w:noProof/>
         </w:rPr>
       </w:pPr>
-      <w:hyperlink w:anchor="_Toc240981231" w:history="1">
+      <w:hyperlink w:anchor="_Toc240982720" w:history="1">
         <w:r>
           <w:rPr>
             <w:rStyle w:val="Hyperlink"/>
@@ -1472,7 +1522,7 @@
             <w:noProof/>
             <w:webHidden/>
           </w:rPr>
-          <w:instrText xml:space="preserve"> PAGEREF _Toc240981231 \h </w:instrText>
+          <w:instrText xml:space="preserve"> PAGEREF _Toc240982720 \h </w:instrText>
         </w:r>
         <w:r>
           <w:rPr>
@@ -1513,7 +1563,7 @@
           <w:noProof/>
         </w:rPr>
       </w:pPr>
-      <w:hyperlink w:anchor="_Toc240981232" w:history="1">
+      <w:hyperlink w:anchor="_Toc240982721" w:history="1">
         <w:r>
           <w:rPr>
             <w:rStyle w:val="Hyperlink"/>
@@ -1540,7 +1590,7 @@
             <w:noProof/>
             <w:webHidden/>
           </w:rPr>
-          <w:instrText xml:space="preserve"> PAGEREF _Toc240981232 \h </w:instrText>
+          <w:instrText xml:space="preserve"> PAGEREF _Toc240982721 \h </w:instrText>
         </w:r>
         <w:r>
           <w:rPr>
@@ -1581,7 +1631,7 @@
           <w:noProof/>
         </w:rPr>
       </w:pPr>
-      <w:hyperlink w:anchor="_Toc240981233" w:history="1">
+      <w:hyperlink w:anchor="_Toc240982722" w:history="1">
         <w:r>
           <w:rPr>
             <w:rStyle w:val="Hyperlink"/>
@@ -1608,7 +1658,7 @@
             <w:noProof/>
             <w:webHidden/>
           </w:rPr>
-          <w:instrText xml:space="preserve"> PAGEREF _Toc240981233 \h </w:instrText>
+          <w:instrText xml:space="preserve"> PAGEREF _Toc240982722 \h </w:instrText>
         </w:r>
         <w:r>
           <w:rPr>
@@ -1649,7 +1699,7 @@
           <w:noProof/>
         </w:rPr>
       </w:pPr>
-      <w:hyperlink w:anchor="_Toc240981234" w:history="1">
+      <w:hyperlink w:anchor="_Toc240982723" w:history="1">
         <w:r>
           <w:rPr>
             <w:rStyle w:val="Hyperlink"/>
@@ -1676,7 +1726,7 @@
             <w:noProof/>
             <w:webHidden/>
           </w:rPr>
-          <w:instrText xml:space="preserve"> PAGEREF _Toc240981234 \h </w:instrText>
+          <w:instrText xml:space="preserve"> PAGEREF _Toc240982723 \h </w:instrText>
         </w:r>
         <w:r>
           <w:rPr>
@@ -1717,7 +1767,7 @@
           <w:noProof/>
         </w:rPr>
       </w:pPr>
-      <w:hyperlink w:anchor="_Toc240981235" w:history="1">
+      <w:hyperlink w:anchor="_Toc240982724" w:history="1">
         <w:r>
           <w:rPr>
             <w:rStyle w:val="Hyperlink"/>
@@ -1744,7 +1794,7 @@
             <w:noProof/>
             <w:webHidden/>
           </w:rPr>
-          <w:instrText xml:space="preserve"> PAGEREF _Toc240981235 \h </w:instrText>
+          <w:instrText xml:space="preserve"> PAGEREF _Toc240982724 \h </w:instrText>
         </w:r>
         <w:r>
           <w:rPr>
@@ -1785,7 +1835,7 @@
           <w:noProof/>
         </w:rPr>
       </w:pPr>
-      <w:hyperlink w:anchor="_Toc240981236" w:history="1">
+      <w:hyperlink w:anchor="_Toc240982725" w:history="1">
         <w:r>
           <w:rPr>
             <w:rStyle w:val="Hyperlink"/>
@@ -1812,7 +1862,7 @@
             <w:noProof/>
             <w:webHidden/>
           </w:rPr>
-          <w:instrText xml:space="preserve"> PAGEREF _Toc240981236 \h </w:instrText>
+          <w:instrText xml:space="preserve"> PAGEREF _Toc240982725 \h </w:instrText>
         </w:r>
         <w:r>
           <w:rPr>
@@ -1853,7 +1903,7 @@
           <w:noProof/>
         </w:rPr>
       </w:pPr>
-      <w:hyperlink w:anchor="_Toc240981237" w:history="1">
+      <w:hyperlink w:anchor="_Toc240982726" w:history="1">
         <w:r>
           <w:rPr>
             <w:rStyle w:val="Hyperlink"/>
@@ -1880,7 +1930,7 @@
             <w:noProof/>
             <w:webHidden/>
           </w:rPr>
-          <w:instrText xml:space="preserve"> PAGEREF _Toc240981237 \h </w:instrText>
+          <w:instrText xml:space="preserve"> PAGEREF _Toc240982726 \h </w:instrText>
         </w:r>
         <w:r>
           <w:rPr>
@@ -1921,7 +1971,7 @@
           <w:noProof/>
         </w:rPr>
       </w:pPr>
-      <w:hyperlink w:anchor="_Toc240981238" w:history="1">
+      <w:hyperlink w:anchor="_Toc240982727" w:history="1">
         <w:r>
           <w:rPr>
             <w:rStyle w:val="Hyperlink"/>
@@ -1948,7 +1998,7 @@
             <w:noProof/>
             <w:webHidden/>
           </w:rPr>
-          <w:instrText xml:space="preserve"> PAGEREF _Toc240981238 \h </w:instrText>
+          <w:instrText xml:space="preserve"> PAGEREF _Toc240982727 \h </w:instrText>
         </w:r>
         <w:r>
           <w:rPr>
@@ -1989,7 +2039,7 @@
           <w:noProof/>
         </w:rPr>
       </w:pPr>
-      <w:hyperlink w:anchor="_Toc240981239" w:history="1">
+      <w:hyperlink w:anchor="_Toc240982728" w:history="1">
         <w:r>
           <w:rPr>
             <w:rStyle w:val="Hyperlink"/>
@@ -2016,7 +2066,7 @@
             <w:noProof/>
             <w:webHidden/>
           </w:rPr>
-          <w:instrText xml:space="preserve"> PAGEREF _Toc240981239 \h </w:instrText>
+          <w:instrText xml:space="preserve"> PAGEREF _Toc240982728 \h </w:instrText>
         </w:r>
         <w:r>
           <w:rPr>
@@ -2057,7 +2107,7 @@
           <w:noProof/>
         </w:rPr>
       </w:pPr>
-      <w:hyperlink w:anchor="_Toc240981240" w:history="1">
+      <w:hyperlink w:anchor="_Toc240982729" w:history="1">
         <w:r>
           <w:rPr>
             <w:rStyle w:val="Hyperlink"/>
@@ -2084,7 +2134,7 @@
             <w:noProof/>
             <w:webHidden/>
           </w:rPr>
-          <w:instrText xml:space="preserve"> PAGEREF _Toc240981240 \h </w:instrText>
+          <w:instrText xml:space="preserve"> PAGEREF _Toc240982729 \h </w:instrText>
         </w:r>
         <w:r>
           <w:rPr>
@@ -2125,7 +2175,7 @@
           <w:noProof/>
         </w:rPr>
       </w:pPr>
-      <w:hyperlink w:anchor="_Toc240981241" w:history="1">
+      <w:hyperlink w:anchor="_Toc240982730" w:history="1">
         <w:r>
           <w:rPr>
             <w:rStyle w:val="Hyperlink"/>
@@ -2152,7 +2202,7 @@
             <w:noProof/>
             <w:webHidden/>
           </w:rPr>
-          <w:instrText xml:space="preserve"> PAGEREF _Toc240981241 \h </w:instrText>
+          <w:instrText xml:space="preserve"> PAGEREF _Toc240982730 \h </w:instrText>
         </w:r>
         <w:r>
           <w:rPr>
@@ -2193,7 +2243,7 @@
           <w:noProof/>
         </w:rPr>
       </w:pPr>
-      <w:hyperlink w:anchor="_Toc240981242" w:history="1">
+      <w:hyperlink w:anchor="_Toc240982731" w:history="1">
         <w:r>
           <w:rPr>
             <w:rStyle w:val="Hyperlink"/>
@@ -2220,7 +2270,7 @@
             <w:noProof/>
             <w:webHidden/>
           </w:rPr>
-          <w:instrText xml:space="preserve"> PAGEREF _Toc240981242 \h </w:instrText>
+          <w:instrText xml:space="preserve"> PAGEREF _Toc240982731 \h </w:instrText>
         </w:r>
         <w:r>
           <w:rPr>
@@ -2261,7 +2311,7 @@
           <w:noProof/>
         </w:rPr>
       </w:pPr>
-      <w:hyperlink w:anchor="_Toc240981243" w:history="1">
+      <w:hyperlink w:anchor="_Toc240982732" w:history="1">
         <w:r>
           <w:rPr>
             <w:rStyle w:val="Hyperlink"/>
@@ -2288,7 +2338,7 @@
             <w:noProof/>
             <w:webHidden/>
           </w:rPr>
-          <w:instrText xml:space="preserve"> PAGEREF _Toc240981243 \h </w:instrText>
+          <w:instrText xml:space="preserve"> PAGEREF _Toc240982732 \h </w:instrText>
         </w:r>
         <w:r>
           <w:rPr>
@@ -2329,7 +2379,7 @@
           <w:noProof/>
         </w:rPr>
       </w:pPr>
-      <w:hyperlink w:anchor="_Toc240981244" w:history="1">
+      <w:hyperlink w:anchor="_Toc240982733" w:history="1">
         <w:r>
           <w:rPr>
             <w:rStyle w:val="Hyperlink"/>
@@ -2356,7 +2406,7 @@
             <w:noProof/>
             <w:webHidden/>
           </w:rPr>
-          <w:instrText xml:space="preserve"> PAGEREF _Toc240981244 \h </w:instrText>
+          <w:instrText xml:space="preserve"> PAGEREF _Toc240982733 \h </w:instrText>
         </w:r>
         <w:r>
           <w:rPr>
@@ -2397,7 +2447,7 @@
           <w:noProof/>
         </w:rPr>
       </w:pPr>
-      <w:hyperlink w:anchor="_Toc240981245" w:history="1">
+      <w:hyperlink w:anchor="_Toc240982734" w:history="1">
         <w:r>
           <w:rPr>
             <w:rStyle w:val="Hyperlink"/>
@@ -2424,7 +2474,7 @@
             <w:noProof/>
             <w:webHidden/>
           </w:rPr>
-          <w:instrText xml:space="preserve"> PAGEREF _Toc240981245 \h </w:instrText>
+          <w:instrText xml:space="preserve"> PAGEREF _Toc240982734 \h </w:instrText>
         </w:r>
         <w:r>
           <w:rPr>
@@ -2465,7 +2515,7 @@
           <w:noProof/>
         </w:rPr>
       </w:pPr>
-      <w:hyperlink w:anchor="_Toc240981246" w:history="1">
+      <w:hyperlink w:anchor="_Toc240982735" w:history="1">
         <w:r>
           <w:rPr>
             <w:rStyle w:val="Hyperlink"/>
@@ -2492,7 +2542,7 @@
             <w:noProof/>
             <w:webHidden/>
           </w:rPr>
-          <w:instrText xml:space="preserve"> PAGEREF _Toc240981246 \h </w:instrText>
+          <w:instrText xml:space="preserve"> PAGEREF _Toc240982735 \h </w:instrText>
         </w:r>
         <w:r>
           <w:rPr>
@@ -2533,7 +2583,7 @@
           <w:noProof/>
         </w:rPr>
       </w:pPr>
-      <w:hyperlink w:anchor="_Toc240981247" w:history="1">
+      <w:hyperlink w:anchor="_Toc240982736" w:history="1">
         <w:r>
           <w:rPr>
             <w:rStyle w:val="Hyperlink"/>
@@ -2560,7 +2610,7 @@
             <w:noProof/>
             <w:webHidden/>
           </w:rPr>
-          <w:instrText xml:space="preserve"> PAGEREF _Toc240981247 \h </w:instrText>
+          <w:instrText xml:space="preserve"> PAGEREF _Toc240982736 \h </w:instrText>
         </w:r>
         <w:r>
           <w:rPr>
@@ -2601,7 +2651,7 @@
           <w:noProof/>
         </w:rPr>
       </w:pPr>
-      <w:hyperlink w:anchor="_Toc240981248" w:history="1">
+      <w:hyperlink w:anchor="_Toc240982737" w:history="1">
         <w:r>
           <w:rPr>
             <w:rStyle w:val="Hyperlink"/>
@@ -2628,7 +2678,7 @@
             <w:noProof/>
             <w:webHidden/>
           </w:rPr>
-          <w:instrText xml:space="preserve"> PAGEREF _Toc240981248 \h </w:instrText>
+          <w:instrText xml:space="preserve"> PAGEREF _Toc240982737 \h </w:instrText>
         </w:r>
         <w:r>
           <w:rPr>
@@ -2669,7 +2719,7 @@
           <w:noProof/>
         </w:rPr>
       </w:pPr>
-      <w:hyperlink w:anchor="_Toc240981249" w:history="1">
+      <w:hyperlink w:anchor="_Toc240982738" w:history="1">
         <w:r>
           <w:rPr>
             <w:rStyle w:val="Hyperlink"/>
@@ -2696,7 +2746,7 @@
             <w:noProof/>
             <w:webHidden/>
           </w:rPr>
-          <w:instrText xml:space="preserve"> PAGEREF _Toc240981249 \h </w:instrText>
+          <w:instrText xml:space="preserve"> PAGEREF _Toc240982738 \h </w:instrText>
         </w:r>
         <w:r>
           <w:rPr>
@@ -2737,7 +2787,7 @@
           <w:noProof/>
         </w:rPr>
       </w:pPr>
-      <w:hyperlink w:anchor="_Toc240981250" w:history="1">
+      <w:hyperlink w:anchor="_Toc240982739" w:history="1">
         <w:r>
           <w:rPr>
             <w:rStyle w:val="Hyperlink"/>
@@ -2764,7 +2814,7 @@
             <w:noProof/>
             <w:webHidden/>
           </w:rPr>
-          <w:instrText xml:space="preserve"> PAGEREF _Toc240981250 \h </w:instrText>
+          <w:instrText xml:space="preserve"> PAGEREF _Toc240982739 \h </w:instrText>
         </w:r>
         <w:r>
           <w:rPr>
@@ -2805,7 +2855,7 @@
           <w:noProof/>
         </w:rPr>
       </w:pPr>
-      <w:hyperlink w:anchor="_Toc240981251" w:history="1">
+      <w:hyperlink w:anchor="_Toc240982740" w:history="1">
         <w:r>
           <w:rPr>
             <w:rStyle w:val="Hyperlink"/>
@@ -2832,7 +2882,7 @@
             <w:noProof/>
             <w:webHidden/>
           </w:rPr>
-          <w:instrText xml:space="preserve"> PAGEREF _Toc240981251 \h </w:instrText>
+          <w:instrText xml:space="preserve"> PAGEREF _Toc240982740 \h </w:instrText>
         </w:r>
         <w:r>
           <w:rPr>
@@ -2873,7 +2923,7 @@
           <w:noProof/>
         </w:rPr>
       </w:pPr>
-      <w:hyperlink w:anchor="_Toc240981252" w:history="1">
+      <w:hyperlink w:anchor="_Toc240982741" w:history="1">
         <w:r>
           <w:rPr>
             <w:rStyle w:val="Hyperlink"/>
@@ -2900,7 +2950,7 @@
             <w:noProof/>
             <w:webHidden/>
           </w:rPr>
-          <w:instrText xml:space="preserve"> PAGEREF _Toc240981252 \h </w:instrText>
+          <w:instrText xml:space="preserve"> PAGEREF _Toc240982741 \h </w:instrText>
         </w:r>
         <w:r>
           <w:rPr>
@@ -2941,7 +2991,7 @@
           <w:noProof/>
         </w:rPr>
       </w:pPr>
-      <w:hyperlink w:anchor="_Toc240981253" w:history="1">
+      <w:hyperlink w:anchor="_Toc240982742" w:history="1">
         <w:r>
           <w:rPr>
             <w:rStyle w:val="Hyperlink"/>
@@ -2968,7 +3018,7 @@
             <w:noProof/>
             <w:webHidden/>
           </w:rPr>
-          <w:instrText xml:space="preserve"> PAGEREF _Toc240981253 \h </w:instrText>
+          <w:instrText xml:space="preserve"> PAGEREF _Toc240982742 \h </w:instrText>
         </w:r>
         <w:r>
           <w:rPr>
@@ -3014,7 +3064,7 @@
       <w:pPr>
         <w:pStyle w:val="Heading1"/>
       </w:pPr>
-      <w:bookmarkStart w:id="0" w:name="_Toc240981224"/>
+      <w:bookmarkStart w:id="0" w:name="_Toc240982713"/>
       <w:r>
         <w:lastRenderedPageBreak/>
         <w:t>About This Document</w:t>
@@ -3117,7 +3167,7 @@
       <w:pPr>
         <w:pStyle w:val="Heading1"/>
       </w:pPr>
-      <w:bookmarkStart w:id="1" w:name="_Toc240981225"/>
+      <w:bookmarkStart w:id="1" w:name="_Toc240982714"/>
       <w:r>
         <w:t>1. Basic Information (Application and Organization)</w:t>
       </w:r>
@@ -3264,7 +3314,7 @@
       <w:pPr>
         <w:pStyle w:val="Heading2"/>
       </w:pPr>
-      <w:bookmarkStart w:id="2" w:name="_Toc240981226"/>
+      <w:bookmarkStart w:id="2" w:name="_Toc240982715"/>
       <w:r>
         <w:t>1.0 · Status Summary — Section 1</w:t>
       </w:r>
@@ -3641,7 +3691,7 @@
       <w:pPr>
         <w:pStyle w:val="Heading2"/>
       </w:pPr>
-      <w:bookmarkStart w:id="3" w:name="_Toc240981227"/>
+      <w:bookmarkStart w:id="3" w:name="_Toc240982716"/>
       <w:r>
         <w:t>1.1 · Application Form</w:t>
       </w:r>
@@ -4693,7 +4743,7 @@
       <w:pPr>
         <w:pStyle w:val="Heading2"/>
       </w:pPr>
-      <w:bookmarkStart w:id="4" w:name="_Toc240981228"/>
+      <w:bookmarkStart w:id="4" w:name="_Toc240982717"/>
       <w:r>
         <w:t>1.2 · Business License / Company Registration Certificate</w:t>
       </w:r>
@@ -5242,7 +5292,7 @@
       <w:pPr>
         <w:pStyle w:val="Heading2"/>
       </w:pPr>
-      <w:bookmarkStart w:id="5" w:name="_Toc240981229"/>
+      <w:bookmarkStart w:id="5" w:name="_Toc240982718"/>
       <w:r>
         <w:t>1.3 · Organizational Chart and Contact Information</w:t>
       </w:r>
@@ -5791,7 +5841,7 @@
       <w:pPr>
         <w:pStyle w:val="Heading2"/>
       </w:pPr>
-      <w:bookmarkStart w:id="6" w:name="_Toc240981230"/>
+      <w:bookmarkStart w:id="6" w:name="_Toc240982719"/>
       <w:r>
         <w:t>1.4 · Manufacturing Plant Address and Introduction of Production Facilities</w:t>
       </w:r>
@@ -6303,7 +6353,7 @@
       <w:pPr>
         <w:pStyle w:val="Heading2"/>
       </w:pPr>
-      <w:bookmarkStart w:id="7" w:name="_Toc240981231"/>
+      <w:bookmarkStart w:id="7" w:name="_Toc240982720"/>
       <w:r>
         <w:t>1.5 · ISO 9001 Certificate, Quality Manual, and Procedure Index</w:t>
       </w:r>
@@ -6726,7 +6776,7 @@
       <w:pPr>
         <w:pStyle w:val="Heading1"/>
       </w:pPr>
-      <w:bookmarkStart w:id="8" w:name="_Toc240981232"/>
+      <w:bookmarkStart w:id="8" w:name="_Toc240982721"/>
       <w:r>
         <w:t>2. Technical Documentation</w:t>
       </w:r>
@@ -6741,7 +6791,7 @@
       <w:pPr>
         <w:pStyle w:val="Heading2"/>
       </w:pPr>
-      <w:bookmarkStart w:id="9" w:name="_Toc240981233"/>
+      <w:bookmarkStart w:id="9" w:name="_Toc240982722"/>
       <w:r>
         <w:t>2.1 · Detailed Product Description</w:t>
       </w:r>
@@ -6762,7 +6812,7 @@
     </w:p>
     <w:p>
       <w:r>
-        <w:t>The enclosure is designed for hazardous-area deployment at refinery sites, using metal materials (aluminum alloy and stainless steel) and mounted via a bracket to existing structures without drilling or welding. Important: this design-intent statement does not constitute a claim that the enclosure has passed testing or has been Ex-certified — the explosion-protection scheme, gas group, temperature class, and target installation zone will be addressed in Section 2.5.</w:t>
+        <w:t>The enclosure is designed for hazardous-area deployment at refinery sites, using metal materials (aluminum alloy and stainless steel) and mounted via a U-bolt mounting plate to existing structures without drilling or welding. Important: this design-intent statement does not constitute a claim that the enclosure has passed testing or has been Ex-certified — the explosion-protection scheme, gas group, temperature class, and target installation zone will be addressed in Section 2.5.</w:t>
       </w:r>
     </w:p>
     <w:p>
@@ -6774,7 +6824,7 @@
       <w:pPr>
         <w:pStyle w:val="Heading2"/>
       </w:pPr>
-      <w:bookmarkStart w:id="10" w:name="_Toc240981234"/>
+      <w:bookmarkStart w:id="10" w:name="_Toc240982723"/>
       <w:r>
         <w:t>2.2 · Product Name, Model, and Specification List</w:t>
       </w:r>
@@ -7218,7 +7268,7 @@
       <w:pPr>
         <w:pStyle w:val="Heading2"/>
       </w:pPr>
-      <w:bookmarkStart w:id="11" w:name="_Toc240981235"/>
+      <w:bookmarkStart w:id="11" w:name="_Toc240982724"/>
       <w:r>
         <w:t>2.3 · Functional Description and Technical Parameters (Electrical, Mechanical, etc.)</w:t>
       </w:r>
@@ -7236,7 +7286,7 @@
       <w:pPr>
         <w:pStyle w:val="Heading3"/>
       </w:pPr>
-      <w:bookmarkStart w:id="12" w:name="_Toc240981236"/>
+      <w:bookmarkStart w:id="12" w:name="_Toc240982725"/>
       <w:r>
         <w:t>2.3.a · Electrical Parameters — Node Sensor (GLD)</w:t>
       </w:r>
@@ -7860,7 +7910,7 @@
       <w:pPr>
         <w:pStyle w:val="Heading3"/>
       </w:pPr>
-      <w:bookmarkStart w:id="13" w:name="_Toc240981237"/>
+      <w:bookmarkStart w:id="13" w:name="_Toc240982726"/>
       <w:r>
         <w:t>2.3.b · Sensor and Communication Parameters — Node Sensor (GLD)</w:t>
       </w:r>
@@ -8922,7 +8972,7 @@
       <w:pPr>
         <w:pStyle w:val="Heading3"/>
       </w:pPr>
-      <w:bookmarkStart w:id="14" w:name="_Toc240981238"/>
+      <w:bookmarkStart w:id="14" w:name="_Toc240982727"/>
       <w:r>
         <w:t>2.3.c · Mechanical Parameters — Node Sensor (GLD)</w:t>
       </w:r>
@@ -9297,7 +9347,7 @@
               <w:rPr>
                 <w:sz w:val="19"/>
               </w:rPr>
-              <w:t>Bracket, following the design already installed at the refinery</w:t>
+              <w:t>U-bolt mounting plate, following the design already installed at the refinery</w:t>
             </w:r>
           </w:p>
         </w:tc>
@@ -9766,7 +9816,7 @@
       <w:pPr>
         <w:pStyle w:val="Heading2"/>
       </w:pPr>
-      <w:bookmarkStart w:id="15" w:name="_Toc240981239"/>
+      <w:bookmarkStart w:id="15" w:name="_Toc240982728"/>
       <w:r>
         <w:t>2.4 · Product Photographs — Overall and Key Components</w:t>
       </w:r>
@@ -9805,7 +9855,7 @@
                 <w:noProof/>
               </w:rPr>
               <w:drawing>
-                <wp:inline distT="0" distB="0" distL="0" distR="0" wp14:anchorId="52CB0236" wp14:editId="5120A65C">
+                <wp:inline distT="0" distB="0" distL="0" distR="0" wp14:anchorId="186B4BC1" wp14:editId="6745E7F4">
                   <wp:extent cx="1379912" cy="2286000"/>
                   <wp:effectExtent l="0" t="0" r="0" b="0"/>
                   <wp:docPr id="1" name="Picture 1"/>
@@ -9882,7 +9932,7 @@
                 <w:noProof/>
               </w:rPr>
               <w:drawing>
-                <wp:inline distT="0" distB="0" distL="0" distR="0" wp14:anchorId="6C9B01F8" wp14:editId="11A76C2D">
+                <wp:inline distT="0" distB="0" distL="0" distR="0" wp14:anchorId="7FE0685C" wp14:editId="5F1080C4">
                   <wp:extent cx="1714500" cy="2286000"/>
                   <wp:effectExtent l="0" t="0" r="0" b="0"/>
                   <wp:docPr id="2" name="Picture 2"/>
@@ -9964,7 +10014,7 @@
                 <w:noProof/>
               </w:rPr>
               <w:drawing>
-                <wp:inline distT="0" distB="0" distL="0" distR="0" wp14:anchorId="5EEDAF2C" wp14:editId="5F6606FF">
+                <wp:inline distT="0" distB="0" distL="0" distR="0" wp14:anchorId="1728B60C" wp14:editId="0FDCB1D8">
                   <wp:extent cx="1026621" cy="2286000"/>
                   <wp:effectExtent l="0" t="0" r="0" b="0"/>
                   <wp:docPr id="3" name="Picture 3"/>
@@ -10050,7 +10100,7 @@
               </w:rPr>
               <w:lastRenderedPageBreak/>
               <w:drawing>
-                <wp:inline distT="0" distB="0" distL="0" distR="0" wp14:anchorId="68274092" wp14:editId="44E51C5F">
+                <wp:inline distT="0" distB="0" distL="0" distR="0" wp14:anchorId="209F69E3" wp14:editId="1EADE8B5">
                   <wp:extent cx="1026621" cy="2286000"/>
                   <wp:effectExtent l="0" t="0" r="0" b="0"/>
                   <wp:docPr id="4" name="Picture 4"/>
@@ -10141,7 +10191,7 @@
               </w:rPr>
               <w:lastRenderedPageBreak/>
               <w:drawing>
-                <wp:inline distT="0" distB="0" distL="0" distR="0" wp14:anchorId="247E419A" wp14:editId="1AA789AA">
+                <wp:inline distT="0" distB="0" distL="0" distR="0" wp14:anchorId="10C526EC" wp14:editId="7672E3ED">
                   <wp:extent cx="1026621" cy="2286000"/>
                   <wp:effectExtent l="0" t="0" r="0" b="0"/>
                   <wp:docPr id="5" name="Picture 5"/>
@@ -10218,7 +10268,7 @@
                 <w:noProof/>
               </w:rPr>
               <w:drawing>
-                <wp:inline distT="0" distB="0" distL="0" distR="0" wp14:anchorId="2858F4A2" wp14:editId="77ADB554">
+                <wp:inline distT="0" distB="0" distL="0" distR="0" wp14:anchorId="309F0425" wp14:editId="5F6EBB75">
                   <wp:extent cx="1026621" cy="2286000"/>
                   <wp:effectExtent l="0" t="0" r="0" b="0"/>
                   <wp:docPr id="6" name="Picture 6"/>
@@ -10300,7 +10350,7 @@
                 <w:noProof/>
               </w:rPr>
               <w:drawing>
-                <wp:inline distT="0" distB="0" distL="0" distR="0" wp14:anchorId="5E12467C" wp14:editId="7E26DD55">
+                <wp:inline distT="0" distB="0" distL="0" distR="0" wp14:anchorId="361A644D" wp14:editId="2D86ADEC">
                   <wp:extent cx="1026621" cy="2286000"/>
                   <wp:effectExtent l="0" t="0" r="0" b="0"/>
                   <wp:docPr id="7" name="Picture 7"/>
@@ -10424,7 +10474,7 @@
       <w:pPr>
         <w:pStyle w:val="Heading2"/>
       </w:pPr>
-      <w:bookmarkStart w:id="16" w:name="_Toc240981240"/>
+      <w:bookmarkStart w:id="16" w:name="_Toc240982729"/>
       <w:r>
         <w:lastRenderedPageBreak/>
         <w:t>2.5 · Description of Intended Use and Installation Environment (Gas Group, Temperature Class, Area Classification)</w:t>
@@ -10887,7 +10937,7 @@
       <w:pPr>
         <w:pStyle w:val="Heading2"/>
       </w:pPr>
-      <w:bookmarkStart w:id="17" w:name="_Toc240981241"/>
+      <w:bookmarkStart w:id="17" w:name="_Toc240982730"/>
       <w:r>
         <w:t>2.6 · Design and Manufacturing Information</w:t>
       </w:r>
@@ -10902,7 +10952,7 @@
       <w:pPr>
         <w:pStyle w:val="Heading3"/>
       </w:pPr>
-      <w:bookmarkStart w:id="18" w:name="_Toc240981242"/>
+      <w:bookmarkStart w:id="18" w:name="_Toc240982731"/>
       <w:r>
         <w:lastRenderedPageBreak/>
         <w:t>2.6.a · Complete Drawings (Assembly, Component, Electrical Schematic, PCB Layout, Enclosure Structure, Junction Box, Terminal, Grounding)</w:t>
@@ -10923,7 +10973,7 @@
           <w:noProof/>
         </w:rPr>
         <w:drawing>
-          <wp:inline distT="0" distB="0" distL="0" distR="0" wp14:anchorId="3406015D" wp14:editId="656F0D72">
+          <wp:inline distT="0" distB="0" distL="0" distR="0" wp14:anchorId="22CB094F" wp14:editId="6230D59E">
             <wp:extent cx="5120640" cy="3413760"/>
             <wp:effectExtent l="0" t="0" r="0" b="0"/>
             <wp:docPr id="8" name="Picture 8"/>
@@ -10996,7 +11046,7 @@
         </w:rPr>
         <w:lastRenderedPageBreak/>
         <w:drawing>
-          <wp:inline distT="0" distB="0" distL="0" distR="0" wp14:anchorId="7063C53F" wp14:editId="3E93053D">
+          <wp:inline distT="0" distB="0" distL="0" distR="0" wp14:anchorId="067FF7E7" wp14:editId="765602CD">
             <wp:extent cx="5120640" cy="3413760"/>
             <wp:effectExtent l="0" t="0" r="0" b="0"/>
             <wp:docPr id="9" name="Picture 9"/>
@@ -11068,7 +11118,7 @@
           <w:noProof/>
         </w:rPr>
         <w:drawing>
-          <wp:inline distT="0" distB="0" distL="0" distR="0" wp14:anchorId="293CB8AC" wp14:editId="19856B37">
+          <wp:inline distT="0" distB="0" distL="0" distR="0" wp14:anchorId="5CB660EA" wp14:editId="5BB0E751">
             <wp:extent cx="5120640" cy="3413760"/>
             <wp:effectExtent l="0" t="0" r="0" b="0"/>
             <wp:docPr id="10" name="Picture 10"/>
@@ -11141,7 +11191,7 @@
         </w:rPr>
         <w:lastRenderedPageBreak/>
         <w:drawing>
-          <wp:inline distT="0" distB="0" distL="0" distR="0" wp14:anchorId="2E6ED075" wp14:editId="6C3FEA2C">
+          <wp:inline distT="0" distB="0" distL="0" distR="0" wp14:anchorId="2CA7075D" wp14:editId="1ED234B5">
             <wp:extent cx="5120640" cy="3413760"/>
             <wp:effectExtent l="0" t="0" r="0" b="0"/>
             <wp:docPr id="11" name="Picture 11"/>
@@ -11213,7 +11263,7 @@
           <w:noProof/>
         </w:rPr>
         <w:drawing>
-          <wp:inline distT="0" distB="0" distL="0" distR="0" wp14:anchorId="6B0799BC" wp14:editId="1DA1B5F6">
+          <wp:inline distT="0" distB="0" distL="0" distR="0" wp14:anchorId="013CC6E5" wp14:editId="13A6E914">
             <wp:extent cx="5120640" cy="3413760"/>
             <wp:effectExtent l="0" t="0" r="0" b="0"/>
             <wp:docPr id="12" name="Picture 12"/>
@@ -11286,7 +11336,7 @@
         </w:rPr>
         <w:lastRenderedPageBreak/>
         <w:drawing>
-          <wp:inline distT="0" distB="0" distL="0" distR="0" wp14:anchorId="5FCE7129" wp14:editId="0DD82716">
+          <wp:inline distT="0" distB="0" distL="0" distR="0" wp14:anchorId="05486C5A" wp14:editId="46716DA2">
             <wp:extent cx="5120640" cy="3413760"/>
             <wp:effectExtent l="0" t="0" r="0" b="0"/>
             <wp:docPr id="13" name="Picture 13"/>
@@ -11358,7 +11408,7 @@
           <w:noProof/>
         </w:rPr>
         <w:drawing>
-          <wp:inline distT="0" distB="0" distL="0" distR="0" wp14:anchorId="38602DC4" wp14:editId="5CC88993">
+          <wp:inline distT="0" distB="0" distL="0" distR="0" wp14:anchorId="0887B323" wp14:editId="58F00840">
             <wp:extent cx="5120640" cy="3413760"/>
             <wp:effectExtent l="0" t="0" r="0" b="0"/>
             <wp:docPr id="14" name="Picture 14"/>
@@ -11431,7 +11481,7 @@
         </w:rPr>
         <w:lastRenderedPageBreak/>
         <w:drawing>
-          <wp:inline distT="0" distB="0" distL="0" distR="0" wp14:anchorId="1452B049" wp14:editId="434198DE">
+          <wp:inline distT="0" distB="0" distL="0" distR="0" wp14:anchorId="0B79647B" wp14:editId="4B10855F">
             <wp:extent cx="5120640" cy="3413760"/>
             <wp:effectExtent l="0" t="0" r="0" b="0"/>
             <wp:docPr id="15" name="Picture 15"/>
@@ -11503,7 +11553,7 @@
           <w:noProof/>
         </w:rPr>
         <w:drawing>
-          <wp:inline distT="0" distB="0" distL="0" distR="0" wp14:anchorId="469246E7" wp14:editId="74B6E5FB">
+          <wp:inline distT="0" distB="0" distL="0" distR="0" wp14:anchorId="53D95A50" wp14:editId="546A8FDE">
             <wp:extent cx="5120640" cy="3413760"/>
             <wp:effectExtent l="0" t="0" r="0" b="0"/>
             <wp:docPr id="16" name="Picture 16"/>
@@ -11576,7 +11626,7 @@
         </w:rPr>
         <w:lastRenderedPageBreak/>
         <w:drawing>
-          <wp:inline distT="0" distB="0" distL="0" distR="0" wp14:anchorId="27A1B4C3" wp14:editId="01A069F2">
+          <wp:inline distT="0" distB="0" distL="0" distR="0" wp14:anchorId="171E2B91" wp14:editId="7B7A0D13">
             <wp:extent cx="2468880" cy="2479268"/>
             <wp:effectExtent l="0" t="0" r="0" b="0"/>
             <wp:docPr id="17" name="Picture 17"/>
@@ -11619,7 +11669,7 @@
           <w:noProof/>
         </w:rPr>
         <w:drawing>
-          <wp:inline distT="0" distB="0" distL="0" distR="0" wp14:anchorId="020D18DF" wp14:editId="4B7FE014">
+          <wp:inline distT="0" distB="0" distL="0" distR="0" wp14:anchorId="145482F9" wp14:editId="093141AF">
             <wp:extent cx="2468880" cy="1804956"/>
             <wp:effectExtent l="0" t="0" r="0" b="0"/>
             <wp:docPr id="18" name="Picture 18"/>
@@ -11696,7 +11746,7 @@
           <w:noProof/>
         </w:rPr>
         <w:drawing>
-          <wp:inline distT="0" distB="0" distL="0" distR="0" wp14:anchorId="03C44608" wp14:editId="1BBF5535">
+          <wp:inline distT="0" distB="0" distL="0" distR="0" wp14:anchorId="41B18508" wp14:editId="52494F0F">
             <wp:extent cx="5669280" cy="3847707"/>
             <wp:effectExtent l="0" t="0" r="0" b="0"/>
             <wp:docPr id="19" name="Picture 19"/>
@@ -12247,7 +12297,7 @@
       <w:pPr>
         <w:pStyle w:val="Heading3"/>
       </w:pPr>
-      <w:bookmarkStart w:id="19" w:name="_Toc240981243"/>
+      <w:bookmarkStart w:id="19" w:name="_Toc240982732"/>
       <w:r>
         <w:t>2.6.b · Bill of Materials (BOM) for Explosion-Safety-Relevant Components</w:t>
       </w:r>
@@ -23228,7 +23278,7 @@
       <w:pPr>
         <w:pStyle w:val="Heading3"/>
       </w:pPr>
-      <w:bookmarkStart w:id="20" w:name="_Toc240981244"/>
+      <w:bookmarkStart w:id="20" w:name="_Toc240982733"/>
       <w:r>
         <w:t>2.6.c · Material Specification Sheets / Datasheets (Non-Metallic Materials)</w:t>
       </w:r>
@@ -23294,7 +23344,7 @@
       <w:pPr>
         <w:pStyle w:val="Heading3"/>
       </w:pPr>
-      <w:bookmarkStart w:id="21" w:name="_Toc240981245"/>
+      <w:bookmarkStart w:id="21" w:name="_Toc240982734"/>
       <w:r>
         <w:t>2.6.d · Manufacturing Process Description</w:t>
       </w:r>
@@ -23353,7 +23403,7 @@
       <w:pPr>
         <w:pStyle w:val="Heading3"/>
       </w:pPr>
-      <w:bookmarkStart w:id="22" w:name="_Toc240981246"/>
+      <w:bookmarkStart w:id="22" w:name="_Toc240982735"/>
       <w:r>
         <w:lastRenderedPageBreak/>
         <w:t>2.6.e · Explosion-Protection Calculations and Explanations (if applicable)</w:t>
@@ -23413,7 +23463,7 @@
       <w:pPr>
         <w:pStyle w:val="Heading3"/>
       </w:pPr>
-      <w:bookmarkStart w:id="23" w:name="_Toc240981247"/>
+      <w:bookmarkStart w:id="23" w:name="_Toc240982736"/>
       <w:r>
         <w:t>2.6.f · Temperature Group Calculation (Hottest-Point Temperature Estimation)</w:t>
       </w:r>
@@ -23475,7 +23525,7 @@
       <w:pPr>
         <w:pStyle w:val="Heading3"/>
       </w:pPr>
-      <w:bookmarkStart w:id="24" w:name="_Toc240981248"/>
+      <w:bookmarkStart w:id="24" w:name="_Toc240982737"/>
       <w:r>
         <w:t>2.6.g · Usage and Installation Instructions (Draft)</w:t>
       </w:r>
@@ -23666,7 +23716,7 @@
               <w:rPr>
                 <w:sz w:val="19"/>
               </w:rPr>
-              <w:t>Procedural text drafted below; the mechanical mounting method itself (L-bracket, no drilling/welding — Section 2.3.c) and the specific cable gland/torque values are still pending final component selection.</w:t>
+              <w:t>Procedural text drafted below; the mechanical mounting method itself (U-bolt mounting plate, no drilling/welding — Section 2.3.c) and the specific cable gland/torque values are still pending final component selection.</w:t>
             </w:r>
           </w:p>
         </w:tc>
@@ -24204,7 +24254,7 @@
       <w:pPr>
         <w:pStyle w:val="Heading3"/>
       </w:pPr>
-      <w:bookmarkStart w:id="25" w:name="_Toc240981249"/>
+      <w:bookmarkStart w:id="25" w:name="_Toc240982738"/>
       <w:r>
         <w:t>2.6.h · Nameplate Information</w:t>
       </w:r>
@@ -24264,7 +24314,7 @@
       <w:pPr>
         <w:pStyle w:val="Heading3"/>
       </w:pPr>
-      <w:bookmarkStart w:id="26" w:name="_Toc240981250"/>
+      <w:bookmarkStart w:id="26" w:name="_Toc240982739"/>
       <w:r>
         <w:t>2.6.i · Ex Component Certificates</w:t>
       </w:r>
@@ -24323,7 +24373,7 @@
       <w:pPr>
         <w:pStyle w:val="Heading1"/>
       </w:pPr>
-      <w:bookmarkStart w:id="27" w:name="_Toc240981251"/>
+      <w:bookmarkStart w:id="27" w:name="_Toc240982740"/>
       <w:r>
         <w:t>3. Sample Information</w:t>
       </w:r>
@@ -24338,7 +24388,7 @@
       <w:pPr>
         <w:pStyle w:val="Heading2"/>
       </w:pPr>
-      <w:bookmarkStart w:id="28" w:name="_Toc240981252"/>
+      <w:bookmarkStart w:id="28" w:name="_Toc240982741"/>
       <w:r>
         <w:t>3.1 · Model, Serial Number, and Status</w:t>
       </w:r>
@@ -24397,7 +24447,7 @@
       <w:pPr>
         <w:pStyle w:val="Heading2"/>
       </w:pPr>
-      <w:bookmarkStart w:id="29" w:name="_Toc240981253"/>
+      <w:bookmarkStart w:id="29" w:name="_Toc240982742"/>
       <w:r>
         <w:t>3.2 · Test Fixtures and Auxiliary Equipment</w:t>
       </w:r>
@@ -25196,7 +25246,7 @@
         <w:color w:val="4A4A4A"/>
         <w:sz w:val="16"/>
       </w:rPr>
-      <w:t>LGU/GLD/IECEX-TDF/2026-001  ·  Rev. 0.6</w:t>
+      <w:t>LGU/GLD/IECEX-TDF/2026-001  ·  Rev. 0.7</w:t>
     </w:r>
     <w:r>
       <w:tab/>
@@ -25466,31 +25516,31 @@
       </w:rPr>
     </w:lvl>
   </w:abstractNum>
-  <w:num w:numId="1" w16cid:durableId="544676686">
+  <w:num w:numId="1" w16cid:durableId="311755450">
     <w:abstractNumId w:val="8"/>
   </w:num>
-  <w:num w:numId="2" w16cid:durableId="550459149">
+  <w:num w:numId="2" w16cid:durableId="1954903021">
     <w:abstractNumId w:val="6"/>
   </w:num>
-  <w:num w:numId="3" w16cid:durableId="102699379">
+  <w:num w:numId="3" w16cid:durableId="1483352862">
     <w:abstractNumId w:val="5"/>
   </w:num>
-  <w:num w:numId="4" w16cid:durableId="1893535175">
+  <w:num w:numId="4" w16cid:durableId="1452673597">
     <w:abstractNumId w:val="4"/>
   </w:num>
-  <w:num w:numId="5" w16cid:durableId="852453463">
+  <w:num w:numId="5" w16cid:durableId="956448171">
     <w:abstractNumId w:val="7"/>
   </w:num>
-  <w:num w:numId="6" w16cid:durableId="463694967">
+  <w:num w:numId="6" w16cid:durableId="1132096354">
     <w:abstractNumId w:val="3"/>
   </w:num>
-  <w:num w:numId="7" w16cid:durableId="631985812">
+  <w:num w:numId="7" w16cid:durableId="337852088">
     <w:abstractNumId w:val="2"/>
   </w:num>
-  <w:num w:numId="8" w16cid:durableId="704403571">
+  <w:num w:numId="8" w16cid:durableId="1654482463">
     <w:abstractNumId w:val="1"/>
   </w:num>
-  <w:num w:numId="9" w16cid:durableId="1953396390">
+  <w:num w:numId="9" w16cid:durableId="945649697">
     <w:abstractNumId w:val="0"/>
   </w:num>
 </w:numbering>
@@ -36922,7 +36972,7 @@
     <w:autoRedefine/>
     <w:uiPriority w:val="39"/>
     <w:unhideWhenUsed/>
-    <w:rsid w:val="005F3968"/>
+    <w:rsid w:val="00F87A60"/>
     <w:pPr>
       <w:spacing w:after="100"/>
     </w:pPr>
@@ -36934,7 +36984,7 @@
     <w:autoRedefine/>
     <w:uiPriority w:val="39"/>
     <w:unhideWhenUsed/>
-    <w:rsid w:val="005F3968"/>
+    <w:rsid w:val="00F87A60"/>
     <w:pPr>
       <w:spacing w:after="100"/>
       <w:ind w:left="210"/>
@@ -36947,7 +36997,7 @@
     <w:autoRedefine/>
     <w:uiPriority w:val="39"/>
     <w:unhideWhenUsed/>
-    <w:rsid w:val="005F3968"/>
+    <w:rsid w:val="00F87A60"/>
     <w:pPr>
       <w:spacing w:after="100"/>
       <w:ind w:left="420"/>
@@ -36958,7 +37008,7 @@
     <w:basedOn w:val="DefaultParagraphFont"/>
     <w:uiPriority w:val="99"/>
     <w:unhideWhenUsed/>
-    <w:rsid w:val="005F3968"/>
+    <w:rsid w:val="00F87A60"/>
     <w:rPr>
       <w:color w:val="0000FF" w:themeColor="hyperlink"/>
       <w:u w:val="single"/>

</xml_diff>

<commit_message>
Update weight/suhu/kelembapan operasi mengikuti draf tim terkini; arsipkan sumber terkait
User instruksikan mengikuti nilai dari draf Rev24092026.docx yang sedang
dikerjakan tim: berat 2,378 kg, suhu operasi -20 s.d. +60 C, kelembapan
5-95% RH (semua Final), menggantikan nilai lama yang sebelumnya
dikonfirmasi terpisah. Diterapkan ke Dokumen_Teknis_Sertifikasi,
Instruction_Manual, draf permintaan material, dan draf form GTS.

IECEx_ATEX_Certification_Information_Requirements_GLD belum ikut
di-render ulang karena filenya sedang terbuka di Word pengguna
bersamaan dengan draf tim -- revisi skrip sudah dinaikkan, render
docx/pdf menyusul.

Juga mengarsipkan sumber terkait: folder review AI eksternal atas draf
tim (03_Dokumen_Final_dan_Referensi, termasuk 2 manual referensi pihak
ketiga) dan draf Rev24092026.docx itu sendiri.

Co-Authored-By: Claude Sonnet 5 <noreply@anthropic.com>
</commit_message>
<xml_diff>
--- a/Deliverables/Dokumen_Teknis_Sertifikasi_GLD_IECEx_ATEX.docx
+++ b/Deliverables/Dokumen_Teknis_Sertifikasi_GLD_IECEx_ATEX.docx
@@ -226,7 +226,7 @@
               <w:rPr>
                 <w:sz w:val="20"/>
               </w:rPr>
-              <w:t>0.7</w:t>
+              <w:t>0.8</w:t>
             </w:r>
           </w:p>
         </w:tc>
@@ -263,7 +263,7 @@
               <w:rPr>
                 <w:sz w:val="20"/>
               </w:rPr>
-              <w:t>22 September 2026</w:t>
+              <w:t>24 September 2026</w:t>
             </w:r>
           </w:p>
         </w:tc>
@@ -976,6 +976,56 @@
                 <w:sz w:val="19"/>
               </w:rPr>
               <w:t>“L-bracket” terminology corrected throughout to “U-bolt mounting plate” (Sections 2.1, 2.3.c, 2.6.g), matching the actual CAD drawing (a flat 250×250 mm plate secured by 2× U-bolts — not an angled/L-shaped bracket).</w:t>
+            </w:r>
+          </w:p>
+        </w:tc>
+      </w:tr>
+      <w:tr>
+        <w:tc>
+          <w:tcPr>
+            <w:tcW w:w="1296" w:type="dxa"/>
+          </w:tcPr>
+          <w:p>
+            <w:pPr>
+              <w:spacing w:after="40"/>
+            </w:pPr>
+            <w:r>
+              <w:rPr>
+                <w:sz w:val="19"/>
+              </w:rPr>
+              <w:t>0.8</w:t>
+            </w:r>
+          </w:p>
+        </w:tc>
+        <w:tc>
+          <w:tcPr>
+            <w:tcW w:w="1872" w:type="dxa"/>
+          </w:tcPr>
+          <w:p>
+            <w:pPr>
+              <w:spacing w:after="40"/>
+            </w:pPr>
+            <w:r>
+              <w:rPr>
+                <w:sz w:val="19"/>
+              </w:rPr>
+              <w:t>24 September 2026</w:t>
+            </w:r>
+          </w:p>
+        </w:tc>
+        <w:tc>
+          <w:tcPr>
+            <w:tcW w:w="6192" w:type="dxa"/>
+          </w:tcPr>
+          <w:p>
+            <w:pPr>
+              <w:spacing w:after="40"/>
+            </w:pPr>
+            <w:r>
+              <w:rPr>
+                <w:sz w:val="19"/>
+              </w:rPr>
+              <w:t>Total weight, operating temperature, and operating humidity (Sections 2.3.c, 2.5) updated to 2.378 kg, −20°C to +60°C, and 5–95% RH respectively, per current project specification data.</w:t>
             </w:r>
           </w:p>
         </w:tc>
@@ -1019,7 +1069,7 @@
       <w:r>
         <w:fldChar w:fldCharType="separate"/>
       </w:r>
-      <w:hyperlink w:anchor="_Toc240982713" w:history="1">
+      <w:hyperlink w:anchor="_Toc241185764" w:history="1">
         <w:r>
           <w:rPr>
             <w:rStyle w:val="Hyperlink"/>
@@ -1046,7 +1096,7 @@
             <w:noProof/>
             <w:webHidden/>
           </w:rPr>
-          <w:instrText xml:space="preserve"> PAGEREF _Toc240982713 \h </w:instrText>
+          <w:instrText xml:space="preserve"> PAGEREF _Toc241185764 \h </w:instrText>
         </w:r>
         <w:r>
           <w:rPr>
@@ -1087,7 +1137,7 @@
           <w:noProof/>
         </w:rPr>
       </w:pPr>
-      <w:hyperlink w:anchor="_Toc240982714" w:history="1">
+      <w:hyperlink w:anchor="_Toc241185765" w:history="1">
         <w:r>
           <w:rPr>
             <w:rStyle w:val="Hyperlink"/>
@@ -1114,7 +1164,7 @@
             <w:noProof/>
             <w:webHidden/>
           </w:rPr>
-          <w:instrText xml:space="preserve"> PAGEREF _Toc240982714 \h </w:instrText>
+          <w:instrText xml:space="preserve"> PAGEREF _Toc241185765 \h </w:instrText>
         </w:r>
         <w:r>
           <w:rPr>
@@ -1155,7 +1205,7 @@
           <w:noProof/>
         </w:rPr>
       </w:pPr>
-      <w:hyperlink w:anchor="_Toc240982715" w:history="1">
+      <w:hyperlink w:anchor="_Toc241185766" w:history="1">
         <w:r>
           <w:rPr>
             <w:rStyle w:val="Hyperlink"/>
@@ -1182,7 +1232,7 @@
             <w:noProof/>
             <w:webHidden/>
           </w:rPr>
-          <w:instrText xml:space="preserve"> PAGEREF _Toc240982715 \h </w:instrText>
+          <w:instrText xml:space="preserve"> PAGEREF _Toc241185766 \h </w:instrText>
         </w:r>
         <w:r>
           <w:rPr>
@@ -1223,7 +1273,7 @@
           <w:noProof/>
         </w:rPr>
       </w:pPr>
-      <w:hyperlink w:anchor="_Toc240982716" w:history="1">
+      <w:hyperlink w:anchor="_Toc241185767" w:history="1">
         <w:r>
           <w:rPr>
             <w:rStyle w:val="Hyperlink"/>
@@ -1250,7 +1300,7 @@
             <w:noProof/>
             <w:webHidden/>
           </w:rPr>
-          <w:instrText xml:space="preserve"> PAGEREF _Toc240982716 \h </w:instrText>
+          <w:instrText xml:space="preserve"> PAGEREF _Toc241185767 \h </w:instrText>
         </w:r>
         <w:r>
           <w:rPr>
@@ -1291,7 +1341,7 @@
           <w:noProof/>
         </w:rPr>
       </w:pPr>
-      <w:hyperlink w:anchor="_Toc240982717" w:history="1">
+      <w:hyperlink w:anchor="_Toc241185768" w:history="1">
         <w:r>
           <w:rPr>
             <w:rStyle w:val="Hyperlink"/>
@@ -1318,7 +1368,7 @@
             <w:noProof/>
             <w:webHidden/>
           </w:rPr>
-          <w:instrText xml:space="preserve"> PAGEREF _Toc240982717 \h </w:instrText>
+          <w:instrText xml:space="preserve"> PAGEREF _Toc241185768 \h </w:instrText>
         </w:r>
         <w:r>
           <w:rPr>
@@ -1359,7 +1409,7 @@
           <w:noProof/>
         </w:rPr>
       </w:pPr>
-      <w:hyperlink w:anchor="_Toc240982718" w:history="1">
+      <w:hyperlink w:anchor="_Toc241185769" w:history="1">
         <w:r>
           <w:rPr>
             <w:rStyle w:val="Hyperlink"/>
@@ -1386,7 +1436,7 @@
             <w:noProof/>
             <w:webHidden/>
           </w:rPr>
-          <w:instrText xml:space="preserve"> PAGEREF _Toc240982718 \h </w:instrText>
+          <w:instrText xml:space="preserve"> PAGEREF _Toc241185769 \h </w:instrText>
         </w:r>
         <w:r>
           <w:rPr>
@@ -1427,7 +1477,7 @@
           <w:noProof/>
         </w:rPr>
       </w:pPr>
-      <w:hyperlink w:anchor="_Toc240982719" w:history="1">
+      <w:hyperlink w:anchor="_Toc241185770" w:history="1">
         <w:r>
           <w:rPr>
             <w:rStyle w:val="Hyperlink"/>
@@ -1454,7 +1504,7 @@
             <w:noProof/>
             <w:webHidden/>
           </w:rPr>
-          <w:instrText xml:space="preserve"> PAGEREF _Toc240982719 \h </w:instrText>
+          <w:instrText xml:space="preserve"> PAGEREF _Toc241185770 \h </w:instrText>
         </w:r>
         <w:r>
           <w:rPr>
@@ -1495,7 +1545,7 @@
           <w:noProof/>
         </w:rPr>
       </w:pPr>
-      <w:hyperlink w:anchor="_Toc240982720" w:history="1">
+      <w:hyperlink w:anchor="_Toc241185771" w:history="1">
         <w:r>
           <w:rPr>
             <w:rStyle w:val="Hyperlink"/>
@@ -1522,7 +1572,7 @@
             <w:noProof/>
             <w:webHidden/>
           </w:rPr>
-          <w:instrText xml:space="preserve"> PAGEREF _Toc240982720 \h </w:instrText>
+          <w:instrText xml:space="preserve"> PAGEREF _Toc241185771 \h </w:instrText>
         </w:r>
         <w:r>
           <w:rPr>
@@ -1563,7 +1613,7 @@
           <w:noProof/>
         </w:rPr>
       </w:pPr>
-      <w:hyperlink w:anchor="_Toc240982721" w:history="1">
+      <w:hyperlink w:anchor="_Toc241185772" w:history="1">
         <w:r>
           <w:rPr>
             <w:rStyle w:val="Hyperlink"/>
@@ -1590,7 +1640,7 @@
             <w:noProof/>
             <w:webHidden/>
           </w:rPr>
-          <w:instrText xml:space="preserve"> PAGEREF _Toc240982721 \h </w:instrText>
+          <w:instrText xml:space="preserve"> PAGEREF _Toc241185772 \h </w:instrText>
         </w:r>
         <w:r>
           <w:rPr>
@@ -1631,7 +1681,7 @@
           <w:noProof/>
         </w:rPr>
       </w:pPr>
-      <w:hyperlink w:anchor="_Toc240982722" w:history="1">
+      <w:hyperlink w:anchor="_Toc241185773" w:history="1">
         <w:r>
           <w:rPr>
             <w:rStyle w:val="Hyperlink"/>
@@ -1658,7 +1708,7 @@
             <w:noProof/>
             <w:webHidden/>
           </w:rPr>
-          <w:instrText xml:space="preserve"> PAGEREF _Toc240982722 \h </w:instrText>
+          <w:instrText xml:space="preserve"> PAGEREF _Toc241185773 \h </w:instrText>
         </w:r>
         <w:r>
           <w:rPr>
@@ -1699,7 +1749,7 @@
           <w:noProof/>
         </w:rPr>
       </w:pPr>
-      <w:hyperlink w:anchor="_Toc240982723" w:history="1">
+      <w:hyperlink w:anchor="_Toc241185774" w:history="1">
         <w:r>
           <w:rPr>
             <w:rStyle w:val="Hyperlink"/>
@@ -1726,7 +1776,7 @@
             <w:noProof/>
             <w:webHidden/>
           </w:rPr>
-          <w:instrText xml:space="preserve"> PAGEREF _Toc240982723 \h </w:instrText>
+          <w:instrText xml:space="preserve"> PAGEREF _Toc241185774 \h </w:instrText>
         </w:r>
         <w:r>
           <w:rPr>
@@ -1767,7 +1817,7 @@
           <w:noProof/>
         </w:rPr>
       </w:pPr>
-      <w:hyperlink w:anchor="_Toc240982724" w:history="1">
+      <w:hyperlink w:anchor="_Toc241185775" w:history="1">
         <w:r>
           <w:rPr>
             <w:rStyle w:val="Hyperlink"/>
@@ -1794,7 +1844,7 @@
             <w:noProof/>
             <w:webHidden/>
           </w:rPr>
-          <w:instrText xml:space="preserve"> PAGEREF _Toc240982724 \h </w:instrText>
+          <w:instrText xml:space="preserve"> PAGEREF _Toc241185775 \h </w:instrText>
         </w:r>
         <w:r>
           <w:rPr>
@@ -1835,7 +1885,7 @@
           <w:noProof/>
         </w:rPr>
       </w:pPr>
-      <w:hyperlink w:anchor="_Toc240982725" w:history="1">
+      <w:hyperlink w:anchor="_Toc241185776" w:history="1">
         <w:r>
           <w:rPr>
             <w:rStyle w:val="Hyperlink"/>
@@ -1862,7 +1912,7 @@
             <w:noProof/>
             <w:webHidden/>
           </w:rPr>
-          <w:instrText xml:space="preserve"> PAGEREF _Toc240982725 \h </w:instrText>
+          <w:instrText xml:space="preserve"> PAGEREF _Toc241185776 \h </w:instrText>
         </w:r>
         <w:r>
           <w:rPr>
@@ -1903,7 +1953,7 @@
           <w:noProof/>
         </w:rPr>
       </w:pPr>
-      <w:hyperlink w:anchor="_Toc240982726" w:history="1">
+      <w:hyperlink w:anchor="_Toc241185777" w:history="1">
         <w:r>
           <w:rPr>
             <w:rStyle w:val="Hyperlink"/>
@@ -1930,7 +1980,7 @@
             <w:noProof/>
             <w:webHidden/>
           </w:rPr>
-          <w:instrText xml:space="preserve"> PAGEREF _Toc240982726 \h </w:instrText>
+          <w:instrText xml:space="preserve"> PAGEREF _Toc241185777 \h </w:instrText>
         </w:r>
         <w:r>
           <w:rPr>
@@ -1971,7 +2021,7 @@
           <w:noProof/>
         </w:rPr>
       </w:pPr>
-      <w:hyperlink w:anchor="_Toc240982727" w:history="1">
+      <w:hyperlink w:anchor="_Toc241185778" w:history="1">
         <w:r>
           <w:rPr>
             <w:rStyle w:val="Hyperlink"/>
@@ -1998,7 +2048,7 @@
             <w:noProof/>
             <w:webHidden/>
           </w:rPr>
-          <w:instrText xml:space="preserve"> PAGEREF _Toc240982727 \h </w:instrText>
+          <w:instrText xml:space="preserve"> PAGEREF _Toc241185778 \h </w:instrText>
         </w:r>
         <w:r>
           <w:rPr>
@@ -2039,7 +2089,7 @@
           <w:noProof/>
         </w:rPr>
       </w:pPr>
-      <w:hyperlink w:anchor="_Toc240982728" w:history="1">
+      <w:hyperlink w:anchor="_Toc241185779" w:history="1">
         <w:r>
           <w:rPr>
             <w:rStyle w:val="Hyperlink"/>
@@ -2066,7 +2116,7 @@
             <w:noProof/>
             <w:webHidden/>
           </w:rPr>
-          <w:instrText xml:space="preserve"> PAGEREF _Toc240982728 \h </w:instrText>
+          <w:instrText xml:space="preserve"> PAGEREF _Toc241185779 \h </w:instrText>
         </w:r>
         <w:r>
           <w:rPr>
@@ -2107,7 +2157,7 @@
           <w:noProof/>
         </w:rPr>
       </w:pPr>
-      <w:hyperlink w:anchor="_Toc240982729" w:history="1">
+      <w:hyperlink w:anchor="_Toc241185780" w:history="1">
         <w:r>
           <w:rPr>
             <w:rStyle w:val="Hyperlink"/>
@@ -2134,7 +2184,7 @@
             <w:noProof/>
             <w:webHidden/>
           </w:rPr>
-          <w:instrText xml:space="preserve"> PAGEREF _Toc240982729 \h </w:instrText>
+          <w:instrText xml:space="preserve"> PAGEREF _Toc241185780 \h </w:instrText>
         </w:r>
         <w:r>
           <w:rPr>
@@ -2154,7 +2204,7 @@
             <w:noProof/>
             <w:webHidden/>
           </w:rPr>
-          <w:t>19</w:t>
+          <w:t>18</w:t>
         </w:r>
         <w:r>
           <w:rPr>
@@ -2175,7 +2225,7 @@
           <w:noProof/>
         </w:rPr>
       </w:pPr>
-      <w:hyperlink w:anchor="_Toc240982730" w:history="1">
+      <w:hyperlink w:anchor="_Toc241185781" w:history="1">
         <w:r>
           <w:rPr>
             <w:rStyle w:val="Hyperlink"/>
@@ -2202,7 +2252,7 @@
             <w:noProof/>
             <w:webHidden/>
           </w:rPr>
-          <w:instrText xml:space="preserve"> PAGEREF _Toc240982730 \h </w:instrText>
+          <w:instrText xml:space="preserve"> PAGEREF _Toc241185781 \h </w:instrText>
         </w:r>
         <w:r>
           <w:rPr>
@@ -2243,7 +2293,7 @@
           <w:noProof/>
         </w:rPr>
       </w:pPr>
-      <w:hyperlink w:anchor="_Toc240982731" w:history="1">
+      <w:hyperlink w:anchor="_Toc241185782" w:history="1">
         <w:r>
           <w:rPr>
             <w:rStyle w:val="Hyperlink"/>
@@ -2270,7 +2320,7 @@
             <w:noProof/>
             <w:webHidden/>
           </w:rPr>
-          <w:instrText xml:space="preserve"> PAGEREF _Toc240982731 \h </w:instrText>
+          <w:instrText xml:space="preserve"> PAGEREF _Toc241185782 \h </w:instrText>
         </w:r>
         <w:r>
           <w:rPr>
@@ -2311,7 +2361,7 @@
           <w:noProof/>
         </w:rPr>
       </w:pPr>
-      <w:hyperlink w:anchor="_Toc240982732" w:history="1">
+      <w:hyperlink w:anchor="_Toc241185783" w:history="1">
         <w:r>
           <w:rPr>
             <w:rStyle w:val="Hyperlink"/>
@@ -2338,7 +2388,7 @@
             <w:noProof/>
             <w:webHidden/>
           </w:rPr>
-          <w:instrText xml:space="preserve"> PAGEREF _Toc240982732 \h </w:instrText>
+          <w:instrText xml:space="preserve"> PAGEREF _Toc241185783 \h </w:instrText>
         </w:r>
         <w:r>
           <w:rPr>
@@ -2379,7 +2429,7 @@
           <w:noProof/>
         </w:rPr>
       </w:pPr>
-      <w:hyperlink w:anchor="_Toc240982733" w:history="1">
+      <w:hyperlink w:anchor="_Toc241185784" w:history="1">
         <w:r>
           <w:rPr>
             <w:rStyle w:val="Hyperlink"/>
@@ -2406,7 +2456,7 @@
             <w:noProof/>
             <w:webHidden/>
           </w:rPr>
-          <w:instrText xml:space="preserve"> PAGEREF _Toc240982733 \h </w:instrText>
+          <w:instrText xml:space="preserve"> PAGEREF _Toc241185784 \h </w:instrText>
         </w:r>
         <w:r>
           <w:rPr>
@@ -2447,7 +2497,7 @@
           <w:noProof/>
         </w:rPr>
       </w:pPr>
-      <w:hyperlink w:anchor="_Toc240982734" w:history="1">
+      <w:hyperlink w:anchor="_Toc241185785" w:history="1">
         <w:r>
           <w:rPr>
             <w:rStyle w:val="Hyperlink"/>
@@ -2474,7 +2524,7 @@
             <w:noProof/>
             <w:webHidden/>
           </w:rPr>
-          <w:instrText xml:space="preserve"> PAGEREF _Toc240982734 \h </w:instrText>
+          <w:instrText xml:space="preserve"> PAGEREF _Toc241185785 \h </w:instrText>
         </w:r>
         <w:r>
           <w:rPr>
@@ -2515,7 +2565,7 @@
           <w:noProof/>
         </w:rPr>
       </w:pPr>
-      <w:hyperlink w:anchor="_Toc240982735" w:history="1">
+      <w:hyperlink w:anchor="_Toc241185786" w:history="1">
         <w:r>
           <w:rPr>
             <w:rStyle w:val="Hyperlink"/>
@@ -2542,7 +2592,7 @@
             <w:noProof/>
             <w:webHidden/>
           </w:rPr>
-          <w:instrText xml:space="preserve"> PAGEREF _Toc240982735 \h </w:instrText>
+          <w:instrText xml:space="preserve"> PAGEREF _Toc241185786 \h </w:instrText>
         </w:r>
         <w:r>
           <w:rPr>
@@ -2583,7 +2633,7 @@
           <w:noProof/>
         </w:rPr>
       </w:pPr>
-      <w:hyperlink w:anchor="_Toc240982736" w:history="1">
+      <w:hyperlink w:anchor="_Toc241185787" w:history="1">
         <w:r>
           <w:rPr>
             <w:rStyle w:val="Hyperlink"/>
@@ -2610,7 +2660,7 @@
             <w:noProof/>
             <w:webHidden/>
           </w:rPr>
-          <w:instrText xml:space="preserve"> PAGEREF _Toc240982736 \h </w:instrText>
+          <w:instrText xml:space="preserve"> PAGEREF _Toc241185787 \h </w:instrText>
         </w:r>
         <w:r>
           <w:rPr>
@@ -2651,7 +2701,7 @@
           <w:noProof/>
         </w:rPr>
       </w:pPr>
-      <w:hyperlink w:anchor="_Toc240982737" w:history="1">
+      <w:hyperlink w:anchor="_Toc241185788" w:history="1">
         <w:r>
           <w:rPr>
             <w:rStyle w:val="Hyperlink"/>
@@ -2678,7 +2728,7 @@
             <w:noProof/>
             <w:webHidden/>
           </w:rPr>
-          <w:instrText xml:space="preserve"> PAGEREF _Toc240982737 \h </w:instrText>
+          <w:instrText xml:space="preserve"> PAGEREF _Toc241185788 \h </w:instrText>
         </w:r>
         <w:r>
           <w:rPr>
@@ -2719,7 +2769,7 @@
           <w:noProof/>
         </w:rPr>
       </w:pPr>
-      <w:hyperlink w:anchor="_Toc240982738" w:history="1">
+      <w:hyperlink w:anchor="_Toc241185789" w:history="1">
         <w:r>
           <w:rPr>
             <w:rStyle w:val="Hyperlink"/>
@@ -2746,7 +2796,7 @@
             <w:noProof/>
             <w:webHidden/>
           </w:rPr>
-          <w:instrText xml:space="preserve"> PAGEREF _Toc240982738 \h </w:instrText>
+          <w:instrText xml:space="preserve"> PAGEREF _Toc241185789 \h </w:instrText>
         </w:r>
         <w:r>
           <w:rPr>
@@ -2787,7 +2837,7 @@
           <w:noProof/>
         </w:rPr>
       </w:pPr>
-      <w:hyperlink w:anchor="_Toc240982739" w:history="1">
+      <w:hyperlink w:anchor="_Toc241185790" w:history="1">
         <w:r>
           <w:rPr>
             <w:rStyle w:val="Hyperlink"/>
@@ -2814,7 +2864,7 @@
             <w:noProof/>
             <w:webHidden/>
           </w:rPr>
-          <w:instrText xml:space="preserve"> PAGEREF _Toc240982739 \h </w:instrText>
+          <w:instrText xml:space="preserve"> PAGEREF _Toc241185790 \h </w:instrText>
         </w:r>
         <w:r>
           <w:rPr>
@@ -2855,7 +2905,7 @@
           <w:noProof/>
         </w:rPr>
       </w:pPr>
-      <w:hyperlink w:anchor="_Toc240982740" w:history="1">
+      <w:hyperlink w:anchor="_Toc241185791" w:history="1">
         <w:r>
           <w:rPr>
             <w:rStyle w:val="Hyperlink"/>
@@ -2882,7 +2932,7 @@
             <w:noProof/>
             <w:webHidden/>
           </w:rPr>
-          <w:instrText xml:space="preserve"> PAGEREF _Toc240982740 \h </w:instrText>
+          <w:instrText xml:space="preserve"> PAGEREF _Toc241185791 \h </w:instrText>
         </w:r>
         <w:r>
           <w:rPr>
@@ -2923,7 +2973,7 @@
           <w:noProof/>
         </w:rPr>
       </w:pPr>
-      <w:hyperlink w:anchor="_Toc240982741" w:history="1">
+      <w:hyperlink w:anchor="_Toc241185792" w:history="1">
         <w:r>
           <w:rPr>
             <w:rStyle w:val="Hyperlink"/>
@@ -2950,7 +3000,7 @@
             <w:noProof/>
             <w:webHidden/>
           </w:rPr>
-          <w:instrText xml:space="preserve"> PAGEREF _Toc240982741 \h </w:instrText>
+          <w:instrText xml:space="preserve"> PAGEREF _Toc241185792 \h </w:instrText>
         </w:r>
         <w:r>
           <w:rPr>
@@ -2991,7 +3041,7 @@
           <w:noProof/>
         </w:rPr>
       </w:pPr>
-      <w:hyperlink w:anchor="_Toc240982742" w:history="1">
+      <w:hyperlink w:anchor="_Toc241185793" w:history="1">
         <w:r>
           <w:rPr>
             <w:rStyle w:val="Hyperlink"/>
@@ -3018,7 +3068,7 @@
             <w:noProof/>
             <w:webHidden/>
           </w:rPr>
-          <w:instrText xml:space="preserve"> PAGEREF _Toc240982742 \h </w:instrText>
+          <w:instrText xml:space="preserve"> PAGEREF _Toc241185793 \h </w:instrText>
         </w:r>
         <w:r>
           <w:rPr>
@@ -3064,7 +3114,7 @@
       <w:pPr>
         <w:pStyle w:val="Heading1"/>
       </w:pPr>
-      <w:bookmarkStart w:id="0" w:name="_Toc240982713"/>
+      <w:bookmarkStart w:id="0" w:name="_Toc241185764"/>
       <w:r>
         <w:lastRenderedPageBreak/>
         <w:t>About This Document</w:t>
@@ -3167,7 +3217,7 @@
       <w:pPr>
         <w:pStyle w:val="Heading1"/>
       </w:pPr>
-      <w:bookmarkStart w:id="1" w:name="_Toc240982714"/>
+      <w:bookmarkStart w:id="1" w:name="_Toc241185765"/>
       <w:r>
         <w:t>1. Basic Information (Application and Organization)</w:t>
       </w:r>
@@ -3314,7 +3364,7 @@
       <w:pPr>
         <w:pStyle w:val="Heading2"/>
       </w:pPr>
-      <w:bookmarkStart w:id="2" w:name="_Toc240982715"/>
+      <w:bookmarkStart w:id="2" w:name="_Toc241185766"/>
       <w:r>
         <w:t>1.0 · Status Summary — Section 1</w:t>
       </w:r>
@@ -3691,7 +3741,7 @@
       <w:pPr>
         <w:pStyle w:val="Heading2"/>
       </w:pPr>
-      <w:bookmarkStart w:id="3" w:name="_Toc240982716"/>
+      <w:bookmarkStart w:id="3" w:name="_Toc241185767"/>
       <w:r>
         <w:t>1.1 · Application Form</w:t>
       </w:r>
@@ -4743,7 +4793,7 @@
       <w:pPr>
         <w:pStyle w:val="Heading2"/>
       </w:pPr>
-      <w:bookmarkStart w:id="4" w:name="_Toc240982717"/>
+      <w:bookmarkStart w:id="4" w:name="_Toc241185768"/>
       <w:r>
         <w:t>1.2 · Business License / Company Registration Certificate</w:t>
       </w:r>
@@ -5292,7 +5342,7 @@
       <w:pPr>
         <w:pStyle w:val="Heading2"/>
       </w:pPr>
-      <w:bookmarkStart w:id="5" w:name="_Toc240982718"/>
+      <w:bookmarkStart w:id="5" w:name="_Toc241185769"/>
       <w:r>
         <w:t>1.3 · Organizational Chart and Contact Information</w:t>
       </w:r>
@@ -5841,7 +5891,7 @@
       <w:pPr>
         <w:pStyle w:val="Heading2"/>
       </w:pPr>
-      <w:bookmarkStart w:id="6" w:name="_Toc240982719"/>
+      <w:bookmarkStart w:id="6" w:name="_Toc241185770"/>
       <w:r>
         <w:t>1.4 · Manufacturing Plant Address and Introduction of Production Facilities</w:t>
       </w:r>
@@ -6353,7 +6403,7 @@
       <w:pPr>
         <w:pStyle w:val="Heading2"/>
       </w:pPr>
-      <w:bookmarkStart w:id="7" w:name="_Toc240982720"/>
+      <w:bookmarkStart w:id="7" w:name="_Toc241185771"/>
       <w:r>
         <w:t>1.5 · ISO 9001 Certificate, Quality Manual, and Procedure Index</w:t>
       </w:r>
@@ -6776,7 +6826,7 @@
       <w:pPr>
         <w:pStyle w:val="Heading1"/>
       </w:pPr>
-      <w:bookmarkStart w:id="8" w:name="_Toc240982721"/>
+      <w:bookmarkStart w:id="8" w:name="_Toc241185772"/>
       <w:r>
         <w:t>2. Technical Documentation</w:t>
       </w:r>
@@ -6791,7 +6841,7 @@
       <w:pPr>
         <w:pStyle w:val="Heading2"/>
       </w:pPr>
-      <w:bookmarkStart w:id="9" w:name="_Toc240982722"/>
+      <w:bookmarkStart w:id="9" w:name="_Toc241185773"/>
       <w:r>
         <w:t>2.1 · Detailed Product Description</w:t>
       </w:r>
@@ -6824,7 +6874,7 @@
       <w:pPr>
         <w:pStyle w:val="Heading2"/>
       </w:pPr>
-      <w:bookmarkStart w:id="10" w:name="_Toc240982723"/>
+      <w:bookmarkStart w:id="10" w:name="_Toc241185774"/>
       <w:r>
         <w:t>2.2 · Product Name, Model, and Specification List</w:t>
       </w:r>
@@ -7268,7 +7318,7 @@
       <w:pPr>
         <w:pStyle w:val="Heading2"/>
       </w:pPr>
-      <w:bookmarkStart w:id="11" w:name="_Toc240982724"/>
+      <w:bookmarkStart w:id="11" w:name="_Toc241185775"/>
       <w:r>
         <w:t>2.3 · Functional Description and Technical Parameters (Electrical, Mechanical, etc.)</w:t>
       </w:r>
@@ -7286,7 +7336,7 @@
       <w:pPr>
         <w:pStyle w:val="Heading3"/>
       </w:pPr>
-      <w:bookmarkStart w:id="12" w:name="_Toc240982725"/>
+      <w:bookmarkStart w:id="12" w:name="_Toc241185776"/>
       <w:r>
         <w:t>2.3.a · Electrical Parameters — Node Sensor (GLD)</w:t>
       </w:r>
@@ -7910,7 +7960,7 @@
       <w:pPr>
         <w:pStyle w:val="Heading3"/>
       </w:pPr>
-      <w:bookmarkStart w:id="13" w:name="_Toc240982726"/>
+      <w:bookmarkStart w:id="13" w:name="_Toc241185777"/>
       <w:r>
         <w:t>2.3.b · Sensor and Communication Parameters — Node Sensor (GLD)</w:t>
       </w:r>
@@ -8972,7 +9022,7 @@
       <w:pPr>
         <w:pStyle w:val="Heading3"/>
       </w:pPr>
-      <w:bookmarkStart w:id="14" w:name="_Toc240982727"/>
+      <w:bookmarkStart w:id="14" w:name="_Toc241185778"/>
       <w:r>
         <w:t>2.3.c · Mechanical Parameters — Node Sensor (GLD)</w:t>
       </w:r>
@@ -9274,7 +9324,7 @@
               <w:rPr>
                 <w:sz w:val="19"/>
               </w:rPr>
-              <w:t>2.3 kg</w:t>
+              <w:t>2.378 kg</w:t>
             </w:r>
           </w:p>
         </w:tc>
@@ -9308,7 +9358,7 @@
               <w:rPr>
                 <w:sz w:val="19"/>
               </w:rPr>
-              <w:t>Project-confirmed value; not yet documented against a calibrated weighing record.</w:t>
+              <w:t>Total weight of PCB, casing, and sensors combined; project-confirmed value, not yet documented against a calibrated weighing record.</w:t>
             </w:r>
           </w:p>
         </w:tc>
@@ -9639,7 +9689,7 @@
               <w:rPr>
                 <w:sz w:val="19"/>
               </w:rPr>
-              <w:t>40°C to +85°C (ambient)</w:t>
+              <w:t>20°C to +60°C (ambient)</w:t>
             </w:r>
           </w:p>
         </w:tc>
@@ -9673,7 +9723,7 @@
               <w:rPr>
                 <w:sz w:val="19"/>
               </w:rPr>
-              <w:t>Project-confirmed value, extended-industrial electronics range — a key input for temperature class (T1–T6) determination in Section 2.5. Not yet documented against a calibrated test record.</w:t>
+              <w:t>Project-confirmed value — a key input for temperature class (T1–T6) determination in Section 2.5. Not yet documented against a calibrated test record.</w:t>
             </w:r>
           </w:p>
         </w:tc>
@@ -9712,7 +9762,7 @@
               <w:rPr>
                 <w:sz w:val="19"/>
               </w:rPr>
-              <w:t>10–90% RH, non-condensing</w:t>
+              <w:t>5–95% RH, non-condensing</w:t>
             </w:r>
           </w:p>
         </w:tc>
@@ -9746,7 +9796,7 @@
               <w:rPr>
                 <w:sz w:val="19"/>
               </w:rPr>
-              <w:t>A standard industrial-electronics humidity rating, matched to the range specified by a comparable certified diffusion-type gas detector (New Cosmos KD-12/KD-12R) rather than an independent GLD-specific measurement or test.</w:t>
+              <w:t>Project-confirmed value. Not yet documented against a calibrated test record.</w:t>
             </w:r>
           </w:p>
         </w:tc>
@@ -9764,7 +9814,6 @@
           <w:color w:val="4A4A4A"/>
           <w:sz w:val="18"/>
         </w:rPr>
-        <w:lastRenderedPageBreak/>
         <w:t>Source: internal technical specification documentation, Sections 1.1–1.3 (Node Sensor), cross-referenced with the official product technical datasheet (Revision 4.0) and component certification verification (ESP32-S3-WROOM-1U, E22-900MM22S).</w:t>
       </w:r>
     </w:p>
@@ -9801,7 +9850,15 @@
                 <w:color w:val="4A4A4A"/>
                 <w:sz w:val="20"/>
               </w:rPr>
-              <w:t>Rows marked “Pending confirmation” above do not reflect a documentation oversight — this is an honest status indicator. These fields are intentionally left blank because no official data yet exists (not yet measured, tested, or decided). They must not be filled with estimates in future revisions without a clear supporting data source.</w:t>
+              <w:t xml:space="preserve">Rows marked “Pending confirmation” above do not reflect a documentation oversight — this is an honest status indicator. These fields are intentionally left blank because no official data yet exists (not yet measured, tested, or </w:t>
+            </w:r>
+            <w:r>
+              <w:rPr>
+                <w:color w:val="4A4A4A"/>
+                <w:sz w:val="20"/>
+              </w:rPr>
+              <w:lastRenderedPageBreak/>
+              <w:t>decided). They must not be filled with estimates in future revisions without a clear supporting data source.</w:t>
             </w:r>
           </w:p>
         </w:tc>
@@ -9816,7 +9873,7 @@
       <w:pPr>
         <w:pStyle w:val="Heading2"/>
       </w:pPr>
-      <w:bookmarkStart w:id="15" w:name="_Toc240982728"/>
+      <w:bookmarkStart w:id="15" w:name="_Toc241185779"/>
       <w:r>
         <w:t>2.4 · Product Photographs — Overall and Key Components</w:t>
       </w:r>
@@ -9855,7 +9912,7 @@
                 <w:noProof/>
               </w:rPr>
               <w:drawing>
-                <wp:inline distT="0" distB="0" distL="0" distR="0" wp14:anchorId="186B4BC1" wp14:editId="6745E7F4">
+                <wp:inline distT="0" distB="0" distL="0" distR="0" wp14:anchorId="7B280349" wp14:editId="4913058C">
                   <wp:extent cx="1379912" cy="2286000"/>
                   <wp:effectExtent l="0" t="0" r="0" b="0"/>
                   <wp:docPr id="1" name="Picture 1"/>
@@ -9932,7 +9989,7 @@
                 <w:noProof/>
               </w:rPr>
               <w:drawing>
-                <wp:inline distT="0" distB="0" distL="0" distR="0" wp14:anchorId="7FE0685C" wp14:editId="5F1080C4">
+                <wp:inline distT="0" distB="0" distL="0" distR="0" wp14:anchorId="79C8B9C7" wp14:editId="248BF30B">
                   <wp:extent cx="1714500" cy="2286000"/>
                   <wp:effectExtent l="0" t="0" r="0" b="0"/>
                   <wp:docPr id="2" name="Picture 2"/>
@@ -10014,7 +10071,7 @@
                 <w:noProof/>
               </w:rPr>
               <w:drawing>
-                <wp:inline distT="0" distB="0" distL="0" distR="0" wp14:anchorId="1728B60C" wp14:editId="0FDCB1D8">
+                <wp:inline distT="0" distB="0" distL="0" distR="0" wp14:anchorId="27F7A844" wp14:editId="62FF062D">
                   <wp:extent cx="1026621" cy="2286000"/>
                   <wp:effectExtent l="0" t="0" r="0" b="0"/>
                   <wp:docPr id="3" name="Picture 3"/>
@@ -10073,15 +10130,7 @@
                 <w:color w:val="4A4A4A"/>
                 <w:sz w:val="17"/>
               </w:rPr>
-              <w:t xml:space="preserve">The main enclosure with the sensor mesh cover installed, shown in a flat front view illustrating the enclosure shape and its four </w:t>
-            </w:r>
-            <w:r>
-              <w:rPr>
-                <w:color w:val="4A4A4A"/>
-                <w:sz w:val="17"/>
-              </w:rPr>
-              <w:lastRenderedPageBreak/>
-              <w:t>mounting bolt holes.</w:t>
+              <w:t>The main enclosure with the sensor mesh cover installed, shown in a flat front view illustrating the enclosure shape and its four mounting bolt holes.</w:t>
             </w:r>
           </w:p>
         </w:tc>
@@ -10098,9 +10147,8 @@
               <w:rPr>
                 <w:noProof/>
               </w:rPr>
-              <w:lastRenderedPageBreak/>
               <w:drawing>
-                <wp:inline distT="0" distB="0" distL="0" distR="0" wp14:anchorId="209F69E3" wp14:editId="1EADE8B5">
+                <wp:inline distT="0" distB="0" distL="0" distR="0" wp14:anchorId="6C9CE581" wp14:editId="5A1D7B0D">
                   <wp:extent cx="1026621" cy="2286000"/>
                   <wp:effectExtent l="0" t="0" r="0" b="0"/>
                   <wp:docPr id="4" name="Picture 4"/>
@@ -10159,15 +10207,7 @@
                 <w:color w:val="4A4A4A"/>
                 <w:sz w:val="17"/>
               </w:rPr>
-              <w:t xml:space="preserve">The main PCB installed inside the enclosure prior to gas sensor module installation. The ESP32-S3-WROOM-1U microcontroller, </w:t>
-            </w:r>
-            <w:r>
-              <w:rPr>
-                <w:color w:val="4A4A4A"/>
-                <w:sz w:val="17"/>
-              </w:rPr>
-              <w:lastRenderedPageBreak/>
-              <w:t>LoRa radio module, and power circuitry are visible.</w:t>
+              <w:t>The main PCB installed inside the enclosure prior to gas sensor module installation. The ESP32-S3-WROOM-1U microcontroller, LoRa radio module, and power circuitry are visible.</w:t>
             </w:r>
           </w:p>
         </w:tc>
@@ -10191,7 +10231,7 @@
               </w:rPr>
               <w:lastRenderedPageBreak/>
               <w:drawing>
-                <wp:inline distT="0" distB="0" distL="0" distR="0" wp14:anchorId="10C526EC" wp14:editId="7672E3ED">
+                <wp:inline distT="0" distB="0" distL="0" distR="0" wp14:anchorId="38067EDC" wp14:editId="6C3D8F4B">
                   <wp:extent cx="1026621" cy="2286000"/>
                   <wp:effectExtent l="0" t="0" r="0" b="0"/>
                   <wp:docPr id="5" name="Picture 5"/>
@@ -10268,7 +10308,7 @@
                 <w:noProof/>
               </w:rPr>
               <w:drawing>
-                <wp:inline distT="0" distB="0" distL="0" distR="0" wp14:anchorId="309F0425" wp14:editId="5F6EBB75">
+                <wp:inline distT="0" distB="0" distL="0" distR="0" wp14:anchorId="10AF1421" wp14:editId="27A3EE69">
                   <wp:extent cx="1026621" cy="2286000"/>
                   <wp:effectExtent l="0" t="0" r="0" b="0"/>
                   <wp:docPr id="6" name="Picture 6"/>
@@ -10350,7 +10390,7 @@
                 <w:noProof/>
               </w:rPr>
               <w:drawing>
-                <wp:inline distT="0" distB="0" distL="0" distR="0" wp14:anchorId="361A644D" wp14:editId="2D86ADEC">
+                <wp:inline distT="0" distB="0" distL="0" distR="0" wp14:anchorId="56FE035E" wp14:editId="69D40317">
                   <wp:extent cx="1026621" cy="2286000"/>
                   <wp:effectExtent l="0" t="0" r="0" b="0"/>
                   <wp:docPr id="7" name="Picture 7"/>
@@ -10474,19 +10514,19 @@
       <w:pPr>
         <w:pStyle w:val="Heading2"/>
       </w:pPr>
-      <w:bookmarkStart w:id="16" w:name="_Toc240982729"/>
+      <w:bookmarkStart w:id="16" w:name="_Toc241185780"/>
       <w:r>
-        <w:lastRenderedPageBreak/>
         <w:t>2.5 · Description of Intended Use and Installation Environment (Gas Group, Temperature Class, Area Classification)</w:t>
       </w:r>
       <w:bookmarkEnd w:id="16"/>
     </w:p>
     <w:p>
       <w:r>
-        <w:t>The GLD is intended for continuous, fixed-point monitoring of flammable and toxic gas leaks in oil &amp; gas refinery hazardous areas — process units, tank farms, pipe racks, and loading/unloading areas. The specific Ex classification parameters below reflect the project engineering team's current recommendation, developed from the intended deployment envelope and the gases the device is designed to detect; none of these parameters has yet been confirmed with the certification body (ExCB) or a notified body, an</w:t>
+        <w:t xml:space="preserve">The GLD is intended for continuous, fixed-point monitoring of flammable and toxic gas leaks in oil &amp; gas refinery hazardous areas — process units, tank farms, pipe racks, and loading/unloading areas. The specific Ex </w:t>
       </w:r>
       <w:r>
-        <w:t>d none should be treated as final.</w:t>
+        <w:lastRenderedPageBreak/>
+        <w:t>classification parameters below reflect the project engineering team's current recommendation, developed from the intended deployment envelope and the gases the device is designed to detect; none of these parameters has yet been confirmed with the certification body (ExCB) or a notified body, and none should be treated as final.</w:t>
       </w:r>
     </w:p>
     <w:tbl>
@@ -10771,7 +10811,7 @@
               <w:rPr>
                 <w:sz w:val="19"/>
               </w:rPr>
-              <w:t>40°C to +85°C</w:t>
+              <w:t>20°C to +60°C</w:t>
             </w:r>
           </w:p>
         </w:tc>
@@ -10805,7 +10845,7 @@
               <w:rPr>
                 <w:sz w:val="19"/>
               </w:rPr>
-              <w:t>Project-confirmed value, extended-industrial electronics range. Distinct from the MQ-sensor hot-spot surface temperature above, which remains the top-priority open item for the T4 recommendation.</w:t>
+              <w:t>Project-confirmed value, consistent with the Mechanical Parameters table (Section 2.3.c). Distinct from the MQ-sensor hot-spot surface temperature above, which remains the top-priority open item for the T4 recommendation.</w:t>
             </w:r>
           </w:p>
         </w:tc>
@@ -10937,7 +10977,7 @@
       <w:pPr>
         <w:pStyle w:val="Heading2"/>
       </w:pPr>
-      <w:bookmarkStart w:id="17" w:name="_Toc240982730"/>
+      <w:bookmarkStart w:id="17" w:name="_Toc241185781"/>
       <w:r>
         <w:t>2.6 · Design and Manufacturing Information</w:t>
       </w:r>
@@ -10952,7 +10992,7 @@
       <w:pPr>
         <w:pStyle w:val="Heading3"/>
       </w:pPr>
-      <w:bookmarkStart w:id="18" w:name="_Toc240982731"/>
+      <w:bookmarkStart w:id="18" w:name="_Toc241185782"/>
       <w:r>
         <w:lastRenderedPageBreak/>
         <w:t>2.6.a · Complete Drawings (Assembly, Component, Electrical Schematic, PCB Layout, Enclosure Structure, Junction Box, Terminal, Grounding)</w:t>
@@ -10973,7 +11013,7 @@
           <w:noProof/>
         </w:rPr>
         <w:drawing>
-          <wp:inline distT="0" distB="0" distL="0" distR="0" wp14:anchorId="22CB094F" wp14:editId="6230D59E">
+          <wp:inline distT="0" distB="0" distL="0" distR="0" wp14:anchorId="05877050" wp14:editId="37EC5034">
             <wp:extent cx="5120640" cy="3413760"/>
             <wp:effectExtent l="0" t="0" r="0" b="0"/>
             <wp:docPr id="8" name="Picture 8"/>
@@ -11046,7 +11086,7 @@
         </w:rPr>
         <w:lastRenderedPageBreak/>
         <w:drawing>
-          <wp:inline distT="0" distB="0" distL="0" distR="0" wp14:anchorId="067FF7E7" wp14:editId="765602CD">
+          <wp:inline distT="0" distB="0" distL="0" distR="0" wp14:anchorId="7FCDBBFE" wp14:editId="12B20F10">
             <wp:extent cx="5120640" cy="3413760"/>
             <wp:effectExtent l="0" t="0" r="0" b="0"/>
             <wp:docPr id="9" name="Picture 9"/>
@@ -11118,7 +11158,7 @@
           <w:noProof/>
         </w:rPr>
         <w:drawing>
-          <wp:inline distT="0" distB="0" distL="0" distR="0" wp14:anchorId="5CB660EA" wp14:editId="5BB0E751">
+          <wp:inline distT="0" distB="0" distL="0" distR="0" wp14:anchorId="53F8A22B" wp14:editId="04721ECC">
             <wp:extent cx="5120640" cy="3413760"/>
             <wp:effectExtent l="0" t="0" r="0" b="0"/>
             <wp:docPr id="10" name="Picture 10"/>
@@ -11191,7 +11231,7 @@
         </w:rPr>
         <w:lastRenderedPageBreak/>
         <w:drawing>
-          <wp:inline distT="0" distB="0" distL="0" distR="0" wp14:anchorId="2CA7075D" wp14:editId="1ED234B5">
+          <wp:inline distT="0" distB="0" distL="0" distR="0" wp14:anchorId="29141D0D" wp14:editId="03AB4442">
             <wp:extent cx="5120640" cy="3413760"/>
             <wp:effectExtent l="0" t="0" r="0" b="0"/>
             <wp:docPr id="11" name="Picture 11"/>
@@ -11263,7 +11303,7 @@
           <w:noProof/>
         </w:rPr>
         <w:drawing>
-          <wp:inline distT="0" distB="0" distL="0" distR="0" wp14:anchorId="013CC6E5" wp14:editId="13A6E914">
+          <wp:inline distT="0" distB="0" distL="0" distR="0" wp14:anchorId="5C6644DB" wp14:editId="5A6C7E31">
             <wp:extent cx="5120640" cy="3413760"/>
             <wp:effectExtent l="0" t="0" r="0" b="0"/>
             <wp:docPr id="12" name="Picture 12"/>
@@ -11336,7 +11376,7 @@
         </w:rPr>
         <w:lastRenderedPageBreak/>
         <w:drawing>
-          <wp:inline distT="0" distB="0" distL="0" distR="0" wp14:anchorId="05486C5A" wp14:editId="46716DA2">
+          <wp:inline distT="0" distB="0" distL="0" distR="0" wp14:anchorId="0F320894" wp14:editId="0D7FC307">
             <wp:extent cx="5120640" cy="3413760"/>
             <wp:effectExtent l="0" t="0" r="0" b="0"/>
             <wp:docPr id="13" name="Picture 13"/>
@@ -11408,7 +11448,7 @@
           <w:noProof/>
         </w:rPr>
         <w:drawing>
-          <wp:inline distT="0" distB="0" distL="0" distR="0" wp14:anchorId="0887B323" wp14:editId="58F00840">
+          <wp:inline distT="0" distB="0" distL="0" distR="0" wp14:anchorId="79698BED" wp14:editId="6129FFA0">
             <wp:extent cx="5120640" cy="3413760"/>
             <wp:effectExtent l="0" t="0" r="0" b="0"/>
             <wp:docPr id="14" name="Picture 14"/>
@@ -11481,7 +11521,7 @@
         </w:rPr>
         <w:lastRenderedPageBreak/>
         <w:drawing>
-          <wp:inline distT="0" distB="0" distL="0" distR="0" wp14:anchorId="0B79647B" wp14:editId="4B10855F">
+          <wp:inline distT="0" distB="0" distL="0" distR="0" wp14:anchorId="23409922" wp14:editId="003F786F">
             <wp:extent cx="5120640" cy="3413760"/>
             <wp:effectExtent l="0" t="0" r="0" b="0"/>
             <wp:docPr id="15" name="Picture 15"/>
@@ -11553,7 +11593,7 @@
           <w:noProof/>
         </w:rPr>
         <w:drawing>
-          <wp:inline distT="0" distB="0" distL="0" distR="0" wp14:anchorId="53D95A50" wp14:editId="546A8FDE">
+          <wp:inline distT="0" distB="0" distL="0" distR="0" wp14:anchorId="1DFBEDF4" wp14:editId="64E462E3">
             <wp:extent cx="5120640" cy="3413760"/>
             <wp:effectExtent l="0" t="0" r="0" b="0"/>
             <wp:docPr id="16" name="Picture 16"/>
@@ -11626,7 +11666,7 @@
         </w:rPr>
         <w:lastRenderedPageBreak/>
         <w:drawing>
-          <wp:inline distT="0" distB="0" distL="0" distR="0" wp14:anchorId="171E2B91" wp14:editId="7B7A0D13">
+          <wp:inline distT="0" distB="0" distL="0" distR="0" wp14:anchorId="28B27E00" wp14:editId="6298902D">
             <wp:extent cx="2468880" cy="2479268"/>
             <wp:effectExtent l="0" t="0" r="0" b="0"/>
             <wp:docPr id="17" name="Picture 17"/>
@@ -11669,7 +11709,7 @@
           <w:noProof/>
         </w:rPr>
         <w:drawing>
-          <wp:inline distT="0" distB="0" distL="0" distR="0" wp14:anchorId="145482F9" wp14:editId="093141AF">
+          <wp:inline distT="0" distB="0" distL="0" distR="0" wp14:anchorId="11E007CF" wp14:editId="5A985488">
             <wp:extent cx="2468880" cy="1804956"/>
             <wp:effectExtent l="0" t="0" r="0" b="0"/>
             <wp:docPr id="18" name="Picture 18"/>
@@ -11746,7 +11786,7 @@
           <w:noProof/>
         </w:rPr>
         <w:drawing>
-          <wp:inline distT="0" distB="0" distL="0" distR="0" wp14:anchorId="41B18508" wp14:editId="52494F0F">
+          <wp:inline distT="0" distB="0" distL="0" distR="0" wp14:anchorId="20EFD86C" wp14:editId="2C4E7A1B">
             <wp:extent cx="5669280" cy="3847707"/>
             <wp:effectExtent l="0" t="0" r="0" b="0"/>
             <wp:docPr id="19" name="Picture 19"/>
@@ -12297,7 +12337,7 @@
       <w:pPr>
         <w:pStyle w:val="Heading3"/>
       </w:pPr>
-      <w:bookmarkStart w:id="19" w:name="_Toc240982732"/>
+      <w:bookmarkStart w:id="19" w:name="_Toc241185783"/>
       <w:r>
         <w:t>2.6.b · Bill of Materials (BOM) for Explosion-Safety-Relevant Components</w:t>
       </w:r>
@@ -23278,7 +23318,7 @@
       <w:pPr>
         <w:pStyle w:val="Heading3"/>
       </w:pPr>
-      <w:bookmarkStart w:id="20" w:name="_Toc240982733"/>
+      <w:bookmarkStart w:id="20" w:name="_Toc241185784"/>
       <w:r>
         <w:t>2.6.c · Material Specification Sheets / Datasheets (Non-Metallic Materials)</w:t>
       </w:r>
@@ -23344,7 +23384,7 @@
       <w:pPr>
         <w:pStyle w:val="Heading3"/>
       </w:pPr>
-      <w:bookmarkStart w:id="21" w:name="_Toc240982734"/>
+      <w:bookmarkStart w:id="21" w:name="_Toc241185785"/>
       <w:r>
         <w:t>2.6.d · Manufacturing Process Description</w:t>
       </w:r>
@@ -23403,7 +23443,7 @@
       <w:pPr>
         <w:pStyle w:val="Heading3"/>
       </w:pPr>
-      <w:bookmarkStart w:id="22" w:name="_Toc240982735"/>
+      <w:bookmarkStart w:id="22" w:name="_Toc241185786"/>
       <w:r>
         <w:lastRenderedPageBreak/>
         <w:t>2.6.e · Explosion-Protection Calculations and Explanations (if applicable)</w:t>
@@ -23463,7 +23503,7 @@
       <w:pPr>
         <w:pStyle w:val="Heading3"/>
       </w:pPr>
-      <w:bookmarkStart w:id="23" w:name="_Toc240982736"/>
+      <w:bookmarkStart w:id="23" w:name="_Toc241185787"/>
       <w:r>
         <w:t>2.6.f · Temperature Group Calculation (Hottest-Point Temperature Estimation)</w:t>
       </w:r>
@@ -23525,7 +23565,7 @@
       <w:pPr>
         <w:pStyle w:val="Heading3"/>
       </w:pPr>
-      <w:bookmarkStart w:id="24" w:name="_Toc240982737"/>
+      <w:bookmarkStart w:id="24" w:name="_Toc241185788"/>
       <w:r>
         <w:t>2.6.g · Usage and Installation Instructions (Draft)</w:t>
       </w:r>
@@ -24254,7 +24294,7 @@
       <w:pPr>
         <w:pStyle w:val="Heading3"/>
       </w:pPr>
-      <w:bookmarkStart w:id="25" w:name="_Toc240982738"/>
+      <w:bookmarkStart w:id="25" w:name="_Toc241185789"/>
       <w:r>
         <w:t>2.6.h · Nameplate Information</w:t>
       </w:r>
@@ -24314,7 +24354,7 @@
       <w:pPr>
         <w:pStyle w:val="Heading3"/>
       </w:pPr>
-      <w:bookmarkStart w:id="26" w:name="_Toc240982739"/>
+      <w:bookmarkStart w:id="26" w:name="_Toc241185790"/>
       <w:r>
         <w:t>2.6.i · Ex Component Certificates</w:t>
       </w:r>
@@ -24373,7 +24413,7 @@
       <w:pPr>
         <w:pStyle w:val="Heading1"/>
       </w:pPr>
-      <w:bookmarkStart w:id="27" w:name="_Toc240982740"/>
+      <w:bookmarkStart w:id="27" w:name="_Toc241185791"/>
       <w:r>
         <w:t>3. Sample Information</w:t>
       </w:r>
@@ -24388,7 +24428,7 @@
       <w:pPr>
         <w:pStyle w:val="Heading2"/>
       </w:pPr>
-      <w:bookmarkStart w:id="28" w:name="_Toc240982741"/>
+      <w:bookmarkStart w:id="28" w:name="_Toc241185792"/>
       <w:r>
         <w:t>3.1 · Model, Serial Number, and Status</w:t>
       </w:r>
@@ -24447,7 +24487,7 @@
       <w:pPr>
         <w:pStyle w:val="Heading2"/>
       </w:pPr>
-      <w:bookmarkStart w:id="29" w:name="_Toc240982742"/>
+      <w:bookmarkStart w:id="29" w:name="_Toc241185793"/>
       <w:r>
         <w:t>3.2 · Test Fixtures and Auxiliary Equipment</w:t>
       </w:r>
@@ -25246,7 +25286,7 @@
         <w:color w:val="4A4A4A"/>
         <w:sz w:val="16"/>
       </w:rPr>
-      <w:t>LGU/GLD/IECEX-TDF/2026-001  ·  Rev. 0.7</w:t>
+      <w:t>LGU/GLD/IECEX-TDF/2026-001  ·  Rev. 0.8</w:t>
     </w:r>
     <w:r>
       <w:tab/>
@@ -25516,31 +25556,31 @@
       </w:rPr>
     </w:lvl>
   </w:abstractNum>
-  <w:num w:numId="1" w16cid:durableId="311755450">
+  <w:num w:numId="1" w16cid:durableId="386998739">
     <w:abstractNumId w:val="8"/>
   </w:num>
-  <w:num w:numId="2" w16cid:durableId="1954903021">
+  <w:num w:numId="2" w16cid:durableId="89202868">
     <w:abstractNumId w:val="6"/>
   </w:num>
-  <w:num w:numId="3" w16cid:durableId="1483352862">
+  <w:num w:numId="3" w16cid:durableId="1373070846">
     <w:abstractNumId w:val="5"/>
   </w:num>
-  <w:num w:numId="4" w16cid:durableId="1452673597">
+  <w:num w:numId="4" w16cid:durableId="678502688">
     <w:abstractNumId w:val="4"/>
   </w:num>
-  <w:num w:numId="5" w16cid:durableId="956448171">
+  <w:num w:numId="5" w16cid:durableId="224419442">
     <w:abstractNumId w:val="7"/>
   </w:num>
-  <w:num w:numId="6" w16cid:durableId="1132096354">
+  <w:num w:numId="6" w16cid:durableId="763264620">
     <w:abstractNumId w:val="3"/>
   </w:num>
-  <w:num w:numId="7" w16cid:durableId="337852088">
+  <w:num w:numId="7" w16cid:durableId="986401113">
     <w:abstractNumId w:val="2"/>
   </w:num>
-  <w:num w:numId="8" w16cid:durableId="1654482463">
+  <w:num w:numId="8" w16cid:durableId="1200238980">
     <w:abstractNumId w:val="1"/>
   </w:num>
-  <w:num w:numId="9" w16cid:durableId="945649697">
+  <w:num w:numId="9" w16cid:durableId="858280279">
     <w:abstractNumId w:val="0"/>
   </w:num>
 </w:numbering>
@@ -36972,7 +37012,7 @@
     <w:autoRedefine/>
     <w:uiPriority w:val="39"/>
     <w:unhideWhenUsed/>
-    <w:rsid w:val="00F87A60"/>
+    <w:rsid w:val="0037796D"/>
     <w:pPr>
       <w:spacing w:after="100"/>
     </w:pPr>
@@ -36984,7 +37024,7 @@
     <w:autoRedefine/>
     <w:uiPriority w:val="39"/>
     <w:unhideWhenUsed/>
-    <w:rsid w:val="00F87A60"/>
+    <w:rsid w:val="0037796D"/>
     <w:pPr>
       <w:spacing w:after="100"/>
       <w:ind w:left="210"/>
@@ -36997,7 +37037,7 @@
     <w:autoRedefine/>
     <w:uiPriority w:val="39"/>
     <w:unhideWhenUsed/>
-    <w:rsid w:val="00F87A60"/>
+    <w:rsid w:val="0037796D"/>
     <w:pPr>
       <w:spacing w:after="100"/>
       <w:ind w:left="420"/>
@@ -37008,7 +37048,7 @@
     <w:basedOn w:val="DefaultParagraphFont"/>
     <w:uiPriority w:val="99"/>
     <w:unhideWhenUsed/>
-    <w:rsid w:val="00F87A60"/>
+    <w:rsid w:val="0037796D"/>
     <w:rPr>
       <w:color w:val="0000FF" w:themeColor="hyperlink"/>
       <w:u w:val="single"/>

</xml_diff>

<commit_message>
Perkaya butir 2.6.c (datasheet material non-logam) dengan persyaratan standar
Tambahkan kutipan persyaratan IEC 60079-0 yang relevan (kelas CTI,
glow-wire, Tg vs rentang operasi terkini, ketahanan UV) dan daftar
komponen non-logam yang sudah teridentifikasi di desain GLD (mesh
sensor, gasket, seal cable gland, insulator antena). Status butir ini
tetap "Not yet available" karena genuinely belum ada datasheet dari
mitra casing -- bukan diisi angka tebakan.

Co-Authored-By: Claude Sonnet 5 <noreply@anthropic.com>
</commit_message>
<xml_diff>
--- a/Deliverables/Dokumen_Teknis_Sertifikasi_GLD_IECEx_ATEX.docx
+++ b/Deliverables/Dokumen_Teknis_Sertifikasi_GLD_IECEx_ATEX.docx
@@ -226,7 +226,7 @@
               <w:rPr>
                 <w:sz w:val="20"/>
               </w:rPr>
-              <w:t>0.8</w:t>
+              <w:t>0.9</w:t>
             </w:r>
           </w:p>
         </w:tc>
@@ -263,7 +263,7 @@
               <w:rPr>
                 <w:sz w:val="20"/>
               </w:rPr>
-              <w:t>24 September 2026</w:t>
+              <w:t>25 September 2026</w:t>
             </w:r>
           </w:p>
         </w:tc>
@@ -1026,6 +1026,56 @@
                 <w:sz w:val="19"/>
               </w:rPr>
               <w:t>Total weight, operating temperature, and operating humidity (Sections 2.3.c, 2.5) updated to 2.378 kg, −20°C to +60°C, and 5–95% RH respectively, per current project specification data.</w:t>
+            </w:r>
+          </w:p>
+        </w:tc>
+      </w:tr>
+      <w:tr>
+        <w:tc>
+          <w:tcPr>
+            <w:tcW w:w="1296" w:type="dxa"/>
+          </w:tcPr>
+          <w:p>
+            <w:pPr>
+              <w:spacing w:after="40"/>
+            </w:pPr>
+            <w:r>
+              <w:rPr>
+                <w:sz w:val="19"/>
+              </w:rPr>
+              <w:t>0.9</w:t>
+            </w:r>
+          </w:p>
+        </w:tc>
+        <w:tc>
+          <w:tcPr>
+            <w:tcW w:w="1872" w:type="dxa"/>
+          </w:tcPr>
+          <w:p>
+            <w:pPr>
+              <w:spacing w:after="40"/>
+            </w:pPr>
+            <w:r>
+              <w:rPr>
+                <w:sz w:val="19"/>
+              </w:rPr>
+              <w:t>25 September 2026</w:t>
+            </w:r>
+          </w:p>
+        </w:tc>
+        <w:tc>
+          <w:tcPr>
+            <w:tcW w:w="6192" w:type="dxa"/>
+          </w:tcPr>
+          <w:p>
+            <w:pPr>
+              <w:spacing w:after="40"/>
+            </w:pPr>
+            <w:r>
+              <w:rPr>
+                <w:sz w:val="19"/>
+              </w:rPr>
+              <w:t>Section 2.6.c (material specification sheets, non-metallic materials) expanded with the specific IEC 60079-0 requirements (CTI class, glow-wire/flame-retardancy, Tg vs. the confirmed operating range, UV/weathering resistance) and a list of the non-metallic components in GLD's own design that this item will need to cover (sensor mesh/flame-arrestor cover, cover-to-body sealing gasket, cable-gland seal, antenna feedthrough insulator); status remains Not yet available pending the casing partner's data.</w:t>
             </w:r>
           </w:p>
         </w:tc>
@@ -1069,7 +1119,7 @@
       <w:r>
         <w:fldChar w:fldCharType="separate"/>
       </w:r>
-      <w:hyperlink w:anchor="_Toc241185764" w:history="1">
+      <w:hyperlink w:anchor="_Toc241217577" w:history="1">
         <w:r>
           <w:rPr>
             <w:rStyle w:val="Hyperlink"/>
@@ -1096,7 +1146,7 @@
             <w:noProof/>
             <w:webHidden/>
           </w:rPr>
-          <w:instrText xml:space="preserve"> PAGEREF _Toc241185764 \h </w:instrText>
+          <w:instrText xml:space="preserve"> PAGEREF _Toc241217577 \h </w:instrText>
         </w:r>
         <w:r>
           <w:rPr>
@@ -1137,7 +1187,7 @@
           <w:noProof/>
         </w:rPr>
       </w:pPr>
-      <w:hyperlink w:anchor="_Toc241185765" w:history="1">
+      <w:hyperlink w:anchor="_Toc241217578" w:history="1">
         <w:r>
           <w:rPr>
             <w:rStyle w:val="Hyperlink"/>
@@ -1164,7 +1214,7 @@
             <w:noProof/>
             <w:webHidden/>
           </w:rPr>
-          <w:instrText xml:space="preserve"> PAGEREF _Toc241185765 \h </w:instrText>
+          <w:instrText xml:space="preserve"> PAGEREF _Toc241217578 \h </w:instrText>
         </w:r>
         <w:r>
           <w:rPr>
@@ -1205,7 +1255,7 @@
           <w:noProof/>
         </w:rPr>
       </w:pPr>
-      <w:hyperlink w:anchor="_Toc241185766" w:history="1">
+      <w:hyperlink w:anchor="_Toc241217579" w:history="1">
         <w:r>
           <w:rPr>
             <w:rStyle w:val="Hyperlink"/>
@@ -1232,7 +1282,7 @@
             <w:noProof/>
             <w:webHidden/>
           </w:rPr>
-          <w:instrText xml:space="preserve"> PAGEREF _Toc241185766 \h </w:instrText>
+          <w:instrText xml:space="preserve"> PAGEREF _Toc241217579 \h </w:instrText>
         </w:r>
         <w:r>
           <w:rPr>
@@ -1273,7 +1323,7 @@
           <w:noProof/>
         </w:rPr>
       </w:pPr>
-      <w:hyperlink w:anchor="_Toc241185767" w:history="1">
+      <w:hyperlink w:anchor="_Toc241217580" w:history="1">
         <w:r>
           <w:rPr>
             <w:rStyle w:val="Hyperlink"/>
@@ -1300,7 +1350,7 @@
             <w:noProof/>
             <w:webHidden/>
           </w:rPr>
-          <w:instrText xml:space="preserve"> PAGEREF _Toc241185767 \h </w:instrText>
+          <w:instrText xml:space="preserve"> PAGEREF _Toc241217580 \h </w:instrText>
         </w:r>
         <w:r>
           <w:rPr>
@@ -1341,7 +1391,7 @@
           <w:noProof/>
         </w:rPr>
       </w:pPr>
-      <w:hyperlink w:anchor="_Toc241185768" w:history="1">
+      <w:hyperlink w:anchor="_Toc241217581" w:history="1">
         <w:r>
           <w:rPr>
             <w:rStyle w:val="Hyperlink"/>
@@ -1368,7 +1418,7 @@
             <w:noProof/>
             <w:webHidden/>
           </w:rPr>
-          <w:instrText xml:space="preserve"> PAGEREF _Toc241185768 \h </w:instrText>
+          <w:instrText xml:space="preserve"> PAGEREF _Toc241217581 \h </w:instrText>
         </w:r>
         <w:r>
           <w:rPr>
@@ -1409,7 +1459,7 @@
           <w:noProof/>
         </w:rPr>
       </w:pPr>
-      <w:hyperlink w:anchor="_Toc241185769" w:history="1">
+      <w:hyperlink w:anchor="_Toc241217582" w:history="1">
         <w:r>
           <w:rPr>
             <w:rStyle w:val="Hyperlink"/>
@@ -1436,7 +1486,7 @@
             <w:noProof/>
             <w:webHidden/>
           </w:rPr>
-          <w:instrText xml:space="preserve"> PAGEREF _Toc241185769 \h </w:instrText>
+          <w:instrText xml:space="preserve"> PAGEREF _Toc241217582 \h </w:instrText>
         </w:r>
         <w:r>
           <w:rPr>
@@ -1477,7 +1527,7 @@
           <w:noProof/>
         </w:rPr>
       </w:pPr>
-      <w:hyperlink w:anchor="_Toc241185770" w:history="1">
+      <w:hyperlink w:anchor="_Toc241217583" w:history="1">
         <w:r>
           <w:rPr>
             <w:rStyle w:val="Hyperlink"/>
@@ -1504,7 +1554,7 @@
             <w:noProof/>
             <w:webHidden/>
           </w:rPr>
-          <w:instrText xml:space="preserve"> PAGEREF _Toc241185770 \h </w:instrText>
+          <w:instrText xml:space="preserve"> PAGEREF _Toc241217583 \h </w:instrText>
         </w:r>
         <w:r>
           <w:rPr>
@@ -1545,7 +1595,7 @@
           <w:noProof/>
         </w:rPr>
       </w:pPr>
-      <w:hyperlink w:anchor="_Toc241185771" w:history="1">
+      <w:hyperlink w:anchor="_Toc241217584" w:history="1">
         <w:r>
           <w:rPr>
             <w:rStyle w:val="Hyperlink"/>
@@ -1572,7 +1622,7 @@
             <w:noProof/>
             <w:webHidden/>
           </w:rPr>
-          <w:instrText xml:space="preserve"> PAGEREF _Toc241185771 \h </w:instrText>
+          <w:instrText xml:space="preserve"> PAGEREF _Toc241217584 \h </w:instrText>
         </w:r>
         <w:r>
           <w:rPr>
@@ -1613,7 +1663,7 @@
           <w:noProof/>
         </w:rPr>
       </w:pPr>
-      <w:hyperlink w:anchor="_Toc241185772" w:history="1">
+      <w:hyperlink w:anchor="_Toc241217585" w:history="1">
         <w:r>
           <w:rPr>
             <w:rStyle w:val="Hyperlink"/>
@@ -1640,7 +1690,7 @@
             <w:noProof/>
             <w:webHidden/>
           </w:rPr>
-          <w:instrText xml:space="preserve"> PAGEREF _Toc241185772 \h </w:instrText>
+          <w:instrText xml:space="preserve"> PAGEREF _Toc241217585 \h </w:instrText>
         </w:r>
         <w:r>
           <w:rPr>
@@ -1681,7 +1731,7 @@
           <w:noProof/>
         </w:rPr>
       </w:pPr>
-      <w:hyperlink w:anchor="_Toc241185773" w:history="1">
+      <w:hyperlink w:anchor="_Toc241217586" w:history="1">
         <w:r>
           <w:rPr>
             <w:rStyle w:val="Hyperlink"/>
@@ -1708,7 +1758,7 @@
             <w:noProof/>
             <w:webHidden/>
           </w:rPr>
-          <w:instrText xml:space="preserve"> PAGEREF _Toc241185773 \h </w:instrText>
+          <w:instrText xml:space="preserve"> PAGEREF _Toc241217586 \h </w:instrText>
         </w:r>
         <w:r>
           <w:rPr>
@@ -1749,7 +1799,7 @@
           <w:noProof/>
         </w:rPr>
       </w:pPr>
-      <w:hyperlink w:anchor="_Toc241185774" w:history="1">
+      <w:hyperlink w:anchor="_Toc241217587" w:history="1">
         <w:r>
           <w:rPr>
             <w:rStyle w:val="Hyperlink"/>
@@ -1776,7 +1826,7 @@
             <w:noProof/>
             <w:webHidden/>
           </w:rPr>
-          <w:instrText xml:space="preserve"> PAGEREF _Toc241185774 \h </w:instrText>
+          <w:instrText xml:space="preserve"> PAGEREF _Toc241217587 \h </w:instrText>
         </w:r>
         <w:r>
           <w:rPr>
@@ -1817,7 +1867,7 @@
           <w:noProof/>
         </w:rPr>
       </w:pPr>
-      <w:hyperlink w:anchor="_Toc241185775" w:history="1">
+      <w:hyperlink w:anchor="_Toc241217588" w:history="1">
         <w:r>
           <w:rPr>
             <w:rStyle w:val="Hyperlink"/>
@@ -1844,7 +1894,7 @@
             <w:noProof/>
             <w:webHidden/>
           </w:rPr>
-          <w:instrText xml:space="preserve"> PAGEREF _Toc241185775 \h </w:instrText>
+          <w:instrText xml:space="preserve"> PAGEREF _Toc241217588 \h </w:instrText>
         </w:r>
         <w:r>
           <w:rPr>
@@ -1885,7 +1935,7 @@
           <w:noProof/>
         </w:rPr>
       </w:pPr>
-      <w:hyperlink w:anchor="_Toc241185776" w:history="1">
+      <w:hyperlink w:anchor="_Toc241217589" w:history="1">
         <w:r>
           <w:rPr>
             <w:rStyle w:val="Hyperlink"/>
@@ -1912,7 +1962,7 @@
             <w:noProof/>
             <w:webHidden/>
           </w:rPr>
-          <w:instrText xml:space="preserve"> PAGEREF _Toc241185776 \h </w:instrText>
+          <w:instrText xml:space="preserve"> PAGEREF _Toc241217589 \h </w:instrText>
         </w:r>
         <w:r>
           <w:rPr>
@@ -1953,7 +2003,7 @@
           <w:noProof/>
         </w:rPr>
       </w:pPr>
-      <w:hyperlink w:anchor="_Toc241185777" w:history="1">
+      <w:hyperlink w:anchor="_Toc241217590" w:history="1">
         <w:r>
           <w:rPr>
             <w:rStyle w:val="Hyperlink"/>
@@ -1980,7 +2030,7 @@
             <w:noProof/>
             <w:webHidden/>
           </w:rPr>
-          <w:instrText xml:space="preserve"> PAGEREF _Toc241185777 \h </w:instrText>
+          <w:instrText xml:space="preserve"> PAGEREF _Toc241217590 \h </w:instrText>
         </w:r>
         <w:r>
           <w:rPr>
@@ -2021,7 +2071,7 @@
           <w:noProof/>
         </w:rPr>
       </w:pPr>
-      <w:hyperlink w:anchor="_Toc241185778" w:history="1">
+      <w:hyperlink w:anchor="_Toc241217591" w:history="1">
         <w:r>
           <w:rPr>
             <w:rStyle w:val="Hyperlink"/>
@@ -2048,7 +2098,7 @@
             <w:noProof/>
             <w:webHidden/>
           </w:rPr>
-          <w:instrText xml:space="preserve"> PAGEREF _Toc241185778 \h </w:instrText>
+          <w:instrText xml:space="preserve"> PAGEREF _Toc241217591 \h </w:instrText>
         </w:r>
         <w:r>
           <w:rPr>
@@ -2089,7 +2139,7 @@
           <w:noProof/>
         </w:rPr>
       </w:pPr>
-      <w:hyperlink w:anchor="_Toc241185779" w:history="1">
+      <w:hyperlink w:anchor="_Toc241217592" w:history="1">
         <w:r>
           <w:rPr>
             <w:rStyle w:val="Hyperlink"/>
@@ -2116,7 +2166,7 @@
             <w:noProof/>
             <w:webHidden/>
           </w:rPr>
-          <w:instrText xml:space="preserve"> PAGEREF _Toc241185779 \h </w:instrText>
+          <w:instrText xml:space="preserve"> PAGEREF _Toc241217592 \h </w:instrText>
         </w:r>
         <w:r>
           <w:rPr>
@@ -2157,7 +2207,7 @@
           <w:noProof/>
         </w:rPr>
       </w:pPr>
-      <w:hyperlink w:anchor="_Toc241185780" w:history="1">
+      <w:hyperlink w:anchor="_Toc241217593" w:history="1">
         <w:r>
           <w:rPr>
             <w:rStyle w:val="Hyperlink"/>
@@ -2184,7 +2234,7 @@
             <w:noProof/>
             <w:webHidden/>
           </w:rPr>
-          <w:instrText xml:space="preserve"> PAGEREF _Toc241185780 \h </w:instrText>
+          <w:instrText xml:space="preserve"> PAGEREF _Toc241217593 \h </w:instrText>
         </w:r>
         <w:r>
           <w:rPr>
@@ -2225,7 +2275,7 @@
           <w:noProof/>
         </w:rPr>
       </w:pPr>
-      <w:hyperlink w:anchor="_Toc241185781" w:history="1">
+      <w:hyperlink w:anchor="_Toc241217594" w:history="1">
         <w:r>
           <w:rPr>
             <w:rStyle w:val="Hyperlink"/>
@@ -2252,7 +2302,7 @@
             <w:noProof/>
             <w:webHidden/>
           </w:rPr>
-          <w:instrText xml:space="preserve"> PAGEREF _Toc241185781 \h </w:instrText>
+          <w:instrText xml:space="preserve"> PAGEREF _Toc241217594 \h </w:instrText>
         </w:r>
         <w:r>
           <w:rPr>
@@ -2293,7 +2343,7 @@
           <w:noProof/>
         </w:rPr>
       </w:pPr>
-      <w:hyperlink w:anchor="_Toc241185782" w:history="1">
+      <w:hyperlink w:anchor="_Toc241217595" w:history="1">
         <w:r>
           <w:rPr>
             <w:rStyle w:val="Hyperlink"/>
@@ -2320,7 +2370,7 @@
             <w:noProof/>
             <w:webHidden/>
           </w:rPr>
-          <w:instrText xml:space="preserve"> PAGEREF _Toc241185782 \h </w:instrText>
+          <w:instrText xml:space="preserve"> PAGEREF _Toc241217595 \h </w:instrText>
         </w:r>
         <w:r>
           <w:rPr>
@@ -2361,7 +2411,7 @@
           <w:noProof/>
         </w:rPr>
       </w:pPr>
-      <w:hyperlink w:anchor="_Toc241185783" w:history="1">
+      <w:hyperlink w:anchor="_Toc241217596" w:history="1">
         <w:r>
           <w:rPr>
             <w:rStyle w:val="Hyperlink"/>
@@ -2388,7 +2438,7 @@
             <w:noProof/>
             <w:webHidden/>
           </w:rPr>
-          <w:instrText xml:space="preserve"> PAGEREF _Toc241185783 \h </w:instrText>
+          <w:instrText xml:space="preserve"> PAGEREF _Toc241217596 \h </w:instrText>
         </w:r>
         <w:r>
           <w:rPr>
@@ -2429,7 +2479,7 @@
           <w:noProof/>
         </w:rPr>
       </w:pPr>
-      <w:hyperlink w:anchor="_Toc241185784" w:history="1">
+      <w:hyperlink w:anchor="_Toc241217597" w:history="1">
         <w:r>
           <w:rPr>
             <w:rStyle w:val="Hyperlink"/>
@@ -2456,7 +2506,7 @@
             <w:noProof/>
             <w:webHidden/>
           </w:rPr>
-          <w:instrText xml:space="preserve"> PAGEREF _Toc241185784 \h </w:instrText>
+          <w:instrText xml:space="preserve"> PAGEREF _Toc241217597 \h </w:instrText>
         </w:r>
         <w:r>
           <w:rPr>
@@ -2497,7 +2547,7 @@
           <w:noProof/>
         </w:rPr>
       </w:pPr>
-      <w:hyperlink w:anchor="_Toc241185785" w:history="1">
+      <w:hyperlink w:anchor="_Toc241217598" w:history="1">
         <w:r>
           <w:rPr>
             <w:rStyle w:val="Hyperlink"/>
@@ -2524,75 +2574,7 @@
             <w:noProof/>
             <w:webHidden/>
           </w:rPr>
-          <w:instrText xml:space="preserve"> PAGEREF _Toc241185785 \h </w:instrText>
-        </w:r>
-        <w:r>
-          <w:rPr>
-            <w:noProof/>
-            <w:webHidden/>
-          </w:rPr>
-        </w:r>
-        <w:r>
-          <w:rPr>
-            <w:noProof/>
-            <w:webHidden/>
-          </w:rPr>
-          <w:fldChar w:fldCharType="separate"/>
-        </w:r>
-        <w:r>
-          <w:rPr>
-            <w:noProof/>
-            <w:webHidden/>
-          </w:rPr>
-          <w:t>30</w:t>
-        </w:r>
-        <w:r>
-          <w:rPr>
-            <w:noProof/>
-            <w:webHidden/>
-          </w:rPr>
-          <w:fldChar w:fldCharType="end"/>
-        </w:r>
-      </w:hyperlink>
-    </w:p>
-    <w:p>
-      <w:pPr>
-        <w:pStyle w:val="TOC3"/>
-        <w:tabs>
-          <w:tab w:val="right" w:leader="dot" w:pos="9736"/>
-        </w:tabs>
-        <w:rPr>
-          <w:noProof/>
-        </w:rPr>
-      </w:pPr>
-      <w:hyperlink w:anchor="_Toc241185786" w:history="1">
-        <w:r>
-          <w:rPr>
-            <w:rStyle w:val="Hyperlink"/>
-            <w:noProof/>
-          </w:rPr>
-          <w:t>2.6.e · Explosion-Protection Calculations and Explanations (if applicable)</w:t>
-        </w:r>
-        <w:r>
-          <w:rPr>
-            <w:noProof/>
-            <w:webHidden/>
-          </w:rPr>
-          <w:tab/>
-        </w:r>
-        <w:r>
-          <w:rPr>
-            <w:noProof/>
-            <w:webHidden/>
-          </w:rPr>
-          <w:fldChar w:fldCharType="begin"/>
-        </w:r>
-        <w:r>
-          <w:rPr>
-            <w:noProof/>
-            <w:webHidden/>
-          </w:rPr>
-          <w:instrText xml:space="preserve"> PAGEREF _Toc241185786 \h </w:instrText>
+          <w:instrText xml:space="preserve"> PAGEREF _Toc241217598 \h </w:instrText>
         </w:r>
         <w:r>
           <w:rPr>
@@ -2633,13 +2615,13 @@
           <w:noProof/>
         </w:rPr>
       </w:pPr>
-      <w:hyperlink w:anchor="_Toc241185787" w:history="1">
+      <w:hyperlink w:anchor="_Toc241217599" w:history="1">
         <w:r>
           <w:rPr>
             <w:rStyle w:val="Hyperlink"/>
             <w:noProof/>
           </w:rPr>
-          <w:t>2.6.f · Temperature Group Calculation (Hottest-Point Temperature Estimation)</w:t>
+          <w:t>2.6.e · Explosion-Protection Calculations and Explanations (if applicable)</w:t>
         </w:r>
         <w:r>
           <w:rPr>
@@ -2660,7 +2642,7 @@
             <w:noProof/>
             <w:webHidden/>
           </w:rPr>
-          <w:instrText xml:space="preserve"> PAGEREF _Toc241185787 \h </w:instrText>
+          <w:instrText xml:space="preserve"> PAGEREF _Toc241217599 \h </w:instrText>
         </w:r>
         <w:r>
           <w:rPr>
@@ -2701,13 +2683,13 @@
           <w:noProof/>
         </w:rPr>
       </w:pPr>
-      <w:hyperlink w:anchor="_Toc241185788" w:history="1">
+      <w:hyperlink w:anchor="_Toc241217600" w:history="1">
         <w:r>
           <w:rPr>
             <w:rStyle w:val="Hyperlink"/>
             <w:noProof/>
           </w:rPr>
-          <w:t>2.6.g · Usage and Installation Instructions (Draft)</w:t>
+          <w:t>2.6.f · Temperature Group Calculation (Hottest-Point Temperature Estimation)</w:t>
         </w:r>
         <w:r>
           <w:rPr>
@@ -2728,7 +2710,7 @@
             <w:noProof/>
             <w:webHidden/>
           </w:rPr>
-          <w:instrText xml:space="preserve"> PAGEREF _Toc241185788 \h </w:instrText>
+          <w:instrText xml:space="preserve"> PAGEREF _Toc241217600 \h </w:instrText>
         </w:r>
         <w:r>
           <w:rPr>
@@ -2769,7 +2751,75 @@
           <w:noProof/>
         </w:rPr>
       </w:pPr>
-      <w:hyperlink w:anchor="_Toc241185789" w:history="1">
+      <w:hyperlink w:anchor="_Toc241217601" w:history="1">
+        <w:r>
+          <w:rPr>
+            <w:rStyle w:val="Hyperlink"/>
+            <w:noProof/>
+          </w:rPr>
+          <w:t>2.6.g · Usage and Installation Instructions (Draft)</w:t>
+        </w:r>
+        <w:r>
+          <w:rPr>
+            <w:noProof/>
+            <w:webHidden/>
+          </w:rPr>
+          <w:tab/>
+        </w:r>
+        <w:r>
+          <w:rPr>
+            <w:noProof/>
+            <w:webHidden/>
+          </w:rPr>
+          <w:fldChar w:fldCharType="begin"/>
+        </w:r>
+        <w:r>
+          <w:rPr>
+            <w:noProof/>
+            <w:webHidden/>
+          </w:rPr>
+          <w:instrText xml:space="preserve"> PAGEREF _Toc241217601 \h </w:instrText>
+        </w:r>
+        <w:r>
+          <w:rPr>
+            <w:noProof/>
+            <w:webHidden/>
+          </w:rPr>
+        </w:r>
+        <w:r>
+          <w:rPr>
+            <w:noProof/>
+            <w:webHidden/>
+          </w:rPr>
+          <w:fldChar w:fldCharType="separate"/>
+        </w:r>
+        <w:r>
+          <w:rPr>
+            <w:noProof/>
+            <w:webHidden/>
+          </w:rPr>
+          <w:t>31</w:t>
+        </w:r>
+        <w:r>
+          <w:rPr>
+            <w:noProof/>
+            <w:webHidden/>
+          </w:rPr>
+          <w:fldChar w:fldCharType="end"/>
+        </w:r>
+      </w:hyperlink>
+    </w:p>
+    <w:p>
+      <w:pPr>
+        <w:pStyle w:val="TOC3"/>
+        <w:tabs>
+          <w:tab w:val="right" w:leader="dot" w:pos="9736"/>
+        </w:tabs>
+        <w:rPr>
+          <w:noProof/>
+        </w:rPr>
+      </w:pPr>
+      <w:hyperlink w:anchor="_Toc241217602" w:history="1">
         <w:r>
           <w:rPr>
             <w:rStyle w:val="Hyperlink"/>
@@ -2796,7 +2846,7 @@
             <w:noProof/>
             <w:webHidden/>
           </w:rPr>
-          <w:instrText xml:space="preserve"> PAGEREF _Toc241185789 \h </w:instrText>
+          <w:instrText xml:space="preserve"> PAGEREF _Toc241217602 \h </w:instrText>
         </w:r>
         <w:r>
           <w:rPr>
@@ -2816,7 +2866,7 @@
             <w:noProof/>
             <w:webHidden/>
           </w:rPr>
-          <w:t>32</w:t>
+          <w:t>33</w:t>
         </w:r>
         <w:r>
           <w:rPr>
@@ -2837,7 +2887,7 @@
           <w:noProof/>
         </w:rPr>
       </w:pPr>
-      <w:hyperlink w:anchor="_Toc241185790" w:history="1">
+      <w:hyperlink w:anchor="_Toc241217603" w:history="1">
         <w:r>
           <w:rPr>
             <w:rStyle w:val="Hyperlink"/>
@@ -2864,7 +2914,7 @@
             <w:noProof/>
             <w:webHidden/>
           </w:rPr>
-          <w:instrText xml:space="preserve"> PAGEREF _Toc241185790 \h </w:instrText>
+          <w:instrText xml:space="preserve"> PAGEREF _Toc241217603 \h </w:instrText>
         </w:r>
         <w:r>
           <w:rPr>
@@ -2905,7 +2955,7 @@
           <w:noProof/>
         </w:rPr>
       </w:pPr>
-      <w:hyperlink w:anchor="_Toc241185791" w:history="1">
+      <w:hyperlink w:anchor="_Toc241217604" w:history="1">
         <w:r>
           <w:rPr>
             <w:rStyle w:val="Hyperlink"/>
@@ -2932,7 +2982,7 @@
             <w:noProof/>
             <w:webHidden/>
           </w:rPr>
-          <w:instrText xml:space="preserve"> PAGEREF _Toc241185791 \h </w:instrText>
+          <w:instrText xml:space="preserve"> PAGEREF _Toc241217604 \h </w:instrText>
         </w:r>
         <w:r>
           <w:rPr>
@@ -2973,7 +3023,7 @@
           <w:noProof/>
         </w:rPr>
       </w:pPr>
-      <w:hyperlink w:anchor="_Toc241185792" w:history="1">
+      <w:hyperlink w:anchor="_Toc241217605" w:history="1">
         <w:r>
           <w:rPr>
             <w:rStyle w:val="Hyperlink"/>
@@ -3000,7 +3050,7 @@
             <w:noProof/>
             <w:webHidden/>
           </w:rPr>
-          <w:instrText xml:space="preserve"> PAGEREF _Toc241185792 \h </w:instrText>
+          <w:instrText xml:space="preserve"> PAGEREF _Toc241217605 \h </w:instrText>
         </w:r>
         <w:r>
           <w:rPr>
@@ -3041,7 +3091,7 @@
           <w:noProof/>
         </w:rPr>
       </w:pPr>
-      <w:hyperlink w:anchor="_Toc241185793" w:history="1">
+      <w:hyperlink w:anchor="_Toc241217606" w:history="1">
         <w:r>
           <w:rPr>
             <w:rStyle w:val="Hyperlink"/>
@@ -3068,7 +3118,7 @@
             <w:noProof/>
             <w:webHidden/>
           </w:rPr>
-          <w:instrText xml:space="preserve"> PAGEREF _Toc241185793 \h </w:instrText>
+          <w:instrText xml:space="preserve"> PAGEREF _Toc241217606 \h </w:instrText>
         </w:r>
         <w:r>
           <w:rPr>
@@ -3114,7 +3164,7 @@
       <w:pPr>
         <w:pStyle w:val="Heading1"/>
       </w:pPr>
-      <w:bookmarkStart w:id="0" w:name="_Toc241185764"/>
+      <w:bookmarkStart w:id="0" w:name="_Toc241217577"/>
       <w:r>
         <w:lastRenderedPageBreak/>
         <w:t>About This Document</w:t>
@@ -3217,7 +3267,7 @@
       <w:pPr>
         <w:pStyle w:val="Heading1"/>
       </w:pPr>
-      <w:bookmarkStart w:id="1" w:name="_Toc241185765"/>
+      <w:bookmarkStart w:id="1" w:name="_Toc241217578"/>
       <w:r>
         <w:t>1. Basic Information (Application and Organization)</w:t>
       </w:r>
@@ -3364,7 +3414,7 @@
       <w:pPr>
         <w:pStyle w:val="Heading2"/>
       </w:pPr>
-      <w:bookmarkStart w:id="2" w:name="_Toc241185766"/>
+      <w:bookmarkStart w:id="2" w:name="_Toc241217579"/>
       <w:r>
         <w:t>1.0 · Status Summary — Section 1</w:t>
       </w:r>
@@ -3741,7 +3791,7 @@
       <w:pPr>
         <w:pStyle w:val="Heading2"/>
       </w:pPr>
-      <w:bookmarkStart w:id="3" w:name="_Toc241185767"/>
+      <w:bookmarkStart w:id="3" w:name="_Toc241217580"/>
       <w:r>
         <w:t>1.1 · Application Form</w:t>
       </w:r>
@@ -4793,7 +4843,7 @@
       <w:pPr>
         <w:pStyle w:val="Heading2"/>
       </w:pPr>
-      <w:bookmarkStart w:id="4" w:name="_Toc241185768"/>
+      <w:bookmarkStart w:id="4" w:name="_Toc241217581"/>
       <w:r>
         <w:t>1.2 · Business License / Company Registration Certificate</w:t>
       </w:r>
@@ -5342,7 +5392,7 @@
       <w:pPr>
         <w:pStyle w:val="Heading2"/>
       </w:pPr>
-      <w:bookmarkStart w:id="5" w:name="_Toc241185769"/>
+      <w:bookmarkStart w:id="5" w:name="_Toc241217582"/>
       <w:r>
         <w:t>1.3 · Organizational Chart and Contact Information</w:t>
       </w:r>
@@ -5891,7 +5941,7 @@
       <w:pPr>
         <w:pStyle w:val="Heading2"/>
       </w:pPr>
-      <w:bookmarkStart w:id="6" w:name="_Toc241185770"/>
+      <w:bookmarkStart w:id="6" w:name="_Toc241217583"/>
       <w:r>
         <w:t>1.4 · Manufacturing Plant Address and Introduction of Production Facilities</w:t>
       </w:r>
@@ -6403,7 +6453,7 @@
       <w:pPr>
         <w:pStyle w:val="Heading2"/>
       </w:pPr>
-      <w:bookmarkStart w:id="7" w:name="_Toc241185771"/>
+      <w:bookmarkStart w:id="7" w:name="_Toc241217584"/>
       <w:r>
         <w:t>1.5 · ISO 9001 Certificate, Quality Manual, and Procedure Index</w:t>
       </w:r>
@@ -6826,7 +6876,7 @@
       <w:pPr>
         <w:pStyle w:val="Heading1"/>
       </w:pPr>
-      <w:bookmarkStart w:id="8" w:name="_Toc241185772"/>
+      <w:bookmarkStart w:id="8" w:name="_Toc241217585"/>
       <w:r>
         <w:t>2. Technical Documentation</w:t>
       </w:r>
@@ -6841,7 +6891,7 @@
       <w:pPr>
         <w:pStyle w:val="Heading2"/>
       </w:pPr>
-      <w:bookmarkStart w:id="9" w:name="_Toc241185773"/>
+      <w:bookmarkStart w:id="9" w:name="_Toc241217586"/>
       <w:r>
         <w:t>2.1 · Detailed Product Description</w:t>
       </w:r>
@@ -6874,7 +6924,7 @@
       <w:pPr>
         <w:pStyle w:val="Heading2"/>
       </w:pPr>
-      <w:bookmarkStart w:id="10" w:name="_Toc241185774"/>
+      <w:bookmarkStart w:id="10" w:name="_Toc241217587"/>
       <w:r>
         <w:t>2.2 · Product Name, Model, and Specification List</w:t>
       </w:r>
@@ -7318,7 +7368,7 @@
       <w:pPr>
         <w:pStyle w:val="Heading2"/>
       </w:pPr>
-      <w:bookmarkStart w:id="11" w:name="_Toc241185775"/>
+      <w:bookmarkStart w:id="11" w:name="_Toc241217588"/>
       <w:r>
         <w:t>2.3 · Functional Description and Technical Parameters (Electrical, Mechanical, etc.)</w:t>
       </w:r>
@@ -7336,7 +7386,7 @@
       <w:pPr>
         <w:pStyle w:val="Heading3"/>
       </w:pPr>
-      <w:bookmarkStart w:id="12" w:name="_Toc241185776"/>
+      <w:bookmarkStart w:id="12" w:name="_Toc241217589"/>
       <w:r>
         <w:t>2.3.a · Electrical Parameters — Node Sensor (GLD)</w:t>
       </w:r>
@@ -7960,7 +8010,7 @@
       <w:pPr>
         <w:pStyle w:val="Heading3"/>
       </w:pPr>
-      <w:bookmarkStart w:id="13" w:name="_Toc241185777"/>
+      <w:bookmarkStart w:id="13" w:name="_Toc241217590"/>
       <w:r>
         <w:t>2.3.b · Sensor and Communication Parameters — Node Sensor (GLD)</w:t>
       </w:r>
@@ -9022,7 +9072,7 @@
       <w:pPr>
         <w:pStyle w:val="Heading3"/>
       </w:pPr>
-      <w:bookmarkStart w:id="14" w:name="_Toc241185778"/>
+      <w:bookmarkStart w:id="14" w:name="_Toc241217591"/>
       <w:r>
         <w:t>2.3.c · Mechanical Parameters — Node Sensor (GLD)</w:t>
       </w:r>
@@ -9873,7 +9923,7 @@
       <w:pPr>
         <w:pStyle w:val="Heading2"/>
       </w:pPr>
-      <w:bookmarkStart w:id="15" w:name="_Toc241185779"/>
+      <w:bookmarkStart w:id="15" w:name="_Toc241217592"/>
       <w:r>
         <w:t>2.4 · Product Photographs — Overall and Key Components</w:t>
       </w:r>
@@ -9912,7 +9962,7 @@
                 <w:noProof/>
               </w:rPr>
               <w:drawing>
-                <wp:inline distT="0" distB="0" distL="0" distR="0" wp14:anchorId="7B280349" wp14:editId="4913058C">
+                <wp:inline distT="0" distB="0" distL="0" distR="0" wp14:anchorId="7997AD4A" wp14:editId="4ADFF6AE">
                   <wp:extent cx="1379912" cy="2286000"/>
                   <wp:effectExtent l="0" t="0" r="0" b="0"/>
                   <wp:docPr id="1" name="Picture 1"/>
@@ -9989,7 +10039,7 @@
                 <w:noProof/>
               </w:rPr>
               <w:drawing>
-                <wp:inline distT="0" distB="0" distL="0" distR="0" wp14:anchorId="79C8B9C7" wp14:editId="248BF30B">
+                <wp:inline distT="0" distB="0" distL="0" distR="0" wp14:anchorId="0D07425D" wp14:editId="6A899265">
                   <wp:extent cx="1714500" cy="2286000"/>
                   <wp:effectExtent l="0" t="0" r="0" b="0"/>
                   <wp:docPr id="2" name="Picture 2"/>
@@ -10071,7 +10121,7 @@
                 <w:noProof/>
               </w:rPr>
               <w:drawing>
-                <wp:inline distT="0" distB="0" distL="0" distR="0" wp14:anchorId="27F7A844" wp14:editId="62FF062D">
+                <wp:inline distT="0" distB="0" distL="0" distR="0" wp14:anchorId="3AC217C4" wp14:editId="43168355">
                   <wp:extent cx="1026621" cy="2286000"/>
                   <wp:effectExtent l="0" t="0" r="0" b="0"/>
                   <wp:docPr id="3" name="Picture 3"/>
@@ -10148,7 +10198,7 @@
                 <w:noProof/>
               </w:rPr>
               <w:drawing>
-                <wp:inline distT="0" distB="0" distL="0" distR="0" wp14:anchorId="6C9CE581" wp14:editId="5A1D7B0D">
+                <wp:inline distT="0" distB="0" distL="0" distR="0" wp14:anchorId="51B93882" wp14:editId="49B9AAE4">
                   <wp:extent cx="1026621" cy="2286000"/>
                   <wp:effectExtent l="0" t="0" r="0" b="0"/>
                   <wp:docPr id="4" name="Picture 4"/>
@@ -10231,7 +10281,7 @@
               </w:rPr>
               <w:lastRenderedPageBreak/>
               <w:drawing>
-                <wp:inline distT="0" distB="0" distL="0" distR="0" wp14:anchorId="38067EDC" wp14:editId="6C3D8F4B">
+                <wp:inline distT="0" distB="0" distL="0" distR="0" wp14:anchorId="72DDDA98" wp14:editId="4417FD64">
                   <wp:extent cx="1026621" cy="2286000"/>
                   <wp:effectExtent l="0" t="0" r="0" b="0"/>
                   <wp:docPr id="5" name="Picture 5"/>
@@ -10308,7 +10358,7 @@
                 <w:noProof/>
               </w:rPr>
               <w:drawing>
-                <wp:inline distT="0" distB="0" distL="0" distR="0" wp14:anchorId="10AF1421" wp14:editId="27A3EE69">
+                <wp:inline distT="0" distB="0" distL="0" distR="0" wp14:anchorId="6760CF0D" wp14:editId="07F40AE1">
                   <wp:extent cx="1026621" cy="2286000"/>
                   <wp:effectExtent l="0" t="0" r="0" b="0"/>
                   <wp:docPr id="6" name="Picture 6"/>
@@ -10390,7 +10440,7 @@
                 <w:noProof/>
               </w:rPr>
               <w:drawing>
-                <wp:inline distT="0" distB="0" distL="0" distR="0" wp14:anchorId="56FE035E" wp14:editId="69D40317">
+                <wp:inline distT="0" distB="0" distL="0" distR="0" wp14:anchorId="38521575" wp14:editId="400DFA6D">
                   <wp:extent cx="1026621" cy="2286000"/>
                   <wp:effectExtent l="0" t="0" r="0" b="0"/>
                   <wp:docPr id="7" name="Picture 7"/>
@@ -10514,7 +10564,7 @@
       <w:pPr>
         <w:pStyle w:val="Heading2"/>
       </w:pPr>
-      <w:bookmarkStart w:id="16" w:name="_Toc241185780"/>
+      <w:bookmarkStart w:id="16" w:name="_Toc241217593"/>
       <w:r>
         <w:t>2.5 · Description of Intended Use and Installation Environment (Gas Group, Temperature Class, Area Classification)</w:t>
       </w:r>
@@ -10977,7 +11027,7 @@
       <w:pPr>
         <w:pStyle w:val="Heading2"/>
       </w:pPr>
-      <w:bookmarkStart w:id="17" w:name="_Toc241185781"/>
+      <w:bookmarkStart w:id="17" w:name="_Toc241217594"/>
       <w:r>
         <w:t>2.6 · Design and Manufacturing Information</w:t>
       </w:r>
@@ -10992,7 +11042,7 @@
       <w:pPr>
         <w:pStyle w:val="Heading3"/>
       </w:pPr>
-      <w:bookmarkStart w:id="18" w:name="_Toc241185782"/>
+      <w:bookmarkStart w:id="18" w:name="_Toc241217595"/>
       <w:r>
         <w:lastRenderedPageBreak/>
         <w:t>2.6.a · Complete Drawings (Assembly, Component, Electrical Schematic, PCB Layout, Enclosure Structure, Junction Box, Terminal, Grounding)</w:t>
@@ -11013,7 +11063,7 @@
           <w:noProof/>
         </w:rPr>
         <w:drawing>
-          <wp:inline distT="0" distB="0" distL="0" distR="0" wp14:anchorId="05877050" wp14:editId="37EC5034">
+          <wp:inline distT="0" distB="0" distL="0" distR="0" wp14:anchorId="734D0807" wp14:editId="6D39EBFA">
             <wp:extent cx="5120640" cy="3413760"/>
             <wp:effectExtent l="0" t="0" r="0" b="0"/>
             <wp:docPr id="8" name="Picture 8"/>
@@ -11086,7 +11136,7 @@
         </w:rPr>
         <w:lastRenderedPageBreak/>
         <w:drawing>
-          <wp:inline distT="0" distB="0" distL="0" distR="0" wp14:anchorId="7FCDBBFE" wp14:editId="12B20F10">
+          <wp:inline distT="0" distB="0" distL="0" distR="0" wp14:anchorId="621EC456" wp14:editId="515F1472">
             <wp:extent cx="5120640" cy="3413760"/>
             <wp:effectExtent l="0" t="0" r="0" b="0"/>
             <wp:docPr id="9" name="Picture 9"/>
@@ -11158,7 +11208,7 @@
           <w:noProof/>
         </w:rPr>
         <w:drawing>
-          <wp:inline distT="0" distB="0" distL="0" distR="0" wp14:anchorId="53F8A22B" wp14:editId="04721ECC">
+          <wp:inline distT="0" distB="0" distL="0" distR="0" wp14:anchorId="47A04742" wp14:editId="6ADA93C1">
             <wp:extent cx="5120640" cy="3413760"/>
             <wp:effectExtent l="0" t="0" r="0" b="0"/>
             <wp:docPr id="10" name="Picture 10"/>
@@ -11231,7 +11281,7 @@
         </w:rPr>
         <w:lastRenderedPageBreak/>
         <w:drawing>
-          <wp:inline distT="0" distB="0" distL="0" distR="0" wp14:anchorId="29141D0D" wp14:editId="03AB4442">
+          <wp:inline distT="0" distB="0" distL="0" distR="0" wp14:anchorId="5E6338B7" wp14:editId="1F83AA03">
             <wp:extent cx="5120640" cy="3413760"/>
             <wp:effectExtent l="0" t="0" r="0" b="0"/>
             <wp:docPr id="11" name="Picture 11"/>
@@ -11303,7 +11353,7 @@
           <w:noProof/>
         </w:rPr>
         <w:drawing>
-          <wp:inline distT="0" distB="0" distL="0" distR="0" wp14:anchorId="5C6644DB" wp14:editId="5A6C7E31">
+          <wp:inline distT="0" distB="0" distL="0" distR="0" wp14:anchorId="191DED4A" wp14:editId="2C24EC34">
             <wp:extent cx="5120640" cy="3413760"/>
             <wp:effectExtent l="0" t="0" r="0" b="0"/>
             <wp:docPr id="12" name="Picture 12"/>
@@ -11376,7 +11426,7 @@
         </w:rPr>
         <w:lastRenderedPageBreak/>
         <w:drawing>
-          <wp:inline distT="0" distB="0" distL="0" distR="0" wp14:anchorId="0F320894" wp14:editId="0D7FC307">
+          <wp:inline distT="0" distB="0" distL="0" distR="0" wp14:anchorId="1F8642D6" wp14:editId="7CBECB34">
             <wp:extent cx="5120640" cy="3413760"/>
             <wp:effectExtent l="0" t="0" r="0" b="0"/>
             <wp:docPr id="13" name="Picture 13"/>
@@ -11448,7 +11498,7 @@
           <w:noProof/>
         </w:rPr>
         <w:drawing>
-          <wp:inline distT="0" distB="0" distL="0" distR="0" wp14:anchorId="79698BED" wp14:editId="6129FFA0">
+          <wp:inline distT="0" distB="0" distL="0" distR="0" wp14:anchorId="3E868453" wp14:editId="498F3680">
             <wp:extent cx="5120640" cy="3413760"/>
             <wp:effectExtent l="0" t="0" r="0" b="0"/>
             <wp:docPr id="14" name="Picture 14"/>
@@ -11521,7 +11571,7 @@
         </w:rPr>
         <w:lastRenderedPageBreak/>
         <w:drawing>
-          <wp:inline distT="0" distB="0" distL="0" distR="0" wp14:anchorId="23409922" wp14:editId="003F786F">
+          <wp:inline distT="0" distB="0" distL="0" distR="0" wp14:anchorId="162A97E1" wp14:editId="7B11623C">
             <wp:extent cx="5120640" cy="3413760"/>
             <wp:effectExtent l="0" t="0" r="0" b="0"/>
             <wp:docPr id="15" name="Picture 15"/>
@@ -11593,7 +11643,7 @@
           <w:noProof/>
         </w:rPr>
         <w:drawing>
-          <wp:inline distT="0" distB="0" distL="0" distR="0" wp14:anchorId="1DFBEDF4" wp14:editId="64E462E3">
+          <wp:inline distT="0" distB="0" distL="0" distR="0" wp14:anchorId="64F28D48" wp14:editId="4822FC2A">
             <wp:extent cx="5120640" cy="3413760"/>
             <wp:effectExtent l="0" t="0" r="0" b="0"/>
             <wp:docPr id="16" name="Picture 16"/>
@@ -11666,7 +11716,7 @@
         </w:rPr>
         <w:lastRenderedPageBreak/>
         <w:drawing>
-          <wp:inline distT="0" distB="0" distL="0" distR="0" wp14:anchorId="28B27E00" wp14:editId="6298902D">
+          <wp:inline distT="0" distB="0" distL="0" distR="0" wp14:anchorId="0130BE83" wp14:editId="4609669B">
             <wp:extent cx="2468880" cy="2479268"/>
             <wp:effectExtent l="0" t="0" r="0" b="0"/>
             <wp:docPr id="17" name="Picture 17"/>
@@ -11709,7 +11759,7 @@
           <w:noProof/>
         </w:rPr>
         <w:drawing>
-          <wp:inline distT="0" distB="0" distL="0" distR="0" wp14:anchorId="11E007CF" wp14:editId="5A985488">
+          <wp:inline distT="0" distB="0" distL="0" distR="0" wp14:anchorId="71B218EE" wp14:editId="587358D9">
             <wp:extent cx="2468880" cy="1804956"/>
             <wp:effectExtent l="0" t="0" r="0" b="0"/>
             <wp:docPr id="18" name="Picture 18"/>
@@ -11786,7 +11836,7 @@
           <w:noProof/>
         </w:rPr>
         <w:drawing>
-          <wp:inline distT="0" distB="0" distL="0" distR="0" wp14:anchorId="20EFD86C" wp14:editId="2C4E7A1B">
+          <wp:inline distT="0" distB="0" distL="0" distR="0" wp14:anchorId="5C24565F" wp14:editId="791256AC">
             <wp:extent cx="5669280" cy="3847707"/>
             <wp:effectExtent l="0" t="0" r="0" b="0"/>
             <wp:docPr id="19" name="Picture 19"/>
@@ -12337,7 +12387,7 @@
       <w:pPr>
         <w:pStyle w:val="Heading3"/>
       </w:pPr>
-      <w:bookmarkStart w:id="19" w:name="_Toc241185783"/>
+      <w:bookmarkStart w:id="19" w:name="_Toc241217596"/>
       <w:r>
         <w:t>2.6.b · Bill of Materials (BOM) for Explosion-Safety-Relevant Components</w:t>
       </w:r>
@@ -23318,7 +23368,7 @@
       <w:pPr>
         <w:pStyle w:val="Heading3"/>
       </w:pPr>
-      <w:bookmarkStart w:id="20" w:name="_Toc241185784"/>
+      <w:bookmarkStart w:id="20" w:name="_Toc241217597"/>
       <w:r>
         <w:t>2.6.c · Material Specification Sheets / Datasheets (Non-Metallic Materials)</w:t>
       </w:r>
@@ -23327,6 +23377,22 @@
     <w:p>
       <w:r>
         <w:t>Datasheets or supplier conformity declarations for non-metallic materials (enclosure components, seals, insulators, potting compounds) — covering heat/cold resistance, anti-aging, anti-static, flame retardancy, CTI value, and chemical resistance — have not yet been collected.</w:t>
+      </w:r>
+    </w:p>
+    <w:p>
+      <w:r>
+        <w:t>Per IEC 60079-0:2017, once GLD's specific non-metallic components are identified the applicable requirements are: a Comparative Tracking Index (CTI) class per Table 5/6 appropriate to the equipment's creepage/clearance design; a glow-wire or needle-flame flame-retardancy result per §26.4–26.5; a glass-transition temperature (Tg) safely outside the confirmed −20°C to +60°C ambient operating range (Section 2.3.c); and UV/weathering-resistance data for any component exposed outdoors. These thresholds are cited</w:t>
+      </w:r>
+      <w:r>
+        <w:t xml:space="preserve"> from the standard itself and have not yet been matched against actual component datasheets.</w:t>
+      </w:r>
+    </w:p>
+    <w:p>
+      <w:r>
+        <w:t>Non-metallic components identified in the design so far that this item will need to cover: the protective mesh/flame-arrestor cover over the gas-sensing element (Section 2.6.a — material not yet confirmed; may prove to be metallic, which would place it outside this specific checklist item); the cover-to-body sealing gasket/O-ring providing the IP66 rating (Section 2.3.c — material/grade not yet specified); the integral seal of the candidate M20×1.5 cable gland (Section 2.3.c); and the antenna/SMA feedthroug</w:t>
+      </w:r>
+      <w:r>
+        <w:t>h insulator (material not yet specified).</w:t>
       </w:r>
     </w:p>
     <w:tbl>
@@ -23362,14 +23428,14 @@
                 <w:color w:val="4A4A4A"/>
                 <w:sz w:val="20"/>
               </w:rPr>
-              <w:t xml:space="preserve">Status: Not yet available. Dependent on the enclosure design and material selection, which sits with the external casing development partner (PT Galaksi Megatama Indonesia, Section 1.4) rather than the authors. Partial candidate data: the BP18-1Z reference drawing (Section 2.6.a) specifies a powder-coating surface treatment with two electrostatic-safety parameters directly relevant to this checklist item — maximum surface charge transfer &lt;10 nC and maximum surface capacitance &lt;5 pF (coating thickness ≤ 0.2 </w:t>
+              <w:t>Status: Not yet available. Dependent on the enclosure design and material selection, which sits with the external casing development partner (PT Galaksi Megatama Indonesia, Section 1.4) rather than the authors; this data has been formally requested from that partner. Partial candidate data: the BP18-1Z reference drawing (Section 2.6.a) specifies a powder-coating surface treatment with two electrostatic-safety parameters directly relevant to this checklist item — maximum surface charge transfer &lt;10 nC and ma</w:t>
             </w:r>
             <w:r>
               <w:rPr>
                 <w:color w:val="4A4A4A"/>
                 <w:sz w:val="20"/>
               </w:rPr>
-              <w:t>mm). These are the type of parameter IEC 60079-0 requires for coated/non-metallic surfaces on Ex equipment, but they describe a supplier's candidate component, not a confirmed datasheet for GLD's own enclosure finish.</w:t>
+              <w:t>ximum surface capacitance &lt;5 pF (coating thickness ≤ 0.2 mm). These are the type of parameter IEC 60079-0 requires for coated/non-metallic surfaces on Ex equipment, but they describe a supplier's candidate component, not a confirmed datasheet for GLD's own enclosure finish.</w:t>
             </w:r>
           </w:p>
         </w:tc>
@@ -23384,8 +23450,9 @@
       <w:pPr>
         <w:pStyle w:val="Heading3"/>
       </w:pPr>
-      <w:bookmarkStart w:id="21" w:name="_Toc241185785"/>
+      <w:bookmarkStart w:id="21" w:name="_Toc241217598"/>
       <w:r>
+        <w:lastRenderedPageBreak/>
         <w:t>2.6.d · Manufacturing Process Description</w:t>
       </w:r>
       <w:bookmarkEnd w:id="21"/>
@@ -23443,9 +23510,8 @@
       <w:pPr>
         <w:pStyle w:val="Heading3"/>
       </w:pPr>
-      <w:bookmarkStart w:id="22" w:name="_Toc241185786"/>
+      <w:bookmarkStart w:id="22" w:name="_Toc241217599"/>
       <w:r>
-        <w:lastRenderedPageBreak/>
         <w:t>2.6.e · Explosion-Protection Calculations and Explanations (if applicable)</w:t>
       </w:r>
       <w:bookmarkEnd w:id="22"/>
@@ -23503,7 +23569,7 @@
       <w:pPr>
         <w:pStyle w:val="Heading3"/>
       </w:pPr>
-      <w:bookmarkStart w:id="23" w:name="_Toc241185787"/>
+      <w:bookmarkStart w:id="23" w:name="_Toc241217600"/>
       <w:r>
         <w:t>2.6.f · Temperature Group Calculation (Hottest-Point Temperature Estimation)</w:t>
       </w:r>
@@ -23565,7 +23631,7 @@
       <w:pPr>
         <w:pStyle w:val="Heading3"/>
       </w:pPr>
-      <w:bookmarkStart w:id="24" w:name="_Toc241185788"/>
+      <w:bookmarkStart w:id="24" w:name="_Toc241217601"/>
       <w:r>
         <w:t>2.6.g · Usage and Installation Instructions (Draft)</w:t>
       </w:r>
@@ -23857,6 +23923,7 @@
                 <w:color w:val="4A4A4A"/>
                 <w:sz w:val="20"/>
               </w:rPr>
+              <w:lastRenderedPageBreak/>
               <w:t>Status: Draft text available (source: internal working draft, Rev. 18 Sep 2026). This is a draft for review, not a finalized, Ex-approved installation and operation manual. It has not been checked against a selected type of protection (Ex d/e/i, Section 2.6.e), a confirmed temperature class (Section 2.6.f), or finalized cable-entry/enclosure hardware. It also feeds the standalone Instruction_Manual_GLD deliverable.</w:t>
             </w:r>
           </w:p>
@@ -23913,7 +23980,6 @@
         <w:rPr>
           <w:sz w:val="20"/>
         </w:rPr>
-        <w:lastRenderedPageBreak/>
         <w:t>Use only the approved production power arrangement: 24 VDC.</w:t>
       </w:r>
     </w:p>
@@ -24192,6 +24258,7 @@
                 <w:b/>
                 <w:sz w:val="19"/>
               </w:rPr>
+              <w:lastRenderedPageBreak/>
               <w:t>Dataset</w:t>
             </w:r>
           </w:p>
@@ -24294,7 +24361,7 @@
       <w:pPr>
         <w:pStyle w:val="Heading3"/>
       </w:pPr>
-      <w:bookmarkStart w:id="25" w:name="_Toc241185789"/>
+      <w:bookmarkStart w:id="25" w:name="_Toc241217602"/>
       <w:r>
         <w:t>2.6.h · Nameplate Information</w:t>
       </w:r>
@@ -24338,7 +24405,6 @@
                 <w:color w:val="4A4A4A"/>
                 <w:sz w:val="20"/>
               </w:rPr>
-              <w:lastRenderedPageBreak/>
               <w:t>Status: Not yet available.</w:t>
             </w:r>
           </w:p>
@@ -24354,7 +24420,7 @@
       <w:pPr>
         <w:pStyle w:val="Heading3"/>
       </w:pPr>
-      <w:bookmarkStart w:id="26" w:name="_Toc241185790"/>
+      <w:bookmarkStart w:id="26" w:name="_Toc241217603"/>
       <w:r>
         <w:t>2.6.i · Ex Component Certificates</w:t>
       </w:r>
@@ -24413,7 +24479,7 @@
       <w:pPr>
         <w:pStyle w:val="Heading1"/>
       </w:pPr>
-      <w:bookmarkStart w:id="27" w:name="_Toc241185791"/>
+      <w:bookmarkStart w:id="27" w:name="_Toc241217604"/>
       <w:r>
         <w:t>3. Sample Information</w:t>
       </w:r>
@@ -24428,7 +24494,7 @@
       <w:pPr>
         <w:pStyle w:val="Heading2"/>
       </w:pPr>
-      <w:bookmarkStart w:id="28" w:name="_Toc241185792"/>
+      <w:bookmarkStart w:id="28" w:name="_Toc241217605"/>
       <w:r>
         <w:t>3.1 · Model, Serial Number, and Status</w:t>
       </w:r>
@@ -24487,7 +24553,7 @@
       <w:pPr>
         <w:pStyle w:val="Heading2"/>
       </w:pPr>
-      <w:bookmarkStart w:id="29" w:name="_Toc241185793"/>
+      <w:bookmarkStart w:id="29" w:name="_Toc241217606"/>
       <w:r>
         <w:t>3.2 · Test Fixtures and Auxiliary Equipment</w:t>
       </w:r>
@@ -24572,6 +24638,7 @@
                 <w:b/>
                 <w:sz w:val="19"/>
               </w:rPr>
+              <w:lastRenderedPageBreak/>
               <w:t>Firmware / serial</w:t>
             </w:r>
           </w:p>
@@ -25286,7 +25353,7 @@
         <w:color w:val="4A4A4A"/>
         <w:sz w:val="16"/>
       </w:rPr>
-      <w:t>LGU/GLD/IECEX-TDF/2026-001  ·  Rev. 0.8</w:t>
+      <w:t>LGU/GLD/IECEX-TDF/2026-001  ·  Rev. 0.9</w:t>
     </w:r>
     <w:r>
       <w:tab/>
@@ -25556,31 +25623,31 @@
       </w:rPr>
     </w:lvl>
   </w:abstractNum>
-  <w:num w:numId="1" w16cid:durableId="386998739">
+  <w:num w:numId="1" w16cid:durableId="276571518">
     <w:abstractNumId w:val="8"/>
   </w:num>
-  <w:num w:numId="2" w16cid:durableId="89202868">
+  <w:num w:numId="2" w16cid:durableId="1123767490">
     <w:abstractNumId w:val="6"/>
   </w:num>
-  <w:num w:numId="3" w16cid:durableId="1373070846">
+  <w:num w:numId="3" w16cid:durableId="1287001733">
     <w:abstractNumId w:val="5"/>
   </w:num>
-  <w:num w:numId="4" w16cid:durableId="678502688">
+  <w:num w:numId="4" w16cid:durableId="1951617579">
     <w:abstractNumId w:val="4"/>
   </w:num>
-  <w:num w:numId="5" w16cid:durableId="224419442">
+  <w:num w:numId="5" w16cid:durableId="1678380437">
     <w:abstractNumId w:val="7"/>
   </w:num>
-  <w:num w:numId="6" w16cid:durableId="763264620">
+  <w:num w:numId="6" w16cid:durableId="1354304879">
     <w:abstractNumId w:val="3"/>
   </w:num>
-  <w:num w:numId="7" w16cid:durableId="986401113">
+  <w:num w:numId="7" w16cid:durableId="1779829076">
     <w:abstractNumId w:val="2"/>
   </w:num>
-  <w:num w:numId="8" w16cid:durableId="1200238980">
+  <w:num w:numId="8" w16cid:durableId="65081521">
     <w:abstractNumId w:val="1"/>
   </w:num>
-  <w:num w:numId="9" w16cid:durableId="858280279">
+  <w:num w:numId="9" w16cid:durableId="1760980807">
     <w:abstractNumId w:val="0"/>
   </w:num>
 </w:numbering>
@@ -37012,7 +37079,7 @@
     <w:autoRedefine/>
     <w:uiPriority w:val="39"/>
     <w:unhideWhenUsed/>
-    <w:rsid w:val="0037796D"/>
+    <w:rsid w:val="00A76A2B"/>
     <w:pPr>
       <w:spacing w:after="100"/>
     </w:pPr>
@@ -37024,7 +37091,7 @@
     <w:autoRedefine/>
     <w:uiPriority w:val="39"/>
     <w:unhideWhenUsed/>
-    <w:rsid w:val="0037796D"/>
+    <w:rsid w:val="00A76A2B"/>
     <w:pPr>
       <w:spacing w:after="100"/>
       <w:ind w:left="210"/>
@@ -37037,7 +37104,7 @@
     <w:autoRedefine/>
     <w:uiPriority w:val="39"/>
     <w:unhideWhenUsed/>
-    <w:rsid w:val="0037796D"/>
+    <w:rsid w:val="00A76A2B"/>
     <w:pPr>
       <w:spacing w:after="100"/>
       <w:ind w:left="420"/>
@@ -37048,7 +37115,7 @@
     <w:basedOn w:val="DefaultParagraphFont"/>
     <w:uiPriority w:val="99"/>
     <w:unhideWhenUsed/>
-    <w:rsid w:val="0037796D"/>
+    <w:rsid w:val="00A76A2B"/>
     <w:rPr>
       <w:color w:val="0000FF" w:themeColor="hyperlink"/>
       <w:u w:val="single"/>

</xml_diff>

<commit_message>
Konfirmasi material mesh/gasket dari draf tim; update draft form GTS
Pelajari versi draf tim yang lebih lengkap (Rev24092026.pdf, dengan
gambar exploded-view/assembly nyata): mesh pelindung sensor
dikonfirmasi stainless steel, gasket cover-body dikonfirmasi rubber
gasket. Diterapkan ke Dokumen_Teknis_Sertifikasi 2.6.c.

Update Marking Code di draf form GTS dengan draf tim "II 2G Ex
[db/ib] IIC T4 Gb", dengan catatan eksplisit menolak nilai Tamb
-40/+85C dan klasifikasi debu "D" yang ditemukan salin-tempel keliru
dari marking produk referensi (bertentangan dengan tabel Mechanical
Parameters di dokumen tim sendiri) -- tidak dipropagasi ke dokumen
manapun.

Co-Authored-By: Claude Sonnet 5 <noreply@anthropic.com>
</commit_message>
<xml_diff>
--- a/Deliverables/Dokumen_Teknis_Sertifikasi_GLD_IECEx_ATEX.docx
+++ b/Deliverables/Dokumen_Teknis_Sertifikasi_GLD_IECEx_ATEX.docx
@@ -226,7 +226,7 @@
               <w:rPr>
                 <w:sz w:val="20"/>
               </w:rPr>
-              <w:t>0.9</w:t>
+              <w:t>1.0</w:t>
             </w:r>
           </w:p>
         </w:tc>
@@ -1076,6 +1076,56 @@
                 <w:sz w:val="19"/>
               </w:rPr>
               <w:t>Section 2.6.c (material specification sheets, non-metallic materials) expanded with the specific IEC 60079-0 requirements (CTI class, glow-wire/flame-retardancy, Tg vs. the confirmed operating range, UV/weathering resistance) and a list of the non-metallic components in GLD's own design that this item will need to cover (sensor mesh/flame-arrestor cover, cover-to-body sealing gasket, cable-gland seal, antenna feedthrough insulator); status remains Not yet available pending the casing partner's data.</w:t>
+            </w:r>
+          </w:p>
+        </w:tc>
+      </w:tr>
+      <w:tr>
+        <w:tc>
+          <w:tcPr>
+            <w:tcW w:w="1296" w:type="dxa"/>
+          </w:tcPr>
+          <w:p>
+            <w:pPr>
+              <w:spacing w:after="40"/>
+            </w:pPr>
+            <w:r>
+              <w:rPr>
+                <w:sz w:val="19"/>
+              </w:rPr>
+              <w:t>1.0</w:t>
+            </w:r>
+          </w:p>
+        </w:tc>
+        <w:tc>
+          <w:tcPr>
+            <w:tcW w:w="1872" w:type="dxa"/>
+          </w:tcPr>
+          <w:p>
+            <w:pPr>
+              <w:spacing w:after="40"/>
+            </w:pPr>
+            <w:r>
+              <w:rPr>
+                <w:sz w:val="19"/>
+              </w:rPr>
+              <w:t>25 September 2026</w:t>
+            </w:r>
+          </w:p>
+        </w:tc>
+        <w:tc>
+          <w:tcPr>
+            <w:tcW w:w="6192" w:type="dxa"/>
+          </w:tcPr>
+          <w:p>
+            <w:pPr>
+              <w:spacing w:after="40"/>
+            </w:pPr>
+            <w:r>
+              <w:rPr>
+                <w:sz w:val="19"/>
+              </w:rPr>
+              <w:t>Section 2.6.c updated with materials confirmed from a newer casing-partner assembly drawing: the protective mesh cover is stainless steel (metallic, outside the scope of this non-metallic-materials item) and the cover-to-body seal is a rubber gasket (compound/grade still not specified).</w:t>
             </w:r>
           </w:p>
         </w:tc>
@@ -1119,7 +1169,7 @@
       <w:r>
         <w:fldChar w:fldCharType="separate"/>
       </w:r>
-      <w:hyperlink w:anchor="_Toc241217577" w:history="1">
+      <w:hyperlink w:anchor="_Toc241219133" w:history="1">
         <w:r>
           <w:rPr>
             <w:rStyle w:val="Hyperlink"/>
@@ -1146,7 +1196,7 @@
             <w:noProof/>
             <w:webHidden/>
           </w:rPr>
-          <w:instrText xml:space="preserve"> PAGEREF _Toc241217577 \h </w:instrText>
+          <w:instrText xml:space="preserve"> PAGEREF _Toc241219133 \h </w:instrText>
         </w:r>
         <w:r>
           <w:rPr>
@@ -1187,7 +1237,7 @@
           <w:noProof/>
         </w:rPr>
       </w:pPr>
-      <w:hyperlink w:anchor="_Toc241217578" w:history="1">
+      <w:hyperlink w:anchor="_Toc241219134" w:history="1">
         <w:r>
           <w:rPr>
             <w:rStyle w:val="Hyperlink"/>
@@ -1214,7 +1264,7 @@
             <w:noProof/>
             <w:webHidden/>
           </w:rPr>
-          <w:instrText xml:space="preserve"> PAGEREF _Toc241217578 \h </w:instrText>
+          <w:instrText xml:space="preserve"> PAGEREF _Toc241219134 \h </w:instrText>
         </w:r>
         <w:r>
           <w:rPr>
@@ -1255,7 +1305,7 @@
           <w:noProof/>
         </w:rPr>
       </w:pPr>
-      <w:hyperlink w:anchor="_Toc241217579" w:history="1">
+      <w:hyperlink w:anchor="_Toc241219135" w:history="1">
         <w:r>
           <w:rPr>
             <w:rStyle w:val="Hyperlink"/>
@@ -1282,7 +1332,7 @@
             <w:noProof/>
             <w:webHidden/>
           </w:rPr>
-          <w:instrText xml:space="preserve"> PAGEREF _Toc241217579 \h </w:instrText>
+          <w:instrText xml:space="preserve"> PAGEREF _Toc241219135 \h </w:instrText>
         </w:r>
         <w:r>
           <w:rPr>
@@ -1323,7 +1373,7 @@
           <w:noProof/>
         </w:rPr>
       </w:pPr>
-      <w:hyperlink w:anchor="_Toc241217580" w:history="1">
+      <w:hyperlink w:anchor="_Toc241219136" w:history="1">
         <w:r>
           <w:rPr>
             <w:rStyle w:val="Hyperlink"/>
@@ -1350,7 +1400,7 @@
             <w:noProof/>
             <w:webHidden/>
           </w:rPr>
-          <w:instrText xml:space="preserve"> PAGEREF _Toc241217580 \h </w:instrText>
+          <w:instrText xml:space="preserve"> PAGEREF _Toc241219136 \h </w:instrText>
         </w:r>
         <w:r>
           <w:rPr>
@@ -1391,7 +1441,7 @@
           <w:noProof/>
         </w:rPr>
       </w:pPr>
-      <w:hyperlink w:anchor="_Toc241217581" w:history="1">
+      <w:hyperlink w:anchor="_Toc241219137" w:history="1">
         <w:r>
           <w:rPr>
             <w:rStyle w:val="Hyperlink"/>
@@ -1418,7 +1468,7 @@
             <w:noProof/>
             <w:webHidden/>
           </w:rPr>
-          <w:instrText xml:space="preserve"> PAGEREF _Toc241217581 \h </w:instrText>
+          <w:instrText xml:space="preserve"> PAGEREF _Toc241219137 \h </w:instrText>
         </w:r>
         <w:r>
           <w:rPr>
@@ -1459,7 +1509,7 @@
           <w:noProof/>
         </w:rPr>
       </w:pPr>
-      <w:hyperlink w:anchor="_Toc241217582" w:history="1">
+      <w:hyperlink w:anchor="_Toc241219138" w:history="1">
         <w:r>
           <w:rPr>
             <w:rStyle w:val="Hyperlink"/>
@@ -1486,7 +1536,7 @@
             <w:noProof/>
             <w:webHidden/>
           </w:rPr>
-          <w:instrText xml:space="preserve"> PAGEREF _Toc241217582 \h </w:instrText>
+          <w:instrText xml:space="preserve"> PAGEREF _Toc241219138 \h </w:instrText>
         </w:r>
         <w:r>
           <w:rPr>
@@ -1527,7 +1577,7 @@
           <w:noProof/>
         </w:rPr>
       </w:pPr>
-      <w:hyperlink w:anchor="_Toc241217583" w:history="1">
+      <w:hyperlink w:anchor="_Toc241219139" w:history="1">
         <w:r>
           <w:rPr>
             <w:rStyle w:val="Hyperlink"/>
@@ -1554,7 +1604,7 @@
             <w:noProof/>
             <w:webHidden/>
           </w:rPr>
-          <w:instrText xml:space="preserve"> PAGEREF _Toc241217583 \h </w:instrText>
+          <w:instrText xml:space="preserve"> PAGEREF _Toc241219139 \h </w:instrText>
         </w:r>
         <w:r>
           <w:rPr>
@@ -1595,7 +1645,7 @@
           <w:noProof/>
         </w:rPr>
       </w:pPr>
-      <w:hyperlink w:anchor="_Toc241217584" w:history="1">
+      <w:hyperlink w:anchor="_Toc241219140" w:history="1">
         <w:r>
           <w:rPr>
             <w:rStyle w:val="Hyperlink"/>
@@ -1622,7 +1672,7 @@
             <w:noProof/>
             <w:webHidden/>
           </w:rPr>
-          <w:instrText xml:space="preserve"> PAGEREF _Toc241217584 \h </w:instrText>
+          <w:instrText xml:space="preserve"> PAGEREF _Toc241219140 \h </w:instrText>
         </w:r>
         <w:r>
           <w:rPr>
@@ -1663,7 +1713,7 @@
           <w:noProof/>
         </w:rPr>
       </w:pPr>
-      <w:hyperlink w:anchor="_Toc241217585" w:history="1">
+      <w:hyperlink w:anchor="_Toc241219141" w:history="1">
         <w:r>
           <w:rPr>
             <w:rStyle w:val="Hyperlink"/>
@@ -1690,7 +1740,7 @@
             <w:noProof/>
             <w:webHidden/>
           </w:rPr>
-          <w:instrText xml:space="preserve"> PAGEREF _Toc241217585 \h </w:instrText>
+          <w:instrText xml:space="preserve"> PAGEREF _Toc241219141 \h </w:instrText>
         </w:r>
         <w:r>
           <w:rPr>
@@ -1731,7 +1781,7 @@
           <w:noProof/>
         </w:rPr>
       </w:pPr>
-      <w:hyperlink w:anchor="_Toc241217586" w:history="1">
+      <w:hyperlink w:anchor="_Toc241219142" w:history="1">
         <w:r>
           <w:rPr>
             <w:rStyle w:val="Hyperlink"/>
@@ -1758,7 +1808,7 @@
             <w:noProof/>
             <w:webHidden/>
           </w:rPr>
-          <w:instrText xml:space="preserve"> PAGEREF _Toc241217586 \h </w:instrText>
+          <w:instrText xml:space="preserve"> PAGEREF _Toc241219142 \h </w:instrText>
         </w:r>
         <w:r>
           <w:rPr>
@@ -1799,7 +1849,7 @@
           <w:noProof/>
         </w:rPr>
       </w:pPr>
-      <w:hyperlink w:anchor="_Toc241217587" w:history="1">
+      <w:hyperlink w:anchor="_Toc241219143" w:history="1">
         <w:r>
           <w:rPr>
             <w:rStyle w:val="Hyperlink"/>
@@ -1826,7 +1876,7 @@
             <w:noProof/>
             <w:webHidden/>
           </w:rPr>
-          <w:instrText xml:space="preserve"> PAGEREF _Toc241217587 \h </w:instrText>
+          <w:instrText xml:space="preserve"> PAGEREF _Toc241219143 \h </w:instrText>
         </w:r>
         <w:r>
           <w:rPr>
@@ -1867,7 +1917,7 @@
           <w:noProof/>
         </w:rPr>
       </w:pPr>
-      <w:hyperlink w:anchor="_Toc241217588" w:history="1">
+      <w:hyperlink w:anchor="_Toc241219144" w:history="1">
         <w:r>
           <w:rPr>
             <w:rStyle w:val="Hyperlink"/>
@@ -1894,7 +1944,7 @@
             <w:noProof/>
             <w:webHidden/>
           </w:rPr>
-          <w:instrText xml:space="preserve"> PAGEREF _Toc241217588 \h </w:instrText>
+          <w:instrText xml:space="preserve"> PAGEREF _Toc241219144 \h </w:instrText>
         </w:r>
         <w:r>
           <w:rPr>
@@ -1935,7 +1985,7 @@
           <w:noProof/>
         </w:rPr>
       </w:pPr>
-      <w:hyperlink w:anchor="_Toc241217589" w:history="1">
+      <w:hyperlink w:anchor="_Toc241219145" w:history="1">
         <w:r>
           <w:rPr>
             <w:rStyle w:val="Hyperlink"/>
@@ -1962,7 +2012,7 @@
             <w:noProof/>
             <w:webHidden/>
           </w:rPr>
-          <w:instrText xml:space="preserve"> PAGEREF _Toc241217589 \h </w:instrText>
+          <w:instrText xml:space="preserve"> PAGEREF _Toc241219145 \h </w:instrText>
         </w:r>
         <w:r>
           <w:rPr>
@@ -2003,7 +2053,7 @@
           <w:noProof/>
         </w:rPr>
       </w:pPr>
-      <w:hyperlink w:anchor="_Toc241217590" w:history="1">
+      <w:hyperlink w:anchor="_Toc241219146" w:history="1">
         <w:r>
           <w:rPr>
             <w:rStyle w:val="Hyperlink"/>
@@ -2030,7 +2080,7 @@
             <w:noProof/>
             <w:webHidden/>
           </w:rPr>
-          <w:instrText xml:space="preserve"> PAGEREF _Toc241217590 \h </w:instrText>
+          <w:instrText xml:space="preserve"> PAGEREF _Toc241219146 \h </w:instrText>
         </w:r>
         <w:r>
           <w:rPr>
@@ -2071,7 +2121,7 @@
           <w:noProof/>
         </w:rPr>
       </w:pPr>
-      <w:hyperlink w:anchor="_Toc241217591" w:history="1">
+      <w:hyperlink w:anchor="_Toc241219147" w:history="1">
         <w:r>
           <w:rPr>
             <w:rStyle w:val="Hyperlink"/>
@@ -2098,7 +2148,7 @@
             <w:noProof/>
             <w:webHidden/>
           </w:rPr>
-          <w:instrText xml:space="preserve"> PAGEREF _Toc241217591 \h </w:instrText>
+          <w:instrText xml:space="preserve"> PAGEREF _Toc241219147 \h </w:instrText>
         </w:r>
         <w:r>
           <w:rPr>
@@ -2139,7 +2189,7 @@
           <w:noProof/>
         </w:rPr>
       </w:pPr>
-      <w:hyperlink w:anchor="_Toc241217592" w:history="1">
+      <w:hyperlink w:anchor="_Toc241219148" w:history="1">
         <w:r>
           <w:rPr>
             <w:rStyle w:val="Hyperlink"/>
@@ -2166,7 +2216,7 @@
             <w:noProof/>
             <w:webHidden/>
           </w:rPr>
-          <w:instrText xml:space="preserve"> PAGEREF _Toc241217592 \h </w:instrText>
+          <w:instrText xml:space="preserve"> PAGEREF _Toc241219148 \h </w:instrText>
         </w:r>
         <w:r>
           <w:rPr>
@@ -2207,7 +2257,7 @@
           <w:noProof/>
         </w:rPr>
       </w:pPr>
-      <w:hyperlink w:anchor="_Toc241217593" w:history="1">
+      <w:hyperlink w:anchor="_Toc241219149" w:history="1">
         <w:r>
           <w:rPr>
             <w:rStyle w:val="Hyperlink"/>
@@ -2234,7 +2284,7 @@
             <w:noProof/>
             <w:webHidden/>
           </w:rPr>
-          <w:instrText xml:space="preserve"> PAGEREF _Toc241217593 \h </w:instrText>
+          <w:instrText xml:space="preserve"> PAGEREF _Toc241219149 \h </w:instrText>
         </w:r>
         <w:r>
           <w:rPr>
@@ -2275,7 +2325,7 @@
           <w:noProof/>
         </w:rPr>
       </w:pPr>
-      <w:hyperlink w:anchor="_Toc241217594" w:history="1">
+      <w:hyperlink w:anchor="_Toc241219150" w:history="1">
         <w:r>
           <w:rPr>
             <w:rStyle w:val="Hyperlink"/>
@@ -2302,7 +2352,7 @@
             <w:noProof/>
             <w:webHidden/>
           </w:rPr>
-          <w:instrText xml:space="preserve"> PAGEREF _Toc241217594 \h </w:instrText>
+          <w:instrText xml:space="preserve"> PAGEREF _Toc241219150 \h </w:instrText>
         </w:r>
         <w:r>
           <w:rPr>
@@ -2343,7 +2393,7 @@
           <w:noProof/>
         </w:rPr>
       </w:pPr>
-      <w:hyperlink w:anchor="_Toc241217595" w:history="1">
+      <w:hyperlink w:anchor="_Toc241219151" w:history="1">
         <w:r>
           <w:rPr>
             <w:rStyle w:val="Hyperlink"/>
@@ -2370,7 +2420,7 @@
             <w:noProof/>
             <w:webHidden/>
           </w:rPr>
-          <w:instrText xml:space="preserve"> PAGEREF _Toc241217595 \h </w:instrText>
+          <w:instrText xml:space="preserve"> PAGEREF _Toc241219151 \h </w:instrText>
         </w:r>
         <w:r>
           <w:rPr>
@@ -2411,7 +2461,7 @@
           <w:noProof/>
         </w:rPr>
       </w:pPr>
-      <w:hyperlink w:anchor="_Toc241217596" w:history="1">
+      <w:hyperlink w:anchor="_Toc241219152" w:history="1">
         <w:r>
           <w:rPr>
             <w:rStyle w:val="Hyperlink"/>
@@ -2438,7 +2488,7 @@
             <w:noProof/>
             <w:webHidden/>
           </w:rPr>
-          <w:instrText xml:space="preserve"> PAGEREF _Toc241217596 \h </w:instrText>
+          <w:instrText xml:space="preserve"> PAGEREF _Toc241219152 \h </w:instrText>
         </w:r>
         <w:r>
           <w:rPr>
@@ -2479,7 +2529,7 @@
           <w:noProof/>
         </w:rPr>
       </w:pPr>
-      <w:hyperlink w:anchor="_Toc241217597" w:history="1">
+      <w:hyperlink w:anchor="_Toc241219153" w:history="1">
         <w:r>
           <w:rPr>
             <w:rStyle w:val="Hyperlink"/>
@@ -2506,7 +2556,7 @@
             <w:noProof/>
             <w:webHidden/>
           </w:rPr>
-          <w:instrText xml:space="preserve"> PAGEREF _Toc241217597 \h </w:instrText>
+          <w:instrText xml:space="preserve"> PAGEREF _Toc241219153 \h </w:instrText>
         </w:r>
         <w:r>
           <w:rPr>
@@ -2547,7 +2597,7 @@
           <w:noProof/>
         </w:rPr>
       </w:pPr>
-      <w:hyperlink w:anchor="_Toc241217598" w:history="1">
+      <w:hyperlink w:anchor="_Toc241219154" w:history="1">
         <w:r>
           <w:rPr>
             <w:rStyle w:val="Hyperlink"/>
@@ -2574,7 +2624,7 @@
             <w:noProof/>
             <w:webHidden/>
           </w:rPr>
-          <w:instrText xml:space="preserve"> PAGEREF _Toc241217598 \h </w:instrText>
+          <w:instrText xml:space="preserve"> PAGEREF _Toc241219154 \h </w:instrText>
         </w:r>
         <w:r>
           <w:rPr>
@@ -2615,7 +2665,7 @@
           <w:noProof/>
         </w:rPr>
       </w:pPr>
-      <w:hyperlink w:anchor="_Toc241217599" w:history="1">
+      <w:hyperlink w:anchor="_Toc241219155" w:history="1">
         <w:r>
           <w:rPr>
             <w:rStyle w:val="Hyperlink"/>
@@ -2642,7 +2692,7 @@
             <w:noProof/>
             <w:webHidden/>
           </w:rPr>
-          <w:instrText xml:space="preserve"> PAGEREF _Toc241217599 \h </w:instrText>
+          <w:instrText xml:space="preserve"> PAGEREF _Toc241219155 \h </w:instrText>
         </w:r>
         <w:r>
           <w:rPr>
@@ -2683,7 +2733,7 @@
           <w:noProof/>
         </w:rPr>
       </w:pPr>
-      <w:hyperlink w:anchor="_Toc241217600" w:history="1">
+      <w:hyperlink w:anchor="_Toc241219156" w:history="1">
         <w:r>
           <w:rPr>
             <w:rStyle w:val="Hyperlink"/>
@@ -2710,7 +2760,7 @@
             <w:noProof/>
             <w:webHidden/>
           </w:rPr>
-          <w:instrText xml:space="preserve"> PAGEREF _Toc241217600 \h </w:instrText>
+          <w:instrText xml:space="preserve"> PAGEREF _Toc241219156 \h </w:instrText>
         </w:r>
         <w:r>
           <w:rPr>
@@ -2751,7 +2801,7 @@
           <w:noProof/>
         </w:rPr>
       </w:pPr>
-      <w:hyperlink w:anchor="_Toc241217601" w:history="1">
+      <w:hyperlink w:anchor="_Toc241219157" w:history="1">
         <w:r>
           <w:rPr>
             <w:rStyle w:val="Hyperlink"/>
@@ -2778,7 +2828,7 @@
             <w:noProof/>
             <w:webHidden/>
           </w:rPr>
-          <w:instrText xml:space="preserve"> PAGEREF _Toc241217601 \h </w:instrText>
+          <w:instrText xml:space="preserve"> PAGEREF _Toc241219157 \h </w:instrText>
         </w:r>
         <w:r>
           <w:rPr>
@@ -2819,7 +2869,7 @@
           <w:noProof/>
         </w:rPr>
       </w:pPr>
-      <w:hyperlink w:anchor="_Toc241217602" w:history="1">
+      <w:hyperlink w:anchor="_Toc241219158" w:history="1">
         <w:r>
           <w:rPr>
             <w:rStyle w:val="Hyperlink"/>
@@ -2846,7 +2896,7 @@
             <w:noProof/>
             <w:webHidden/>
           </w:rPr>
-          <w:instrText xml:space="preserve"> PAGEREF _Toc241217602 \h </w:instrText>
+          <w:instrText xml:space="preserve"> PAGEREF _Toc241219158 \h </w:instrText>
         </w:r>
         <w:r>
           <w:rPr>
@@ -2887,7 +2937,7 @@
           <w:noProof/>
         </w:rPr>
       </w:pPr>
-      <w:hyperlink w:anchor="_Toc241217603" w:history="1">
+      <w:hyperlink w:anchor="_Toc241219159" w:history="1">
         <w:r>
           <w:rPr>
             <w:rStyle w:val="Hyperlink"/>
@@ -2914,7 +2964,7 @@
             <w:noProof/>
             <w:webHidden/>
           </w:rPr>
-          <w:instrText xml:space="preserve"> PAGEREF _Toc241217603 \h </w:instrText>
+          <w:instrText xml:space="preserve"> PAGEREF _Toc241219159 \h </w:instrText>
         </w:r>
         <w:r>
           <w:rPr>
@@ -2955,7 +3005,7 @@
           <w:noProof/>
         </w:rPr>
       </w:pPr>
-      <w:hyperlink w:anchor="_Toc241217604" w:history="1">
+      <w:hyperlink w:anchor="_Toc241219160" w:history="1">
         <w:r>
           <w:rPr>
             <w:rStyle w:val="Hyperlink"/>
@@ -2982,7 +3032,7 @@
             <w:noProof/>
             <w:webHidden/>
           </w:rPr>
-          <w:instrText xml:space="preserve"> PAGEREF _Toc241217604 \h </w:instrText>
+          <w:instrText xml:space="preserve"> PAGEREF _Toc241219160 \h </w:instrText>
         </w:r>
         <w:r>
           <w:rPr>
@@ -3023,7 +3073,7 @@
           <w:noProof/>
         </w:rPr>
       </w:pPr>
-      <w:hyperlink w:anchor="_Toc241217605" w:history="1">
+      <w:hyperlink w:anchor="_Toc241219161" w:history="1">
         <w:r>
           <w:rPr>
             <w:rStyle w:val="Hyperlink"/>
@@ -3050,7 +3100,7 @@
             <w:noProof/>
             <w:webHidden/>
           </w:rPr>
-          <w:instrText xml:space="preserve"> PAGEREF _Toc241217605 \h </w:instrText>
+          <w:instrText xml:space="preserve"> PAGEREF _Toc241219161 \h </w:instrText>
         </w:r>
         <w:r>
           <w:rPr>
@@ -3091,7 +3141,7 @@
           <w:noProof/>
         </w:rPr>
       </w:pPr>
-      <w:hyperlink w:anchor="_Toc241217606" w:history="1">
+      <w:hyperlink w:anchor="_Toc241219162" w:history="1">
         <w:r>
           <w:rPr>
             <w:rStyle w:val="Hyperlink"/>
@@ -3118,7 +3168,7 @@
             <w:noProof/>
             <w:webHidden/>
           </w:rPr>
-          <w:instrText xml:space="preserve"> PAGEREF _Toc241217606 \h </w:instrText>
+          <w:instrText xml:space="preserve"> PAGEREF _Toc241219162 \h </w:instrText>
         </w:r>
         <w:r>
           <w:rPr>
@@ -3164,7 +3214,7 @@
       <w:pPr>
         <w:pStyle w:val="Heading1"/>
       </w:pPr>
-      <w:bookmarkStart w:id="0" w:name="_Toc241217577"/>
+      <w:bookmarkStart w:id="0" w:name="_Toc241219133"/>
       <w:r>
         <w:lastRenderedPageBreak/>
         <w:t>About This Document</w:t>
@@ -3267,7 +3317,7 @@
       <w:pPr>
         <w:pStyle w:val="Heading1"/>
       </w:pPr>
-      <w:bookmarkStart w:id="1" w:name="_Toc241217578"/>
+      <w:bookmarkStart w:id="1" w:name="_Toc241219134"/>
       <w:r>
         <w:t>1. Basic Information (Application and Organization)</w:t>
       </w:r>
@@ -3414,7 +3464,7 @@
       <w:pPr>
         <w:pStyle w:val="Heading2"/>
       </w:pPr>
-      <w:bookmarkStart w:id="2" w:name="_Toc241217579"/>
+      <w:bookmarkStart w:id="2" w:name="_Toc241219135"/>
       <w:r>
         <w:t>1.0 · Status Summary — Section 1</w:t>
       </w:r>
@@ -3791,7 +3841,7 @@
       <w:pPr>
         <w:pStyle w:val="Heading2"/>
       </w:pPr>
-      <w:bookmarkStart w:id="3" w:name="_Toc241217580"/>
+      <w:bookmarkStart w:id="3" w:name="_Toc241219136"/>
       <w:r>
         <w:t>1.1 · Application Form</w:t>
       </w:r>
@@ -4843,7 +4893,7 @@
       <w:pPr>
         <w:pStyle w:val="Heading2"/>
       </w:pPr>
-      <w:bookmarkStart w:id="4" w:name="_Toc241217581"/>
+      <w:bookmarkStart w:id="4" w:name="_Toc241219137"/>
       <w:r>
         <w:t>1.2 · Business License / Company Registration Certificate</w:t>
       </w:r>
@@ -5392,7 +5442,7 @@
       <w:pPr>
         <w:pStyle w:val="Heading2"/>
       </w:pPr>
-      <w:bookmarkStart w:id="5" w:name="_Toc241217582"/>
+      <w:bookmarkStart w:id="5" w:name="_Toc241219138"/>
       <w:r>
         <w:t>1.3 · Organizational Chart and Contact Information</w:t>
       </w:r>
@@ -5941,7 +5991,7 @@
       <w:pPr>
         <w:pStyle w:val="Heading2"/>
       </w:pPr>
-      <w:bookmarkStart w:id="6" w:name="_Toc241217583"/>
+      <w:bookmarkStart w:id="6" w:name="_Toc241219139"/>
       <w:r>
         <w:t>1.4 · Manufacturing Plant Address and Introduction of Production Facilities</w:t>
       </w:r>
@@ -6453,7 +6503,7 @@
       <w:pPr>
         <w:pStyle w:val="Heading2"/>
       </w:pPr>
-      <w:bookmarkStart w:id="7" w:name="_Toc241217584"/>
+      <w:bookmarkStart w:id="7" w:name="_Toc241219140"/>
       <w:r>
         <w:t>1.5 · ISO 9001 Certificate, Quality Manual, and Procedure Index</w:t>
       </w:r>
@@ -6876,7 +6926,7 @@
       <w:pPr>
         <w:pStyle w:val="Heading1"/>
       </w:pPr>
-      <w:bookmarkStart w:id="8" w:name="_Toc241217585"/>
+      <w:bookmarkStart w:id="8" w:name="_Toc241219141"/>
       <w:r>
         <w:t>2. Technical Documentation</w:t>
       </w:r>
@@ -6891,7 +6941,7 @@
       <w:pPr>
         <w:pStyle w:val="Heading2"/>
       </w:pPr>
-      <w:bookmarkStart w:id="9" w:name="_Toc241217586"/>
+      <w:bookmarkStart w:id="9" w:name="_Toc241219142"/>
       <w:r>
         <w:t>2.1 · Detailed Product Description</w:t>
       </w:r>
@@ -6924,7 +6974,7 @@
       <w:pPr>
         <w:pStyle w:val="Heading2"/>
       </w:pPr>
-      <w:bookmarkStart w:id="10" w:name="_Toc241217587"/>
+      <w:bookmarkStart w:id="10" w:name="_Toc241219143"/>
       <w:r>
         <w:t>2.2 · Product Name, Model, and Specification List</w:t>
       </w:r>
@@ -7368,7 +7418,7 @@
       <w:pPr>
         <w:pStyle w:val="Heading2"/>
       </w:pPr>
-      <w:bookmarkStart w:id="11" w:name="_Toc241217588"/>
+      <w:bookmarkStart w:id="11" w:name="_Toc241219144"/>
       <w:r>
         <w:t>2.3 · Functional Description and Technical Parameters (Electrical, Mechanical, etc.)</w:t>
       </w:r>
@@ -7386,7 +7436,7 @@
       <w:pPr>
         <w:pStyle w:val="Heading3"/>
       </w:pPr>
-      <w:bookmarkStart w:id="12" w:name="_Toc241217589"/>
+      <w:bookmarkStart w:id="12" w:name="_Toc241219145"/>
       <w:r>
         <w:t>2.3.a · Electrical Parameters — Node Sensor (GLD)</w:t>
       </w:r>
@@ -8010,7 +8060,7 @@
       <w:pPr>
         <w:pStyle w:val="Heading3"/>
       </w:pPr>
-      <w:bookmarkStart w:id="13" w:name="_Toc241217590"/>
+      <w:bookmarkStart w:id="13" w:name="_Toc241219146"/>
       <w:r>
         <w:t>2.3.b · Sensor and Communication Parameters — Node Sensor (GLD)</w:t>
       </w:r>
@@ -9072,7 +9122,7 @@
       <w:pPr>
         <w:pStyle w:val="Heading3"/>
       </w:pPr>
-      <w:bookmarkStart w:id="14" w:name="_Toc241217591"/>
+      <w:bookmarkStart w:id="14" w:name="_Toc241219147"/>
       <w:r>
         <w:t>2.3.c · Mechanical Parameters — Node Sensor (GLD)</w:t>
       </w:r>
@@ -9923,7 +9973,7 @@
       <w:pPr>
         <w:pStyle w:val="Heading2"/>
       </w:pPr>
-      <w:bookmarkStart w:id="15" w:name="_Toc241217592"/>
+      <w:bookmarkStart w:id="15" w:name="_Toc241219148"/>
       <w:r>
         <w:t>2.4 · Product Photographs — Overall and Key Components</w:t>
       </w:r>
@@ -9962,7 +10012,7 @@
                 <w:noProof/>
               </w:rPr>
               <w:drawing>
-                <wp:inline distT="0" distB="0" distL="0" distR="0" wp14:anchorId="7997AD4A" wp14:editId="4ADFF6AE">
+                <wp:inline distT="0" distB="0" distL="0" distR="0" wp14:anchorId="7C9B1345" wp14:editId="643F3773">
                   <wp:extent cx="1379912" cy="2286000"/>
                   <wp:effectExtent l="0" t="0" r="0" b="0"/>
                   <wp:docPr id="1" name="Picture 1"/>
@@ -10039,7 +10089,7 @@
                 <w:noProof/>
               </w:rPr>
               <w:drawing>
-                <wp:inline distT="0" distB="0" distL="0" distR="0" wp14:anchorId="0D07425D" wp14:editId="6A899265">
+                <wp:inline distT="0" distB="0" distL="0" distR="0" wp14:anchorId="683F1A81" wp14:editId="57E8BE00">
                   <wp:extent cx="1714500" cy="2286000"/>
                   <wp:effectExtent l="0" t="0" r="0" b="0"/>
                   <wp:docPr id="2" name="Picture 2"/>
@@ -10121,7 +10171,7 @@
                 <w:noProof/>
               </w:rPr>
               <w:drawing>
-                <wp:inline distT="0" distB="0" distL="0" distR="0" wp14:anchorId="3AC217C4" wp14:editId="43168355">
+                <wp:inline distT="0" distB="0" distL="0" distR="0" wp14:anchorId="16CDD880" wp14:editId="71F75973">
                   <wp:extent cx="1026621" cy="2286000"/>
                   <wp:effectExtent l="0" t="0" r="0" b="0"/>
                   <wp:docPr id="3" name="Picture 3"/>
@@ -10198,7 +10248,7 @@
                 <w:noProof/>
               </w:rPr>
               <w:drawing>
-                <wp:inline distT="0" distB="0" distL="0" distR="0" wp14:anchorId="51B93882" wp14:editId="49B9AAE4">
+                <wp:inline distT="0" distB="0" distL="0" distR="0" wp14:anchorId="392F7E66" wp14:editId="6E10DF00">
                   <wp:extent cx="1026621" cy="2286000"/>
                   <wp:effectExtent l="0" t="0" r="0" b="0"/>
                   <wp:docPr id="4" name="Picture 4"/>
@@ -10281,7 +10331,7 @@
               </w:rPr>
               <w:lastRenderedPageBreak/>
               <w:drawing>
-                <wp:inline distT="0" distB="0" distL="0" distR="0" wp14:anchorId="72DDDA98" wp14:editId="4417FD64">
+                <wp:inline distT="0" distB="0" distL="0" distR="0" wp14:anchorId="1847FBF0" wp14:editId="1C98E042">
                   <wp:extent cx="1026621" cy="2286000"/>
                   <wp:effectExtent l="0" t="0" r="0" b="0"/>
                   <wp:docPr id="5" name="Picture 5"/>
@@ -10358,7 +10408,7 @@
                 <w:noProof/>
               </w:rPr>
               <w:drawing>
-                <wp:inline distT="0" distB="0" distL="0" distR="0" wp14:anchorId="6760CF0D" wp14:editId="07F40AE1">
+                <wp:inline distT="0" distB="0" distL="0" distR="0" wp14:anchorId="2FE0150D" wp14:editId="42945BBB">
                   <wp:extent cx="1026621" cy="2286000"/>
                   <wp:effectExtent l="0" t="0" r="0" b="0"/>
                   <wp:docPr id="6" name="Picture 6"/>
@@ -10440,7 +10490,7 @@
                 <w:noProof/>
               </w:rPr>
               <w:drawing>
-                <wp:inline distT="0" distB="0" distL="0" distR="0" wp14:anchorId="38521575" wp14:editId="400DFA6D">
+                <wp:inline distT="0" distB="0" distL="0" distR="0" wp14:anchorId="508FDDC3" wp14:editId="3A3B70F6">
                   <wp:extent cx="1026621" cy="2286000"/>
                   <wp:effectExtent l="0" t="0" r="0" b="0"/>
                   <wp:docPr id="7" name="Picture 7"/>
@@ -10564,7 +10614,7 @@
       <w:pPr>
         <w:pStyle w:val="Heading2"/>
       </w:pPr>
-      <w:bookmarkStart w:id="16" w:name="_Toc241217593"/>
+      <w:bookmarkStart w:id="16" w:name="_Toc241219149"/>
       <w:r>
         <w:t>2.5 · Description of Intended Use and Installation Environment (Gas Group, Temperature Class, Area Classification)</w:t>
       </w:r>
@@ -11027,7 +11077,7 @@
       <w:pPr>
         <w:pStyle w:val="Heading2"/>
       </w:pPr>
-      <w:bookmarkStart w:id="17" w:name="_Toc241217594"/>
+      <w:bookmarkStart w:id="17" w:name="_Toc241219150"/>
       <w:r>
         <w:t>2.6 · Design and Manufacturing Information</w:t>
       </w:r>
@@ -11042,7 +11092,7 @@
       <w:pPr>
         <w:pStyle w:val="Heading3"/>
       </w:pPr>
-      <w:bookmarkStart w:id="18" w:name="_Toc241217595"/>
+      <w:bookmarkStart w:id="18" w:name="_Toc241219151"/>
       <w:r>
         <w:lastRenderedPageBreak/>
         <w:t>2.6.a · Complete Drawings (Assembly, Component, Electrical Schematic, PCB Layout, Enclosure Structure, Junction Box, Terminal, Grounding)</w:t>
@@ -11063,7 +11113,7 @@
           <w:noProof/>
         </w:rPr>
         <w:drawing>
-          <wp:inline distT="0" distB="0" distL="0" distR="0" wp14:anchorId="734D0807" wp14:editId="6D39EBFA">
+          <wp:inline distT="0" distB="0" distL="0" distR="0" wp14:anchorId="15694F28" wp14:editId="040E7771">
             <wp:extent cx="5120640" cy="3413760"/>
             <wp:effectExtent l="0" t="0" r="0" b="0"/>
             <wp:docPr id="8" name="Picture 8"/>
@@ -11136,7 +11186,7 @@
         </w:rPr>
         <w:lastRenderedPageBreak/>
         <w:drawing>
-          <wp:inline distT="0" distB="0" distL="0" distR="0" wp14:anchorId="621EC456" wp14:editId="515F1472">
+          <wp:inline distT="0" distB="0" distL="0" distR="0" wp14:anchorId="3A08EF96" wp14:editId="03DC168D">
             <wp:extent cx="5120640" cy="3413760"/>
             <wp:effectExtent l="0" t="0" r="0" b="0"/>
             <wp:docPr id="9" name="Picture 9"/>
@@ -11208,7 +11258,7 @@
           <w:noProof/>
         </w:rPr>
         <w:drawing>
-          <wp:inline distT="0" distB="0" distL="0" distR="0" wp14:anchorId="47A04742" wp14:editId="6ADA93C1">
+          <wp:inline distT="0" distB="0" distL="0" distR="0" wp14:anchorId="2D59D685" wp14:editId="6A87881A">
             <wp:extent cx="5120640" cy="3413760"/>
             <wp:effectExtent l="0" t="0" r="0" b="0"/>
             <wp:docPr id="10" name="Picture 10"/>
@@ -11281,7 +11331,7 @@
         </w:rPr>
         <w:lastRenderedPageBreak/>
         <w:drawing>
-          <wp:inline distT="0" distB="0" distL="0" distR="0" wp14:anchorId="5E6338B7" wp14:editId="1F83AA03">
+          <wp:inline distT="0" distB="0" distL="0" distR="0" wp14:anchorId="6C7D3AD7" wp14:editId="1B472B71">
             <wp:extent cx="5120640" cy="3413760"/>
             <wp:effectExtent l="0" t="0" r="0" b="0"/>
             <wp:docPr id="11" name="Picture 11"/>
@@ -11353,7 +11403,7 @@
           <w:noProof/>
         </w:rPr>
         <w:drawing>
-          <wp:inline distT="0" distB="0" distL="0" distR="0" wp14:anchorId="191DED4A" wp14:editId="2C24EC34">
+          <wp:inline distT="0" distB="0" distL="0" distR="0" wp14:anchorId="145A3FBB" wp14:editId="654BACD1">
             <wp:extent cx="5120640" cy="3413760"/>
             <wp:effectExtent l="0" t="0" r="0" b="0"/>
             <wp:docPr id="12" name="Picture 12"/>
@@ -11426,7 +11476,7 @@
         </w:rPr>
         <w:lastRenderedPageBreak/>
         <w:drawing>
-          <wp:inline distT="0" distB="0" distL="0" distR="0" wp14:anchorId="1F8642D6" wp14:editId="7CBECB34">
+          <wp:inline distT="0" distB="0" distL="0" distR="0" wp14:anchorId="2331BD7F" wp14:editId="463F765F">
             <wp:extent cx="5120640" cy="3413760"/>
             <wp:effectExtent l="0" t="0" r="0" b="0"/>
             <wp:docPr id="13" name="Picture 13"/>
@@ -11498,7 +11548,7 @@
           <w:noProof/>
         </w:rPr>
         <w:drawing>
-          <wp:inline distT="0" distB="0" distL="0" distR="0" wp14:anchorId="3E868453" wp14:editId="498F3680">
+          <wp:inline distT="0" distB="0" distL="0" distR="0" wp14:anchorId="0BACEE0F" wp14:editId="04357D3C">
             <wp:extent cx="5120640" cy="3413760"/>
             <wp:effectExtent l="0" t="0" r="0" b="0"/>
             <wp:docPr id="14" name="Picture 14"/>
@@ -11571,7 +11621,7 @@
         </w:rPr>
         <w:lastRenderedPageBreak/>
         <w:drawing>
-          <wp:inline distT="0" distB="0" distL="0" distR="0" wp14:anchorId="162A97E1" wp14:editId="7B11623C">
+          <wp:inline distT="0" distB="0" distL="0" distR="0" wp14:anchorId="13121ABA" wp14:editId="38980054">
             <wp:extent cx="5120640" cy="3413760"/>
             <wp:effectExtent l="0" t="0" r="0" b="0"/>
             <wp:docPr id="15" name="Picture 15"/>
@@ -11643,7 +11693,7 @@
           <w:noProof/>
         </w:rPr>
         <w:drawing>
-          <wp:inline distT="0" distB="0" distL="0" distR="0" wp14:anchorId="64F28D48" wp14:editId="4822FC2A">
+          <wp:inline distT="0" distB="0" distL="0" distR="0" wp14:anchorId="3A51572E" wp14:editId="5D8A502F">
             <wp:extent cx="5120640" cy="3413760"/>
             <wp:effectExtent l="0" t="0" r="0" b="0"/>
             <wp:docPr id="16" name="Picture 16"/>
@@ -11716,7 +11766,7 @@
         </w:rPr>
         <w:lastRenderedPageBreak/>
         <w:drawing>
-          <wp:inline distT="0" distB="0" distL="0" distR="0" wp14:anchorId="0130BE83" wp14:editId="4609669B">
+          <wp:inline distT="0" distB="0" distL="0" distR="0" wp14:anchorId="1E32F810" wp14:editId="24634140">
             <wp:extent cx="2468880" cy="2479268"/>
             <wp:effectExtent l="0" t="0" r="0" b="0"/>
             <wp:docPr id="17" name="Picture 17"/>
@@ -11759,7 +11809,7 @@
           <w:noProof/>
         </w:rPr>
         <w:drawing>
-          <wp:inline distT="0" distB="0" distL="0" distR="0" wp14:anchorId="71B218EE" wp14:editId="587358D9">
+          <wp:inline distT="0" distB="0" distL="0" distR="0" wp14:anchorId="0ECAFA03" wp14:editId="1BE5FCB0">
             <wp:extent cx="2468880" cy="1804956"/>
             <wp:effectExtent l="0" t="0" r="0" b="0"/>
             <wp:docPr id="18" name="Picture 18"/>
@@ -11836,7 +11886,7 @@
           <w:noProof/>
         </w:rPr>
         <w:drawing>
-          <wp:inline distT="0" distB="0" distL="0" distR="0" wp14:anchorId="5C24565F" wp14:editId="791256AC">
+          <wp:inline distT="0" distB="0" distL="0" distR="0" wp14:anchorId="611BBD3C" wp14:editId="003783B6">
             <wp:extent cx="5669280" cy="3847707"/>
             <wp:effectExtent l="0" t="0" r="0" b="0"/>
             <wp:docPr id="19" name="Picture 19"/>
@@ -12387,7 +12437,7 @@
       <w:pPr>
         <w:pStyle w:val="Heading3"/>
       </w:pPr>
-      <w:bookmarkStart w:id="19" w:name="_Toc241217596"/>
+      <w:bookmarkStart w:id="19" w:name="_Toc241219152"/>
       <w:r>
         <w:t>2.6.b · Bill of Materials (BOM) for Explosion-Safety-Relevant Components</w:t>
       </w:r>
@@ -23368,7 +23418,7 @@
       <w:pPr>
         <w:pStyle w:val="Heading3"/>
       </w:pPr>
-      <w:bookmarkStart w:id="20" w:name="_Toc241217597"/>
+      <w:bookmarkStart w:id="20" w:name="_Toc241219153"/>
       <w:r>
         <w:t>2.6.c · Material Specification Sheets / Datasheets (Non-Metallic Materials)</w:t>
       </w:r>
@@ -23389,10 +23439,10 @@
     </w:p>
     <w:p>
       <w:r>
-        <w:t>Non-metallic components identified in the design so far that this item will need to cover: the protective mesh/flame-arrestor cover over the gas-sensing element (Section 2.6.a — material not yet confirmed; may prove to be metallic, which would place it outside this specific checklist item); the cover-to-body sealing gasket/O-ring providing the IP66 rating (Section 2.3.c — material/grade not yet specified); the integral seal of the candidate M20×1.5 cable gland (Section 2.3.c); and the antenna/SMA feedthroug</w:t>
+        <w:t>Non-metallic components in the design that this item will need to cover: the cover-to-body sealing gasket providing the IP66 rating (Section 2.3.c — identified as a rubber gasket in the casing partner's assembly drawing, specific compound/grade not yet specified); the integral seal of the candidate M20×1.5 cable gland (Section 2.3.c); and the antenna/SMA feedthrough insulator (material not yet specified). The protective mesh cover over the gas-sensing element is now identified as a stainless-steel wire mesh</w:t>
       </w:r>
       <w:r>
-        <w:t>h insulator (material not yet specified).</w:t>
+        <w:t xml:space="preserve"> in the same assembly drawing — being metallic, it falls outside this specific non-metallic-materials checklist item.</w:t>
       </w:r>
     </w:p>
     <w:tbl>
@@ -23450,9 +23500,8 @@
       <w:pPr>
         <w:pStyle w:val="Heading3"/>
       </w:pPr>
-      <w:bookmarkStart w:id="21" w:name="_Toc241217598"/>
+      <w:bookmarkStart w:id="21" w:name="_Toc241219154"/>
       <w:r>
-        <w:lastRenderedPageBreak/>
         <w:t>2.6.d · Manufacturing Process Description</w:t>
       </w:r>
       <w:bookmarkEnd w:id="21"/>
@@ -23510,7 +23559,7 @@
       <w:pPr>
         <w:pStyle w:val="Heading3"/>
       </w:pPr>
-      <w:bookmarkStart w:id="22" w:name="_Toc241217599"/>
+      <w:bookmarkStart w:id="22" w:name="_Toc241219155"/>
       <w:r>
         <w:t>2.6.e · Explosion-Protection Calculations and Explanations (if applicable)</w:t>
       </w:r>
@@ -23569,7 +23618,7 @@
       <w:pPr>
         <w:pStyle w:val="Heading3"/>
       </w:pPr>
-      <w:bookmarkStart w:id="23" w:name="_Toc241217600"/>
+      <w:bookmarkStart w:id="23" w:name="_Toc241219156"/>
       <w:r>
         <w:t>2.6.f · Temperature Group Calculation (Hottest-Point Temperature Estimation)</w:t>
       </w:r>
@@ -23631,7 +23680,7 @@
       <w:pPr>
         <w:pStyle w:val="Heading3"/>
       </w:pPr>
-      <w:bookmarkStart w:id="24" w:name="_Toc241217601"/>
+      <w:bookmarkStart w:id="24" w:name="_Toc241219157"/>
       <w:r>
         <w:t>2.6.g · Usage and Installation Instructions (Draft)</w:t>
       </w:r>
@@ -23923,7 +23972,6 @@
                 <w:color w:val="4A4A4A"/>
                 <w:sz w:val="20"/>
               </w:rPr>
-              <w:lastRenderedPageBreak/>
               <w:t>Status: Draft text available (source: internal working draft, Rev. 18 Sep 2026). This is a draft for review, not a finalized, Ex-approved installation and operation manual. It has not been checked against a selected type of protection (Ex d/e/i, Section 2.6.e), a confirmed temperature class (Section 2.6.f), or finalized cable-entry/enclosure hardware. It also feeds the standalone Instruction_Manual_GLD deliverable.</w:t>
             </w:r>
           </w:p>
@@ -24203,6 +24251,7 @@
                 <w:b/>
                 <w:sz w:val="19"/>
               </w:rPr>
+              <w:lastRenderedPageBreak/>
               <w:t>Inference</w:t>
             </w:r>
           </w:p>
@@ -24258,7 +24307,6 @@
                 <w:b/>
                 <w:sz w:val="19"/>
               </w:rPr>
-              <w:lastRenderedPageBreak/>
               <w:t>Dataset</w:t>
             </w:r>
           </w:p>
@@ -24361,7 +24409,7 @@
       <w:pPr>
         <w:pStyle w:val="Heading3"/>
       </w:pPr>
-      <w:bookmarkStart w:id="25" w:name="_Toc241217602"/>
+      <w:bookmarkStart w:id="25" w:name="_Toc241219158"/>
       <w:r>
         <w:t>2.6.h · Nameplate Information</w:t>
       </w:r>
@@ -24420,7 +24468,7 @@
       <w:pPr>
         <w:pStyle w:val="Heading3"/>
       </w:pPr>
-      <w:bookmarkStart w:id="26" w:name="_Toc241217603"/>
+      <w:bookmarkStart w:id="26" w:name="_Toc241219159"/>
       <w:r>
         <w:t>2.6.i · Ex Component Certificates</w:t>
       </w:r>
@@ -24479,7 +24527,7 @@
       <w:pPr>
         <w:pStyle w:val="Heading1"/>
       </w:pPr>
-      <w:bookmarkStart w:id="27" w:name="_Toc241217604"/>
+      <w:bookmarkStart w:id="27" w:name="_Toc241219160"/>
       <w:r>
         <w:t>3. Sample Information</w:t>
       </w:r>
@@ -24494,7 +24542,7 @@
       <w:pPr>
         <w:pStyle w:val="Heading2"/>
       </w:pPr>
-      <w:bookmarkStart w:id="28" w:name="_Toc241217605"/>
+      <w:bookmarkStart w:id="28" w:name="_Toc241219161"/>
       <w:r>
         <w:t>3.1 · Model, Serial Number, and Status</w:t>
       </w:r>
@@ -24553,7 +24601,7 @@
       <w:pPr>
         <w:pStyle w:val="Heading2"/>
       </w:pPr>
-      <w:bookmarkStart w:id="29" w:name="_Toc241217606"/>
+      <w:bookmarkStart w:id="29" w:name="_Toc241219162"/>
       <w:r>
         <w:t>3.2 · Test Fixtures and Auxiliary Equipment</w:t>
       </w:r>
@@ -24596,6 +24644,7 @@
                 <w:color w:val="4A4A4A"/>
                 <w:sz w:val="18"/>
               </w:rPr>
+              <w:lastRenderedPageBreak/>
               <w:t>TEST GROUP</w:t>
             </w:r>
           </w:p>
@@ -24638,7 +24687,6 @@
                 <w:b/>
                 <w:sz w:val="19"/>
               </w:rPr>
-              <w:lastRenderedPageBreak/>
               <w:t>Firmware / serial</w:t>
             </w:r>
           </w:p>
@@ -25353,7 +25401,7 @@
         <w:color w:val="4A4A4A"/>
         <w:sz w:val="16"/>
       </w:rPr>
-      <w:t>LGU/GLD/IECEX-TDF/2026-001  ·  Rev. 0.9</w:t>
+      <w:t>LGU/GLD/IECEX-TDF/2026-001  ·  Rev. 1.0</w:t>
     </w:r>
     <w:r>
       <w:tab/>
@@ -25623,31 +25671,31 @@
       </w:rPr>
     </w:lvl>
   </w:abstractNum>
-  <w:num w:numId="1" w16cid:durableId="276571518">
+  <w:num w:numId="1" w16cid:durableId="407191502">
     <w:abstractNumId w:val="8"/>
   </w:num>
-  <w:num w:numId="2" w16cid:durableId="1123767490">
+  <w:num w:numId="2" w16cid:durableId="957956747">
     <w:abstractNumId w:val="6"/>
   </w:num>
-  <w:num w:numId="3" w16cid:durableId="1287001733">
+  <w:num w:numId="3" w16cid:durableId="2119787084">
     <w:abstractNumId w:val="5"/>
   </w:num>
-  <w:num w:numId="4" w16cid:durableId="1951617579">
+  <w:num w:numId="4" w16cid:durableId="798645985">
     <w:abstractNumId w:val="4"/>
   </w:num>
-  <w:num w:numId="5" w16cid:durableId="1678380437">
+  <w:num w:numId="5" w16cid:durableId="260375269">
     <w:abstractNumId w:val="7"/>
   </w:num>
-  <w:num w:numId="6" w16cid:durableId="1354304879">
+  <w:num w:numId="6" w16cid:durableId="861893312">
     <w:abstractNumId w:val="3"/>
   </w:num>
-  <w:num w:numId="7" w16cid:durableId="1779829076">
+  <w:num w:numId="7" w16cid:durableId="1392271816">
     <w:abstractNumId w:val="2"/>
   </w:num>
-  <w:num w:numId="8" w16cid:durableId="65081521">
+  <w:num w:numId="8" w16cid:durableId="1754400700">
     <w:abstractNumId w:val="1"/>
   </w:num>
-  <w:num w:numId="9" w16cid:durableId="1760980807">
+  <w:num w:numId="9" w16cid:durableId="228226323">
     <w:abstractNumId w:val="0"/>
   </w:num>
 </w:numbering>
@@ -37079,7 +37127,7 @@
     <w:autoRedefine/>
     <w:uiPriority w:val="39"/>
     <w:unhideWhenUsed/>
-    <w:rsid w:val="00A76A2B"/>
+    <w:rsid w:val="00EB520E"/>
     <w:pPr>
       <w:spacing w:after="100"/>
     </w:pPr>
@@ -37091,7 +37139,7 @@
     <w:autoRedefine/>
     <w:uiPriority w:val="39"/>
     <w:unhideWhenUsed/>
-    <w:rsid w:val="00A76A2B"/>
+    <w:rsid w:val="00EB520E"/>
     <w:pPr>
       <w:spacing w:after="100"/>
       <w:ind w:left="210"/>
@@ -37104,7 +37152,7 @@
     <w:autoRedefine/>
     <w:uiPriority w:val="39"/>
     <w:unhideWhenUsed/>
-    <w:rsid w:val="00A76A2B"/>
+    <w:rsid w:val="00EB520E"/>
     <w:pPr>
       <w:spacing w:after="100"/>
       <w:ind w:left="420"/>
@@ -37115,7 +37163,7 @@
     <w:basedOn w:val="DefaultParagraphFont"/>
     <w:uiPriority w:val="99"/>
     <w:unhideWhenUsed/>
-    <w:rsid w:val="00A76A2B"/>
+    <w:rsid w:val="00EB520E"/>
     <w:rPr>
       <w:color w:val="0000FF" w:themeColor="hyperlink"/>
       <w:u w:val="single"/>

</xml_diff>

<commit_message>
Perjelas batas kelistrikan GLD (24VDC saja) dan seal cable gland
Tambah baris "Equipment boundary (mains exposure): None - 24 VDC
only" ke Electrical Parameters -- GLD sendiri tidak pernah menyentuh
220 VAC, adaptor AC/DC adalah perangkat terpisah di luar batas unit
yang disertifikasi. Perjelas seal internal cable gland mengikuti
referensi BP18-1Z bersama gland-nya, sesuai arahan proyek.

Nilai Tamb -40/+85C dan klasifikasi debu "D" dari draf tim belum
diterapkan -- masih menunggu klarifikasi karena bertentangan dengan
nilai -20/+60C yang sudah dikonfirmasi Final.

Co-Authored-By: Claude Sonnet 5 <noreply@anthropic.com>
</commit_message>
<xml_diff>
--- a/Deliverables/Dokumen_Teknis_Sertifikasi_GLD_IECEx_ATEX.docx
+++ b/Deliverables/Dokumen_Teknis_Sertifikasi_GLD_IECEx_ATEX.docx
@@ -226,7 +226,7 @@
               <w:rPr>
                 <w:sz w:val="20"/>
               </w:rPr>
-              <w:t>1.0</w:t>
+              <w:t>1.1</w:t>
             </w:r>
           </w:p>
         </w:tc>
@@ -1126,6 +1126,56 @@
                 <w:sz w:val="19"/>
               </w:rPr>
               <w:t>Section 2.6.c updated with materials confirmed from a newer casing-partner assembly drawing: the protective mesh cover is stainless steel (metallic, outside the scope of this non-metallic-materials item) and the cover-to-body seal is a rubber gasket (compound/grade still not specified).</w:t>
+            </w:r>
+          </w:p>
+        </w:tc>
+      </w:tr>
+      <w:tr>
+        <w:tc>
+          <w:tcPr>
+            <w:tcW w:w="1296" w:type="dxa"/>
+          </w:tcPr>
+          <w:p>
+            <w:pPr>
+              <w:spacing w:after="40"/>
+            </w:pPr>
+            <w:r>
+              <w:rPr>
+                <w:sz w:val="19"/>
+              </w:rPr>
+              <w:t>1.1</w:t>
+            </w:r>
+          </w:p>
+        </w:tc>
+        <w:tc>
+          <w:tcPr>
+            <w:tcW w:w="1872" w:type="dxa"/>
+          </w:tcPr>
+          <w:p>
+            <w:pPr>
+              <w:spacing w:after="40"/>
+            </w:pPr>
+            <w:r>
+              <w:rPr>
+                <w:sz w:val="19"/>
+              </w:rPr>
+              <w:t>25 September 2026</w:t>
+            </w:r>
+          </w:p>
+        </w:tc>
+        <w:tc>
+          <w:tcPr>
+            <w:tcW w:w="6192" w:type="dxa"/>
+          </w:tcPr>
+          <w:p>
+            <w:pPr>
+              <w:spacing w:after="40"/>
+            </w:pPr>
+            <w:r>
+              <w:rPr>
+                <w:sz w:val="19"/>
+              </w:rPr>
+              <w:t>Added an explicit equipment-boundary statement to Section 2.3.a: the Node Sensor (GLD) receives only 24 VDC at its terminal and never carries 220 VAC internally; the AC/DC adapter is a separate, site-supplied device outside the certified unit's physical boundary. Section 2.6.c cable-gland seal remark clarified as specified together with the M20×1.5 gland itself from the BP18-1Z reference, per project direction, rather than as a separately sourced item.</w:t>
             </w:r>
           </w:p>
         </w:tc>
@@ -1169,7 +1219,7 @@
       <w:r>
         <w:fldChar w:fldCharType="separate"/>
       </w:r>
-      <w:hyperlink w:anchor="_Toc241219133" w:history="1">
+      <w:hyperlink w:anchor="_Toc241234423" w:history="1">
         <w:r>
           <w:rPr>
             <w:rStyle w:val="Hyperlink"/>
@@ -1196,7 +1246,7 @@
             <w:noProof/>
             <w:webHidden/>
           </w:rPr>
-          <w:instrText xml:space="preserve"> PAGEREF _Toc241219133 \h </w:instrText>
+          <w:instrText xml:space="preserve"> PAGEREF _Toc241234423 \h </w:instrText>
         </w:r>
         <w:r>
           <w:rPr>
@@ -1237,7 +1287,7 @@
           <w:noProof/>
         </w:rPr>
       </w:pPr>
-      <w:hyperlink w:anchor="_Toc241219134" w:history="1">
+      <w:hyperlink w:anchor="_Toc241234424" w:history="1">
         <w:r>
           <w:rPr>
             <w:rStyle w:val="Hyperlink"/>
@@ -1264,7 +1314,7 @@
             <w:noProof/>
             <w:webHidden/>
           </w:rPr>
-          <w:instrText xml:space="preserve"> PAGEREF _Toc241219134 \h </w:instrText>
+          <w:instrText xml:space="preserve"> PAGEREF _Toc241234424 \h </w:instrText>
         </w:r>
         <w:r>
           <w:rPr>
@@ -1305,7 +1355,7 @@
           <w:noProof/>
         </w:rPr>
       </w:pPr>
-      <w:hyperlink w:anchor="_Toc241219135" w:history="1">
+      <w:hyperlink w:anchor="_Toc241234425" w:history="1">
         <w:r>
           <w:rPr>
             <w:rStyle w:val="Hyperlink"/>
@@ -1332,7 +1382,7 @@
             <w:noProof/>
             <w:webHidden/>
           </w:rPr>
-          <w:instrText xml:space="preserve"> PAGEREF _Toc241219135 \h </w:instrText>
+          <w:instrText xml:space="preserve"> PAGEREF _Toc241234425 \h </w:instrText>
         </w:r>
         <w:r>
           <w:rPr>
@@ -1373,7 +1423,7 @@
           <w:noProof/>
         </w:rPr>
       </w:pPr>
-      <w:hyperlink w:anchor="_Toc241219136" w:history="1">
+      <w:hyperlink w:anchor="_Toc241234426" w:history="1">
         <w:r>
           <w:rPr>
             <w:rStyle w:val="Hyperlink"/>
@@ -1400,7 +1450,7 @@
             <w:noProof/>
             <w:webHidden/>
           </w:rPr>
-          <w:instrText xml:space="preserve"> PAGEREF _Toc241219136 \h </w:instrText>
+          <w:instrText xml:space="preserve"> PAGEREF _Toc241234426 \h </w:instrText>
         </w:r>
         <w:r>
           <w:rPr>
@@ -1441,7 +1491,7 @@
           <w:noProof/>
         </w:rPr>
       </w:pPr>
-      <w:hyperlink w:anchor="_Toc241219137" w:history="1">
+      <w:hyperlink w:anchor="_Toc241234427" w:history="1">
         <w:r>
           <w:rPr>
             <w:rStyle w:val="Hyperlink"/>
@@ -1468,7 +1518,7 @@
             <w:noProof/>
             <w:webHidden/>
           </w:rPr>
-          <w:instrText xml:space="preserve"> PAGEREF _Toc241219137 \h </w:instrText>
+          <w:instrText xml:space="preserve"> PAGEREF _Toc241234427 \h </w:instrText>
         </w:r>
         <w:r>
           <w:rPr>
@@ -1509,7 +1559,7 @@
           <w:noProof/>
         </w:rPr>
       </w:pPr>
-      <w:hyperlink w:anchor="_Toc241219138" w:history="1">
+      <w:hyperlink w:anchor="_Toc241234428" w:history="1">
         <w:r>
           <w:rPr>
             <w:rStyle w:val="Hyperlink"/>
@@ -1536,7 +1586,7 @@
             <w:noProof/>
             <w:webHidden/>
           </w:rPr>
-          <w:instrText xml:space="preserve"> PAGEREF _Toc241219138 \h </w:instrText>
+          <w:instrText xml:space="preserve"> PAGEREF _Toc241234428 \h </w:instrText>
         </w:r>
         <w:r>
           <w:rPr>
@@ -1577,7 +1627,7 @@
           <w:noProof/>
         </w:rPr>
       </w:pPr>
-      <w:hyperlink w:anchor="_Toc241219139" w:history="1">
+      <w:hyperlink w:anchor="_Toc241234429" w:history="1">
         <w:r>
           <w:rPr>
             <w:rStyle w:val="Hyperlink"/>
@@ -1604,7 +1654,7 @@
             <w:noProof/>
             <w:webHidden/>
           </w:rPr>
-          <w:instrText xml:space="preserve"> PAGEREF _Toc241219139 \h </w:instrText>
+          <w:instrText xml:space="preserve"> PAGEREF _Toc241234429 \h </w:instrText>
         </w:r>
         <w:r>
           <w:rPr>
@@ -1645,7 +1695,7 @@
           <w:noProof/>
         </w:rPr>
       </w:pPr>
-      <w:hyperlink w:anchor="_Toc241219140" w:history="1">
+      <w:hyperlink w:anchor="_Toc241234430" w:history="1">
         <w:r>
           <w:rPr>
             <w:rStyle w:val="Hyperlink"/>
@@ -1672,7 +1722,7 @@
             <w:noProof/>
             <w:webHidden/>
           </w:rPr>
-          <w:instrText xml:space="preserve"> PAGEREF _Toc241219140 \h </w:instrText>
+          <w:instrText xml:space="preserve"> PAGEREF _Toc241234430 \h </w:instrText>
         </w:r>
         <w:r>
           <w:rPr>
@@ -1713,7 +1763,7 @@
           <w:noProof/>
         </w:rPr>
       </w:pPr>
-      <w:hyperlink w:anchor="_Toc241219141" w:history="1">
+      <w:hyperlink w:anchor="_Toc241234431" w:history="1">
         <w:r>
           <w:rPr>
             <w:rStyle w:val="Hyperlink"/>
@@ -1740,7 +1790,7 @@
             <w:noProof/>
             <w:webHidden/>
           </w:rPr>
-          <w:instrText xml:space="preserve"> PAGEREF _Toc241219141 \h </w:instrText>
+          <w:instrText xml:space="preserve"> PAGEREF _Toc241234431 \h </w:instrText>
         </w:r>
         <w:r>
           <w:rPr>
@@ -1781,7 +1831,7 @@
           <w:noProof/>
         </w:rPr>
       </w:pPr>
-      <w:hyperlink w:anchor="_Toc241219142" w:history="1">
+      <w:hyperlink w:anchor="_Toc241234432" w:history="1">
         <w:r>
           <w:rPr>
             <w:rStyle w:val="Hyperlink"/>
@@ -1808,7 +1858,7 @@
             <w:noProof/>
             <w:webHidden/>
           </w:rPr>
-          <w:instrText xml:space="preserve"> PAGEREF _Toc241219142 \h </w:instrText>
+          <w:instrText xml:space="preserve"> PAGEREF _Toc241234432 \h </w:instrText>
         </w:r>
         <w:r>
           <w:rPr>
@@ -1849,7 +1899,7 @@
           <w:noProof/>
         </w:rPr>
       </w:pPr>
-      <w:hyperlink w:anchor="_Toc241219143" w:history="1">
+      <w:hyperlink w:anchor="_Toc241234433" w:history="1">
         <w:r>
           <w:rPr>
             <w:rStyle w:val="Hyperlink"/>
@@ -1876,7 +1926,7 @@
             <w:noProof/>
             <w:webHidden/>
           </w:rPr>
-          <w:instrText xml:space="preserve"> PAGEREF _Toc241219143 \h </w:instrText>
+          <w:instrText xml:space="preserve"> PAGEREF _Toc241234433 \h </w:instrText>
         </w:r>
         <w:r>
           <w:rPr>
@@ -1917,7 +1967,7 @@
           <w:noProof/>
         </w:rPr>
       </w:pPr>
-      <w:hyperlink w:anchor="_Toc241219144" w:history="1">
+      <w:hyperlink w:anchor="_Toc241234434" w:history="1">
         <w:r>
           <w:rPr>
             <w:rStyle w:val="Hyperlink"/>
@@ -1944,7 +1994,7 @@
             <w:noProof/>
             <w:webHidden/>
           </w:rPr>
-          <w:instrText xml:space="preserve"> PAGEREF _Toc241219144 \h </w:instrText>
+          <w:instrText xml:space="preserve"> PAGEREF _Toc241234434 \h </w:instrText>
         </w:r>
         <w:r>
           <w:rPr>
@@ -1985,7 +2035,7 @@
           <w:noProof/>
         </w:rPr>
       </w:pPr>
-      <w:hyperlink w:anchor="_Toc241219145" w:history="1">
+      <w:hyperlink w:anchor="_Toc241234435" w:history="1">
         <w:r>
           <w:rPr>
             <w:rStyle w:val="Hyperlink"/>
@@ -2012,7 +2062,7 @@
             <w:noProof/>
             <w:webHidden/>
           </w:rPr>
-          <w:instrText xml:space="preserve"> PAGEREF _Toc241219145 \h </w:instrText>
+          <w:instrText xml:space="preserve"> PAGEREF _Toc241234435 \h </w:instrText>
         </w:r>
         <w:r>
           <w:rPr>
@@ -2053,7 +2103,7 @@
           <w:noProof/>
         </w:rPr>
       </w:pPr>
-      <w:hyperlink w:anchor="_Toc241219146" w:history="1">
+      <w:hyperlink w:anchor="_Toc241234436" w:history="1">
         <w:r>
           <w:rPr>
             <w:rStyle w:val="Hyperlink"/>
@@ -2080,7 +2130,7 @@
             <w:noProof/>
             <w:webHidden/>
           </w:rPr>
-          <w:instrText xml:space="preserve"> PAGEREF _Toc241219146 \h </w:instrText>
+          <w:instrText xml:space="preserve"> PAGEREF _Toc241234436 \h </w:instrText>
         </w:r>
         <w:r>
           <w:rPr>
@@ -2121,7 +2171,7 @@
           <w:noProof/>
         </w:rPr>
       </w:pPr>
-      <w:hyperlink w:anchor="_Toc241219147" w:history="1">
+      <w:hyperlink w:anchor="_Toc241234437" w:history="1">
         <w:r>
           <w:rPr>
             <w:rStyle w:val="Hyperlink"/>
@@ -2148,7 +2198,7 @@
             <w:noProof/>
             <w:webHidden/>
           </w:rPr>
-          <w:instrText xml:space="preserve"> PAGEREF _Toc241219147 \h </w:instrText>
+          <w:instrText xml:space="preserve"> PAGEREF _Toc241234437 \h </w:instrText>
         </w:r>
         <w:r>
           <w:rPr>
@@ -2168,7 +2218,7 @@
             <w:noProof/>
             <w:webHidden/>
           </w:rPr>
-          <w:t>14</w:t>
+          <w:t>15</w:t>
         </w:r>
         <w:r>
           <w:rPr>
@@ -2189,7 +2239,7 @@
           <w:noProof/>
         </w:rPr>
       </w:pPr>
-      <w:hyperlink w:anchor="_Toc241219148" w:history="1">
+      <w:hyperlink w:anchor="_Toc241234438" w:history="1">
         <w:r>
           <w:rPr>
             <w:rStyle w:val="Hyperlink"/>
@@ -2216,75 +2266,7 @@
             <w:noProof/>
             <w:webHidden/>
           </w:rPr>
-          <w:instrText xml:space="preserve"> PAGEREF _Toc241219148 \h </w:instrText>
-        </w:r>
-        <w:r>
-          <w:rPr>
-            <w:noProof/>
-            <w:webHidden/>
-          </w:rPr>
-        </w:r>
-        <w:r>
-          <w:rPr>
-            <w:noProof/>
-            <w:webHidden/>
-          </w:rPr>
-          <w:fldChar w:fldCharType="separate"/>
-        </w:r>
-        <w:r>
-          <w:rPr>
-            <w:noProof/>
-            <w:webHidden/>
-          </w:rPr>
-          <w:t>17</w:t>
-        </w:r>
-        <w:r>
-          <w:rPr>
-            <w:noProof/>
-            <w:webHidden/>
-          </w:rPr>
-          <w:fldChar w:fldCharType="end"/>
-        </w:r>
-      </w:hyperlink>
-    </w:p>
-    <w:p>
-      <w:pPr>
-        <w:pStyle w:val="TOC2"/>
-        <w:tabs>
-          <w:tab w:val="right" w:leader="dot" w:pos="9736"/>
-        </w:tabs>
-        <w:rPr>
-          <w:noProof/>
-        </w:rPr>
-      </w:pPr>
-      <w:hyperlink w:anchor="_Toc241219149" w:history="1">
-        <w:r>
-          <w:rPr>
-            <w:rStyle w:val="Hyperlink"/>
-            <w:noProof/>
-          </w:rPr>
-          <w:t>2.5 · Description of Intended Use and Installation Environment (Gas Group, Temperature Class, Area Classification)</w:t>
-        </w:r>
-        <w:r>
-          <w:rPr>
-            <w:noProof/>
-            <w:webHidden/>
-          </w:rPr>
-          <w:tab/>
-        </w:r>
-        <w:r>
-          <w:rPr>
-            <w:noProof/>
-            <w:webHidden/>
-          </w:rPr>
-          <w:fldChar w:fldCharType="begin"/>
-        </w:r>
-        <w:r>
-          <w:rPr>
-            <w:noProof/>
-            <w:webHidden/>
-          </w:rPr>
-          <w:instrText xml:space="preserve"> PAGEREF _Toc241219149 \h </w:instrText>
+          <w:instrText xml:space="preserve"> PAGEREF _Toc241234438 \h </w:instrText>
         </w:r>
         <w:r>
           <w:rPr>
@@ -2325,13 +2307,13 @@
           <w:noProof/>
         </w:rPr>
       </w:pPr>
-      <w:hyperlink w:anchor="_Toc241219150" w:history="1">
+      <w:hyperlink w:anchor="_Toc241234439" w:history="1">
         <w:r>
           <w:rPr>
             <w:rStyle w:val="Hyperlink"/>
             <w:noProof/>
           </w:rPr>
-          <w:t>2.6 · Design and Manufacturing Information</w:t>
+          <w:t>2.5 · Description of Intended Use and Installation Environment (Gas Group, Temperature Class, Area Classification)</w:t>
         </w:r>
         <w:r>
           <w:rPr>
@@ -2352,7 +2334,7 @@
             <w:noProof/>
             <w:webHidden/>
           </w:rPr>
-          <w:instrText xml:space="preserve"> PAGEREF _Toc241219150 \h </w:instrText>
+          <w:instrText xml:space="preserve"> PAGEREF _Toc241234439 \h </w:instrText>
         </w:r>
         <w:r>
           <w:rPr>
@@ -2385,7 +2367,7 @@
     </w:p>
     <w:p>
       <w:pPr>
-        <w:pStyle w:val="TOC3"/>
+        <w:pStyle w:val="TOC2"/>
         <w:tabs>
           <w:tab w:val="right" w:leader="dot" w:pos="9736"/>
         </w:tabs>
@@ -2393,13 +2375,13 @@
           <w:noProof/>
         </w:rPr>
       </w:pPr>
-      <w:hyperlink w:anchor="_Toc241219151" w:history="1">
+      <w:hyperlink w:anchor="_Toc241234440" w:history="1">
         <w:r>
           <w:rPr>
             <w:rStyle w:val="Hyperlink"/>
             <w:noProof/>
           </w:rPr>
-          <w:t>2.6.a · Complete Drawings (Assembly, Component, Electrical Schematic, PCB Layout, Enclosure Structure, Junction Box, Terminal, Grounding)</w:t>
+          <w:t>2.6 · Design and Manufacturing Information</w:t>
         </w:r>
         <w:r>
           <w:rPr>
@@ -2420,7 +2402,7 @@
             <w:noProof/>
             <w:webHidden/>
           </w:rPr>
-          <w:instrText xml:space="preserve"> PAGEREF _Toc241219151 \h </w:instrText>
+          <w:instrText xml:space="preserve"> PAGEREF _Toc241234440 \h </w:instrText>
         </w:r>
         <w:r>
           <w:rPr>
@@ -2461,7 +2443,75 @@
           <w:noProof/>
         </w:rPr>
       </w:pPr>
-      <w:hyperlink w:anchor="_Toc241219152" w:history="1">
+      <w:hyperlink w:anchor="_Toc241234441" w:history="1">
+        <w:r>
+          <w:rPr>
+            <w:rStyle w:val="Hyperlink"/>
+            <w:noProof/>
+          </w:rPr>
+          <w:t>2.6.a · Complete Drawings (Assembly, Component, Electrical Schematic, PCB Layout, Enclosure Structure, Junction Box, Terminal, Grounding)</w:t>
+        </w:r>
+        <w:r>
+          <w:rPr>
+            <w:noProof/>
+            <w:webHidden/>
+          </w:rPr>
+          <w:tab/>
+        </w:r>
+        <w:r>
+          <w:rPr>
+            <w:noProof/>
+            <w:webHidden/>
+          </w:rPr>
+          <w:fldChar w:fldCharType="begin"/>
+        </w:r>
+        <w:r>
+          <w:rPr>
+            <w:noProof/>
+            <w:webHidden/>
+          </w:rPr>
+          <w:instrText xml:space="preserve"> PAGEREF _Toc241234441 \h </w:instrText>
+        </w:r>
+        <w:r>
+          <w:rPr>
+            <w:noProof/>
+            <w:webHidden/>
+          </w:rPr>
+        </w:r>
+        <w:r>
+          <w:rPr>
+            <w:noProof/>
+            <w:webHidden/>
+          </w:rPr>
+          <w:fldChar w:fldCharType="separate"/>
+        </w:r>
+        <w:r>
+          <w:rPr>
+            <w:noProof/>
+            <w:webHidden/>
+          </w:rPr>
+          <w:t>21</w:t>
+        </w:r>
+        <w:r>
+          <w:rPr>
+            <w:noProof/>
+            <w:webHidden/>
+          </w:rPr>
+          <w:fldChar w:fldCharType="end"/>
+        </w:r>
+      </w:hyperlink>
+    </w:p>
+    <w:p>
+      <w:pPr>
+        <w:pStyle w:val="TOC3"/>
+        <w:tabs>
+          <w:tab w:val="right" w:leader="dot" w:pos="9736"/>
+        </w:tabs>
+        <w:rPr>
+          <w:noProof/>
+        </w:rPr>
+      </w:pPr>
+      <w:hyperlink w:anchor="_Toc241234442" w:history="1">
         <w:r>
           <w:rPr>
             <w:rStyle w:val="Hyperlink"/>
@@ -2488,7 +2538,7 @@
             <w:noProof/>
             <w:webHidden/>
           </w:rPr>
-          <w:instrText xml:space="preserve"> PAGEREF _Toc241219152 \h </w:instrText>
+          <w:instrText xml:space="preserve"> PAGEREF _Toc241234442 \h </w:instrText>
         </w:r>
         <w:r>
           <w:rPr>
@@ -2508,7 +2558,7 @@
             <w:noProof/>
             <w:webHidden/>
           </w:rPr>
-          <w:t>27</w:t>
+          <w:t>28</w:t>
         </w:r>
         <w:r>
           <w:rPr>
@@ -2529,7 +2579,7 @@
           <w:noProof/>
         </w:rPr>
       </w:pPr>
-      <w:hyperlink w:anchor="_Toc241219153" w:history="1">
+      <w:hyperlink w:anchor="_Toc241234443" w:history="1">
         <w:r>
           <w:rPr>
             <w:rStyle w:val="Hyperlink"/>
@@ -2556,75 +2606,7 @@
             <w:noProof/>
             <w:webHidden/>
           </w:rPr>
-          <w:instrText xml:space="preserve"> PAGEREF _Toc241219153 \h </w:instrText>
-        </w:r>
-        <w:r>
-          <w:rPr>
-            <w:noProof/>
-            <w:webHidden/>
-          </w:rPr>
-        </w:r>
-        <w:r>
-          <w:rPr>
-            <w:noProof/>
-            <w:webHidden/>
-          </w:rPr>
-          <w:fldChar w:fldCharType="separate"/>
-        </w:r>
-        <w:r>
-          <w:rPr>
-            <w:noProof/>
-            <w:webHidden/>
-          </w:rPr>
-          <w:t>30</w:t>
-        </w:r>
-        <w:r>
-          <w:rPr>
-            <w:noProof/>
-            <w:webHidden/>
-          </w:rPr>
-          <w:fldChar w:fldCharType="end"/>
-        </w:r>
-      </w:hyperlink>
-    </w:p>
-    <w:p>
-      <w:pPr>
-        <w:pStyle w:val="TOC3"/>
-        <w:tabs>
-          <w:tab w:val="right" w:leader="dot" w:pos="9736"/>
-        </w:tabs>
-        <w:rPr>
-          <w:noProof/>
-        </w:rPr>
-      </w:pPr>
-      <w:hyperlink w:anchor="_Toc241219154" w:history="1">
-        <w:r>
-          <w:rPr>
-            <w:rStyle w:val="Hyperlink"/>
-            <w:noProof/>
-          </w:rPr>
-          <w:t>2.6.d · Manufacturing Process Description</w:t>
-        </w:r>
-        <w:r>
-          <w:rPr>
-            <w:noProof/>
-            <w:webHidden/>
-          </w:rPr>
-          <w:tab/>
-        </w:r>
-        <w:r>
-          <w:rPr>
-            <w:noProof/>
-            <w:webHidden/>
-          </w:rPr>
-          <w:fldChar w:fldCharType="begin"/>
-        </w:r>
-        <w:r>
-          <w:rPr>
-            <w:noProof/>
-            <w:webHidden/>
-          </w:rPr>
-          <w:instrText xml:space="preserve"> PAGEREF _Toc241219154 \h </w:instrText>
+          <w:instrText xml:space="preserve"> PAGEREF _Toc241234443 \h </w:instrText>
         </w:r>
         <w:r>
           <w:rPr>
@@ -2665,7 +2647,75 @@
           <w:noProof/>
         </w:rPr>
       </w:pPr>
-      <w:hyperlink w:anchor="_Toc241219155" w:history="1">
+      <w:hyperlink w:anchor="_Toc241234444" w:history="1">
+        <w:r>
+          <w:rPr>
+            <w:rStyle w:val="Hyperlink"/>
+            <w:noProof/>
+          </w:rPr>
+          <w:t>2.6.d · Manufacturing Process Description</w:t>
+        </w:r>
+        <w:r>
+          <w:rPr>
+            <w:noProof/>
+            <w:webHidden/>
+          </w:rPr>
+          <w:tab/>
+        </w:r>
+        <w:r>
+          <w:rPr>
+            <w:noProof/>
+            <w:webHidden/>
+          </w:rPr>
+          <w:fldChar w:fldCharType="begin"/>
+        </w:r>
+        <w:r>
+          <w:rPr>
+            <w:noProof/>
+            <w:webHidden/>
+          </w:rPr>
+          <w:instrText xml:space="preserve"> PAGEREF _Toc241234444 \h </w:instrText>
+        </w:r>
+        <w:r>
+          <w:rPr>
+            <w:noProof/>
+            <w:webHidden/>
+          </w:rPr>
+        </w:r>
+        <w:r>
+          <w:rPr>
+            <w:noProof/>
+            <w:webHidden/>
+          </w:rPr>
+          <w:fldChar w:fldCharType="separate"/>
+        </w:r>
+        <w:r>
+          <w:rPr>
+            <w:noProof/>
+            <w:webHidden/>
+          </w:rPr>
+          <w:t>32</w:t>
+        </w:r>
+        <w:r>
+          <w:rPr>
+            <w:noProof/>
+            <w:webHidden/>
+          </w:rPr>
+          <w:fldChar w:fldCharType="end"/>
+        </w:r>
+      </w:hyperlink>
+    </w:p>
+    <w:p>
+      <w:pPr>
+        <w:pStyle w:val="TOC3"/>
+        <w:tabs>
+          <w:tab w:val="right" w:leader="dot" w:pos="9736"/>
+        </w:tabs>
+        <w:rPr>
+          <w:noProof/>
+        </w:rPr>
+      </w:pPr>
+      <w:hyperlink w:anchor="_Toc241234445" w:history="1">
         <w:r>
           <w:rPr>
             <w:rStyle w:val="Hyperlink"/>
@@ -2692,7 +2742,7 @@
             <w:noProof/>
             <w:webHidden/>
           </w:rPr>
-          <w:instrText xml:space="preserve"> PAGEREF _Toc241219155 \h </w:instrText>
+          <w:instrText xml:space="preserve"> PAGEREF _Toc241234445 \h </w:instrText>
         </w:r>
         <w:r>
           <w:rPr>
@@ -2712,7 +2762,7 @@
             <w:noProof/>
             <w:webHidden/>
           </w:rPr>
-          <w:t>31</w:t>
+          <w:t>32</w:t>
         </w:r>
         <w:r>
           <w:rPr>
@@ -2733,7 +2783,7 @@
           <w:noProof/>
         </w:rPr>
       </w:pPr>
-      <w:hyperlink w:anchor="_Toc241219156" w:history="1">
+      <w:hyperlink w:anchor="_Toc241234446" w:history="1">
         <w:r>
           <w:rPr>
             <w:rStyle w:val="Hyperlink"/>
@@ -2760,7 +2810,7 @@
             <w:noProof/>
             <w:webHidden/>
           </w:rPr>
-          <w:instrText xml:space="preserve"> PAGEREF _Toc241219156 \h </w:instrText>
+          <w:instrText xml:space="preserve"> PAGEREF _Toc241234446 \h </w:instrText>
         </w:r>
         <w:r>
           <w:rPr>
@@ -2780,7 +2830,7 @@
             <w:noProof/>
             <w:webHidden/>
           </w:rPr>
-          <w:t>31</w:t>
+          <w:t>32</w:t>
         </w:r>
         <w:r>
           <w:rPr>
@@ -2801,7 +2851,7 @@
           <w:noProof/>
         </w:rPr>
       </w:pPr>
-      <w:hyperlink w:anchor="_Toc241219157" w:history="1">
+      <w:hyperlink w:anchor="_Toc241234447" w:history="1">
         <w:r>
           <w:rPr>
             <w:rStyle w:val="Hyperlink"/>
@@ -2828,7 +2878,7 @@
             <w:noProof/>
             <w:webHidden/>
           </w:rPr>
-          <w:instrText xml:space="preserve"> PAGEREF _Toc241219157 \h </w:instrText>
+          <w:instrText xml:space="preserve"> PAGEREF _Toc241234447 \h </w:instrText>
         </w:r>
         <w:r>
           <w:rPr>
@@ -2848,7 +2898,7 @@
             <w:noProof/>
             <w:webHidden/>
           </w:rPr>
-          <w:t>31</w:t>
+          <w:t>32</w:t>
         </w:r>
         <w:r>
           <w:rPr>
@@ -2869,7 +2919,7 @@
           <w:noProof/>
         </w:rPr>
       </w:pPr>
-      <w:hyperlink w:anchor="_Toc241219158" w:history="1">
+      <w:hyperlink w:anchor="_Toc241234448" w:history="1">
         <w:r>
           <w:rPr>
             <w:rStyle w:val="Hyperlink"/>
@@ -2896,7 +2946,7 @@
             <w:noProof/>
             <w:webHidden/>
           </w:rPr>
-          <w:instrText xml:space="preserve"> PAGEREF _Toc241219158 \h </w:instrText>
+          <w:instrText xml:space="preserve"> PAGEREF _Toc241234448 \h </w:instrText>
         </w:r>
         <w:r>
           <w:rPr>
@@ -2916,7 +2966,7 @@
             <w:noProof/>
             <w:webHidden/>
           </w:rPr>
-          <w:t>33</w:t>
+          <w:t>34</w:t>
         </w:r>
         <w:r>
           <w:rPr>
@@ -2937,7 +2987,7 @@
           <w:noProof/>
         </w:rPr>
       </w:pPr>
-      <w:hyperlink w:anchor="_Toc241219159" w:history="1">
+      <w:hyperlink w:anchor="_Toc241234449" w:history="1">
         <w:r>
           <w:rPr>
             <w:rStyle w:val="Hyperlink"/>
@@ -2964,7 +3014,7 @@
             <w:noProof/>
             <w:webHidden/>
           </w:rPr>
-          <w:instrText xml:space="preserve"> PAGEREF _Toc241219159 \h </w:instrText>
+          <w:instrText xml:space="preserve"> PAGEREF _Toc241234449 \h </w:instrText>
         </w:r>
         <w:r>
           <w:rPr>
@@ -2984,7 +3034,7 @@
             <w:noProof/>
             <w:webHidden/>
           </w:rPr>
-          <w:t>33</w:t>
+          <w:t>34</w:t>
         </w:r>
         <w:r>
           <w:rPr>
@@ -3005,7 +3055,7 @@
           <w:noProof/>
         </w:rPr>
       </w:pPr>
-      <w:hyperlink w:anchor="_Toc241219160" w:history="1">
+      <w:hyperlink w:anchor="_Toc241234450" w:history="1">
         <w:r>
           <w:rPr>
             <w:rStyle w:val="Hyperlink"/>
@@ -3032,7 +3082,7 @@
             <w:noProof/>
             <w:webHidden/>
           </w:rPr>
-          <w:instrText xml:space="preserve"> PAGEREF _Toc241219160 \h </w:instrText>
+          <w:instrText xml:space="preserve"> PAGEREF _Toc241234450 \h </w:instrText>
         </w:r>
         <w:r>
           <w:rPr>
@@ -3052,7 +3102,7 @@
             <w:noProof/>
             <w:webHidden/>
           </w:rPr>
-          <w:t>33</w:t>
+          <w:t>34</w:t>
         </w:r>
         <w:r>
           <w:rPr>
@@ -3073,7 +3123,7 @@
           <w:noProof/>
         </w:rPr>
       </w:pPr>
-      <w:hyperlink w:anchor="_Toc241219161" w:history="1">
+      <w:hyperlink w:anchor="_Toc241234451" w:history="1">
         <w:r>
           <w:rPr>
             <w:rStyle w:val="Hyperlink"/>
@@ -3100,7 +3150,7 @@
             <w:noProof/>
             <w:webHidden/>
           </w:rPr>
-          <w:instrText xml:space="preserve"> PAGEREF _Toc241219161 \h </w:instrText>
+          <w:instrText xml:space="preserve"> PAGEREF _Toc241234451 \h </w:instrText>
         </w:r>
         <w:r>
           <w:rPr>
@@ -3120,7 +3170,7 @@
             <w:noProof/>
             <w:webHidden/>
           </w:rPr>
-          <w:t>33</w:t>
+          <w:t>34</w:t>
         </w:r>
         <w:r>
           <w:rPr>
@@ -3141,7 +3191,7 @@
           <w:noProof/>
         </w:rPr>
       </w:pPr>
-      <w:hyperlink w:anchor="_Toc241219162" w:history="1">
+      <w:hyperlink w:anchor="_Toc241234452" w:history="1">
         <w:r>
           <w:rPr>
             <w:rStyle w:val="Hyperlink"/>
@@ -3168,7 +3218,7 @@
             <w:noProof/>
             <w:webHidden/>
           </w:rPr>
-          <w:instrText xml:space="preserve"> PAGEREF _Toc241219162 \h </w:instrText>
+          <w:instrText xml:space="preserve"> PAGEREF _Toc241234452 \h </w:instrText>
         </w:r>
         <w:r>
           <w:rPr>
@@ -3188,7 +3238,7 @@
             <w:noProof/>
             <w:webHidden/>
           </w:rPr>
-          <w:t>33</w:t>
+          <w:t>35</w:t>
         </w:r>
         <w:r>
           <w:rPr>
@@ -3214,7 +3264,7 @@
       <w:pPr>
         <w:pStyle w:val="Heading1"/>
       </w:pPr>
-      <w:bookmarkStart w:id="0" w:name="_Toc241219133"/>
+      <w:bookmarkStart w:id="0" w:name="_Toc241234423"/>
       <w:r>
         <w:lastRenderedPageBreak/>
         <w:t>About This Document</w:t>
@@ -3317,7 +3367,7 @@
       <w:pPr>
         <w:pStyle w:val="Heading1"/>
       </w:pPr>
-      <w:bookmarkStart w:id="1" w:name="_Toc241219134"/>
+      <w:bookmarkStart w:id="1" w:name="_Toc241234424"/>
       <w:r>
         <w:t>1. Basic Information (Application and Organization)</w:t>
       </w:r>
@@ -3464,7 +3514,7 @@
       <w:pPr>
         <w:pStyle w:val="Heading2"/>
       </w:pPr>
-      <w:bookmarkStart w:id="2" w:name="_Toc241219135"/>
+      <w:bookmarkStart w:id="2" w:name="_Toc241234425"/>
       <w:r>
         <w:t>1.0 · Status Summary — Section 1</w:t>
       </w:r>
@@ -3841,7 +3891,7 @@
       <w:pPr>
         <w:pStyle w:val="Heading2"/>
       </w:pPr>
-      <w:bookmarkStart w:id="3" w:name="_Toc241219136"/>
+      <w:bookmarkStart w:id="3" w:name="_Toc241234426"/>
       <w:r>
         <w:t>1.1 · Application Form</w:t>
       </w:r>
@@ -4893,7 +4943,7 @@
       <w:pPr>
         <w:pStyle w:val="Heading2"/>
       </w:pPr>
-      <w:bookmarkStart w:id="4" w:name="_Toc241219137"/>
+      <w:bookmarkStart w:id="4" w:name="_Toc241234427"/>
       <w:r>
         <w:t>1.2 · Business License / Company Registration Certificate</w:t>
       </w:r>
@@ -5442,7 +5492,7 @@
       <w:pPr>
         <w:pStyle w:val="Heading2"/>
       </w:pPr>
-      <w:bookmarkStart w:id="5" w:name="_Toc241219138"/>
+      <w:bookmarkStart w:id="5" w:name="_Toc241234428"/>
       <w:r>
         <w:t>1.3 · Organizational Chart and Contact Information</w:t>
       </w:r>
@@ -5991,7 +6041,7 @@
       <w:pPr>
         <w:pStyle w:val="Heading2"/>
       </w:pPr>
-      <w:bookmarkStart w:id="6" w:name="_Toc241219139"/>
+      <w:bookmarkStart w:id="6" w:name="_Toc241234429"/>
       <w:r>
         <w:t>1.4 · Manufacturing Plant Address and Introduction of Production Facilities</w:t>
       </w:r>
@@ -6503,7 +6553,7 @@
       <w:pPr>
         <w:pStyle w:val="Heading2"/>
       </w:pPr>
-      <w:bookmarkStart w:id="7" w:name="_Toc241219140"/>
+      <w:bookmarkStart w:id="7" w:name="_Toc241234430"/>
       <w:r>
         <w:t>1.5 · ISO 9001 Certificate, Quality Manual, and Procedure Index</w:t>
       </w:r>
@@ -6926,7 +6976,7 @@
       <w:pPr>
         <w:pStyle w:val="Heading1"/>
       </w:pPr>
-      <w:bookmarkStart w:id="8" w:name="_Toc241219141"/>
+      <w:bookmarkStart w:id="8" w:name="_Toc241234431"/>
       <w:r>
         <w:t>2. Technical Documentation</w:t>
       </w:r>
@@ -6941,7 +6991,7 @@
       <w:pPr>
         <w:pStyle w:val="Heading2"/>
       </w:pPr>
-      <w:bookmarkStart w:id="9" w:name="_Toc241219142"/>
+      <w:bookmarkStart w:id="9" w:name="_Toc241234432"/>
       <w:r>
         <w:t>2.1 · Detailed Product Description</w:t>
       </w:r>
@@ -6974,7 +7024,7 @@
       <w:pPr>
         <w:pStyle w:val="Heading2"/>
       </w:pPr>
-      <w:bookmarkStart w:id="10" w:name="_Toc241219143"/>
+      <w:bookmarkStart w:id="10" w:name="_Toc241234433"/>
       <w:r>
         <w:t>2.2 · Product Name, Model, and Specification List</w:t>
       </w:r>
@@ -7418,7 +7468,7 @@
       <w:pPr>
         <w:pStyle w:val="Heading2"/>
       </w:pPr>
-      <w:bookmarkStart w:id="11" w:name="_Toc241219144"/>
+      <w:bookmarkStart w:id="11" w:name="_Toc241234434"/>
       <w:r>
         <w:t>2.3 · Functional Description and Technical Parameters (Electrical, Mechanical, etc.)</w:t>
       </w:r>
@@ -7436,7 +7486,7 @@
       <w:pPr>
         <w:pStyle w:val="Heading3"/>
       </w:pPr>
-      <w:bookmarkStart w:id="12" w:name="_Toc241219145"/>
+      <w:bookmarkStart w:id="12" w:name="_Toc241234435"/>
       <w:r>
         <w:t>2.3.a · Electrical Parameters — Node Sensor (GLD)</w:t>
       </w:r>
@@ -7842,7 +7892,7 @@
                 <w:b/>
                 <w:sz w:val="19"/>
               </w:rPr>
-              <w:t>Maximum input current</w:t>
+              <w:t>Equipment boundary (mains exposure)</w:t>
             </w:r>
           </w:p>
         </w:tc>
@@ -7858,7 +7908,7 @@
               <w:rPr>
                 <w:sz w:val="19"/>
               </w:rPr>
-              <w:t>≈0.33 A @ 24 VDC</w:t>
+              <w:t>None — 24 VDC only</w:t>
             </w:r>
           </w:p>
         </w:tc>
@@ -7876,7 +7926,7 @@
                 <w:color w:val="149174"/>
                 <w:sz w:val="19"/>
               </w:rPr>
-              <w:t>Calculated</w:t>
+              <w:t>Final</w:t>
             </w:r>
           </w:p>
         </w:tc>
@@ -7892,7 +7942,7 @@
               <w:rPr>
                 <w:sz w:val="19"/>
               </w:rPr>
-              <w:t>Calculated from measured maximum power consumption (7.995 W) divided by 24 VDC.</w:t>
+              <w:t>The Node Sensor (GLD) itself receives only 24 VDC at its terminal and never carries 220 VAC internally. The AC/DC adapter (220 VAC/50 Hz → 24 VDC) is a separate, site-supplied device outside the physical boundary of the certified unit; its own installation location (e.g., relative to the hazardous-area zone) is a site electrical-design matter, not a parameter of this equipment.</w:t>
             </w:r>
           </w:p>
         </w:tc>
@@ -7915,7 +7965,8 @@
                 <w:b/>
                 <w:sz w:val="19"/>
               </w:rPr>
-              <w:t>Maximum power consumption</w:t>
+              <w:lastRenderedPageBreak/>
+              <w:t>Maximum input current</w:t>
             </w:r>
           </w:p>
         </w:tc>
@@ -7931,7 +7982,7 @@
               <w:rPr>
                 <w:sz w:val="19"/>
               </w:rPr>
-              <w:t>7.995 W @ 24 VDC</w:t>
+              <w:t>≈0.33 A @ 24 VDC</w:t>
             </w:r>
           </w:p>
         </w:tc>
@@ -7949,7 +8000,7 @@
                 <w:color w:val="149174"/>
                 <w:sz w:val="19"/>
               </w:rPr>
-              <w:t>Measured — production config.</w:t>
+              <w:t>Calculated</w:t>
             </w:r>
           </w:p>
         </w:tc>
@@ -7965,7 +8016,7 @@
               <w:rPr>
                 <w:sz w:val="19"/>
               </w:rPr>
-              <w:t>Applies to the continuous-power configuration. The battery (R&amp;D) configuration is recorded separately at 5.75 W — a different operating mode, not a data conflict.</w:t>
+              <w:t>Calculated from measured maximum power consumption (7.995 W) divided by 24 VDC.</w:t>
             </w:r>
           </w:p>
         </w:tc>
@@ -7988,7 +8039,79 @@
                 <w:b/>
                 <w:sz w:val="19"/>
               </w:rPr>
-              <w:lastRenderedPageBreak/>
+              <w:t>Maximum power consumption</w:t>
+            </w:r>
+          </w:p>
+        </w:tc>
+        <w:tc>
+          <w:tcPr>
+            <w:tcW w:w="2160" w:type="dxa"/>
+          </w:tcPr>
+          <w:p>
+            <w:pPr>
+              <w:spacing w:after="40"/>
+            </w:pPr>
+            <w:r>
+              <w:rPr>
+                <w:sz w:val="19"/>
+              </w:rPr>
+              <w:t>7.995 W @ 24 VDC</w:t>
+            </w:r>
+          </w:p>
+        </w:tc>
+        <w:tc>
+          <w:tcPr>
+            <w:tcW w:w="1584" w:type="dxa"/>
+          </w:tcPr>
+          <w:p>
+            <w:pPr>
+              <w:spacing w:after="40"/>
+            </w:pPr>
+            <w:r>
+              <w:rPr>
+                <w:b/>
+                <w:color w:val="149174"/>
+                <w:sz w:val="19"/>
+              </w:rPr>
+              <w:t>Measured — production config.</w:t>
+            </w:r>
+          </w:p>
+        </w:tc>
+        <w:tc>
+          <w:tcPr>
+            <w:tcW w:w="3312" w:type="dxa"/>
+          </w:tcPr>
+          <w:p>
+            <w:pPr>
+              <w:spacing w:after="40"/>
+            </w:pPr>
+            <w:r>
+              <w:rPr>
+                <w:sz w:val="19"/>
+              </w:rPr>
+              <w:t>Applies to the continuous-power configuration. The battery (R&amp;D) configuration is recorded separately at 5.75 W — a different operating mode, not a data conflict.</w:t>
+            </w:r>
+          </w:p>
+        </w:tc>
+      </w:tr>
+      <w:tr>
+        <w:trPr>
+          <w:cantSplit/>
+          <w:jc w:val="center"/>
+        </w:trPr>
+        <w:tc>
+          <w:tcPr>
+            <w:tcW w:w="2304" w:type="dxa"/>
+          </w:tcPr>
+          <w:p>
+            <w:pPr>
+              <w:spacing w:after="40"/>
+            </w:pPr>
+            <w:r>
+              <w:rPr>
+                <w:b/>
+                <w:sz w:val="19"/>
+              </w:rPr>
               <w:t>Electrical protection (fuse, reverse polarity, overvoltage, overcurrent)</w:t>
             </w:r>
           </w:p>
@@ -8060,7 +8183,7 @@
       <w:pPr>
         <w:pStyle w:val="Heading3"/>
       </w:pPr>
-      <w:bookmarkStart w:id="13" w:name="_Toc241219146"/>
+      <w:bookmarkStart w:id="13" w:name="_Toc241234436"/>
       <w:r>
         <w:t>2.3.b · Sensor and Communication Parameters — Node Sensor (GLD)</w:t>
       </w:r>
@@ -8326,6 +8449,7 @@
                 <w:b/>
                 <w:sz w:val="19"/>
               </w:rPr>
+              <w:lastRenderedPageBreak/>
               <w:t>Environmental sensor (temperature/humidity)</w:t>
             </w:r>
           </w:p>
@@ -8472,7 +8596,6 @@
                 <w:b/>
                 <w:sz w:val="19"/>
               </w:rPr>
-              <w:lastRenderedPageBreak/>
               <w:t>Processing unit</w:t>
             </w:r>
           </w:p>
@@ -9122,8 +9245,9 @@
       <w:pPr>
         <w:pStyle w:val="Heading3"/>
       </w:pPr>
-      <w:bookmarkStart w:id="14" w:name="_Toc241219147"/>
+      <w:bookmarkStart w:id="14" w:name="_Toc241234437"/>
       <w:r>
+        <w:lastRenderedPageBreak/>
         <w:t>2.3.c · Mechanical Parameters — Node Sensor (GLD)</w:t>
       </w:r>
       <w:bookmarkEnd w:id="14"/>
@@ -9973,7 +10097,7 @@
       <w:pPr>
         <w:pStyle w:val="Heading2"/>
       </w:pPr>
-      <w:bookmarkStart w:id="15" w:name="_Toc241219148"/>
+      <w:bookmarkStart w:id="15" w:name="_Toc241234438"/>
       <w:r>
         <w:t>2.4 · Product Photographs — Overall and Key Components</w:t>
       </w:r>
@@ -10012,7 +10136,7 @@
                 <w:noProof/>
               </w:rPr>
               <w:drawing>
-                <wp:inline distT="0" distB="0" distL="0" distR="0" wp14:anchorId="7C9B1345" wp14:editId="643F3773">
+                <wp:inline distT="0" distB="0" distL="0" distR="0" wp14:anchorId="749E721A" wp14:editId="7D8C5890">
                   <wp:extent cx="1379912" cy="2286000"/>
                   <wp:effectExtent l="0" t="0" r="0" b="0"/>
                   <wp:docPr id="1" name="Picture 1"/>
@@ -10089,7 +10213,7 @@
                 <w:noProof/>
               </w:rPr>
               <w:drawing>
-                <wp:inline distT="0" distB="0" distL="0" distR="0" wp14:anchorId="683F1A81" wp14:editId="57E8BE00">
+                <wp:inline distT="0" distB="0" distL="0" distR="0" wp14:anchorId="0C2E75BD" wp14:editId="6D679D03">
                   <wp:extent cx="1714500" cy="2286000"/>
                   <wp:effectExtent l="0" t="0" r="0" b="0"/>
                   <wp:docPr id="2" name="Picture 2"/>
@@ -10171,7 +10295,7 @@
                 <w:noProof/>
               </w:rPr>
               <w:drawing>
-                <wp:inline distT="0" distB="0" distL="0" distR="0" wp14:anchorId="16CDD880" wp14:editId="71F75973">
+                <wp:inline distT="0" distB="0" distL="0" distR="0" wp14:anchorId="3AFF75A0" wp14:editId="75504693">
                   <wp:extent cx="1026621" cy="2286000"/>
                   <wp:effectExtent l="0" t="0" r="0" b="0"/>
                   <wp:docPr id="3" name="Picture 3"/>
@@ -10248,7 +10372,7 @@
                 <w:noProof/>
               </w:rPr>
               <w:drawing>
-                <wp:inline distT="0" distB="0" distL="0" distR="0" wp14:anchorId="392F7E66" wp14:editId="6E10DF00">
+                <wp:inline distT="0" distB="0" distL="0" distR="0" wp14:anchorId="23B0723C" wp14:editId="431B32F3">
                   <wp:extent cx="1026621" cy="2286000"/>
                   <wp:effectExtent l="0" t="0" r="0" b="0"/>
                   <wp:docPr id="4" name="Picture 4"/>
@@ -10331,7 +10455,7 @@
               </w:rPr>
               <w:lastRenderedPageBreak/>
               <w:drawing>
-                <wp:inline distT="0" distB="0" distL="0" distR="0" wp14:anchorId="1847FBF0" wp14:editId="1C98E042">
+                <wp:inline distT="0" distB="0" distL="0" distR="0" wp14:anchorId="057E753D" wp14:editId="5F645A48">
                   <wp:extent cx="1026621" cy="2286000"/>
                   <wp:effectExtent l="0" t="0" r="0" b="0"/>
                   <wp:docPr id="5" name="Picture 5"/>
@@ -10408,7 +10532,7 @@
                 <w:noProof/>
               </w:rPr>
               <w:drawing>
-                <wp:inline distT="0" distB="0" distL="0" distR="0" wp14:anchorId="2FE0150D" wp14:editId="42945BBB">
+                <wp:inline distT="0" distB="0" distL="0" distR="0" wp14:anchorId="27E8740B" wp14:editId="1BB89574">
                   <wp:extent cx="1026621" cy="2286000"/>
                   <wp:effectExtent l="0" t="0" r="0" b="0"/>
                   <wp:docPr id="6" name="Picture 6"/>
@@ -10490,7 +10614,7 @@
                 <w:noProof/>
               </w:rPr>
               <w:drawing>
-                <wp:inline distT="0" distB="0" distL="0" distR="0" wp14:anchorId="508FDDC3" wp14:editId="3A3B70F6">
+                <wp:inline distT="0" distB="0" distL="0" distR="0" wp14:anchorId="134A333F" wp14:editId="209CC2E4">
                   <wp:extent cx="1026621" cy="2286000"/>
                   <wp:effectExtent l="0" t="0" r="0" b="0"/>
                   <wp:docPr id="7" name="Picture 7"/>
@@ -10614,7 +10738,7 @@
       <w:pPr>
         <w:pStyle w:val="Heading2"/>
       </w:pPr>
-      <w:bookmarkStart w:id="16" w:name="_Toc241219149"/>
+      <w:bookmarkStart w:id="16" w:name="_Toc241234439"/>
       <w:r>
         <w:t>2.5 · Description of Intended Use and Installation Environment (Gas Group, Temperature Class, Area Classification)</w:t>
       </w:r>
@@ -11077,7 +11201,7 @@
       <w:pPr>
         <w:pStyle w:val="Heading2"/>
       </w:pPr>
-      <w:bookmarkStart w:id="17" w:name="_Toc241219150"/>
+      <w:bookmarkStart w:id="17" w:name="_Toc241234440"/>
       <w:r>
         <w:t>2.6 · Design and Manufacturing Information</w:t>
       </w:r>
@@ -11092,7 +11216,7 @@
       <w:pPr>
         <w:pStyle w:val="Heading3"/>
       </w:pPr>
-      <w:bookmarkStart w:id="18" w:name="_Toc241219151"/>
+      <w:bookmarkStart w:id="18" w:name="_Toc241234441"/>
       <w:r>
         <w:lastRenderedPageBreak/>
         <w:t>2.6.a · Complete Drawings (Assembly, Component, Electrical Schematic, PCB Layout, Enclosure Structure, Junction Box, Terminal, Grounding)</w:t>
@@ -11113,7 +11237,7 @@
           <w:noProof/>
         </w:rPr>
         <w:drawing>
-          <wp:inline distT="0" distB="0" distL="0" distR="0" wp14:anchorId="15694F28" wp14:editId="040E7771">
+          <wp:inline distT="0" distB="0" distL="0" distR="0" wp14:anchorId="38ED77D9" wp14:editId="091BA391">
             <wp:extent cx="5120640" cy="3413760"/>
             <wp:effectExtent l="0" t="0" r="0" b="0"/>
             <wp:docPr id="8" name="Picture 8"/>
@@ -11186,7 +11310,7 @@
         </w:rPr>
         <w:lastRenderedPageBreak/>
         <w:drawing>
-          <wp:inline distT="0" distB="0" distL="0" distR="0" wp14:anchorId="3A08EF96" wp14:editId="03DC168D">
+          <wp:inline distT="0" distB="0" distL="0" distR="0" wp14:anchorId="045E9C17" wp14:editId="3C96CA7D">
             <wp:extent cx="5120640" cy="3413760"/>
             <wp:effectExtent l="0" t="0" r="0" b="0"/>
             <wp:docPr id="9" name="Picture 9"/>
@@ -11258,7 +11382,7 @@
           <w:noProof/>
         </w:rPr>
         <w:drawing>
-          <wp:inline distT="0" distB="0" distL="0" distR="0" wp14:anchorId="2D59D685" wp14:editId="6A87881A">
+          <wp:inline distT="0" distB="0" distL="0" distR="0" wp14:anchorId="7FE2F6B9" wp14:editId="412004D4">
             <wp:extent cx="5120640" cy="3413760"/>
             <wp:effectExtent l="0" t="0" r="0" b="0"/>
             <wp:docPr id="10" name="Picture 10"/>
@@ -11331,7 +11455,7 @@
         </w:rPr>
         <w:lastRenderedPageBreak/>
         <w:drawing>
-          <wp:inline distT="0" distB="0" distL="0" distR="0" wp14:anchorId="6C7D3AD7" wp14:editId="1B472B71">
+          <wp:inline distT="0" distB="0" distL="0" distR="0" wp14:anchorId="046608F8" wp14:editId="5972BE4D">
             <wp:extent cx="5120640" cy="3413760"/>
             <wp:effectExtent l="0" t="0" r="0" b="0"/>
             <wp:docPr id="11" name="Picture 11"/>
@@ -11403,7 +11527,7 @@
           <w:noProof/>
         </w:rPr>
         <w:drawing>
-          <wp:inline distT="0" distB="0" distL="0" distR="0" wp14:anchorId="145A3FBB" wp14:editId="654BACD1">
+          <wp:inline distT="0" distB="0" distL="0" distR="0" wp14:anchorId="21FB7042" wp14:editId="460E571D">
             <wp:extent cx="5120640" cy="3413760"/>
             <wp:effectExtent l="0" t="0" r="0" b="0"/>
             <wp:docPr id="12" name="Picture 12"/>
@@ -11476,7 +11600,7 @@
         </w:rPr>
         <w:lastRenderedPageBreak/>
         <w:drawing>
-          <wp:inline distT="0" distB="0" distL="0" distR="0" wp14:anchorId="2331BD7F" wp14:editId="463F765F">
+          <wp:inline distT="0" distB="0" distL="0" distR="0" wp14:anchorId="2F30C3C9" wp14:editId="7CD3BE19">
             <wp:extent cx="5120640" cy="3413760"/>
             <wp:effectExtent l="0" t="0" r="0" b="0"/>
             <wp:docPr id="13" name="Picture 13"/>
@@ -11548,7 +11672,7 @@
           <w:noProof/>
         </w:rPr>
         <w:drawing>
-          <wp:inline distT="0" distB="0" distL="0" distR="0" wp14:anchorId="0BACEE0F" wp14:editId="04357D3C">
+          <wp:inline distT="0" distB="0" distL="0" distR="0" wp14:anchorId="6230BB3E" wp14:editId="028C249A">
             <wp:extent cx="5120640" cy="3413760"/>
             <wp:effectExtent l="0" t="0" r="0" b="0"/>
             <wp:docPr id="14" name="Picture 14"/>
@@ -11621,7 +11745,7 @@
         </w:rPr>
         <w:lastRenderedPageBreak/>
         <w:drawing>
-          <wp:inline distT="0" distB="0" distL="0" distR="0" wp14:anchorId="13121ABA" wp14:editId="38980054">
+          <wp:inline distT="0" distB="0" distL="0" distR="0" wp14:anchorId="5564CAB6" wp14:editId="16C18CC0">
             <wp:extent cx="5120640" cy="3413760"/>
             <wp:effectExtent l="0" t="0" r="0" b="0"/>
             <wp:docPr id="15" name="Picture 15"/>
@@ -11693,7 +11817,7 @@
           <w:noProof/>
         </w:rPr>
         <w:drawing>
-          <wp:inline distT="0" distB="0" distL="0" distR="0" wp14:anchorId="3A51572E" wp14:editId="5D8A502F">
+          <wp:inline distT="0" distB="0" distL="0" distR="0" wp14:anchorId="1A416A0F" wp14:editId="5A8E7FCA">
             <wp:extent cx="5120640" cy="3413760"/>
             <wp:effectExtent l="0" t="0" r="0" b="0"/>
             <wp:docPr id="16" name="Picture 16"/>
@@ -11766,7 +11890,7 @@
         </w:rPr>
         <w:lastRenderedPageBreak/>
         <w:drawing>
-          <wp:inline distT="0" distB="0" distL="0" distR="0" wp14:anchorId="1E32F810" wp14:editId="24634140">
+          <wp:inline distT="0" distB="0" distL="0" distR="0" wp14:anchorId="27C94705" wp14:editId="6FB64E19">
             <wp:extent cx="2468880" cy="2479268"/>
             <wp:effectExtent l="0" t="0" r="0" b="0"/>
             <wp:docPr id="17" name="Picture 17"/>
@@ -11809,7 +11933,7 @@
           <w:noProof/>
         </w:rPr>
         <w:drawing>
-          <wp:inline distT="0" distB="0" distL="0" distR="0" wp14:anchorId="0ECAFA03" wp14:editId="1BE5FCB0">
+          <wp:inline distT="0" distB="0" distL="0" distR="0" wp14:anchorId="3FDF19A1" wp14:editId="6CE71BC3">
             <wp:extent cx="2468880" cy="1804956"/>
             <wp:effectExtent l="0" t="0" r="0" b="0"/>
             <wp:docPr id="18" name="Picture 18"/>
@@ -11886,7 +12010,7 @@
           <w:noProof/>
         </w:rPr>
         <w:drawing>
-          <wp:inline distT="0" distB="0" distL="0" distR="0" wp14:anchorId="611BBD3C" wp14:editId="003783B6">
+          <wp:inline distT="0" distB="0" distL="0" distR="0" wp14:anchorId="792105B7" wp14:editId="02E543AE">
             <wp:extent cx="5669280" cy="3847707"/>
             <wp:effectExtent l="0" t="0" r="0" b="0"/>
             <wp:docPr id="19" name="Picture 19"/>
@@ -12437,7 +12561,7 @@
       <w:pPr>
         <w:pStyle w:val="Heading3"/>
       </w:pPr>
-      <w:bookmarkStart w:id="19" w:name="_Toc241219152"/>
+      <w:bookmarkStart w:id="19" w:name="_Toc241234442"/>
       <w:r>
         <w:t>2.6.b · Bill of Materials (BOM) for Explosion-Safety-Relevant Components</w:t>
       </w:r>
@@ -23418,7 +23542,7 @@
       <w:pPr>
         <w:pStyle w:val="Heading3"/>
       </w:pPr>
-      <w:bookmarkStart w:id="20" w:name="_Toc241219153"/>
+      <w:bookmarkStart w:id="20" w:name="_Toc241234443"/>
       <w:r>
         <w:t>2.6.c · Material Specification Sheets / Datasheets (Non-Metallic Materials)</w:t>
       </w:r>
@@ -23439,10 +23563,10 @@
     </w:p>
     <w:p>
       <w:r>
-        <w:t>Non-metallic components in the design that this item will need to cover: the cover-to-body sealing gasket providing the IP66 rating (Section 2.3.c — identified as a rubber gasket in the casing partner's assembly drawing, specific compound/grade not yet specified); the integral seal of the candidate M20×1.5 cable gland (Section 2.3.c); and the antenna/SMA feedthrough insulator (material not yet specified). The protective mesh cover over the gas-sensing element is now identified as a stainless-steel wire mesh</w:t>
+        <w:t>Non-metallic components in the design that this item will need to cover: the cover-to-body sealing gasket providing the IP66 rating (Section 2.3.c — identified as a rubber gasket in the casing partner's assembly drawing, specific compound/grade not yet specified); the integral seal of the candidate M20×1.5 cable gland — per project direction, specified together with the gland itself from the BP18-1Z reference (Section 2.3.c), rather than as a separately sourced component; and the antenna/SMA feedthrough ins</w:t>
       </w:r>
       <w:r>
-        <w:t xml:space="preserve"> in the same assembly drawing — being metallic, it falls outside this specific non-metallic-materials checklist item.</w:t>
+        <w:t>ulator (material not yet specified). The protective mesh cover over the gas-sensing element is now identified as a stainless-steel wire mesh in the same assembly drawing — being metallic, it falls outside this specific non-metallic-materials checklist item.</w:t>
       </w:r>
     </w:p>
     <w:tbl>
@@ -23485,7 +23609,15 @@
                 <w:color w:val="4A4A4A"/>
                 <w:sz w:val="20"/>
               </w:rPr>
-              <w:t>ximum surface capacitance &lt;5 pF (coating thickness ≤ 0.2 mm). These are the type of parameter IEC 60079-0 requires for coated/non-metallic surfaces on Ex equipment, but they describe a supplier's candidate component, not a confirmed datasheet for GLD's own enclosure finish.</w:t>
+              <w:t xml:space="preserve">ximum surface capacitance &lt;5 pF (coating thickness ≤ 0.2 mm). These are the type of parameter IEC 60079-0 requires for coated/non-metallic surfaces on Ex equipment, but they describe a supplier's candidate component, not a confirmed datasheet for GLD's own enclosure </w:t>
+            </w:r>
+            <w:r>
+              <w:rPr>
+                <w:color w:val="4A4A4A"/>
+                <w:sz w:val="20"/>
+              </w:rPr>
+              <w:lastRenderedPageBreak/>
+              <w:t>finish.</w:t>
             </w:r>
           </w:p>
         </w:tc>
@@ -23500,7 +23632,7 @@
       <w:pPr>
         <w:pStyle w:val="Heading3"/>
       </w:pPr>
-      <w:bookmarkStart w:id="21" w:name="_Toc241219154"/>
+      <w:bookmarkStart w:id="21" w:name="_Toc241234444"/>
       <w:r>
         <w:t>2.6.d · Manufacturing Process Description</w:t>
       </w:r>
@@ -23559,7 +23691,7 @@
       <w:pPr>
         <w:pStyle w:val="Heading3"/>
       </w:pPr>
-      <w:bookmarkStart w:id="22" w:name="_Toc241219155"/>
+      <w:bookmarkStart w:id="22" w:name="_Toc241234445"/>
       <w:r>
         <w:t>2.6.e · Explosion-Protection Calculations and Explanations (if applicable)</w:t>
       </w:r>
@@ -23618,7 +23750,7 @@
       <w:pPr>
         <w:pStyle w:val="Heading3"/>
       </w:pPr>
-      <w:bookmarkStart w:id="23" w:name="_Toc241219156"/>
+      <w:bookmarkStart w:id="23" w:name="_Toc241234446"/>
       <w:r>
         <w:t>2.6.f · Temperature Group Calculation (Hottest-Point Temperature Estimation)</w:t>
       </w:r>
@@ -23680,7 +23812,7 @@
       <w:pPr>
         <w:pStyle w:val="Heading3"/>
       </w:pPr>
-      <w:bookmarkStart w:id="24" w:name="_Toc241219157"/>
+      <w:bookmarkStart w:id="24" w:name="_Toc241234447"/>
       <w:r>
         <w:t>2.6.g · Usage and Installation Instructions (Draft)</w:t>
       </w:r>
@@ -23894,6 +24026,7 @@
                 <w:b/>
                 <w:sz w:val="19"/>
               </w:rPr>
+              <w:lastRenderedPageBreak/>
               <w:t>c) Operating instructions and maintenance requirements</w:t>
             </w:r>
           </w:p>
@@ -24140,13 +24273,14 @@
         <w:rPr>
           <w:sz w:val="20"/>
         </w:rPr>
-        <w:t>Before each operating period, check power, enclosure condition, diagnostic status, communication status, and the absence of active faults. Treat an alarm as a real process-safety event until the site response procedure establishes otherwise. If the detector reports a fault or loses required communication, notify the responsible operator and place the affected detection point in the site impairment process. Do not change firmware, model files, alarm thresholds, or calibration parameters from the field withou</w:t>
+        <w:t xml:space="preserve">Before each operating period, check power, enclosure condition, diagnostic status, communication status, and the absence of active faults. Treat an alarm as a real process-safety event until the site response procedure establishes otherwise. If the detector reports a fault or loses required communication, notify the responsible operator and place </w:t>
       </w:r>
       <w:r>
         <w:rPr>
           <w:sz w:val="20"/>
         </w:rPr>
-        <w:t>t controlled approval and a documented rollback path.</w:t>
+        <w:lastRenderedPageBreak/>
+        <w:t>the affected detection point in the site impairment process. Do not change firmware, model files, alarm thresholds, or calibration parameters from the field without controlled approval and a documented rollback path.</w:t>
       </w:r>
     </w:p>
     <w:p>
@@ -24251,7 +24385,6 @@
                 <w:b/>
                 <w:sz w:val="19"/>
               </w:rPr>
-              <w:lastRenderedPageBreak/>
               <w:t>Inference</w:t>
             </w:r>
           </w:p>
@@ -24409,7 +24542,7 @@
       <w:pPr>
         <w:pStyle w:val="Heading3"/>
       </w:pPr>
-      <w:bookmarkStart w:id="25" w:name="_Toc241219158"/>
+      <w:bookmarkStart w:id="25" w:name="_Toc241234448"/>
       <w:r>
         <w:t>2.6.h · Nameplate Information</w:t>
       </w:r>
@@ -24468,7 +24601,7 @@
       <w:pPr>
         <w:pStyle w:val="Heading3"/>
       </w:pPr>
-      <w:bookmarkStart w:id="26" w:name="_Toc241219159"/>
+      <w:bookmarkStart w:id="26" w:name="_Toc241234449"/>
       <w:r>
         <w:t>2.6.i · Ex Component Certificates</w:t>
       </w:r>
@@ -24527,7 +24660,7 @@
       <w:pPr>
         <w:pStyle w:val="Heading1"/>
       </w:pPr>
-      <w:bookmarkStart w:id="27" w:name="_Toc241219160"/>
+      <w:bookmarkStart w:id="27" w:name="_Toc241234450"/>
       <w:r>
         <w:t>3. Sample Information</w:t>
       </w:r>
@@ -24542,7 +24675,7 @@
       <w:pPr>
         <w:pStyle w:val="Heading2"/>
       </w:pPr>
-      <w:bookmarkStart w:id="28" w:name="_Toc241219161"/>
+      <w:bookmarkStart w:id="28" w:name="_Toc241234451"/>
       <w:r>
         <w:t>3.1 · Model, Serial Number, and Status</w:t>
       </w:r>
@@ -24601,8 +24734,9 @@
       <w:pPr>
         <w:pStyle w:val="Heading2"/>
       </w:pPr>
-      <w:bookmarkStart w:id="29" w:name="_Toc241219162"/>
+      <w:bookmarkStart w:id="29" w:name="_Toc241234452"/>
       <w:r>
+        <w:lastRenderedPageBreak/>
         <w:t>3.2 · Test Fixtures and Auxiliary Equipment</w:t>
       </w:r>
       <w:bookmarkEnd w:id="29"/>
@@ -24644,7 +24778,6 @@
                 <w:color w:val="4A4A4A"/>
                 <w:sz w:val="18"/>
               </w:rPr>
-              <w:lastRenderedPageBreak/>
               <w:t>TEST GROUP</w:t>
             </w:r>
           </w:p>
@@ -25342,7 +25475,7 @@
           <w:color w:val="8A8A8A"/>
           <w:sz w:val="17"/>
         </w:rPr>
-        <w:t>This is a working document, prepared in stages, drafted in direct reference to the IECEx/ATEX Certification Information Requirements (original English/Mandarin version issued by the certification body). Data sources: the official product technical datasheet (Institute of Technology Bandung, Revision 4.0), internal technical specification documentation, EMC parameter measurement data, and product photography. Fields marked “Pending confirmation” are not yet final and must not be relied upon for procurement o</w:t>
+        <w:t xml:space="preserve">This is a working document, prepared in stages, drafted in direct reference to the IECEx/ATEX Certification Information Requirements (original English/Mandarin version issued by the certification body). Data sources: the official product technical datasheet (Institute of Technology Bandung, Revision 4.0), internal technical specification documentation, EMC parameter measurement data, and product photography. Fields </w:t>
       </w:r>
       <w:r>
         <w:rPr>
@@ -25350,7 +25483,8 @@
           <w:color w:val="8A8A8A"/>
           <w:sz w:val="17"/>
         </w:rPr>
-        <w:t>r certification purposes without further verification.</w:t>
+        <w:lastRenderedPageBreak/>
+        <w:t>marked “Pending confirmation” are not yet final and must not be relied upon for procurement or certification purposes without further verification.</w:t>
       </w:r>
     </w:p>
     <w:sectPr>
@@ -25401,7 +25535,7 @@
         <w:color w:val="4A4A4A"/>
         <w:sz w:val="16"/>
       </w:rPr>
-      <w:t>LGU/GLD/IECEX-TDF/2026-001  ·  Rev. 1.0</w:t>
+      <w:t>LGU/GLD/IECEX-TDF/2026-001  ·  Rev. 1.1</w:t>
     </w:r>
     <w:r>
       <w:tab/>
@@ -25671,31 +25805,31 @@
       </w:rPr>
     </w:lvl>
   </w:abstractNum>
-  <w:num w:numId="1" w16cid:durableId="407191502">
+  <w:num w:numId="1" w16cid:durableId="64692981">
     <w:abstractNumId w:val="8"/>
   </w:num>
-  <w:num w:numId="2" w16cid:durableId="957956747">
+  <w:num w:numId="2" w16cid:durableId="1170220534">
     <w:abstractNumId w:val="6"/>
   </w:num>
-  <w:num w:numId="3" w16cid:durableId="2119787084">
+  <w:num w:numId="3" w16cid:durableId="1495948652">
     <w:abstractNumId w:val="5"/>
   </w:num>
-  <w:num w:numId="4" w16cid:durableId="798645985">
+  <w:num w:numId="4" w16cid:durableId="808521303">
     <w:abstractNumId w:val="4"/>
   </w:num>
-  <w:num w:numId="5" w16cid:durableId="260375269">
+  <w:num w:numId="5" w16cid:durableId="78719289">
     <w:abstractNumId w:val="7"/>
   </w:num>
-  <w:num w:numId="6" w16cid:durableId="861893312">
+  <w:num w:numId="6" w16cid:durableId="1726097512">
     <w:abstractNumId w:val="3"/>
   </w:num>
-  <w:num w:numId="7" w16cid:durableId="1392271816">
+  <w:num w:numId="7" w16cid:durableId="1190609150">
     <w:abstractNumId w:val="2"/>
   </w:num>
-  <w:num w:numId="8" w16cid:durableId="1754400700">
+  <w:num w:numId="8" w16cid:durableId="298613041">
     <w:abstractNumId w:val="1"/>
   </w:num>
-  <w:num w:numId="9" w16cid:durableId="228226323">
+  <w:num w:numId="9" w16cid:durableId="915095189">
     <w:abstractNumId w:val="0"/>
   </w:num>
 </w:numbering>
@@ -37127,7 +37261,7 @@
     <w:autoRedefine/>
     <w:uiPriority w:val="39"/>
     <w:unhideWhenUsed/>
-    <w:rsid w:val="00EB520E"/>
+    <w:rsid w:val="00626FB9"/>
     <w:pPr>
       <w:spacing w:after="100"/>
     </w:pPr>
@@ -37139,7 +37273,7 @@
     <w:autoRedefine/>
     <w:uiPriority w:val="39"/>
     <w:unhideWhenUsed/>
-    <w:rsid w:val="00EB520E"/>
+    <w:rsid w:val="00626FB9"/>
     <w:pPr>
       <w:spacing w:after="100"/>
       <w:ind w:left="210"/>
@@ -37152,7 +37286,7 @@
     <w:autoRedefine/>
     <w:uiPriority w:val="39"/>
     <w:unhideWhenUsed/>
-    <w:rsid w:val="00EB520E"/>
+    <w:rsid w:val="00626FB9"/>
     <w:pPr>
       <w:spacing w:after="100"/>
       <w:ind w:left="420"/>
@@ -37163,7 +37297,7 @@
     <w:basedOn w:val="DefaultParagraphFont"/>
     <w:uiPriority w:val="99"/>
     <w:unhideWhenUsed/>
-    <w:rsid w:val="00EB520E"/>
+    <w:rsid w:val="00626FB9"/>
     <w:rPr>
       <w:color w:val="0000FF" w:themeColor="hyperlink"/>
       <w:u w:val="single"/>

</xml_diff>

<commit_message>
Persempit Method of Protection jadi rekomendasi tim: Ex d (flameproof)
Sebelumnya "Ex d dan/atau Ex i" tanpa kesimpulan. Casing ADC12 die-cast +
mesh stainless steel cocok dengan pola flame-path Ex d yang dipakai
ketiga produk referensi yang sudah dipelajari (Talentum 16000, Sensepoint
XCD, KD-12). Ex i dikesampingkan karena heater sensor MQ (~0,75W/sensor,
24VDC tanpa barrier pembatas arus bersertifikat) sulit direkonsiliasi
dengan batas energi intrinsically-safe untuk Grup IIC; Ex e juga tidak
relevan untuk komponen yang normalnya beroperasi panas/berpotensi
percikan. Tetap ditandai sebagai rekomendasi tim, bukan keputusan resmi
ExCB. Diterapkan ke Dokumen Teknis Sertifikasi (rev 1.1->1.2) dan draf
form GTS (checkbox Ex d dicentang); dokumen naratif IECEx CIR diupdate
sumbernya tapi render masih tertunda karena file terbuka di Word.

Co-Authored-By: Claude Sonnet 5 <noreply@anthropic.com>
</commit_message>
<xml_diff>
--- a/Deliverables/Dokumen_Teknis_Sertifikasi_GLD_IECEx_ATEX.docx
+++ b/Deliverables/Dokumen_Teknis_Sertifikasi_GLD_IECEx_ATEX.docx
@@ -226,7 +226,7 @@
               <w:rPr>
                 <w:sz w:val="20"/>
               </w:rPr>
-              <w:t>1.1</w:t>
+              <w:t>1.2</w:t>
             </w:r>
           </w:p>
         </w:tc>
@@ -263,7 +263,7 @@
               <w:rPr>
                 <w:sz w:val="20"/>
               </w:rPr>
-              <w:t>25 September 2026</w:t>
+              <w:t>28 September 2026</w:t>
             </w:r>
           </w:p>
         </w:tc>
@@ -1176,6 +1176,62 @@
                 <w:sz w:val="19"/>
               </w:rPr>
               <w:t>Added an explicit equipment-boundary statement to Section 2.3.a: the Node Sensor (GLD) receives only 24 VDC at its terminal and never carries 220 VAC internally; the AC/DC adapter is a separate, site-supplied device outside the certified unit's physical boundary. Section 2.6.c cable-gland seal remark clarified as specified together with the M20×1.5 gland itself from the BP18-1Z reference, per project direction, rather than as a separately sourced item.</w:t>
+            </w:r>
+          </w:p>
+        </w:tc>
+      </w:tr>
+      <w:tr>
+        <w:tc>
+          <w:tcPr>
+            <w:tcW w:w="1296" w:type="dxa"/>
+          </w:tcPr>
+          <w:p>
+            <w:pPr>
+              <w:spacing w:after="40"/>
+            </w:pPr>
+            <w:r>
+              <w:rPr>
+                <w:sz w:val="19"/>
+              </w:rPr>
+              <w:t>1.2</w:t>
+            </w:r>
+          </w:p>
+        </w:tc>
+        <w:tc>
+          <w:tcPr>
+            <w:tcW w:w="1872" w:type="dxa"/>
+          </w:tcPr>
+          <w:p>
+            <w:pPr>
+              <w:spacing w:after="40"/>
+            </w:pPr>
+            <w:r>
+              <w:rPr>
+                <w:sz w:val="19"/>
+              </w:rPr>
+              <w:t>28 September 2026</w:t>
+            </w:r>
+          </w:p>
+        </w:tc>
+        <w:tc>
+          <w:tcPr>
+            <w:tcW w:w="6192" w:type="dxa"/>
+          </w:tcPr>
+          <w:p>
+            <w:pPr>
+              <w:spacing w:after="40"/>
+            </w:pPr>
+            <w:r>
+              <w:rPr>
+                <w:sz w:val="19"/>
+              </w:rPr>
+              <w:t>Type of protection narrowed to a single team recommendation, Ex d (flameproof enclosure), in Sections 1.1 and 2.5 — selected over Ex e and Ex i based on the existing ADC12 die-cast enclosure with a stainless-steel mesh flame path (matching the three certified reference products reviewed) and the MQ-sensor heaters' continuous, unregulated power draw being difficult to reconcile with intrinsically safe energy limits for Group IIC. Section 2.6.e updated accordingly. Still an internal recommendation, not an ExC</w:t>
+            </w:r>
+            <w:r>
+              <w:rPr>
+                <w:sz w:val="19"/>
+              </w:rPr>
+              <w:t>B decision.</w:t>
             </w:r>
           </w:p>
         </w:tc>
@@ -1219,7 +1275,7 @@
       <w:r>
         <w:fldChar w:fldCharType="separate"/>
       </w:r>
-      <w:hyperlink w:anchor="_Toc241234423" w:history="1">
+      <w:hyperlink w:anchor="_Toc241498838" w:history="1">
         <w:r>
           <w:rPr>
             <w:rStyle w:val="Hyperlink"/>
@@ -1246,7 +1302,7 @@
             <w:noProof/>
             <w:webHidden/>
           </w:rPr>
-          <w:instrText xml:space="preserve"> PAGEREF _Toc241234423 \h </w:instrText>
+          <w:instrText xml:space="preserve"> PAGEREF _Toc241498838 \h </w:instrText>
         </w:r>
         <w:r>
           <w:rPr>
@@ -1287,7 +1343,7 @@
           <w:noProof/>
         </w:rPr>
       </w:pPr>
-      <w:hyperlink w:anchor="_Toc241234424" w:history="1">
+      <w:hyperlink w:anchor="_Toc241498839" w:history="1">
         <w:r>
           <w:rPr>
             <w:rStyle w:val="Hyperlink"/>
@@ -1314,7 +1370,7 @@
             <w:noProof/>
             <w:webHidden/>
           </w:rPr>
-          <w:instrText xml:space="preserve"> PAGEREF _Toc241234424 \h </w:instrText>
+          <w:instrText xml:space="preserve"> PAGEREF _Toc241498839 \h </w:instrText>
         </w:r>
         <w:r>
           <w:rPr>
@@ -1355,7 +1411,7 @@
           <w:noProof/>
         </w:rPr>
       </w:pPr>
-      <w:hyperlink w:anchor="_Toc241234425" w:history="1">
+      <w:hyperlink w:anchor="_Toc241498840" w:history="1">
         <w:r>
           <w:rPr>
             <w:rStyle w:val="Hyperlink"/>
@@ -1382,7 +1438,7 @@
             <w:noProof/>
             <w:webHidden/>
           </w:rPr>
-          <w:instrText xml:space="preserve"> PAGEREF _Toc241234425 \h </w:instrText>
+          <w:instrText xml:space="preserve"> PAGEREF _Toc241498840 \h </w:instrText>
         </w:r>
         <w:r>
           <w:rPr>
@@ -1423,7 +1479,7 @@
           <w:noProof/>
         </w:rPr>
       </w:pPr>
-      <w:hyperlink w:anchor="_Toc241234426" w:history="1">
+      <w:hyperlink w:anchor="_Toc241498841" w:history="1">
         <w:r>
           <w:rPr>
             <w:rStyle w:val="Hyperlink"/>
@@ -1450,7 +1506,7 @@
             <w:noProof/>
             <w:webHidden/>
           </w:rPr>
-          <w:instrText xml:space="preserve"> PAGEREF _Toc241234426 \h </w:instrText>
+          <w:instrText xml:space="preserve"> PAGEREF _Toc241498841 \h </w:instrText>
         </w:r>
         <w:r>
           <w:rPr>
@@ -1491,7 +1547,7 @@
           <w:noProof/>
         </w:rPr>
       </w:pPr>
-      <w:hyperlink w:anchor="_Toc241234427" w:history="1">
+      <w:hyperlink w:anchor="_Toc241498842" w:history="1">
         <w:r>
           <w:rPr>
             <w:rStyle w:val="Hyperlink"/>
@@ -1518,7 +1574,7 @@
             <w:noProof/>
             <w:webHidden/>
           </w:rPr>
-          <w:instrText xml:space="preserve"> PAGEREF _Toc241234427 \h </w:instrText>
+          <w:instrText xml:space="preserve"> PAGEREF _Toc241498842 \h </w:instrText>
         </w:r>
         <w:r>
           <w:rPr>
@@ -1559,7 +1615,7 @@
           <w:noProof/>
         </w:rPr>
       </w:pPr>
-      <w:hyperlink w:anchor="_Toc241234428" w:history="1">
+      <w:hyperlink w:anchor="_Toc241498843" w:history="1">
         <w:r>
           <w:rPr>
             <w:rStyle w:val="Hyperlink"/>
@@ -1586,7 +1642,7 @@
             <w:noProof/>
             <w:webHidden/>
           </w:rPr>
-          <w:instrText xml:space="preserve"> PAGEREF _Toc241234428 \h </w:instrText>
+          <w:instrText xml:space="preserve"> PAGEREF _Toc241498843 \h </w:instrText>
         </w:r>
         <w:r>
           <w:rPr>
@@ -1627,7 +1683,7 @@
           <w:noProof/>
         </w:rPr>
       </w:pPr>
-      <w:hyperlink w:anchor="_Toc241234429" w:history="1">
+      <w:hyperlink w:anchor="_Toc241498844" w:history="1">
         <w:r>
           <w:rPr>
             <w:rStyle w:val="Hyperlink"/>
@@ -1654,7 +1710,7 @@
             <w:noProof/>
             <w:webHidden/>
           </w:rPr>
-          <w:instrText xml:space="preserve"> PAGEREF _Toc241234429 \h </w:instrText>
+          <w:instrText xml:space="preserve"> PAGEREF _Toc241498844 \h </w:instrText>
         </w:r>
         <w:r>
           <w:rPr>
@@ -1695,7 +1751,7 @@
           <w:noProof/>
         </w:rPr>
       </w:pPr>
-      <w:hyperlink w:anchor="_Toc241234430" w:history="1">
+      <w:hyperlink w:anchor="_Toc241498845" w:history="1">
         <w:r>
           <w:rPr>
             <w:rStyle w:val="Hyperlink"/>
@@ -1722,7 +1778,7 @@
             <w:noProof/>
             <w:webHidden/>
           </w:rPr>
-          <w:instrText xml:space="preserve"> PAGEREF _Toc241234430 \h </w:instrText>
+          <w:instrText xml:space="preserve"> PAGEREF _Toc241498845 \h </w:instrText>
         </w:r>
         <w:r>
           <w:rPr>
@@ -1763,7 +1819,7 @@
           <w:noProof/>
         </w:rPr>
       </w:pPr>
-      <w:hyperlink w:anchor="_Toc241234431" w:history="1">
+      <w:hyperlink w:anchor="_Toc241498846" w:history="1">
         <w:r>
           <w:rPr>
             <w:rStyle w:val="Hyperlink"/>
@@ -1790,7 +1846,7 @@
             <w:noProof/>
             <w:webHidden/>
           </w:rPr>
-          <w:instrText xml:space="preserve"> PAGEREF _Toc241234431 \h </w:instrText>
+          <w:instrText xml:space="preserve"> PAGEREF _Toc241498846 \h </w:instrText>
         </w:r>
         <w:r>
           <w:rPr>
@@ -1831,7 +1887,7 @@
           <w:noProof/>
         </w:rPr>
       </w:pPr>
-      <w:hyperlink w:anchor="_Toc241234432" w:history="1">
+      <w:hyperlink w:anchor="_Toc241498847" w:history="1">
         <w:r>
           <w:rPr>
             <w:rStyle w:val="Hyperlink"/>
@@ -1858,7 +1914,7 @@
             <w:noProof/>
             <w:webHidden/>
           </w:rPr>
-          <w:instrText xml:space="preserve"> PAGEREF _Toc241234432 \h </w:instrText>
+          <w:instrText xml:space="preserve"> PAGEREF _Toc241498847 \h </w:instrText>
         </w:r>
         <w:r>
           <w:rPr>
@@ -1899,7 +1955,7 @@
           <w:noProof/>
         </w:rPr>
       </w:pPr>
-      <w:hyperlink w:anchor="_Toc241234433" w:history="1">
+      <w:hyperlink w:anchor="_Toc241498848" w:history="1">
         <w:r>
           <w:rPr>
             <w:rStyle w:val="Hyperlink"/>
@@ -1926,7 +1982,7 @@
             <w:noProof/>
             <w:webHidden/>
           </w:rPr>
-          <w:instrText xml:space="preserve"> PAGEREF _Toc241234433 \h </w:instrText>
+          <w:instrText xml:space="preserve"> PAGEREF _Toc241498848 \h </w:instrText>
         </w:r>
         <w:r>
           <w:rPr>
@@ -1967,7 +2023,7 @@
           <w:noProof/>
         </w:rPr>
       </w:pPr>
-      <w:hyperlink w:anchor="_Toc241234434" w:history="1">
+      <w:hyperlink w:anchor="_Toc241498849" w:history="1">
         <w:r>
           <w:rPr>
             <w:rStyle w:val="Hyperlink"/>
@@ -1994,7 +2050,7 @@
             <w:noProof/>
             <w:webHidden/>
           </w:rPr>
-          <w:instrText xml:space="preserve"> PAGEREF _Toc241234434 \h </w:instrText>
+          <w:instrText xml:space="preserve"> PAGEREF _Toc241498849 \h </w:instrText>
         </w:r>
         <w:r>
           <w:rPr>
@@ -2035,7 +2091,7 @@
           <w:noProof/>
         </w:rPr>
       </w:pPr>
-      <w:hyperlink w:anchor="_Toc241234435" w:history="1">
+      <w:hyperlink w:anchor="_Toc241498850" w:history="1">
         <w:r>
           <w:rPr>
             <w:rStyle w:val="Hyperlink"/>
@@ -2062,7 +2118,7 @@
             <w:noProof/>
             <w:webHidden/>
           </w:rPr>
-          <w:instrText xml:space="preserve"> PAGEREF _Toc241234435 \h </w:instrText>
+          <w:instrText xml:space="preserve"> PAGEREF _Toc241498850 \h </w:instrText>
         </w:r>
         <w:r>
           <w:rPr>
@@ -2103,7 +2159,7 @@
           <w:noProof/>
         </w:rPr>
       </w:pPr>
-      <w:hyperlink w:anchor="_Toc241234436" w:history="1">
+      <w:hyperlink w:anchor="_Toc241498851" w:history="1">
         <w:r>
           <w:rPr>
             <w:rStyle w:val="Hyperlink"/>
@@ -2130,7 +2186,7 @@
             <w:noProof/>
             <w:webHidden/>
           </w:rPr>
-          <w:instrText xml:space="preserve"> PAGEREF _Toc241234436 \h </w:instrText>
+          <w:instrText xml:space="preserve"> PAGEREF _Toc241498851 \h </w:instrText>
         </w:r>
         <w:r>
           <w:rPr>
@@ -2171,7 +2227,7 @@
           <w:noProof/>
         </w:rPr>
       </w:pPr>
-      <w:hyperlink w:anchor="_Toc241234437" w:history="1">
+      <w:hyperlink w:anchor="_Toc241498852" w:history="1">
         <w:r>
           <w:rPr>
             <w:rStyle w:val="Hyperlink"/>
@@ -2198,7 +2254,7 @@
             <w:noProof/>
             <w:webHidden/>
           </w:rPr>
-          <w:instrText xml:space="preserve"> PAGEREF _Toc241234437 \h </w:instrText>
+          <w:instrText xml:space="preserve"> PAGEREF _Toc241498852 \h </w:instrText>
         </w:r>
         <w:r>
           <w:rPr>
@@ -2239,7 +2295,7 @@
           <w:noProof/>
         </w:rPr>
       </w:pPr>
-      <w:hyperlink w:anchor="_Toc241234438" w:history="1">
+      <w:hyperlink w:anchor="_Toc241498853" w:history="1">
         <w:r>
           <w:rPr>
             <w:rStyle w:val="Hyperlink"/>
@@ -2266,7 +2322,7 @@
             <w:noProof/>
             <w:webHidden/>
           </w:rPr>
-          <w:instrText xml:space="preserve"> PAGEREF _Toc241234438 \h </w:instrText>
+          <w:instrText xml:space="preserve"> PAGEREF _Toc241498853 \h </w:instrText>
         </w:r>
         <w:r>
           <w:rPr>
@@ -2307,7 +2363,7 @@
           <w:noProof/>
         </w:rPr>
       </w:pPr>
-      <w:hyperlink w:anchor="_Toc241234439" w:history="1">
+      <w:hyperlink w:anchor="_Toc241498854" w:history="1">
         <w:r>
           <w:rPr>
             <w:rStyle w:val="Hyperlink"/>
@@ -2334,7 +2390,7 @@
             <w:noProof/>
             <w:webHidden/>
           </w:rPr>
-          <w:instrText xml:space="preserve"> PAGEREF _Toc241234439 \h </w:instrText>
+          <w:instrText xml:space="preserve"> PAGEREF _Toc241498854 \h </w:instrText>
         </w:r>
         <w:r>
           <w:rPr>
@@ -2375,7 +2431,7 @@
           <w:noProof/>
         </w:rPr>
       </w:pPr>
-      <w:hyperlink w:anchor="_Toc241234440" w:history="1">
+      <w:hyperlink w:anchor="_Toc241498855" w:history="1">
         <w:r>
           <w:rPr>
             <w:rStyle w:val="Hyperlink"/>
@@ -2402,75 +2458,7 @@
             <w:noProof/>
             <w:webHidden/>
           </w:rPr>
-          <w:instrText xml:space="preserve"> PAGEREF _Toc241234440 \h </w:instrText>
-        </w:r>
-        <w:r>
-          <w:rPr>
-            <w:noProof/>
-            <w:webHidden/>
-          </w:rPr>
-        </w:r>
-        <w:r>
-          <w:rPr>
-            <w:noProof/>
-            <w:webHidden/>
-          </w:rPr>
-          <w:fldChar w:fldCharType="separate"/>
-        </w:r>
-        <w:r>
-          <w:rPr>
-            <w:noProof/>
-            <w:webHidden/>
-          </w:rPr>
-          <w:t>20</w:t>
-        </w:r>
-        <w:r>
-          <w:rPr>
-            <w:noProof/>
-            <w:webHidden/>
-          </w:rPr>
-          <w:fldChar w:fldCharType="end"/>
-        </w:r>
-      </w:hyperlink>
-    </w:p>
-    <w:p>
-      <w:pPr>
-        <w:pStyle w:val="TOC3"/>
-        <w:tabs>
-          <w:tab w:val="right" w:leader="dot" w:pos="9736"/>
-        </w:tabs>
-        <w:rPr>
-          <w:noProof/>
-        </w:rPr>
-      </w:pPr>
-      <w:hyperlink w:anchor="_Toc241234441" w:history="1">
-        <w:r>
-          <w:rPr>
-            <w:rStyle w:val="Hyperlink"/>
-            <w:noProof/>
-          </w:rPr>
-          <w:t>2.6.a · Complete Drawings (Assembly, Component, Electrical Schematic, PCB Layout, Enclosure Structure, Junction Box, Terminal, Grounding)</w:t>
-        </w:r>
-        <w:r>
-          <w:rPr>
-            <w:noProof/>
-            <w:webHidden/>
-          </w:rPr>
-          <w:tab/>
-        </w:r>
-        <w:r>
-          <w:rPr>
-            <w:noProof/>
-            <w:webHidden/>
-          </w:rPr>
-          <w:fldChar w:fldCharType="begin"/>
-        </w:r>
-        <w:r>
-          <w:rPr>
-            <w:noProof/>
-            <w:webHidden/>
-          </w:rPr>
-          <w:instrText xml:space="preserve"> PAGEREF _Toc241234441 \h </w:instrText>
+          <w:instrText xml:space="preserve"> PAGEREF _Toc241498855 \h </w:instrText>
         </w:r>
         <w:r>
           <w:rPr>
@@ -2511,7 +2499,75 @@
           <w:noProof/>
         </w:rPr>
       </w:pPr>
-      <w:hyperlink w:anchor="_Toc241234442" w:history="1">
+      <w:hyperlink w:anchor="_Toc241498856" w:history="1">
+        <w:r>
+          <w:rPr>
+            <w:rStyle w:val="Hyperlink"/>
+            <w:noProof/>
+          </w:rPr>
+          <w:t>2.6.a · Complete Drawings (Assembly, Component, Electrical Schematic, PCB Layout, Enclosure Structure, Junction Box, Terminal, Grounding)</w:t>
+        </w:r>
+        <w:r>
+          <w:rPr>
+            <w:noProof/>
+            <w:webHidden/>
+          </w:rPr>
+          <w:tab/>
+        </w:r>
+        <w:r>
+          <w:rPr>
+            <w:noProof/>
+            <w:webHidden/>
+          </w:rPr>
+          <w:fldChar w:fldCharType="begin"/>
+        </w:r>
+        <w:r>
+          <w:rPr>
+            <w:noProof/>
+            <w:webHidden/>
+          </w:rPr>
+          <w:instrText xml:space="preserve"> PAGEREF _Toc241498856 \h </w:instrText>
+        </w:r>
+        <w:r>
+          <w:rPr>
+            <w:noProof/>
+            <w:webHidden/>
+          </w:rPr>
+        </w:r>
+        <w:r>
+          <w:rPr>
+            <w:noProof/>
+            <w:webHidden/>
+          </w:rPr>
+          <w:fldChar w:fldCharType="separate"/>
+        </w:r>
+        <w:r>
+          <w:rPr>
+            <w:noProof/>
+            <w:webHidden/>
+          </w:rPr>
+          <w:t>21</w:t>
+        </w:r>
+        <w:r>
+          <w:rPr>
+            <w:noProof/>
+            <w:webHidden/>
+          </w:rPr>
+          <w:fldChar w:fldCharType="end"/>
+        </w:r>
+      </w:hyperlink>
+    </w:p>
+    <w:p>
+      <w:pPr>
+        <w:pStyle w:val="TOC3"/>
+        <w:tabs>
+          <w:tab w:val="right" w:leader="dot" w:pos="9736"/>
+        </w:tabs>
+        <w:rPr>
+          <w:noProof/>
+        </w:rPr>
+      </w:pPr>
+      <w:hyperlink w:anchor="_Toc241498857" w:history="1">
         <w:r>
           <w:rPr>
             <w:rStyle w:val="Hyperlink"/>
@@ -2538,7 +2594,7 @@
             <w:noProof/>
             <w:webHidden/>
           </w:rPr>
-          <w:instrText xml:space="preserve"> PAGEREF _Toc241234442 \h </w:instrText>
+          <w:instrText xml:space="preserve"> PAGEREF _Toc241498857 \h </w:instrText>
         </w:r>
         <w:r>
           <w:rPr>
@@ -2579,7 +2635,7 @@
           <w:noProof/>
         </w:rPr>
       </w:pPr>
-      <w:hyperlink w:anchor="_Toc241234443" w:history="1">
+      <w:hyperlink w:anchor="_Toc241498858" w:history="1">
         <w:r>
           <w:rPr>
             <w:rStyle w:val="Hyperlink"/>
@@ -2606,75 +2662,7 @@
             <w:noProof/>
             <w:webHidden/>
           </w:rPr>
-          <w:instrText xml:space="preserve"> PAGEREF _Toc241234443 \h </w:instrText>
-        </w:r>
-        <w:r>
-          <w:rPr>
-            <w:noProof/>
-            <w:webHidden/>
-          </w:rPr>
-        </w:r>
-        <w:r>
-          <w:rPr>
-            <w:noProof/>
-            <w:webHidden/>
-          </w:rPr>
-          <w:fldChar w:fldCharType="separate"/>
-        </w:r>
-        <w:r>
-          <w:rPr>
-            <w:noProof/>
-            <w:webHidden/>
-          </w:rPr>
-          <w:t>31</w:t>
-        </w:r>
-        <w:r>
-          <w:rPr>
-            <w:noProof/>
-            <w:webHidden/>
-          </w:rPr>
-          <w:fldChar w:fldCharType="end"/>
-        </w:r>
-      </w:hyperlink>
-    </w:p>
-    <w:p>
-      <w:pPr>
-        <w:pStyle w:val="TOC3"/>
-        <w:tabs>
-          <w:tab w:val="right" w:leader="dot" w:pos="9736"/>
-        </w:tabs>
-        <w:rPr>
-          <w:noProof/>
-        </w:rPr>
-      </w:pPr>
-      <w:hyperlink w:anchor="_Toc241234444" w:history="1">
-        <w:r>
-          <w:rPr>
-            <w:rStyle w:val="Hyperlink"/>
-            <w:noProof/>
-          </w:rPr>
-          <w:t>2.6.d · Manufacturing Process Description</w:t>
-        </w:r>
-        <w:r>
-          <w:rPr>
-            <w:noProof/>
-            <w:webHidden/>
-          </w:rPr>
-          <w:tab/>
-        </w:r>
-        <w:r>
-          <w:rPr>
-            <w:noProof/>
-            <w:webHidden/>
-          </w:rPr>
-          <w:fldChar w:fldCharType="begin"/>
-        </w:r>
-        <w:r>
-          <w:rPr>
-            <w:noProof/>
-            <w:webHidden/>
-          </w:rPr>
-          <w:instrText xml:space="preserve"> PAGEREF _Toc241234444 \h </w:instrText>
+          <w:instrText xml:space="preserve"> PAGEREF _Toc241498858 \h </w:instrText>
         </w:r>
         <w:r>
           <w:rPr>
@@ -2715,13 +2703,13 @@
           <w:noProof/>
         </w:rPr>
       </w:pPr>
-      <w:hyperlink w:anchor="_Toc241234445" w:history="1">
+      <w:hyperlink w:anchor="_Toc241498859" w:history="1">
         <w:r>
           <w:rPr>
             <w:rStyle w:val="Hyperlink"/>
             <w:noProof/>
           </w:rPr>
-          <w:t>2.6.e · Explosion-Protection Calculations and Explanations (if applicable)</w:t>
+          <w:t>2.6.d · Manufacturing Process Description</w:t>
         </w:r>
         <w:r>
           <w:rPr>
@@ -2742,7 +2730,7 @@
             <w:noProof/>
             <w:webHidden/>
           </w:rPr>
-          <w:instrText xml:space="preserve"> PAGEREF _Toc241234445 \h </w:instrText>
+          <w:instrText xml:space="preserve"> PAGEREF _Toc241498859 \h </w:instrText>
         </w:r>
         <w:r>
           <w:rPr>
@@ -2783,13 +2771,13 @@
           <w:noProof/>
         </w:rPr>
       </w:pPr>
-      <w:hyperlink w:anchor="_Toc241234446" w:history="1">
+      <w:hyperlink w:anchor="_Toc241498860" w:history="1">
         <w:r>
           <w:rPr>
             <w:rStyle w:val="Hyperlink"/>
             <w:noProof/>
           </w:rPr>
-          <w:t>2.6.f · Temperature Group Calculation (Hottest-Point Temperature Estimation)</w:t>
+          <w:t>2.6.e · Explosion-Protection Calculations and Explanations (if applicable)</w:t>
         </w:r>
         <w:r>
           <w:rPr>
@@ -2810,7 +2798,7 @@
             <w:noProof/>
             <w:webHidden/>
           </w:rPr>
-          <w:instrText xml:space="preserve"> PAGEREF _Toc241234446 \h </w:instrText>
+          <w:instrText xml:space="preserve"> PAGEREF _Toc241498860 \h </w:instrText>
         </w:r>
         <w:r>
           <w:rPr>
@@ -2851,7 +2839,75 @@
           <w:noProof/>
         </w:rPr>
       </w:pPr>
-      <w:hyperlink w:anchor="_Toc241234447" w:history="1">
+      <w:hyperlink w:anchor="_Toc241498861" w:history="1">
+        <w:r>
+          <w:rPr>
+            <w:rStyle w:val="Hyperlink"/>
+            <w:noProof/>
+          </w:rPr>
+          <w:t>2.6.f · Temperature Group Calculation (Hottest-Point Temperature Estimation)</w:t>
+        </w:r>
+        <w:r>
+          <w:rPr>
+            <w:noProof/>
+            <w:webHidden/>
+          </w:rPr>
+          <w:tab/>
+        </w:r>
+        <w:r>
+          <w:rPr>
+            <w:noProof/>
+            <w:webHidden/>
+          </w:rPr>
+          <w:fldChar w:fldCharType="begin"/>
+        </w:r>
+        <w:r>
+          <w:rPr>
+            <w:noProof/>
+            <w:webHidden/>
+          </w:rPr>
+          <w:instrText xml:space="preserve"> PAGEREF _Toc241498861 \h </w:instrText>
+        </w:r>
+        <w:r>
+          <w:rPr>
+            <w:noProof/>
+            <w:webHidden/>
+          </w:rPr>
+        </w:r>
+        <w:r>
+          <w:rPr>
+            <w:noProof/>
+            <w:webHidden/>
+          </w:rPr>
+          <w:fldChar w:fldCharType="separate"/>
+        </w:r>
+        <w:r>
+          <w:rPr>
+            <w:noProof/>
+            <w:webHidden/>
+          </w:rPr>
+          <w:t>33</w:t>
+        </w:r>
+        <w:r>
+          <w:rPr>
+            <w:noProof/>
+            <w:webHidden/>
+          </w:rPr>
+          <w:fldChar w:fldCharType="end"/>
+        </w:r>
+      </w:hyperlink>
+    </w:p>
+    <w:p>
+      <w:pPr>
+        <w:pStyle w:val="TOC3"/>
+        <w:tabs>
+          <w:tab w:val="right" w:leader="dot" w:pos="9736"/>
+        </w:tabs>
+        <w:rPr>
+          <w:noProof/>
+        </w:rPr>
+      </w:pPr>
+      <w:hyperlink w:anchor="_Toc241498862" w:history="1">
         <w:r>
           <w:rPr>
             <w:rStyle w:val="Hyperlink"/>
@@ -2878,7 +2934,7 @@
             <w:noProof/>
             <w:webHidden/>
           </w:rPr>
-          <w:instrText xml:space="preserve"> PAGEREF _Toc241234447 \h </w:instrText>
+          <w:instrText xml:space="preserve"> PAGEREF _Toc241498862 \h </w:instrText>
         </w:r>
         <w:r>
           <w:rPr>
@@ -2898,7 +2954,7 @@
             <w:noProof/>
             <w:webHidden/>
           </w:rPr>
-          <w:t>32</w:t>
+          <w:t>33</w:t>
         </w:r>
         <w:r>
           <w:rPr>
@@ -2919,7 +2975,7 @@
           <w:noProof/>
         </w:rPr>
       </w:pPr>
-      <w:hyperlink w:anchor="_Toc241234448" w:history="1">
+      <w:hyperlink w:anchor="_Toc241498863" w:history="1">
         <w:r>
           <w:rPr>
             <w:rStyle w:val="Hyperlink"/>
@@ -2946,7 +3002,7 @@
             <w:noProof/>
             <w:webHidden/>
           </w:rPr>
-          <w:instrText xml:space="preserve"> PAGEREF _Toc241234448 \h </w:instrText>
+          <w:instrText xml:space="preserve"> PAGEREF _Toc241498863 \h </w:instrText>
         </w:r>
         <w:r>
           <w:rPr>
@@ -2987,7 +3043,7 @@
           <w:noProof/>
         </w:rPr>
       </w:pPr>
-      <w:hyperlink w:anchor="_Toc241234449" w:history="1">
+      <w:hyperlink w:anchor="_Toc241498864" w:history="1">
         <w:r>
           <w:rPr>
             <w:rStyle w:val="Hyperlink"/>
@@ -3014,7 +3070,7 @@
             <w:noProof/>
             <w:webHidden/>
           </w:rPr>
-          <w:instrText xml:space="preserve"> PAGEREF _Toc241234449 \h </w:instrText>
+          <w:instrText xml:space="preserve"> PAGEREF _Toc241498864 \h </w:instrText>
         </w:r>
         <w:r>
           <w:rPr>
@@ -3034,7 +3090,7 @@
             <w:noProof/>
             <w:webHidden/>
           </w:rPr>
-          <w:t>34</w:t>
+          <w:t>35</w:t>
         </w:r>
         <w:r>
           <w:rPr>
@@ -3055,7 +3111,7 @@
           <w:noProof/>
         </w:rPr>
       </w:pPr>
-      <w:hyperlink w:anchor="_Toc241234450" w:history="1">
+      <w:hyperlink w:anchor="_Toc241498865" w:history="1">
         <w:r>
           <w:rPr>
             <w:rStyle w:val="Hyperlink"/>
@@ -3082,7 +3138,7 @@
             <w:noProof/>
             <w:webHidden/>
           </w:rPr>
-          <w:instrText xml:space="preserve"> PAGEREF _Toc241234450 \h </w:instrText>
+          <w:instrText xml:space="preserve"> PAGEREF _Toc241498865 \h </w:instrText>
         </w:r>
         <w:r>
           <w:rPr>
@@ -3102,7 +3158,7 @@
             <w:noProof/>
             <w:webHidden/>
           </w:rPr>
-          <w:t>34</w:t>
+          <w:t>35</w:t>
         </w:r>
         <w:r>
           <w:rPr>
@@ -3123,7 +3179,7 @@
           <w:noProof/>
         </w:rPr>
       </w:pPr>
-      <w:hyperlink w:anchor="_Toc241234451" w:history="1">
+      <w:hyperlink w:anchor="_Toc241498866" w:history="1">
         <w:r>
           <w:rPr>
             <w:rStyle w:val="Hyperlink"/>
@@ -3150,7 +3206,7 @@
             <w:noProof/>
             <w:webHidden/>
           </w:rPr>
-          <w:instrText xml:space="preserve"> PAGEREF _Toc241234451 \h </w:instrText>
+          <w:instrText xml:space="preserve"> PAGEREF _Toc241498866 \h </w:instrText>
         </w:r>
         <w:r>
           <w:rPr>
@@ -3170,7 +3226,7 @@
             <w:noProof/>
             <w:webHidden/>
           </w:rPr>
-          <w:t>34</w:t>
+          <w:t>35</w:t>
         </w:r>
         <w:r>
           <w:rPr>
@@ -3191,7 +3247,7 @@
           <w:noProof/>
         </w:rPr>
       </w:pPr>
-      <w:hyperlink w:anchor="_Toc241234452" w:history="1">
+      <w:hyperlink w:anchor="_Toc241498867" w:history="1">
         <w:r>
           <w:rPr>
             <w:rStyle w:val="Hyperlink"/>
@@ -3218,7 +3274,7 @@
             <w:noProof/>
             <w:webHidden/>
           </w:rPr>
-          <w:instrText xml:space="preserve"> PAGEREF _Toc241234452 \h </w:instrText>
+          <w:instrText xml:space="preserve"> PAGEREF _Toc241498867 \h </w:instrText>
         </w:r>
         <w:r>
           <w:rPr>
@@ -3264,7 +3320,7 @@
       <w:pPr>
         <w:pStyle w:val="Heading1"/>
       </w:pPr>
-      <w:bookmarkStart w:id="0" w:name="_Toc241234423"/>
+      <w:bookmarkStart w:id="0" w:name="_Toc241498838"/>
       <w:r>
         <w:lastRenderedPageBreak/>
         <w:t>About This Document</w:t>
@@ -3367,7 +3423,7 @@
       <w:pPr>
         <w:pStyle w:val="Heading1"/>
       </w:pPr>
-      <w:bookmarkStart w:id="1" w:name="_Toc241234424"/>
+      <w:bookmarkStart w:id="1" w:name="_Toc241498839"/>
       <w:r>
         <w:t>1. Basic Information (Application and Organization)</w:t>
       </w:r>
@@ -3514,7 +3570,7 @@
       <w:pPr>
         <w:pStyle w:val="Heading2"/>
       </w:pPr>
-      <w:bookmarkStart w:id="2" w:name="_Toc241234425"/>
+      <w:bookmarkStart w:id="2" w:name="_Toc241498840"/>
       <w:r>
         <w:t>1.0 · Status Summary — Section 1</w:t>
       </w:r>
@@ -3891,7 +3947,7 @@
       <w:pPr>
         <w:pStyle w:val="Heading2"/>
       </w:pPr>
-      <w:bookmarkStart w:id="3" w:name="_Toc241234426"/>
+      <w:bookmarkStart w:id="3" w:name="_Toc241498841"/>
       <w:r>
         <w:t>1.1 · Application Form</w:t>
       </w:r>
@@ -4678,7 +4734,7 @@
               <w:rPr>
                 <w:sz w:val="19"/>
               </w:rPr>
-              <w:t>Not yet selected — Ex d, Ex e, and Ex i under evaluation</w:t>
+              <w:t>Ex d — flameproof enclosure</w:t>
             </w:r>
           </w:p>
         </w:tc>
@@ -4693,10 +4749,10 @@
             <w:r>
               <w:rPr>
                 <w:b/>
-                <w:color w:val="B02A37"/>
-                <w:sz w:val="19"/>
-              </w:rPr>
-              <w:t>Open</w:t>
+                <w:color w:val="B56A1E"/>
+                <w:sz w:val="19"/>
+              </w:rPr>
+              <w:t>Internal recommendation, not an ExCB decision</w:t>
             </w:r>
           </w:p>
         </w:tc>
@@ -4712,7 +4768,7 @@
               <w:rPr>
                 <w:sz w:val="19"/>
               </w:rPr>
-              <w:t>Section 2.6.e</w:t>
+              <w:t>Section 2.5</w:t>
             </w:r>
           </w:p>
         </w:tc>
@@ -4751,7 +4807,7 @@
               <w:rPr>
                 <w:sz w:val="19"/>
               </w:rPr>
-              <w:t>IEC 60079-0, together with the standard corresponding to the type of protection once selected</w:t>
+              <w:t>IEC 60079-0, together with IEC 60079-1 (flameproof enclosures “d”)</w:t>
             </w:r>
           </w:p>
         </w:tc>
@@ -4943,7 +4999,7 @@
       <w:pPr>
         <w:pStyle w:val="Heading2"/>
       </w:pPr>
-      <w:bookmarkStart w:id="4" w:name="_Toc241234427"/>
+      <w:bookmarkStart w:id="4" w:name="_Toc241498842"/>
       <w:r>
         <w:t>1.2 · Business License / Company Registration Certificate</w:t>
       </w:r>
@@ -5492,7 +5548,7 @@
       <w:pPr>
         <w:pStyle w:val="Heading2"/>
       </w:pPr>
-      <w:bookmarkStart w:id="5" w:name="_Toc241234428"/>
+      <w:bookmarkStart w:id="5" w:name="_Toc241498843"/>
       <w:r>
         <w:t>1.3 · Organizational Chart and Contact Information</w:t>
       </w:r>
@@ -6041,7 +6097,7 @@
       <w:pPr>
         <w:pStyle w:val="Heading2"/>
       </w:pPr>
-      <w:bookmarkStart w:id="6" w:name="_Toc241234429"/>
+      <w:bookmarkStart w:id="6" w:name="_Toc241498844"/>
       <w:r>
         <w:t>1.4 · Manufacturing Plant Address and Introduction of Production Facilities</w:t>
       </w:r>
@@ -6553,7 +6609,7 @@
       <w:pPr>
         <w:pStyle w:val="Heading2"/>
       </w:pPr>
-      <w:bookmarkStart w:id="7" w:name="_Toc241234430"/>
+      <w:bookmarkStart w:id="7" w:name="_Toc241498845"/>
       <w:r>
         <w:t>1.5 · ISO 9001 Certificate, Quality Manual, and Procedure Index</w:t>
       </w:r>
@@ -6976,7 +7032,7 @@
       <w:pPr>
         <w:pStyle w:val="Heading1"/>
       </w:pPr>
-      <w:bookmarkStart w:id="8" w:name="_Toc241234431"/>
+      <w:bookmarkStart w:id="8" w:name="_Toc241498846"/>
       <w:r>
         <w:t>2. Technical Documentation</w:t>
       </w:r>
@@ -6991,7 +7047,7 @@
       <w:pPr>
         <w:pStyle w:val="Heading2"/>
       </w:pPr>
-      <w:bookmarkStart w:id="9" w:name="_Toc241234432"/>
+      <w:bookmarkStart w:id="9" w:name="_Toc241498847"/>
       <w:r>
         <w:t>2.1 · Detailed Product Description</w:t>
       </w:r>
@@ -7024,7 +7080,7 @@
       <w:pPr>
         <w:pStyle w:val="Heading2"/>
       </w:pPr>
-      <w:bookmarkStart w:id="10" w:name="_Toc241234433"/>
+      <w:bookmarkStart w:id="10" w:name="_Toc241498848"/>
       <w:r>
         <w:t>2.2 · Product Name, Model, and Specification List</w:t>
       </w:r>
@@ -7468,7 +7524,7 @@
       <w:pPr>
         <w:pStyle w:val="Heading2"/>
       </w:pPr>
-      <w:bookmarkStart w:id="11" w:name="_Toc241234434"/>
+      <w:bookmarkStart w:id="11" w:name="_Toc241498849"/>
       <w:r>
         <w:t>2.3 · Functional Description and Technical Parameters (Electrical, Mechanical, etc.)</w:t>
       </w:r>
@@ -7486,7 +7542,7 @@
       <w:pPr>
         <w:pStyle w:val="Heading3"/>
       </w:pPr>
-      <w:bookmarkStart w:id="12" w:name="_Toc241234435"/>
+      <w:bookmarkStart w:id="12" w:name="_Toc241498850"/>
       <w:r>
         <w:t>2.3.a · Electrical Parameters — Node Sensor (GLD)</w:t>
       </w:r>
@@ -8183,7 +8239,7 @@
       <w:pPr>
         <w:pStyle w:val="Heading3"/>
       </w:pPr>
-      <w:bookmarkStart w:id="13" w:name="_Toc241234436"/>
+      <w:bookmarkStart w:id="13" w:name="_Toc241498851"/>
       <w:r>
         <w:t>2.3.b · Sensor and Communication Parameters — Node Sensor (GLD)</w:t>
       </w:r>
@@ -9245,7 +9301,7 @@
       <w:pPr>
         <w:pStyle w:val="Heading3"/>
       </w:pPr>
-      <w:bookmarkStart w:id="14" w:name="_Toc241234437"/>
+      <w:bookmarkStart w:id="14" w:name="_Toc241498852"/>
       <w:r>
         <w:lastRenderedPageBreak/>
         <w:t>2.3.c · Mechanical Parameters — Node Sensor (GLD)</w:t>
@@ -10097,7 +10153,7 @@
       <w:pPr>
         <w:pStyle w:val="Heading2"/>
       </w:pPr>
-      <w:bookmarkStart w:id="15" w:name="_Toc241234438"/>
+      <w:bookmarkStart w:id="15" w:name="_Toc241498853"/>
       <w:r>
         <w:t>2.4 · Product Photographs — Overall and Key Components</w:t>
       </w:r>
@@ -10136,7 +10192,7 @@
                 <w:noProof/>
               </w:rPr>
               <w:drawing>
-                <wp:inline distT="0" distB="0" distL="0" distR="0" wp14:anchorId="749E721A" wp14:editId="7D8C5890">
+                <wp:inline distT="0" distB="0" distL="0" distR="0" wp14:anchorId="34E9DE72" wp14:editId="0B077C61">
                   <wp:extent cx="1379912" cy="2286000"/>
                   <wp:effectExtent l="0" t="0" r="0" b="0"/>
                   <wp:docPr id="1" name="Picture 1"/>
@@ -10213,7 +10269,7 @@
                 <w:noProof/>
               </w:rPr>
               <w:drawing>
-                <wp:inline distT="0" distB="0" distL="0" distR="0" wp14:anchorId="0C2E75BD" wp14:editId="6D679D03">
+                <wp:inline distT="0" distB="0" distL="0" distR="0" wp14:anchorId="393B5B39" wp14:editId="35276636">
                   <wp:extent cx="1714500" cy="2286000"/>
                   <wp:effectExtent l="0" t="0" r="0" b="0"/>
                   <wp:docPr id="2" name="Picture 2"/>
@@ -10295,7 +10351,7 @@
                 <w:noProof/>
               </w:rPr>
               <w:drawing>
-                <wp:inline distT="0" distB="0" distL="0" distR="0" wp14:anchorId="3AFF75A0" wp14:editId="75504693">
+                <wp:inline distT="0" distB="0" distL="0" distR="0" wp14:anchorId="4388EA8D" wp14:editId="769B0141">
                   <wp:extent cx="1026621" cy="2286000"/>
                   <wp:effectExtent l="0" t="0" r="0" b="0"/>
                   <wp:docPr id="3" name="Picture 3"/>
@@ -10372,7 +10428,7 @@
                 <w:noProof/>
               </w:rPr>
               <w:drawing>
-                <wp:inline distT="0" distB="0" distL="0" distR="0" wp14:anchorId="23B0723C" wp14:editId="431B32F3">
+                <wp:inline distT="0" distB="0" distL="0" distR="0" wp14:anchorId="338C193E" wp14:editId="20B13877">
                   <wp:extent cx="1026621" cy="2286000"/>
                   <wp:effectExtent l="0" t="0" r="0" b="0"/>
                   <wp:docPr id="4" name="Picture 4"/>
@@ -10455,7 +10511,7 @@
               </w:rPr>
               <w:lastRenderedPageBreak/>
               <w:drawing>
-                <wp:inline distT="0" distB="0" distL="0" distR="0" wp14:anchorId="057E753D" wp14:editId="5F645A48">
+                <wp:inline distT="0" distB="0" distL="0" distR="0" wp14:anchorId="49CFF802" wp14:editId="4A6A4935">
                   <wp:extent cx="1026621" cy="2286000"/>
                   <wp:effectExtent l="0" t="0" r="0" b="0"/>
                   <wp:docPr id="5" name="Picture 5"/>
@@ -10532,7 +10588,7 @@
                 <w:noProof/>
               </w:rPr>
               <w:drawing>
-                <wp:inline distT="0" distB="0" distL="0" distR="0" wp14:anchorId="27E8740B" wp14:editId="1BB89574">
+                <wp:inline distT="0" distB="0" distL="0" distR="0" wp14:anchorId="6A873FFB" wp14:editId="61AE7632">
                   <wp:extent cx="1026621" cy="2286000"/>
                   <wp:effectExtent l="0" t="0" r="0" b="0"/>
                   <wp:docPr id="6" name="Picture 6"/>
@@ -10614,7 +10670,7 @@
                 <w:noProof/>
               </w:rPr>
               <w:drawing>
-                <wp:inline distT="0" distB="0" distL="0" distR="0" wp14:anchorId="134A333F" wp14:editId="209CC2E4">
+                <wp:inline distT="0" distB="0" distL="0" distR="0" wp14:anchorId="7CF93939" wp14:editId="0015307A">
                   <wp:extent cx="1026621" cy="2286000"/>
                   <wp:effectExtent l="0" t="0" r="0" b="0"/>
                   <wp:docPr id="7" name="Picture 7"/>
@@ -10738,7 +10794,7 @@
       <w:pPr>
         <w:pStyle w:val="Heading2"/>
       </w:pPr>
-      <w:bookmarkStart w:id="16" w:name="_Toc241234439"/>
+      <w:bookmarkStart w:id="16" w:name="_Toc241498854"/>
       <w:r>
         <w:t>2.5 · Description of Intended Use and Installation Environment (Gas Group, Temperature Class, Area Classification)</w:t>
       </w:r>
@@ -11147,6 +11203,86 @@
           </w:p>
         </w:tc>
       </w:tr>
+      <w:tr>
+        <w:trPr>
+          <w:cantSplit/>
+          <w:jc w:val="center"/>
+        </w:trPr>
+        <w:tc>
+          <w:tcPr>
+            <w:tcW w:w="1872" w:type="dxa"/>
+          </w:tcPr>
+          <w:p>
+            <w:pPr>
+              <w:spacing w:after="40"/>
+            </w:pPr>
+            <w:r>
+              <w:rPr>
+                <w:b/>
+                <w:sz w:val="19"/>
+              </w:rPr>
+              <w:lastRenderedPageBreak/>
+              <w:t>Type of protection</w:t>
+            </w:r>
+          </w:p>
+        </w:tc>
+        <w:tc>
+          <w:tcPr>
+            <w:tcW w:w="1584" w:type="dxa"/>
+          </w:tcPr>
+          <w:p>
+            <w:pPr>
+              <w:spacing w:after="40"/>
+            </w:pPr>
+            <w:r>
+              <w:rPr>
+                <w:sz w:val="19"/>
+              </w:rPr>
+              <w:t>Ex d — flameproof enclosure</w:t>
+            </w:r>
+          </w:p>
+        </w:tc>
+        <w:tc>
+          <w:tcPr>
+            <w:tcW w:w="2736" w:type="dxa"/>
+          </w:tcPr>
+          <w:p>
+            <w:pPr>
+              <w:spacing w:after="40"/>
+            </w:pPr>
+            <w:r>
+              <w:rPr>
+                <w:b/>
+                <w:color w:val="B56A1E"/>
+                <w:sz w:val="19"/>
+              </w:rPr>
+              <w:t>Team recommendation — pending ExCB confirmation</w:t>
+            </w:r>
+          </w:p>
+        </w:tc>
+        <w:tc>
+          <w:tcPr>
+            <w:tcW w:w="3456" w:type="dxa"/>
+          </w:tcPr>
+          <w:p>
+            <w:pPr>
+              <w:spacing w:after="40"/>
+            </w:pPr>
+            <w:r>
+              <w:rPr>
+                <w:sz w:val="19"/>
+              </w:rPr>
+              <w:t xml:space="preserve">Selected over Ex e and Ex i based on the existing enclosure design: a die-cast aluminum (ADC12) housing with a stainless-steel wire mesh over the sensing element functions as a flame path/flame arrestor, the same pattern used by the three comparable certified gas detectors reviewed as references (all Ex d). Ex i was set aside because the MQ-series sensor heaters draw continuous power (≈0.75 W each) directly from an unregulated 24 VDC supply rather than through certified current-limiting barriers, difficult </w:t>
+            </w:r>
+            <w:r>
+              <w:rPr>
+                <w:sz w:val="19"/>
+              </w:rPr>
+              <w:t>to reconcile with intrinsically-safe energy limits for Group IIC. Ex e was not pursued because it is not intended for enclosures with normally-energized, potentially arcing parts such as the sensor heaters.</w:t>
+            </w:r>
+          </w:p>
+        </w:tc>
+      </w:tr>
     </w:tbl>
     <w:p>
       <w:pPr>
@@ -11186,7 +11322,7 @@
                 <w:color w:val="4A4A4A"/>
                 <w:sz w:val="20"/>
               </w:rPr>
-              <w:t>These are engineering recommendations, not a certification decision. An independent readiness assessment of the same checklist item, prepared separately from the underlying firmware/hardware repository, reached the same conclusion — gas group, temperature class, ambient range, and zone are not yet formally established. Final classification requires explicit agreement with the ExCB.</w:t>
+              <w:t>These are engineering recommendations, not a certification decision. An independent readiness assessment of the same checklist item, prepared separately from the underlying firmware/hardware repository, reached the same conclusion — gas group, temperature class, ambient range, zone, and type of protection are not yet formally established. Final classification requires explicit agreement with the ExCB.</w:t>
             </w:r>
           </w:p>
         </w:tc>
@@ -11201,7 +11337,7 @@
       <w:pPr>
         <w:pStyle w:val="Heading2"/>
       </w:pPr>
-      <w:bookmarkStart w:id="17" w:name="_Toc241234440"/>
+      <w:bookmarkStart w:id="17" w:name="_Toc241498855"/>
       <w:r>
         <w:t>2.6 · Design and Manufacturing Information</w:t>
       </w:r>
@@ -11216,9 +11352,8 @@
       <w:pPr>
         <w:pStyle w:val="Heading3"/>
       </w:pPr>
-      <w:bookmarkStart w:id="18" w:name="_Toc241234441"/>
+      <w:bookmarkStart w:id="18" w:name="_Toc241498856"/>
       <w:r>
-        <w:lastRenderedPageBreak/>
         <w:t>2.6.a · Complete Drawings (Assembly, Component, Electrical Schematic, PCB Layout, Enclosure Structure, Junction Box, Terminal, Grounding)</w:t>
       </w:r>
       <w:bookmarkEnd w:id="18"/>
@@ -11236,8 +11371,9 @@
         <w:rPr>
           <w:noProof/>
         </w:rPr>
+        <w:lastRenderedPageBreak/>
         <w:drawing>
-          <wp:inline distT="0" distB="0" distL="0" distR="0" wp14:anchorId="38ED77D9" wp14:editId="091BA391">
+          <wp:inline distT="0" distB="0" distL="0" distR="0" wp14:anchorId="47F17A08" wp14:editId="15E36A37">
             <wp:extent cx="5120640" cy="3413760"/>
             <wp:effectExtent l="0" t="0" r="0" b="0"/>
             <wp:docPr id="8" name="Picture 8"/>
@@ -11308,9 +11444,8 @@
         <w:rPr>
           <w:noProof/>
         </w:rPr>
-        <w:lastRenderedPageBreak/>
         <w:drawing>
-          <wp:inline distT="0" distB="0" distL="0" distR="0" wp14:anchorId="045E9C17" wp14:editId="3C96CA7D">
+          <wp:inline distT="0" distB="0" distL="0" distR="0" wp14:anchorId="506E70E8" wp14:editId="37EE6593">
             <wp:extent cx="5120640" cy="3413760"/>
             <wp:effectExtent l="0" t="0" r="0" b="0"/>
             <wp:docPr id="9" name="Picture 9"/>
@@ -11381,8 +11516,9 @@
         <w:rPr>
           <w:noProof/>
         </w:rPr>
+        <w:lastRenderedPageBreak/>
         <w:drawing>
-          <wp:inline distT="0" distB="0" distL="0" distR="0" wp14:anchorId="7FE2F6B9" wp14:editId="412004D4">
+          <wp:inline distT="0" distB="0" distL="0" distR="0" wp14:anchorId="4FBB8474" wp14:editId="67D53DFD">
             <wp:extent cx="5120640" cy="3413760"/>
             <wp:effectExtent l="0" t="0" r="0" b="0"/>
             <wp:docPr id="10" name="Picture 10"/>
@@ -11453,9 +11589,8 @@
         <w:rPr>
           <w:noProof/>
         </w:rPr>
-        <w:lastRenderedPageBreak/>
         <w:drawing>
-          <wp:inline distT="0" distB="0" distL="0" distR="0" wp14:anchorId="046608F8" wp14:editId="5972BE4D">
+          <wp:inline distT="0" distB="0" distL="0" distR="0" wp14:anchorId="7AB809AB" wp14:editId="0157E182">
             <wp:extent cx="5120640" cy="3413760"/>
             <wp:effectExtent l="0" t="0" r="0" b="0"/>
             <wp:docPr id="11" name="Picture 11"/>
@@ -11526,8 +11661,9 @@
         <w:rPr>
           <w:noProof/>
         </w:rPr>
+        <w:lastRenderedPageBreak/>
         <w:drawing>
-          <wp:inline distT="0" distB="0" distL="0" distR="0" wp14:anchorId="21FB7042" wp14:editId="460E571D">
+          <wp:inline distT="0" distB="0" distL="0" distR="0" wp14:anchorId="2372D96C" wp14:editId="080BC99F">
             <wp:extent cx="5120640" cy="3413760"/>
             <wp:effectExtent l="0" t="0" r="0" b="0"/>
             <wp:docPr id="12" name="Picture 12"/>
@@ -11598,9 +11734,8 @@
         <w:rPr>
           <w:noProof/>
         </w:rPr>
-        <w:lastRenderedPageBreak/>
         <w:drawing>
-          <wp:inline distT="0" distB="0" distL="0" distR="0" wp14:anchorId="2F30C3C9" wp14:editId="7CD3BE19">
+          <wp:inline distT="0" distB="0" distL="0" distR="0" wp14:anchorId="47429F62" wp14:editId="61E940CA">
             <wp:extent cx="5120640" cy="3413760"/>
             <wp:effectExtent l="0" t="0" r="0" b="0"/>
             <wp:docPr id="13" name="Picture 13"/>
@@ -11671,8 +11806,9 @@
         <w:rPr>
           <w:noProof/>
         </w:rPr>
+        <w:lastRenderedPageBreak/>
         <w:drawing>
-          <wp:inline distT="0" distB="0" distL="0" distR="0" wp14:anchorId="6230BB3E" wp14:editId="028C249A">
+          <wp:inline distT="0" distB="0" distL="0" distR="0" wp14:anchorId="4C6760CB" wp14:editId="34F93CAA">
             <wp:extent cx="5120640" cy="3413760"/>
             <wp:effectExtent l="0" t="0" r="0" b="0"/>
             <wp:docPr id="14" name="Picture 14"/>
@@ -11743,9 +11879,8 @@
         <w:rPr>
           <w:noProof/>
         </w:rPr>
-        <w:lastRenderedPageBreak/>
         <w:drawing>
-          <wp:inline distT="0" distB="0" distL="0" distR="0" wp14:anchorId="5564CAB6" wp14:editId="16C18CC0">
+          <wp:inline distT="0" distB="0" distL="0" distR="0" wp14:anchorId="58991555" wp14:editId="03D433FA">
             <wp:extent cx="5120640" cy="3413760"/>
             <wp:effectExtent l="0" t="0" r="0" b="0"/>
             <wp:docPr id="15" name="Picture 15"/>
@@ -11816,8 +11951,9 @@
         <w:rPr>
           <w:noProof/>
         </w:rPr>
+        <w:lastRenderedPageBreak/>
         <w:drawing>
-          <wp:inline distT="0" distB="0" distL="0" distR="0" wp14:anchorId="1A416A0F" wp14:editId="5A8E7FCA">
+          <wp:inline distT="0" distB="0" distL="0" distR="0" wp14:anchorId="7EDAA5FA" wp14:editId="251E75D0">
             <wp:extent cx="5120640" cy="3413760"/>
             <wp:effectExtent l="0" t="0" r="0" b="0"/>
             <wp:docPr id="16" name="Picture 16"/>
@@ -11888,9 +12024,8 @@
         <w:rPr>
           <w:noProof/>
         </w:rPr>
-        <w:lastRenderedPageBreak/>
         <w:drawing>
-          <wp:inline distT="0" distB="0" distL="0" distR="0" wp14:anchorId="27C94705" wp14:editId="6FB64E19">
+          <wp:inline distT="0" distB="0" distL="0" distR="0" wp14:anchorId="1C9A6822" wp14:editId="6A99A356">
             <wp:extent cx="2468880" cy="2479268"/>
             <wp:effectExtent l="0" t="0" r="0" b="0"/>
             <wp:docPr id="17" name="Picture 17"/>
@@ -11933,7 +12068,7 @@
           <w:noProof/>
         </w:rPr>
         <w:drawing>
-          <wp:inline distT="0" distB="0" distL="0" distR="0" wp14:anchorId="3FDF19A1" wp14:editId="6CE71BC3">
+          <wp:inline distT="0" distB="0" distL="0" distR="0" wp14:anchorId="231C02EB" wp14:editId="04A8C1B3">
             <wp:extent cx="2468880" cy="1804956"/>
             <wp:effectExtent l="0" t="0" r="0" b="0"/>
             <wp:docPr id="18" name="Picture 18"/>
@@ -12009,8 +12144,9 @@
         <w:rPr>
           <w:noProof/>
         </w:rPr>
+        <w:lastRenderedPageBreak/>
         <w:drawing>
-          <wp:inline distT="0" distB="0" distL="0" distR="0" wp14:anchorId="792105B7" wp14:editId="02E543AE">
+          <wp:inline distT="0" distB="0" distL="0" distR="0" wp14:anchorId="591B98B6" wp14:editId="12BE7029">
             <wp:extent cx="5669280" cy="3847707"/>
             <wp:effectExtent l="0" t="0" r="0" b="0"/>
             <wp:docPr id="19" name="Picture 19"/>
@@ -12070,15 +12206,7 @@
           <w:color w:val="4A4A4A"/>
           <w:sz w:val="17"/>
         </w:rPr>
-        <w:t xml:space="preserve">Orthographic and isometric views with real dimensions (enclosure neck Ø75 mm, overall probe height 191.51 mm, mounting plate 250×250 </w:t>
-      </w:r>
-      <w:r>
-        <w:rPr>
-          <w:color w:val="4A4A4A"/>
-          <w:sz w:val="17"/>
-        </w:rPr>
-        <w:lastRenderedPageBreak/>
-        <w:t>mm with toleranced hole pattern), a U-bolt parameter table (2″/DN50, M10 thread), and a title block (drafted 31 Aug 2026). Source: dimensioned CAD drawing derived from a STEP solid model of the enclosure and bracket assembly.</w:t>
+        <w:t>Orthographic and isometric views with real dimensions (enclosure neck Ø75 mm, overall probe height 191.51 mm, mounting plate 250×250 mm with toleranced hole pattern), a U-bolt parameter table (2″/DN50, M10 thread), and a title block (drafted 31 Aug 2026). Source: dimensioned CAD drawing derived from a STEP solid model of the enclosure and bracket assembly.</w:t>
       </w:r>
     </w:p>
     <w:tbl>
@@ -12397,6 +12525,7 @@
                 <w:b/>
                 <w:sz w:val="19"/>
               </w:rPr>
+              <w:lastRenderedPageBreak/>
               <w:t>Enclosure structure drawing (gap, length, volume)</w:t>
             </w:r>
           </w:p>
@@ -12538,15 +12667,7 @@
                 <w:color w:val="4A4A4A"/>
                 <w:sz w:val="20"/>
               </w:rPr>
-              <w:t xml:space="preserve">Real dimensioned CAD drawings now exist for the enclosure's external envelope and mounting hardware, and native </w:t>
-            </w:r>
-            <w:r>
-              <w:rPr>
-                <w:color w:val="4A4A4A"/>
-                <w:sz w:val="20"/>
-              </w:rPr>
-              <w:lastRenderedPageBreak/>
-              <w:t>PCB layout/schematic source files exist for the electronics. What is still missing for a certifiable drawing package: internal component/assembly drawings, junction box and grounding-connection drawings, and — specific to explosion protection — flame-path gap/length/volume dimensioning, which requires a confirmed protection concept before it can be drawn.</w:t>
+              <w:t>Real dimensioned CAD drawings now exist for the enclosure's external envelope and mounting hardware, and native PCB layout/schematic source files exist for the electronics. What is still missing for a certifiable drawing package: internal component/assembly drawings, junction box and grounding-connection drawings, and — specific to explosion protection — flame-path gap/length/volume dimensioning, which requires a confirmed protection concept before it can be drawn.</w:t>
             </w:r>
           </w:p>
         </w:tc>
@@ -12561,7 +12682,7 @@
       <w:pPr>
         <w:pStyle w:val="Heading3"/>
       </w:pPr>
-      <w:bookmarkStart w:id="19" w:name="_Toc241234442"/>
+      <w:bookmarkStart w:id="19" w:name="_Toc241498857"/>
       <w:r>
         <w:t>2.6.b · Bill of Materials (BOM) for Explosion-Safety-Relevant Components</w:t>
       </w:r>
@@ -12577,7 +12698,11 @@
         <w:t>It does not, however, satisfy this checklist item as written. The checklist asks specifically for the explosion-safety-relevant BOM — enclosure, gaskets, terminals, cable entry devices, switches, light sources, battery, potting compound, and plastic parts, each with material grade and Ex/UL/CCC certification status. None of those mechanical/safety items appear in an electronic CAD BOM: the enclosure is present only as a placeholder mechanical symbol (designator U50, no manufacturer or dimensional data attac</w:t>
       </w:r>
       <w:r>
-        <w:t>hed), and the gas sensor itself (MQ2, designator I1) has no manufacturer or supplier part number recorded — it is sourced outside the LCSC/JLCPCB supply chain and its Ex status is unverified. Comparative research on Ex-rated enclosure products from other manufacturers exists internally as a reference for target specifications only — it describes third-party products, not this product's actual components, and is not included here.</w:t>
+        <w:t xml:space="preserve">hed), and the gas sensor itself (MQ2, designator I1) has no manufacturer or supplier part number recorded — it is sourced outside the </w:t>
+      </w:r>
+      <w:r>
+        <w:lastRenderedPageBreak/>
+        <w:t>LCSC/JLCPCB supply chain and its Ex status is unverified. Comparative research on Ex-rated enclosure products from other manufacturers exists internally as a reference for target specifications only — it describes third-party products, not this product's actual components, and is not included here.</w:t>
       </w:r>
     </w:p>
     <w:tbl>
@@ -14388,7 +14513,6 @@
                 <w:b/>
                 <w:sz w:val="15"/>
               </w:rPr>
-              <w:lastRenderedPageBreak/>
               <w:t>D12</w:t>
             </w:r>
           </w:p>
@@ -16552,6 +16676,7 @@
                 <w:b/>
                 <w:sz w:val="15"/>
               </w:rPr>
+              <w:lastRenderedPageBreak/>
               <w:t>SW1</w:t>
             </w:r>
           </w:p>
@@ -18612,7 +18737,6 @@
                 <w:b/>
                 <w:sz w:val="15"/>
               </w:rPr>
-              <w:lastRenderedPageBreak/>
               <w:t>U2,U3</w:t>
             </w:r>
           </w:p>
@@ -20467,6 +20591,7 @@
                 <w:b/>
                 <w:sz w:val="15"/>
               </w:rPr>
+              <w:lastRenderedPageBreak/>
               <w:t>C39,C40,C62,C63,C64,C67,C68,C5</w:t>
             </w:r>
           </w:p>
@@ -22777,7 +22902,6 @@
                 <w:b/>
                 <w:sz w:val="15"/>
               </w:rPr>
-              <w:lastRenderedPageBreak/>
               <w:t>R2,R3</w:t>
             </w:r>
           </w:p>
@@ -23542,8 +23666,9 @@
       <w:pPr>
         <w:pStyle w:val="Heading3"/>
       </w:pPr>
-      <w:bookmarkStart w:id="20" w:name="_Toc241234443"/>
+      <w:bookmarkStart w:id="20" w:name="_Toc241498858"/>
       <w:r>
+        <w:lastRenderedPageBreak/>
         <w:t>2.6.c · Material Specification Sheets / Datasheets (Non-Metallic Materials)</w:t>
       </w:r>
       <w:bookmarkEnd w:id="20"/>
@@ -23609,15 +23734,7 @@
                 <w:color w:val="4A4A4A"/>
                 <w:sz w:val="20"/>
               </w:rPr>
-              <w:t xml:space="preserve">ximum surface capacitance &lt;5 pF (coating thickness ≤ 0.2 mm). These are the type of parameter IEC 60079-0 requires for coated/non-metallic surfaces on Ex equipment, but they describe a supplier's candidate component, not a confirmed datasheet for GLD's own enclosure </w:t>
-            </w:r>
-            <w:r>
-              <w:rPr>
-                <w:color w:val="4A4A4A"/>
-                <w:sz w:val="20"/>
-              </w:rPr>
-              <w:lastRenderedPageBreak/>
-              <w:t>finish.</w:t>
+              <w:t>ximum surface capacitance &lt;5 pF (coating thickness ≤ 0.2 mm). These are the type of parameter IEC 60079-0 requires for coated/non-metallic surfaces on Ex equipment, but they describe a supplier's candidate component, not a confirmed datasheet for GLD's own enclosure finish.</w:t>
             </w:r>
           </w:p>
         </w:tc>
@@ -23632,7 +23749,7 @@
       <w:pPr>
         <w:pStyle w:val="Heading3"/>
       </w:pPr>
-      <w:bookmarkStart w:id="21" w:name="_Toc241234444"/>
+      <w:bookmarkStart w:id="21" w:name="_Toc241498859"/>
       <w:r>
         <w:t>2.6.d · Manufacturing Process Description</w:t>
       </w:r>
@@ -23691,7 +23808,7 @@
       <w:pPr>
         <w:pStyle w:val="Heading3"/>
       </w:pPr>
-      <w:bookmarkStart w:id="22" w:name="_Toc241234445"/>
+      <w:bookmarkStart w:id="22" w:name="_Toc241498860"/>
       <w:r>
         <w:t>2.6.e · Explosion-Protection Calculations and Explanations (if applicable)</w:t>
       </w:r>
@@ -23699,7 +23816,7 @@
     </w:p>
     <w:p>
       <w:r>
-        <w:t>Calculations depend on the explosion-protection concept selected (e.g., Ex d, Ex e, Ex i), which has not yet been confirmed with the ExCB, and on final enclosure geometry from the casing development partner. No calculations have been performed.</w:t>
+        <w:t>Flame-path (joint gap, length) and free-internal-volume calculations specific to Ex d (Section 2.5, team recommendation) have not yet been performed, pending final enclosure geometry from the casing development partner and a confirmed protection concept with the ExCB.</w:t>
       </w:r>
     </w:p>
     <w:tbl>
@@ -23735,7 +23852,8 @@
                 <w:color w:val="4A4A4A"/>
                 <w:sz w:val="20"/>
               </w:rPr>
-              <w:t>Status: Not yet available — pending protection-concept confirmation and final enclosure design.</w:t>
+              <w:lastRenderedPageBreak/>
+              <w:t>Status: Not yet available — pending ExCB confirmation of the Ex d protection concept and final enclosure design.</w:t>
             </w:r>
           </w:p>
         </w:tc>
@@ -23750,7 +23868,7 @@
       <w:pPr>
         <w:pStyle w:val="Heading3"/>
       </w:pPr>
-      <w:bookmarkStart w:id="23" w:name="_Toc241234446"/>
+      <w:bookmarkStart w:id="23" w:name="_Toc241498861"/>
       <w:r>
         <w:t>2.6.f · Temperature Group Calculation (Hottest-Point Temperature Estimation)</w:t>
       </w:r>
@@ -23812,7 +23930,7 @@
       <w:pPr>
         <w:pStyle w:val="Heading3"/>
       </w:pPr>
-      <w:bookmarkStart w:id="24" w:name="_Toc241234447"/>
+      <w:bookmarkStart w:id="24" w:name="_Toc241498862"/>
       <w:r>
         <w:t>2.6.g · Usage and Installation Instructions (Draft)</w:t>
       </w:r>
@@ -24026,7 +24144,6 @@
                 <w:b/>
                 <w:sz w:val="19"/>
               </w:rPr>
-              <w:lastRenderedPageBreak/>
               <w:t>c) Operating instructions and maintenance requirements</w:t>
             </w:r>
           </w:p>
@@ -24197,6 +24314,7 @@
         <w:rPr>
           <w:sz w:val="20"/>
         </w:rPr>
+        <w:lastRenderedPageBreak/>
         <w:t>Do not drill, weld, enlarge cable entries, bypass protective devices, or modify the enclosure without written engineering and Ex approval.</w:t>
       </w:r>
     </w:p>
@@ -24273,14 +24391,13 @@
         <w:rPr>
           <w:sz w:val="20"/>
         </w:rPr>
-        <w:t xml:space="preserve">Before each operating period, check power, enclosure condition, diagnostic status, communication status, and the absence of active faults. Treat an alarm as a real process-safety event until the site response procedure establishes otherwise. If the detector reports a fault or loses required communication, notify the responsible operator and place </w:t>
+        <w:t>Before each operating period, check power, enclosure condition, diagnostic status, communication status, and the absence of active faults. Treat an alarm as a real process-safety event until the site response procedure establishes otherwise. If the detector reports a fault or loses required communication, notify the responsible operator and place the affected detection point in the site impairment process. Do not change firmware, model files, alarm thresholds, or calibration parameters from the field withou</w:t>
       </w:r>
       <w:r>
         <w:rPr>
           <w:sz w:val="20"/>
         </w:rPr>
-        <w:lastRenderedPageBreak/>
-        <w:t>the affected detection point in the site impairment process. Do not change firmware, model files, alarm thresholds, or calibration parameters from the field without controlled approval and a documented rollback path.</w:t>
+        <w:t>t controlled approval and a documented rollback path.</w:t>
       </w:r>
     </w:p>
     <w:p>
@@ -24542,7 +24659,7 @@
       <w:pPr>
         <w:pStyle w:val="Heading3"/>
       </w:pPr>
-      <w:bookmarkStart w:id="25" w:name="_Toc241234448"/>
+      <w:bookmarkStart w:id="25" w:name="_Toc241498863"/>
       <w:r>
         <w:t>2.6.h · Nameplate Information</w:t>
       </w:r>
@@ -24601,8 +24718,9 @@
       <w:pPr>
         <w:pStyle w:val="Heading3"/>
       </w:pPr>
-      <w:bookmarkStart w:id="26" w:name="_Toc241234449"/>
+      <w:bookmarkStart w:id="26" w:name="_Toc241498864"/>
       <w:r>
+        <w:lastRenderedPageBreak/>
         <w:t>2.6.i · Ex Component Certificates</w:t>
       </w:r>
       <w:bookmarkEnd w:id="26"/>
@@ -24660,7 +24778,7 @@
       <w:pPr>
         <w:pStyle w:val="Heading1"/>
       </w:pPr>
-      <w:bookmarkStart w:id="27" w:name="_Toc241234450"/>
+      <w:bookmarkStart w:id="27" w:name="_Toc241498865"/>
       <w:r>
         <w:t>3. Sample Information</w:t>
       </w:r>
@@ -24675,7 +24793,7 @@
       <w:pPr>
         <w:pStyle w:val="Heading2"/>
       </w:pPr>
-      <w:bookmarkStart w:id="28" w:name="_Toc241234451"/>
+      <w:bookmarkStart w:id="28" w:name="_Toc241498866"/>
       <w:r>
         <w:t>3.1 · Model, Serial Number, and Status</w:t>
       </w:r>
@@ -24734,9 +24852,8 @@
       <w:pPr>
         <w:pStyle w:val="Heading2"/>
       </w:pPr>
-      <w:bookmarkStart w:id="29" w:name="_Toc241234452"/>
+      <w:bookmarkStart w:id="29" w:name="_Toc241498867"/>
       <w:r>
-        <w:lastRenderedPageBreak/>
         <w:t>3.2 · Test Fixtures and Auxiliary Equipment</w:t>
       </w:r>
       <w:bookmarkEnd w:id="29"/>
@@ -25088,6 +25205,7 @@
     </w:p>
     <w:p>
       <w:r>
+        <w:lastRenderedPageBreak/>
         <w:t>A second, commissioning-oriented equipment list is drafted separately (source: internal working draft, Rev. 18 Sep 2026), organized by physical test apparatus rather than by test group:</w:t>
       </w:r>
     </w:p>
@@ -25475,7 +25593,7 @@
           <w:color w:val="8A8A8A"/>
           <w:sz w:val="17"/>
         </w:rPr>
-        <w:t xml:space="preserve">This is a working document, prepared in stages, drafted in direct reference to the IECEx/ATEX Certification Information Requirements (original English/Mandarin version issued by the certification body). Data sources: the official product technical datasheet (Institute of Technology Bandung, Revision 4.0), internal technical specification documentation, EMC parameter measurement data, and product photography. Fields </w:t>
+        <w:t>This is a working document, prepared in stages, drafted in direct reference to the IECEx/ATEX Certification Information Requirements (original English/Mandarin version issued by the certification body). Data sources: the official product technical datasheet (Institute of Technology Bandung, Revision 4.0), internal technical specification documentation, EMC parameter measurement data, and product photography. Fields marked “Pending confirmation” are not yet final and must not be relied upon for procurement o</w:t>
       </w:r>
       <w:r>
         <w:rPr>
@@ -25483,8 +25601,7 @@
           <w:color w:val="8A8A8A"/>
           <w:sz w:val="17"/>
         </w:rPr>
-        <w:lastRenderedPageBreak/>
-        <w:t>marked “Pending confirmation” are not yet final and must not be relied upon for procurement or certification purposes without further verification.</w:t>
+        <w:t>r certification purposes without further verification.</w:t>
       </w:r>
     </w:p>
     <w:sectPr>
@@ -25535,7 +25652,7 @@
         <w:color w:val="4A4A4A"/>
         <w:sz w:val="16"/>
       </w:rPr>
-      <w:t>LGU/GLD/IECEX-TDF/2026-001  ·  Rev. 1.1</w:t>
+      <w:t>LGU/GLD/IECEX-TDF/2026-001  ·  Rev. 1.2</w:t>
     </w:r>
     <w:r>
       <w:tab/>
@@ -25805,31 +25922,31 @@
       </w:rPr>
     </w:lvl>
   </w:abstractNum>
-  <w:num w:numId="1" w16cid:durableId="64692981">
+  <w:num w:numId="1" w16cid:durableId="99229768">
     <w:abstractNumId w:val="8"/>
   </w:num>
-  <w:num w:numId="2" w16cid:durableId="1170220534">
+  <w:num w:numId="2" w16cid:durableId="776750280">
     <w:abstractNumId w:val="6"/>
   </w:num>
-  <w:num w:numId="3" w16cid:durableId="1495948652">
+  <w:num w:numId="3" w16cid:durableId="1699694369">
     <w:abstractNumId w:val="5"/>
   </w:num>
-  <w:num w:numId="4" w16cid:durableId="808521303">
+  <w:num w:numId="4" w16cid:durableId="1777217164">
     <w:abstractNumId w:val="4"/>
   </w:num>
-  <w:num w:numId="5" w16cid:durableId="78719289">
+  <w:num w:numId="5" w16cid:durableId="196085041">
     <w:abstractNumId w:val="7"/>
   </w:num>
-  <w:num w:numId="6" w16cid:durableId="1726097512">
+  <w:num w:numId="6" w16cid:durableId="971791003">
     <w:abstractNumId w:val="3"/>
   </w:num>
-  <w:num w:numId="7" w16cid:durableId="1190609150">
+  <w:num w:numId="7" w16cid:durableId="2095321327">
     <w:abstractNumId w:val="2"/>
   </w:num>
-  <w:num w:numId="8" w16cid:durableId="298613041">
+  <w:num w:numId="8" w16cid:durableId="775104586">
     <w:abstractNumId w:val="1"/>
   </w:num>
-  <w:num w:numId="9" w16cid:durableId="915095189">
+  <w:num w:numId="9" w16cid:durableId="333652965">
     <w:abstractNumId w:val="0"/>
   </w:num>
 </w:numbering>
@@ -37261,7 +37378,7 @@
     <w:autoRedefine/>
     <w:uiPriority w:val="39"/>
     <w:unhideWhenUsed/>
-    <w:rsid w:val="00626FB9"/>
+    <w:rsid w:val="00F53640"/>
     <w:pPr>
       <w:spacing w:after="100"/>
     </w:pPr>
@@ -37273,7 +37390,7 @@
     <w:autoRedefine/>
     <w:uiPriority w:val="39"/>
     <w:unhideWhenUsed/>
-    <w:rsid w:val="00626FB9"/>
+    <w:rsid w:val="00F53640"/>
     <w:pPr>
       <w:spacing w:after="100"/>
       <w:ind w:left="210"/>
@@ -37286,7 +37403,7 @@
     <w:autoRedefine/>
     <w:uiPriority w:val="39"/>
     <w:unhideWhenUsed/>
-    <w:rsid w:val="00626FB9"/>
+    <w:rsid w:val="00F53640"/>
     <w:pPr>
       <w:spacing w:after="100"/>
       <w:ind w:left="420"/>
@@ -37297,7 +37414,7 @@
     <w:basedOn w:val="DefaultParagraphFont"/>
     <w:uiPriority w:val="99"/>
     <w:unhideWhenUsed/>
-    <w:rsid w:val="00626FB9"/>
+    <w:rsid w:val="00F53640"/>
     <w:rPr>
       <w:color w:val="0000FF" w:themeColor="hyperlink"/>
       <w:u w:val="single"/>

</xml_diff>

<commit_message>
Ganti Applicant sertifikasi jadi PT Galaksi, hapus rujukan LGU/ITB
Applicant sekarang sama dengan Manufacturer: PT Galaksi Megatama
Indonesia satu entitas. Sebelumnya Applicant=LGU dengan LGU dicatat
sebagai "design and development authority" dan ITB sebagai "technical
partner" - keduanya dihapus dari letterhead, Document Control, dan
tabel-tabel terkait di Dokumen Teknis Sertifikasi (rev 1.1->1.3) dan
draf form GTS. Kontak Applicant di form GTS dikembalikan ke "Perlu
keputusan" karena data kontak resmi PT Galaksi (di luar nama Direksi
dari akta) tidak tersedia - tidak menebak nomor telepon/email.
Kalimat naratif yang menjelaskan siapa mengerjakan desain elektronik
dibuat generik, bukan dihapus substansinya, supaya tetap jujur tanpa
mengklaim PT Galaksi sendiri yang mendesain elektronik/firmware.

Co-Authored-By: Claude Sonnet 5 <noreply@anthropic.com>
</commit_message>
<xml_diff>
--- a/Deliverables/Dokumen_Teknis_Sertifikasi_GLD_IECEx_ATEX.docx
+++ b/Deliverables/Dokumen_Teknis_Sertifikasi_GLD_IECEx_ATEX.docx
@@ -26,7 +26,7 @@
                 <w:color w:val="FFFFFF"/>
                 <w:sz w:val="28"/>
               </w:rPr>
-              <w:t>PT LAPI GANESHA UTAMA</w:t>
+              <w:t>PT GALAKSI MEGATAMA INDONESIA</w:t>
             </w:r>
           </w:p>
           <w:p>
@@ -38,7 +38,7 @@
                 <w:color w:val="C7D2E0"/>
                 <w:sz w:val="19"/>
               </w:rPr>
-              <w:t>In technical partnership with the Institute of Technology Bandung</w:t>
+              <w:t>Manufacturer of record</w:t>
             </w:r>
           </w:p>
         </w:tc>
@@ -189,7 +189,7 @@
               <w:rPr>
                 <w:sz w:val="20"/>
               </w:rPr>
-              <w:t>LGU/GLD/IECEX-TDF/2026-001</w:t>
+              <w:t>GMI/GLD/IECEX-TDF/2026-001</w:t>
             </w:r>
           </w:p>
         </w:tc>
@@ -226,7 +226,7 @@
               <w:rPr>
                 <w:sz w:val="20"/>
               </w:rPr>
-              <w:t>1.2</w:t>
+              <w:t>1.3</w:t>
             </w:r>
           </w:p>
         </w:tc>
@@ -395,7 +395,7 @@
                 <w:color w:val="4A4A4A"/>
                 <w:sz w:val="19"/>
               </w:rPr>
-              <w:t>Manufacturer</w:t>
+              <w:t>Applicant / Manufacturer</w:t>
             </w:r>
           </w:p>
         </w:tc>
@@ -412,80 +412,6 @@
                 <w:sz w:val="20"/>
               </w:rPr>
               <w:t>PT Galaksi Megatama Indonesia</w:t>
-            </w:r>
-          </w:p>
-        </w:tc>
-      </w:tr>
-      <w:tr>
-        <w:tc>
-          <w:tcPr>
-            <w:tcW w:w="2880" w:type="dxa"/>
-            <w:shd w:val="clear" w:color="auto" w:fill="EFEFEF"/>
-          </w:tcPr>
-          <w:p>
-            <w:pPr>
-              <w:spacing w:after="40"/>
-            </w:pPr>
-            <w:r>
-              <w:rPr>
-                <w:b/>
-                <w:color w:val="4A4A4A"/>
-                <w:sz w:val="19"/>
-              </w:rPr>
-              <w:t>Design &amp; development authority</w:t>
-            </w:r>
-          </w:p>
-        </w:tc>
-        <w:tc>
-          <w:tcPr>
-            <w:tcW w:w="6480" w:type="dxa"/>
-          </w:tcPr>
-          <w:p>
-            <w:pPr>
-              <w:spacing w:after="40"/>
-            </w:pPr>
-            <w:r>
-              <w:rPr>
-                <w:sz w:val="20"/>
-              </w:rPr>
-              <w:t>PT LAPI Ganesha Utama</w:t>
-            </w:r>
-          </w:p>
-        </w:tc>
-      </w:tr>
-      <w:tr>
-        <w:tc>
-          <w:tcPr>
-            <w:tcW w:w="2880" w:type="dxa"/>
-            <w:shd w:val="clear" w:color="auto" w:fill="EFEFEF"/>
-          </w:tcPr>
-          <w:p>
-            <w:pPr>
-              <w:spacing w:after="40"/>
-            </w:pPr>
-            <w:r>
-              <w:rPr>
-                <w:b/>
-                <w:color w:val="4A4A4A"/>
-                <w:sz w:val="19"/>
-              </w:rPr>
-              <w:t>Technical partner</w:t>
-            </w:r>
-          </w:p>
-        </w:tc>
-        <w:tc>
-          <w:tcPr>
-            <w:tcW w:w="6480" w:type="dxa"/>
-          </w:tcPr>
-          <w:p>
-            <w:pPr>
-              <w:spacing w:after="40"/>
-            </w:pPr>
-            <w:r>
-              <w:rPr>
-                <w:sz w:val="20"/>
-              </w:rPr>
-              <w:t>Institute of Technology Bandung</w:t>
             </w:r>
           </w:p>
         </w:tc>
@@ -761,7 +687,7 @@
               <w:rPr>
                 <w:sz w:val="19"/>
               </w:rPr>
-              <w:t>Manufacturer-of-record for Section 1 changed to PT Galaksi Megatama Indonesia (legal documents on file); PT LAPI Ganesha Utama recorded as design and development authority. Section 2.6.g draft content (safety warnings, installation procedures, operating modes, commissioning equipment) added.</w:t>
+              <w:t>Manufacturer-of-record for Section 1 changed to PT Galaksi Megatama Indonesia (legal documents on file). Section 2.6.g draft content (safety warnings, installation procedures, operating modes, commissioning equipment) added.</w:t>
             </w:r>
           </w:p>
         </w:tc>
@@ -811,14 +737,7 @@
               <w:rPr>
                 <w:sz w:val="19"/>
               </w:rPr>
-              <w:t xml:space="preserve">Candidate enclosure component data (ADC12 die-cast alloy, M20×1.5 cable entry, electrostatic-safety parameters) added to Sections 2.3.c, 2.6.a, and </w:t>
-            </w:r>
-            <w:r>
-              <w:rPr>
-                <w:sz w:val="19"/>
-              </w:rPr>
-              <w:lastRenderedPageBreak/>
-              <w:t>2.6.c, sourced from a supplier reference drawing in the casing partner's supply chain.</w:t>
+              <w:t>Candidate enclosure component data (ADC12 die-cast alloy, M20×1.5 cable entry, electrostatic-safety parameters) added to Sections 2.3.c, 2.6.a, and 2.6.c, sourced from a supplier reference drawing in the casing partner's supply chain.</w:t>
             </w:r>
           </w:p>
         </w:tc>
@@ -836,40 +755,46 @@
               <w:rPr>
                 <w:sz w:val="19"/>
               </w:rPr>
+              <w:t>0.5</w:t>
+            </w:r>
+          </w:p>
+        </w:tc>
+        <w:tc>
+          <w:tcPr>
+            <w:tcW w:w="1872" w:type="dxa"/>
+          </w:tcPr>
+          <w:p>
+            <w:pPr>
+              <w:spacing w:after="40"/>
+            </w:pPr>
+            <w:r>
+              <w:rPr>
+                <w:sz w:val="19"/>
+              </w:rPr>
+              <w:t>22 September 2026</w:t>
+            </w:r>
+          </w:p>
+        </w:tc>
+        <w:tc>
+          <w:tcPr>
+            <w:tcW w:w="6192" w:type="dxa"/>
+          </w:tcPr>
+          <w:p>
+            <w:pPr>
+              <w:spacing w:after="40"/>
+            </w:pPr>
+            <w:r>
+              <w:rPr>
+                <w:sz w:val="19"/>
+              </w:rPr>
+              <w:t xml:space="preserve">Enclosure material grade confirmed as ADC12 (Section 2.3.c, status raised to </w:t>
+            </w:r>
+            <w:r>
+              <w:rPr>
+                <w:sz w:val="19"/>
+              </w:rPr>
               <w:lastRenderedPageBreak/>
-              <w:t>0.5</w:t>
-            </w:r>
-          </w:p>
-        </w:tc>
-        <w:tc>
-          <w:tcPr>
-            <w:tcW w:w="1872" w:type="dxa"/>
-          </w:tcPr>
-          <w:p>
-            <w:pPr>
-              <w:spacing w:after="40"/>
-            </w:pPr>
-            <w:r>
-              <w:rPr>
-                <w:sz w:val="19"/>
-              </w:rPr>
-              <w:t>22 September 2026</w:t>
-            </w:r>
-          </w:p>
-        </w:tc>
-        <w:tc>
-          <w:tcPr>
-            <w:tcW w:w="6192" w:type="dxa"/>
-          </w:tcPr>
-          <w:p>
-            <w:pPr>
-              <w:spacing w:after="40"/>
-            </w:pPr>
-            <w:r>
-              <w:rPr>
-                <w:sz w:val="19"/>
-              </w:rPr>
-              <w:t>Enclosure material grade confirmed as ADC12 (Section 2.3.c, status raised to Final with an explicit caveat that this extrapolates from the casing manufacturer's sub-component drawing, not a direct callout on the main enclosure drawing). Cable entry (Section 2.3.c) confirmed as a 2-conductor cable labeled L+/L−, each conductor ≈0.75 mm diameter.</w:t>
+              <w:t>Final with an explicit caveat that this extrapolates from the casing manufacturer's sub-component drawing, not a direct callout on the main enclosure drawing). Cable entry (Section 2.3.c) confirmed as a 2-conductor cable labeled L+/L−, each conductor ≈0.75 mm diameter.</w:t>
             </w:r>
           </w:p>
         </w:tc>
@@ -887,6 +812,7 @@
               <w:rPr>
                 <w:sz w:val="19"/>
               </w:rPr>
+              <w:lastRenderedPageBreak/>
               <w:t>0.6</w:t>
             </w:r>
           </w:p>
@@ -1232,6 +1158,63 @@
                 <w:sz w:val="19"/>
               </w:rPr>
               <w:t>B decision.</w:t>
+            </w:r>
+          </w:p>
+        </w:tc>
+      </w:tr>
+      <w:tr>
+        <w:tc>
+          <w:tcPr>
+            <w:tcW w:w="1296" w:type="dxa"/>
+          </w:tcPr>
+          <w:p>
+            <w:pPr>
+              <w:spacing w:after="40"/>
+            </w:pPr>
+            <w:r>
+              <w:rPr>
+                <w:sz w:val="19"/>
+              </w:rPr>
+              <w:t>1.3</w:t>
+            </w:r>
+          </w:p>
+        </w:tc>
+        <w:tc>
+          <w:tcPr>
+            <w:tcW w:w="1872" w:type="dxa"/>
+          </w:tcPr>
+          <w:p>
+            <w:pPr>
+              <w:spacing w:after="40"/>
+            </w:pPr>
+            <w:r>
+              <w:rPr>
+                <w:sz w:val="19"/>
+              </w:rPr>
+              <w:t>28 September 2026</w:t>
+            </w:r>
+          </w:p>
+        </w:tc>
+        <w:tc>
+          <w:tcPr>
+            <w:tcW w:w="6192" w:type="dxa"/>
+          </w:tcPr>
+          <w:p>
+            <w:pPr>
+              <w:spacing w:after="40"/>
+            </w:pPr>
+            <w:r>
+              <w:rPr>
+                <w:sz w:val="19"/>
+              </w:rPr>
+              <w:t xml:space="preserve">Applicant/Manufacturer identity simplified to a single entity, PT Galaksi Megatama Indonesia, throughout the document (document number prefix changed to GMI/...). Removed all references to PT LAPI Ganesha Utama as “design and development authority” and to the Institute of Technology </w:t>
+            </w:r>
+            <w:r>
+              <w:rPr>
+                <w:sz w:val="19"/>
+              </w:rPr>
+              <w:lastRenderedPageBreak/>
+              <w:t>Bandung as “technical partner” (Sections 1.1, 1.3, 2.2, letterhead, Document Control) per updated applicant-identity decision; narrative passages describing electronics design/engineering work were made generic rather than deleted, to avoid implying the Manufacturer performed work it did not.</w:t>
             </w:r>
           </w:p>
         </w:tc>
@@ -1239,6 +1222,7 @@
     </w:tbl>
     <w:p>
       <w:r>
+        <w:lastRenderedPageBreak/>
         <w:br w:type="page"/>
       </w:r>
     </w:p>
@@ -1275,7 +1259,7 @@
       <w:r>
         <w:fldChar w:fldCharType="separate"/>
       </w:r>
-      <w:hyperlink w:anchor="_Toc241498838" w:history="1">
+      <w:hyperlink w:anchor="_Toc241510258" w:history="1">
         <w:r>
           <w:rPr>
             <w:rStyle w:val="Hyperlink"/>
@@ -1302,7 +1286,7 @@
             <w:noProof/>
             <w:webHidden/>
           </w:rPr>
-          <w:instrText xml:space="preserve"> PAGEREF _Toc241498838 \h </w:instrText>
+          <w:instrText xml:space="preserve"> PAGEREF _Toc241510258 \h </w:instrText>
         </w:r>
         <w:r>
           <w:rPr>
@@ -1322,7 +1306,7 @@
             <w:noProof/>
             <w:webHidden/>
           </w:rPr>
-          <w:t>5</w:t>
+          <w:t>6</w:t>
         </w:r>
         <w:r>
           <w:rPr>
@@ -1343,7 +1327,7 @@
           <w:noProof/>
         </w:rPr>
       </w:pPr>
-      <w:hyperlink w:anchor="_Toc241498839" w:history="1">
+      <w:hyperlink w:anchor="_Toc241510259" w:history="1">
         <w:r>
           <w:rPr>
             <w:rStyle w:val="Hyperlink"/>
@@ -1370,75 +1354,7 @@
             <w:noProof/>
             <w:webHidden/>
           </w:rPr>
-          <w:instrText xml:space="preserve"> PAGEREF _Toc241498839 \h </w:instrText>
-        </w:r>
-        <w:r>
-          <w:rPr>
-            <w:noProof/>
-            <w:webHidden/>
-          </w:rPr>
-        </w:r>
-        <w:r>
-          <w:rPr>
-            <w:noProof/>
-            <w:webHidden/>
-          </w:rPr>
-          <w:fldChar w:fldCharType="separate"/>
-        </w:r>
-        <w:r>
-          <w:rPr>
-            <w:noProof/>
-            <w:webHidden/>
-          </w:rPr>
-          <w:t>5</w:t>
-        </w:r>
-        <w:r>
-          <w:rPr>
-            <w:noProof/>
-            <w:webHidden/>
-          </w:rPr>
-          <w:fldChar w:fldCharType="end"/>
-        </w:r>
-      </w:hyperlink>
-    </w:p>
-    <w:p>
-      <w:pPr>
-        <w:pStyle w:val="TOC2"/>
-        <w:tabs>
-          <w:tab w:val="right" w:leader="dot" w:pos="9736"/>
-        </w:tabs>
-        <w:rPr>
-          <w:noProof/>
-        </w:rPr>
-      </w:pPr>
-      <w:hyperlink w:anchor="_Toc241498840" w:history="1">
-        <w:r>
-          <w:rPr>
-            <w:rStyle w:val="Hyperlink"/>
-            <w:noProof/>
-          </w:rPr>
-          <w:t>1.0 · Status Summary — Section 1</w:t>
-        </w:r>
-        <w:r>
-          <w:rPr>
-            <w:noProof/>
-            <w:webHidden/>
-          </w:rPr>
-          <w:tab/>
-        </w:r>
-        <w:r>
-          <w:rPr>
-            <w:noProof/>
-            <w:webHidden/>
-          </w:rPr>
-          <w:fldChar w:fldCharType="begin"/>
-        </w:r>
-        <w:r>
-          <w:rPr>
-            <w:noProof/>
-            <w:webHidden/>
-          </w:rPr>
-          <w:instrText xml:space="preserve"> PAGEREF _Toc241498840 \h </w:instrText>
+          <w:instrText xml:space="preserve"> PAGEREF _Toc241510259 \h </w:instrText>
         </w:r>
         <w:r>
           <w:rPr>
@@ -1479,13 +1395,13 @@
           <w:noProof/>
         </w:rPr>
       </w:pPr>
-      <w:hyperlink w:anchor="_Toc241498841" w:history="1">
+      <w:hyperlink w:anchor="_Toc241510260" w:history="1">
         <w:r>
           <w:rPr>
             <w:rStyle w:val="Hyperlink"/>
             <w:noProof/>
           </w:rPr>
-          <w:t>1.1 · Application Form</w:t>
+          <w:t>1.0 · Status Summary — Section 1</w:t>
         </w:r>
         <w:r>
           <w:rPr>
@@ -1506,75 +1422,7 @@
             <w:noProof/>
             <w:webHidden/>
           </w:rPr>
-          <w:instrText xml:space="preserve"> PAGEREF _Toc241498841 \h </w:instrText>
-        </w:r>
-        <w:r>
-          <w:rPr>
-            <w:noProof/>
-            <w:webHidden/>
-          </w:rPr>
-        </w:r>
-        <w:r>
-          <w:rPr>
-            <w:noProof/>
-            <w:webHidden/>
-          </w:rPr>
-          <w:fldChar w:fldCharType="separate"/>
-        </w:r>
-        <w:r>
-          <w:rPr>
-            <w:noProof/>
-            <w:webHidden/>
-          </w:rPr>
-          <w:t>6</w:t>
-        </w:r>
-        <w:r>
-          <w:rPr>
-            <w:noProof/>
-            <w:webHidden/>
-          </w:rPr>
-          <w:fldChar w:fldCharType="end"/>
-        </w:r>
-      </w:hyperlink>
-    </w:p>
-    <w:p>
-      <w:pPr>
-        <w:pStyle w:val="TOC2"/>
-        <w:tabs>
-          <w:tab w:val="right" w:leader="dot" w:pos="9736"/>
-        </w:tabs>
-        <w:rPr>
-          <w:noProof/>
-        </w:rPr>
-      </w:pPr>
-      <w:hyperlink w:anchor="_Toc241498842" w:history="1">
-        <w:r>
-          <w:rPr>
-            <w:rStyle w:val="Hyperlink"/>
-            <w:noProof/>
-          </w:rPr>
-          <w:t>1.2 · Business License / Company Registration Certificate</w:t>
-        </w:r>
-        <w:r>
-          <w:rPr>
-            <w:noProof/>
-            <w:webHidden/>
-          </w:rPr>
-          <w:tab/>
-        </w:r>
-        <w:r>
-          <w:rPr>
-            <w:noProof/>
-            <w:webHidden/>
-          </w:rPr>
-          <w:fldChar w:fldCharType="begin"/>
-        </w:r>
-        <w:r>
-          <w:rPr>
-            <w:noProof/>
-            <w:webHidden/>
-          </w:rPr>
-          <w:instrText xml:space="preserve"> PAGEREF _Toc241498842 \h </w:instrText>
+          <w:instrText xml:space="preserve"> PAGEREF _Toc241510260 \h </w:instrText>
         </w:r>
         <w:r>
           <w:rPr>
@@ -1615,13 +1463,13 @@
           <w:noProof/>
         </w:rPr>
       </w:pPr>
-      <w:hyperlink w:anchor="_Toc241498843" w:history="1">
+      <w:hyperlink w:anchor="_Toc241510261" w:history="1">
         <w:r>
           <w:rPr>
             <w:rStyle w:val="Hyperlink"/>
             <w:noProof/>
           </w:rPr>
-          <w:t>1.3 · Organizational Chart and Contact Information</w:t>
+          <w:t>1.1 · Application Form</w:t>
         </w:r>
         <w:r>
           <w:rPr>
@@ -1642,7 +1490,75 @@
             <w:noProof/>
             <w:webHidden/>
           </w:rPr>
-          <w:instrText xml:space="preserve"> PAGEREF _Toc241498843 \h </w:instrText>
+          <w:instrText xml:space="preserve"> PAGEREF _Toc241510261 \h </w:instrText>
+        </w:r>
+        <w:r>
+          <w:rPr>
+            <w:noProof/>
+            <w:webHidden/>
+          </w:rPr>
+        </w:r>
+        <w:r>
+          <w:rPr>
+            <w:noProof/>
+            <w:webHidden/>
+          </w:rPr>
+          <w:fldChar w:fldCharType="separate"/>
+        </w:r>
+        <w:r>
+          <w:rPr>
+            <w:noProof/>
+            <w:webHidden/>
+          </w:rPr>
+          <w:t>7</w:t>
+        </w:r>
+        <w:r>
+          <w:rPr>
+            <w:noProof/>
+            <w:webHidden/>
+          </w:rPr>
+          <w:fldChar w:fldCharType="end"/>
+        </w:r>
+      </w:hyperlink>
+    </w:p>
+    <w:p>
+      <w:pPr>
+        <w:pStyle w:val="TOC2"/>
+        <w:tabs>
+          <w:tab w:val="right" w:leader="dot" w:pos="9736"/>
+        </w:tabs>
+        <w:rPr>
+          <w:noProof/>
+        </w:rPr>
+      </w:pPr>
+      <w:hyperlink w:anchor="_Toc241510262" w:history="1">
+        <w:r>
+          <w:rPr>
+            <w:rStyle w:val="Hyperlink"/>
+            <w:noProof/>
+          </w:rPr>
+          <w:t>1.2 · Business License / Company Registration Certificate</w:t>
+        </w:r>
+        <w:r>
+          <w:rPr>
+            <w:noProof/>
+            <w:webHidden/>
+          </w:rPr>
+          <w:tab/>
+        </w:r>
+        <w:r>
+          <w:rPr>
+            <w:noProof/>
+            <w:webHidden/>
+          </w:rPr>
+          <w:fldChar w:fldCharType="begin"/>
+        </w:r>
+        <w:r>
+          <w:rPr>
+            <w:noProof/>
+            <w:webHidden/>
+          </w:rPr>
+          <w:instrText xml:space="preserve"> PAGEREF _Toc241510262 \h </w:instrText>
         </w:r>
         <w:r>
           <w:rPr>
@@ -1683,13 +1599,13 @@
           <w:noProof/>
         </w:rPr>
       </w:pPr>
-      <w:hyperlink w:anchor="_Toc241498844" w:history="1">
+      <w:hyperlink w:anchor="_Toc241510263" w:history="1">
         <w:r>
           <w:rPr>
             <w:rStyle w:val="Hyperlink"/>
             <w:noProof/>
           </w:rPr>
-          <w:t>1.4 · Manufacturing Plant Address and Introduction of Production Facilities</w:t>
+          <w:t>1.3 · Organizational Chart and Contact Information</w:t>
         </w:r>
         <w:r>
           <w:rPr>
@@ -1710,7 +1626,7 @@
             <w:noProof/>
             <w:webHidden/>
           </w:rPr>
-          <w:instrText xml:space="preserve"> PAGEREF _Toc241498844 \h </w:instrText>
+          <w:instrText xml:space="preserve"> PAGEREF _Toc241510263 \h </w:instrText>
         </w:r>
         <w:r>
           <w:rPr>
@@ -1751,13 +1667,13 @@
           <w:noProof/>
         </w:rPr>
       </w:pPr>
-      <w:hyperlink w:anchor="_Toc241498845" w:history="1">
+      <w:hyperlink w:anchor="_Toc241510264" w:history="1">
         <w:r>
           <w:rPr>
             <w:rStyle w:val="Hyperlink"/>
             <w:noProof/>
           </w:rPr>
-          <w:t>1.5 · ISO 9001 Certificate, Quality Manual, and Procedure Index</w:t>
+          <w:t>1.4 · Manufacturing Plant Address and Introduction of Production Facilities</w:t>
         </w:r>
         <w:r>
           <w:rPr>
@@ -1778,7 +1694,7 @@
             <w:noProof/>
             <w:webHidden/>
           </w:rPr>
-          <w:instrText xml:space="preserve"> PAGEREF _Toc241498845 \h </w:instrText>
+          <w:instrText xml:space="preserve"> PAGEREF _Toc241510264 \h </w:instrText>
         </w:r>
         <w:r>
           <w:rPr>
@@ -1811,6 +1727,74 @@
     </w:p>
     <w:p>
       <w:pPr>
+        <w:pStyle w:val="TOC2"/>
+        <w:tabs>
+          <w:tab w:val="right" w:leader="dot" w:pos="9736"/>
+        </w:tabs>
+        <w:rPr>
+          <w:noProof/>
+        </w:rPr>
+      </w:pPr>
+      <w:hyperlink w:anchor="_Toc241510265" w:history="1">
+        <w:r>
+          <w:rPr>
+            <w:rStyle w:val="Hyperlink"/>
+            <w:noProof/>
+          </w:rPr>
+          <w:t>1.5 · ISO 9001 Certificate, Quality Manual, and Procedure Index</w:t>
+        </w:r>
+        <w:r>
+          <w:rPr>
+            <w:noProof/>
+            <w:webHidden/>
+          </w:rPr>
+          <w:tab/>
+        </w:r>
+        <w:r>
+          <w:rPr>
+            <w:noProof/>
+            <w:webHidden/>
+          </w:rPr>
+          <w:fldChar w:fldCharType="begin"/>
+        </w:r>
+        <w:r>
+          <w:rPr>
+            <w:noProof/>
+            <w:webHidden/>
+          </w:rPr>
+          <w:instrText xml:space="preserve"> PAGEREF _Toc241510265 \h </w:instrText>
+        </w:r>
+        <w:r>
+          <w:rPr>
+            <w:noProof/>
+            <w:webHidden/>
+          </w:rPr>
+        </w:r>
+        <w:r>
+          <w:rPr>
+            <w:noProof/>
+            <w:webHidden/>
+          </w:rPr>
+          <w:fldChar w:fldCharType="separate"/>
+        </w:r>
+        <w:r>
+          <w:rPr>
+            <w:noProof/>
+            <w:webHidden/>
+          </w:rPr>
+          <w:t>11</w:t>
+        </w:r>
+        <w:r>
+          <w:rPr>
+            <w:noProof/>
+            <w:webHidden/>
+          </w:rPr>
+          <w:fldChar w:fldCharType="end"/>
+        </w:r>
+      </w:hyperlink>
+    </w:p>
+    <w:p>
+      <w:pPr>
         <w:pStyle w:val="TOC1"/>
         <w:tabs>
           <w:tab w:val="right" w:leader="dot" w:pos="9736"/>
@@ -1819,7 +1803,7 @@
           <w:noProof/>
         </w:rPr>
       </w:pPr>
-      <w:hyperlink w:anchor="_Toc241498846" w:history="1">
+      <w:hyperlink w:anchor="_Toc241510266" w:history="1">
         <w:r>
           <w:rPr>
             <w:rStyle w:val="Hyperlink"/>
@@ -1846,7 +1830,7 @@
             <w:noProof/>
             <w:webHidden/>
           </w:rPr>
-          <w:instrText xml:space="preserve"> PAGEREF _Toc241498846 \h </w:instrText>
+          <w:instrText xml:space="preserve"> PAGEREF _Toc241510266 \h </w:instrText>
         </w:r>
         <w:r>
           <w:rPr>
@@ -1887,7 +1871,7 @@
           <w:noProof/>
         </w:rPr>
       </w:pPr>
-      <w:hyperlink w:anchor="_Toc241498847" w:history="1">
+      <w:hyperlink w:anchor="_Toc241510267" w:history="1">
         <w:r>
           <w:rPr>
             <w:rStyle w:val="Hyperlink"/>
@@ -1914,7 +1898,7 @@
             <w:noProof/>
             <w:webHidden/>
           </w:rPr>
-          <w:instrText xml:space="preserve"> PAGEREF _Toc241498847 \h </w:instrText>
+          <w:instrText xml:space="preserve"> PAGEREF _Toc241510267 \h </w:instrText>
         </w:r>
         <w:r>
           <w:rPr>
@@ -1955,7 +1939,7 @@
           <w:noProof/>
         </w:rPr>
       </w:pPr>
-      <w:hyperlink w:anchor="_Toc241498848" w:history="1">
+      <w:hyperlink w:anchor="_Toc241510268" w:history="1">
         <w:r>
           <w:rPr>
             <w:rStyle w:val="Hyperlink"/>
@@ -1982,7 +1966,7 @@
             <w:noProof/>
             <w:webHidden/>
           </w:rPr>
-          <w:instrText xml:space="preserve"> PAGEREF _Toc241498848 \h </w:instrText>
+          <w:instrText xml:space="preserve"> PAGEREF _Toc241510268 \h </w:instrText>
         </w:r>
         <w:r>
           <w:rPr>
@@ -2002,7 +1986,7 @@
             <w:noProof/>
             <w:webHidden/>
           </w:rPr>
-          <w:t>11</w:t>
+          <w:t>12</w:t>
         </w:r>
         <w:r>
           <w:rPr>
@@ -2023,7 +2007,7 @@
           <w:noProof/>
         </w:rPr>
       </w:pPr>
-      <w:hyperlink w:anchor="_Toc241498849" w:history="1">
+      <w:hyperlink w:anchor="_Toc241510269" w:history="1">
         <w:r>
           <w:rPr>
             <w:rStyle w:val="Hyperlink"/>
@@ -2050,7 +2034,7 @@
             <w:noProof/>
             <w:webHidden/>
           </w:rPr>
-          <w:instrText xml:space="preserve"> PAGEREF _Toc241498849 \h </w:instrText>
+          <w:instrText xml:space="preserve"> PAGEREF _Toc241510269 \h </w:instrText>
         </w:r>
         <w:r>
           <w:rPr>
@@ -2091,7 +2075,7 @@
           <w:noProof/>
         </w:rPr>
       </w:pPr>
-      <w:hyperlink w:anchor="_Toc241498850" w:history="1">
+      <w:hyperlink w:anchor="_Toc241510270" w:history="1">
         <w:r>
           <w:rPr>
             <w:rStyle w:val="Hyperlink"/>
@@ -2118,75 +2102,7 @@
             <w:noProof/>
             <w:webHidden/>
           </w:rPr>
-          <w:instrText xml:space="preserve"> PAGEREF _Toc241498850 \h </w:instrText>
-        </w:r>
-        <w:r>
-          <w:rPr>
-            <w:noProof/>
-            <w:webHidden/>
-          </w:rPr>
-        </w:r>
-        <w:r>
-          <w:rPr>
-            <w:noProof/>
-            <w:webHidden/>
-          </w:rPr>
-          <w:fldChar w:fldCharType="separate"/>
-        </w:r>
-        <w:r>
-          <w:rPr>
-            <w:noProof/>
-            <w:webHidden/>
-          </w:rPr>
-          <w:t>12</w:t>
-        </w:r>
-        <w:r>
-          <w:rPr>
-            <w:noProof/>
-            <w:webHidden/>
-          </w:rPr>
-          <w:fldChar w:fldCharType="end"/>
-        </w:r>
-      </w:hyperlink>
-    </w:p>
-    <w:p>
-      <w:pPr>
-        <w:pStyle w:val="TOC3"/>
-        <w:tabs>
-          <w:tab w:val="right" w:leader="dot" w:pos="9736"/>
-        </w:tabs>
-        <w:rPr>
-          <w:noProof/>
-        </w:rPr>
-      </w:pPr>
-      <w:hyperlink w:anchor="_Toc241498851" w:history="1">
-        <w:r>
-          <w:rPr>
-            <w:rStyle w:val="Hyperlink"/>
-            <w:noProof/>
-          </w:rPr>
-          <w:t>2.3.b · Sensor and Communication Parameters — Node Sensor (GLD)</w:t>
-        </w:r>
-        <w:r>
-          <w:rPr>
-            <w:noProof/>
-            <w:webHidden/>
-          </w:rPr>
-          <w:tab/>
-        </w:r>
-        <w:r>
-          <w:rPr>
-            <w:noProof/>
-            <w:webHidden/>
-          </w:rPr>
-          <w:fldChar w:fldCharType="begin"/>
-        </w:r>
-        <w:r>
-          <w:rPr>
-            <w:noProof/>
-            <w:webHidden/>
-          </w:rPr>
-          <w:instrText xml:space="preserve"> PAGEREF _Toc241498851 \h </w:instrText>
+          <w:instrText xml:space="preserve"> PAGEREF _Toc241510270 \h </w:instrText>
         </w:r>
         <w:r>
           <w:rPr>
@@ -2227,7 +2143,75 @@
           <w:noProof/>
         </w:rPr>
       </w:pPr>
-      <w:hyperlink w:anchor="_Toc241498852" w:history="1">
+      <w:hyperlink w:anchor="_Toc241510271" w:history="1">
+        <w:r>
+          <w:rPr>
+            <w:rStyle w:val="Hyperlink"/>
+            <w:noProof/>
+          </w:rPr>
+          <w:t>2.3.b · Sensor and Communication Parameters — Node Sensor (GLD)</w:t>
+        </w:r>
+        <w:r>
+          <w:rPr>
+            <w:noProof/>
+            <w:webHidden/>
+          </w:rPr>
+          <w:tab/>
+        </w:r>
+        <w:r>
+          <w:rPr>
+            <w:noProof/>
+            <w:webHidden/>
+          </w:rPr>
+          <w:fldChar w:fldCharType="begin"/>
+        </w:r>
+        <w:r>
+          <w:rPr>
+            <w:noProof/>
+            <w:webHidden/>
+          </w:rPr>
+          <w:instrText xml:space="preserve"> PAGEREF _Toc241510271 \h </w:instrText>
+        </w:r>
+        <w:r>
+          <w:rPr>
+            <w:noProof/>
+            <w:webHidden/>
+          </w:rPr>
+        </w:r>
+        <w:r>
+          <w:rPr>
+            <w:noProof/>
+            <w:webHidden/>
+          </w:rPr>
+          <w:fldChar w:fldCharType="separate"/>
+        </w:r>
+        <w:r>
+          <w:rPr>
+            <w:noProof/>
+            <w:webHidden/>
+          </w:rPr>
+          <w:t>14</w:t>
+        </w:r>
+        <w:r>
+          <w:rPr>
+            <w:noProof/>
+            <w:webHidden/>
+          </w:rPr>
+          <w:fldChar w:fldCharType="end"/>
+        </w:r>
+      </w:hyperlink>
+    </w:p>
+    <w:p>
+      <w:pPr>
+        <w:pStyle w:val="TOC3"/>
+        <w:tabs>
+          <w:tab w:val="right" w:leader="dot" w:pos="9736"/>
+        </w:tabs>
+        <w:rPr>
+          <w:noProof/>
+        </w:rPr>
+      </w:pPr>
+      <w:hyperlink w:anchor="_Toc241510272" w:history="1">
         <w:r>
           <w:rPr>
             <w:rStyle w:val="Hyperlink"/>
@@ -2254,7 +2238,7 @@
             <w:noProof/>
             <w:webHidden/>
           </w:rPr>
-          <w:instrText xml:space="preserve"> PAGEREF _Toc241498852 \h </w:instrText>
+          <w:instrText xml:space="preserve"> PAGEREF _Toc241510272 \h </w:instrText>
         </w:r>
         <w:r>
           <w:rPr>
@@ -2295,7 +2279,7 @@
           <w:noProof/>
         </w:rPr>
       </w:pPr>
-      <w:hyperlink w:anchor="_Toc241498853" w:history="1">
+      <w:hyperlink w:anchor="_Toc241510273" w:history="1">
         <w:r>
           <w:rPr>
             <w:rStyle w:val="Hyperlink"/>
@@ -2322,7 +2306,7 @@
             <w:noProof/>
             <w:webHidden/>
           </w:rPr>
-          <w:instrText xml:space="preserve"> PAGEREF _Toc241498853 \h </w:instrText>
+          <w:instrText xml:space="preserve"> PAGEREF _Toc241510273 \h </w:instrText>
         </w:r>
         <w:r>
           <w:rPr>
@@ -2363,7 +2347,7 @@
           <w:noProof/>
         </w:rPr>
       </w:pPr>
-      <w:hyperlink w:anchor="_Toc241498854" w:history="1">
+      <w:hyperlink w:anchor="_Toc241510274" w:history="1">
         <w:r>
           <w:rPr>
             <w:rStyle w:val="Hyperlink"/>
@@ -2390,7 +2374,7 @@
             <w:noProof/>
             <w:webHidden/>
           </w:rPr>
-          <w:instrText xml:space="preserve"> PAGEREF _Toc241498854 \h </w:instrText>
+          <w:instrText xml:space="preserve"> PAGEREF _Toc241510274 \h </w:instrText>
         </w:r>
         <w:r>
           <w:rPr>
@@ -2431,7 +2415,7 @@
           <w:noProof/>
         </w:rPr>
       </w:pPr>
-      <w:hyperlink w:anchor="_Toc241498855" w:history="1">
+      <w:hyperlink w:anchor="_Toc241510275" w:history="1">
         <w:r>
           <w:rPr>
             <w:rStyle w:val="Hyperlink"/>
@@ -2458,7 +2442,7 @@
             <w:noProof/>
             <w:webHidden/>
           </w:rPr>
-          <w:instrText xml:space="preserve"> PAGEREF _Toc241498855 \h </w:instrText>
+          <w:instrText xml:space="preserve"> PAGEREF _Toc241510275 \h </w:instrText>
         </w:r>
         <w:r>
           <w:rPr>
@@ -2499,7 +2483,7 @@
           <w:noProof/>
         </w:rPr>
       </w:pPr>
-      <w:hyperlink w:anchor="_Toc241498856" w:history="1">
+      <w:hyperlink w:anchor="_Toc241510276" w:history="1">
         <w:r>
           <w:rPr>
             <w:rStyle w:val="Hyperlink"/>
@@ -2526,7 +2510,7 @@
             <w:noProof/>
             <w:webHidden/>
           </w:rPr>
-          <w:instrText xml:space="preserve"> PAGEREF _Toc241498856 \h </w:instrText>
+          <w:instrText xml:space="preserve"> PAGEREF _Toc241510276 \h </w:instrText>
         </w:r>
         <w:r>
           <w:rPr>
@@ -2567,7 +2551,7 @@
           <w:noProof/>
         </w:rPr>
       </w:pPr>
-      <w:hyperlink w:anchor="_Toc241498857" w:history="1">
+      <w:hyperlink w:anchor="_Toc241510277" w:history="1">
         <w:r>
           <w:rPr>
             <w:rStyle w:val="Hyperlink"/>
@@ -2594,7 +2578,7 @@
             <w:noProof/>
             <w:webHidden/>
           </w:rPr>
-          <w:instrText xml:space="preserve"> PAGEREF _Toc241498857 \h </w:instrText>
+          <w:instrText xml:space="preserve"> PAGEREF _Toc241510277 \h </w:instrText>
         </w:r>
         <w:r>
           <w:rPr>
@@ -2635,7 +2619,7 @@
           <w:noProof/>
         </w:rPr>
       </w:pPr>
-      <w:hyperlink w:anchor="_Toc241498858" w:history="1">
+      <w:hyperlink w:anchor="_Toc241510278" w:history="1">
         <w:r>
           <w:rPr>
             <w:rStyle w:val="Hyperlink"/>
@@ -2662,7 +2646,7 @@
             <w:noProof/>
             <w:webHidden/>
           </w:rPr>
-          <w:instrText xml:space="preserve"> PAGEREF _Toc241498858 \h </w:instrText>
+          <w:instrText xml:space="preserve"> PAGEREF _Toc241510278 \h </w:instrText>
         </w:r>
         <w:r>
           <w:rPr>
@@ -2703,7 +2687,7 @@
           <w:noProof/>
         </w:rPr>
       </w:pPr>
-      <w:hyperlink w:anchor="_Toc241498859" w:history="1">
+      <w:hyperlink w:anchor="_Toc241510279" w:history="1">
         <w:r>
           <w:rPr>
             <w:rStyle w:val="Hyperlink"/>
@@ -2730,7 +2714,7 @@
             <w:noProof/>
             <w:webHidden/>
           </w:rPr>
-          <w:instrText xml:space="preserve"> PAGEREF _Toc241498859 \h </w:instrText>
+          <w:instrText xml:space="preserve"> PAGEREF _Toc241510279 \h </w:instrText>
         </w:r>
         <w:r>
           <w:rPr>
@@ -2771,7 +2755,7 @@
           <w:noProof/>
         </w:rPr>
       </w:pPr>
-      <w:hyperlink w:anchor="_Toc241498860" w:history="1">
+      <w:hyperlink w:anchor="_Toc241510280" w:history="1">
         <w:r>
           <w:rPr>
             <w:rStyle w:val="Hyperlink"/>
@@ -2798,7 +2782,7 @@
             <w:noProof/>
             <w:webHidden/>
           </w:rPr>
-          <w:instrText xml:space="preserve"> PAGEREF _Toc241498860 \h </w:instrText>
+          <w:instrText xml:space="preserve"> PAGEREF _Toc241510280 \h </w:instrText>
         </w:r>
         <w:r>
           <w:rPr>
@@ -2839,7 +2823,7 @@
           <w:noProof/>
         </w:rPr>
       </w:pPr>
-      <w:hyperlink w:anchor="_Toc241498861" w:history="1">
+      <w:hyperlink w:anchor="_Toc241510281" w:history="1">
         <w:r>
           <w:rPr>
             <w:rStyle w:val="Hyperlink"/>
@@ -2866,7 +2850,7 @@
             <w:noProof/>
             <w:webHidden/>
           </w:rPr>
-          <w:instrText xml:space="preserve"> PAGEREF _Toc241498861 \h </w:instrText>
+          <w:instrText xml:space="preserve"> PAGEREF _Toc241510281 \h </w:instrText>
         </w:r>
         <w:r>
           <w:rPr>
@@ -2907,7 +2891,7 @@
           <w:noProof/>
         </w:rPr>
       </w:pPr>
-      <w:hyperlink w:anchor="_Toc241498862" w:history="1">
+      <w:hyperlink w:anchor="_Toc241510282" w:history="1">
         <w:r>
           <w:rPr>
             <w:rStyle w:val="Hyperlink"/>
@@ -2934,7 +2918,7 @@
             <w:noProof/>
             <w:webHidden/>
           </w:rPr>
-          <w:instrText xml:space="preserve"> PAGEREF _Toc241498862 \h </w:instrText>
+          <w:instrText xml:space="preserve"> PAGEREF _Toc241510282 \h </w:instrText>
         </w:r>
         <w:r>
           <w:rPr>
@@ -2975,7 +2959,7 @@
           <w:noProof/>
         </w:rPr>
       </w:pPr>
-      <w:hyperlink w:anchor="_Toc241498863" w:history="1">
+      <w:hyperlink w:anchor="_Toc241510283" w:history="1">
         <w:r>
           <w:rPr>
             <w:rStyle w:val="Hyperlink"/>
@@ -3002,7 +2986,7 @@
             <w:noProof/>
             <w:webHidden/>
           </w:rPr>
-          <w:instrText xml:space="preserve"> PAGEREF _Toc241498863 \h </w:instrText>
+          <w:instrText xml:space="preserve"> PAGEREF _Toc241510283 \h </w:instrText>
         </w:r>
         <w:r>
           <w:rPr>
@@ -3043,7 +3027,7 @@
           <w:noProof/>
         </w:rPr>
       </w:pPr>
-      <w:hyperlink w:anchor="_Toc241498864" w:history="1">
+      <w:hyperlink w:anchor="_Toc241510284" w:history="1">
         <w:r>
           <w:rPr>
             <w:rStyle w:val="Hyperlink"/>
@@ -3070,7 +3054,7 @@
             <w:noProof/>
             <w:webHidden/>
           </w:rPr>
-          <w:instrText xml:space="preserve"> PAGEREF _Toc241498864 \h </w:instrText>
+          <w:instrText xml:space="preserve"> PAGEREF _Toc241510284 \h </w:instrText>
         </w:r>
         <w:r>
           <w:rPr>
@@ -3111,7 +3095,7 @@
           <w:noProof/>
         </w:rPr>
       </w:pPr>
-      <w:hyperlink w:anchor="_Toc241498865" w:history="1">
+      <w:hyperlink w:anchor="_Toc241510285" w:history="1">
         <w:r>
           <w:rPr>
             <w:rStyle w:val="Hyperlink"/>
@@ -3138,7 +3122,7 @@
             <w:noProof/>
             <w:webHidden/>
           </w:rPr>
-          <w:instrText xml:space="preserve"> PAGEREF _Toc241498865 \h </w:instrText>
+          <w:instrText xml:space="preserve"> PAGEREF _Toc241510285 \h </w:instrText>
         </w:r>
         <w:r>
           <w:rPr>
@@ -3179,7 +3163,7 @@
           <w:noProof/>
         </w:rPr>
       </w:pPr>
-      <w:hyperlink w:anchor="_Toc241498866" w:history="1">
+      <w:hyperlink w:anchor="_Toc241510286" w:history="1">
         <w:r>
           <w:rPr>
             <w:rStyle w:val="Hyperlink"/>
@@ -3206,7 +3190,7 @@
             <w:noProof/>
             <w:webHidden/>
           </w:rPr>
-          <w:instrText xml:space="preserve"> PAGEREF _Toc241498866 \h </w:instrText>
+          <w:instrText xml:space="preserve"> PAGEREF _Toc241510286 \h </w:instrText>
         </w:r>
         <w:r>
           <w:rPr>
@@ -3247,7 +3231,7 @@
           <w:noProof/>
         </w:rPr>
       </w:pPr>
-      <w:hyperlink w:anchor="_Toc241498867" w:history="1">
+      <w:hyperlink w:anchor="_Toc241510287" w:history="1">
         <w:r>
           <w:rPr>
             <w:rStyle w:val="Hyperlink"/>
@@ -3274,7 +3258,7 @@
             <w:noProof/>
             <w:webHidden/>
           </w:rPr>
-          <w:instrText xml:space="preserve"> PAGEREF _Toc241498867 \h </w:instrText>
+          <w:instrText xml:space="preserve"> PAGEREF _Toc241510287 \h </w:instrText>
         </w:r>
         <w:r>
           <w:rPr>
@@ -3320,7 +3304,7 @@
       <w:pPr>
         <w:pStyle w:val="Heading1"/>
       </w:pPr>
-      <w:bookmarkStart w:id="0" w:name="_Toc241498838"/>
+      <w:bookmarkStart w:id="0" w:name="_Toc241510258"/>
       <w:r>
         <w:lastRenderedPageBreak/>
         <w:t>About This Document</w:t>
@@ -3423,7 +3407,7 @@
       <w:pPr>
         <w:pStyle w:val="Heading1"/>
       </w:pPr>
-      <w:bookmarkStart w:id="1" w:name="_Toc241498839"/>
+      <w:bookmarkStart w:id="1" w:name="_Toc241510259"/>
       <w:r>
         <w:t>1. Basic Information (Application and Organization)</w:t>
       </w:r>
@@ -3511,14 +3495,14 @@
                 <w:color w:val="4A4A4A"/>
                 <w:sz w:val="20"/>
               </w:rPr>
-              <w:t>Manufacturer-of-record for this section: PT Galaksi Megatama Indonesia. This section reports the legal/corporate particulars of PT Galaksi Megatama Indonesia as the Manufacturer named in the ExCB application, since it holds the Indonesian industrial manufacturing business license (NIB) relevant to fabricating the equipment (KBLI 25119/25120/28221/25920 — metal products, pressurized-vessel-class containers, metalworking machinery, and special metal-treatment services). PT LAPI Ganesha Utama (LGU) is the desi</w:t>
+              <w:t>Applicant and Manufacturer of record for this document: PT Galaksi Megatama Indonesia. This section reports the legal/corporate particulars of PT Galaksi Megatama Indonesia, since it holds the Indonesian industrial manufacturing business license (NIB) relevant to fabricating the equipment (KBLI 25119/25120/28221/25920 — metal products, pressurized-vessel-class containers, metalworking machinery, and special metal-treatment services). PT Galaksi Megatama Indonesia is recorded as the sole applicant and manufa</w:t>
             </w:r>
             <w:r>
               <w:rPr>
                 <w:color w:val="4A4A4A"/>
                 <w:sz w:val="20"/>
               </w:rPr>
-              <w:t xml:space="preserve">gn and development authority responsible for the electronics, firmware, and system engineering of the GLD, working with the Institute of Technology Bandung as technical partner; it is recorded as such throughout Sections 2 and 3. This attribution reflects a working decision recorded 22 September 2026 based on PT Galaksi's legal documents (deed of establishment, NIB, </w:t>
+              <w:t xml:space="preserve">cturer throughout this document. This attribution reflects a working decision recorded 28 September 2026 based on PT Galaksi's legal documents (deed of establishment, NIB, NPWP, MOLHR ratification decree, tax registration certificate) supplied to the authors — it has not yet been confirmed directly with the company's officers as the final arrangement for the ExCB submission and </w:t>
             </w:r>
             <w:r>
               <w:rPr>
@@ -3526,14 +3510,7 @@
                 <w:sz w:val="20"/>
               </w:rPr>
               <w:lastRenderedPageBreak/>
-              <w:t>NPWP, MOLHR ratification decree, tax registration certificate) supplied to the authors — it has not yet been confirmed directly with either com</w:t>
-            </w:r>
-            <w:r>
-              <w:rPr>
-                <w:color w:val="4A4A4A"/>
-                <w:sz w:val="20"/>
-              </w:rPr>
-              <w:t>pany's officers as the final arrangement for the ExCB submission and should be verified before formal filing.</w:t>
+              <w:t>should be verified before formal filing.</w:t>
             </w:r>
           </w:p>
         </w:tc>
@@ -3570,7 +3547,7 @@
       <w:pPr>
         <w:pStyle w:val="Heading2"/>
       </w:pPr>
-      <w:bookmarkStart w:id="2" w:name="_Toc241498840"/>
+      <w:bookmarkStart w:id="2" w:name="_Toc241510260"/>
       <w:r>
         <w:t>1.0 · Status Summary — Section 1</w:t>
       </w:r>
@@ -3947,7 +3924,7 @@
       <w:pPr>
         <w:pStyle w:val="Heading2"/>
       </w:pPr>
-      <w:bookmarkStart w:id="3" w:name="_Toc241498841"/>
+      <w:bookmarkStart w:id="3" w:name="_Toc241510261"/>
       <w:r>
         <w:t>1.1 · Application Form</w:t>
       </w:r>
@@ -4145,7 +4122,7 @@
                 <w:b/>
                 <w:sz w:val="19"/>
               </w:rPr>
-              <w:t>Design and development authority</w:t>
+              <w:t>Product name</w:t>
             </w:r>
           </w:p>
         </w:tc>
@@ -4161,7 +4138,7 @@
               <w:rPr>
                 <w:sz w:val="19"/>
               </w:rPr>
-              <w:t>PT LAPI Ganesha Utama (LGU)</w:t>
+              <w:t>Gas Leak Detector (GLD) — Node Sensor</w:t>
             </w:r>
           </w:p>
         </w:tc>
@@ -4191,6 +4168,12 @@
             <w:pPr>
               <w:spacing w:after="40"/>
             </w:pPr>
+            <w:r>
+              <w:rPr>
+                <w:sz w:val="19"/>
+              </w:rPr>
+              <w:t>Section 2.2</w:t>
+            </w:r>
           </w:p>
         </w:tc>
       </w:tr>
@@ -4212,8 +4195,7 @@
                 <w:b/>
                 <w:sz w:val="19"/>
               </w:rPr>
-              <w:lastRenderedPageBreak/>
-              <w:t>Technical development partner</w:t>
+              <w:t>Model / version</w:t>
             </w:r>
           </w:p>
         </w:tc>
@@ -4229,7 +4211,7 @@
               <w:rPr>
                 <w:sz w:val="19"/>
               </w:rPr>
-              <w:t>Institute of Technology Bandung — IoT Laboratory &amp; Physics Laboratory</w:t>
+              <w:t>GLD V2</w:t>
             </w:r>
           </w:p>
         </w:tc>
@@ -4259,6 +4241,12 @@
             <w:pPr>
               <w:spacing w:after="40"/>
             </w:pPr>
+            <w:r>
+              <w:rPr>
+                <w:sz w:val="19"/>
+              </w:rPr>
+              <w:t>Section 2.2</w:t>
+            </w:r>
           </w:p>
         </w:tc>
       </w:tr>
@@ -4280,7 +4268,7 @@
                 <w:b/>
                 <w:sz w:val="19"/>
               </w:rPr>
-              <w:t>Product name</w:t>
+              <w:t>Scope of certification</w:t>
             </w:r>
           </w:p>
         </w:tc>
@@ -4296,7 +4284,7 @@
               <w:rPr>
                 <w:sz w:val="19"/>
               </w:rPr>
-              <w:t>Gas Leak Detector (GLD) — Node Sensor</w:t>
+              <w:t>Node Sensor (GLD) only</w:t>
             </w:r>
           </w:p>
         </w:tc>
@@ -4330,7 +4318,7 @@
               <w:rPr>
                 <w:sz w:val="19"/>
               </w:rPr>
-              <w:t>Section 2.2</w:t>
+              <w:t>Section 2.1</w:t>
             </w:r>
           </w:p>
         </w:tc>
@@ -4353,152 +4341,7 @@
                 <w:b/>
                 <w:sz w:val="19"/>
               </w:rPr>
-              <w:t>Model / version</w:t>
-            </w:r>
-          </w:p>
-        </w:tc>
-        <w:tc>
-          <w:tcPr>
-            <w:tcW w:w="2736" w:type="dxa"/>
-          </w:tcPr>
-          <w:p>
-            <w:pPr>
-              <w:spacing w:after="40"/>
-            </w:pPr>
-            <w:r>
-              <w:rPr>
-                <w:sz w:val="19"/>
-              </w:rPr>
-              <w:t>GLD V2</w:t>
-            </w:r>
-          </w:p>
-        </w:tc>
-        <w:tc>
-          <w:tcPr>
-            <w:tcW w:w="2160" w:type="dxa"/>
-          </w:tcPr>
-          <w:p>
-            <w:pPr>
-              <w:spacing w:after="40"/>
-            </w:pPr>
-            <w:r>
-              <w:rPr>
-                <w:b/>
-                <w:color w:val="149174"/>
-                <w:sz w:val="19"/>
-              </w:rPr>
-              <w:t>Confirmed</w:t>
-            </w:r>
-          </w:p>
-        </w:tc>
-        <w:tc>
-          <w:tcPr>
-            <w:tcW w:w="2304" w:type="dxa"/>
-          </w:tcPr>
-          <w:p>
-            <w:pPr>
-              <w:spacing w:after="40"/>
-            </w:pPr>
-            <w:r>
-              <w:rPr>
-                <w:sz w:val="19"/>
-              </w:rPr>
-              <w:t>Section 2.2</w:t>
-            </w:r>
-          </w:p>
-        </w:tc>
-      </w:tr>
-      <w:tr>
-        <w:trPr>
-          <w:cantSplit/>
-          <w:jc w:val="center"/>
-        </w:trPr>
-        <w:tc>
-          <w:tcPr>
-            <w:tcW w:w="2160" w:type="dxa"/>
-          </w:tcPr>
-          <w:p>
-            <w:pPr>
-              <w:spacing w:after="40"/>
-            </w:pPr>
-            <w:r>
-              <w:rPr>
-                <w:b/>
-                <w:sz w:val="19"/>
-              </w:rPr>
-              <w:t>Scope of certification</w:t>
-            </w:r>
-          </w:p>
-        </w:tc>
-        <w:tc>
-          <w:tcPr>
-            <w:tcW w:w="2736" w:type="dxa"/>
-          </w:tcPr>
-          <w:p>
-            <w:pPr>
-              <w:spacing w:after="40"/>
-            </w:pPr>
-            <w:r>
-              <w:rPr>
-                <w:sz w:val="19"/>
-              </w:rPr>
-              <w:t>Node Sensor (GLD) only</w:t>
-            </w:r>
-          </w:p>
-        </w:tc>
-        <w:tc>
-          <w:tcPr>
-            <w:tcW w:w="2160" w:type="dxa"/>
-          </w:tcPr>
-          <w:p>
-            <w:pPr>
-              <w:spacing w:after="40"/>
-            </w:pPr>
-            <w:r>
-              <w:rPr>
-                <w:b/>
-                <w:color w:val="149174"/>
-                <w:sz w:val="19"/>
-              </w:rPr>
-              <w:t>Confirmed</w:t>
-            </w:r>
-          </w:p>
-        </w:tc>
-        <w:tc>
-          <w:tcPr>
-            <w:tcW w:w="2304" w:type="dxa"/>
-          </w:tcPr>
-          <w:p>
-            <w:pPr>
-              <w:spacing w:after="40"/>
-            </w:pPr>
-            <w:r>
-              <w:rPr>
-                <w:sz w:val="19"/>
-              </w:rPr>
-              <w:t>Section 2.1</w:t>
-            </w:r>
-          </w:p>
-        </w:tc>
-      </w:tr>
-      <w:tr>
-        <w:trPr>
-          <w:cantSplit/>
-          <w:jc w:val="center"/>
-        </w:trPr>
-        <w:tc>
-          <w:tcPr>
-            <w:tcW w:w="2160" w:type="dxa"/>
-          </w:tcPr>
-          <w:p>
-            <w:pPr>
-              <w:spacing w:after="40"/>
-            </w:pPr>
-            <w:r>
-              <w:rPr>
-                <w:b/>
-                <w:sz w:val="19"/>
-              </w:rPr>
+              <w:lastRenderedPageBreak/>
               <w:t>Requested area classification</w:t>
             </w:r>
           </w:p>
@@ -4999,7 +4842,7 @@
       <w:pPr>
         <w:pStyle w:val="Heading2"/>
       </w:pPr>
-      <w:bookmarkStart w:id="4" w:name="_Toc241498842"/>
+      <w:bookmarkStart w:id="4" w:name="_Toc241510262"/>
       <w:r>
         <w:t>1.2 · Business License / Company Registration Certificate</w:t>
       </w:r>
@@ -5270,7 +5113,6 @@
                 <w:b/>
                 <w:sz w:val="19"/>
               </w:rPr>
-              <w:lastRenderedPageBreak/>
               <w:t>Taxpayer identification number</w:t>
             </w:r>
           </w:p>
@@ -5328,6 +5170,7 @@
                 <w:b/>
                 <w:sz w:val="19"/>
               </w:rPr>
+              <w:lastRenderedPageBreak/>
               <w:t>Deed of establishment and latest amendment</w:t>
             </w:r>
           </w:p>
@@ -5548,7 +5391,7 @@
       <w:pPr>
         <w:pStyle w:val="Heading2"/>
       </w:pPr>
-      <w:bookmarkStart w:id="5" w:name="_Toc241498843"/>
+      <w:bookmarkStart w:id="5" w:name="_Toc241510263"/>
       <w:r>
         <w:t>1.3 · Organizational Chart and Contact Information</w:t>
       </w:r>
@@ -5762,7 +5605,6 @@
                 <w:b/>
                 <w:sz w:val="19"/>
               </w:rPr>
-              <w:lastRenderedPageBreak/>
               <w:t>Authorized signatory for the application</w:t>
             </w:r>
           </w:p>
@@ -5877,6 +5719,7 @@
                 <w:b/>
                 <w:sz w:val="19"/>
               </w:rPr>
+              <w:lastRenderedPageBreak/>
               <w:t>Technical contact for the product</w:t>
             </w:r>
           </w:p>
@@ -5969,63 +5812,6 @@
                 <w:sz w:val="19"/>
               </w:rPr>
               <w:t>Counterpart for the quality assessment referred to in 1.5.</w:t>
-            </w:r>
-          </w:p>
-        </w:tc>
-      </w:tr>
-      <w:tr>
-        <w:trPr>
-          <w:cantSplit/>
-          <w:jc w:val="center"/>
-        </w:trPr>
-        <w:tc>
-          <w:tcPr>
-            <w:tcW w:w="3024" w:type="dxa"/>
-          </w:tcPr>
-          <w:p>
-            <w:pPr>
-              <w:spacing w:after="40"/>
-            </w:pPr>
-            <w:r>
-              <w:rPr>
-                <w:b/>
-                <w:sz w:val="19"/>
-              </w:rPr>
-              <w:t>Technical partner contact</w:t>
-            </w:r>
-          </w:p>
-        </w:tc>
-        <w:tc>
-          <w:tcPr>
-            <w:tcW w:w="1872" w:type="dxa"/>
-          </w:tcPr>
-          <w:p>
-            <w:pPr>
-              <w:spacing w:after="40"/>
-            </w:pPr>
-            <w:r>
-              <w:rPr>
-                <w:b/>
-                <w:color w:val="B56A1E"/>
-                <w:sz w:val="19"/>
-              </w:rPr>
-              <w:t>Organization identified; contact to be confirmed</w:t>
-            </w:r>
-          </w:p>
-        </w:tc>
-        <w:tc>
-          <w:tcPr>
-            <w:tcW w:w="4464" w:type="dxa"/>
-          </w:tcPr>
-          <w:p>
-            <w:pPr>
-              <w:spacing w:after="40"/>
-            </w:pPr>
-            <w:r>
-              <w:rPr>
-                <w:sz w:val="19"/>
-              </w:rPr>
-              <w:t>Institute of Technology Bandung — IoT Laboratory / Physics Laboratory.</w:t>
             </w:r>
           </w:p>
         </w:tc>
@@ -6097,7 +5883,7 @@
       <w:pPr>
         <w:pStyle w:val="Heading2"/>
       </w:pPr>
-      <w:bookmarkStart w:id="6" w:name="_Toc241498844"/>
+      <w:bookmarkStart w:id="6" w:name="_Toc241510264"/>
       <w:r>
         <w:t>1.4 · Manufacturing Plant Address and Introduction of Production Facilities</w:t>
       </w:r>
@@ -6265,7 +6051,6 @@
                 <w:b/>
                 <w:sz w:val="19"/>
               </w:rPr>
-              <w:lastRenderedPageBreak/>
               <w:t>Printed circuit board fabrication and assembly</w:t>
             </w:r>
           </w:p>
@@ -6300,7 +6085,7 @@
               <w:rPr>
                 <w:sz w:val="19"/>
               </w:rPr>
-              <w:t>The electronic design is maintained by LGU as a native EasyEDA/JLCPCB project and the component supply chain is referenced to LCSC supplier part numbers throughout the bill of materials (Section 2.6.b). The fabrication and assembly provider, and its address, remain to be confirmed in writing.</w:t>
+              <w:t>The electronic design is maintained as a native EasyEDA/JLCPCB project and the component supply chain is referenced to LCSC supplier part numbers throughout the bill of materials (Section 2.6.b). The fabrication and assembly provider, and its address, remain to be confirmed in writing.</w:t>
             </w:r>
           </w:p>
         </w:tc>
@@ -6437,6 +6222,7 @@
                 <w:b/>
                 <w:sz w:val="19"/>
               </w:rPr>
+              <w:lastRenderedPageBreak/>
               <w:t>Production facility profile</w:t>
             </w:r>
           </w:p>
@@ -6609,7 +6395,7 @@
       <w:pPr>
         <w:pStyle w:val="Heading2"/>
       </w:pPr>
-      <w:bookmarkStart w:id="7" w:name="_Toc241498845"/>
+      <w:bookmarkStart w:id="7" w:name="_Toc241510265"/>
       <w:r>
         <w:t>1.5 · ISO 9001 Certificate, Quality Manual, and Procedure Index</w:t>
       </w:r>
@@ -7009,15 +6795,14 @@
                 <w:color w:val="4A4A4A"/>
                 <w:sz w:val="20"/>
               </w:rPr>
-              <w:t xml:space="preserve">Note on the quality requirement. The checklist marks this item “if applicable” and links it to quality assessment review. Under both schemes a manufacturer is expected to demonstrate a quality system covering Ex production </w:t>
+              <w:t>Note on the quality requirement. The checklist marks this item “if applicable” and links it to quality assessment review. Under both schemes a manufacturer is expected to demonstrate a quality system covering Ex production before certificates are issued — through an IECEx Quality Assessment Report, or through the corresponding production-quality or product-verification arrangement under ATEX — whether or not ISO 9001 certification is held. The route that applies to this application is to be confirmed with t</w:t>
             </w:r>
             <w:r>
               <w:rPr>
                 <w:color w:val="4A4A4A"/>
                 <w:sz w:val="20"/>
               </w:rPr>
-              <w:lastRenderedPageBreak/>
-              <w:t>before certificates are issued — through an IECEx Quality Assessment Report, or through the corresponding production-quality or product-verification arrangement under ATEX — whether or not ISO 9001 certification is held. The route that applies to this application is to be confirmed with the ExCB; ISO 9001 certification, where held, generally shortens that assessment rather than replacing it.</w:t>
+              <w:t>he ExCB; ISO 9001 certification, where held, generally shortens that assessment rather than replacing it.</w:t>
             </w:r>
           </w:p>
         </w:tc>
@@ -7032,7 +6817,7 @@
       <w:pPr>
         <w:pStyle w:val="Heading1"/>
       </w:pPr>
-      <w:bookmarkStart w:id="8" w:name="_Toc241498846"/>
+      <w:bookmarkStart w:id="8" w:name="_Toc241510266"/>
       <w:r>
         <w:t>2. Technical Documentation</w:t>
       </w:r>
@@ -7047,7 +6832,7 @@
       <w:pPr>
         <w:pStyle w:val="Heading2"/>
       </w:pPr>
-      <w:bookmarkStart w:id="9" w:name="_Toc241498847"/>
+      <w:bookmarkStart w:id="9" w:name="_Toc241510267"/>
       <w:r>
         <w:t>2.1 · Detailed Product Description</w:t>
       </w:r>
@@ -7055,7 +6840,11 @@
     </w:p>
     <w:p>
       <w:r>
-        <w:t>The Gas Leak Detector (GLD) is an IoT-based, multi-sensor gas leak detection device designed for the early detection of flammable and process gases in oil &amp; gas refinery environments (process units, tank farms, pipe racks, and storage/loading-unloading areas). This document addresses the GLD unit itself as the subject of the current IECEx/ATEX certification.</w:t>
+        <w:t xml:space="preserve">The Gas Leak Detector (GLD) is an IoT-based, multi-sensor gas leak detection device designed for the early detection of flammable and process gases in oil &amp; gas refinery environments (process units, tank farms, pipe </w:t>
+      </w:r>
+      <w:r>
+        <w:lastRenderedPageBreak/>
+        <w:t>racks, and storage/loading-unloading areas). This document addresses the GLD unit itself as the subject of the current IECEx/ATEX certification.</w:t>
       </w:r>
     </w:p>
     <w:p>
@@ -7080,7 +6869,7 @@
       <w:pPr>
         <w:pStyle w:val="Heading2"/>
       </w:pPr>
-      <w:bookmarkStart w:id="10" w:name="_Toc241498848"/>
+      <w:bookmarkStart w:id="10" w:name="_Toc241510268"/>
       <w:r>
         <w:t>2.2 · Product Name, Model, and Specification List</w:t>
       </w:r>
@@ -7223,7 +7012,7 @@
                 <w:color w:val="4A4A4A"/>
                 <w:sz w:val="19"/>
               </w:rPr>
-              <w:t>Design &amp; development authority</w:t>
+              <w:t>End client / program owner</w:t>
             </w:r>
           </w:p>
         </w:tc>
@@ -7239,7 +7028,7 @@
               <w:rPr>
                 <w:sz w:val="20"/>
               </w:rPr>
-              <w:t>PT LAPI Ganesha Utama (LGU)</w:t>
+              <w:t>PT Pertamina Patra Niaga (initial deployment site: Refinery Unit IV, Cilacap)</w:t>
             </w:r>
           </w:p>
         </w:tc>
@@ -7260,81 +7049,6 @@
                 <w:color w:val="4A4A4A"/>
                 <w:sz w:val="19"/>
               </w:rPr>
-              <w:t>Technical development partner</w:t>
-            </w:r>
-          </w:p>
-        </w:tc>
-        <w:tc>
-          <w:tcPr>
-            <w:tcW w:w="6192" w:type="dxa"/>
-          </w:tcPr>
-          <w:p>
-            <w:pPr>
-              <w:spacing w:after="40"/>
-            </w:pPr>
-            <w:r>
-              <w:rPr>
-                <w:sz w:val="20"/>
-              </w:rPr>
-              <w:t>Institute of Technology Bandung — IoT Laboratory &amp; Physics Laboratory</w:t>
-            </w:r>
-          </w:p>
-        </w:tc>
-      </w:tr>
-      <w:tr>
-        <w:tc>
-          <w:tcPr>
-            <w:tcW w:w="3168" w:type="dxa"/>
-            <w:shd w:val="clear" w:color="auto" w:fill="EFEFEF"/>
-          </w:tcPr>
-          <w:p>
-            <w:pPr>
-              <w:spacing w:after="40"/>
-            </w:pPr>
-            <w:r>
-              <w:rPr>
-                <w:b/>
-                <w:color w:val="4A4A4A"/>
-                <w:sz w:val="19"/>
-              </w:rPr>
-              <w:t>End client / program owner</w:t>
-            </w:r>
-          </w:p>
-        </w:tc>
-        <w:tc>
-          <w:tcPr>
-            <w:tcW w:w="6192" w:type="dxa"/>
-          </w:tcPr>
-          <w:p>
-            <w:pPr>
-              <w:spacing w:after="40"/>
-            </w:pPr>
-            <w:r>
-              <w:rPr>
-                <w:sz w:val="20"/>
-              </w:rPr>
-              <w:t>PT Pertamina Patra Niaga (initial deployment site: Refinery Unit IV, Cilacap)</w:t>
-            </w:r>
-          </w:p>
-        </w:tc>
-      </w:tr>
-      <w:tr>
-        <w:tc>
-          <w:tcPr>
-            <w:tcW w:w="3168" w:type="dxa"/>
-            <w:shd w:val="clear" w:color="auto" w:fill="EFEFEF"/>
-          </w:tcPr>
-          <w:p>
-            <w:pPr>
-              <w:spacing w:after="40"/>
-            </w:pPr>
-            <w:r>
-              <w:rPr>
-                <w:b/>
-                <w:color w:val="4A4A4A"/>
-                <w:sz w:val="19"/>
-              </w:rPr>
-              <w:lastRenderedPageBreak/>
               <w:t>Primary function</w:t>
             </w:r>
           </w:p>
@@ -7517,14 +7231,14 @@
           <w:color w:val="4A4A4A"/>
           <w:sz w:val="18"/>
         </w:rPr>
-        <w:t>Source: official product technical datasheet (Institute of Technology Bandung, Revision 4.0), cross-referenced with internal technical specification documentation and EMC parameter measurement data.</w:t>
+        <w:t>Source: official product technical datasheet (Revision 4.0), cross-referenced with internal technical specification documentation and EMC parameter measurement data.</w:t>
       </w:r>
     </w:p>
     <w:p>
       <w:pPr>
         <w:pStyle w:val="Heading2"/>
       </w:pPr>
-      <w:bookmarkStart w:id="11" w:name="_Toc241498849"/>
+      <w:bookmarkStart w:id="11" w:name="_Toc241510269"/>
       <w:r>
         <w:t>2.3 · Functional Description and Technical Parameters (Electrical, Mechanical, etc.)</w:t>
       </w:r>
@@ -7535,14 +7249,18 @@
         <w:t>Functional workflow (normal operating mode): sense → process → transmit. Each of the eight gas sensors continuously samples ambient conditions → data is normalized and classified by the on-device AI model (ESP32-S3) → the result is transmitted over the LoRa network (star-topology transmission) at a configurable interval (default 10 seconds), or immediately (event-driven) when an alarm condition is detected. Gas alarms are triggered through two parallel channels: a local visual/audible alarm module on the un</w:t>
       </w:r>
       <w:r>
-        <w:t>it itself, and a push notification transmitted over the LoRa network to the dashboard — the alarm-push pathway has been successfully tested on a campus mesh network (field validation at a production refinery installation is still pending).</w:t>
+        <w:t xml:space="preserve">it itself, and a push </w:t>
+      </w:r>
+      <w:r>
+        <w:lastRenderedPageBreak/>
+        <w:t>notification transmitted over the LoRa network to the dashboard — the alarm-push pathway has been successfully tested on a campus mesh network (field validation at a production refinery installation is still pending).</w:t>
       </w:r>
     </w:p>
     <w:p>
       <w:pPr>
         <w:pStyle w:val="Heading3"/>
       </w:pPr>
-      <w:bookmarkStart w:id="12" w:name="_Toc241498850"/>
+      <w:bookmarkStart w:id="12" w:name="_Toc241510270"/>
       <w:r>
         <w:t>2.3.a · Electrical Parameters — Node Sensor (GLD)</w:t>
       </w:r>
@@ -8021,7 +7739,6 @@
                 <w:b/>
                 <w:sz w:val="19"/>
               </w:rPr>
-              <w:lastRenderedPageBreak/>
               <w:t>Maximum input current</w:t>
             </w:r>
           </w:p>
@@ -8168,6 +7885,7 @@
                 <w:b/>
                 <w:sz w:val="19"/>
               </w:rPr>
+              <w:lastRenderedPageBreak/>
               <w:t>Electrical protection (fuse, reverse polarity, overvoltage, overcurrent)</w:t>
             </w:r>
           </w:p>
@@ -8239,7 +7957,7 @@
       <w:pPr>
         <w:pStyle w:val="Heading3"/>
       </w:pPr>
-      <w:bookmarkStart w:id="13" w:name="_Toc241498851"/>
+      <w:bookmarkStart w:id="13" w:name="_Toc241510271"/>
       <w:r>
         <w:t>2.3.b · Sensor and Communication Parameters — Node Sensor (GLD)</w:t>
       </w:r>
@@ -8505,7 +8223,6 @@
                 <w:b/>
                 <w:sz w:val="19"/>
               </w:rPr>
-              <w:lastRenderedPageBreak/>
               <w:t>Environmental sensor (temperature/humidity)</w:t>
             </w:r>
           </w:p>
@@ -8652,6 +8369,7 @@
                 <w:b/>
                 <w:sz w:val="19"/>
               </w:rPr>
+              <w:lastRenderedPageBreak/>
               <w:t>Processing unit</w:t>
             </w:r>
           </w:p>
@@ -9301,9 +9019,8 @@
       <w:pPr>
         <w:pStyle w:val="Heading3"/>
       </w:pPr>
-      <w:bookmarkStart w:id="14" w:name="_Toc241498852"/>
+      <w:bookmarkStart w:id="14" w:name="_Toc241510272"/>
       <w:r>
-        <w:lastRenderedPageBreak/>
         <w:t>2.3.c · Mechanical Parameters — Node Sensor (GLD)</w:t>
       </w:r>
       <w:bookmarkEnd w:id="14"/>
@@ -10153,7 +9870,7 @@
       <w:pPr>
         <w:pStyle w:val="Heading2"/>
       </w:pPr>
-      <w:bookmarkStart w:id="15" w:name="_Toc241498853"/>
+      <w:bookmarkStart w:id="15" w:name="_Toc241510273"/>
       <w:r>
         <w:t>2.4 · Product Photographs — Overall and Key Components</w:t>
       </w:r>
@@ -10192,7 +9909,7 @@
                 <w:noProof/>
               </w:rPr>
               <w:drawing>
-                <wp:inline distT="0" distB="0" distL="0" distR="0" wp14:anchorId="34E9DE72" wp14:editId="0B077C61">
+                <wp:inline distT="0" distB="0" distL="0" distR="0" wp14:anchorId="1678A069" wp14:editId="2CAEABF2">
                   <wp:extent cx="1379912" cy="2286000"/>
                   <wp:effectExtent l="0" t="0" r="0" b="0"/>
                   <wp:docPr id="1" name="Picture 1"/>
@@ -10269,7 +9986,7 @@
                 <w:noProof/>
               </w:rPr>
               <w:drawing>
-                <wp:inline distT="0" distB="0" distL="0" distR="0" wp14:anchorId="393B5B39" wp14:editId="35276636">
+                <wp:inline distT="0" distB="0" distL="0" distR="0" wp14:anchorId="4407278C" wp14:editId="61850E62">
                   <wp:extent cx="1714500" cy="2286000"/>
                   <wp:effectExtent l="0" t="0" r="0" b="0"/>
                   <wp:docPr id="2" name="Picture 2"/>
@@ -10351,7 +10068,7 @@
                 <w:noProof/>
               </w:rPr>
               <w:drawing>
-                <wp:inline distT="0" distB="0" distL="0" distR="0" wp14:anchorId="4388EA8D" wp14:editId="769B0141">
+                <wp:inline distT="0" distB="0" distL="0" distR="0" wp14:anchorId="4885AE5A" wp14:editId="4B7E89FD">
                   <wp:extent cx="1026621" cy="2286000"/>
                   <wp:effectExtent l="0" t="0" r="0" b="0"/>
                   <wp:docPr id="3" name="Picture 3"/>
@@ -10428,7 +10145,7 @@
                 <w:noProof/>
               </w:rPr>
               <w:drawing>
-                <wp:inline distT="0" distB="0" distL="0" distR="0" wp14:anchorId="338C193E" wp14:editId="20B13877">
+                <wp:inline distT="0" distB="0" distL="0" distR="0" wp14:anchorId="508079D6" wp14:editId="6BCEF928">
                   <wp:extent cx="1026621" cy="2286000"/>
                   <wp:effectExtent l="0" t="0" r="0" b="0"/>
                   <wp:docPr id="4" name="Picture 4"/>
@@ -10511,7 +10228,7 @@
               </w:rPr>
               <w:lastRenderedPageBreak/>
               <w:drawing>
-                <wp:inline distT="0" distB="0" distL="0" distR="0" wp14:anchorId="49CFF802" wp14:editId="4A6A4935">
+                <wp:inline distT="0" distB="0" distL="0" distR="0" wp14:anchorId="7E395B61" wp14:editId="79738F25">
                   <wp:extent cx="1026621" cy="2286000"/>
                   <wp:effectExtent l="0" t="0" r="0" b="0"/>
                   <wp:docPr id="5" name="Picture 5"/>
@@ -10588,7 +10305,7 @@
                 <w:noProof/>
               </w:rPr>
               <w:drawing>
-                <wp:inline distT="0" distB="0" distL="0" distR="0" wp14:anchorId="6A873FFB" wp14:editId="61AE7632">
+                <wp:inline distT="0" distB="0" distL="0" distR="0" wp14:anchorId="614788D5" wp14:editId="1059401A">
                   <wp:extent cx="1026621" cy="2286000"/>
                   <wp:effectExtent l="0" t="0" r="0" b="0"/>
                   <wp:docPr id="6" name="Picture 6"/>
@@ -10670,7 +10387,7 @@
                 <w:noProof/>
               </w:rPr>
               <w:drawing>
-                <wp:inline distT="0" distB="0" distL="0" distR="0" wp14:anchorId="7CF93939" wp14:editId="0015307A">
+                <wp:inline distT="0" distB="0" distL="0" distR="0" wp14:anchorId="4AFCEE6D" wp14:editId="6453A24A">
                   <wp:extent cx="1026621" cy="2286000"/>
                   <wp:effectExtent l="0" t="0" r="0" b="0"/>
                   <wp:docPr id="7" name="Picture 7"/>
@@ -10794,7 +10511,7 @@
       <w:pPr>
         <w:pStyle w:val="Heading2"/>
       </w:pPr>
-      <w:bookmarkStart w:id="16" w:name="_Toc241498854"/>
+      <w:bookmarkStart w:id="16" w:name="_Toc241510274"/>
       <w:r>
         <w:t>2.5 · Description of Intended Use and Installation Environment (Gas Group, Temperature Class, Area Classification)</w:t>
       </w:r>
@@ -11337,7 +11054,7 @@
       <w:pPr>
         <w:pStyle w:val="Heading2"/>
       </w:pPr>
-      <w:bookmarkStart w:id="17" w:name="_Toc241498855"/>
+      <w:bookmarkStart w:id="17" w:name="_Toc241510275"/>
       <w:r>
         <w:t>2.6 · Design and Manufacturing Information</w:t>
       </w:r>
@@ -11352,7 +11069,7 @@
       <w:pPr>
         <w:pStyle w:val="Heading3"/>
       </w:pPr>
-      <w:bookmarkStart w:id="18" w:name="_Toc241498856"/>
+      <w:bookmarkStart w:id="18" w:name="_Toc241510276"/>
       <w:r>
         <w:t>2.6.a · Complete Drawings (Assembly, Component, Electrical Schematic, PCB Layout, Enclosure Structure, Junction Box, Terminal, Grounding)</w:t>
       </w:r>
@@ -11373,7 +11090,7 @@
         </w:rPr>
         <w:lastRenderedPageBreak/>
         <w:drawing>
-          <wp:inline distT="0" distB="0" distL="0" distR="0" wp14:anchorId="47F17A08" wp14:editId="15E36A37">
+          <wp:inline distT="0" distB="0" distL="0" distR="0" wp14:anchorId="7785D0CA" wp14:editId="63A7C267">
             <wp:extent cx="5120640" cy="3413760"/>
             <wp:effectExtent l="0" t="0" r="0" b="0"/>
             <wp:docPr id="8" name="Picture 8"/>
@@ -11445,7 +11162,7 @@
           <w:noProof/>
         </w:rPr>
         <w:drawing>
-          <wp:inline distT="0" distB="0" distL="0" distR="0" wp14:anchorId="506E70E8" wp14:editId="37EE6593">
+          <wp:inline distT="0" distB="0" distL="0" distR="0" wp14:anchorId="35D9CE59" wp14:editId="7FCDF981">
             <wp:extent cx="5120640" cy="3413760"/>
             <wp:effectExtent l="0" t="0" r="0" b="0"/>
             <wp:docPr id="9" name="Picture 9"/>
@@ -11518,7 +11235,7 @@
         </w:rPr>
         <w:lastRenderedPageBreak/>
         <w:drawing>
-          <wp:inline distT="0" distB="0" distL="0" distR="0" wp14:anchorId="4FBB8474" wp14:editId="67D53DFD">
+          <wp:inline distT="0" distB="0" distL="0" distR="0" wp14:anchorId="1BE9CD84" wp14:editId="737DF9F9">
             <wp:extent cx="5120640" cy="3413760"/>
             <wp:effectExtent l="0" t="0" r="0" b="0"/>
             <wp:docPr id="10" name="Picture 10"/>
@@ -11590,7 +11307,7 @@
           <w:noProof/>
         </w:rPr>
         <w:drawing>
-          <wp:inline distT="0" distB="0" distL="0" distR="0" wp14:anchorId="7AB809AB" wp14:editId="0157E182">
+          <wp:inline distT="0" distB="0" distL="0" distR="0" wp14:anchorId="42EBA810" wp14:editId="659B4926">
             <wp:extent cx="5120640" cy="3413760"/>
             <wp:effectExtent l="0" t="0" r="0" b="0"/>
             <wp:docPr id="11" name="Picture 11"/>
@@ -11663,7 +11380,7 @@
         </w:rPr>
         <w:lastRenderedPageBreak/>
         <w:drawing>
-          <wp:inline distT="0" distB="0" distL="0" distR="0" wp14:anchorId="2372D96C" wp14:editId="080BC99F">
+          <wp:inline distT="0" distB="0" distL="0" distR="0" wp14:anchorId="115220C2" wp14:editId="16BF5FD0">
             <wp:extent cx="5120640" cy="3413760"/>
             <wp:effectExtent l="0" t="0" r="0" b="0"/>
             <wp:docPr id="12" name="Picture 12"/>
@@ -11735,7 +11452,7 @@
           <w:noProof/>
         </w:rPr>
         <w:drawing>
-          <wp:inline distT="0" distB="0" distL="0" distR="0" wp14:anchorId="47429F62" wp14:editId="61E940CA">
+          <wp:inline distT="0" distB="0" distL="0" distR="0" wp14:anchorId="46CB5DEB" wp14:editId="02DED26C">
             <wp:extent cx="5120640" cy="3413760"/>
             <wp:effectExtent l="0" t="0" r="0" b="0"/>
             <wp:docPr id="13" name="Picture 13"/>
@@ -11808,7 +11525,7 @@
         </w:rPr>
         <w:lastRenderedPageBreak/>
         <w:drawing>
-          <wp:inline distT="0" distB="0" distL="0" distR="0" wp14:anchorId="4C6760CB" wp14:editId="34F93CAA">
+          <wp:inline distT="0" distB="0" distL="0" distR="0" wp14:anchorId="393B28BD" wp14:editId="2D96BAA6">
             <wp:extent cx="5120640" cy="3413760"/>
             <wp:effectExtent l="0" t="0" r="0" b="0"/>
             <wp:docPr id="14" name="Picture 14"/>
@@ -11880,7 +11597,7 @@
           <w:noProof/>
         </w:rPr>
         <w:drawing>
-          <wp:inline distT="0" distB="0" distL="0" distR="0" wp14:anchorId="58991555" wp14:editId="03D433FA">
+          <wp:inline distT="0" distB="0" distL="0" distR="0" wp14:anchorId="0A833093" wp14:editId="65EB28B4">
             <wp:extent cx="5120640" cy="3413760"/>
             <wp:effectExtent l="0" t="0" r="0" b="0"/>
             <wp:docPr id="15" name="Picture 15"/>
@@ -11953,7 +11670,7 @@
         </w:rPr>
         <w:lastRenderedPageBreak/>
         <w:drawing>
-          <wp:inline distT="0" distB="0" distL="0" distR="0" wp14:anchorId="7EDAA5FA" wp14:editId="251E75D0">
+          <wp:inline distT="0" distB="0" distL="0" distR="0" wp14:anchorId="09856F2A" wp14:editId="5F0655B4">
             <wp:extent cx="5120640" cy="3413760"/>
             <wp:effectExtent l="0" t="0" r="0" b="0"/>
             <wp:docPr id="16" name="Picture 16"/>
@@ -12025,7 +11742,7 @@
           <w:noProof/>
         </w:rPr>
         <w:drawing>
-          <wp:inline distT="0" distB="0" distL="0" distR="0" wp14:anchorId="1C9A6822" wp14:editId="6A99A356">
+          <wp:inline distT="0" distB="0" distL="0" distR="0" wp14:anchorId="1112C41E" wp14:editId="17FA71B1">
             <wp:extent cx="2468880" cy="2479268"/>
             <wp:effectExtent l="0" t="0" r="0" b="0"/>
             <wp:docPr id="17" name="Picture 17"/>
@@ -12068,7 +11785,7 @@
           <w:noProof/>
         </w:rPr>
         <w:drawing>
-          <wp:inline distT="0" distB="0" distL="0" distR="0" wp14:anchorId="231C02EB" wp14:editId="04A8C1B3">
+          <wp:inline distT="0" distB="0" distL="0" distR="0" wp14:anchorId="7DE84F04" wp14:editId="542C43BD">
             <wp:extent cx="2468880" cy="1804956"/>
             <wp:effectExtent l="0" t="0" r="0" b="0"/>
             <wp:docPr id="18" name="Picture 18"/>
@@ -12146,7 +11863,7 @@
         </w:rPr>
         <w:lastRenderedPageBreak/>
         <w:drawing>
-          <wp:inline distT="0" distB="0" distL="0" distR="0" wp14:anchorId="591B98B6" wp14:editId="12BE7029">
+          <wp:inline distT="0" distB="0" distL="0" distR="0" wp14:anchorId="412F8A18" wp14:editId="57D18BCA">
             <wp:extent cx="5669280" cy="3847707"/>
             <wp:effectExtent l="0" t="0" r="0" b="0"/>
             <wp:docPr id="19" name="Picture 19"/>
@@ -12682,7 +12399,7 @@
       <w:pPr>
         <w:pStyle w:val="Heading3"/>
       </w:pPr>
-      <w:bookmarkStart w:id="19" w:name="_Toc241498857"/>
+      <w:bookmarkStart w:id="19" w:name="_Toc241510277"/>
       <w:r>
         <w:t>2.6.b · Bill of Materials (BOM) for Explosion-Safety-Relevant Components</w:t>
       </w:r>
@@ -23666,7 +23383,7 @@
       <w:pPr>
         <w:pStyle w:val="Heading3"/>
       </w:pPr>
-      <w:bookmarkStart w:id="20" w:name="_Toc241498858"/>
+      <w:bookmarkStart w:id="20" w:name="_Toc241510278"/>
       <w:r>
         <w:lastRenderedPageBreak/>
         <w:t>2.6.c · Material Specification Sheets / Datasheets (Non-Metallic Materials)</w:t>
@@ -23749,7 +23466,7 @@
       <w:pPr>
         <w:pStyle w:val="Heading3"/>
       </w:pPr>
-      <w:bookmarkStart w:id="21" w:name="_Toc241498859"/>
+      <w:bookmarkStart w:id="21" w:name="_Toc241510279"/>
       <w:r>
         <w:t>2.6.d · Manufacturing Process Description</w:t>
       </w:r>
@@ -23808,7 +23525,7 @@
       <w:pPr>
         <w:pStyle w:val="Heading3"/>
       </w:pPr>
-      <w:bookmarkStart w:id="22" w:name="_Toc241498860"/>
+      <w:bookmarkStart w:id="22" w:name="_Toc241510280"/>
       <w:r>
         <w:t>2.6.e · Explosion-Protection Calculations and Explanations (if applicable)</w:t>
       </w:r>
@@ -23868,7 +23585,7 @@
       <w:pPr>
         <w:pStyle w:val="Heading3"/>
       </w:pPr>
-      <w:bookmarkStart w:id="23" w:name="_Toc241498861"/>
+      <w:bookmarkStart w:id="23" w:name="_Toc241510281"/>
       <w:r>
         <w:t>2.6.f · Temperature Group Calculation (Hottest-Point Temperature Estimation)</w:t>
       </w:r>
@@ -23930,7 +23647,7 @@
       <w:pPr>
         <w:pStyle w:val="Heading3"/>
       </w:pPr>
-      <w:bookmarkStart w:id="24" w:name="_Toc241498862"/>
+      <w:bookmarkStart w:id="24" w:name="_Toc241510282"/>
       <w:r>
         <w:t>2.6.g · Usage and Installation Instructions (Draft)</w:t>
       </w:r>
@@ -24659,7 +24376,7 @@
       <w:pPr>
         <w:pStyle w:val="Heading3"/>
       </w:pPr>
-      <w:bookmarkStart w:id="25" w:name="_Toc241498863"/>
+      <w:bookmarkStart w:id="25" w:name="_Toc241510283"/>
       <w:r>
         <w:t>2.6.h · Nameplate Information</w:t>
       </w:r>
@@ -24718,7 +24435,7 @@
       <w:pPr>
         <w:pStyle w:val="Heading3"/>
       </w:pPr>
-      <w:bookmarkStart w:id="26" w:name="_Toc241498864"/>
+      <w:bookmarkStart w:id="26" w:name="_Toc241510284"/>
       <w:r>
         <w:lastRenderedPageBreak/>
         <w:t>2.6.i · Ex Component Certificates</w:t>
@@ -24778,7 +24495,7 @@
       <w:pPr>
         <w:pStyle w:val="Heading1"/>
       </w:pPr>
-      <w:bookmarkStart w:id="27" w:name="_Toc241498865"/>
+      <w:bookmarkStart w:id="27" w:name="_Toc241510285"/>
       <w:r>
         <w:t>3. Sample Information</w:t>
       </w:r>
@@ -24793,7 +24510,7 @@
       <w:pPr>
         <w:pStyle w:val="Heading2"/>
       </w:pPr>
-      <w:bookmarkStart w:id="28" w:name="_Toc241498866"/>
+      <w:bookmarkStart w:id="28" w:name="_Toc241510286"/>
       <w:r>
         <w:t>3.1 · Model, Serial Number, and Status</w:t>
       </w:r>
@@ -24852,7 +24569,7 @@
       <w:pPr>
         <w:pStyle w:val="Heading2"/>
       </w:pPr>
-      <w:bookmarkStart w:id="29" w:name="_Toc241498867"/>
+      <w:bookmarkStart w:id="29" w:name="_Toc241510287"/>
       <w:r>
         <w:t>3.2 · Test Fixtures and Auxiliary Equipment</w:t>
       </w:r>
@@ -25593,7 +25310,7 @@
           <w:color w:val="8A8A8A"/>
           <w:sz w:val="17"/>
         </w:rPr>
-        <w:t>This is a working document, prepared in stages, drafted in direct reference to the IECEx/ATEX Certification Information Requirements (original English/Mandarin version issued by the certification body). Data sources: the official product technical datasheet (Institute of Technology Bandung, Revision 4.0), internal technical specification documentation, EMC parameter measurement data, and product photography. Fields marked “Pending confirmation” are not yet final and must not be relied upon for procurement o</w:t>
+        <w:t xml:space="preserve">This is a working document, prepared in stages, drafted in direct reference to the IECEx/ATEX Certification Information Requirements (original English/Mandarin version issued by the certification body). Data sources: the official product technical datasheet (Revision 4.0), internal technical specification documentation, EMC parameter measurement data, and product photography. Fields marked “Pending confirmation” are not yet final and must not be relied upon for procurement or certification purposes without </w:t>
       </w:r>
       <w:r>
         <w:rPr>
@@ -25601,7 +25318,7 @@
           <w:color w:val="8A8A8A"/>
           <w:sz w:val="17"/>
         </w:rPr>
-        <w:t>r certification purposes without further verification.</w:t>
+        <w:t>further verification.</w:t>
       </w:r>
     </w:p>
     <w:sectPr>
@@ -25652,7 +25369,7 @@
         <w:color w:val="4A4A4A"/>
         <w:sz w:val="16"/>
       </w:rPr>
-      <w:t>LGU/GLD/IECEX-TDF/2026-001  ·  Rev. 1.2</w:t>
+      <w:t>GMI/GLD/IECEX-TDF/2026-001  ·  Rev. 1.3</w:t>
     </w:r>
     <w:r>
       <w:tab/>
@@ -25922,31 +25639,31 @@
       </w:rPr>
     </w:lvl>
   </w:abstractNum>
-  <w:num w:numId="1" w16cid:durableId="99229768">
+  <w:num w:numId="1" w16cid:durableId="1401175474">
     <w:abstractNumId w:val="8"/>
   </w:num>
-  <w:num w:numId="2" w16cid:durableId="776750280">
+  <w:num w:numId="2" w16cid:durableId="837573684">
     <w:abstractNumId w:val="6"/>
   </w:num>
-  <w:num w:numId="3" w16cid:durableId="1699694369">
+  <w:num w:numId="3" w16cid:durableId="572280110">
     <w:abstractNumId w:val="5"/>
   </w:num>
-  <w:num w:numId="4" w16cid:durableId="1777217164">
+  <w:num w:numId="4" w16cid:durableId="1238246834">
     <w:abstractNumId w:val="4"/>
   </w:num>
-  <w:num w:numId="5" w16cid:durableId="196085041">
+  <w:num w:numId="5" w16cid:durableId="1829980911">
     <w:abstractNumId w:val="7"/>
   </w:num>
-  <w:num w:numId="6" w16cid:durableId="971791003">
+  <w:num w:numId="6" w16cid:durableId="197815386">
     <w:abstractNumId w:val="3"/>
   </w:num>
-  <w:num w:numId="7" w16cid:durableId="2095321327">
+  <w:num w:numId="7" w16cid:durableId="380371186">
     <w:abstractNumId w:val="2"/>
   </w:num>
-  <w:num w:numId="8" w16cid:durableId="775104586">
+  <w:num w:numId="8" w16cid:durableId="1709187584">
     <w:abstractNumId w:val="1"/>
   </w:num>
-  <w:num w:numId="9" w16cid:durableId="333652965">
+  <w:num w:numId="9" w16cid:durableId="691688939">
     <w:abstractNumId w:val="0"/>
   </w:num>
 </w:numbering>
@@ -37378,7 +37095,7 @@
     <w:autoRedefine/>
     <w:uiPriority w:val="39"/>
     <w:unhideWhenUsed/>
-    <w:rsid w:val="00F53640"/>
+    <w:rsid w:val="00C7125C"/>
     <w:pPr>
       <w:spacing w:after="100"/>
     </w:pPr>
@@ -37390,7 +37107,7 @@
     <w:autoRedefine/>
     <w:uiPriority w:val="39"/>
     <w:unhideWhenUsed/>
-    <w:rsid w:val="00F53640"/>
+    <w:rsid w:val="00C7125C"/>
     <w:pPr>
       <w:spacing w:after="100"/>
       <w:ind w:left="210"/>
@@ -37403,7 +37120,7 @@
     <w:autoRedefine/>
     <w:uiPriority w:val="39"/>
     <w:unhideWhenUsed/>
-    <w:rsid w:val="00F53640"/>
+    <w:rsid w:val="00C7125C"/>
     <w:pPr>
       <w:spacing w:after="100"/>
       <w:ind w:left="420"/>
@@ -37414,7 +37131,7 @@
     <w:basedOn w:val="DefaultParagraphFont"/>
     <w:uiPriority w:val="99"/>
     <w:unhideWhenUsed/>
-    <w:rsid w:val="00F53640"/>
+    <w:rsid w:val="00C7125C"/>
     <w:rPr>
       <w:color w:val="0000FF" w:themeColor="hyperlink"/>
       <w:u w:val="single"/>

</xml_diff>

<commit_message>
Masukkan pengukuran suhu MQ pertama ke 2.6.f dokumen sertifikasi
Data internal 8 kanal thermocouple (normal, max load, fan stalled)
diekstrapolasi ke Tamb maks +60C: terburuk ~114C vs batas efektif T4
130C. Status 2.6.f naik ke Partially available dengan item terbuka
dicatat eksplisit (TC-3/4/5 belum diukur, Alarm/Tx kosong, PCB max
load belum stabil, metadata uji belum ada). Narrative doc akhirnya
di-render ulang setelah tidak lagi terkunci di Word. Revision history
yang masih menyebut nama LGU/ITB dibuat generik.

Co-Authored-By: Claude Opus 5.5 <noreply@anthropic.com>
</commit_message>
<xml_diff>
--- a/Deliverables/Dokumen_Teknis_Sertifikasi_GLD_IECEx_ATEX.docx
+++ b/Deliverables/Dokumen_Teknis_Sertifikasi_GLD_IECEx_ATEX.docx
@@ -226,7 +226,7 @@
               <w:rPr>
                 <w:sz w:val="20"/>
               </w:rPr>
-              <w:t>1.3</w:t>
+              <w:t>1.4</w:t>
             </w:r>
           </w:p>
         </w:tc>
@@ -263,7 +263,7 @@
               <w:rPr>
                 <w:sz w:val="20"/>
               </w:rPr>
-              <w:t>28 September 2026</w:t>
+              <w:t>30 September 2026</w:t>
             </w:r>
           </w:p>
         </w:tc>
@@ -1207,14 +1207,65 @@
               <w:rPr>
                 <w:sz w:val="19"/>
               </w:rPr>
-              <w:t xml:space="preserve">Applicant/Manufacturer identity simplified to a single entity, PT Galaksi Megatama Indonesia, throughout the document (document number prefix changed to GMI/...). Removed all references to PT LAPI Ganesha Utama as “design and development authority” and to the Institute of Technology </w:t>
+              <w:t xml:space="preserve">Applicant/Manufacturer identity simplified to a single entity, PT Galaksi Megatama Indonesia, throughout the document (document number prefix changed to GMI/...). The separate “design and development authority” and “technical partner” entries were removed (Sections 1.1, 1.3, 2.2, letterhead, </w:t>
             </w:r>
             <w:r>
               <w:rPr>
                 <w:sz w:val="19"/>
               </w:rPr>
               <w:lastRenderedPageBreak/>
-              <w:t>Bandung as “technical partner” (Sections 1.1, 1.3, 2.2, letterhead, Document Control) per updated applicant-identity decision; narrative passages describing electronics design/engineering work were made generic rather than deleted, to avoid implying the Manufacturer performed work it did not.</w:t>
+              <w:t>Document Control); narrative passages describing electronics design/engineering work were made generic rather than deleted, to avoid implying the Manufacturer performed work it did not.</w:t>
+            </w:r>
+          </w:p>
+        </w:tc>
+      </w:tr>
+      <w:tr>
+        <w:tc>
+          <w:tcPr>
+            <w:tcW w:w="1296" w:type="dxa"/>
+          </w:tcPr>
+          <w:p>
+            <w:pPr>
+              <w:spacing w:after="40"/>
+            </w:pPr>
+            <w:r>
+              <w:rPr>
+                <w:sz w:val="19"/>
+              </w:rPr>
+              <w:lastRenderedPageBreak/>
+              <w:t>1.4</w:t>
+            </w:r>
+          </w:p>
+        </w:tc>
+        <w:tc>
+          <w:tcPr>
+            <w:tcW w:w="1872" w:type="dxa"/>
+          </w:tcPr>
+          <w:p>
+            <w:pPr>
+              <w:spacing w:after="40"/>
+            </w:pPr>
+            <w:r>
+              <w:rPr>
+                <w:sz w:val="19"/>
+              </w:rPr>
+              <w:t>30 September 2026</w:t>
+            </w:r>
+          </w:p>
+        </w:tc>
+        <w:tc>
+          <w:tcPr>
+            <w:tcW w:w="6192" w:type="dxa"/>
+          </w:tcPr>
+          <w:p>
+            <w:pPr>
+              <w:spacing w:after="40"/>
+            </w:pPr>
+            <w:r>
+              <w:rPr>
+                <w:sz w:val="19"/>
+              </w:rPr>
+              <w:t>Section 2.6.f populated with a preliminary internal surface-temperature measurement (eight thermocouple channels; normal, maximum-load and fan-stalled conditions; 180 minutes each), including extrapolation to the +60°C maximum ambient: highest value ≈114°C (MQ sensor body, fan stalled) against an effective T4 limit of 130°C. Status raised from Not yet available to Partially available; open measurement items listed. Sections 1.1 and 2.5 temperature-class remarks updated accordingly.</w:t>
             </w:r>
           </w:p>
         </w:tc>
@@ -1222,7 +1273,6 @@
     </w:tbl>
     <w:p>
       <w:r>
-        <w:lastRenderedPageBreak/>
         <w:br w:type="page"/>
       </w:r>
     </w:p>
@@ -1259,7 +1309,7 @@
       <w:r>
         <w:fldChar w:fldCharType="separate"/>
       </w:r>
-      <w:hyperlink w:anchor="_Toc241510258" w:history="1">
+      <w:hyperlink w:anchor="_Toc241668736" w:history="1">
         <w:r>
           <w:rPr>
             <w:rStyle w:val="Hyperlink"/>
@@ -1286,7 +1336,7 @@
             <w:noProof/>
             <w:webHidden/>
           </w:rPr>
-          <w:instrText xml:space="preserve"> PAGEREF _Toc241510258 \h </w:instrText>
+          <w:instrText xml:space="preserve"> PAGEREF _Toc241668736 \h </w:instrText>
         </w:r>
         <w:r>
           <w:rPr>
@@ -1327,7 +1377,7 @@
           <w:noProof/>
         </w:rPr>
       </w:pPr>
-      <w:hyperlink w:anchor="_Toc241510259" w:history="1">
+      <w:hyperlink w:anchor="_Toc241668737" w:history="1">
         <w:r>
           <w:rPr>
             <w:rStyle w:val="Hyperlink"/>
@@ -1354,7 +1404,7 @@
             <w:noProof/>
             <w:webHidden/>
           </w:rPr>
-          <w:instrText xml:space="preserve"> PAGEREF _Toc241510259 \h </w:instrText>
+          <w:instrText xml:space="preserve"> PAGEREF _Toc241668737 \h </w:instrText>
         </w:r>
         <w:r>
           <w:rPr>
@@ -1395,7 +1445,7 @@
           <w:noProof/>
         </w:rPr>
       </w:pPr>
-      <w:hyperlink w:anchor="_Toc241510260" w:history="1">
+      <w:hyperlink w:anchor="_Toc241668738" w:history="1">
         <w:r>
           <w:rPr>
             <w:rStyle w:val="Hyperlink"/>
@@ -1422,7 +1472,7 @@
             <w:noProof/>
             <w:webHidden/>
           </w:rPr>
-          <w:instrText xml:space="preserve"> PAGEREF _Toc241510260 \h </w:instrText>
+          <w:instrText xml:space="preserve"> PAGEREF _Toc241668738 \h </w:instrText>
         </w:r>
         <w:r>
           <w:rPr>
@@ -1463,7 +1513,7 @@
           <w:noProof/>
         </w:rPr>
       </w:pPr>
-      <w:hyperlink w:anchor="_Toc241510261" w:history="1">
+      <w:hyperlink w:anchor="_Toc241668739" w:history="1">
         <w:r>
           <w:rPr>
             <w:rStyle w:val="Hyperlink"/>
@@ -1490,7 +1540,7 @@
             <w:noProof/>
             <w:webHidden/>
           </w:rPr>
-          <w:instrText xml:space="preserve"> PAGEREF _Toc241510261 \h </w:instrText>
+          <w:instrText xml:space="preserve"> PAGEREF _Toc241668739 \h </w:instrText>
         </w:r>
         <w:r>
           <w:rPr>
@@ -1531,7 +1581,7 @@
           <w:noProof/>
         </w:rPr>
       </w:pPr>
-      <w:hyperlink w:anchor="_Toc241510262" w:history="1">
+      <w:hyperlink w:anchor="_Toc241668740" w:history="1">
         <w:r>
           <w:rPr>
             <w:rStyle w:val="Hyperlink"/>
@@ -1558,7 +1608,7 @@
             <w:noProof/>
             <w:webHidden/>
           </w:rPr>
-          <w:instrText xml:space="preserve"> PAGEREF _Toc241510262 \h </w:instrText>
+          <w:instrText xml:space="preserve"> PAGEREF _Toc241668740 \h </w:instrText>
         </w:r>
         <w:r>
           <w:rPr>
@@ -1599,7 +1649,7 @@
           <w:noProof/>
         </w:rPr>
       </w:pPr>
-      <w:hyperlink w:anchor="_Toc241510263" w:history="1">
+      <w:hyperlink w:anchor="_Toc241668741" w:history="1">
         <w:r>
           <w:rPr>
             <w:rStyle w:val="Hyperlink"/>
@@ -1626,7 +1676,7 @@
             <w:noProof/>
             <w:webHidden/>
           </w:rPr>
-          <w:instrText xml:space="preserve"> PAGEREF _Toc241510263 \h </w:instrText>
+          <w:instrText xml:space="preserve"> PAGEREF _Toc241668741 \h </w:instrText>
         </w:r>
         <w:r>
           <w:rPr>
@@ -1667,7 +1717,7 @@
           <w:noProof/>
         </w:rPr>
       </w:pPr>
-      <w:hyperlink w:anchor="_Toc241510264" w:history="1">
+      <w:hyperlink w:anchor="_Toc241668742" w:history="1">
         <w:r>
           <w:rPr>
             <w:rStyle w:val="Hyperlink"/>
@@ -1694,7 +1744,7 @@
             <w:noProof/>
             <w:webHidden/>
           </w:rPr>
-          <w:instrText xml:space="preserve"> PAGEREF _Toc241510264 \h </w:instrText>
+          <w:instrText xml:space="preserve"> PAGEREF _Toc241668742 \h </w:instrText>
         </w:r>
         <w:r>
           <w:rPr>
@@ -1735,7 +1785,7 @@
           <w:noProof/>
         </w:rPr>
       </w:pPr>
-      <w:hyperlink w:anchor="_Toc241510265" w:history="1">
+      <w:hyperlink w:anchor="_Toc241668743" w:history="1">
         <w:r>
           <w:rPr>
             <w:rStyle w:val="Hyperlink"/>
@@ -1762,7 +1812,7 @@
             <w:noProof/>
             <w:webHidden/>
           </w:rPr>
-          <w:instrText xml:space="preserve"> PAGEREF _Toc241510265 \h </w:instrText>
+          <w:instrText xml:space="preserve"> PAGEREF _Toc241668743 \h </w:instrText>
         </w:r>
         <w:r>
           <w:rPr>
@@ -1803,7 +1853,7 @@
           <w:noProof/>
         </w:rPr>
       </w:pPr>
-      <w:hyperlink w:anchor="_Toc241510266" w:history="1">
+      <w:hyperlink w:anchor="_Toc241668744" w:history="1">
         <w:r>
           <w:rPr>
             <w:rStyle w:val="Hyperlink"/>
@@ -1830,7 +1880,7 @@
             <w:noProof/>
             <w:webHidden/>
           </w:rPr>
-          <w:instrText xml:space="preserve"> PAGEREF _Toc241510266 \h </w:instrText>
+          <w:instrText xml:space="preserve"> PAGEREF _Toc241668744 \h </w:instrText>
         </w:r>
         <w:r>
           <w:rPr>
@@ -1871,7 +1921,7 @@
           <w:noProof/>
         </w:rPr>
       </w:pPr>
-      <w:hyperlink w:anchor="_Toc241510267" w:history="1">
+      <w:hyperlink w:anchor="_Toc241668745" w:history="1">
         <w:r>
           <w:rPr>
             <w:rStyle w:val="Hyperlink"/>
@@ -1898,7 +1948,7 @@
             <w:noProof/>
             <w:webHidden/>
           </w:rPr>
-          <w:instrText xml:space="preserve"> PAGEREF _Toc241510267 \h </w:instrText>
+          <w:instrText xml:space="preserve"> PAGEREF _Toc241668745 \h </w:instrText>
         </w:r>
         <w:r>
           <w:rPr>
@@ -1939,7 +1989,7 @@
           <w:noProof/>
         </w:rPr>
       </w:pPr>
-      <w:hyperlink w:anchor="_Toc241510268" w:history="1">
+      <w:hyperlink w:anchor="_Toc241668746" w:history="1">
         <w:r>
           <w:rPr>
             <w:rStyle w:val="Hyperlink"/>
@@ -1966,7 +2016,7 @@
             <w:noProof/>
             <w:webHidden/>
           </w:rPr>
-          <w:instrText xml:space="preserve"> PAGEREF _Toc241510268 \h </w:instrText>
+          <w:instrText xml:space="preserve"> PAGEREF _Toc241668746 \h </w:instrText>
         </w:r>
         <w:r>
           <w:rPr>
@@ -2007,7 +2057,7 @@
           <w:noProof/>
         </w:rPr>
       </w:pPr>
-      <w:hyperlink w:anchor="_Toc241510269" w:history="1">
+      <w:hyperlink w:anchor="_Toc241668747" w:history="1">
         <w:r>
           <w:rPr>
             <w:rStyle w:val="Hyperlink"/>
@@ -2034,7 +2084,7 @@
             <w:noProof/>
             <w:webHidden/>
           </w:rPr>
-          <w:instrText xml:space="preserve"> PAGEREF _Toc241510269 \h </w:instrText>
+          <w:instrText xml:space="preserve"> PAGEREF _Toc241668747 \h </w:instrText>
         </w:r>
         <w:r>
           <w:rPr>
@@ -2075,7 +2125,7 @@
           <w:noProof/>
         </w:rPr>
       </w:pPr>
-      <w:hyperlink w:anchor="_Toc241510270" w:history="1">
+      <w:hyperlink w:anchor="_Toc241668748" w:history="1">
         <w:r>
           <w:rPr>
             <w:rStyle w:val="Hyperlink"/>
@@ -2102,7 +2152,7 @@
             <w:noProof/>
             <w:webHidden/>
           </w:rPr>
-          <w:instrText xml:space="preserve"> PAGEREF _Toc241510270 \h </w:instrText>
+          <w:instrText xml:space="preserve"> PAGEREF _Toc241668748 \h </w:instrText>
         </w:r>
         <w:r>
           <w:rPr>
@@ -2143,7 +2193,7 @@
           <w:noProof/>
         </w:rPr>
       </w:pPr>
-      <w:hyperlink w:anchor="_Toc241510271" w:history="1">
+      <w:hyperlink w:anchor="_Toc241668749" w:history="1">
         <w:r>
           <w:rPr>
             <w:rStyle w:val="Hyperlink"/>
@@ -2170,7 +2220,7 @@
             <w:noProof/>
             <w:webHidden/>
           </w:rPr>
-          <w:instrText xml:space="preserve"> PAGEREF _Toc241510271 \h </w:instrText>
+          <w:instrText xml:space="preserve"> PAGEREF _Toc241668749 \h </w:instrText>
         </w:r>
         <w:r>
           <w:rPr>
@@ -2211,7 +2261,7 @@
           <w:noProof/>
         </w:rPr>
       </w:pPr>
-      <w:hyperlink w:anchor="_Toc241510272" w:history="1">
+      <w:hyperlink w:anchor="_Toc241668750" w:history="1">
         <w:r>
           <w:rPr>
             <w:rStyle w:val="Hyperlink"/>
@@ -2238,7 +2288,7 @@
             <w:noProof/>
             <w:webHidden/>
           </w:rPr>
-          <w:instrText xml:space="preserve"> PAGEREF _Toc241510272 \h </w:instrText>
+          <w:instrText xml:space="preserve"> PAGEREF _Toc241668750 \h </w:instrText>
         </w:r>
         <w:r>
           <w:rPr>
@@ -2279,7 +2329,7 @@
           <w:noProof/>
         </w:rPr>
       </w:pPr>
-      <w:hyperlink w:anchor="_Toc241510273" w:history="1">
+      <w:hyperlink w:anchor="_Toc241668751" w:history="1">
         <w:r>
           <w:rPr>
             <w:rStyle w:val="Hyperlink"/>
@@ -2306,7 +2356,7 @@
             <w:noProof/>
             <w:webHidden/>
           </w:rPr>
-          <w:instrText xml:space="preserve"> PAGEREF _Toc241510273 \h </w:instrText>
+          <w:instrText xml:space="preserve"> PAGEREF _Toc241668751 \h </w:instrText>
         </w:r>
         <w:r>
           <w:rPr>
@@ -2347,7 +2397,7 @@
           <w:noProof/>
         </w:rPr>
       </w:pPr>
-      <w:hyperlink w:anchor="_Toc241510274" w:history="1">
+      <w:hyperlink w:anchor="_Toc241668752" w:history="1">
         <w:r>
           <w:rPr>
             <w:rStyle w:val="Hyperlink"/>
@@ -2374,7 +2424,7 @@
             <w:noProof/>
             <w:webHidden/>
           </w:rPr>
-          <w:instrText xml:space="preserve"> PAGEREF _Toc241510274 \h </w:instrText>
+          <w:instrText xml:space="preserve"> PAGEREF _Toc241668752 \h </w:instrText>
         </w:r>
         <w:r>
           <w:rPr>
@@ -2415,7 +2465,7 @@
           <w:noProof/>
         </w:rPr>
       </w:pPr>
-      <w:hyperlink w:anchor="_Toc241510275" w:history="1">
+      <w:hyperlink w:anchor="_Toc241668753" w:history="1">
         <w:r>
           <w:rPr>
             <w:rStyle w:val="Hyperlink"/>
@@ -2442,7 +2492,7 @@
             <w:noProof/>
             <w:webHidden/>
           </w:rPr>
-          <w:instrText xml:space="preserve"> PAGEREF _Toc241510275 \h </w:instrText>
+          <w:instrText xml:space="preserve"> PAGEREF _Toc241668753 \h </w:instrText>
         </w:r>
         <w:r>
           <w:rPr>
@@ -2483,7 +2533,7 @@
           <w:noProof/>
         </w:rPr>
       </w:pPr>
-      <w:hyperlink w:anchor="_Toc241510276" w:history="1">
+      <w:hyperlink w:anchor="_Toc241668754" w:history="1">
         <w:r>
           <w:rPr>
             <w:rStyle w:val="Hyperlink"/>
@@ -2510,7 +2560,7 @@
             <w:noProof/>
             <w:webHidden/>
           </w:rPr>
-          <w:instrText xml:space="preserve"> PAGEREF _Toc241510276 \h </w:instrText>
+          <w:instrText xml:space="preserve"> PAGEREF _Toc241668754 \h </w:instrText>
         </w:r>
         <w:r>
           <w:rPr>
@@ -2551,7 +2601,7 @@
           <w:noProof/>
         </w:rPr>
       </w:pPr>
-      <w:hyperlink w:anchor="_Toc241510277" w:history="1">
+      <w:hyperlink w:anchor="_Toc241668755" w:history="1">
         <w:r>
           <w:rPr>
             <w:rStyle w:val="Hyperlink"/>
@@ -2578,7 +2628,7 @@
             <w:noProof/>
             <w:webHidden/>
           </w:rPr>
-          <w:instrText xml:space="preserve"> PAGEREF _Toc241510277 \h </w:instrText>
+          <w:instrText xml:space="preserve"> PAGEREF _Toc241668755 \h </w:instrText>
         </w:r>
         <w:r>
           <w:rPr>
@@ -2619,7 +2669,7 @@
           <w:noProof/>
         </w:rPr>
       </w:pPr>
-      <w:hyperlink w:anchor="_Toc241510278" w:history="1">
+      <w:hyperlink w:anchor="_Toc241668756" w:history="1">
         <w:r>
           <w:rPr>
             <w:rStyle w:val="Hyperlink"/>
@@ -2646,7 +2696,7 @@
             <w:noProof/>
             <w:webHidden/>
           </w:rPr>
-          <w:instrText xml:space="preserve"> PAGEREF _Toc241510278 \h </w:instrText>
+          <w:instrText xml:space="preserve"> PAGEREF _Toc241668756 \h </w:instrText>
         </w:r>
         <w:r>
           <w:rPr>
@@ -2687,7 +2737,7 @@
           <w:noProof/>
         </w:rPr>
       </w:pPr>
-      <w:hyperlink w:anchor="_Toc241510279" w:history="1">
+      <w:hyperlink w:anchor="_Toc241668757" w:history="1">
         <w:r>
           <w:rPr>
             <w:rStyle w:val="Hyperlink"/>
@@ -2714,7 +2764,7 @@
             <w:noProof/>
             <w:webHidden/>
           </w:rPr>
-          <w:instrText xml:space="preserve"> PAGEREF _Toc241510279 \h </w:instrText>
+          <w:instrText xml:space="preserve"> PAGEREF _Toc241668757 \h </w:instrText>
         </w:r>
         <w:r>
           <w:rPr>
@@ -2755,7 +2805,7 @@
           <w:noProof/>
         </w:rPr>
       </w:pPr>
-      <w:hyperlink w:anchor="_Toc241510280" w:history="1">
+      <w:hyperlink w:anchor="_Toc241668758" w:history="1">
         <w:r>
           <w:rPr>
             <w:rStyle w:val="Hyperlink"/>
@@ -2782,7 +2832,7 @@
             <w:noProof/>
             <w:webHidden/>
           </w:rPr>
-          <w:instrText xml:space="preserve"> PAGEREF _Toc241510280 \h </w:instrText>
+          <w:instrText xml:space="preserve"> PAGEREF _Toc241668758 \h </w:instrText>
         </w:r>
         <w:r>
           <w:rPr>
@@ -2823,7 +2873,7 @@
           <w:noProof/>
         </w:rPr>
       </w:pPr>
-      <w:hyperlink w:anchor="_Toc241510281" w:history="1">
+      <w:hyperlink w:anchor="_Toc241668759" w:history="1">
         <w:r>
           <w:rPr>
             <w:rStyle w:val="Hyperlink"/>
@@ -2850,7 +2900,7 @@
             <w:noProof/>
             <w:webHidden/>
           </w:rPr>
-          <w:instrText xml:space="preserve"> PAGEREF _Toc241510281 \h </w:instrText>
+          <w:instrText xml:space="preserve"> PAGEREF _Toc241668759 \h </w:instrText>
         </w:r>
         <w:r>
           <w:rPr>
@@ -2891,7 +2941,7 @@
           <w:noProof/>
         </w:rPr>
       </w:pPr>
-      <w:hyperlink w:anchor="_Toc241510282" w:history="1">
+      <w:hyperlink w:anchor="_Toc241668760" w:history="1">
         <w:r>
           <w:rPr>
             <w:rStyle w:val="Hyperlink"/>
@@ -2918,75 +2968,7 @@
             <w:noProof/>
             <w:webHidden/>
           </w:rPr>
-          <w:instrText xml:space="preserve"> PAGEREF _Toc241510282 \h </w:instrText>
-        </w:r>
-        <w:r>
-          <w:rPr>
-            <w:noProof/>
-            <w:webHidden/>
-          </w:rPr>
-        </w:r>
-        <w:r>
-          <w:rPr>
-            <w:noProof/>
-            <w:webHidden/>
-          </w:rPr>
-          <w:fldChar w:fldCharType="separate"/>
-        </w:r>
-        <w:r>
-          <w:rPr>
-            <w:noProof/>
-            <w:webHidden/>
-          </w:rPr>
-          <w:t>33</w:t>
-        </w:r>
-        <w:r>
-          <w:rPr>
-            <w:noProof/>
-            <w:webHidden/>
-          </w:rPr>
-          <w:fldChar w:fldCharType="end"/>
-        </w:r>
-      </w:hyperlink>
-    </w:p>
-    <w:p>
-      <w:pPr>
-        <w:pStyle w:val="TOC3"/>
-        <w:tabs>
-          <w:tab w:val="right" w:leader="dot" w:pos="9736"/>
-        </w:tabs>
-        <w:rPr>
-          <w:noProof/>
-        </w:rPr>
-      </w:pPr>
-      <w:hyperlink w:anchor="_Toc241510283" w:history="1">
-        <w:r>
-          <w:rPr>
-            <w:rStyle w:val="Hyperlink"/>
-            <w:noProof/>
-          </w:rPr>
-          <w:t>2.6.h · Nameplate Information</w:t>
-        </w:r>
-        <w:r>
-          <w:rPr>
-            <w:noProof/>
-            <w:webHidden/>
-          </w:rPr>
-          <w:tab/>
-        </w:r>
-        <w:r>
-          <w:rPr>
-            <w:noProof/>
-            <w:webHidden/>
-          </w:rPr>
-          <w:fldChar w:fldCharType="begin"/>
-        </w:r>
-        <w:r>
-          <w:rPr>
-            <w:noProof/>
-            <w:webHidden/>
-          </w:rPr>
-          <w:instrText xml:space="preserve"> PAGEREF _Toc241510283 \h </w:instrText>
+          <w:instrText xml:space="preserve"> PAGEREF _Toc241668760 \h </w:instrText>
         </w:r>
         <w:r>
           <w:rPr>
@@ -3027,13 +3009,13 @@
           <w:noProof/>
         </w:rPr>
       </w:pPr>
-      <w:hyperlink w:anchor="_Toc241510284" w:history="1">
+      <w:hyperlink w:anchor="_Toc241668761" w:history="1">
         <w:r>
           <w:rPr>
             <w:rStyle w:val="Hyperlink"/>
             <w:noProof/>
           </w:rPr>
-          <w:t>2.6.i · Ex Component Certificates</w:t>
+          <w:t>2.6.h · Nameplate Information</w:t>
         </w:r>
         <w:r>
           <w:rPr>
@@ -3054,7 +3036,7 @@
             <w:noProof/>
             <w:webHidden/>
           </w:rPr>
-          <w:instrText xml:space="preserve"> PAGEREF _Toc241510284 \h </w:instrText>
+          <w:instrText xml:space="preserve"> PAGEREF _Toc241668761 \h </w:instrText>
         </w:r>
         <w:r>
           <w:rPr>
@@ -3087,6 +3069,74 @@
     </w:p>
     <w:p>
       <w:pPr>
+        <w:pStyle w:val="TOC3"/>
+        <w:tabs>
+          <w:tab w:val="right" w:leader="dot" w:pos="9736"/>
+        </w:tabs>
+        <w:rPr>
+          <w:noProof/>
+        </w:rPr>
+      </w:pPr>
+      <w:hyperlink w:anchor="_Toc241668762" w:history="1">
+        <w:r>
+          <w:rPr>
+            <w:rStyle w:val="Hyperlink"/>
+            <w:noProof/>
+          </w:rPr>
+          <w:t>2.6.i · Ex Component Certificates</w:t>
+        </w:r>
+        <w:r>
+          <w:rPr>
+            <w:noProof/>
+            <w:webHidden/>
+          </w:rPr>
+          <w:tab/>
+        </w:r>
+        <w:r>
+          <w:rPr>
+            <w:noProof/>
+            <w:webHidden/>
+          </w:rPr>
+          <w:fldChar w:fldCharType="begin"/>
+        </w:r>
+        <w:r>
+          <w:rPr>
+            <w:noProof/>
+            <w:webHidden/>
+          </w:rPr>
+          <w:instrText xml:space="preserve"> PAGEREF _Toc241668762 \h </w:instrText>
+        </w:r>
+        <w:r>
+          <w:rPr>
+            <w:noProof/>
+            <w:webHidden/>
+          </w:rPr>
+        </w:r>
+        <w:r>
+          <w:rPr>
+            <w:noProof/>
+            <w:webHidden/>
+          </w:rPr>
+          <w:fldChar w:fldCharType="separate"/>
+        </w:r>
+        <w:r>
+          <w:rPr>
+            <w:noProof/>
+            <w:webHidden/>
+          </w:rPr>
+          <w:t>36</w:t>
+        </w:r>
+        <w:r>
+          <w:rPr>
+            <w:noProof/>
+            <w:webHidden/>
+          </w:rPr>
+          <w:fldChar w:fldCharType="end"/>
+        </w:r>
+      </w:hyperlink>
+    </w:p>
+    <w:p>
+      <w:pPr>
         <w:pStyle w:val="TOC1"/>
         <w:tabs>
           <w:tab w:val="right" w:leader="dot" w:pos="9736"/>
@@ -3095,7 +3145,7 @@
           <w:noProof/>
         </w:rPr>
       </w:pPr>
-      <w:hyperlink w:anchor="_Toc241510285" w:history="1">
+      <w:hyperlink w:anchor="_Toc241668763" w:history="1">
         <w:r>
           <w:rPr>
             <w:rStyle w:val="Hyperlink"/>
@@ -3122,7 +3172,7 @@
             <w:noProof/>
             <w:webHidden/>
           </w:rPr>
-          <w:instrText xml:space="preserve"> PAGEREF _Toc241510285 \h </w:instrText>
+          <w:instrText xml:space="preserve"> PAGEREF _Toc241668763 \h </w:instrText>
         </w:r>
         <w:r>
           <w:rPr>
@@ -3142,7 +3192,7 @@
             <w:noProof/>
             <w:webHidden/>
           </w:rPr>
-          <w:t>35</w:t>
+          <w:t>36</w:t>
         </w:r>
         <w:r>
           <w:rPr>
@@ -3163,7 +3213,7 @@
           <w:noProof/>
         </w:rPr>
       </w:pPr>
-      <w:hyperlink w:anchor="_Toc241510286" w:history="1">
+      <w:hyperlink w:anchor="_Toc241668764" w:history="1">
         <w:r>
           <w:rPr>
             <w:rStyle w:val="Hyperlink"/>
@@ -3190,7 +3240,7 @@
             <w:noProof/>
             <w:webHidden/>
           </w:rPr>
-          <w:instrText xml:space="preserve"> PAGEREF _Toc241510286 \h </w:instrText>
+          <w:instrText xml:space="preserve"> PAGEREF _Toc241668764 \h </w:instrText>
         </w:r>
         <w:r>
           <w:rPr>
@@ -3210,7 +3260,7 @@
             <w:noProof/>
             <w:webHidden/>
           </w:rPr>
-          <w:t>35</w:t>
+          <w:t>36</w:t>
         </w:r>
         <w:r>
           <w:rPr>
@@ -3231,7 +3281,7 @@
           <w:noProof/>
         </w:rPr>
       </w:pPr>
-      <w:hyperlink w:anchor="_Toc241510287" w:history="1">
+      <w:hyperlink w:anchor="_Toc241668765" w:history="1">
         <w:r>
           <w:rPr>
             <w:rStyle w:val="Hyperlink"/>
@@ -3258,7 +3308,7 @@
             <w:noProof/>
             <w:webHidden/>
           </w:rPr>
-          <w:instrText xml:space="preserve"> PAGEREF _Toc241510287 \h </w:instrText>
+          <w:instrText xml:space="preserve"> PAGEREF _Toc241668765 \h </w:instrText>
         </w:r>
         <w:r>
           <w:rPr>
@@ -3278,7 +3328,7 @@
             <w:noProof/>
             <w:webHidden/>
           </w:rPr>
-          <w:t>35</w:t>
+          <w:t>36</w:t>
         </w:r>
         <w:r>
           <w:rPr>
@@ -3304,7 +3354,7 @@
       <w:pPr>
         <w:pStyle w:val="Heading1"/>
       </w:pPr>
-      <w:bookmarkStart w:id="0" w:name="_Toc241510258"/>
+      <w:bookmarkStart w:id="0" w:name="_Toc241668736"/>
       <w:r>
         <w:lastRenderedPageBreak/>
         <w:t>About This Document</w:t>
@@ -3407,7 +3457,7 @@
       <w:pPr>
         <w:pStyle w:val="Heading1"/>
       </w:pPr>
-      <w:bookmarkStart w:id="1" w:name="_Toc241510259"/>
+      <w:bookmarkStart w:id="1" w:name="_Toc241668737"/>
       <w:r>
         <w:t>1. Basic Information (Application and Organization)</w:t>
       </w:r>
@@ -3547,7 +3597,7 @@
       <w:pPr>
         <w:pStyle w:val="Heading2"/>
       </w:pPr>
-      <w:bookmarkStart w:id="2" w:name="_Toc241510260"/>
+      <w:bookmarkStart w:id="2" w:name="_Toc241668738"/>
       <w:r>
         <w:t>1.0 · Status Summary — Section 1</w:t>
       </w:r>
@@ -3924,7 +3974,7 @@
       <w:pPr>
         <w:pStyle w:val="Heading2"/>
       </w:pPr>
-      <w:bookmarkStart w:id="3" w:name="_Toc241510261"/>
+      <w:bookmarkStart w:id="3" w:name="_Toc241668739"/>
       <w:r>
         <w:t>1.1 · Application Form</w:t>
       </w:r>
@@ -4449,7 +4499,7 @@
                 <w:color w:val="B56A1E"/>
                 <w:sz w:val="19"/>
               </w:rPr>
-              <w:t>Target — verification outstanding</w:t>
+              <w:t>Target — preliminary internal measurement supports it; formal verification outstanding</w:t>
             </w:r>
           </w:p>
         </w:tc>
@@ -4842,7 +4892,7 @@
       <w:pPr>
         <w:pStyle w:val="Heading2"/>
       </w:pPr>
-      <w:bookmarkStart w:id="4" w:name="_Toc241510262"/>
+      <w:bookmarkStart w:id="4" w:name="_Toc241668740"/>
       <w:r>
         <w:t>1.2 · Business License / Company Registration Certificate</w:t>
       </w:r>
@@ -5391,7 +5441,7 @@
       <w:pPr>
         <w:pStyle w:val="Heading2"/>
       </w:pPr>
-      <w:bookmarkStart w:id="5" w:name="_Toc241510263"/>
+      <w:bookmarkStart w:id="5" w:name="_Toc241668741"/>
       <w:r>
         <w:t>1.3 · Organizational Chart and Contact Information</w:t>
       </w:r>
@@ -5883,7 +5933,7 @@
       <w:pPr>
         <w:pStyle w:val="Heading2"/>
       </w:pPr>
-      <w:bookmarkStart w:id="6" w:name="_Toc241510264"/>
+      <w:bookmarkStart w:id="6" w:name="_Toc241668742"/>
       <w:r>
         <w:t>1.4 · Manufacturing Plant Address and Introduction of Production Facilities</w:t>
       </w:r>
@@ -6395,7 +6445,7 @@
       <w:pPr>
         <w:pStyle w:val="Heading2"/>
       </w:pPr>
-      <w:bookmarkStart w:id="7" w:name="_Toc241510265"/>
+      <w:bookmarkStart w:id="7" w:name="_Toc241668743"/>
       <w:r>
         <w:t>1.5 · ISO 9001 Certificate, Quality Manual, and Procedure Index</w:t>
       </w:r>
@@ -6817,7 +6867,7 @@
       <w:pPr>
         <w:pStyle w:val="Heading1"/>
       </w:pPr>
-      <w:bookmarkStart w:id="8" w:name="_Toc241510266"/>
+      <w:bookmarkStart w:id="8" w:name="_Toc241668744"/>
       <w:r>
         <w:t>2. Technical Documentation</w:t>
       </w:r>
@@ -6832,7 +6882,7 @@
       <w:pPr>
         <w:pStyle w:val="Heading2"/>
       </w:pPr>
-      <w:bookmarkStart w:id="9" w:name="_Toc241510267"/>
+      <w:bookmarkStart w:id="9" w:name="_Toc241668745"/>
       <w:r>
         <w:t>2.1 · Detailed Product Description</w:t>
       </w:r>
@@ -6869,7 +6919,7 @@
       <w:pPr>
         <w:pStyle w:val="Heading2"/>
       </w:pPr>
-      <w:bookmarkStart w:id="10" w:name="_Toc241510268"/>
+      <w:bookmarkStart w:id="10" w:name="_Toc241668746"/>
       <w:r>
         <w:t>2.2 · Product Name, Model, and Specification List</w:t>
       </w:r>
@@ -7238,7 +7288,7 @@
       <w:pPr>
         <w:pStyle w:val="Heading2"/>
       </w:pPr>
-      <w:bookmarkStart w:id="11" w:name="_Toc241510269"/>
+      <w:bookmarkStart w:id="11" w:name="_Toc241668747"/>
       <w:r>
         <w:t>2.3 · Functional Description and Technical Parameters (Electrical, Mechanical, etc.)</w:t>
       </w:r>
@@ -7260,7 +7310,7 @@
       <w:pPr>
         <w:pStyle w:val="Heading3"/>
       </w:pPr>
-      <w:bookmarkStart w:id="12" w:name="_Toc241510270"/>
+      <w:bookmarkStart w:id="12" w:name="_Toc241668748"/>
       <w:r>
         <w:t>2.3.a · Electrical Parameters — Node Sensor (GLD)</w:t>
       </w:r>
@@ -7957,7 +8007,7 @@
       <w:pPr>
         <w:pStyle w:val="Heading3"/>
       </w:pPr>
-      <w:bookmarkStart w:id="13" w:name="_Toc241510271"/>
+      <w:bookmarkStart w:id="13" w:name="_Toc241668749"/>
       <w:r>
         <w:t>2.3.b · Sensor and Communication Parameters — Node Sensor (GLD)</w:t>
       </w:r>
@@ -9019,7 +9069,7 @@
       <w:pPr>
         <w:pStyle w:val="Heading3"/>
       </w:pPr>
-      <w:bookmarkStart w:id="14" w:name="_Toc241510272"/>
+      <w:bookmarkStart w:id="14" w:name="_Toc241668750"/>
       <w:r>
         <w:t>2.3.c · Mechanical Parameters — Node Sensor (GLD)</w:t>
       </w:r>
@@ -9870,7 +9920,7 @@
       <w:pPr>
         <w:pStyle w:val="Heading2"/>
       </w:pPr>
-      <w:bookmarkStart w:id="15" w:name="_Toc241510273"/>
+      <w:bookmarkStart w:id="15" w:name="_Toc241668751"/>
       <w:r>
         <w:t>2.4 · Product Photographs — Overall and Key Components</w:t>
       </w:r>
@@ -9909,7 +9959,7 @@
                 <w:noProof/>
               </w:rPr>
               <w:drawing>
-                <wp:inline distT="0" distB="0" distL="0" distR="0" wp14:anchorId="1678A069" wp14:editId="2CAEABF2">
+                <wp:inline distT="0" distB="0" distL="0" distR="0" wp14:anchorId="26DC5602" wp14:editId="6DDC429F">
                   <wp:extent cx="1379912" cy="2286000"/>
                   <wp:effectExtent l="0" t="0" r="0" b="0"/>
                   <wp:docPr id="1" name="Picture 1"/>
@@ -9986,7 +10036,7 @@
                 <w:noProof/>
               </w:rPr>
               <w:drawing>
-                <wp:inline distT="0" distB="0" distL="0" distR="0" wp14:anchorId="4407278C" wp14:editId="61850E62">
+                <wp:inline distT="0" distB="0" distL="0" distR="0" wp14:anchorId="35F4BAEF" wp14:editId="08B42F54">
                   <wp:extent cx="1714500" cy="2286000"/>
                   <wp:effectExtent l="0" t="0" r="0" b="0"/>
                   <wp:docPr id="2" name="Picture 2"/>
@@ -10068,7 +10118,7 @@
                 <w:noProof/>
               </w:rPr>
               <w:drawing>
-                <wp:inline distT="0" distB="0" distL="0" distR="0" wp14:anchorId="4885AE5A" wp14:editId="4B7E89FD">
+                <wp:inline distT="0" distB="0" distL="0" distR="0" wp14:anchorId="03886E74" wp14:editId="24020FD0">
                   <wp:extent cx="1026621" cy="2286000"/>
                   <wp:effectExtent l="0" t="0" r="0" b="0"/>
                   <wp:docPr id="3" name="Picture 3"/>
@@ -10145,7 +10195,7 @@
                 <w:noProof/>
               </w:rPr>
               <w:drawing>
-                <wp:inline distT="0" distB="0" distL="0" distR="0" wp14:anchorId="508079D6" wp14:editId="6BCEF928">
+                <wp:inline distT="0" distB="0" distL="0" distR="0" wp14:anchorId="7E2576D3" wp14:editId="7E4C7BCD">
                   <wp:extent cx="1026621" cy="2286000"/>
                   <wp:effectExtent l="0" t="0" r="0" b="0"/>
                   <wp:docPr id="4" name="Picture 4"/>
@@ -10228,7 +10278,7 @@
               </w:rPr>
               <w:lastRenderedPageBreak/>
               <w:drawing>
-                <wp:inline distT="0" distB="0" distL="0" distR="0" wp14:anchorId="7E395B61" wp14:editId="79738F25">
+                <wp:inline distT="0" distB="0" distL="0" distR="0" wp14:anchorId="5736711D" wp14:editId="5E9E594C">
                   <wp:extent cx="1026621" cy="2286000"/>
                   <wp:effectExtent l="0" t="0" r="0" b="0"/>
                   <wp:docPr id="5" name="Picture 5"/>
@@ -10305,7 +10355,7 @@
                 <w:noProof/>
               </w:rPr>
               <w:drawing>
-                <wp:inline distT="0" distB="0" distL="0" distR="0" wp14:anchorId="614788D5" wp14:editId="1059401A">
+                <wp:inline distT="0" distB="0" distL="0" distR="0" wp14:anchorId="7BD4AACC" wp14:editId="28A94D6C">
                   <wp:extent cx="1026621" cy="2286000"/>
                   <wp:effectExtent l="0" t="0" r="0" b="0"/>
                   <wp:docPr id="6" name="Picture 6"/>
@@ -10387,7 +10437,7 @@
                 <w:noProof/>
               </w:rPr>
               <w:drawing>
-                <wp:inline distT="0" distB="0" distL="0" distR="0" wp14:anchorId="4AFCEE6D" wp14:editId="6453A24A">
+                <wp:inline distT="0" distB="0" distL="0" distR="0" wp14:anchorId="020BDEB6" wp14:editId="1C6BA19E">
                   <wp:extent cx="1026621" cy="2286000"/>
                   <wp:effectExtent l="0" t="0" r="0" b="0"/>
                   <wp:docPr id="7" name="Picture 7"/>
@@ -10511,7 +10561,7 @@
       <w:pPr>
         <w:pStyle w:val="Heading2"/>
       </w:pPr>
-      <w:bookmarkStart w:id="16" w:name="_Toc241510274"/>
+      <w:bookmarkStart w:id="16" w:name="_Toc241668752"/>
       <w:r>
         <w:t>2.5 · Description of Intended Use and Installation Environment (Gas Group, Temperature Class, Area Classification)</w:t>
       </w:r>
@@ -10763,7 +10813,7 @@
               <w:rPr>
                 <w:sz w:val="19"/>
               </w:rPr>
-              <w:t>Not yet substantiated by measurement. MQ-series metal-oxide sensors rely on an internal heating element as their normal operating principle; a hot-spot measurement specific to the sensor models and enclosure configuration used here has not yet been performed (see 2.6.f).</w:t>
+              <w:t>Supported by a preliminary internal surface-temperature measurement (Section 2.6.f): the highest value, extrapolated to the +60°C maximum ambient, is ≈114°C (MQ sensor body, fan-stalled condition), below the T4 limit less the 5 K margin (130°C). Not yet final — several measurement points and conditions remain open (see 2.6.f), and confirmation requires ExCB type testing.</w:t>
             </w:r>
           </w:p>
         </w:tc>
@@ -10842,7 +10892,7 @@
               <w:rPr>
                 <w:sz w:val="19"/>
               </w:rPr>
-              <w:t>Project-confirmed value, consistent with the Mechanical Parameters table (Section 2.3.c). Distinct from the MQ-sensor hot-spot surface temperature above, which remains the top-priority open item for the T4 recommendation.</w:t>
+              <w:t>Project-confirmed value, consistent with the Mechanical Parameters table (Section 2.3.c). Used as the reference for extrapolating the preliminary surface-temperature measurements in Section 2.6.f to worst-case ambient.</w:t>
             </w:r>
           </w:p>
         </w:tc>
@@ -11054,7 +11104,7 @@
       <w:pPr>
         <w:pStyle w:val="Heading2"/>
       </w:pPr>
-      <w:bookmarkStart w:id="17" w:name="_Toc241510275"/>
+      <w:bookmarkStart w:id="17" w:name="_Toc241668753"/>
       <w:r>
         <w:t>2.6 · Design and Manufacturing Information</w:t>
       </w:r>
@@ -11069,7 +11119,7 @@
       <w:pPr>
         <w:pStyle w:val="Heading3"/>
       </w:pPr>
-      <w:bookmarkStart w:id="18" w:name="_Toc241510276"/>
+      <w:bookmarkStart w:id="18" w:name="_Toc241668754"/>
       <w:r>
         <w:t>2.6.a · Complete Drawings (Assembly, Component, Electrical Schematic, PCB Layout, Enclosure Structure, Junction Box, Terminal, Grounding)</w:t>
       </w:r>
@@ -11090,7 +11140,7 @@
         </w:rPr>
         <w:lastRenderedPageBreak/>
         <w:drawing>
-          <wp:inline distT="0" distB="0" distL="0" distR="0" wp14:anchorId="7785D0CA" wp14:editId="63A7C267">
+          <wp:inline distT="0" distB="0" distL="0" distR="0" wp14:anchorId="6823F866" wp14:editId="46FD5545">
             <wp:extent cx="5120640" cy="3413760"/>
             <wp:effectExtent l="0" t="0" r="0" b="0"/>
             <wp:docPr id="8" name="Picture 8"/>
@@ -11162,7 +11212,7 @@
           <w:noProof/>
         </w:rPr>
         <w:drawing>
-          <wp:inline distT="0" distB="0" distL="0" distR="0" wp14:anchorId="35D9CE59" wp14:editId="7FCDF981">
+          <wp:inline distT="0" distB="0" distL="0" distR="0" wp14:anchorId="7FBD0756" wp14:editId="11CF7531">
             <wp:extent cx="5120640" cy="3413760"/>
             <wp:effectExtent l="0" t="0" r="0" b="0"/>
             <wp:docPr id="9" name="Picture 9"/>
@@ -11235,7 +11285,7 @@
         </w:rPr>
         <w:lastRenderedPageBreak/>
         <w:drawing>
-          <wp:inline distT="0" distB="0" distL="0" distR="0" wp14:anchorId="1BE9CD84" wp14:editId="737DF9F9">
+          <wp:inline distT="0" distB="0" distL="0" distR="0" wp14:anchorId="5ECF9185" wp14:editId="5C0E8869">
             <wp:extent cx="5120640" cy="3413760"/>
             <wp:effectExtent l="0" t="0" r="0" b="0"/>
             <wp:docPr id="10" name="Picture 10"/>
@@ -11307,7 +11357,7 @@
           <w:noProof/>
         </w:rPr>
         <w:drawing>
-          <wp:inline distT="0" distB="0" distL="0" distR="0" wp14:anchorId="42EBA810" wp14:editId="659B4926">
+          <wp:inline distT="0" distB="0" distL="0" distR="0" wp14:anchorId="34940FF8" wp14:editId="2F355F2F">
             <wp:extent cx="5120640" cy="3413760"/>
             <wp:effectExtent l="0" t="0" r="0" b="0"/>
             <wp:docPr id="11" name="Picture 11"/>
@@ -11380,7 +11430,7 @@
         </w:rPr>
         <w:lastRenderedPageBreak/>
         <w:drawing>
-          <wp:inline distT="0" distB="0" distL="0" distR="0" wp14:anchorId="115220C2" wp14:editId="16BF5FD0">
+          <wp:inline distT="0" distB="0" distL="0" distR="0" wp14:anchorId="2D91497E" wp14:editId="39BD4230">
             <wp:extent cx="5120640" cy="3413760"/>
             <wp:effectExtent l="0" t="0" r="0" b="0"/>
             <wp:docPr id="12" name="Picture 12"/>
@@ -11452,7 +11502,7 @@
           <w:noProof/>
         </w:rPr>
         <w:drawing>
-          <wp:inline distT="0" distB="0" distL="0" distR="0" wp14:anchorId="46CB5DEB" wp14:editId="02DED26C">
+          <wp:inline distT="0" distB="0" distL="0" distR="0" wp14:anchorId="2CA0F5FE" wp14:editId="3609E0D9">
             <wp:extent cx="5120640" cy="3413760"/>
             <wp:effectExtent l="0" t="0" r="0" b="0"/>
             <wp:docPr id="13" name="Picture 13"/>
@@ -11525,7 +11575,7 @@
         </w:rPr>
         <w:lastRenderedPageBreak/>
         <w:drawing>
-          <wp:inline distT="0" distB="0" distL="0" distR="0" wp14:anchorId="393B28BD" wp14:editId="2D96BAA6">
+          <wp:inline distT="0" distB="0" distL="0" distR="0" wp14:anchorId="3403BAED" wp14:editId="0E26E4A0">
             <wp:extent cx="5120640" cy="3413760"/>
             <wp:effectExtent l="0" t="0" r="0" b="0"/>
             <wp:docPr id="14" name="Picture 14"/>
@@ -11597,7 +11647,7 @@
           <w:noProof/>
         </w:rPr>
         <w:drawing>
-          <wp:inline distT="0" distB="0" distL="0" distR="0" wp14:anchorId="0A833093" wp14:editId="65EB28B4">
+          <wp:inline distT="0" distB="0" distL="0" distR="0" wp14:anchorId="051D8F64" wp14:editId="5A12AAD2">
             <wp:extent cx="5120640" cy="3413760"/>
             <wp:effectExtent l="0" t="0" r="0" b="0"/>
             <wp:docPr id="15" name="Picture 15"/>
@@ -11670,7 +11720,7 @@
         </w:rPr>
         <w:lastRenderedPageBreak/>
         <w:drawing>
-          <wp:inline distT="0" distB="0" distL="0" distR="0" wp14:anchorId="09856F2A" wp14:editId="5F0655B4">
+          <wp:inline distT="0" distB="0" distL="0" distR="0" wp14:anchorId="19301CAC" wp14:editId="65C8B8EA">
             <wp:extent cx="5120640" cy="3413760"/>
             <wp:effectExtent l="0" t="0" r="0" b="0"/>
             <wp:docPr id="16" name="Picture 16"/>
@@ -11742,7 +11792,7 @@
           <w:noProof/>
         </w:rPr>
         <w:drawing>
-          <wp:inline distT="0" distB="0" distL="0" distR="0" wp14:anchorId="1112C41E" wp14:editId="17FA71B1">
+          <wp:inline distT="0" distB="0" distL="0" distR="0" wp14:anchorId="606ADF51" wp14:editId="7F061F5B">
             <wp:extent cx="2468880" cy="2479268"/>
             <wp:effectExtent l="0" t="0" r="0" b="0"/>
             <wp:docPr id="17" name="Picture 17"/>
@@ -11785,7 +11835,7 @@
           <w:noProof/>
         </w:rPr>
         <w:drawing>
-          <wp:inline distT="0" distB="0" distL="0" distR="0" wp14:anchorId="7DE84F04" wp14:editId="542C43BD">
+          <wp:inline distT="0" distB="0" distL="0" distR="0" wp14:anchorId="28EDECB5" wp14:editId="4A9E9EF7">
             <wp:extent cx="2468880" cy="1804956"/>
             <wp:effectExtent l="0" t="0" r="0" b="0"/>
             <wp:docPr id="18" name="Picture 18"/>
@@ -11863,7 +11913,7 @@
         </w:rPr>
         <w:lastRenderedPageBreak/>
         <w:drawing>
-          <wp:inline distT="0" distB="0" distL="0" distR="0" wp14:anchorId="412F8A18" wp14:editId="57D18BCA">
+          <wp:inline distT="0" distB="0" distL="0" distR="0" wp14:anchorId="424540F2" wp14:editId="75D96E3C">
             <wp:extent cx="5669280" cy="3847707"/>
             <wp:effectExtent l="0" t="0" r="0" b="0"/>
             <wp:docPr id="19" name="Picture 19"/>
@@ -12399,7 +12449,7 @@
       <w:pPr>
         <w:pStyle w:val="Heading3"/>
       </w:pPr>
-      <w:bookmarkStart w:id="19" w:name="_Toc241510277"/>
+      <w:bookmarkStart w:id="19" w:name="_Toc241668755"/>
       <w:r>
         <w:t>2.6.b · Bill of Materials (BOM) for Explosion-Safety-Relevant Components</w:t>
       </w:r>
@@ -23383,7 +23433,7 @@
       <w:pPr>
         <w:pStyle w:val="Heading3"/>
       </w:pPr>
-      <w:bookmarkStart w:id="20" w:name="_Toc241510278"/>
+      <w:bookmarkStart w:id="20" w:name="_Toc241668756"/>
       <w:r>
         <w:lastRenderedPageBreak/>
         <w:t>2.6.c · Material Specification Sheets / Datasheets (Non-Metallic Materials)</w:t>
@@ -23466,7 +23516,7 @@
       <w:pPr>
         <w:pStyle w:val="Heading3"/>
       </w:pPr>
-      <w:bookmarkStart w:id="21" w:name="_Toc241510279"/>
+      <w:bookmarkStart w:id="21" w:name="_Toc241668757"/>
       <w:r>
         <w:t>2.6.d · Manufacturing Process Description</w:t>
       </w:r>
@@ -23525,7 +23575,7 @@
       <w:pPr>
         <w:pStyle w:val="Heading3"/>
       </w:pPr>
-      <w:bookmarkStart w:id="22" w:name="_Toc241510280"/>
+      <w:bookmarkStart w:id="22" w:name="_Toc241668758"/>
       <w:r>
         <w:t>2.6.e · Explosion-Protection Calculations and Explanations (if applicable)</w:t>
       </w:r>
@@ -23585,7 +23635,7 @@
       <w:pPr>
         <w:pStyle w:val="Heading3"/>
       </w:pPr>
-      <w:bookmarkStart w:id="23" w:name="_Toc241510281"/>
+      <w:bookmarkStart w:id="23" w:name="_Toc241668759"/>
       <w:r>
         <w:t>2.6.f · Temperature Group Calculation (Hottest-Point Temperature Estimation)</w:t>
       </w:r>
@@ -23593,10 +23643,1087 @@
     </w:p>
     <w:p>
       <w:r>
-        <w:t>No hottest-point temperature calculation or measurement has been performed for this product. As general context: MQ-series metal-oxide gas sensors operate using an internal heating element, a class of sensor commonly associated with published operating temperatures in the approximate 200–400°C range — however, this is a general characteristic of the sensor class, not a measured value for the specific sensor models, drive circuitry, and enclosure configuration used in this product. A worst-case hot-spot meas</w:t>
+        <w:t>A preliminary internal surface-temperature measurement has been carried out on a GLD V2 unit using thermocouples at eight locations (plus an ambient reference), under three conditions: normal operation, maximum load, and fan stalled (an expected malfunction of the internal DC cooling fan). Each condition was logged for 180 minutes at an ambient temperature of approximately 24–25°C.</w:t>
+      </w:r>
+    </w:p>
+    <w:tbl>
+      <w:tblPr>
+        <w:tblStyle w:val="TableGrid"/>
+        <w:tblW w:w="0" w:type="auto"/>
+        <w:jc w:val="center"/>
+        <w:tblLayout w:type="fixed"/>
+        <w:tblLook w:val="04A0" w:firstRow="1" w:lastRow="0" w:firstColumn="1" w:lastColumn="0" w:noHBand="0" w:noVBand="1"/>
+      </w:tblPr>
+      <w:tblGrid>
+        <w:gridCol w:w="1152"/>
+        <w:gridCol w:w="3744"/>
+        <w:gridCol w:w="4464"/>
+      </w:tblGrid>
+      <w:tr>
+        <w:trPr>
+          <w:tblHeader/>
+          <w:jc w:val="center"/>
+        </w:trPr>
+        <w:tc>
+          <w:tcPr>
+            <w:tcW w:w="1152" w:type="dxa"/>
+            <w:shd w:val="clear" w:color="auto" w:fill="EFEFEF"/>
+          </w:tcPr>
+          <w:p>
+            <w:pPr>
+              <w:spacing w:after="40"/>
+            </w:pPr>
+            <w:r>
+              <w:rPr>
+                <w:b/>
+                <w:color w:val="4A4A4A"/>
+                <w:sz w:val="18"/>
+              </w:rPr>
+              <w:t>CHANNEL</w:t>
+            </w:r>
+          </w:p>
+        </w:tc>
+        <w:tc>
+          <w:tcPr>
+            <w:tcW w:w="3744" w:type="dxa"/>
+            <w:shd w:val="clear" w:color="auto" w:fill="EFEFEF"/>
+          </w:tcPr>
+          <w:p>
+            <w:pPr>
+              <w:spacing w:after="40"/>
+            </w:pPr>
+            <w:r>
+              <w:rPr>
+                <w:b/>
+                <w:color w:val="4A4A4A"/>
+                <w:sz w:val="18"/>
+              </w:rPr>
+              <w:t>LOCATION</w:t>
+            </w:r>
+          </w:p>
+        </w:tc>
+        <w:tc>
+          <w:tcPr>
+            <w:tcW w:w="4464" w:type="dxa"/>
+            <w:shd w:val="clear" w:color="auto" w:fill="EFEFEF"/>
+          </w:tcPr>
+          <w:p>
+            <w:pPr>
+              <w:spacing w:after="40"/>
+            </w:pPr>
+            <w:r>
+              <w:rPr>
+                <w:b/>
+                <w:color w:val="4A4A4A"/>
+                <w:sz w:val="18"/>
+              </w:rPr>
+              <w:t>RATIONALE</w:t>
+            </w:r>
+          </w:p>
+        </w:tc>
+      </w:tr>
+      <w:tr>
+        <w:trPr>
+          <w:cantSplit/>
+          <w:jc w:val="center"/>
+        </w:trPr>
+        <w:tc>
+          <w:tcPr>
+            <w:tcW w:w="1152" w:type="dxa"/>
+          </w:tcPr>
+          <w:p>
+            <w:pPr>
+              <w:spacing w:after="40"/>
+            </w:pPr>
+            <w:r>
+              <w:rPr>
+                <w:b/>
+                <w:sz w:val="19"/>
+              </w:rPr>
+              <w:t>T amb</w:t>
+            </w:r>
+          </w:p>
+        </w:tc>
+        <w:tc>
+          <w:tcPr>
+            <w:tcW w:w="3744" w:type="dxa"/>
+          </w:tcPr>
+          <w:p>
+            <w:pPr>
+              <w:spacing w:after="40"/>
+            </w:pPr>
+            <w:r>
+              <w:rPr>
+                <w:sz w:val="19"/>
+              </w:rPr>
+              <w:t>Air around the unit</w:t>
+            </w:r>
+          </w:p>
+        </w:tc>
+        <w:tc>
+          <w:tcPr>
+            <w:tcW w:w="4464" w:type="dxa"/>
+          </w:tcPr>
+          <w:p>
+            <w:pPr>
+              <w:spacing w:after="40"/>
+            </w:pPr>
+            <w:r>
+              <w:rPr>
+                <w:sz w:val="19"/>
+              </w:rPr>
+              <w:t>Reference temperature</w:t>
+            </w:r>
+          </w:p>
+        </w:tc>
+      </w:tr>
+      <w:tr>
+        <w:trPr>
+          <w:cantSplit/>
+          <w:jc w:val="center"/>
+        </w:trPr>
+        <w:tc>
+          <w:tcPr>
+            <w:tcW w:w="1152" w:type="dxa"/>
+          </w:tcPr>
+          <w:p>
+            <w:pPr>
+              <w:spacing w:after="40"/>
+            </w:pPr>
+            <w:r>
+              <w:rPr>
+                <w:b/>
+                <w:sz w:val="19"/>
+              </w:rPr>
+              <w:t>TC-1</w:t>
+            </w:r>
+          </w:p>
+        </w:tc>
+        <w:tc>
+          <w:tcPr>
+            <w:tcW w:w="3744" w:type="dxa"/>
+          </w:tcPr>
+          <w:p>
+            <w:pPr>
+              <w:spacing w:after="40"/>
+            </w:pPr>
+            <w:r>
+              <w:rPr>
+                <w:sz w:val="19"/>
+              </w:rPr>
+              <w:t>Hottest MQ sensor body</w:t>
+            </w:r>
+          </w:p>
+        </w:tc>
+        <w:tc>
+          <w:tcPr>
+            <w:tcW w:w="4464" w:type="dxa"/>
+          </w:tcPr>
+          <w:p>
+            <w:pPr>
+              <w:spacing w:after="40"/>
+            </w:pPr>
+            <w:r>
+              <w:rPr>
+                <w:sz w:val="19"/>
+              </w:rPr>
+              <w:t>The sensor heater is the main potential heat source</w:t>
+            </w:r>
+          </w:p>
+        </w:tc>
+      </w:tr>
+      <w:tr>
+        <w:trPr>
+          <w:cantSplit/>
+          <w:jc w:val="center"/>
+        </w:trPr>
+        <w:tc>
+          <w:tcPr>
+            <w:tcW w:w="1152" w:type="dxa"/>
+          </w:tcPr>
+          <w:p>
+            <w:pPr>
+              <w:spacing w:after="40"/>
+            </w:pPr>
+            <w:r>
+              <w:rPr>
+                <w:b/>
+                <w:sz w:val="19"/>
+              </w:rPr>
+              <w:t>TC-2</w:t>
+            </w:r>
+          </w:p>
+        </w:tc>
+        <w:tc>
+          <w:tcPr>
+            <w:tcW w:w="3744" w:type="dxa"/>
+          </w:tcPr>
+          <w:p>
+            <w:pPr>
+              <w:spacing w:after="40"/>
+            </w:pPr>
+            <w:r>
+              <w:rPr>
+                <w:sz w:val="19"/>
+              </w:rPr>
+              <w:t>DC fan motor/body</w:t>
+            </w:r>
+          </w:p>
+        </w:tc>
+        <w:tc>
+          <w:tcPr>
+            <w:tcW w:w="4464" w:type="dxa"/>
+          </w:tcPr>
+          <w:p>
+            <w:pPr>
+              <w:spacing w:after="40"/>
+            </w:pPr>
+            <w:r>
+              <w:rPr>
+                <w:sz w:val="19"/>
+              </w:rPr>
+              <w:t>Normal and stalled-fan heating</w:t>
+            </w:r>
+          </w:p>
+        </w:tc>
+      </w:tr>
+      <w:tr>
+        <w:trPr>
+          <w:cantSplit/>
+          <w:jc w:val="center"/>
+        </w:trPr>
+        <w:tc>
+          <w:tcPr>
+            <w:tcW w:w="1152" w:type="dxa"/>
+          </w:tcPr>
+          <w:p>
+            <w:pPr>
+              <w:spacing w:after="40"/>
+            </w:pPr>
+            <w:r>
+              <w:rPr>
+                <w:b/>
+                <w:sz w:val="19"/>
+              </w:rPr>
+              <w:t>TC-3</w:t>
+            </w:r>
+          </w:p>
+        </w:tc>
+        <w:tc>
+          <w:tcPr>
+            <w:tcW w:w="3744" w:type="dxa"/>
+          </w:tcPr>
+          <w:p>
+            <w:pPr>
+              <w:spacing w:after="40"/>
+            </w:pPr>
+            <w:r>
+              <w:rPr>
+                <w:sz w:val="19"/>
+              </w:rPr>
+              <w:t>DC/DC converter</w:t>
+            </w:r>
+          </w:p>
+        </w:tc>
+        <w:tc>
+          <w:tcPr>
+            <w:tcW w:w="4464" w:type="dxa"/>
+          </w:tcPr>
+          <w:p>
+            <w:pPr>
+              <w:spacing w:after="40"/>
+            </w:pPr>
+            <w:r>
+              <w:rPr>
+                <w:sz w:val="19"/>
+              </w:rPr>
+              <w:t>Power component — not yet measured</w:t>
+            </w:r>
+          </w:p>
+        </w:tc>
+      </w:tr>
+      <w:tr>
+        <w:trPr>
+          <w:cantSplit/>
+          <w:jc w:val="center"/>
+        </w:trPr>
+        <w:tc>
+          <w:tcPr>
+            <w:tcW w:w="1152" w:type="dxa"/>
+          </w:tcPr>
+          <w:p>
+            <w:pPr>
+              <w:spacing w:after="40"/>
+            </w:pPr>
+            <w:r>
+              <w:rPr>
+                <w:b/>
+                <w:sz w:val="19"/>
+              </w:rPr>
+              <w:t>TC-4</w:t>
+            </w:r>
+          </w:p>
+        </w:tc>
+        <w:tc>
+          <w:tcPr>
+            <w:tcW w:w="3744" w:type="dxa"/>
+          </w:tcPr>
+          <w:p>
+            <w:pPr>
+              <w:spacing w:after="40"/>
+            </w:pPr>
+            <w:r>
+              <w:rPr>
+                <w:sz w:val="19"/>
+              </w:rPr>
+              <w:t>Power inductor</w:t>
+            </w:r>
+          </w:p>
+        </w:tc>
+        <w:tc>
+          <w:tcPr>
+            <w:tcW w:w="4464" w:type="dxa"/>
+          </w:tcPr>
+          <w:p>
+            <w:pPr>
+              <w:spacing w:after="40"/>
+            </w:pPr>
+            <w:r>
+              <w:rPr>
+                <w:sz w:val="19"/>
+              </w:rPr>
+              <w:t>Potential hot spot — not yet measured</w:t>
+            </w:r>
+          </w:p>
+        </w:tc>
+      </w:tr>
+      <w:tr>
+        <w:trPr>
+          <w:cantSplit/>
+          <w:jc w:val="center"/>
+        </w:trPr>
+        <w:tc>
+          <w:tcPr>
+            <w:tcW w:w="1152" w:type="dxa"/>
+          </w:tcPr>
+          <w:p>
+            <w:pPr>
+              <w:spacing w:after="40"/>
+            </w:pPr>
+            <w:r>
+              <w:rPr>
+                <w:b/>
+                <w:sz w:val="19"/>
+              </w:rPr>
+              <w:t>TC-5</w:t>
+            </w:r>
+          </w:p>
+        </w:tc>
+        <w:tc>
+          <w:tcPr>
+            <w:tcW w:w="3744" w:type="dxa"/>
+          </w:tcPr>
+          <w:p>
+            <w:pPr>
+              <w:spacing w:after="40"/>
+            </w:pPr>
+            <w:r>
+              <w:rPr>
+                <w:sz w:val="19"/>
+              </w:rPr>
+              <w:t>MOSFET / power diode</w:t>
+            </w:r>
+          </w:p>
+        </w:tc>
+        <w:tc>
+          <w:tcPr>
+            <w:tcW w:w="4464" w:type="dxa"/>
+          </w:tcPr>
+          <w:p>
+            <w:pPr>
+              <w:spacing w:after="40"/>
+            </w:pPr>
+            <w:r>
+              <w:rPr>
+                <w:sz w:val="19"/>
+              </w:rPr>
+              <w:t>Potential local heating — not yet measured</w:t>
+            </w:r>
+          </w:p>
+        </w:tc>
+      </w:tr>
+      <w:tr>
+        <w:trPr>
+          <w:cantSplit/>
+          <w:jc w:val="center"/>
+        </w:trPr>
+        <w:tc>
+          <w:tcPr>
+            <w:tcW w:w="1152" w:type="dxa"/>
+          </w:tcPr>
+          <w:p>
+            <w:pPr>
+              <w:spacing w:after="40"/>
+            </w:pPr>
+            <w:r>
+              <w:rPr>
+                <w:b/>
+                <w:sz w:val="19"/>
+              </w:rPr>
+              <w:t>TC-6</w:t>
+            </w:r>
+          </w:p>
+        </w:tc>
+        <w:tc>
+          <w:tcPr>
+            <w:tcW w:w="3744" w:type="dxa"/>
+          </w:tcPr>
+          <w:p>
+            <w:pPr>
+              <w:spacing w:after="40"/>
+            </w:pPr>
+            <w:r>
+              <w:rPr>
+                <w:sz w:val="19"/>
+              </w:rPr>
+              <w:t>Hottest PCB area</w:t>
+            </w:r>
+          </w:p>
+        </w:tc>
+        <w:tc>
+          <w:tcPr>
+            <w:tcW w:w="4464" w:type="dxa"/>
+          </w:tcPr>
+          <w:p>
+            <w:pPr>
+              <w:spacing w:after="40"/>
+            </w:pPr>
+            <w:r>
+              <w:rPr>
+                <w:sz w:val="19"/>
+              </w:rPr>
+              <w:t>PCB temperature verification</w:t>
+            </w:r>
+          </w:p>
+        </w:tc>
+      </w:tr>
+      <w:tr>
+        <w:trPr>
+          <w:cantSplit/>
+          <w:jc w:val="center"/>
+        </w:trPr>
+        <w:tc>
+          <w:tcPr>
+            <w:tcW w:w="1152" w:type="dxa"/>
+          </w:tcPr>
+          <w:p>
+            <w:pPr>
+              <w:spacing w:after="40"/>
+            </w:pPr>
+            <w:r>
+              <w:rPr>
+                <w:b/>
+                <w:sz w:val="19"/>
+              </w:rPr>
+              <w:t>TC-7</w:t>
+            </w:r>
+          </w:p>
+        </w:tc>
+        <w:tc>
+          <w:tcPr>
+            <w:tcW w:w="3744" w:type="dxa"/>
+          </w:tcPr>
+          <w:p>
+            <w:pPr>
+              <w:spacing w:after="40"/>
+            </w:pPr>
+            <w:r>
+              <w:rPr>
+                <w:sz w:val="19"/>
+              </w:rPr>
+              <w:t>External enclosure surface near the heat source</w:t>
+            </w:r>
+          </w:p>
+        </w:tc>
+        <w:tc>
+          <w:tcPr>
+            <w:tcW w:w="4464" w:type="dxa"/>
+          </w:tcPr>
+          <w:p>
+            <w:pPr>
+              <w:spacing w:after="40"/>
+            </w:pPr>
+            <w:r>
+              <w:rPr>
+                <w:sz w:val="19"/>
+              </w:rPr>
+              <w:t>Candidate external maximum</w:t>
+            </w:r>
+          </w:p>
+        </w:tc>
+      </w:tr>
+      <w:tr>
+        <w:trPr>
+          <w:cantSplit/>
+          <w:jc w:val="center"/>
+        </w:trPr>
+        <w:tc>
+          <w:tcPr>
+            <w:tcW w:w="1152" w:type="dxa"/>
+          </w:tcPr>
+          <w:p>
+            <w:pPr>
+              <w:spacing w:after="40"/>
+            </w:pPr>
+            <w:r>
+              <w:rPr>
+                <w:b/>
+                <w:sz w:val="19"/>
+              </w:rPr>
+              <w:t>TC-8</w:t>
+            </w:r>
+          </w:p>
+        </w:tc>
+        <w:tc>
+          <w:tcPr>
+            <w:tcW w:w="3744" w:type="dxa"/>
+          </w:tcPr>
+          <w:p>
+            <w:pPr>
+              <w:spacing w:after="40"/>
+            </w:pPr>
+            <w:r>
+              <w:rPr>
+                <w:sz w:val="19"/>
+              </w:rPr>
+              <w:t>Other external enclosure surface</w:t>
+            </w:r>
+          </w:p>
+        </w:tc>
+        <w:tc>
+          <w:tcPr>
+            <w:tcW w:w="4464" w:type="dxa"/>
+          </w:tcPr>
+          <w:p>
+            <w:pPr>
+              <w:spacing w:after="40"/>
+            </w:pPr>
+            <w:r>
+              <w:rPr>
+                <w:sz w:val="19"/>
+              </w:rPr>
+              <w:t>Confirms the external maximum is not missed</w:t>
+            </w:r>
+          </w:p>
+        </w:tc>
+      </w:tr>
+    </w:tbl>
+    <w:p>
+      <w:pPr>
+        <w:spacing w:after="40"/>
+      </w:pPr>
+    </w:p>
+    <w:p>
+      <w:r>
+        <w:t>Maximum values recorded over the 180-minute runs, and the same values extrapolated to the +60°C maximum rated ambient (Section 2.5) by adding the measured temperature rise above ambient:</w:t>
+      </w:r>
+    </w:p>
+    <w:tbl>
+      <w:tblPr>
+        <w:tblStyle w:val="TableGrid"/>
+        <w:tblW w:w="0" w:type="auto"/>
+        <w:jc w:val="center"/>
+        <w:tblLayout w:type="fixed"/>
+        <w:tblLook w:val="04A0" w:firstRow="1" w:lastRow="0" w:firstColumn="1" w:lastColumn="0" w:noHBand="0" w:noVBand="1"/>
+      </w:tblPr>
+      <w:tblGrid>
+        <w:gridCol w:w="2016"/>
+        <w:gridCol w:w="1152"/>
+        <w:gridCol w:w="1728"/>
+        <w:gridCol w:w="1584"/>
+        <w:gridCol w:w="1152"/>
+        <w:gridCol w:w="1728"/>
+      </w:tblGrid>
+      <w:tr>
+        <w:trPr>
+          <w:tblHeader/>
+          <w:jc w:val="center"/>
+        </w:trPr>
+        <w:tc>
+          <w:tcPr>
+            <w:tcW w:w="2016" w:type="dxa"/>
+            <w:shd w:val="clear" w:color="auto" w:fill="EFEFEF"/>
+          </w:tcPr>
+          <w:p>
+            <w:pPr>
+              <w:spacing w:after="40"/>
+            </w:pPr>
+            <w:r>
+              <w:rPr>
+                <w:b/>
+                <w:color w:val="4A4A4A"/>
+                <w:sz w:val="18"/>
+              </w:rPr>
+              <w:t>CONDITION</w:t>
+            </w:r>
+          </w:p>
+        </w:tc>
+        <w:tc>
+          <w:tcPr>
+            <w:tcW w:w="1152" w:type="dxa"/>
+            <w:shd w:val="clear" w:color="auto" w:fill="EFEFEF"/>
+          </w:tcPr>
+          <w:p>
+            <w:pPr>
+              <w:spacing w:after="40"/>
+            </w:pPr>
+            <w:r>
+              <w:rPr>
+                <w:b/>
+                <w:color w:val="4A4A4A"/>
+                <w:sz w:val="18"/>
+              </w:rPr>
+              <w:t>MEAN T AMB</w:t>
+            </w:r>
+          </w:p>
+        </w:tc>
+        <w:tc>
+          <w:tcPr>
+            <w:tcW w:w="1728" w:type="dxa"/>
+            <w:shd w:val="clear" w:color="auto" w:fill="EFEFEF"/>
+          </w:tcPr>
+          <w:p>
+            <w:pPr>
+              <w:spacing w:after="40"/>
+            </w:pPr>
+            <w:r>
+              <w:rPr>
+                <w:b/>
+                <w:color w:val="4A4A4A"/>
+                <w:sz w:val="18"/>
+              </w:rPr>
+              <w:t>MQ SENSOR BODY (TC-1)</w:t>
+            </w:r>
+          </w:p>
+        </w:tc>
+        <w:tc>
+          <w:tcPr>
+            <w:tcW w:w="1584" w:type="dxa"/>
+            <w:shd w:val="clear" w:color="auto" w:fill="EFEFEF"/>
+          </w:tcPr>
+          <w:p>
+            <w:pPr>
+              <w:spacing w:after="40"/>
+            </w:pPr>
+            <w:r>
+              <w:rPr>
+                <w:b/>
+                <w:color w:val="4A4A4A"/>
+                <w:sz w:val="18"/>
+              </w:rPr>
+              <w:t>PCB (TC-6)</w:t>
+            </w:r>
+          </w:p>
+        </w:tc>
+        <w:tc>
+          <w:tcPr>
+            <w:tcW w:w="1152" w:type="dxa"/>
+            <w:shd w:val="clear" w:color="auto" w:fill="EFEFEF"/>
+          </w:tcPr>
+          <w:p>
+            <w:pPr>
+              <w:spacing w:after="40"/>
+            </w:pPr>
+            <w:r>
+              <w:rPr>
+                <w:b/>
+                <w:color w:val="4A4A4A"/>
+                <w:sz w:val="18"/>
+              </w:rPr>
+              <w:t>FAN (TC-2)</w:t>
+            </w:r>
+          </w:p>
+        </w:tc>
+        <w:tc>
+          <w:tcPr>
+            <w:tcW w:w="1728" w:type="dxa"/>
+            <w:shd w:val="clear" w:color="auto" w:fill="EFEFEF"/>
+          </w:tcPr>
+          <w:p>
+            <w:pPr>
+              <w:spacing w:after="40"/>
+            </w:pPr>
+            <w:r>
+              <w:rPr>
+                <w:b/>
+                <w:color w:val="4A4A4A"/>
+                <w:sz w:val="18"/>
+              </w:rPr>
+              <w:t>EXTERNAL ENCLOSURE (TC-7/8)</w:t>
+            </w:r>
+          </w:p>
+        </w:tc>
+      </w:tr>
+      <w:tr>
+        <w:trPr>
+          <w:cantSplit/>
+          <w:jc w:val="center"/>
+        </w:trPr>
+        <w:tc>
+          <w:tcPr>
+            <w:tcW w:w="2016" w:type="dxa"/>
+          </w:tcPr>
+          <w:p>
+            <w:pPr>
+              <w:spacing w:after="40"/>
+            </w:pPr>
+            <w:r>
+              <w:rPr>
+                <w:b/>
+                <w:sz w:val="19"/>
+              </w:rPr>
+              <w:t>Normal operation</w:t>
+            </w:r>
+          </w:p>
+        </w:tc>
+        <w:tc>
+          <w:tcPr>
+            <w:tcW w:w="1152" w:type="dxa"/>
+          </w:tcPr>
+          <w:p>
+            <w:pPr>
+              <w:spacing w:after="40"/>
+            </w:pPr>
+            <w:r>
+              <w:rPr>
+                <w:sz w:val="19"/>
+              </w:rPr>
+              <w:t>24.9°C</w:t>
+            </w:r>
+          </w:p>
+        </w:tc>
+        <w:tc>
+          <w:tcPr>
+            <w:tcW w:w="1728" w:type="dxa"/>
+          </w:tcPr>
+          <w:p>
+            <w:pPr>
+              <w:spacing w:after="40"/>
+            </w:pPr>
+            <w:r>
+              <w:rPr>
+                <w:sz w:val="19"/>
+              </w:rPr>
+              <w:t>44.2 → ≈79°C</w:t>
+            </w:r>
+          </w:p>
+        </w:tc>
+        <w:tc>
+          <w:tcPr>
+            <w:tcW w:w="1584" w:type="dxa"/>
+          </w:tcPr>
+          <w:p>
+            <w:pPr>
+              <w:spacing w:after="40"/>
+            </w:pPr>
+            <w:r>
+              <w:rPr>
+                <w:sz w:val="19"/>
+              </w:rPr>
+              <w:t>52.4 → ≈88°C</w:t>
+            </w:r>
+          </w:p>
+        </w:tc>
+        <w:tc>
+          <w:tcPr>
+            <w:tcW w:w="1152" w:type="dxa"/>
+          </w:tcPr>
+          <w:p>
+            <w:pPr>
+              <w:spacing w:after="40"/>
+            </w:pPr>
+            <w:r>
+              <w:rPr>
+                <w:sz w:val="19"/>
+              </w:rPr>
+              <w:t>36.3°C</w:t>
+            </w:r>
+          </w:p>
+        </w:tc>
+        <w:tc>
+          <w:tcPr>
+            <w:tcW w:w="1728" w:type="dxa"/>
+          </w:tcPr>
+          <w:p>
+            <w:pPr>
+              <w:spacing w:after="40"/>
+            </w:pPr>
+            <w:r>
+              <w:rPr>
+                <w:sz w:val="19"/>
+              </w:rPr>
+              <w:t>32.1 → ≈67°C</w:t>
+            </w:r>
+          </w:p>
+        </w:tc>
+      </w:tr>
+      <w:tr>
+        <w:trPr>
+          <w:cantSplit/>
+          <w:jc w:val="center"/>
+        </w:trPr>
+        <w:tc>
+          <w:tcPr>
+            <w:tcW w:w="2016" w:type="dxa"/>
+          </w:tcPr>
+          <w:p>
+            <w:pPr>
+              <w:spacing w:after="40"/>
+            </w:pPr>
+            <w:r>
+              <w:rPr>
+                <w:b/>
+                <w:sz w:val="19"/>
+              </w:rPr>
+              <w:t>Maximum load</w:t>
+            </w:r>
+          </w:p>
+        </w:tc>
+        <w:tc>
+          <w:tcPr>
+            <w:tcW w:w="1152" w:type="dxa"/>
+          </w:tcPr>
+          <w:p>
+            <w:pPr>
+              <w:spacing w:after="40"/>
+            </w:pPr>
+            <w:r>
+              <w:rPr>
+                <w:sz w:val="19"/>
+              </w:rPr>
+              <w:t>24.2°C</w:t>
+            </w:r>
+          </w:p>
+        </w:tc>
+        <w:tc>
+          <w:tcPr>
+            <w:tcW w:w="1728" w:type="dxa"/>
+          </w:tcPr>
+          <w:p>
+            <w:pPr>
+              <w:spacing w:after="40"/>
+            </w:pPr>
+            <w:r>
+              <w:rPr>
+                <w:sz w:val="19"/>
+              </w:rPr>
+              <w:t>55.0 → ≈91°C</w:t>
+            </w:r>
+          </w:p>
+        </w:tc>
+        <w:tc>
+          <w:tcPr>
+            <w:tcW w:w="1584" w:type="dxa"/>
+          </w:tcPr>
+          <w:p>
+            <w:pPr>
+              <w:spacing w:after="40"/>
+            </w:pPr>
+            <w:r>
+              <w:rPr>
+                <w:sz w:val="19"/>
+              </w:rPr>
+              <w:t>58.3 → ≈94°C</w:t>
+            </w:r>
+          </w:p>
+        </w:tc>
+        <w:tc>
+          <w:tcPr>
+            <w:tcW w:w="1152" w:type="dxa"/>
+          </w:tcPr>
+          <w:p>
+            <w:pPr>
+              <w:spacing w:after="40"/>
+            </w:pPr>
+            <w:r>
+              <w:rPr>
+                <w:sz w:val="19"/>
+              </w:rPr>
+              <w:t>30.2°C</w:t>
+            </w:r>
+          </w:p>
+        </w:tc>
+        <w:tc>
+          <w:tcPr>
+            <w:tcW w:w="1728" w:type="dxa"/>
+          </w:tcPr>
+          <w:p>
+            <w:pPr>
+              <w:spacing w:after="40"/>
+            </w:pPr>
+            <w:r>
+              <w:rPr>
+                <w:sz w:val="19"/>
+              </w:rPr>
+              <w:t>34.8 → ≈71°C</w:t>
+            </w:r>
+          </w:p>
+        </w:tc>
+      </w:tr>
+      <w:tr>
+        <w:trPr>
+          <w:cantSplit/>
+          <w:jc w:val="center"/>
+        </w:trPr>
+        <w:tc>
+          <w:tcPr>
+            <w:tcW w:w="2016" w:type="dxa"/>
+          </w:tcPr>
+          <w:p>
+            <w:pPr>
+              <w:spacing w:after="40"/>
+            </w:pPr>
+            <w:r>
+              <w:rPr>
+                <w:b/>
+                <w:sz w:val="19"/>
+              </w:rPr>
+              <w:t>Fan stalled (malfunction)</w:t>
+            </w:r>
+          </w:p>
+        </w:tc>
+        <w:tc>
+          <w:tcPr>
+            <w:tcW w:w="1152" w:type="dxa"/>
+          </w:tcPr>
+          <w:p>
+            <w:pPr>
+              <w:spacing w:after="40"/>
+            </w:pPr>
+            <w:r>
+              <w:rPr>
+                <w:sz w:val="19"/>
+              </w:rPr>
+              <w:t>24.8°C</w:t>
+            </w:r>
+          </w:p>
+        </w:tc>
+        <w:tc>
+          <w:tcPr>
+            <w:tcW w:w="1728" w:type="dxa"/>
+          </w:tcPr>
+          <w:p>
+            <w:pPr>
+              <w:spacing w:after="40"/>
+            </w:pPr>
+            <w:r>
+              <w:rPr>
+                <w:sz w:val="19"/>
+              </w:rPr>
+              <w:t>78.4 → ≈114°C</w:t>
+            </w:r>
+          </w:p>
+        </w:tc>
+        <w:tc>
+          <w:tcPr>
+            <w:tcW w:w="1584" w:type="dxa"/>
+          </w:tcPr>
+          <w:p>
+            <w:pPr>
+              <w:spacing w:after="40"/>
+            </w:pPr>
+            <w:r>
+              <w:rPr>
+                <w:sz w:val="19"/>
+              </w:rPr>
+              <w:t>63.4 → ≈99°C</w:t>
+            </w:r>
+          </w:p>
+        </w:tc>
+        <w:tc>
+          <w:tcPr>
+            <w:tcW w:w="1152" w:type="dxa"/>
+          </w:tcPr>
+          <w:p>
+            <w:pPr>
+              <w:spacing w:after="40"/>
+            </w:pPr>
+            <w:r>
+              <w:rPr>
+                <w:sz w:val="19"/>
+              </w:rPr>
+              <w:t>36.3°C</w:t>
+            </w:r>
+          </w:p>
+        </w:tc>
+        <w:tc>
+          <w:tcPr>
+            <w:tcW w:w="1728" w:type="dxa"/>
+          </w:tcPr>
+          <w:p>
+            <w:pPr>
+              <w:spacing w:after="40"/>
+            </w:pPr>
+            <w:r>
+              <w:rPr>
+                <w:sz w:val="19"/>
+              </w:rPr>
+              <w:t>43.9 → ≈79°C</w:t>
+            </w:r>
+          </w:p>
+        </w:tc>
+      </w:tr>
+    </w:tbl>
+    <w:p>
+      <w:pPr>
+        <w:spacing w:after="40"/>
+      </w:pPr>
+    </w:p>
+    <w:p>
+      <w:r>
+        <w:t xml:space="preserve">Preliminary reading against T4. The T4 limit is 135°C; with the 5 K margin applied for temperature classes T3–T6 under IEC 60079-0, the effective limit is 130°C. The highest extrapolated value, ≈114°C on the MQ sensor body in the fan-stalled condition, leaves a margin of about 16 K. The heater element itself (in the approximate 200–400°C range typical of this sensor class) sits inside the sensor can and was not measured directly; the measured sensor-body surface is 44–78°C. Under the recommended flameproof </w:t>
       </w:r>
       <w:r>
-        <w:t>urement is identified as the top-priority action required to substantiate the recommended T4 classification in Section 2.5.</w:t>
+        <w:t>concept (Ex d, Section 2.5), the temperature class is governed by the external surfaces of the flameproof enclosure, whose extrapolated maximum is ≈79°C.</w:t>
+      </w:r>
+    </w:p>
+    <w:p>
+      <w:r>
+        <w:rPr>
+          <w:b/>
+        </w:rPr>
+        <w:t>Open items before this can be treated as a temperature-class verification:</w:t>
+      </w:r>
+    </w:p>
+    <w:p>
+      <w:r>
+        <w:t>•  TC-3, TC-4 and TC-5 (DC/DC converter, power inductor, MOSFET/power diode) have not been measured; no independent hot-spot location check has been recorded.</w:t>
+      </w:r>
+    </w:p>
+    <w:p>
+      <w:r>
+        <w:lastRenderedPageBreak/>
+        <w:t>•  The alarm/transmit condition has not been measured.</w:t>
+      </w:r>
+    </w:p>
+    <w:p>
+      <w:r>
+        <w:t>•  Thermal equilibrium was not demonstrated in every run: the PCB reading under maximum load was still rising in the final hour (46.4 → 55.8 → 58.3°C), above the 2 K/h stability criterion.</w:t>
+      </w:r>
+    </w:p>
+    <w:p>
+      <w:r>
+        <w:t>•  Two short excursions on TC-7 (43.4 and 43.9°C) in the fan-stalled run, with neighbouring readings near 30°C, should be checked for thermocouple contact before the external maximum is finalised.</w:t>
+      </w:r>
+    </w:p>
+    <w:p>
+      <w:r>
+        <w:t>•  Test metadata is not yet recorded: date, operator, unit identification, thermocouple type, supply voltage (the most unfavourable voltage within the rated range should be used), and whether the enclosure was fully closed.</w:t>
+      </w:r>
+    </w:p>
+    <w:p>
+      <w:r>
+        <w:t>•  Extrapolation to +60°C assumes a constant temperature rise above ambient; confirmation requires testing at maximum ambient as part of ExCB type testing.</w:t>
       </w:r>
     </w:p>
     <w:tbl>
@@ -23616,12 +24743,12 @@
           <w:tcPr>
             <w:tcW w:w="9746" w:type="dxa"/>
             <w:tcBorders>
-              <w:top w:val="single" w:sz="4" w:space="0" w:color="B9D3E0"/>
-              <w:left w:val="single" w:sz="4" w:space="0" w:color="B9D3E0"/>
-              <w:bottom w:val="single" w:sz="4" w:space="0" w:color="B9D3E0"/>
-              <w:right w:val="single" w:sz="4" w:space="0" w:color="B9D3E0"/>
+              <w:top w:val="single" w:sz="4" w:space="0" w:color="E8C79A"/>
+              <w:left w:val="single" w:sz="4" w:space="0" w:color="E8C79A"/>
+              <w:bottom w:val="single" w:sz="4" w:space="0" w:color="E8C79A"/>
+              <w:right w:val="single" w:sz="4" w:space="0" w:color="E8C79A"/>
             </w:tcBorders>
-            <w:shd w:val="clear" w:color="auto" w:fill="E4F2FA"/>
+            <w:shd w:val="clear" w:color="auto" w:fill="FDF1E6"/>
           </w:tcPr>
           <w:p>
             <w:pPr>
@@ -23632,7 +24759,7 @@
                 <w:color w:val="4A4A4A"/>
                 <w:sz w:val="20"/>
               </w:rPr>
-              <w:t>Status: Not yet available.</w:t>
+              <w:t>Status: Partially available — preliminary internal measurement. Indicates T4 is achievable with margin; not a substitute for type testing, and the open items above must be closed first.</w:t>
             </w:r>
           </w:p>
         </w:tc>
@@ -23647,7 +24774,7 @@
       <w:pPr>
         <w:pStyle w:val="Heading3"/>
       </w:pPr>
-      <w:bookmarkStart w:id="24" w:name="_Toc241510282"/>
+      <w:bookmarkStart w:id="24" w:name="_Toc241668760"/>
       <w:r>
         <w:t>2.6.g · Usage and Installation Instructions (Draft)</w:t>
       </w:r>
@@ -24019,6 +25146,7 @@
         <w:rPr>
           <w:sz w:val="20"/>
         </w:rPr>
+        <w:lastRenderedPageBreak/>
         <w:t>Perform sensor nulling only in confirmed clean air. Accept the operation only when all eight sensors report a complete 8/8 result; otherwise correct the cause and repeat.</w:t>
       </w:r>
     </w:p>
@@ -24031,7 +25159,6 @@
         <w:rPr>
           <w:sz w:val="20"/>
         </w:rPr>
-        <w:lastRenderedPageBreak/>
         <w:t>Do not drill, weld, enlarge cable entries, bypass protective devices, or modify the enclosure without written engineering and Ex approval.</w:t>
       </w:r>
     </w:p>
@@ -24376,7 +25503,7 @@
       <w:pPr>
         <w:pStyle w:val="Heading3"/>
       </w:pPr>
-      <w:bookmarkStart w:id="25" w:name="_Toc241510283"/>
+      <w:bookmarkStart w:id="25" w:name="_Toc241668761"/>
       <w:r>
         <w:t>2.6.h · Nameplate Information</w:t>
       </w:r>
@@ -24435,7 +25562,7 @@
       <w:pPr>
         <w:pStyle w:val="Heading3"/>
       </w:pPr>
-      <w:bookmarkStart w:id="26" w:name="_Toc241510284"/>
+      <w:bookmarkStart w:id="26" w:name="_Toc241668762"/>
       <w:r>
         <w:lastRenderedPageBreak/>
         <w:t>2.6.i · Ex Component Certificates</w:t>
@@ -24495,7 +25622,7 @@
       <w:pPr>
         <w:pStyle w:val="Heading1"/>
       </w:pPr>
-      <w:bookmarkStart w:id="27" w:name="_Toc241510285"/>
+      <w:bookmarkStart w:id="27" w:name="_Toc241668763"/>
       <w:r>
         <w:t>3. Sample Information</w:t>
       </w:r>
@@ -24510,7 +25637,7 @@
       <w:pPr>
         <w:pStyle w:val="Heading2"/>
       </w:pPr>
-      <w:bookmarkStart w:id="28" w:name="_Toc241510286"/>
+      <w:bookmarkStart w:id="28" w:name="_Toc241668764"/>
       <w:r>
         <w:t>3.1 · Model, Serial Number, and Status</w:t>
       </w:r>
@@ -24569,7 +25696,7 @@
       <w:pPr>
         <w:pStyle w:val="Heading2"/>
       </w:pPr>
-      <w:bookmarkStart w:id="29" w:name="_Toc241510287"/>
+      <w:bookmarkStart w:id="29" w:name="_Toc241668765"/>
       <w:r>
         <w:t>3.2 · Test Fixtures and Auxiliary Equipment</w:t>
       </w:r>
@@ -25369,7 +26496,7 @@
         <w:color w:val="4A4A4A"/>
         <w:sz w:val="16"/>
       </w:rPr>
-      <w:t>GMI/GLD/IECEX-TDF/2026-001  ·  Rev. 1.3</w:t>
+      <w:t>GMI/GLD/IECEX-TDF/2026-001  ·  Rev. 1.4</w:t>
     </w:r>
     <w:r>
       <w:tab/>
@@ -25639,31 +26766,31 @@
       </w:rPr>
     </w:lvl>
   </w:abstractNum>
-  <w:num w:numId="1" w16cid:durableId="1401175474">
+  <w:num w:numId="1" w16cid:durableId="1562251062">
     <w:abstractNumId w:val="8"/>
   </w:num>
-  <w:num w:numId="2" w16cid:durableId="837573684">
+  <w:num w:numId="2" w16cid:durableId="1345088325">
     <w:abstractNumId w:val="6"/>
   </w:num>
-  <w:num w:numId="3" w16cid:durableId="572280110">
+  <w:num w:numId="3" w16cid:durableId="1156147873">
     <w:abstractNumId w:val="5"/>
   </w:num>
-  <w:num w:numId="4" w16cid:durableId="1238246834">
+  <w:num w:numId="4" w16cid:durableId="1511598837">
     <w:abstractNumId w:val="4"/>
   </w:num>
-  <w:num w:numId="5" w16cid:durableId="1829980911">
+  <w:num w:numId="5" w16cid:durableId="287787876">
     <w:abstractNumId w:val="7"/>
   </w:num>
-  <w:num w:numId="6" w16cid:durableId="197815386">
+  <w:num w:numId="6" w16cid:durableId="1981689927">
     <w:abstractNumId w:val="3"/>
   </w:num>
-  <w:num w:numId="7" w16cid:durableId="380371186">
+  <w:num w:numId="7" w16cid:durableId="2134056222">
     <w:abstractNumId w:val="2"/>
   </w:num>
-  <w:num w:numId="8" w16cid:durableId="1709187584">
+  <w:num w:numId="8" w16cid:durableId="463234463">
     <w:abstractNumId w:val="1"/>
   </w:num>
-  <w:num w:numId="9" w16cid:durableId="691688939">
+  <w:num w:numId="9" w16cid:durableId="1600287296">
     <w:abstractNumId w:val="0"/>
   </w:num>
 </w:numbering>
@@ -37095,7 +38222,7 @@
     <w:autoRedefine/>
     <w:uiPriority w:val="39"/>
     <w:unhideWhenUsed/>
-    <w:rsid w:val="00C7125C"/>
+    <w:rsid w:val="00A671F7"/>
     <w:pPr>
       <w:spacing w:after="100"/>
     </w:pPr>
@@ -37107,7 +38234,7 @@
     <w:autoRedefine/>
     <w:uiPriority w:val="39"/>
     <w:unhideWhenUsed/>
-    <w:rsid w:val="00C7125C"/>
+    <w:rsid w:val="00A671F7"/>
     <w:pPr>
       <w:spacing w:after="100"/>
       <w:ind w:left="210"/>
@@ -37120,7 +38247,7 @@
     <w:autoRedefine/>
     <w:uiPriority w:val="39"/>
     <w:unhideWhenUsed/>
-    <w:rsid w:val="00C7125C"/>
+    <w:rsid w:val="00A671F7"/>
     <w:pPr>
       <w:spacing w:after="100"/>
       <w:ind w:left="420"/>
@@ -37131,7 +38258,7 @@
     <w:basedOn w:val="DefaultParagraphFont"/>
     <w:uiPriority w:val="99"/>
     <w:unhideWhenUsed/>
-    <w:rsid w:val="00C7125C"/>
+    <w:rsid w:val="00A671F7"/>
     <w:rPr>
       <w:color w:val="0000FF" w:themeColor="hyperlink"/>
       <w:u w:val="single"/>

</xml_diff>